<commit_message>
Elaboration of abstract part of the formal report
</commit_message>
<xml_diff>
--- a/Project1_Sleep_Deprivation_Cognition/Report/Analysis_Report.docx
+++ b/Project1_Sleep_Deprivation_Cognition/Report/Analysis_Report.docx
@@ -390,6 +390,356 @@
     </w:p>
     <w:p>
       <w:pPr>
+        <w:pStyle w:val="ae"/>
+        <w:spacing w:before="0" w:beforeAutospacing="0" w:after="0" w:afterAutospacing="0"/>
+        <w:jc w:val="both"/>
+        <w:rPr>
+          <w:rFonts w:ascii="Times New Roman" w:hAnsi="Times New Roman" w:cs="Times New Roman"/>
+        </w:rPr>
+      </w:pPr>
+      <w:r>
+        <w:rPr>
+          <w:rFonts w:ascii="Times New Roman" w:hAnsi="Times New Roman" w:cs="Times New Roman"/>
+        </w:rPr>
+        <w:t xml:space="preserve">Numerous studies have identified behavioral and psychological contributors associated with cognitive performance and emotional </w:t>
+      </w:r>
+      <w:r>
+        <w:rPr>
+          <w:rFonts w:ascii="Times New Roman" w:hAnsi="Times New Roman" w:cs="Times New Roman"/>
+        </w:rPr>
+        <w:t>functioning.</w:t>
+      </w:r>
+      <w:r>
+        <w:rPr>
+          <w:rFonts w:ascii="Times New Roman" w:hAnsi="Times New Roman" w:cs="Times New Roman"/>
+        </w:rPr>
+        <w:t xml:space="preserve"> Based on current theories and a publicly available dataset, this project examined two research questions: (1) whether sleep-related factors were associated with emotional regulation, representing behavioral contributors to psychological functioning; and (2) whether psychological factors, including stress levels and emotional regulation, were associated with cognitive performanc</w:t>
+      </w:r>
+      <w:r>
+        <w:rPr>
+          <w:rFonts w:ascii="Times New Roman" w:hAnsi="Times New Roman" w:cs="Times New Roman"/>
+        </w:rPr>
+        <w:t>e. F</w:t>
+      </w:r>
+      <w:r>
+        <w:rPr>
+          <w:rFonts w:ascii="Times New Roman" w:hAnsi="Times New Roman" w:cs="Times New Roman"/>
+        </w:rPr>
+        <w:t>or the first module,</w:t>
+      </w:r>
+      <w:r>
+        <w:rPr>
+          <w:rFonts w:ascii="Times New Roman" w:hAnsi="Times New Roman" w:cs="Times New Roman"/>
+        </w:rPr>
+        <w:t xml:space="preserve"> regression-based models were</w:t>
+      </w:r>
+      <w:r>
+        <w:rPr>
+          <w:rFonts w:ascii="Times New Roman" w:hAnsi="Times New Roman" w:cs="Times New Roman"/>
+        </w:rPr>
+        <w:t xml:space="preserve"> constructed</w:t>
+      </w:r>
+      <w:r>
+        <w:rPr>
+          <w:rFonts w:ascii="Times New Roman" w:hAnsi="Times New Roman" w:cs="Times New Roman"/>
+        </w:rPr>
+        <w:t xml:space="preserve"> to </w:t>
+      </w:r>
+      <w:r>
+        <w:rPr>
+          <w:rFonts w:ascii="Times New Roman" w:hAnsi="Times New Roman" w:cs="Times New Roman"/>
+        </w:rPr>
+        <w:t>evaluate</w:t>
+      </w:r>
+      <w:r>
+        <w:rPr>
+          <w:rFonts w:ascii="Times New Roman" w:hAnsi="Times New Roman" w:cs="Times New Roman"/>
+        </w:rPr>
+        <w:t xml:space="preserve"> associations between sleep-related factors and emotional regulation, including the </w:t>
+      </w:r>
+      <w:r>
+        <w:rPr>
+          <w:rFonts w:ascii="Times New Roman" w:hAnsi="Times New Roman" w:cs="Times New Roman"/>
+        </w:rPr>
+        <w:t>potential interaction effects between sleep duration and sleep quality</w:t>
+      </w:r>
+      <w:r>
+        <w:rPr>
+          <w:rFonts w:ascii="Times New Roman" w:hAnsi="Times New Roman" w:cs="Times New Roman"/>
+        </w:rPr>
+        <w:t xml:space="preserve">. </w:t>
+      </w:r>
+      <w:r>
+        <w:rPr>
+          <w:rFonts w:ascii="Times New Roman" w:hAnsi="Times New Roman" w:cs="Times New Roman"/>
+        </w:rPr>
+        <w:t xml:space="preserve">For the second module, </w:t>
+      </w:r>
+      <w:r>
+        <w:rPr>
+          <w:rFonts w:ascii="Times New Roman" w:hAnsi="Times New Roman" w:cs="Times New Roman"/>
+        </w:rPr>
+        <w:t xml:space="preserve">Principal component analysis (PCA) was </w:t>
+      </w:r>
+      <w:r>
+        <w:rPr>
+          <w:rFonts w:ascii="Times New Roman" w:hAnsi="Times New Roman" w:cs="Times New Roman"/>
+        </w:rPr>
+        <w:t xml:space="preserve">initially </w:t>
+      </w:r>
+      <w:r>
+        <w:rPr>
+          <w:rFonts w:ascii="Times New Roman" w:hAnsi="Times New Roman" w:cs="Times New Roman"/>
+        </w:rPr>
+        <w:t>conducted to explore the potential commonality among cognitive measures, followed by analyses examining associations between psychological</w:t>
+      </w:r>
+      <w:r>
+        <w:rPr>
+          <w:rFonts w:ascii="Times New Roman" w:hAnsi="Times New Roman" w:cs="Times New Roman"/>
+        </w:rPr>
+        <w:t xml:space="preserve"> predictors including stress levels and emotion regulation</w:t>
+      </w:r>
+      <w:r>
+        <w:rPr>
+          <w:rFonts w:ascii="Times New Roman" w:hAnsi="Times New Roman" w:cs="Times New Roman"/>
+        </w:rPr>
+        <w:t>,</w:t>
+      </w:r>
+      <w:r>
+        <w:rPr>
+          <w:rFonts w:ascii="Times New Roman" w:hAnsi="Times New Roman" w:cs="Times New Roman"/>
+        </w:rPr>
+        <w:t xml:space="preserve"> </w:t>
+      </w:r>
+      <w:r>
+        <w:rPr>
+          <w:rFonts w:ascii="Times New Roman" w:hAnsi="Times New Roman" w:cs="Times New Roman"/>
+        </w:rPr>
+        <w:t>and individual cognitive</w:t>
+      </w:r>
+      <w:r>
+        <w:rPr>
+          <w:rFonts w:ascii="Times New Roman" w:hAnsi="Times New Roman" w:cs="Times New Roman"/>
+        </w:rPr>
+        <w:t xml:space="preserve"> outcomes</w:t>
+      </w:r>
+      <w:r>
+        <w:rPr>
+          <w:rFonts w:ascii="Times New Roman" w:hAnsi="Times New Roman" w:cs="Times New Roman"/>
+        </w:rPr>
+        <w:t>.</w:t>
+      </w:r>
+      <w:r>
+        <w:rPr>
+          <w:rFonts w:ascii="Times New Roman" w:hAnsi="Times New Roman" w:cs="Times New Roman" w:hint="eastAsia"/>
+        </w:rPr>
+        <w:t xml:space="preserve"> </w:t>
+      </w:r>
+      <w:r>
+        <w:rPr>
+          <w:rFonts w:ascii="Times New Roman" w:hAnsi="Times New Roman" w:cs="Times New Roman"/>
+        </w:rPr>
+        <w:t xml:space="preserve">The findings provided </w:t>
+      </w:r>
+      <w:r>
+        <w:rPr>
+          <w:rFonts w:ascii="Times New Roman" w:hAnsi="Times New Roman" w:cs="Times New Roman"/>
+        </w:rPr>
+        <w:t xml:space="preserve">insufficient </w:t>
+      </w:r>
+      <w:r>
+        <w:rPr>
+          <w:rFonts w:ascii="Times New Roman" w:hAnsi="Times New Roman" w:cs="Times New Roman"/>
+        </w:rPr>
+        <w:t>evidence supporting</w:t>
+      </w:r>
+      <w:r>
+        <w:rPr>
+          <w:rFonts w:ascii="Times New Roman" w:hAnsi="Times New Roman" w:cs="Times New Roman" w:hint="eastAsia"/>
+        </w:rPr>
+        <w:t xml:space="preserve"> </w:t>
+      </w:r>
+      <w:r>
+        <w:rPr>
+          <w:rFonts w:ascii="Times New Roman" w:hAnsi="Times New Roman" w:cs="Times New Roman"/>
+        </w:rPr>
+        <w:t xml:space="preserve">associations between behavioral and psychological factors and cognitive performance </w:t>
+      </w:r>
+      <w:r>
+        <w:rPr>
+          <w:rFonts w:ascii="Times New Roman" w:hAnsi="Times New Roman" w:cs="Times New Roman" w:hint="eastAsia"/>
+        </w:rPr>
+        <w:t xml:space="preserve">in </w:t>
+      </w:r>
+      <w:r>
+        <w:rPr>
+          <w:rFonts w:ascii="Times New Roman" w:hAnsi="Times New Roman" w:cs="Times New Roman"/>
+        </w:rPr>
+        <w:t>the</w:t>
+      </w:r>
+      <w:r>
+        <w:rPr>
+          <w:rFonts w:ascii="Times New Roman" w:hAnsi="Times New Roman" w:cs="Times New Roman"/>
+        </w:rPr>
+        <w:t xml:space="preserve"> population level</w:t>
+      </w:r>
+      <w:r>
+        <w:rPr>
+          <w:rFonts w:ascii="Times New Roman" w:hAnsi="Times New Roman" w:cs="Times New Roman"/>
+        </w:rPr>
+        <w:t xml:space="preserve">. PCA </w:t>
+      </w:r>
+      <w:r>
+        <w:rPr>
+          <w:rFonts w:ascii="Times New Roman" w:hAnsi="Times New Roman" w:cs="Times New Roman"/>
+        </w:rPr>
+        <w:t xml:space="preserve">did </w:t>
+      </w:r>
+      <w:r>
+        <w:rPr>
+          <w:rFonts w:ascii="Times New Roman" w:hAnsi="Times New Roman" w:cs="Times New Roman"/>
+        </w:rPr>
+        <w:t xml:space="preserve">not </w:t>
+      </w:r>
+      <w:r>
+        <w:rPr>
+          <w:rFonts w:ascii="Times New Roman" w:hAnsi="Times New Roman" w:cs="Times New Roman"/>
+        </w:rPr>
+        <w:t xml:space="preserve">indicate </w:t>
+      </w:r>
+      <w:r>
+        <w:rPr>
+          <w:rFonts w:ascii="Times New Roman" w:hAnsi="Times New Roman" w:cs="Times New Roman"/>
+        </w:rPr>
+        <w:t>a unified cognitive performance component, suggesting th</w:t>
+      </w:r>
+      <w:r>
+        <w:rPr>
+          <w:rFonts w:ascii="Times New Roman" w:hAnsi="Times New Roman" w:cs="Times New Roman"/>
+        </w:rPr>
+        <w:t>e</w:t>
+      </w:r>
+      <w:r>
+        <w:rPr>
+          <w:rFonts w:ascii="Times New Roman" w:hAnsi="Times New Roman" w:cs="Times New Roman"/>
+        </w:rPr>
+        <w:t xml:space="preserve"> individual cognitive </w:t>
+      </w:r>
+      <w:r>
+        <w:rPr>
+          <w:rFonts w:ascii="Times New Roman" w:hAnsi="Times New Roman" w:cs="Times New Roman"/>
+        </w:rPr>
+        <w:t>measur</w:t>
+      </w:r>
+      <w:r>
+        <w:rPr>
+          <w:rFonts w:ascii="Times New Roman" w:hAnsi="Times New Roman" w:cs="Times New Roman" w:hint="eastAsia"/>
+        </w:rPr>
+        <w:t>es</w:t>
+      </w:r>
+      <w:r>
+        <w:rPr>
+          <w:rFonts w:ascii="Times New Roman" w:hAnsi="Times New Roman" w:cs="Times New Roman" w:hint="eastAsia"/>
+        </w:rPr>
+        <w:t xml:space="preserve"> </w:t>
+      </w:r>
+      <w:r>
+        <w:rPr>
+          <w:rFonts w:ascii="Times New Roman" w:hAnsi="Times New Roman" w:cs="Times New Roman"/>
+        </w:rPr>
+        <w:t xml:space="preserve">in the </w:t>
+      </w:r>
+      <w:r>
+        <w:rPr>
+          <w:rFonts w:ascii="Times New Roman" w:hAnsi="Times New Roman" w:cs="Times New Roman"/>
+        </w:rPr>
+        <w:t>data</w:t>
+      </w:r>
+      <w:r>
+        <w:rPr>
+          <w:rFonts w:ascii="Times New Roman" w:hAnsi="Times New Roman" w:cs="Times New Roman"/>
+        </w:rPr>
+        <w:t xml:space="preserve"> represent</w:t>
+      </w:r>
+      <w:r>
+        <w:rPr>
+          <w:rFonts w:ascii="Times New Roman" w:hAnsi="Times New Roman" w:cs="Times New Roman"/>
+        </w:rPr>
+        <w:t xml:space="preserve"> distinct cognitive domains. </w:t>
+      </w:r>
+      <w:r>
+        <w:rPr>
+          <w:rFonts w:ascii="Times New Roman" w:hAnsi="Times New Roman" w:cs="Times New Roman" w:hint="eastAsia"/>
+        </w:rPr>
+        <w:t>T</w:t>
+      </w:r>
+      <w:r>
+        <w:rPr>
+          <w:rFonts w:ascii="Times New Roman" w:hAnsi="Times New Roman" w:cs="Times New Roman"/>
+        </w:rPr>
+        <w:t>hese</w:t>
+      </w:r>
+      <w:r>
+        <w:rPr>
+          <w:rFonts w:ascii="Times New Roman" w:hAnsi="Times New Roman" w:cs="Times New Roman" w:hint="eastAsia"/>
+        </w:rPr>
+        <w:t xml:space="preserve"> intriguing </w:t>
+      </w:r>
+      <w:r>
+        <w:rPr>
+          <w:rFonts w:ascii="Times New Roman" w:hAnsi="Times New Roman" w:cs="Times New Roman"/>
+        </w:rPr>
+        <w:t>findings</w:t>
+      </w:r>
+      <w:r>
+        <w:rPr>
+          <w:rFonts w:ascii="Times New Roman" w:hAnsi="Times New Roman" w:cs="Times New Roman" w:hint="eastAsia"/>
+        </w:rPr>
+        <w:t>,</w:t>
+      </w:r>
+      <w:r>
+        <w:rPr>
+          <w:rFonts w:ascii="Times New Roman" w:hAnsi="Times New Roman" w:cs="Times New Roman"/>
+        </w:rPr>
+        <w:t xml:space="preserve"> inconsistent with expectations</w:t>
+      </w:r>
+      <w:r>
+        <w:rPr>
+          <w:rFonts w:ascii="Times New Roman" w:hAnsi="Times New Roman" w:cs="Times New Roman"/>
+        </w:rPr>
+        <w:t>,</w:t>
+      </w:r>
+      <w:r>
+        <w:rPr>
+          <w:rFonts w:ascii="Times New Roman" w:hAnsi="Times New Roman" w:cs="Times New Roman"/>
+        </w:rPr>
+        <w:t xml:space="preserve"> </w:t>
+      </w:r>
+      <w:r>
+        <w:rPr>
+          <w:rFonts w:ascii="Times New Roman" w:hAnsi="Times New Roman" w:cs="Times New Roman"/>
+        </w:rPr>
+        <w:t>highlight the complexity of relationships among sleep, psychological states, and cognitive functioning</w:t>
+      </w:r>
+      <w:r>
+        <w:rPr>
+          <w:rFonts w:ascii="Times New Roman" w:hAnsi="Times New Roman" w:cs="Times New Roman"/>
+        </w:rPr>
+        <w:t xml:space="preserve"> </w:t>
+      </w:r>
+    </w:p>
+    <w:p>
+      <w:pPr>
+        <w:pStyle w:val="ae"/>
+        <w:spacing w:before="0" w:beforeAutospacing="0" w:after="0" w:afterAutospacing="0"/>
+        <w:jc w:val="both"/>
+        <w:rPr>
+          <w:rFonts w:ascii="Times New Roman" w:hAnsi="Times New Roman" w:cs="Times New Roman" w:hint="eastAsia"/>
+        </w:rPr>
+      </w:pPr>
+    </w:p>
+    <w:p>
+      <w:pPr>
         <w:spacing w:after="0" w:line="240" w:lineRule="atLeast"/>
         <w:jc w:val="both"/>
         <w:rPr>
@@ -397,447 +747,6 @@
           <w:sz w:val="24"/>
         </w:rPr>
       </w:pPr>
-      <w:r>
-        <w:rPr>
-          <w:rFonts w:ascii="Times New Roman" w:hAnsi="Times New Roman" w:cs="Times New Roman"/>
-          <w:sz w:val="24"/>
-        </w:rPr>
-        <w:t>A plenty of</w:t>
-      </w:r>
-      <w:r>
-        <w:rPr>
-          <w:rFonts w:ascii="Times New Roman" w:hAnsi="Times New Roman" w:cs="Times New Roman"/>
-          <w:sz w:val="24"/>
-        </w:rPr>
-        <w:t xml:space="preserve"> </w:t>
-      </w:r>
-      <w:r>
-        <w:rPr>
-          <w:rFonts w:ascii="Times New Roman" w:hAnsi="Times New Roman" w:cs="Times New Roman"/>
-          <w:sz w:val="24"/>
-        </w:rPr>
-        <w:t>scholars</w:t>
-      </w:r>
-      <w:r>
-        <w:rPr>
-          <w:rFonts w:ascii="Times New Roman" w:hAnsi="Times New Roman" w:cs="Times New Roman"/>
-          <w:sz w:val="24"/>
-        </w:rPr>
-        <w:t xml:space="preserve"> have </w:t>
-      </w:r>
-      <w:r>
-        <w:rPr>
-          <w:rFonts w:ascii="Times New Roman" w:hAnsi="Times New Roman" w:cs="Times New Roman"/>
-          <w:sz w:val="24"/>
-        </w:rPr>
-        <w:t>identified certain</w:t>
-      </w:r>
-      <w:r>
-        <w:rPr>
-          <w:rFonts w:ascii="Times New Roman" w:hAnsi="Times New Roman" w:cs="Times New Roman"/>
-          <w:sz w:val="24"/>
-        </w:rPr>
-        <w:t xml:space="preserve"> important contributors originated from behavior and psychological state for cognitive performances.</w:t>
-      </w:r>
-      <w:r>
-        <w:rPr>
-          <w:rFonts w:ascii="Times New Roman" w:hAnsi="Times New Roman" w:cs="Times New Roman"/>
-          <w:sz w:val="24"/>
-        </w:rPr>
-        <w:t xml:space="preserve"> </w:t>
-      </w:r>
-      <w:r>
-        <w:rPr>
-          <w:rFonts w:ascii="Times New Roman" w:hAnsi="Times New Roman" w:cs="Times New Roman"/>
-          <w:sz w:val="24"/>
-        </w:rPr>
-        <w:t>Behaviorally</w:t>
-      </w:r>
-      <w:r>
-        <w:rPr>
-          <w:rFonts w:ascii="Times New Roman" w:hAnsi="Times New Roman" w:cs="Times New Roman"/>
-          <w:sz w:val="24"/>
-        </w:rPr>
-        <w:t xml:space="preserve">, </w:t>
-      </w:r>
-      <w:r>
-        <w:rPr>
-          <w:rFonts w:ascii="Times New Roman" w:hAnsi="Times New Roman" w:cs="Times New Roman"/>
-          <w:sz w:val="24"/>
-        </w:rPr>
-        <w:t xml:space="preserve">sleep-related factors have been suggested </w:t>
-      </w:r>
-      <w:r>
-        <w:rPr>
-          <w:rFonts w:ascii="Times New Roman" w:hAnsi="Times New Roman" w:cs="Times New Roman"/>
-          <w:sz w:val="24"/>
-        </w:rPr>
-        <w:t xml:space="preserve">to </w:t>
-      </w:r>
-      <w:r>
-        <w:rPr>
-          <w:rFonts w:ascii="Times New Roman" w:hAnsi="Times New Roman" w:cs="Times New Roman"/>
-          <w:sz w:val="24"/>
-        </w:rPr>
-        <w:t xml:space="preserve">play an important role in </w:t>
-      </w:r>
-      <w:r>
-        <w:rPr>
-          <w:rFonts w:ascii="Times New Roman" w:hAnsi="Times New Roman" w:cs="Times New Roman"/>
-          <w:sz w:val="24"/>
-        </w:rPr>
-        <w:t xml:space="preserve">emotional regulation. </w:t>
-      </w:r>
-      <w:r>
-        <w:rPr>
-          <w:rFonts w:ascii="Times New Roman" w:hAnsi="Times New Roman" w:cs="Times New Roman"/>
-          <w:sz w:val="24"/>
-        </w:rPr>
-        <w:t>Psychologically</w:t>
-      </w:r>
-      <w:r>
-        <w:rPr>
-          <w:rFonts w:ascii="Times New Roman" w:hAnsi="Times New Roman" w:cs="Times New Roman"/>
-          <w:sz w:val="24"/>
-        </w:rPr>
-        <w:t xml:space="preserve">, stress level </w:t>
-      </w:r>
-      <w:r>
-        <w:rPr>
-          <w:rFonts w:ascii="Times New Roman" w:hAnsi="Times New Roman" w:cs="Times New Roman"/>
-          <w:sz w:val="24"/>
-        </w:rPr>
-        <w:t>has</w:t>
-      </w:r>
-      <w:r>
-        <w:rPr>
-          <w:rFonts w:ascii="Times New Roman" w:hAnsi="Times New Roman" w:cs="Times New Roman"/>
-          <w:sz w:val="24"/>
-        </w:rPr>
-        <w:t xml:space="preserve"> been </w:t>
-      </w:r>
-      <w:r>
-        <w:rPr>
-          <w:rFonts w:ascii="Times New Roman" w:hAnsi="Times New Roman" w:cs="Times New Roman"/>
-          <w:sz w:val="24"/>
-        </w:rPr>
-        <w:t>extensively</w:t>
-      </w:r>
-      <w:r>
-        <w:rPr>
-          <w:rFonts w:ascii="Times New Roman" w:hAnsi="Times New Roman" w:cs="Times New Roman"/>
-          <w:sz w:val="24"/>
-        </w:rPr>
-        <w:t xml:space="preserve"> </w:t>
-      </w:r>
-      <w:r>
-        <w:rPr>
-          <w:rFonts w:ascii="Times New Roman" w:hAnsi="Times New Roman" w:cs="Times New Roman"/>
-          <w:sz w:val="24"/>
-        </w:rPr>
-        <w:t>investigated</w:t>
-      </w:r>
-      <w:r>
-        <w:rPr>
-          <w:rFonts w:ascii="Times New Roman" w:hAnsi="Times New Roman" w:cs="Times New Roman"/>
-          <w:sz w:val="24"/>
-        </w:rPr>
-        <w:t xml:space="preserve"> </w:t>
-      </w:r>
-      <w:r>
-        <w:rPr>
-          <w:rFonts w:ascii="Times New Roman" w:hAnsi="Times New Roman" w:cs="Times New Roman"/>
-          <w:sz w:val="24"/>
-        </w:rPr>
-        <w:t xml:space="preserve">through </w:t>
-      </w:r>
-      <w:r>
-        <w:rPr>
-          <w:rFonts w:ascii="Times New Roman" w:hAnsi="Times New Roman" w:cs="Times New Roman"/>
-          <w:sz w:val="24"/>
-        </w:rPr>
-        <w:t>behavioral</w:t>
-      </w:r>
-      <w:r>
-        <w:rPr>
-          <w:rFonts w:ascii="Times New Roman" w:hAnsi="Times New Roman" w:cs="Times New Roman"/>
-          <w:sz w:val="24"/>
-        </w:rPr>
-        <w:t xml:space="preserve"> </w:t>
-      </w:r>
-      <w:r>
-        <w:rPr>
-          <w:rFonts w:ascii="Times New Roman" w:hAnsi="Times New Roman" w:cs="Times New Roman"/>
-          <w:sz w:val="24"/>
-        </w:rPr>
-        <w:t>and neurobiological</w:t>
-      </w:r>
-      <w:r>
-        <w:rPr>
-          <w:rFonts w:ascii="Times New Roman" w:hAnsi="Times New Roman" w:cs="Times New Roman"/>
-          <w:sz w:val="24"/>
-        </w:rPr>
-        <w:t xml:space="preserve"> approaches</w:t>
-      </w:r>
-      <w:r>
-        <w:rPr>
-          <w:rFonts w:ascii="Times New Roman" w:hAnsi="Times New Roman" w:cs="Times New Roman"/>
-          <w:sz w:val="24"/>
-        </w:rPr>
-        <w:t xml:space="preserve">. Based on the current theories, this project </w:t>
-      </w:r>
-      <w:r>
-        <w:rPr>
-          <w:rFonts w:ascii="Times New Roman" w:hAnsi="Times New Roman" w:cs="Times New Roman"/>
-          <w:sz w:val="24"/>
-        </w:rPr>
-        <w:t xml:space="preserve">therefore </w:t>
-      </w:r>
-      <w:r>
-        <w:rPr>
-          <w:rFonts w:ascii="Times New Roman" w:hAnsi="Times New Roman" w:cs="Times New Roman"/>
-          <w:sz w:val="24"/>
-        </w:rPr>
-        <w:t xml:space="preserve">aims to </w:t>
-      </w:r>
-      <w:r>
-        <w:rPr>
-          <w:rFonts w:ascii="Times New Roman" w:hAnsi="Times New Roman" w:cs="Times New Roman"/>
-          <w:sz w:val="24"/>
-        </w:rPr>
-        <w:t>examine research</w:t>
-      </w:r>
-      <w:r>
-        <w:rPr>
-          <w:rFonts w:ascii="Times New Roman" w:hAnsi="Times New Roman" w:cs="Times New Roman"/>
-          <w:sz w:val="24"/>
-        </w:rPr>
-        <w:t xml:space="preserve"> two questions (1)</w:t>
-      </w:r>
-      <w:r>
-        <w:rPr>
-          <w:rFonts w:ascii="Times New Roman" w:hAnsi="Times New Roman" w:cs="Times New Roman"/>
-          <w:sz w:val="24"/>
-        </w:rPr>
-        <w:t xml:space="preserve"> </w:t>
-      </w:r>
-      <w:r>
-        <w:rPr>
-          <w:rFonts w:ascii="Times New Roman" w:hAnsi="Times New Roman" w:cs="Times New Roman"/>
-          <w:sz w:val="24"/>
-        </w:rPr>
-        <w:t xml:space="preserve">association between </w:t>
-      </w:r>
-      <w:r>
-        <w:rPr>
-          <w:rFonts w:ascii="Times New Roman" w:hAnsi="Times New Roman" w:cs="Times New Roman"/>
-          <w:sz w:val="24"/>
-        </w:rPr>
-        <w:t>emotional regulation</w:t>
-      </w:r>
-      <w:r>
-        <w:rPr>
-          <w:rFonts w:ascii="Times New Roman" w:hAnsi="Times New Roman" w:cs="Times New Roman"/>
-          <w:sz w:val="24"/>
-        </w:rPr>
-        <w:t xml:space="preserve"> and</w:t>
-      </w:r>
-      <w:r>
-        <w:rPr>
-          <w:rFonts w:ascii="Times New Roman" w:hAnsi="Times New Roman" w:cs="Times New Roman" w:hint="eastAsia"/>
-          <w:sz w:val="24"/>
-        </w:rPr>
-        <w:t xml:space="preserve"> </w:t>
-      </w:r>
-      <w:r>
-        <w:rPr>
-          <w:rFonts w:ascii="Times New Roman" w:hAnsi="Times New Roman" w:cs="Times New Roman"/>
-          <w:sz w:val="24"/>
-        </w:rPr>
-        <w:t>representing</w:t>
-      </w:r>
-      <w:r>
-        <w:rPr>
-          <w:rFonts w:ascii="Times New Roman" w:hAnsi="Times New Roman" w:cs="Times New Roman"/>
-          <w:sz w:val="24"/>
-        </w:rPr>
-        <w:t xml:space="preserve"> an external behavioral contributor </w:t>
-      </w:r>
-      <w:r>
-        <w:rPr>
-          <w:rFonts w:ascii="Times New Roman" w:hAnsi="Times New Roman" w:cs="Times New Roman"/>
-          <w:sz w:val="24"/>
-        </w:rPr>
-        <w:t>and (2)</w:t>
-      </w:r>
-      <w:r>
-        <w:rPr>
-          <w:rFonts w:ascii="Times New Roman" w:hAnsi="Times New Roman" w:cs="Times New Roman"/>
-          <w:sz w:val="24"/>
-        </w:rPr>
-        <w:t xml:space="preserve"> association between </w:t>
-      </w:r>
-      <w:r>
-        <w:rPr>
-          <w:rFonts w:ascii="Times New Roman" w:hAnsi="Times New Roman" w:cs="Times New Roman"/>
-          <w:sz w:val="24"/>
-        </w:rPr>
-        <w:t xml:space="preserve">cognitive performances and </w:t>
-      </w:r>
-      <w:r>
-        <w:rPr>
-          <w:rFonts w:ascii="Times New Roman" w:hAnsi="Times New Roman" w:cs="Times New Roman" w:hint="eastAsia"/>
-          <w:sz w:val="24"/>
-        </w:rPr>
-        <w:t xml:space="preserve">psychological factors </w:t>
-      </w:r>
-      <w:r>
-        <w:rPr>
-          <w:rFonts w:ascii="Times New Roman" w:hAnsi="Times New Roman" w:cs="Times New Roman"/>
-          <w:sz w:val="24"/>
-        </w:rPr>
-        <w:t xml:space="preserve">including stress level and emotion regulation representing </w:t>
-      </w:r>
-      <w:r>
-        <w:rPr>
-          <w:rFonts w:ascii="Times New Roman" w:hAnsi="Times New Roman" w:cs="Times New Roman" w:hint="eastAsia"/>
-          <w:sz w:val="24"/>
-        </w:rPr>
-        <w:t xml:space="preserve">an </w:t>
-      </w:r>
-      <w:r>
-        <w:rPr>
-          <w:rFonts w:ascii="Times New Roman" w:hAnsi="Times New Roman" w:cs="Times New Roman"/>
-          <w:sz w:val="24"/>
-        </w:rPr>
-        <w:t>internally</w:t>
-      </w:r>
-      <w:r>
-        <w:rPr>
-          <w:rFonts w:ascii="Times New Roman" w:hAnsi="Times New Roman" w:cs="Times New Roman" w:hint="eastAsia"/>
-          <w:sz w:val="24"/>
-        </w:rPr>
-        <w:t xml:space="preserve"> originated </w:t>
-      </w:r>
-      <w:r>
-        <w:rPr>
-          <w:rFonts w:ascii="Times New Roman" w:hAnsi="Times New Roman" w:cs="Times New Roman"/>
-          <w:sz w:val="24"/>
-        </w:rPr>
-        <w:t>contributor but in turn target on internal cognitive performances</w:t>
-      </w:r>
-      <w:r>
-        <w:rPr>
-          <w:rFonts w:ascii="Times New Roman" w:hAnsi="Times New Roman" w:cs="Times New Roman"/>
-          <w:sz w:val="24"/>
-        </w:rPr>
-        <w:t>,</w:t>
-      </w:r>
-      <w:r>
-        <w:rPr>
-          <w:rFonts w:ascii="Times New Roman" w:hAnsi="Times New Roman" w:cs="Times New Roman"/>
-          <w:sz w:val="24"/>
-        </w:rPr>
-        <w:t xml:space="preserve"> </w:t>
-      </w:r>
-      <w:r>
-        <w:rPr>
-          <w:rFonts w:ascii="Times New Roman" w:hAnsi="Times New Roman" w:cs="Times New Roman"/>
-          <w:sz w:val="24"/>
-        </w:rPr>
-        <w:tab/>
-      </w:r>
-      <w:r>
-        <w:rPr>
-          <w:rFonts w:ascii="Times New Roman" w:hAnsi="Times New Roman" w:cs="Times New Roman"/>
-          <w:sz w:val="24"/>
-        </w:rPr>
-        <w:tab/>
-      </w:r>
-      <w:r>
-        <w:rPr>
-          <w:rFonts w:ascii="Times New Roman" w:hAnsi="Times New Roman" w:cs="Times New Roman"/>
-          <w:sz w:val="24"/>
-        </w:rPr>
-        <w:tab/>
-      </w:r>
-      <w:r>
-        <w:rPr>
-          <w:rFonts w:ascii="Times New Roman" w:hAnsi="Times New Roman" w:cs="Times New Roman"/>
-          <w:sz w:val="24"/>
-        </w:rPr>
-        <w:tab/>
-      </w:r>
-      <w:r>
-        <w:rPr>
-          <w:rFonts w:ascii="Times New Roman" w:hAnsi="Times New Roman" w:cs="Times New Roman"/>
-          <w:sz w:val="24"/>
-        </w:rPr>
-        <w:tab/>
-      </w:r>
-      <w:r>
-        <w:rPr>
-          <w:rFonts w:ascii="Times New Roman" w:hAnsi="Times New Roman" w:cs="Times New Roman"/>
-          <w:sz w:val="24"/>
-        </w:rPr>
-        <w:tab/>
-      </w:r>
-      <w:r>
-        <w:rPr>
-          <w:rFonts w:ascii="Times New Roman" w:hAnsi="Times New Roman" w:cs="Times New Roman"/>
-          <w:sz w:val="24"/>
-        </w:rPr>
-        <w:tab/>
-      </w:r>
-      <w:r>
-        <w:rPr>
-          <w:rFonts w:ascii="Times New Roman" w:hAnsi="Times New Roman" w:cs="Times New Roman"/>
-          <w:sz w:val="24"/>
-        </w:rPr>
-        <w:tab/>
-      </w:r>
-      <w:r>
-        <w:rPr>
-          <w:rFonts w:ascii="Times New Roman" w:hAnsi="Times New Roman" w:cs="Times New Roman"/>
-          <w:sz w:val="24"/>
-        </w:rPr>
-        <w:tab/>
-      </w:r>
-      <w:r>
-        <w:rPr>
-          <w:rFonts w:ascii="Times New Roman" w:hAnsi="Times New Roman" w:cs="Times New Roman"/>
-          <w:sz w:val="24"/>
-        </w:rPr>
-        <w:tab/>
-      </w:r>
-      <w:r>
-        <w:rPr>
-          <w:rFonts w:ascii="Times New Roman" w:hAnsi="Times New Roman" w:cs="Times New Roman"/>
-          <w:sz w:val="24"/>
-        </w:rPr>
-        <w:tab/>
-      </w:r>
-      <w:r>
-        <w:rPr>
-          <w:rFonts w:ascii="Times New Roman" w:hAnsi="Times New Roman" w:cs="Times New Roman"/>
-          <w:sz w:val="24"/>
-        </w:rPr>
-        <w:tab/>
-      </w:r>
-      <w:r>
-        <w:rPr>
-          <w:rFonts w:ascii="Times New Roman" w:hAnsi="Times New Roman" w:cs="Times New Roman"/>
-          <w:sz w:val="24"/>
-        </w:rPr>
-        <w:tab/>
-      </w:r>
-      <w:r>
-        <w:rPr>
-          <w:rFonts w:ascii="Times New Roman" w:hAnsi="Times New Roman" w:cs="Times New Roman"/>
-          <w:sz w:val="24"/>
-        </w:rPr>
-        <w:tab/>
-      </w:r>
     </w:p>
     <w:sectPr>
       <w:pgSz w:w="11906" w:h="16838"/>
@@ -1773,6 +1682,23 @@
       <w:spacing w:val="5"/>
     </w:rPr>
   </w:style>
+  <w:style w:type="paragraph" w:styleId="ae">
+    <w:name w:val="Normal (Web)"/>
+    <w:basedOn w:val="a"/>
+    <w:uiPriority w:val="99"/>
+    <w:unhideWhenUsed/>
+    <w:rsid w:val="00EC70AF"/>
+    <w:pPr>
+      <w:widowControl/>
+      <w:spacing w:before="100" w:beforeAutospacing="1" w:after="100" w:afterAutospacing="1" w:line="240" w:lineRule="auto"/>
+    </w:pPr>
+    <w:rPr>
+      <w:rFonts w:ascii="宋体" w:eastAsia="宋体" w:hAnsi="宋体" w:cs="宋体"/>
+      <w:kern w:val="0"/>
+      <w:sz w:val="24"/>
+      <w14:ligatures w14:val="none"/>
+    </w:rPr>
+  </w:style>
 </w:styles>
 </file>
 

</xml_diff>

<commit_message>
updating formal analysis report
</commit_message>
<xml_diff>
--- a/Project1_Sleep_Deprivation_Cognition/Report/Analysis_Report.docx
+++ b/Project1_Sleep_Deprivation_Cognition/Report/Analysis_Report.docx
@@ -164,7 +164,7 @@
         <w:rPr>
           <w:rFonts w:ascii="Times New Roman" w:hAnsi="Times New Roman" w:cs="Times New Roman"/>
           <w:sz w:val="24"/>
-          <w:lang w:val="fr-CA" w:eastAsia="ja-JP"/>
+          <w:lang w:eastAsia="ja-JP"/>
         </w:rPr>
       </w:pPr>
       <w:proofErr w:type="gramStart"/>
@@ -186,7 +186,7 @@
         <w:rPr>
           <w:rFonts w:ascii="Times New Roman" w:hAnsi="Times New Roman" w:cs="Times New Roman"/>
           <w:sz w:val="24"/>
-          <w:lang w:val="fr-CA" w:eastAsia="ja-JP"/>
+          <w:lang w:eastAsia="ja-JP"/>
         </w:rPr>
         <w:t>:</w:t>
       </w:r>
@@ -195,7 +195,7 @@
         <w:rPr>
           <w:rFonts w:ascii="Times New Roman" w:hAnsi="Times New Roman" w:cs="Times New Roman"/>
           <w:sz w:val="24"/>
-          <w:lang w:val="fr-CA" w:eastAsia="ja-JP"/>
+          <w:lang w:eastAsia="ja-JP"/>
         </w:rPr>
         <w:t xml:space="preserve"> August</w:t>
       </w:r>
@@ -207,161 +207,146 @@
           <w:b/>
           <w:bCs/>
           <w:sz w:val="24"/>
-          <w:lang w:val="fr-CA"/>
-        </w:rPr>
-      </w:pPr>
-    </w:p>
-    <w:p>
-      <w:pPr>
-        <w:rPr>
-          <w:rFonts w:ascii="Times New Roman" w:hAnsi="Times New Roman" w:cs="Times New Roman"/>
-          <w:b/>
-          <w:bCs/>
-          <w:sz w:val="24"/>
-          <w:lang w:val="fr-CA"/>
-        </w:rPr>
-      </w:pPr>
-    </w:p>
-    <w:p>
-      <w:pPr>
-        <w:rPr>
-          <w:rFonts w:ascii="Times New Roman" w:hAnsi="Times New Roman" w:cs="Times New Roman"/>
-          <w:b/>
-          <w:bCs/>
-          <w:sz w:val="24"/>
-          <w:lang w:val="fr-CA"/>
-        </w:rPr>
-      </w:pPr>
-    </w:p>
-    <w:p>
-      <w:pPr>
-        <w:rPr>
-          <w:rFonts w:ascii="Times New Roman" w:hAnsi="Times New Roman" w:cs="Times New Roman"/>
-          <w:b/>
-          <w:bCs/>
-          <w:sz w:val="24"/>
-          <w:lang w:val="fr-CA"/>
-        </w:rPr>
-      </w:pPr>
-    </w:p>
-    <w:p>
-      <w:pPr>
-        <w:rPr>
-          <w:rFonts w:ascii="Times New Roman" w:hAnsi="Times New Roman" w:cs="Times New Roman"/>
-          <w:b/>
-          <w:bCs/>
-          <w:sz w:val="24"/>
-          <w:lang w:val="fr-CA"/>
-        </w:rPr>
-      </w:pPr>
-    </w:p>
-    <w:p>
-      <w:pPr>
-        <w:rPr>
-          <w:rFonts w:ascii="Times New Roman" w:hAnsi="Times New Roman" w:cs="Times New Roman"/>
-          <w:b/>
-          <w:bCs/>
-          <w:sz w:val="24"/>
-          <w:lang w:val="fr-CA"/>
-        </w:rPr>
-      </w:pPr>
-    </w:p>
-    <w:p>
-      <w:pPr>
-        <w:rPr>
-          <w:rFonts w:ascii="Times New Roman" w:hAnsi="Times New Roman" w:cs="Times New Roman"/>
-          <w:b/>
-          <w:bCs/>
-          <w:sz w:val="24"/>
-          <w:lang w:val="fr-CA"/>
-        </w:rPr>
-      </w:pPr>
-    </w:p>
-    <w:p>
-      <w:pPr>
-        <w:rPr>
-          <w:rFonts w:ascii="Times New Roman" w:hAnsi="Times New Roman" w:cs="Times New Roman"/>
-          <w:b/>
-          <w:bCs/>
-          <w:sz w:val="24"/>
-          <w:lang w:val="fr-CA"/>
-        </w:rPr>
-      </w:pPr>
-    </w:p>
-    <w:p>
-      <w:pPr>
-        <w:rPr>
-          <w:rFonts w:ascii="Times New Roman" w:hAnsi="Times New Roman" w:cs="Times New Roman"/>
-          <w:b/>
-          <w:bCs/>
-          <w:sz w:val="24"/>
-          <w:lang w:val="fr-CA"/>
-        </w:rPr>
-      </w:pPr>
-    </w:p>
-    <w:p>
-      <w:pPr>
-        <w:rPr>
-          <w:rFonts w:ascii="Times New Roman" w:hAnsi="Times New Roman" w:cs="Times New Roman"/>
-          <w:b/>
-          <w:bCs/>
-          <w:sz w:val="24"/>
-          <w:lang w:val="fr-CA"/>
-        </w:rPr>
-      </w:pPr>
-    </w:p>
-    <w:p>
-      <w:pPr>
-        <w:rPr>
-          <w:rFonts w:ascii="Times New Roman" w:hAnsi="Times New Roman" w:cs="Times New Roman"/>
-          <w:b/>
-          <w:bCs/>
-          <w:sz w:val="24"/>
-          <w:lang w:val="fr-CA"/>
-        </w:rPr>
-      </w:pPr>
-    </w:p>
-    <w:p>
-      <w:pPr>
-        <w:rPr>
-          <w:rFonts w:ascii="Times New Roman" w:hAnsi="Times New Roman" w:cs="Times New Roman"/>
-          <w:b/>
-          <w:bCs/>
-          <w:sz w:val="24"/>
-          <w:lang w:val="fr-CA"/>
-        </w:rPr>
-      </w:pPr>
-    </w:p>
-    <w:p>
-      <w:pPr>
-        <w:rPr>
-          <w:rFonts w:ascii="Times New Roman" w:hAnsi="Times New Roman" w:cs="Times New Roman"/>
-          <w:b/>
-          <w:bCs/>
-          <w:sz w:val="24"/>
-          <w:lang w:val="fr-CA"/>
-        </w:rPr>
-      </w:pPr>
-    </w:p>
-    <w:p>
-      <w:pPr>
-        <w:rPr>
-          <w:rFonts w:ascii="Times New Roman" w:hAnsi="Times New Roman" w:cs="Times New Roman"/>
-          <w:b/>
-          <w:bCs/>
-          <w:sz w:val="24"/>
-          <w:lang w:val="fr-CA"/>
-        </w:rPr>
-      </w:pPr>
-    </w:p>
-    <w:p>
-      <w:pPr>
-        <w:rPr>
-          <w:rFonts w:ascii="Times New Roman" w:hAnsi="Times New Roman" w:cs="Times New Roman"/>
-          <w:b/>
-          <w:bCs/>
-          <w:sz w:val="24"/>
-          <w:lang w:val="fr-CA"/>
+        </w:rPr>
+      </w:pPr>
+    </w:p>
+    <w:p>
+      <w:pPr>
+        <w:rPr>
+          <w:rFonts w:ascii="Times New Roman" w:hAnsi="Times New Roman" w:cs="Times New Roman"/>
+          <w:b/>
+          <w:bCs/>
+          <w:sz w:val="24"/>
+        </w:rPr>
+      </w:pPr>
+    </w:p>
+    <w:p>
+      <w:pPr>
+        <w:rPr>
+          <w:rFonts w:ascii="Times New Roman" w:hAnsi="Times New Roman" w:cs="Times New Roman"/>
+          <w:b/>
+          <w:bCs/>
+          <w:sz w:val="24"/>
+        </w:rPr>
+      </w:pPr>
+    </w:p>
+    <w:p>
+      <w:pPr>
+        <w:rPr>
+          <w:rFonts w:ascii="Times New Roman" w:hAnsi="Times New Roman" w:cs="Times New Roman"/>
+          <w:b/>
+          <w:bCs/>
+          <w:sz w:val="24"/>
+        </w:rPr>
+      </w:pPr>
+    </w:p>
+    <w:p>
+      <w:pPr>
+        <w:rPr>
+          <w:rFonts w:ascii="Times New Roman" w:hAnsi="Times New Roman" w:cs="Times New Roman"/>
+          <w:b/>
+          <w:bCs/>
+          <w:sz w:val="24"/>
+        </w:rPr>
+      </w:pPr>
+    </w:p>
+    <w:p>
+      <w:pPr>
+        <w:rPr>
+          <w:rFonts w:ascii="Times New Roman" w:hAnsi="Times New Roman" w:cs="Times New Roman"/>
+          <w:b/>
+          <w:bCs/>
+          <w:sz w:val="24"/>
+        </w:rPr>
+      </w:pPr>
+    </w:p>
+    <w:p>
+      <w:pPr>
+        <w:rPr>
+          <w:rFonts w:ascii="Times New Roman" w:hAnsi="Times New Roman" w:cs="Times New Roman"/>
+          <w:b/>
+          <w:bCs/>
+          <w:sz w:val="24"/>
+        </w:rPr>
+      </w:pPr>
+    </w:p>
+    <w:p>
+      <w:pPr>
+        <w:rPr>
+          <w:rFonts w:ascii="Times New Roman" w:hAnsi="Times New Roman" w:cs="Times New Roman"/>
+          <w:b/>
+          <w:bCs/>
+          <w:sz w:val="24"/>
+        </w:rPr>
+      </w:pPr>
+    </w:p>
+    <w:p>
+      <w:pPr>
+        <w:rPr>
+          <w:rFonts w:ascii="Times New Roman" w:hAnsi="Times New Roman" w:cs="Times New Roman"/>
+          <w:b/>
+          <w:bCs/>
+          <w:sz w:val="24"/>
+        </w:rPr>
+      </w:pPr>
+    </w:p>
+    <w:p>
+      <w:pPr>
+        <w:rPr>
+          <w:rFonts w:ascii="Times New Roman" w:hAnsi="Times New Roman" w:cs="Times New Roman"/>
+          <w:b/>
+          <w:bCs/>
+          <w:sz w:val="24"/>
+        </w:rPr>
+      </w:pPr>
+    </w:p>
+    <w:p>
+      <w:pPr>
+        <w:rPr>
+          <w:rFonts w:ascii="Times New Roman" w:hAnsi="Times New Roman" w:cs="Times New Roman"/>
+          <w:b/>
+          <w:bCs/>
+          <w:sz w:val="24"/>
+        </w:rPr>
+      </w:pPr>
+    </w:p>
+    <w:p>
+      <w:pPr>
+        <w:rPr>
+          <w:rFonts w:ascii="Times New Roman" w:hAnsi="Times New Roman" w:cs="Times New Roman"/>
+          <w:b/>
+          <w:bCs/>
+          <w:sz w:val="24"/>
+        </w:rPr>
+      </w:pPr>
+    </w:p>
+    <w:p>
+      <w:pPr>
+        <w:rPr>
+          <w:rFonts w:ascii="Times New Roman" w:hAnsi="Times New Roman" w:cs="Times New Roman"/>
+          <w:b/>
+          <w:bCs/>
+          <w:sz w:val="24"/>
+        </w:rPr>
+      </w:pPr>
+    </w:p>
+    <w:p>
+      <w:pPr>
+        <w:rPr>
+          <w:rFonts w:ascii="Times New Roman" w:hAnsi="Times New Roman" w:cs="Times New Roman"/>
+          <w:b/>
+          <w:bCs/>
+          <w:sz w:val="24"/>
+        </w:rPr>
+      </w:pPr>
+    </w:p>
+    <w:p>
+      <w:pPr>
+        <w:rPr>
+          <w:rFonts w:ascii="Times New Roman" w:hAnsi="Times New Roman" w:cs="Times New Roman"/>
+          <w:b/>
+          <w:bCs/>
+          <w:sz w:val="24"/>
         </w:rPr>
       </w:pPr>
     </w:p>
@@ -373,19 +358,17 @@
           <w:b/>
           <w:bCs/>
           <w:sz w:val="24"/>
-          <w:lang w:val="fr-CA"/>
-        </w:rPr>
-      </w:pPr>
-      <w:r>
-        <w:rPr>
-          <w:rFonts w:ascii="Times New Roman" w:hAnsi="Times New Roman" w:cs="Times New Roman"/>
-          <w:b/>
-          <w:bCs/>
-          <w:sz w:val="24"/>
-          <w:lang w:val="fr-CA"/>
+        </w:rPr>
+      </w:pPr>
+      <w:r>
+        <w:rPr>
+          <w:rFonts w:ascii="Times New Roman" w:hAnsi="Times New Roman" w:cs="Times New Roman"/>
+          <w:b/>
+          <w:bCs/>
+          <w:sz w:val="24"/>
         </w:rPr>
         <w:lastRenderedPageBreak/>
-        <w:t>Abstract :</w:t>
+        <w:t>Abstract:</w:t>
       </w:r>
     </w:p>
     <w:p>
@@ -428,37 +411,7 @@
         <w:rPr>
           <w:rFonts w:ascii="Times New Roman" w:hAnsi="Times New Roman" w:cs="Times New Roman"/>
         </w:rPr>
-        <w:t>or the first module,</w:t>
-      </w:r>
-      <w:r>
-        <w:rPr>
-          <w:rFonts w:ascii="Times New Roman" w:hAnsi="Times New Roman" w:cs="Times New Roman"/>
-        </w:rPr>
-        <w:t xml:space="preserve"> regression-based models were</w:t>
-      </w:r>
-      <w:r>
-        <w:rPr>
-          <w:rFonts w:ascii="Times New Roman" w:hAnsi="Times New Roman" w:cs="Times New Roman"/>
-        </w:rPr>
-        <w:t xml:space="preserve"> constructed</w:t>
-      </w:r>
-      <w:r>
-        <w:rPr>
-          <w:rFonts w:ascii="Times New Roman" w:hAnsi="Times New Roman" w:cs="Times New Roman"/>
-        </w:rPr>
-        <w:t xml:space="preserve"> to </w:t>
-      </w:r>
-      <w:r>
-        <w:rPr>
-          <w:rFonts w:ascii="Times New Roman" w:hAnsi="Times New Roman" w:cs="Times New Roman"/>
-        </w:rPr>
-        <w:t>evaluate</w:t>
-      </w:r>
-      <w:r>
-        <w:rPr>
-          <w:rFonts w:ascii="Times New Roman" w:hAnsi="Times New Roman" w:cs="Times New Roman"/>
-        </w:rPr>
-        <w:t xml:space="preserve"> associations between sleep-related factors and emotional regulation, including the </w:t>
+        <w:t xml:space="preserve">or the first module, regression-based models were constructed to evaluate associations between sleep-related factors and emotional regulation, including the </w:t>
       </w:r>
       <w:r>
         <w:rPr>
@@ -470,73 +423,55 @@
         <w:rPr>
           <w:rFonts w:ascii="Times New Roman" w:hAnsi="Times New Roman" w:cs="Times New Roman"/>
         </w:rPr>
+        <w:t xml:space="preserve">. For the second module, Principal component analysis (PCA) was </w:t>
+      </w:r>
+      <w:r>
+        <w:rPr>
+          <w:rFonts w:ascii="Times New Roman" w:hAnsi="Times New Roman" w:cs="Times New Roman"/>
+        </w:rPr>
+        <w:t xml:space="preserve">initially </w:t>
+      </w:r>
+      <w:r>
+        <w:rPr>
+          <w:rFonts w:ascii="Times New Roman" w:hAnsi="Times New Roman" w:cs="Times New Roman"/>
+        </w:rPr>
+        <w:t>conducted to explore the potential commonality among cognitive measures, followed by analyses examining associations between psychological</w:t>
+      </w:r>
+      <w:r>
+        <w:rPr>
+          <w:rFonts w:ascii="Times New Roman" w:hAnsi="Times New Roman" w:cs="Times New Roman"/>
+        </w:rPr>
+        <w:t xml:space="preserve"> predictors including stress levels and emotion regulation</w:t>
+      </w:r>
+      <w:r>
+        <w:rPr>
+          <w:rFonts w:ascii="Times New Roman" w:hAnsi="Times New Roman" w:cs="Times New Roman"/>
+        </w:rPr>
+        <w:t>,</w:t>
+      </w:r>
+      <w:r>
+        <w:rPr>
+          <w:rFonts w:ascii="Times New Roman" w:hAnsi="Times New Roman" w:cs="Times New Roman"/>
+        </w:rPr>
+        <w:t xml:space="preserve"> </w:t>
+      </w:r>
+      <w:r>
+        <w:rPr>
+          <w:rFonts w:ascii="Times New Roman" w:hAnsi="Times New Roman" w:cs="Times New Roman"/>
+        </w:rPr>
+        <w:t>and individual cognitive</w:t>
+      </w:r>
+      <w:r>
+        <w:rPr>
+          <w:rFonts w:ascii="Times New Roman" w:hAnsi="Times New Roman" w:cs="Times New Roman"/>
+        </w:rPr>
+        <w:t xml:space="preserve"> outcomes</w:t>
+      </w:r>
+      <w:r>
+        <w:rPr>
+          <w:rFonts w:ascii="Times New Roman" w:hAnsi="Times New Roman" w:cs="Times New Roman"/>
+        </w:rPr>
         <w:t xml:space="preserve">. </w:t>
-      </w:r>
-      <w:r>
-        <w:rPr>
-          <w:rFonts w:ascii="Times New Roman" w:hAnsi="Times New Roman" w:cs="Times New Roman"/>
-        </w:rPr>
-        <w:t xml:space="preserve">For the second module, </w:t>
-      </w:r>
-      <w:r>
-        <w:rPr>
-          <w:rFonts w:ascii="Times New Roman" w:hAnsi="Times New Roman" w:cs="Times New Roman"/>
-        </w:rPr>
-        <w:t xml:space="preserve">Principal component analysis (PCA) was </w:t>
-      </w:r>
-      <w:r>
-        <w:rPr>
-          <w:rFonts w:ascii="Times New Roman" w:hAnsi="Times New Roman" w:cs="Times New Roman"/>
-        </w:rPr>
-        <w:t xml:space="preserve">initially </w:t>
-      </w:r>
-      <w:r>
-        <w:rPr>
-          <w:rFonts w:ascii="Times New Roman" w:hAnsi="Times New Roman" w:cs="Times New Roman"/>
-        </w:rPr>
-        <w:t>conducted to explore the potential commonality among cognitive measures, followed by analyses examining associations between psychological</w:t>
-      </w:r>
-      <w:r>
-        <w:rPr>
-          <w:rFonts w:ascii="Times New Roman" w:hAnsi="Times New Roman" w:cs="Times New Roman"/>
-        </w:rPr>
-        <w:t xml:space="preserve"> predictors including stress levels and emotion regulation</w:t>
-      </w:r>
-      <w:r>
-        <w:rPr>
-          <w:rFonts w:ascii="Times New Roman" w:hAnsi="Times New Roman" w:cs="Times New Roman"/>
-        </w:rPr>
-        <w:t>,</w:t>
-      </w:r>
-      <w:r>
-        <w:rPr>
-          <w:rFonts w:ascii="Times New Roman" w:hAnsi="Times New Roman" w:cs="Times New Roman"/>
-        </w:rPr>
-        <w:t xml:space="preserve"> </w:t>
-      </w:r>
-      <w:r>
-        <w:rPr>
-          <w:rFonts w:ascii="Times New Roman" w:hAnsi="Times New Roman" w:cs="Times New Roman"/>
-        </w:rPr>
-        <w:t>and individual cognitive</w:t>
-      </w:r>
-      <w:r>
-        <w:rPr>
-          <w:rFonts w:ascii="Times New Roman" w:hAnsi="Times New Roman" w:cs="Times New Roman"/>
-        </w:rPr>
-        <w:t xml:space="preserve"> outcomes</w:t>
-      </w:r>
-      <w:r>
-        <w:rPr>
-          <w:rFonts w:ascii="Times New Roman" w:hAnsi="Times New Roman" w:cs="Times New Roman"/>
-        </w:rPr>
-        <w:t>.</w:t>
-      </w:r>
-      <w:r>
-        <w:rPr>
-          <w:rFonts w:ascii="Times New Roman" w:hAnsi="Times New Roman" w:cs="Times New Roman"/>
-        </w:rPr>
-        <w:t xml:space="preserve"> </w:t>
       </w:r>
       <w:r>
         <w:rPr>
@@ -722,9 +657,314 @@
         <w:spacing w:before="0" w:beforeAutospacing="0" w:after="0" w:afterAutospacing="0"/>
         <w:jc w:val="both"/>
         <w:rPr>
+          <w:rFonts w:ascii="Times New Roman" w:hAnsi="Times New Roman" w:cs="Times New Roman"/>
+        </w:rPr>
+      </w:pPr>
+    </w:p>
+    <w:p>
+      <w:pPr>
+        <w:pStyle w:val="ae"/>
+        <w:spacing w:before="0" w:beforeAutospacing="0" w:after="0" w:afterAutospacing="0"/>
+        <w:jc w:val="both"/>
+        <w:rPr>
+          <w:rFonts w:ascii="Times New Roman" w:hAnsi="Times New Roman" w:cs="Times New Roman"/>
+          <w:b/>
+          <w:bCs/>
+        </w:rPr>
+      </w:pPr>
+      <w:r>
+        <w:rPr>
+          <w:rFonts w:ascii="Times New Roman" w:hAnsi="Times New Roman" w:cs="Times New Roman"/>
+          <w:b/>
+          <w:bCs/>
+        </w:rPr>
+        <w:t>Introduction:</w:t>
+      </w:r>
+    </w:p>
+    <w:p>
+      <w:pPr>
+        <w:spacing w:after="0" w:line="240" w:lineRule="atLeast"/>
+        <w:jc w:val="both"/>
+        <w:rPr>
           <w:rFonts w:ascii="Times New Roman" w:hAnsi="Times New Roman" w:cs="Times New Roman" w:hint="eastAsia"/>
-        </w:rPr>
-      </w:pPr>
+          <w:sz w:val="24"/>
+          <w:lang w:val="fr-CA"/>
+        </w:rPr>
+      </w:pPr>
+      <w:r>
+        <w:rPr>
+          <w:rFonts w:ascii="Times New Roman" w:hAnsi="Times New Roman" w:cs="Times New Roman"/>
+          <w:sz w:val="24"/>
+        </w:rPr>
+        <w:t>C</w:t>
+      </w:r>
+      <w:r>
+        <w:rPr>
+          <w:rFonts w:ascii="Times New Roman" w:hAnsi="Times New Roman" w:cs="Times New Roman"/>
+          <w:sz w:val="24"/>
+        </w:rPr>
+        <w:t xml:space="preserve">ognitive </w:t>
+      </w:r>
+      <w:r>
+        <w:rPr>
+          <w:rFonts w:ascii="Times New Roman" w:hAnsi="Times New Roman" w:cs="Times New Roman"/>
+          <w:sz w:val="24"/>
+        </w:rPr>
+        <w:t>processing</w:t>
+      </w:r>
+      <w:r>
+        <w:rPr>
+          <w:rFonts w:ascii="Times New Roman" w:hAnsi="Times New Roman" w:cs="Times New Roman" w:hint="eastAsia"/>
+          <w:sz w:val="24"/>
+        </w:rPr>
+        <w:t xml:space="preserve"> </w:t>
+      </w:r>
+      <w:r>
+        <w:rPr>
+          <w:rFonts w:ascii="Times New Roman" w:hAnsi="Times New Roman" w:cs="Times New Roman"/>
+          <w:sz w:val="24"/>
+        </w:rPr>
+        <w:t>is</w:t>
+      </w:r>
+      <w:r>
+        <w:rPr>
+          <w:rFonts w:ascii="Times New Roman" w:hAnsi="Times New Roman" w:cs="Times New Roman"/>
+          <w:sz w:val="24"/>
+        </w:rPr>
+        <w:t xml:space="preserve"> </w:t>
+      </w:r>
+      <w:r>
+        <w:rPr>
+          <w:rFonts w:ascii="Times New Roman" w:hAnsi="Times New Roman" w:cs="Times New Roman"/>
+          <w:sz w:val="24"/>
+        </w:rPr>
+        <w:t xml:space="preserve">known as </w:t>
+      </w:r>
+      <w:r>
+        <w:rPr>
+          <w:rFonts w:ascii="Times New Roman" w:hAnsi="Times New Roman" w:cs="Times New Roman"/>
+          <w:sz w:val="24"/>
+        </w:rPr>
+        <w:t xml:space="preserve">one of the most </w:t>
+      </w:r>
+      <w:r>
+        <w:rPr>
+          <w:rFonts w:ascii="Times New Roman" w:hAnsi="Times New Roman" w:cs="Times New Roman"/>
+          <w:sz w:val="24"/>
+        </w:rPr>
+        <w:t xml:space="preserve">fundamental </w:t>
+      </w:r>
+      <w:r>
+        <w:rPr>
+          <w:rFonts w:ascii="Times New Roman" w:hAnsi="Times New Roman" w:cs="Times New Roman" w:hint="eastAsia"/>
+          <w:sz w:val="24"/>
+        </w:rPr>
+        <w:t>topic</w:t>
+      </w:r>
+      <w:r>
+        <w:rPr>
+          <w:rFonts w:ascii="Times New Roman" w:hAnsi="Times New Roman" w:cs="Times New Roman"/>
+          <w:sz w:val="24"/>
+        </w:rPr>
+        <w:t xml:space="preserve">s in the </w:t>
+      </w:r>
+      <w:r>
+        <w:rPr>
+          <w:rFonts w:ascii="Times New Roman" w:hAnsi="Times New Roman" w:cs="Times New Roman"/>
+          <w:sz w:val="24"/>
+        </w:rPr>
+        <w:t xml:space="preserve">psychology and neuroscience, </w:t>
+      </w:r>
+      <w:r>
+        <w:rPr>
+          <w:rFonts w:ascii="Times New Roman" w:hAnsi="Times New Roman" w:cs="Times New Roman"/>
+          <w:sz w:val="24"/>
+        </w:rPr>
+        <w:t xml:space="preserve">as it </w:t>
+      </w:r>
+      <w:r>
+        <w:rPr>
+          <w:rFonts w:ascii="Times New Roman" w:hAnsi="Times New Roman" w:cs="Times New Roman"/>
+          <w:sz w:val="24"/>
+        </w:rPr>
+        <w:t>provides a</w:t>
+      </w:r>
+      <w:r>
+        <w:rPr>
+          <w:rFonts w:ascii="Times New Roman" w:hAnsi="Times New Roman" w:cs="Times New Roman"/>
+          <w:sz w:val="24"/>
+        </w:rPr>
+        <w:t xml:space="preserve"> </w:t>
+      </w:r>
+      <w:r>
+        <w:rPr>
+          <w:rFonts w:ascii="Times New Roman" w:hAnsi="Times New Roman" w:cs="Times New Roman" w:hint="eastAsia"/>
+          <w:sz w:val="24"/>
+        </w:rPr>
+        <w:t>framework</w:t>
+      </w:r>
+      <w:r>
+        <w:rPr>
+          <w:rFonts w:ascii="Times New Roman" w:hAnsi="Times New Roman" w:cs="Times New Roman"/>
+          <w:sz w:val="24"/>
+        </w:rPr>
+        <w:t xml:space="preserve"> for</w:t>
+      </w:r>
+      <w:r>
+        <w:rPr>
+          <w:rFonts w:ascii="Times New Roman" w:hAnsi="Times New Roman" w:cs="Times New Roman"/>
+          <w:sz w:val="24"/>
+        </w:rPr>
+        <w:t xml:space="preserve"> understanding </w:t>
+      </w:r>
+      <w:r>
+        <w:rPr>
+          <w:rFonts w:ascii="Times New Roman" w:hAnsi="Times New Roman" w:cs="Times New Roman" w:hint="eastAsia"/>
+          <w:sz w:val="24"/>
+        </w:rPr>
+        <w:t xml:space="preserve">functionally segregated yet integrated </w:t>
+      </w:r>
+      <w:r>
+        <w:rPr>
+          <w:rFonts w:ascii="Times New Roman" w:hAnsi="Times New Roman" w:cs="Times New Roman" w:hint="eastAsia"/>
+          <w:sz w:val="24"/>
+        </w:rPr>
+        <w:t>a</w:t>
+      </w:r>
+      <w:r>
+        <w:rPr>
+          <w:rFonts w:ascii="Times New Roman" w:hAnsi="Times New Roman" w:cs="Times New Roman"/>
+          <w:sz w:val="24"/>
+        </w:rPr>
+        <w:t>lgorithm</w:t>
+      </w:r>
+      <w:r>
+        <w:rPr>
+          <w:rFonts w:ascii="Times New Roman" w:hAnsi="Times New Roman" w:cs="Times New Roman"/>
+          <w:sz w:val="24"/>
+        </w:rPr>
+        <w:t>s</w:t>
+      </w:r>
+      <w:r>
+        <w:rPr>
+          <w:rFonts w:ascii="Times New Roman" w:hAnsi="Times New Roman" w:cs="Times New Roman"/>
+          <w:sz w:val="24"/>
+        </w:rPr>
+        <w:t xml:space="preserve"> underlying </w:t>
+      </w:r>
+      <w:r>
+        <w:rPr>
+          <w:rFonts w:ascii="Times New Roman" w:hAnsi="Times New Roman" w:cs="Times New Roman"/>
+          <w:sz w:val="24"/>
+        </w:rPr>
+        <w:t xml:space="preserve">observable </w:t>
+      </w:r>
+      <w:r>
+        <w:rPr>
+          <w:rFonts w:ascii="Times New Roman" w:hAnsi="Times New Roman" w:cs="Times New Roman" w:hint="eastAsia"/>
+          <w:sz w:val="24"/>
+        </w:rPr>
+        <w:t>way</w:t>
+      </w:r>
+      <w:r>
+        <w:rPr>
+          <w:rFonts w:ascii="Times New Roman" w:hAnsi="Times New Roman" w:cs="Times New Roman"/>
+          <w:sz w:val="24"/>
+        </w:rPr>
+        <w:t xml:space="preserve"> individuals</w:t>
+      </w:r>
+      <w:r>
+        <w:rPr>
+          <w:rFonts w:ascii="Times New Roman" w:hAnsi="Times New Roman" w:cs="Times New Roman"/>
+          <w:sz w:val="24"/>
+        </w:rPr>
+        <w:t xml:space="preserve"> interact</w:t>
+      </w:r>
+      <w:r>
+        <w:rPr>
+          <w:rFonts w:ascii="Times New Roman" w:hAnsi="Times New Roman" w:cs="Times New Roman"/>
+          <w:sz w:val="24"/>
+        </w:rPr>
+        <w:t xml:space="preserve"> with the </w:t>
+      </w:r>
+      <w:r>
+        <w:rPr>
+          <w:rFonts w:ascii="Times New Roman" w:hAnsi="Times New Roman" w:cs="Times New Roman"/>
+          <w:sz w:val="24"/>
+        </w:rPr>
+        <w:t xml:space="preserve">surrounding. </w:t>
+      </w:r>
+      <w:r>
+        <w:rPr>
+          <w:rFonts w:ascii="Times New Roman" w:hAnsi="Times New Roman" w:cs="Times New Roman"/>
+          <w:sz w:val="24"/>
+        </w:rPr>
+        <w:t>(</w:t>
+      </w:r>
+      <w:r>
+        <w:rPr>
+          <w:rFonts w:ascii="Times New Roman" w:hAnsi="Times New Roman" w:cs="Times New Roman"/>
+          <w:noProof/>
+          <w:sz w:val="24"/>
+        </w:rPr>
+        <w:t>Frank &amp; Badre, 2015</w:t>
+      </w:r>
+      <w:r>
+        <w:rPr>
+          <w:rFonts w:ascii="Times New Roman" w:hAnsi="Times New Roman" w:cs="Times New Roman" w:hint="eastAsia"/>
+          <w:noProof/>
+          <w:sz w:val="24"/>
+        </w:rPr>
+        <w:t>;</w:t>
+      </w:r>
+      <w:r>
+        <w:rPr>
+          <w:rFonts w:ascii="Times New Roman" w:hAnsi="Times New Roman" w:cs="Times New Roman"/>
+          <w:noProof/>
+          <w:sz w:val="24"/>
+        </w:rPr>
+        <w:t xml:space="preserve"> Schall, 2004; </w:t>
+      </w:r>
+      <w:r>
+        <w:rPr>
+          <w:rFonts w:ascii="Times New Roman" w:eastAsia="宋体" w:hAnsi="Times New Roman" w:cs="Times New Roman" w:hint="eastAsia"/>
+          <w:noProof/>
+          <w:sz w:val="24"/>
+        </w:rPr>
+        <w:t>Forstmann</w:t>
+      </w:r>
+      <w:r>
+        <w:rPr>
+          <w:rFonts w:ascii="Times New Roman" w:eastAsia="宋体" w:hAnsi="Times New Roman" w:cs="Times New Roman" w:hint="eastAsia"/>
+          <w:noProof/>
+          <w:sz w:val="24"/>
+        </w:rPr>
+        <w:t xml:space="preserve"> et </w:t>
+      </w:r>
+      <w:r>
+        <w:rPr>
+          <w:rFonts w:ascii="Times New Roman" w:eastAsia="宋体" w:hAnsi="Times New Roman" w:cs="Times New Roman"/>
+          <w:noProof/>
+          <w:sz w:val="24"/>
+        </w:rPr>
+        <w:t>al</w:t>
+      </w:r>
+      <w:r>
+        <w:rPr>
+          <w:rFonts w:ascii="Times New Roman" w:eastAsia="宋体" w:hAnsi="Times New Roman" w:cs="Times New Roman" w:hint="eastAsia"/>
+          <w:noProof/>
+          <w:sz w:val="24"/>
+        </w:rPr>
+        <w:t>, 2011</w:t>
+      </w:r>
+      <w:r>
+        <w:rPr>
+          <w:rFonts w:ascii="Times New Roman" w:hAnsi="Times New Roman" w:cs="Times New Roman"/>
+          <w:noProof/>
+          <w:sz w:val="24"/>
+        </w:rPr>
+        <w:t xml:space="preserve">). </w:t>
+      </w:r>
     </w:p>
     <w:p>
       <w:pPr>
@@ -1687,6 +1927,14 @@
       <w14:ligatures w14:val="none"/>
     </w:rPr>
   </w:style>
+  <w:style w:type="paragraph" w:styleId="af">
+    <w:name w:val="Bibliography"/>
+    <w:basedOn w:val="a"/>
+    <w:next w:val="a"/>
+    <w:uiPriority w:val="37"/>
+    <w:unhideWhenUsed/>
+    <w:rsid w:val="002D50A3"/>
+  </w:style>
 </w:styles>
 </file>
 
@@ -1983,4 +2231,105 @@
     </a:ext>
   </a:extLst>
 </a:theme>
+</file>
+
+<file path=customXml/item1.xml><?xml version="1.0" encoding="utf-8"?>
+<b:Sources xmlns:b="http://schemas.openxmlformats.org/officeDocument/2006/bibliography" xmlns="http://schemas.openxmlformats.org/officeDocument/2006/bibliography" SelectedStyle="/APASixthEditionOfficeOnline.xsl" StyleName="APA" Version="6">
+  <b:Source>
+    <b:Tag>Fra</b:Tag>
+    <b:SourceType>ArticleInAPeriodical</b:SourceType>
+    <b:Guid>{002EB1E7-AD72-4B4C-89B8-585B132CEC94}</b:Guid>
+    <b:Author>
+      <b:Author>
+        <b:NameList>
+          <b:Person>
+            <b:Last>Frank</b:Last>
+            <b:Middle>J</b:Middle>
+            <b:First>Michael</b:First>
+          </b:Person>
+          <b:Person>
+            <b:Last>Badre</b:Last>
+            <b:First>David</b:First>
+          </b:Person>
+        </b:NameList>
+      </b:Author>
+    </b:Author>
+    <b:Title>How cognitive theory guides neuroscience</b:Title>
+    <b:PeriodicalTitle>Cognition</b:PeriodicalTitle>
+    <b:Pages>14-20</b:Pages>
+    <b:Volume>135</b:Volume>
+    <b:Year>2015</b:Year>
+    <b:RefOrder>2</b:RefOrder>
+  </b:Source>
+  <b:Source>
+    <b:Tag>Sch04</b:Tag>
+    <b:SourceType>ArticleInAPeriodical</b:SourceType>
+    <b:Guid>{4478A221-D106-1343-961E-BBCFD7693BF9}</b:Guid>
+    <b:Title>On building a bridge between brain and behavior</b:Title>
+    <b:PeriodicalTitle>Annual Review of Psychology</b:PeriodicalTitle>
+    <b:Year>2004</b:Year>
+    <b:Pages>23-50</b:Pages>
+    <b:Author>
+      <b:Author>
+        <b:NameList>
+          <b:Person>
+            <b:Last>Schall</b:Last>
+            <b:Middle>D</b:Middle>
+            <b:First>Jeffrey</b:First>
+          </b:Person>
+        </b:NameList>
+      </b:Author>
+    </b:Author>
+    <b:Volume>55</b:Volume>
+    <b:RefOrder>3</b:RefOrder>
+  </b:Source>
+  <b:Source>
+    <b:Tag>For11</b:Tag>
+    <b:SourceType>ArticleInAPeriodical</b:SourceType>
+    <b:Guid>{48A32152-E8A0-0549-89DB-C9D80A2C6D31}</b:Guid>
+    <b:Author>
+      <b:Author>
+        <b:NameList>
+          <b:Person>
+            <b:Last>Forstmann</b:Last>
+            <b:First>Birte</b:First>
+            <b:Middle>U.</b:Middle>
+          </b:Person>
+          <b:Person>
+            <b:Last>Wagenmakers</b:Last>
+            <b:First>Eric-Jan</b:First>
+          </b:Person>
+          <b:Person>
+            <b:Last>Eichele</b:Last>
+            <b:First>Tom</b:First>
+          </b:Person>
+          <b:Person>
+            <b:Last>Brown</b:Last>
+            <b:First>Scott</b:First>
+          </b:Person>
+          <b:Person>
+            <b:Last>Serences</b:Last>
+            <b:First>John</b:First>
+            <b:Middle>T.</b:Middle>
+          </b:Person>
+        </b:NameList>
+      </b:Author>
+    </b:Author>
+    <b:Title>Reciprocal relations between cognitive neuroscience and cognitive models: Opposites attract?</b:Title>
+    <b:PeriodicalTitle>Trends in Cognitive Sciences</b:PeriodicalTitle>
+    <b:Year>2011</b:Year>
+    <b:Pages>272-279</b:Pages>
+    <b:Volume>15</b:Volume>
+    <b:Issue>6</b:Issue>
+    <b:RefOrder>1</b:RefOrder>
+  </b:Source>
+</b:Sources>
+</file>
+
+<file path=customXml/itemProps1.xml><?xml version="1.0" encoding="utf-8"?>
+<ds:datastoreItem xmlns:ds="http://schemas.openxmlformats.org/officeDocument/2006/customXml" ds:itemID="{FFA7EFCA-63D1-EB4F-93DE-93C35ECC5FDF}">
+  <ds:schemaRefs>
+    <ds:schemaRef ds:uri="http://schemas.openxmlformats.org/officeDocument/2006/bibliography"/>
+  </ds:schemaRefs>
+</ds:datastoreItem>
 </file>
</xml_diff>

<commit_message>
updating formal analysis reprot
</commit_message>
<xml_diff>
--- a/Project1_Sleep_Deprivation_Cognition/Report/Analysis_Report.docx
+++ b/Project1_Sleep_Deprivation_Cognition/Report/Analysis_Report.docx
@@ -684,51 +684,278 @@
     <w:p>
       <w:pPr>
         <w:spacing w:after="0" w:line="240" w:lineRule="atLeast"/>
+        <w:ind w:firstLineChars="100" w:firstLine="240"/>
         <w:jc w:val="both"/>
         <w:rPr>
+          <w:rFonts w:ascii="Times New Roman" w:hAnsi="Times New Roman" w:cs="Times New Roman"/>
+          <w:noProof/>
+          <w:sz w:val="24"/>
+        </w:rPr>
+      </w:pPr>
+      <w:r>
+        <w:rPr>
+          <w:rFonts w:ascii="Times New Roman" w:hAnsi="Times New Roman" w:cs="Times New Roman"/>
+          <w:sz w:val="24"/>
+        </w:rPr>
+        <w:t>C</w:t>
+      </w:r>
+      <w:r>
+        <w:rPr>
+          <w:rFonts w:ascii="Times New Roman" w:hAnsi="Times New Roman" w:cs="Times New Roman"/>
+          <w:sz w:val="24"/>
+        </w:rPr>
+        <w:t xml:space="preserve">ognitive </w:t>
+      </w:r>
+      <w:r>
+        <w:rPr>
+          <w:rFonts w:ascii="Times New Roman" w:hAnsi="Times New Roman" w:cs="Times New Roman"/>
+          <w:sz w:val="24"/>
+        </w:rPr>
+        <w:t>processing</w:t>
+      </w:r>
+      <w:r>
+        <w:rPr>
           <w:rFonts w:ascii="Times New Roman" w:hAnsi="Times New Roman" w:cs="Times New Roman" w:hint="eastAsia"/>
           <w:sz w:val="24"/>
-          <w:lang w:val="fr-CA"/>
-        </w:rPr>
-      </w:pPr>
-      <w:r>
-        <w:rPr>
-          <w:rFonts w:ascii="Times New Roman" w:hAnsi="Times New Roman" w:cs="Times New Roman"/>
-          <w:sz w:val="24"/>
-        </w:rPr>
-        <w:t>C</w:t>
-      </w:r>
-      <w:r>
-        <w:rPr>
-          <w:rFonts w:ascii="Times New Roman" w:hAnsi="Times New Roman" w:cs="Times New Roman"/>
-          <w:sz w:val="24"/>
-        </w:rPr>
-        <w:t xml:space="preserve">ognitive </w:t>
-      </w:r>
-      <w:r>
-        <w:rPr>
-          <w:rFonts w:ascii="Times New Roman" w:hAnsi="Times New Roman" w:cs="Times New Roman"/>
-          <w:sz w:val="24"/>
-        </w:rPr>
-        <w:t>processing</w:t>
+        </w:rPr>
+        <w:t xml:space="preserve"> </w:t>
+      </w:r>
+      <w:r>
+        <w:rPr>
+          <w:rFonts w:ascii="Times New Roman" w:hAnsi="Times New Roman" w:cs="Times New Roman"/>
+          <w:sz w:val="24"/>
+        </w:rPr>
+        <w:t>is</w:t>
+      </w:r>
+      <w:r>
+        <w:rPr>
+          <w:rFonts w:ascii="Times New Roman" w:hAnsi="Times New Roman" w:cs="Times New Roman"/>
+          <w:sz w:val="24"/>
+        </w:rPr>
+        <w:t xml:space="preserve"> </w:t>
+      </w:r>
+      <w:r>
+        <w:rPr>
+          <w:rFonts w:ascii="Times New Roman" w:hAnsi="Times New Roman" w:cs="Times New Roman"/>
+          <w:sz w:val="24"/>
+        </w:rPr>
+        <w:t xml:space="preserve">one </w:t>
+      </w:r>
+      <w:r>
+        <w:rPr>
+          <w:rFonts w:ascii="Times New Roman" w:hAnsi="Times New Roman" w:cs="Times New Roman"/>
+          <w:sz w:val="24"/>
+        </w:rPr>
+        <w:t xml:space="preserve">fundamental </w:t>
       </w:r>
       <w:r>
         <w:rPr>
           <w:rFonts w:ascii="Times New Roman" w:hAnsi="Times New Roman" w:cs="Times New Roman" w:hint="eastAsia"/>
           <w:sz w:val="24"/>
         </w:rPr>
+        <w:t>topic</w:t>
+      </w:r>
+      <w:r>
+        <w:rPr>
+          <w:rFonts w:ascii="Times New Roman" w:hAnsi="Times New Roman" w:cs="Times New Roman"/>
+          <w:sz w:val="24"/>
+        </w:rPr>
+        <w:t xml:space="preserve">s in </w:t>
+      </w:r>
+      <w:r>
+        <w:rPr>
+          <w:rFonts w:ascii="Times New Roman" w:hAnsi="Times New Roman" w:cs="Times New Roman"/>
+          <w:sz w:val="24"/>
+        </w:rPr>
+        <w:t xml:space="preserve">psychology and neuroscience, </w:t>
+      </w:r>
+      <w:r>
+        <w:rPr>
+          <w:rFonts w:ascii="Times New Roman" w:hAnsi="Times New Roman" w:cs="Times New Roman"/>
+          <w:sz w:val="24"/>
+        </w:rPr>
+        <w:t xml:space="preserve">as it </w:t>
+      </w:r>
+      <w:r>
+        <w:rPr>
+          <w:rFonts w:ascii="Times New Roman" w:hAnsi="Times New Roman" w:cs="Times New Roman"/>
+          <w:sz w:val="24"/>
+        </w:rPr>
+        <w:t>provides a</w:t>
+      </w:r>
+      <w:r>
+        <w:rPr>
+          <w:rFonts w:ascii="Times New Roman" w:hAnsi="Times New Roman" w:cs="Times New Roman"/>
+          <w:sz w:val="24"/>
+        </w:rPr>
         <w:t xml:space="preserve"> </w:t>
       </w:r>
       <w:r>
         <w:rPr>
-          <w:rFonts w:ascii="Times New Roman" w:hAnsi="Times New Roman" w:cs="Times New Roman"/>
-          <w:sz w:val="24"/>
-        </w:rPr>
-        <w:t>is</w:t>
-      </w:r>
-      <w:r>
-        <w:rPr>
-          <w:rFonts w:ascii="Times New Roman" w:hAnsi="Times New Roman" w:cs="Times New Roman"/>
+          <w:rFonts w:ascii="Times New Roman" w:hAnsi="Times New Roman" w:cs="Times New Roman" w:hint="eastAsia"/>
+          <w:sz w:val="24"/>
+        </w:rPr>
+        <w:t>framework</w:t>
+      </w:r>
+      <w:r>
+        <w:rPr>
+          <w:rFonts w:ascii="Times New Roman" w:hAnsi="Times New Roman" w:cs="Times New Roman"/>
+          <w:sz w:val="24"/>
+        </w:rPr>
+        <w:t xml:space="preserve"> for</w:t>
+      </w:r>
+      <w:r>
+        <w:rPr>
+          <w:rFonts w:ascii="Times New Roman" w:hAnsi="Times New Roman" w:cs="Times New Roman"/>
+          <w:sz w:val="24"/>
+        </w:rPr>
+        <w:t xml:space="preserve"> understanding </w:t>
+      </w:r>
+      <w:r>
+        <w:rPr>
+          <w:rFonts w:ascii="Times New Roman" w:hAnsi="Times New Roman" w:cs="Times New Roman" w:hint="eastAsia"/>
+          <w:sz w:val="24"/>
+        </w:rPr>
+        <w:t xml:space="preserve">functionally segregated yet integrated </w:t>
+      </w:r>
+      <w:r>
+        <w:rPr>
+          <w:rFonts w:ascii="Times New Roman" w:hAnsi="Times New Roman" w:cs="Times New Roman"/>
+          <w:sz w:val="24"/>
+        </w:rPr>
+        <w:t xml:space="preserve">information-processing </w:t>
+      </w:r>
+      <w:r>
+        <w:rPr>
+          <w:rFonts w:ascii="Times New Roman" w:hAnsi="Times New Roman" w:cs="Times New Roman" w:hint="eastAsia"/>
+          <w:sz w:val="24"/>
+        </w:rPr>
+        <w:t>mechanism</w:t>
+      </w:r>
+      <w:r>
+        <w:rPr>
+          <w:rFonts w:ascii="Times New Roman" w:hAnsi="Times New Roman" w:cs="Times New Roman"/>
+          <w:sz w:val="24"/>
+        </w:rPr>
+        <w:t xml:space="preserve"> underlying </w:t>
+      </w:r>
+      <w:r>
+        <w:rPr>
+          <w:rFonts w:ascii="Times New Roman" w:hAnsi="Times New Roman" w:cs="Times New Roman"/>
+          <w:sz w:val="24"/>
+        </w:rPr>
+        <w:t xml:space="preserve">the </w:t>
+      </w:r>
+      <w:r>
+        <w:rPr>
+          <w:rFonts w:ascii="Times New Roman" w:hAnsi="Times New Roman" w:cs="Times New Roman" w:hint="eastAsia"/>
+          <w:sz w:val="24"/>
+        </w:rPr>
+        <w:t>way</w:t>
+      </w:r>
+      <w:r>
+        <w:rPr>
+          <w:rFonts w:ascii="Times New Roman" w:hAnsi="Times New Roman" w:cs="Times New Roman"/>
+          <w:sz w:val="24"/>
+        </w:rPr>
+        <w:t xml:space="preserve"> individuals</w:t>
+      </w:r>
+      <w:r>
+        <w:rPr>
+          <w:rFonts w:ascii="Times New Roman" w:hAnsi="Times New Roman" w:cs="Times New Roman"/>
+          <w:sz w:val="24"/>
+        </w:rPr>
+        <w:t xml:space="preserve"> interact</w:t>
+      </w:r>
+      <w:r>
+        <w:rPr>
+          <w:rFonts w:ascii="Times New Roman" w:hAnsi="Times New Roman" w:cs="Times New Roman"/>
+          <w:sz w:val="24"/>
+        </w:rPr>
+        <w:t xml:space="preserve"> with the </w:t>
+      </w:r>
+      <w:r>
+        <w:rPr>
+          <w:rFonts w:ascii="Times New Roman" w:hAnsi="Times New Roman" w:cs="Times New Roman"/>
+          <w:sz w:val="24"/>
+        </w:rPr>
+        <w:t xml:space="preserve">surrounding. </w:t>
+      </w:r>
+      <w:r>
+        <w:rPr>
+          <w:rFonts w:ascii="Times New Roman" w:hAnsi="Times New Roman" w:cs="Times New Roman"/>
+          <w:sz w:val="24"/>
+        </w:rPr>
+        <w:t>(</w:t>
+      </w:r>
+      <w:r>
+        <w:rPr>
+          <w:rFonts w:ascii="Times New Roman" w:hAnsi="Times New Roman" w:cs="Times New Roman"/>
+          <w:noProof/>
+          <w:sz w:val="24"/>
+        </w:rPr>
+        <w:t>Frank &amp; Badre, 2015</w:t>
+      </w:r>
+      <w:r>
+        <w:rPr>
+          <w:rFonts w:ascii="Times New Roman" w:hAnsi="Times New Roman" w:cs="Times New Roman" w:hint="eastAsia"/>
+          <w:noProof/>
+          <w:sz w:val="24"/>
+        </w:rPr>
+        <w:t>;</w:t>
+      </w:r>
+      <w:r>
+        <w:rPr>
+          <w:rFonts w:ascii="Times New Roman" w:hAnsi="Times New Roman" w:cs="Times New Roman"/>
+          <w:noProof/>
+          <w:sz w:val="24"/>
+        </w:rPr>
+        <w:t xml:space="preserve"> Schall, 2004; </w:t>
+      </w:r>
+      <w:r>
+        <w:rPr>
+          <w:rFonts w:ascii="Times New Roman" w:eastAsia="宋体" w:hAnsi="Times New Roman" w:cs="Times New Roman" w:hint="eastAsia"/>
+          <w:noProof/>
+          <w:sz w:val="24"/>
+        </w:rPr>
+        <w:t>Forstmann</w:t>
+      </w:r>
+      <w:r>
+        <w:rPr>
+          <w:rFonts w:ascii="Times New Roman" w:eastAsia="宋体" w:hAnsi="Times New Roman" w:cs="Times New Roman" w:hint="eastAsia"/>
+          <w:noProof/>
+          <w:sz w:val="24"/>
+        </w:rPr>
+        <w:t xml:space="preserve"> et </w:t>
+      </w:r>
+      <w:r>
+        <w:rPr>
+          <w:rFonts w:ascii="Times New Roman" w:eastAsia="宋体" w:hAnsi="Times New Roman" w:cs="Times New Roman"/>
+          <w:noProof/>
+          <w:sz w:val="24"/>
+        </w:rPr>
+        <w:t>al</w:t>
+      </w:r>
+      <w:r>
+        <w:rPr>
+          <w:rFonts w:ascii="Times New Roman" w:eastAsia="宋体" w:hAnsi="Times New Roman" w:cs="Times New Roman" w:hint="eastAsia"/>
+          <w:noProof/>
+          <w:sz w:val="24"/>
+        </w:rPr>
+        <w:t>, 2011</w:t>
+      </w:r>
+      <w:r>
+        <w:rPr>
+          <w:rFonts w:ascii="Times New Roman" w:hAnsi="Times New Roman" w:cs="Times New Roman"/>
+          <w:noProof/>
+          <w:sz w:val="24"/>
+        </w:rPr>
+        <w:t>)</w:t>
+      </w:r>
+      <w:r>
+        <w:rPr>
+          <w:rFonts w:ascii="Times New Roman" w:hAnsi="Times New Roman" w:cs="Times New Roman" w:hint="eastAsia"/>
+          <w:noProof/>
           <w:sz w:val="24"/>
         </w:rPr>
         <w:t xml:space="preserve"> </w:t>
@@ -736,235 +963,360 @@
       <w:r>
         <w:rPr>
           <w:rFonts w:ascii="Times New Roman" w:hAnsi="Times New Roman" w:cs="Times New Roman"/>
-          <w:sz w:val="24"/>
-        </w:rPr>
-        <w:t xml:space="preserve">known as </w:t>
-      </w:r>
-      <w:r>
-        <w:rPr>
-          <w:rFonts w:ascii="Times New Roman" w:hAnsi="Times New Roman" w:cs="Times New Roman"/>
-          <w:sz w:val="24"/>
-        </w:rPr>
-        <w:t xml:space="preserve">one of the most </w:t>
-      </w:r>
-      <w:r>
-        <w:rPr>
-          <w:rFonts w:ascii="Times New Roman" w:hAnsi="Times New Roman" w:cs="Times New Roman"/>
-          <w:sz w:val="24"/>
-        </w:rPr>
-        <w:t xml:space="preserve">fundamental </w:t>
-      </w:r>
-      <w:r>
-        <w:rPr>
-          <w:rFonts w:ascii="Times New Roman" w:hAnsi="Times New Roman" w:cs="Times New Roman" w:hint="eastAsia"/>
-          <w:sz w:val="24"/>
-        </w:rPr>
-        <w:t>topic</w:t>
-      </w:r>
-      <w:r>
-        <w:rPr>
-          <w:rFonts w:ascii="Times New Roman" w:hAnsi="Times New Roman" w:cs="Times New Roman"/>
-          <w:sz w:val="24"/>
-        </w:rPr>
-        <w:t xml:space="preserve">s in the </w:t>
-      </w:r>
-      <w:r>
-        <w:rPr>
-          <w:rFonts w:ascii="Times New Roman" w:hAnsi="Times New Roman" w:cs="Times New Roman"/>
-          <w:sz w:val="24"/>
-        </w:rPr>
-        <w:t xml:space="preserve">psychology and neuroscience, </w:t>
-      </w:r>
-      <w:r>
-        <w:rPr>
-          <w:rFonts w:ascii="Times New Roman" w:hAnsi="Times New Roman" w:cs="Times New Roman"/>
-          <w:sz w:val="24"/>
-        </w:rPr>
-        <w:t xml:space="preserve">as it </w:t>
-      </w:r>
-      <w:r>
-        <w:rPr>
-          <w:rFonts w:ascii="Times New Roman" w:hAnsi="Times New Roman" w:cs="Times New Roman"/>
-          <w:sz w:val="24"/>
-        </w:rPr>
-        <w:t>provides a</w:t>
-      </w:r>
-      <w:r>
-        <w:rPr>
-          <w:rFonts w:ascii="Times New Roman" w:hAnsi="Times New Roman" w:cs="Times New Roman"/>
+          <w:noProof/>
+          <w:sz w:val="24"/>
+        </w:rPr>
+        <w:t>t</w:t>
+      </w:r>
+      <w:r>
+        <w:rPr>
+          <w:rFonts w:ascii="Times New Roman" w:hAnsi="Times New Roman" w:cs="Times New Roman"/>
+          <w:noProof/>
+          <w:sz w:val="24"/>
+        </w:rPr>
+        <w:t>he presented information affects the outputs, or observable</w:t>
+      </w:r>
+      <w:r>
+        <w:rPr>
+          <w:rFonts w:ascii="Times New Roman" w:hAnsi="Times New Roman" w:cs="Times New Roman"/>
+          <w:noProof/>
+          <w:sz w:val="24"/>
+        </w:rPr>
+        <w:t xml:space="preserve"> performance through both its direct role as processed inputs or its indirect role in </w:t>
+      </w:r>
+      <w:r>
+        <w:rPr>
+          <w:rFonts w:ascii="Times New Roman" w:hAnsi="Times New Roman" w:cs="Times New Roman"/>
+          <w:noProof/>
+          <w:sz w:val="24"/>
+        </w:rPr>
+        <w:t xml:space="preserve">shaping </w:t>
+      </w:r>
+      <w:r>
+        <w:rPr>
+          <w:rFonts w:ascii="Times New Roman" w:hAnsi="Times New Roman" w:cs="Times New Roman"/>
+          <w:noProof/>
+          <w:sz w:val="24"/>
+        </w:rPr>
+        <w:t>the state or condition under which processing occurs</w:t>
+      </w:r>
+      <w:r>
+        <w:rPr>
+          <w:rFonts w:ascii="Times New Roman" w:hAnsi="Times New Roman" w:cs="Times New Roman"/>
+          <w:noProof/>
+          <w:sz w:val="24"/>
+        </w:rPr>
+        <w:t xml:space="preserve">. </w:t>
+      </w:r>
+    </w:p>
+    <w:p>
+      <w:pPr>
+        <w:spacing w:after="0" w:line="240" w:lineRule="atLeast"/>
+        <w:ind w:firstLineChars="100" w:firstLine="240"/>
+        <w:jc w:val="both"/>
+        <w:rPr>
+          <w:rFonts w:ascii="Times New Roman" w:hAnsi="Times New Roman" w:cs="Times New Roman"/>
+          <w:noProof/>
+          <w:sz w:val="24"/>
+          <w:lang w:eastAsia="ja-JP"/>
+        </w:rPr>
+      </w:pPr>
+      <w:r>
+        <w:rPr>
+          <w:rFonts w:ascii="Times New Roman" w:hAnsi="Times New Roman" w:cs="Times New Roman"/>
+          <w:noProof/>
+          <w:sz w:val="24"/>
+        </w:rPr>
+        <w:t>Some</w:t>
+      </w:r>
+      <w:r>
+        <w:rPr>
+          <w:rFonts w:ascii="Times New Roman" w:hAnsi="Times New Roman" w:cs="Times New Roman"/>
+          <w:noProof/>
           <w:sz w:val="24"/>
         </w:rPr>
         <w:t xml:space="preserve"> </w:t>
       </w:r>
       <w:r>
         <w:rPr>
-          <w:rFonts w:ascii="Times New Roman" w:hAnsi="Times New Roman" w:cs="Times New Roman" w:hint="eastAsia"/>
-          <w:sz w:val="24"/>
-        </w:rPr>
-        <w:t>framework</w:t>
-      </w:r>
-      <w:r>
-        <w:rPr>
-          <w:rFonts w:ascii="Times New Roman" w:hAnsi="Times New Roman" w:cs="Times New Roman"/>
-          <w:sz w:val="24"/>
-        </w:rPr>
-        <w:t xml:space="preserve"> for</w:t>
-      </w:r>
-      <w:r>
-        <w:rPr>
-          <w:rFonts w:ascii="Times New Roman" w:hAnsi="Times New Roman" w:cs="Times New Roman"/>
-          <w:sz w:val="24"/>
-        </w:rPr>
-        <w:t xml:space="preserve"> understanding </w:t>
-      </w:r>
-      <w:r>
-        <w:rPr>
-          <w:rFonts w:ascii="Times New Roman" w:hAnsi="Times New Roman" w:cs="Times New Roman" w:hint="eastAsia"/>
-          <w:sz w:val="24"/>
-        </w:rPr>
-        <w:t xml:space="preserve">functionally segregated yet integrated </w:t>
-      </w:r>
-      <w:r>
-        <w:rPr>
-          <w:rFonts w:ascii="Times New Roman" w:hAnsi="Times New Roman" w:cs="Times New Roman" w:hint="eastAsia"/>
-          <w:sz w:val="24"/>
-        </w:rPr>
-        <w:t>a</w:t>
-      </w:r>
-      <w:r>
-        <w:rPr>
-          <w:rFonts w:ascii="Times New Roman" w:hAnsi="Times New Roman" w:cs="Times New Roman"/>
-          <w:sz w:val="24"/>
-        </w:rPr>
-        <w:t>lgorithm</w:t>
-      </w:r>
-      <w:r>
-        <w:rPr>
-          <w:rFonts w:ascii="Times New Roman" w:hAnsi="Times New Roman" w:cs="Times New Roman"/>
-          <w:sz w:val="24"/>
-        </w:rPr>
-        <w:t>s</w:t>
-      </w:r>
-      <w:r>
-        <w:rPr>
-          <w:rFonts w:ascii="Times New Roman" w:hAnsi="Times New Roman" w:cs="Times New Roman"/>
-          <w:sz w:val="24"/>
-        </w:rPr>
-        <w:t xml:space="preserve"> underlying </w:t>
-      </w:r>
-      <w:r>
-        <w:rPr>
-          <w:rFonts w:ascii="Times New Roman" w:hAnsi="Times New Roman" w:cs="Times New Roman"/>
-          <w:sz w:val="24"/>
-        </w:rPr>
-        <w:t xml:space="preserve">observable </w:t>
-      </w:r>
-      <w:r>
-        <w:rPr>
-          <w:rFonts w:ascii="Times New Roman" w:hAnsi="Times New Roman" w:cs="Times New Roman" w:hint="eastAsia"/>
-          <w:sz w:val="24"/>
-        </w:rPr>
-        <w:t>way</w:t>
-      </w:r>
-      <w:r>
-        <w:rPr>
-          <w:rFonts w:ascii="Times New Roman" w:hAnsi="Times New Roman" w:cs="Times New Roman"/>
-          <w:sz w:val="24"/>
-        </w:rPr>
-        <w:t xml:space="preserve"> individuals</w:t>
-      </w:r>
-      <w:r>
-        <w:rPr>
-          <w:rFonts w:ascii="Times New Roman" w:hAnsi="Times New Roman" w:cs="Times New Roman"/>
-          <w:sz w:val="24"/>
-        </w:rPr>
-        <w:t xml:space="preserve"> interact</w:t>
-      </w:r>
-      <w:r>
-        <w:rPr>
-          <w:rFonts w:ascii="Times New Roman" w:hAnsi="Times New Roman" w:cs="Times New Roman"/>
-          <w:sz w:val="24"/>
-        </w:rPr>
-        <w:t xml:space="preserve"> with the </w:t>
-      </w:r>
-      <w:r>
-        <w:rPr>
-          <w:rFonts w:ascii="Times New Roman" w:hAnsi="Times New Roman" w:cs="Times New Roman"/>
-          <w:sz w:val="24"/>
-        </w:rPr>
-        <w:t xml:space="preserve">surrounding. </w:t>
-      </w:r>
-      <w:r>
-        <w:rPr>
-          <w:rFonts w:ascii="Times New Roman" w:hAnsi="Times New Roman" w:cs="Times New Roman"/>
-          <w:sz w:val="24"/>
-        </w:rPr>
-        <w:t>(</w:t>
-      </w:r>
-      <w:r>
-        <w:rPr>
-          <w:rFonts w:ascii="Times New Roman" w:hAnsi="Times New Roman" w:cs="Times New Roman"/>
-          <w:noProof/>
-          <w:sz w:val="24"/>
-        </w:rPr>
-        <w:t>Frank &amp; Badre, 2015</w:t>
-      </w:r>
-      <w:r>
-        <w:rPr>
-          <w:rFonts w:ascii="Times New Roman" w:hAnsi="Times New Roman" w:cs="Times New Roman" w:hint="eastAsia"/>
-          <w:noProof/>
-          <w:sz w:val="24"/>
-        </w:rPr>
-        <w:t>;</w:t>
-      </w:r>
-      <w:r>
-        <w:rPr>
-          <w:rFonts w:ascii="Times New Roman" w:hAnsi="Times New Roman" w:cs="Times New Roman"/>
-          <w:noProof/>
-          <w:sz w:val="24"/>
-        </w:rPr>
-        <w:t xml:space="preserve"> Schall, 2004; </w:t>
-      </w:r>
-      <w:r>
-        <w:rPr>
-          <w:rFonts w:ascii="Times New Roman" w:eastAsia="宋体" w:hAnsi="Times New Roman" w:cs="Times New Roman" w:hint="eastAsia"/>
-          <w:noProof/>
-          <w:sz w:val="24"/>
-        </w:rPr>
-        <w:t>Forstmann</w:t>
-      </w:r>
-      <w:r>
-        <w:rPr>
-          <w:rFonts w:ascii="Times New Roman" w:eastAsia="宋体" w:hAnsi="Times New Roman" w:cs="Times New Roman" w:hint="eastAsia"/>
-          <w:noProof/>
-          <w:sz w:val="24"/>
-        </w:rPr>
-        <w:t xml:space="preserve"> et </w:t>
-      </w:r>
-      <w:r>
-        <w:rPr>
-          <w:rFonts w:ascii="Times New Roman" w:eastAsia="宋体" w:hAnsi="Times New Roman" w:cs="Times New Roman"/>
-          <w:noProof/>
-          <w:sz w:val="24"/>
-        </w:rPr>
-        <w:t>al</w:t>
-      </w:r>
-      <w:r>
-        <w:rPr>
-          <w:rFonts w:ascii="Times New Roman" w:eastAsia="宋体" w:hAnsi="Times New Roman" w:cs="Times New Roman" w:hint="eastAsia"/>
-          <w:noProof/>
-          <w:sz w:val="24"/>
-        </w:rPr>
-        <w:t>, 2011</w:t>
-      </w:r>
-      <w:r>
-        <w:rPr>
-          <w:rFonts w:ascii="Times New Roman" w:hAnsi="Times New Roman" w:cs="Times New Roman"/>
-          <w:noProof/>
-          <w:sz w:val="24"/>
-        </w:rPr>
-        <w:t xml:space="preserve">). </w:t>
-      </w:r>
+          <w:rFonts w:ascii="Times New Roman" w:hAnsi="Times New Roman" w:cs="Times New Roman"/>
+          <w:noProof/>
+          <w:sz w:val="24"/>
+        </w:rPr>
+        <w:t>studies advocates</w:t>
+      </w:r>
+      <w:r>
+        <w:rPr>
+          <w:rFonts w:ascii="Times New Roman" w:hAnsi="Times New Roman" w:cs="Times New Roman"/>
+          <w:noProof/>
+          <w:sz w:val="24"/>
+        </w:rPr>
+        <w:t xml:space="preserve"> </w:t>
+      </w:r>
+      <w:r>
+        <w:rPr>
+          <w:rFonts w:ascii="Times New Roman" w:hAnsi="Times New Roman" w:cs="Times New Roman"/>
+          <w:noProof/>
+          <w:sz w:val="24"/>
+        </w:rPr>
+        <w:t xml:space="preserve">the idea that </w:t>
+      </w:r>
+      <w:r>
+        <w:rPr>
+          <w:rFonts w:ascii="Times New Roman" w:hAnsi="Times New Roman" w:cs="Times New Roman"/>
+          <w:noProof/>
+          <w:sz w:val="24"/>
+        </w:rPr>
+        <w:t>the</w:t>
+      </w:r>
+      <w:r>
+        <w:rPr>
+          <w:rFonts w:ascii="Times New Roman" w:hAnsi="Times New Roman" w:cs="Times New Roman"/>
+          <w:noProof/>
+          <w:sz w:val="24"/>
+        </w:rPr>
+        <w:t xml:space="preserve"> cognitve algorithms </w:t>
+      </w:r>
+      <w:r>
+        <w:rPr>
+          <w:rFonts w:ascii="Times New Roman" w:hAnsi="Times New Roman" w:cs="Times New Roman"/>
+          <w:noProof/>
+          <w:sz w:val="24"/>
+        </w:rPr>
+        <w:t>can be more broadly</w:t>
+      </w:r>
+      <w:r>
+        <w:rPr>
+          <w:rFonts w:ascii="Times New Roman" w:hAnsi="Times New Roman" w:cs="Times New Roman"/>
+          <w:noProof/>
+          <w:sz w:val="24"/>
+        </w:rPr>
+        <w:t xml:space="preserve"> </w:t>
+      </w:r>
+      <w:r>
+        <w:rPr>
+          <w:rFonts w:ascii="Times New Roman" w:hAnsi="Times New Roman" w:cs="Times New Roman"/>
+          <w:noProof/>
+          <w:sz w:val="24"/>
+        </w:rPr>
+        <w:t>conceptualized</w:t>
+      </w:r>
+      <w:r>
+        <w:rPr>
+          <w:rFonts w:ascii="Times New Roman" w:hAnsi="Times New Roman" w:cs="Times New Roman"/>
+          <w:noProof/>
+          <w:sz w:val="24"/>
+        </w:rPr>
+        <w:t xml:space="preserve"> as a</w:t>
+      </w:r>
+      <w:r>
+        <w:rPr>
+          <w:rFonts w:ascii="Times New Roman" w:hAnsi="Times New Roman" w:cs="Times New Roman"/>
+          <w:noProof/>
+          <w:sz w:val="24"/>
+        </w:rPr>
+        <w:t xml:space="preserve"> dynamically</w:t>
+      </w:r>
+      <w:r>
+        <w:rPr>
+          <w:rFonts w:ascii="Times New Roman" w:hAnsi="Times New Roman" w:cs="Times New Roman"/>
+          <w:noProof/>
+          <w:sz w:val="24"/>
+        </w:rPr>
+        <w:t xml:space="preserve"> conditional model, </w:t>
+      </w:r>
+      <w:r>
+        <w:rPr>
+          <w:rFonts w:ascii="Times New Roman" w:hAnsi="Times New Roman" w:cs="Times New Roman"/>
+          <w:noProof/>
+          <w:sz w:val="24"/>
+        </w:rPr>
+        <w:t xml:space="preserve">meaning </w:t>
+      </w:r>
+      <w:r>
+        <w:rPr>
+          <w:rFonts w:ascii="Times New Roman" w:hAnsi="Times New Roman" w:cs="Times New Roman"/>
+          <w:noProof/>
+          <w:sz w:val="24"/>
+        </w:rPr>
+        <w:t xml:space="preserve">the </w:t>
+      </w:r>
+      <w:r>
+        <w:rPr>
+          <w:rFonts w:ascii="Times New Roman" w:hAnsi="Times New Roman" w:cs="Times New Roman"/>
+          <w:noProof/>
+          <w:sz w:val="24"/>
+        </w:rPr>
+        <w:t xml:space="preserve">expected </w:t>
+      </w:r>
+      <w:r>
+        <w:rPr>
+          <w:rFonts w:ascii="Times New Roman" w:hAnsi="Times New Roman" w:cs="Times New Roman"/>
+          <w:noProof/>
+          <w:sz w:val="24"/>
+        </w:rPr>
+        <w:t>processing outcome</w:t>
+      </w:r>
+      <w:r>
+        <w:rPr>
+          <w:rFonts w:ascii="Times New Roman" w:hAnsi="Times New Roman" w:cs="Times New Roman"/>
+          <w:noProof/>
+          <w:sz w:val="24"/>
+        </w:rPr>
+        <w:t xml:space="preserve"> </w:t>
+      </w:r>
+      <w:r>
+        <w:rPr>
+          <w:rFonts w:ascii="Times New Roman" w:hAnsi="Times New Roman" w:cs="Times New Roman"/>
+          <w:noProof/>
+          <w:sz w:val="24"/>
+        </w:rPr>
+        <w:t xml:space="preserve">is </w:t>
+      </w:r>
+      <w:r>
+        <w:rPr>
+          <w:rFonts w:ascii="Times New Roman" w:hAnsi="Times New Roman" w:cs="Times New Roman"/>
+          <w:noProof/>
+          <w:sz w:val="24"/>
+        </w:rPr>
+        <w:t xml:space="preserve">implicitly </w:t>
+      </w:r>
+      <w:r>
+        <w:rPr>
+          <w:rFonts w:ascii="Times New Roman" w:hAnsi="Times New Roman" w:cs="Times New Roman"/>
+          <w:noProof/>
+          <w:sz w:val="24"/>
+        </w:rPr>
+        <w:t>modulated dynamically by state</w:t>
+      </w:r>
+      <w:r>
+        <w:rPr>
+          <w:rFonts w:ascii="Times New Roman" w:hAnsi="Times New Roman" w:cs="Times New Roman"/>
+          <w:noProof/>
+          <w:sz w:val="24"/>
+        </w:rPr>
+        <w:t xml:space="preserve"> despite the same </w:t>
+      </w:r>
+      <w:r>
+        <w:rPr>
+          <w:rFonts w:ascii="Times New Roman" w:hAnsi="Times New Roman" w:cs="Times New Roman"/>
+          <w:noProof/>
+          <w:sz w:val="24"/>
+        </w:rPr>
+        <w:t xml:space="preserve">observation </w:t>
+      </w:r>
+      <w:r>
+        <w:rPr>
+          <w:rFonts w:ascii="Times New Roman" w:hAnsi="Times New Roman" w:cs="Times New Roman"/>
+          <w:noProof/>
+          <w:sz w:val="24"/>
+          <w:lang w:eastAsia="ja-JP"/>
+        </w:rPr>
+        <w:t xml:space="preserve">to </w:t>
+      </w:r>
+      <w:r>
+        <w:rPr>
+          <w:rFonts w:ascii="Times New Roman" w:hAnsi="Times New Roman" w:cs="Times New Roman"/>
+          <w:noProof/>
+          <w:sz w:val="24"/>
+          <w:lang w:eastAsia="ja-JP"/>
+        </w:rPr>
+        <w:t xml:space="preserve">correspondignly </w:t>
+      </w:r>
+      <w:r>
+        <w:rPr>
+          <w:rFonts w:ascii="Times New Roman" w:hAnsi="Times New Roman" w:cs="Times New Roman"/>
+          <w:noProof/>
+          <w:sz w:val="24"/>
+          <w:lang w:eastAsia="ja-JP"/>
+        </w:rPr>
+        <w:t xml:space="preserve">alter </w:t>
+      </w:r>
+      <w:r>
+        <w:rPr>
+          <w:rFonts w:ascii="Times New Roman" w:hAnsi="Times New Roman" w:cs="Times New Roman"/>
+          <w:noProof/>
+          <w:sz w:val="24"/>
+          <w:lang w:eastAsia="ja-JP"/>
+        </w:rPr>
+        <w:t>individual’s resposne.</w:t>
+      </w:r>
+      <w:r>
+        <w:rPr>
+          <w:rFonts w:ascii="Times New Roman" w:hAnsi="Times New Roman" w:cs="Times New Roman"/>
+          <w:noProof/>
+          <w:sz w:val="24"/>
+          <w:lang w:eastAsia="ja-JP"/>
+        </w:rPr>
+        <w:t xml:space="preserve"> </w:t>
+      </w:r>
+      <w:r>
+        <w:rPr>
+          <w:rFonts w:ascii="Times New Roman" w:hAnsi="Times New Roman" w:cs="Times New Roman"/>
+          <w:noProof/>
+          <w:sz w:val="24"/>
+          <w:lang w:eastAsia="ja-JP"/>
+        </w:rPr>
+        <w:t xml:space="preserve">(Flavell et al, 2022; </w:t>
+      </w:r>
+      <w:r>
+        <w:rPr>
+          <w:rFonts w:ascii="Times New Roman" w:hAnsi="Times New Roman" w:cs="Times New Roman"/>
+          <w:noProof/>
+          <w:sz w:val="24"/>
+          <w:lang w:val="fr-CA" w:eastAsia="ja-JP"/>
+        </w:rPr>
+        <w:t>Gilbert &amp; Sigman, 2007</w:t>
+      </w:r>
+      <w:r>
+        <w:rPr>
+          <w:rFonts w:ascii="Times New Roman" w:hAnsi="Times New Roman" w:cs="Times New Roman"/>
+          <w:noProof/>
+          <w:sz w:val="24"/>
+          <w:lang w:eastAsia="ja-JP"/>
+        </w:rPr>
+        <w:t>)</w:t>
+      </w:r>
+      <w:r>
+        <w:rPr>
+          <w:rFonts w:ascii="Times New Roman" w:hAnsi="Times New Roman" w:cs="Times New Roman"/>
+          <w:noProof/>
+          <w:sz w:val="24"/>
+          <w:lang w:eastAsia="ja-JP"/>
+        </w:rPr>
+        <w:t xml:space="preserve"> </w:t>
+      </w:r>
+      <w:r>
+        <w:rPr>
+          <w:rFonts w:ascii="Times New Roman" w:hAnsi="Times New Roman" w:cs="Times New Roman"/>
+          <w:noProof/>
+          <w:sz w:val="24"/>
+          <w:lang w:eastAsia="ja-JP"/>
+        </w:rPr>
+        <w:t xml:space="preserve">Specfically, </w:t>
+      </w:r>
+    </w:p>
+    <w:p>
+      <w:pPr>
+        <w:spacing w:after="0" w:line="240" w:lineRule="atLeast"/>
+        <w:ind w:firstLineChars="100" w:firstLine="240"/>
+        <w:jc w:val="both"/>
+        <w:rPr>
+          <w:rFonts w:ascii="Times New Roman" w:hAnsi="Times New Roman" w:cs="Times New Roman"/>
+          <w:noProof/>
+          <w:sz w:val="24"/>
+        </w:rPr>
+      </w:pPr>
+    </w:p>
+    <w:p>
+      <w:pPr>
+        <w:spacing w:after="0" w:line="240" w:lineRule="atLeast"/>
+        <w:jc w:val="both"/>
+        <w:rPr>
+          <w:rFonts w:ascii="Times New Roman" w:hAnsi="Times New Roman" w:cs="Times New Roman"/>
+          <w:sz w:val="24"/>
+        </w:rPr>
+      </w:pPr>
     </w:p>
     <w:p>
       <w:pPr>
@@ -2321,13 +2673,75 @@
     <b:Pages>272-279</b:Pages>
     <b:Volume>15</b:Volume>
     <b:Issue>6</b:Issue>
+    <b:RefOrder>4</b:RefOrder>
+  </b:Source>
+  <b:Source>
+    <b:Tag>Fla22</b:Tag>
+    <b:SourceType>ArticleInAPeriodical</b:SourceType>
+    <b:Guid>{67967283-D01A-3F45-9EE9-76D7BA0FD4AC}</b:Guid>
+    <b:Title>The emergence and influence of internal states</b:Title>
+    <b:PeriodicalTitle>Neuron</b:PeriodicalTitle>
+    <b:Year>2022</b:Year>
+    <b:Pages>2545-2570</b:Pages>
+    <b:Volume>110</b:Volume>
+    <b:Issue>16</b:Issue>
+    <b:Author>
+      <b:Author>
+        <b:NameList>
+          <b:Person>
+            <b:Last>Flavell</b:Last>
+            <b:Middle>W</b:Middle>
+            <b:First>Steven</b:First>
+          </b:Person>
+          <b:Person>
+            <b:Last>Gogolla</b:Last>
+            <b:First>Nadine</b:First>
+          </b:Person>
+          <b:Person>
+            <b:Last>Lovett-Barron</b:Last>
+            <b:First>Matthew</b:First>
+          </b:Person>
+          <b:Person>
+            <b:Last>Zelikowsky</b:Last>
+            <b:First>Moriel</b:First>
+          </b:Person>
+        </b:NameList>
+      </b:Author>
+    </b:Author>
+    <b:RefOrder>5</b:RefOrder>
+  </b:Source>
+  <b:Source>
+    <b:Tag>Gil07</b:Tag>
+    <b:SourceType>ArticleInAPeriodical</b:SourceType>
+    <b:Guid>{D13B11D5-A0AE-754C-A52C-938763D885A8}</b:Guid>
+    <b:Title>Brain States: Top-Down Influences in Sensory Processing</b:Title>
+    <b:PeriodicalTitle>Neuron</b:PeriodicalTitle>
+    <b:Year>2007</b:Year>
+    <b:Pages>677-696</b:Pages>
+    <b:Author>
+      <b:Author>
+        <b:NameList>
+          <b:Person>
+            <b:Last>Gilbert</b:Last>
+            <b:Middle>D</b:Middle>
+            <b:First>Charles</b:First>
+          </b:Person>
+          <b:Person>
+            <b:Last>Sigman</b:Last>
+            <b:First>Mariano</b:First>
+          </b:Person>
+        </b:NameList>
+      </b:Author>
+    </b:Author>
+    <b:Volume>54</b:Volume>
+    <b:Issue>5</b:Issue>
     <b:RefOrder>1</b:RefOrder>
   </b:Source>
 </b:Sources>
 </file>
 
 <file path=customXml/itemProps1.xml><?xml version="1.0" encoding="utf-8"?>
-<ds:datastoreItem xmlns:ds="http://schemas.openxmlformats.org/officeDocument/2006/customXml" ds:itemID="{FFA7EFCA-63D1-EB4F-93DE-93C35ECC5FDF}">
+<ds:datastoreItem xmlns:ds="http://schemas.openxmlformats.org/officeDocument/2006/customXml" ds:itemID="{03978D43-C9CD-3A41-BF98-9B478D140524}">
   <ds:schemaRefs>
     <ds:schemaRef ds:uri="http://schemas.openxmlformats.org/officeDocument/2006/bibliography"/>
   </ds:schemaRefs>

</xml_diff>

<commit_message>
updating formal analysis report(introduction)
</commit_message>
<xml_diff>
--- a/Project1_Sleep_Deprivation_Cognition/Report/Analysis_Report.docx
+++ b/Project1_Sleep_Deprivation_Cognition/Report/Analysis_Report.docx
@@ -92,6 +92,7 @@
     </w:p>
     <w:p>
       <w:pPr>
+        <w:spacing w:after="0"/>
         <w:jc w:val="center"/>
         <w:rPr>
           <w:rFonts w:ascii="Times New Roman" w:hAnsi="Times New Roman" w:cs="Times New Roman"/>
@@ -102,12 +103,12 @@
       </w:pPr>
       <w:r>
         <w:rPr>
-          <w:rFonts w:ascii="Times New Roman" w:hAnsi="Times New Roman" w:cs="Times New Roman"/>
+          <w:rFonts w:ascii="Times New Roman" w:hAnsi="Times New Roman" w:cs="Times New Roman" w:hint="eastAsia"/>
           <w:b/>
           <w:bCs/>
           <w:sz w:val="24"/>
         </w:rPr>
-        <w:t>Exploring Sleep-Related Factors</w:t>
+        <w:t xml:space="preserve">Condition-Dependent </w:t>
       </w:r>
       <w:r>
         <w:rPr>
@@ -115,140 +116,135 @@
           <w:b/>
           <w:bCs/>
           <w:sz w:val="24"/>
-          <w:lang w:eastAsia="ja-JP"/>
-        </w:rPr>
-        <w:t>, Emotional Regulation and Cognitive Performance Using Secondary Data</w:t>
-      </w:r>
-    </w:p>
-    <w:p>
-      <w:pPr>
-        <w:jc w:val="center"/>
-        <w:rPr>
-          <w:rFonts w:ascii="Times New Roman" w:hAnsi="Times New Roman" w:cs="Times New Roman"/>
-          <w:sz w:val="24"/>
-        </w:rPr>
-      </w:pPr>
+        </w:rPr>
+        <w:t>Cognitive</w:t>
+      </w:r>
       <w:r>
         <w:rPr>
           <w:rFonts w:ascii="Times New Roman" w:hAnsi="Times New Roman" w:cs="Times New Roman" w:hint="eastAsia"/>
-          <w:sz w:val="24"/>
-        </w:rPr>
-        <w:t>1</w:t>
-      </w:r>
-      <w:r>
-        <w:rPr>
-          <w:rFonts w:ascii="Times New Roman" w:hAnsi="Times New Roman" w:cs="Times New Roman" w:hint="eastAsia"/>
-          <w:sz w:val="24"/>
-          <w:vertAlign w:val="superscript"/>
-        </w:rPr>
-        <w:t>st</w:t>
-      </w:r>
-      <w:r>
-        <w:rPr>
-          <w:rFonts w:ascii="Times New Roman" w:hAnsi="Times New Roman" w:cs="Times New Roman" w:hint="eastAsia"/>
-          <w:sz w:val="24"/>
-        </w:rPr>
-        <w:t xml:space="preserve"> Independent Secondary Data Analysis P</w:t>
-      </w:r>
-      <w:r>
-        <w:rPr>
-          <w:rFonts w:ascii="Times New Roman" w:hAnsi="Times New Roman" w:cs="Times New Roman"/>
-          <w:sz w:val="24"/>
-        </w:rPr>
-        <w:t>roject</w:t>
-      </w:r>
-    </w:p>
-    <w:p>
-      <w:pPr>
-        <w:jc w:val="center"/>
-        <w:rPr>
-          <w:rFonts w:ascii="Times New Roman" w:hAnsi="Times New Roman" w:cs="Times New Roman"/>
-          <w:sz w:val="24"/>
-          <w:lang w:eastAsia="ja-JP"/>
-        </w:rPr>
-      </w:pPr>
-      <w:proofErr w:type="gramStart"/>
-      <w:r>
-        <w:rPr>
-          <w:rFonts w:ascii="Times New Roman" w:hAnsi="Times New Roman" w:cs="Times New Roman" w:hint="eastAsia"/>
-          <w:sz w:val="24"/>
-        </w:rPr>
-        <w:t>Date</w:t>
-      </w:r>
-      <w:r>
-        <w:rPr>
-          <w:rFonts w:ascii="Times New Roman" w:hAnsi="Times New Roman" w:cs="Times New Roman"/>
-          <w:sz w:val="24"/>
-        </w:rPr>
-        <w:t> </w:t>
-      </w:r>
-      <w:r>
-        <w:rPr>
-          <w:rFonts w:ascii="Times New Roman" w:hAnsi="Times New Roman" w:cs="Times New Roman"/>
-          <w:sz w:val="24"/>
-          <w:lang w:eastAsia="ja-JP"/>
-        </w:rPr>
-        <w:t>:</w:t>
-      </w:r>
-      <w:proofErr w:type="gramEnd"/>
-      <w:r>
-        <w:rPr>
-          <w:rFonts w:ascii="Times New Roman" w:hAnsi="Times New Roman" w:cs="Times New Roman"/>
-          <w:sz w:val="24"/>
-          <w:lang w:eastAsia="ja-JP"/>
-        </w:rPr>
-        <w:t xml:space="preserve"> August</w:t>
-      </w:r>
-    </w:p>
-    <w:p>
-      <w:pPr>
-        <w:rPr>
-          <w:rFonts w:ascii="Times New Roman" w:hAnsi="Times New Roman" w:cs="Times New Roman"/>
           <w:b/>
           <w:bCs/>
           <w:sz w:val="24"/>
         </w:rPr>
-      </w:pPr>
-    </w:p>
-    <w:p>
-      <w:pPr>
-        <w:rPr>
-          <w:rFonts w:ascii="Times New Roman" w:hAnsi="Times New Roman" w:cs="Times New Roman"/>
+        <w:t xml:space="preserve"> </w:t>
+      </w:r>
+      <w:r>
+        <w:rPr>
+          <w:rFonts w:ascii="Times New Roman" w:hAnsi="Times New Roman" w:cs="Times New Roman" w:hint="eastAsia"/>
           <w:b/>
           <w:bCs/>
           <w:sz w:val="24"/>
         </w:rPr>
-      </w:pPr>
-    </w:p>
-    <w:p>
-      <w:pPr>
-        <w:rPr>
-          <w:rFonts w:ascii="Times New Roman" w:hAnsi="Times New Roman" w:cs="Times New Roman"/>
+        <w:t>Processing</w:t>
+      </w:r>
+      <w:r>
+        <w:rPr>
+          <w:rFonts w:ascii="Times New Roman" w:hAnsi="Times New Roman" w:cs="Times New Roman" w:hint="eastAsia"/>
           <w:b/>
           <w:bCs/>
           <w:sz w:val="24"/>
         </w:rPr>
-      </w:pPr>
-    </w:p>
-    <w:p>
-      <w:pPr>
+        <w:t>：</w:t>
+      </w:r>
+      <w:r>
         <w:rPr>
           <w:rFonts w:ascii="Times New Roman" w:hAnsi="Times New Roman" w:cs="Times New Roman"/>
           <w:b/>
           <w:bCs/>
           <w:sz w:val="24"/>
         </w:rPr>
-      </w:pPr>
-    </w:p>
-    <w:p>
-      <w:pPr>
+        <w:t>Exploring Sleep-Related Factors</w:t>
+      </w:r>
+      <w:r>
         <w:rPr>
           <w:rFonts w:ascii="Times New Roman" w:hAnsi="Times New Roman" w:cs="Times New Roman"/>
           <w:b/>
           <w:bCs/>
           <w:sz w:val="24"/>
-        </w:rPr>
-      </w:pPr>
+          <w:lang w:eastAsia="ja-JP"/>
+        </w:rPr>
+        <w:t>, Emotional Regulation and Cognitive Performance Using Secondary Data</w:t>
+      </w:r>
+    </w:p>
+    <w:p>
+      <w:pPr>
+        <w:jc w:val="center"/>
+        <w:rPr>
+          <w:rFonts w:ascii="Times New Roman" w:hAnsi="Times New Roman" w:cs="Times New Roman"/>
+          <w:sz w:val="24"/>
+        </w:rPr>
+      </w:pPr>
+    </w:p>
+    <w:p>
+      <w:pPr>
+        <w:jc w:val="center"/>
+        <w:rPr>
+          <w:rFonts w:ascii="Times New Roman" w:hAnsi="Times New Roman" w:cs="Times New Roman"/>
+          <w:sz w:val="24"/>
+        </w:rPr>
+      </w:pPr>
+      <w:r>
+        <w:rPr>
+          <w:rFonts w:ascii="Times New Roman" w:hAnsi="Times New Roman" w:cs="Times New Roman" w:hint="eastAsia"/>
+          <w:sz w:val="24"/>
+        </w:rPr>
+        <w:t>1</w:t>
+      </w:r>
+      <w:r>
+        <w:rPr>
+          <w:rFonts w:ascii="Times New Roman" w:hAnsi="Times New Roman" w:cs="Times New Roman" w:hint="eastAsia"/>
+          <w:sz w:val="24"/>
+          <w:vertAlign w:val="superscript"/>
+        </w:rPr>
+        <w:t>st</w:t>
+      </w:r>
+      <w:r>
+        <w:rPr>
+          <w:rFonts w:ascii="Times New Roman" w:hAnsi="Times New Roman" w:cs="Times New Roman" w:hint="eastAsia"/>
+          <w:sz w:val="24"/>
+        </w:rPr>
+        <w:t xml:space="preserve"> Independent Secondary Data Analysis P</w:t>
+      </w:r>
+      <w:r>
+        <w:rPr>
+          <w:rFonts w:ascii="Times New Roman" w:hAnsi="Times New Roman" w:cs="Times New Roman"/>
+          <w:sz w:val="24"/>
+        </w:rPr>
+        <w:t>roject</w:t>
+      </w:r>
+    </w:p>
+    <w:p>
+      <w:pPr>
+        <w:jc w:val="center"/>
+        <w:rPr>
+          <w:rFonts w:ascii="Times New Roman" w:hAnsi="Times New Roman" w:cs="Times New Roman"/>
+          <w:sz w:val="24"/>
+        </w:rPr>
+      </w:pPr>
+      <w:r>
+        <w:rPr>
+          <w:rFonts w:ascii="Times New Roman" w:hAnsi="Times New Roman" w:cs="Times New Roman"/>
+          <w:sz w:val="24"/>
+        </w:rPr>
+        <w:t>On</w:t>
+      </w:r>
+      <w:r>
+        <w:rPr>
+          <w:rFonts w:ascii="Times New Roman" w:hAnsi="Times New Roman" w:cs="Times New Roman"/>
+          <w:sz w:val="24"/>
+        </w:rPr>
+        <w:t xml:space="preserve"> </w:t>
+      </w:r>
+      <w:proofErr w:type="spellStart"/>
+      <w:r>
+        <w:rPr>
+          <w:rFonts w:ascii="Times New Roman" w:hAnsi="Times New Roman" w:cs="Times New Roman"/>
+          <w:sz w:val="24"/>
+          <w:lang w:val="fr-CA"/>
+        </w:rPr>
+        <w:t>Github</w:t>
+      </w:r>
+      <w:proofErr w:type="spellEnd"/>
     </w:p>
     <w:p>
       <w:pPr>
@@ -352,7 +348,6 @@
     </w:p>
     <w:p>
       <w:pPr>
-        <w:spacing w:after="0"/>
         <w:rPr>
           <w:rFonts w:ascii="Times New Roman" w:hAnsi="Times New Roman" w:cs="Times New Roman"/>
           <w:b/>
@@ -360,14 +355,75 @@
           <w:sz w:val="24"/>
         </w:rPr>
       </w:pPr>
-      <w:r>
+    </w:p>
+    <w:p>
+      <w:pPr>
         <w:rPr>
           <w:rFonts w:ascii="Times New Roman" w:hAnsi="Times New Roman" w:cs="Times New Roman"/>
           <w:b/>
           <w:bCs/>
           <w:sz w:val="24"/>
         </w:rPr>
-        <w:lastRenderedPageBreak/>
+      </w:pPr>
+    </w:p>
+    <w:p>
+      <w:pPr>
+        <w:rPr>
+          <w:rFonts w:ascii="Times New Roman" w:hAnsi="Times New Roman" w:cs="Times New Roman"/>
+          <w:b/>
+          <w:bCs/>
+          <w:sz w:val="24"/>
+        </w:rPr>
+      </w:pPr>
+    </w:p>
+    <w:p>
+      <w:pPr>
+        <w:rPr>
+          <w:rFonts w:ascii="Times New Roman" w:hAnsi="Times New Roman" w:cs="Times New Roman"/>
+          <w:b/>
+          <w:bCs/>
+          <w:sz w:val="24"/>
+        </w:rPr>
+      </w:pPr>
+    </w:p>
+    <w:p>
+      <w:pPr>
+        <w:rPr>
+          <w:rFonts w:ascii="Times New Roman" w:hAnsi="Times New Roman" w:cs="Times New Roman"/>
+          <w:b/>
+          <w:bCs/>
+          <w:sz w:val="24"/>
+        </w:rPr>
+      </w:pPr>
+    </w:p>
+    <w:p>
+      <w:pPr>
+        <w:spacing w:after="0"/>
+        <w:rPr>
+          <w:rFonts w:ascii="Times New Roman" w:hAnsi="Times New Roman" w:cs="Times New Roman"/>
+          <w:b/>
+          <w:bCs/>
+          <w:sz w:val="24"/>
+        </w:rPr>
+      </w:pPr>
+    </w:p>
+    <w:p>
+      <w:pPr>
+        <w:spacing w:after="0"/>
+        <w:rPr>
+          <w:rFonts w:ascii="Times New Roman" w:hAnsi="Times New Roman" w:cs="Times New Roman"/>
+          <w:b/>
+          <w:bCs/>
+          <w:sz w:val="24"/>
+        </w:rPr>
+      </w:pPr>
+      <w:r>
+        <w:rPr>
+          <w:rFonts w:ascii="Times New Roman" w:hAnsi="Times New Roman" w:cs="Times New Roman"/>
+          <w:b/>
+          <w:bCs/>
+          <w:sz w:val="24"/>
+        </w:rPr>
         <w:t>Abstract:</w:t>
       </w:r>
     </w:p>
@@ -746,13 +802,34 @@
           <w:rFonts w:ascii="Times New Roman" w:hAnsi="Times New Roman" w:cs="Times New Roman"/>
           <w:sz w:val="24"/>
         </w:rPr>
-        <w:t xml:space="preserve">fundamental </w:t>
+        <w:t>o</w:t>
+      </w:r>
+      <w:r>
+        <w:rPr>
+          <w:rFonts w:ascii="Times New Roman" w:hAnsi="Times New Roman" w:cs="Times New Roman"/>
+          <w:sz w:val="24"/>
+        </w:rPr>
+        <w:t xml:space="preserve">f the most </w:t>
       </w:r>
       <w:r>
         <w:rPr>
           <w:rFonts w:ascii="Times New Roman" w:hAnsi="Times New Roman" w:cs="Times New Roman" w:hint="eastAsia"/>
           <w:sz w:val="24"/>
         </w:rPr>
+        <w:t>f</w:t>
+      </w:r>
+      <w:r>
+        <w:rPr>
+          <w:rFonts w:ascii="Times New Roman" w:hAnsi="Times New Roman" w:cs="Times New Roman"/>
+          <w:sz w:val="24"/>
+        </w:rPr>
+        <w:t xml:space="preserve">undamental </w:t>
+      </w:r>
+      <w:r>
+        <w:rPr>
+          <w:rFonts w:ascii="Times New Roman" w:hAnsi="Times New Roman" w:cs="Times New Roman" w:hint="eastAsia"/>
+          <w:sz w:val="24"/>
+        </w:rPr>
         <w:t>topic</w:t>
       </w:r>
       <w:r>
@@ -837,7 +914,14 @@
           <w:rFonts w:ascii="Times New Roman" w:hAnsi="Times New Roman" w:cs="Times New Roman"/>
           <w:sz w:val="24"/>
         </w:rPr>
-        <w:t xml:space="preserve"> underlying </w:t>
+        <w:t xml:space="preserve">s </w:t>
+      </w:r>
+      <w:r>
+        <w:rPr>
+          <w:rFonts w:ascii="Times New Roman" w:hAnsi="Times New Roman" w:cs="Times New Roman"/>
+          <w:sz w:val="24"/>
+        </w:rPr>
+        <w:t xml:space="preserve">underlying </w:t>
       </w:r>
       <w:r>
         <w:rPr>
@@ -879,7 +963,21 @@
           <w:rFonts w:ascii="Times New Roman" w:hAnsi="Times New Roman" w:cs="Times New Roman"/>
           <w:sz w:val="24"/>
         </w:rPr>
-        <w:t xml:space="preserve">surrounding. </w:t>
+        <w:t>surrounding</w:t>
+      </w:r>
+      <w:r>
+        <w:rPr>
+          <w:rFonts w:ascii="Times New Roman" w:hAnsi="Times New Roman" w:cs="Times New Roman"/>
+          <w:sz w:val="24"/>
+        </w:rPr>
+        <w:t xml:space="preserve"> environment</w:t>
+      </w:r>
+      <w:r>
+        <w:rPr>
+          <w:rFonts w:ascii="Times New Roman" w:hAnsi="Times New Roman" w:cs="Times New Roman"/>
+          <w:sz w:val="24"/>
+        </w:rPr>
+        <w:t xml:space="preserve">. </w:t>
       </w:r>
       <w:r>
         <w:rPr>
@@ -898,66 +996,82 @@
       </w:r>
       <w:r>
         <w:rPr>
+          <w:rFonts w:ascii="Times New Roman" w:hAnsi="Times New Roman" w:cs="Times New Roman"/>
+          <w:noProof/>
+          <w:sz w:val="24"/>
+        </w:rPr>
+        <w:t xml:space="preserve">; </w:t>
+      </w:r>
+      <w:r>
+        <w:rPr>
+          <w:rFonts w:ascii="Times New Roman" w:hAnsi="Times New Roman" w:cs="Times New Roman"/>
+          <w:noProof/>
+          <w:sz w:val="24"/>
+        </w:rPr>
+        <w:t>Schall, 2004;</w:t>
+      </w:r>
+      <w:r>
+        <w:rPr>
+          <w:rFonts w:ascii="Times New Roman" w:eastAsia="宋体" w:hAnsi="Times New Roman" w:cs="Times New Roman" w:hint="eastAsia"/>
+          <w:noProof/>
+          <w:sz w:val="24"/>
+        </w:rPr>
+        <w:t xml:space="preserve"> </w:t>
+      </w:r>
+      <w:r>
+        <w:rPr>
+          <w:rFonts w:ascii="Times New Roman" w:eastAsia="宋体" w:hAnsi="Times New Roman" w:cs="Times New Roman" w:hint="eastAsia"/>
+          <w:noProof/>
+          <w:sz w:val="24"/>
+        </w:rPr>
+        <w:t>Forstmann</w:t>
+      </w:r>
+      <w:r>
+        <w:rPr>
+          <w:rFonts w:ascii="Times New Roman" w:eastAsia="宋体" w:hAnsi="Times New Roman" w:cs="Times New Roman" w:hint="eastAsia"/>
+          <w:noProof/>
+          <w:sz w:val="24"/>
+        </w:rPr>
+        <w:t xml:space="preserve"> et </w:t>
+      </w:r>
+      <w:r>
+        <w:rPr>
+          <w:rFonts w:ascii="Times New Roman" w:eastAsia="宋体" w:hAnsi="Times New Roman" w:cs="Times New Roman"/>
+          <w:noProof/>
+          <w:sz w:val="24"/>
+        </w:rPr>
+        <w:t>al</w:t>
+      </w:r>
+      <w:r>
+        <w:rPr>
+          <w:rFonts w:ascii="Times New Roman" w:eastAsia="宋体" w:hAnsi="Times New Roman" w:cs="Times New Roman"/>
+          <w:noProof/>
+          <w:sz w:val="24"/>
+        </w:rPr>
+        <w:t>.</w:t>
+      </w:r>
+      <w:r>
+        <w:rPr>
+          <w:rFonts w:ascii="Times New Roman" w:eastAsia="宋体" w:hAnsi="Times New Roman" w:cs="Times New Roman" w:hint="eastAsia"/>
+          <w:noProof/>
+          <w:sz w:val="24"/>
+        </w:rPr>
+        <w:t>, 2011</w:t>
+      </w:r>
+      <w:r>
+        <w:rPr>
+          <w:rFonts w:ascii="Times New Roman" w:hAnsi="Times New Roman" w:cs="Times New Roman"/>
+          <w:noProof/>
+          <w:sz w:val="24"/>
+        </w:rPr>
+        <w:t>)</w:t>
+      </w:r>
+      <w:r>
+        <w:rPr>
           <w:rFonts w:ascii="Times New Roman" w:hAnsi="Times New Roman" w:cs="Times New Roman" w:hint="eastAsia"/>
           <w:noProof/>
           <w:sz w:val="24"/>
         </w:rPr>
-        <w:t>;</w:t>
-      </w:r>
-      <w:r>
-        <w:rPr>
-          <w:rFonts w:ascii="Times New Roman" w:hAnsi="Times New Roman" w:cs="Times New Roman"/>
-          <w:noProof/>
-          <w:sz w:val="24"/>
-        </w:rPr>
-        <w:t xml:space="preserve"> Schall, 2004; </w:t>
-      </w:r>
-      <w:r>
-        <w:rPr>
-          <w:rFonts w:ascii="Times New Roman" w:eastAsia="宋体" w:hAnsi="Times New Roman" w:cs="Times New Roman" w:hint="eastAsia"/>
-          <w:noProof/>
-          <w:sz w:val="24"/>
-        </w:rPr>
-        <w:t>Forstmann</w:t>
-      </w:r>
-      <w:r>
-        <w:rPr>
-          <w:rFonts w:ascii="Times New Roman" w:eastAsia="宋体" w:hAnsi="Times New Roman" w:cs="Times New Roman" w:hint="eastAsia"/>
-          <w:noProof/>
-          <w:sz w:val="24"/>
-        </w:rPr>
-        <w:t xml:space="preserve"> et </w:t>
-      </w:r>
-      <w:r>
-        <w:rPr>
-          <w:rFonts w:ascii="Times New Roman" w:eastAsia="宋体" w:hAnsi="Times New Roman" w:cs="Times New Roman"/>
-          <w:noProof/>
-          <w:sz w:val="24"/>
-        </w:rPr>
-        <w:t>al</w:t>
-      </w:r>
-      <w:r>
-        <w:rPr>
-          <w:rFonts w:ascii="Times New Roman" w:eastAsia="宋体" w:hAnsi="Times New Roman" w:cs="Times New Roman" w:hint="eastAsia"/>
-          <w:noProof/>
-          <w:sz w:val="24"/>
-        </w:rPr>
-        <w:t>, 2011</w:t>
-      </w:r>
-      <w:r>
-        <w:rPr>
-          <w:rFonts w:ascii="Times New Roman" w:hAnsi="Times New Roman" w:cs="Times New Roman"/>
-          <w:noProof/>
-          <w:sz w:val="24"/>
-        </w:rPr>
-        <w:t>)</w:t>
-      </w:r>
-      <w:r>
-        <w:rPr>
-          <w:rFonts w:ascii="Times New Roman" w:hAnsi="Times New Roman" w:cs="Times New Roman" w:hint="eastAsia"/>
-          <w:noProof/>
-          <w:sz w:val="24"/>
-        </w:rPr>
         <w:t xml:space="preserve"> </w:t>
       </w:r>
       <w:r>
@@ -966,23 +1080,103 @@
           <w:noProof/>
           <w:sz w:val="24"/>
         </w:rPr>
-        <w:t>t</w:t>
-      </w:r>
-      <w:r>
-        <w:rPr>
-          <w:rFonts w:ascii="Times New Roman" w:hAnsi="Times New Roman" w:cs="Times New Roman"/>
-          <w:noProof/>
-          <w:sz w:val="24"/>
-        </w:rPr>
-        <w:t>he presented information affects the outputs, or observable</w:t>
-      </w:r>
-      <w:r>
-        <w:rPr>
-          <w:rFonts w:ascii="Times New Roman" w:hAnsi="Times New Roman" w:cs="Times New Roman"/>
-          <w:noProof/>
-          <w:sz w:val="24"/>
-        </w:rPr>
-        <w:t xml:space="preserve"> performance through both its direct role as processed inputs or its indirect role in </w:t>
+        <w:t>P</w:t>
+      </w:r>
+      <w:r>
+        <w:rPr>
+          <w:rFonts w:ascii="Times New Roman" w:hAnsi="Times New Roman" w:cs="Times New Roman"/>
+          <w:noProof/>
+          <w:sz w:val="24"/>
+        </w:rPr>
+        <w:t xml:space="preserve">resented information </w:t>
+      </w:r>
+      <w:r>
+        <w:rPr>
+          <w:rFonts w:ascii="Times New Roman" w:hAnsi="Times New Roman" w:cs="Times New Roman"/>
+          <w:noProof/>
+          <w:sz w:val="24"/>
+        </w:rPr>
+        <w:t xml:space="preserve">may </w:t>
+      </w:r>
+      <w:r>
+        <w:rPr>
+          <w:rFonts w:ascii="Times New Roman" w:hAnsi="Times New Roman" w:cs="Times New Roman"/>
+          <w:noProof/>
+          <w:sz w:val="24"/>
+        </w:rPr>
+        <w:t xml:space="preserve">affect the </w:t>
+      </w:r>
+      <w:r>
+        <w:rPr>
+          <w:rFonts w:ascii="Times New Roman" w:hAnsi="Times New Roman" w:cs="Times New Roman"/>
+          <w:noProof/>
+          <w:sz w:val="24"/>
+        </w:rPr>
+        <w:t>outcomes</w:t>
+      </w:r>
+      <w:r>
+        <w:rPr>
+          <w:rFonts w:ascii="Times New Roman" w:hAnsi="Times New Roman" w:cs="Times New Roman"/>
+          <w:noProof/>
+          <w:sz w:val="24"/>
+        </w:rPr>
+        <w:t xml:space="preserve">, </w:t>
+      </w:r>
+      <w:r>
+        <w:rPr>
+          <w:rFonts w:ascii="Times New Roman" w:hAnsi="Times New Roman" w:cs="Times New Roman"/>
+          <w:noProof/>
+          <w:sz w:val="24"/>
+        </w:rPr>
+        <w:t xml:space="preserve">or </w:t>
+      </w:r>
+      <w:r>
+        <w:rPr>
+          <w:rFonts w:ascii="Times New Roman" w:hAnsi="Times New Roman" w:cs="Times New Roman"/>
+          <w:noProof/>
+          <w:sz w:val="24"/>
+        </w:rPr>
+        <w:t>observable</w:t>
+      </w:r>
+      <w:r>
+        <w:rPr>
+          <w:rFonts w:ascii="Times New Roman" w:hAnsi="Times New Roman" w:cs="Times New Roman"/>
+          <w:noProof/>
+          <w:sz w:val="24"/>
+        </w:rPr>
+        <w:t xml:space="preserve"> performance</w:t>
+      </w:r>
+      <w:r>
+        <w:rPr>
+          <w:rFonts w:ascii="Times New Roman" w:hAnsi="Times New Roman" w:cs="Times New Roman"/>
+          <w:noProof/>
+          <w:sz w:val="24"/>
+        </w:rPr>
+        <w:t>,</w:t>
+      </w:r>
+      <w:r>
+        <w:rPr>
+          <w:rFonts w:ascii="Times New Roman" w:hAnsi="Times New Roman" w:cs="Times New Roman"/>
+          <w:noProof/>
+          <w:sz w:val="24"/>
+        </w:rPr>
+        <w:t xml:space="preserve"> through both its direct role as processed input </w:t>
+      </w:r>
+      <w:r>
+        <w:rPr>
+          <w:rFonts w:ascii="Times New Roman" w:hAnsi="Times New Roman" w:cs="Times New Roman"/>
+          <w:noProof/>
+          <w:sz w:val="24"/>
+        </w:rPr>
+        <w:t>and</w:t>
+      </w:r>
+      <w:r>
+        <w:rPr>
+          <w:rFonts w:ascii="Times New Roman" w:hAnsi="Times New Roman" w:cs="Times New Roman"/>
+          <w:noProof/>
+          <w:sz w:val="24"/>
+        </w:rPr>
+        <w:t xml:space="preserve"> its indirect role in </w:t>
       </w:r>
       <w:r>
         <w:rPr>
@@ -998,7 +1192,23 @@
           <w:noProof/>
           <w:sz w:val="24"/>
         </w:rPr>
-        <w:t>the state or condition under which processing occurs</w:t>
+        <w:t xml:space="preserve">the state </w:t>
+      </w:r>
+      <w:r>
+        <w:rPr>
+          <w:rFonts w:ascii="Times New Roman" w:hAnsi="Times New Roman" w:cs="Times New Roman"/>
+          <w:noProof/>
+          <w:sz w:val="24"/>
+        </w:rPr>
+        <w:t xml:space="preserve">and </w:t>
+      </w:r>
+      <w:r>
+        <w:rPr>
+          <w:rFonts w:ascii="Times New Roman" w:hAnsi="Times New Roman" w:cs="Times New Roman"/>
+          <w:noProof/>
+          <w:sz w:val="24"/>
+        </w:rPr>
+        <w:t>condition under which processing occurs</w:t>
       </w:r>
       <w:r>
         <w:rPr>
@@ -1015,25 +1225,293 @@
         <w:ind w:firstLineChars="100" w:firstLine="240"/>
         <w:jc w:val="both"/>
         <w:rPr>
+          <w:rFonts w:ascii="Times New Roman" w:hAnsi="Times New Roman" w:cs="Times New Roman" w:hint="eastAsia"/>
+          <w:noProof/>
+          <w:sz w:val="24"/>
+        </w:rPr>
+      </w:pPr>
+      <w:r>
+        <w:rPr>
+          <w:rFonts w:ascii="Times New Roman" w:hAnsi="Times New Roman" w:cs="Times New Roman"/>
+          <w:noProof/>
+          <w:sz w:val="24"/>
+        </w:rPr>
+        <w:t>Certain st</w:t>
+      </w:r>
+      <w:r>
+        <w:rPr>
+          <w:rFonts w:ascii="Times New Roman" w:hAnsi="Times New Roman" w:cs="Times New Roman"/>
+          <w:noProof/>
+          <w:sz w:val="24"/>
+        </w:rPr>
+        <w:t xml:space="preserve">udies </w:t>
+      </w:r>
+      <w:r>
+        <w:rPr>
+          <w:rFonts w:ascii="Times New Roman" w:hAnsi="Times New Roman" w:cs="Times New Roman"/>
+          <w:noProof/>
+          <w:sz w:val="24"/>
+        </w:rPr>
+        <w:t>support</w:t>
+      </w:r>
+      <w:r>
+        <w:rPr>
+          <w:rFonts w:ascii="Times New Roman" w:hAnsi="Times New Roman" w:cs="Times New Roman"/>
+          <w:noProof/>
+          <w:sz w:val="24"/>
+        </w:rPr>
+        <w:t xml:space="preserve"> </w:t>
+      </w:r>
+      <w:r>
+        <w:rPr>
+          <w:rFonts w:ascii="Times New Roman" w:hAnsi="Times New Roman" w:cs="Times New Roman"/>
+          <w:noProof/>
+          <w:sz w:val="24"/>
+        </w:rPr>
+        <w:t xml:space="preserve">the idea </w:t>
+      </w:r>
+      <w:r>
+        <w:rPr>
+          <w:rFonts w:ascii="Times New Roman" w:hAnsi="Times New Roman" w:cs="Times New Roman"/>
+          <w:noProof/>
+          <w:sz w:val="24"/>
+        </w:rPr>
+        <w:t xml:space="preserve">of a </w:t>
+      </w:r>
+      <w:r>
+        <w:rPr>
+          <w:rFonts w:ascii="Times New Roman" w:hAnsi="Times New Roman" w:cs="Times New Roman"/>
+          <w:noProof/>
+          <w:sz w:val="24"/>
+        </w:rPr>
+        <w:t>broad</w:t>
+      </w:r>
+      <w:r>
+        <w:rPr>
+          <w:rFonts w:ascii="Times New Roman" w:hAnsi="Times New Roman" w:cs="Times New Roman"/>
+          <w:noProof/>
+          <w:sz w:val="24"/>
+        </w:rPr>
+        <w:t>er</w:t>
+      </w:r>
+      <w:r>
+        <w:rPr>
+          <w:rFonts w:ascii="Times New Roman" w:hAnsi="Times New Roman" w:cs="Times New Roman"/>
+          <w:noProof/>
+          <w:sz w:val="24"/>
+        </w:rPr>
+        <w:t xml:space="preserve"> </w:t>
+      </w:r>
+      <w:r>
+        <w:rPr>
+          <w:rFonts w:ascii="Times New Roman" w:hAnsi="Times New Roman" w:cs="Times New Roman"/>
+          <w:noProof/>
+          <w:sz w:val="24"/>
+        </w:rPr>
+        <w:t>conceptualization of cogntive processing</w:t>
+      </w:r>
+      <w:r>
+        <w:rPr>
+          <w:rFonts w:ascii="Times New Roman" w:hAnsi="Times New Roman" w:cs="Times New Roman"/>
+          <w:noProof/>
+          <w:sz w:val="24"/>
+        </w:rPr>
+        <w:t xml:space="preserve"> as</w:t>
+      </w:r>
+      <w:r>
+        <w:rPr>
+          <w:rFonts w:ascii="Times New Roman" w:hAnsi="Times New Roman" w:cs="Times New Roman"/>
+          <w:noProof/>
+          <w:sz w:val="24"/>
+        </w:rPr>
+        <w:t xml:space="preserve"> a</w:t>
+      </w:r>
+      <w:r>
+        <w:rPr>
+          <w:rFonts w:ascii="Times New Roman" w:hAnsi="Times New Roman" w:cs="Times New Roman"/>
+          <w:noProof/>
+          <w:sz w:val="24"/>
+        </w:rPr>
+        <w:t xml:space="preserve"> dynamically</w:t>
+      </w:r>
+      <w:r>
+        <w:rPr>
+          <w:rFonts w:ascii="Times New Roman" w:hAnsi="Times New Roman" w:cs="Times New Roman"/>
+          <w:noProof/>
+          <w:sz w:val="24"/>
+        </w:rPr>
+        <w:t xml:space="preserve"> conditional model, </w:t>
+      </w:r>
+      <w:r>
+        <w:rPr>
+          <w:rFonts w:ascii="Times New Roman" w:hAnsi="Times New Roman" w:cs="Times New Roman"/>
+          <w:noProof/>
+          <w:sz w:val="24"/>
+        </w:rPr>
+        <w:t xml:space="preserve">meaning </w:t>
+      </w:r>
+      <w:r>
+        <w:rPr>
+          <w:rFonts w:ascii="Times New Roman" w:hAnsi="Times New Roman" w:cs="Times New Roman"/>
+          <w:noProof/>
+          <w:sz w:val="24"/>
+        </w:rPr>
+        <w:t xml:space="preserve">that </w:t>
+      </w:r>
+      <w:r>
+        <w:rPr>
+          <w:rFonts w:ascii="Times New Roman" w:hAnsi="Times New Roman" w:cs="Times New Roman"/>
+          <w:noProof/>
+          <w:sz w:val="24"/>
+        </w:rPr>
+        <w:t xml:space="preserve">the </w:t>
+      </w:r>
+      <w:r>
+        <w:rPr>
+          <w:rFonts w:ascii="Times New Roman" w:hAnsi="Times New Roman" w:cs="Times New Roman"/>
+          <w:noProof/>
+          <w:sz w:val="24"/>
+        </w:rPr>
+        <w:t xml:space="preserve">expected </w:t>
+      </w:r>
+      <w:r>
+        <w:rPr>
+          <w:rFonts w:ascii="Times New Roman" w:hAnsi="Times New Roman" w:cs="Times New Roman"/>
+          <w:noProof/>
+          <w:sz w:val="24"/>
+        </w:rPr>
+        <w:t>processing outcome</w:t>
+      </w:r>
+      <w:r>
+        <w:rPr>
+          <w:rFonts w:ascii="Times New Roman" w:hAnsi="Times New Roman" w:cs="Times New Roman"/>
+          <w:noProof/>
+          <w:sz w:val="24"/>
+        </w:rPr>
+        <w:t xml:space="preserve"> </w:t>
+      </w:r>
+      <w:r>
+        <w:rPr>
+          <w:rFonts w:ascii="Times New Roman" w:hAnsi="Times New Roman" w:cs="Times New Roman"/>
+          <w:noProof/>
+          <w:sz w:val="24"/>
+        </w:rPr>
+        <w:t>may be</w:t>
+      </w:r>
+      <w:r>
+        <w:rPr>
+          <w:rFonts w:ascii="Times New Roman" w:hAnsi="Times New Roman" w:cs="Times New Roman"/>
+          <w:noProof/>
+          <w:sz w:val="24"/>
+        </w:rPr>
+        <w:t xml:space="preserve"> </w:t>
+      </w:r>
+      <w:r>
+        <w:rPr>
+          <w:rFonts w:ascii="Times New Roman" w:hAnsi="Times New Roman" w:cs="Times New Roman"/>
+          <w:noProof/>
+          <w:sz w:val="24"/>
+        </w:rPr>
+        <w:t xml:space="preserve">implicitly </w:t>
+      </w:r>
+      <w:r>
+        <w:rPr>
+          <w:rFonts w:ascii="Times New Roman" w:hAnsi="Times New Roman" w:cs="Times New Roman"/>
+          <w:noProof/>
+          <w:sz w:val="24"/>
+        </w:rPr>
+        <w:t xml:space="preserve">modulated by </w:t>
+      </w:r>
+      <w:r>
+        <w:rPr>
+          <w:rFonts w:ascii="Times New Roman" w:hAnsi="Times New Roman" w:cs="Times New Roman"/>
+          <w:noProof/>
+          <w:sz w:val="24"/>
+        </w:rPr>
+        <w:t xml:space="preserve">current </w:t>
+      </w:r>
+      <w:r>
+        <w:rPr>
+          <w:rFonts w:ascii="Times New Roman" w:hAnsi="Times New Roman" w:cs="Times New Roman"/>
+          <w:noProof/>
+          <w:sz w:val="24"/>
+        </w:rPr>
+        <w:t>state</w:t>
+      </w:r>
+      <w:r>
+        <w:rPr>
+          <w:rFonts w:ascii="Times New Roman" w:hAnsi="Times New Roman" w:cs="Times New Roman" w:hint="eastAsia"/>
+          <w:noProof/>
+          <w:sz w:val="24"/>
+        </w:rPr>
+        <w:t>,</w:t>
+      </w:r>
+      <w:r>
+        <w:rPr>
+          <w:rFonts w:ascii="Times New Roman" w:hAnsi="Times New Roman" w:cs="Times New Roman"/>
+          <w:noProof/>
+          <w:sz w:val="24"/>
+        </w:rPr>
+        <w:t xml:space="preserve"> </w:t>
+      </w:r>
+      <w:r>
+        <w:rPr>
+          <w:rFonts w:ascii="Times New Roman" w:hAnsi="Times New Roman" w:cs="Times New Roman"/>
+          <w:sz w:val="24"/>
+        </w:rPr>
+        <w:t>even when the immediate processing input remains unchanged, thereby potentially altering the individual’s response</w:t>
+      </w:r>
+      <w:r>
+        <w:rPr>
           <w:rFonts w:ascii="Times New Roman" w:hAnsi="Times New Roman" w:cs="Times New Roman"/>
           <w:noProof/>
           <w:sz w:val="24"/>
           <w:lang w:eastAsia="ja-JP"/>
         </w:rPr>
-      </w:pPr>
-      <w:r>
-        <w:rPr>
-          <w:rFonts w:ascii="Times New Roman" w:hAnsi="Times New Roman" w:cs="Times New Roman"/>
-          <w:noProof/>
-          <w:sz w:val="24"/>
-        </w:rPr>
-        <w:t>Some</w:t>
-      </w:r>
-      <w:r>
-        <w:rPr>
-          <w:rFonts w:ascii="Times New Roman" w:hAnsi="Times New Roman" w:cs="Times New Roman"/>
-          <w:noProof/>
-          <w:sz w:val="24"/>
+        <w:t>.</w:t>
+      </w:r>
+      <w:r>
+        <w:rPr>
+          <w:rFonts w:ascii="Times New Roman" w:hAnsi="Times New Roman" w:cs="Times New Roman"/>
+          <w:noProof/>
+          <w:sz w:val="24"/>
+          <w:lang w:eastAsia="ja-JP"/>
+        </w:rPr>
+        <w:t xml:space="preserve"> (Flavell et al, </w:t>
+      </w:r>
+      <w:r>
+        <w:rPr>
+          <w:rFonts w:ascii="Times New Roman" w:hAnsi="Times New Roman" w:cs="Times New Roman"/>
+          <w:noProof/>
+          <w:sz w:val="24"/>
+          <w:lang w:eastAsia="ja-JP"/>
+        </w:rPr>
+        <w:t xml:space="preserve">2022; </w:t>
+      </w:r>
+      <w:r>
+        <w:rPr>
+          <w:rFonts w:ascii="Times New Roman" w:hAnsi="Times New Roman" w:cs="Times New Roman"/>
+          <w:noProof/>
+          <w:sz w:val="24"/>
+          <w:lang w:eastAsia="ja-JP"/>
+        </w:rPr>
+        <w:t>Gilbert &amp; Sigman, 2007</w:t>
+      </w:r>
+      <w:r>
+        <w:rPr>
+          <w:rFonts w:ascii="Times New Roman" w:hAnsi="Times New Roman" w:cs="Times New Roman"/>
+          <w:noProof/>
+          <w:sz w:val="24"/>
+          <w:lang w:eastAsia="ja-JP"/>
+        </w:rPr>
+        <w:t>)</w:t>
+      </w:r>
+      <w:r>
+        <w:rPr>
+          <w:rFonts w:ascii="Times New Roman" w:hAnsi="Times New Roman" w:cs="Times New Roman"/>
+          <w:noProof/>
+          <w:sz w:val="24"/>
+          <w:lang w:eastAsia="ja-JP"/>
         </w:rPr>
         <w:t xml:space="preserve"> </w:t>
       </w:r>
@@ -1042,8 +1520,99 @@
           <w:rFonts w:ascii="Times New Roman" w:hAnsi="Times New Roman" w:cs="Times New Roman"/>
           <w:noProof/>
           <w:sz w:val="24"/>
-        </w:rPr>
-        <w:t>studies advocates</w:t>
+          <w:lang w:eastAsia="ja-JP"/>
+        </w:rPr>
+        <w:t>The condition,</w:t>
+      </w:r>
+      <w:r>
+        <w:rPr>
+          <w:rFonts w:ascii="Times New Roman" w:hAnsi="Times New Roman" w:cs="Times New Roman"/>
+          <w:noProof/>
+          <w:sz w:val="24"/>
+          <w:lang w:eastAsia="ja-JP"/>
+        </w:rPr>
+        <w:t xml:space="preserve"> contributing to</w:t>
+      </w:r>
+      <w:r>
+        <w:rPr>
+          <w:rFonts w:ascii="Times New Roman" w:hAnsi="Times New Roman" w:cs="Times New Roman"/>
+          <w:noProof/>
+          <w:sz w:val="24"/>
+          <w:lang w:eastAsia="ja-JP"/>
+        </w:rPr>
+        <w:t xml:space="preserve"> the variation o</w:t>
+      </w:r>
+      <w:r>
+        <w:rPr>
+          <w:rFonts w:ascii="Times New Roman" w:hAnsi="Times New Roman" w:cs="Times New Roman"/>
+          <w:noProof/>
+          <w:sz w:val="24"/>
+          <w:lang w:eastAsia="ja-JP"/>
+        </w:rPr>
+        <w:t>f cogntive</w:t>
+      </w:r>
+      <w:r>
+        <w:rPr>
+          <w:rFonts w:ascii="Times New Roman" w:hAnsi="Times New Roman" w:cs="Times New Roman"/>
+          <w:noProof/>
+          <w:sz w:val="24"/>
+          <w:lang w:eastAsia="ja-JP"/>
+        </w:rPr>
+        <w:t xml:space="preserve"> processing</w:t>
+      </w:r>
+      <w:r>
+        <w:rPr>
+          <w:rFonts w:ascii="Times New Roman" w:hAnsi="Times New Roman" w:cs="Times New Roman"/>
+          <w:noProof/>
+          <w:sz w:val="24"/>
+          <w:lang w:eastAsia="ja-JP"/>
+        </w:rPr>
+        <w:t xml:space="preserve">, </w:t>
+      </w:r>
+      <w:r>
+        <w:rPr>
+          <w:rFonts w:ascii="Times New Roman" w:hAnsi="Times New Roman" w:cs="Times New Roman"/>
+          <w:noProof/>
+          <w:sz w:val="24"/>
+          <w:lang w:eastAsia="ja-JP"/>
+        </w:rPr>
+        <w:t>can be</w:t>
+      </w:r>
+      <w:r>
+        <w:rPr>
+          <w:rFonts w:ascii="Times New Roman" w:hAnsi="Times New Roman" w:cs="Times New Roman"/>
+          <w:noProof/>
+          <w:sz w:val="24"/>
+          <w:lang w:eastAsia="ja-JP"/>
+        </w:rPr>
+        <w:t xml:space="preserve"> specficailly</w:t>
+      </w:r>
+      <w:r>
+        <w:rPr>
+          <w:rFonts w:ascii="Times New Roman" w:hAnsi="Times New Roman" w:cs="Times New Roman"/>
+          <w:noProof/>
+          <w:sz w:val="24"/>
+          <w:lang w:eastAsia="ja-JP"/>
+        </w:rPr>
+        <w:t xml:space="preserve"> distinguished </w:t>
+      </w:r>
+      <w:r>
+        <w:rPr>
+          <w:rFonts w:ascii="Times New Roman" w:hAnsi="Times New Roman" w:cs="Times New Roman"/>
+          <w:noProof/>
+          <w:sz w:val="24"/>
+          <w:lang w:eastAsia="ja-JP"/>
+        </w:rPr>
+        <w:t>in</w:t>
+      </w:r>
+      <w:r>
+        <w:rPr>
+          <w:rFonts w:ascii="Times New Roman" w:hAnsi="Times New Roman" w:cs="Times New Roman"/>
+          <w:noProof/>
+          <w:sz w:val="24"/>
+          <w:lang w:eastAsia="ja-JP"/>
+        </w:rPr>
+        <w:t>to two types. One</w:t>
       </w:r>
       <w:r>
         <w:rPr>
@@ -1059,31 +1628,31 @@
           <w:noProof/>
           <w:sz w:val="24"/>
         </w:rPr>
-        <w:t xml:space="preserve">the idea that </w:t>
-      </w:r>
-      <w:r>
-        <w:rPr>
-          <w:rFonts w:ascii="Times New Roman" w:hAnsi="Times New Roman" w:cs="Times New Roman"/>
-          <w:noProof/>
-          <w:sz w:val="24"/>
-        </w:rPr>
-        <w:t>the</w:t>
-      </w:r>
-      <w:r>
-        <w:rPr>
-          <w:rFonts w:ascii="Times New Roman" w:hAnsi="Times New Roman" w:cs="Times New Roman"/>
-          <w:noProof/>
-          <w:sz w:val="24"/>
-        </w:rPr>
-        <w:t xml:space="preserve"> cognitve algorithms </w:t>
-      </w:r>
-      <w:r>
-        <w:rPr>
-          <w:rFonts w:ascii="Times New Roman" w:hAnsi="Times New Roman" w:cs="Times New Roman"/>
-          <w:noProof/>
-          <w:sz w:val="24"/>
-        </w:rPr>
-        <w:t>can be more broadly</w:t>
+        <w:t>is</w:t>
+      </w:r>
+      <w:r>
+        <w:rPr>
+          <w:rFonts w:ascii="Times New Roman" w:hAnsi="Times New Roman" w:cs="Times New Roman"/>
+          <w:noProof/>
+          <w:sz w:val="24"/>
+        </w:rPr>
+        <w:t xml:space="preserve"> conceptualized as </w:t>
+      </w:r>
+      <w:r>
+        <w:rPr>
+          <w:rFonts w:ascii="Times New Roman" w:hAnsi="Times New Roman" w:cs="Times New Roman"/>
+          <w:noProof/>
+          <w:sz w:val="24"/>
+        </w:rPr>
+        <w:t xml:space="preserve">beahvioural condition, meaning the condition genreated </w:t>
+      </w:r>
+      <w:r>
+        <w:rPr>
+          <w:rFonts w:ascii="Times New Roman" w:hAnsi="Times New Roman" w:cs="Times New Roman"/>
+          <w:noProof/>
+          <w:sz w:val="24"/>
+        </w:rPr>
+        <w:t>by</w:t>
       </w:r>
       <w:r>
         <w:rPr>
@@ -1099,63 +1668,71 @@
           <w:noProof/>
           <w:sz w:val="24"/>
         </w:rPr>
-        <w:t>conceptualized</w:t>
-      </w:r>
-      <w:r>
-        <w:rPr>
-          <w:rFonts w:ascii="Times New Roman" w:hAnsi="Times New Roman" w:cs="Times New Roman"/>
-          <w:noProof/>
-          <w:sz w:val="24"/>
-        </w:rPr>
-        <w:t xml:space="preserve"> as a</w:t>
-      </w:r>
-      <w:r>
-        <w:rPr>
-          <w:rFonts w:ascii="Times New Roman" w:hAnsi="Times New Roman" w:cs="Times New Roman"/>
-          <w:noProof/>
-          <w:sz w:val="24"/>
-        </w:rPr>
-        <w:t xml:space="preserve"> dynamically</w:t>
-      </w:r>
-      <w:r>
-        <w:rPr>
-          <w:rFonts w:ascii="Times New Roman" w:hAnsi="Times New Roman" w:cs="Times New Roman"/>
-          <w:noProof/>
-          <w:sz w:val="24"/>
-        </w:rPr>
-        <w:t xml:space="preserve"> conditional model, </w:t>
-      </w:r>
-      <w:r>
-        <w:rPr>
-          <w:rFonts w:ascii="Times New Roman" w:hAnsi="Times New Roman" w:cs="Times New Roman"/>
-          <w:noProof/>
-          <w:sz w:val="24"/>
-        </w:rPr>
-        <w:t xml:space="preserve">meaning </w:t>
-      </w:r>
-      <w:r>
-        <w:rPr>
-          <w:rFonts w:ascii="Times New Roman" w:hAnsi="Times New Roman" w:cs="Times New Roman"/>
-          <w:noProof/>
-          <w:sz w:val="24"/>
-        </w:rPr>
-        <w:t xml:space="preserve">the </w:t>
-      </w:r>
-      <w:r>
-        <w:rPr>
-          <w:rFonts w:ascii="Times New Roman" w:hAnsi="Times New Roman" w:cs="Times New Roman"/>
-          <w:noProof/>
-          <w:sz w:val="24"/>
-        </w:rPr>
-        <w:t xml:space="preserve">expected </w:t>
-      </w:r>
-      <w:r>
-        <w:rPr>
-          <w:rFonts w:ascii="Times New Roman" w:hAnsi="Times New Roman" w:cs="Times New Roman"/>
-          <w:noProof/>
-          <w:sz w:val="24"/>
-        </w:rPr>
-        <w:t>processing outcome</w:t>
+        <w:t xml:space="preserve">prior </w:t>
+      </w:r>
+      <w:r>
+        <w:rPr>
+          <w:rFonts w:ascii="Times New Roman" w:hAnsi="Times New Roman" w:cs="Times New Roman"/>
+          <w:noProof/>
+          <w:sz w:val="24"/>
+        </w:rPr>
+        <w:t xml:space="preserve">external </w:t>
+      </w:r>
+      <w:r>
+        <w:rPr>
+          <w:rFonts w:ascii="Times New Roman" w:hAnsi="Times New Roman" w:cs="Times New Roman"/>
+          <w:noProof/>
+          <w:sz w:val="24"/>
+        </w:rPr>
+        <w:t xml:space="preserve">behavior </w:t>
+      </w:r>
+      <w:r>
+        <w:rPr>
+          <w:rFonts w:ascii="Times New Roman" w:hAnsi="Times New Roman" w:cs="Times New Roman"/>
+          <w:noProof/>
+          <w:sz w:val="24"/>
+        </w:rPr>
+        <w:t>or activities</w:t>
+      </w:r>
+      <w:r>
+        <w:rPr>
+          <w:rFonts w:ascii="Times New Roman" w:hAnsi="Times New Roman" w:cs="Times New Roman"/>
+          <w:noProof/>
+          <w:sz w:val="24"/>
+        </w:rPr>
+        <w:t xml:space="preserve"> and </w:t>
+      </w:r>
+      <w:r>
+        <w:rPr>
+          <w:rFonts w:ascii="Times New Roman" w:hAnsi="Times New Roman" w:cs="Times New Roman"/>
+          <w:noProof/>
+          <w:sz w:val="24"/>
+        </w:rPr>
+        <w:t>subsequently</w:t>
+      </w:r>
+      <w:r>
+        <w:rPr>
+          <w:rFonts w:ascii="Times New Roman" w:hAnsi="Times New Roman" w:cs="Times New Roman"/>
+          <w:noProof/>
+          <w:sz w:val="24"/>
+        </w:rPr>
+        <w:t xml:space="preserve"> affects individual who adopt</w:t>
+      </w:r>
+      <w:r>
+        <w:rPr>
+          <w:rFonts w:ascii="Times New Roman" w:hAnsi="Times New Roman" w:cs="Times New Roman"/>
+          <w:noProof/>
+          <w:sz w:val="24"/>
+        </w:rPr>
+        <w:t>s</w:t>
+      </w:r>
+      <w:r>
+        <w:rPr>
+          <w:rFonts w:ascii="Times New Roman" w:hAnsi="Times New Roman" w:cs="Times New Roman"/>
+          <w:noProof/>
+          <w:sz w:val="24"/>
+        </w:rPr>
+        <w:t xml:space="preserve"> it,</w:t>
       </w:r>
       <w:r>
         <w:rPr>
@@ -1171,82 +1748,21 @@
           <w:noProof/>
           <w:sz w:val="24"/>
         </w:rPr>
-        <w:t xml:space="preserve">is </w:t>
-      </w:r>
-      <w:r>
-        <w:rPr>
-          <w:rFonts w:ascii="Times New Roman" w:hAnsi="Times New Roman" w:cs="Times New Roman"/>
-          <w:noProof/>
-          <w:sz w:val="24"/>
-        </w:rPr>
-        <w:t xml:space="preserve">implicitly </w:t>
-      </w:r>
-      <w:r>
-        <w:rPr>
-          <w:rFonts w:ascii="Times New Roman" w:hAnsi="Times New Roman" w:cs="Times New Roman"/>
-          <w:noProof/>
-          <w:sz w:val="24"/>
-        </w:rPr>
-        <w:t>modulated dynamically by state</w:t>
-      </w:r>
-      <w:r>
-        <w:rPr>
-          <w:rFonts w:ascii="Times New Roman" w:hAnsi="Times New Roman" w:cs="Times New Roman"/>
-          <w:noProof/>
-          <w:sz w:val="24"/>
-        </w:rPr>
-        <w:t xml:space="preserve"> despite the same </w:t>
-      </w:r>
-      <w:r>
-        <w:rPr>
-          <w:rFonts w:ascii="Times New Roman" w:hAnsi="Times New Roman" w:cs="Times New Roman"/>
-          <w:noProof/>
-          <w:sz w:val="24"/>
-        </w:rPr>
-        <w:t xml:space="preserve">observation </w:t>
-      </w:r>
-      <w:r>
-        <w:rPr>
-          <w:rFonts w:ascii="Times New Roman" w:hAnsi="Times New Roman" w:cs="Times New Roman"/>
-          <w:noProof/>
-          <w:sz w:val="24"/>
-          <w:lang w:eastAsia="ja-JP"/>
-        </w:rPr>
-        <w:t xml:space="preserve">to </w:t>
-      </w:r>
-      <w:r>
-        <w:rPr>
-          <w:rFonts w:ascii="Times New Roman" w:hAnsi="Times New Roman" w:cs="Times New Roman"/>
-          <w:noProof/>
-          <w:sz w:val="24"/>
-          <w:lang w:eastAsia="ja-JP"/>
-        </w:rPr>
-        <w:t xml:space="preserve">correspondignly </w:t>
-      </w:r>
-      <w:r>
-        <w:rPr>
-          <w:rFonts w:ascii="Times New Roman" w:hAnsi="Times New Roman" w:cs="Times New Roman"/>
-          <w:noProof/>
-          <w:sz w:val="24"/>
-          <w:lang w:eastAsia="ja-JP"/>
-        </w:rPr>
-        <w:t xml:space="preserve">alter </w:t>
-      </w:r>
-      <w:r>
-        <w:rPr>
-          <w:rFonts w:ascii="Times New Roman" w:hAnsi="Times New Roman" w:cs="Times New Roman"/>
-          <w:noProof/>
-          <w:sz w:val="24"/>
-          <w:lang w:eastAsia="ja-JP"/>
-        </w:rPr>
-        <w:t>individual’s resposne.</w:t>
-      </w:r>
-      <w:r>
-        <w:rPr>
-          <w:rFonts w:ascii="Times New Roman" w:hAnsi="Times New Roman" w:cs="Times New Roman"/>
-          <w:noProof/>
-          <w:sz w:val="24"/>
-          <w:lang w:eastAsia="ja-JP"/>
+        <w:t>al</w:t>
+      </w:r>
+      <w:r>
+        <w:rPr>
+          <w:rFonts w:ascii="Times New Roman" w:hAnsi="Times New Roman" w:cs="Times New Roman"/>
+          <w:noProof/>
+          <w:sz w:val="24"/>
+        </w:rPr>
+        <w:t>though</w:t>
+      </w:r>
+      <w:r>
+        <w:rPr>
+          <w:rFonts w:ascii="Times New Roman" w:hAnsi="Times New Roman" w:cs="Times New Roman"/>
+          <w:noProof/>
+          <w:sz w:val="24"/>
         </w:rPr>
         <w:t xml:space="preserve"> </w:t>
       </w:r>
@@ -1255,45 +1771,261 @@
           <w:rFonts w:ascii="Times New Roman" w:hAnsi="Times New Roman" w:cs="Times New Roman"/>
           <w:noProof/>
           <w:sz w:val="24"/>
-          <w:lang w:eastAsia="ja-JP"/>
-        </w:rPr>
-        <w:t xml:space="preserve">(Flavell et al, 2022; </w:t>
-      </w:r>
-      <w:r>
-        <w:rPr>
-          <w:rFonts w:ascii="Times New Roman" w:hAnsi="Times New Roman" w:cs="Times New Roman"/>
-          <w:noProof/>
-          <w:sz w:val="24"/>
-          <w:lang w:val="fr-CA" w:eastAsia="ja-JP"/>
-        </w:rPr>
-        <w:t>Gilbert &amp; Sigman, 2007</w:t>
-      </w:r>
-      <w:r>
-        <w:rPr>
-          <w:rFonts w:ascii="Times New Roman" w:hAnsi="Times New Roman" w:cs="Times New Roman"/>
-          <w:noProof/>
-          <w:sz w:val="24"/>
-          <w:lang w:eastAsia="ja-JP"/>
+        </w:rPr>
+        <w:t xml:space="preserve">the it </w:t>
+      </w:r>
+      <w:r>
+        <w:rPr>
+          <w:rFonts w:ascii="Times New Roman" w:hAnsi="Times New Roman" w:cs="Times New Roman"/>
+          <w:noProof/>
+          <w:sz w:val="24"/>
+        </w:rPr>
+        <w:t xml:space="preserve">is not </w:t>
+      </w:r>
+      <w:r>
+        <w:rPr>
+          <w:rFonts w:ascii="Times New Roman" w:hAnsi="Times New Roman" w:cs="Times New Roman"/>
+          <w:noProof/>
+          <w:sz w:val="24"/>
+        </w:rPr>
+        <w:t xml:space="preserve">necessarily related </w:t>
+      </w:r>
+      <w:r>
+        <w:rPr>
+          <w:rFonts w:ascii="Times New Roman" w:hAnsi="Times New Roman" w:cs="Times New Roman"/>
+          <w:noProof/>
+          <w:sz w:val="24"/>
+        </w:rPr>
+        <w:t>to</w:t>
+      </w:r>
+      <w:r>
+        <w:rPr>
+          <w:rFonts w:ascii="Times New Roman" w:hAnsi="Times New Roman" w:cs="Times New Roman"/>
+          <w:noProof/>
+          <w:sz w:val="24"/>
+        </w:rPr>
+        <w:t xml:space="preserve"> the propoerties of </w:t>
+      </w:r>
+      <w:r>
+        <w:rPr>
+          <w:rFonts w:ascii="Times New Roman" w:hAnsi="Times New Roman" w:cs="Times New Roman"/>
+          <w:noProof/>
+          <w:sz w:val="24"/>
+        </w:rPr>
+        <w:t xml:space="preserve">immediate inputs </w:t>
+      </w:r>
+      <w:r>
+        <w:rPr>
+          <w:rFonts w:ascii="Times New Roman" w:hAnsi="Times New Roman" w:cs="Times New Roman"/>
+          <w:noProof/>
+          <w:sz w:val="24"/>
+        </w:rPr>
+        <w:t>for processing</w:t>
+      </w:r>
+      <w:r>
+        <w:rPr>
+          <w:rFonts w:ascii="Times New Roman" w:hAnsi="Times New Roman" w:cs="Times New Roman"/>
+          <w:noProof/>
+          <w:sz w:val="24"/>
+        </w:rPr>
+        <w:t>. For</w:t>
+      </w:r>
+      <w:r>
+        <w:rPr>
+          <w:rFonts w:ascii="Times New Roman" w:hAnsi="Times New Roman" w:cs="Times New Roman"/>
+          <w:noProof/>
+          <w:sz w:val="24"/>
+        </w:rPr>
+        <w:t xml:space="preserve"> instance</w:t>
+      </w:r>
+      <w:r>
+        <w:rPr>
+          <w:rFonts w:ascii="Times New Roman" w:hAnsi="Times New Roman" w:cs="Times New Roman"/>
+          <w:noProof/>
+          <w:sz w:val="24"/>
+        </w:rPr>
+        <w:t xml:space="preserve">, </w:t>
+      </w:r>
+      <w:r>
+        <w:rPr>
+          <w:rFonts w:ascii="Times New Roman" w:hAnsi="Times New Roman" w:cs="Times New Roman"/>
+          <w:noProof/>
+          <w:sz w:val="24"/>
+        </w:rPr>
+        <w:t xml:space="preserve">insufficeintcy of sleep and </w:t>
+      </w:r>
+      <w:r>
+        <w:rPr>
+          <w:rFonts w:ascii="Times New Roman" w:hAnsi="Times New Roman" w:cs="Times New Roman"/>
+          <w:noProof/>
+          <w:sz w:val="24"/>
+        </w:rPr>
+        <w:t xml:space="preserve">body </w:t>
+      </w:r>
+      <w:r>
+        <w:rPr>
+          <w:rFonts w:ascii="Times New Roman" w:hAnsi="Times New Roman" w:cs="Times New Roman"/>
+          <w:noProof/>
+          <w:sz w:val="24"/>
+        </w:rPr>
+        <w:t>posture</w:t>
+      </w:r>
+      <w:r>
+        <w:rPr>
+          <w:rFonts w:ascii="Times New Roman" w:hAnsi="Times New Roman" w:cs="Times New Roman"/>
+          <w:noProof/>
+          <w:sz w:val="24"/>
+        </w:rPr>
+        <w:t>.</w:t>
+      </w:r>
+      <w:r>
+        <w:rPr>
+          <w:rFonts w:ascii="Times New Roman" w:hAnsi="Times New Roman" w:cs="Times New Roman"/>
+          <w:noProof/>
+          <w:sz w:val="24"/>
+        </w:rPr>
+        <w:t xml:space="preserve"> </w:t>
+      </w:r>
+      <w:r>
+        <w:rPr>
+          <w:rFonts w:ascii="Times New Roman" w:eastAsia="宋体" w:hAnsi="Times New Roman" w:cs="Times New Roman"/>
+          <w:noProof/>
+          <w:sz w:val="24"/>
+        </w:rPr>
+        <w:t>(</w:t>
+      </w:r>
+      <w:proofErr w:type="spellStart"/>
+      <w:r>
+        <w:rPr>
+          <w:rFonts w:ascii="Times New Roman" w:hAnsi="Times New Roman" w:cs="Times New Roman"/>
+          <w:sz w:val="24"/>
+        </w:rPr>
+        <w:t>Alhola</w:t>
+      </w:r>
+      <w:proofErr w:type="spellEnd"/>
+      <w:r>
+        <w:rPr>
+          <w:rFonts w:ascii="Times New Roman" w:hAnsi="Times New Roman" w:cs="Times New Roman"/>
+          <w:sz w:val="24"/>
+        </w:rPr>
+        <w:t xml:space="preserve"> &amp; Polo-</w:t>
+      </w:r>
+      <w:proofErr w:type="spellStart"/>
+      <w:r>
+        <w:rPr>
+          <w:rFonts w:ascii="Times New Roman" w:hAnsi="Times New Roman" w:cs="Times New Roman"/>
+          <w:sz w:val="24"/>
+        </w:rPr>
+        <w:t>Kantola</w:t>
+      </w:r>
+      <w:proofErr w:type="spellEnd"/>
+      <w:r>
+        <w:rPr>
+          <w:rFonts w:ascii="Times New Roman" w:hAnsi="Times New Roman" w:cs="Times New Roman"/>
+          <w:sz w:val="24"/>
+        </w:rPr>
+        <w:t>, 2007; Khan &amp; Al-</w:t>
+      </w:r>
+      <w:proofErr w:type="spellStart"/>
+      <w:r>
+        <w:rPr>
+          <w:rFonts w:ascii="Times New Roman" w:hAnsi="Times New Roman" w:cs="Times New Roman"/>
+          <w:sz w:val="24"/>
+        </w:rPr>
+        <w:t>Jahdali</w:t>
+      </w:r>
+      <w:proofErr w:type="spellEnd"/>
+      <w:r>
+        <w:rPr>
+          <w:rFonts w:ascii="Times New Roman" w:hAnsi="Times New Roman" w:cs="Times New Roman"/>
+          <w:sz w:val="24"/>
+        </w:rPr>
+        <w:t xml:space="preserve">, 2023; </w:t>
+      </w:r>
+      <w:proofErr w:type="spellStart"/>
+      <w:r>
+        <w:rPr>
+          <w:rFonts w:ascii="Times New Roman" w:hAnsi="Times New Roman" w:cs="Times New Roman"/>
+          <w:sz w:val="24"/>
+        </w:rPr>
+        <w:t>Wainio</w:t>
+      </w:r>
+      <w:proofErr w:type="spellEnd"/>
+      <w:r>
+        <w:rPr>
+          <w:rFonts w:ascii="Times New Roman" w:hAnsi="Times New Roman" w:cs="Times New Roman"/>
+          <w:sz w:val="24"/>
+        </w:rPr>
+        <w:t xml:space="preserve">-Theberge &amp; </w:t>
+      </w:r>
+      <w:proofErr w:type="spellStart"/>
+      <w:r>
+        <w:rPr>
+          <w:rFonts w:ascii="Times New Roman" w:hAnsi="Times New Roman" w:cs="Times New Roman"/>
+          <w:sz w:val="24"/>
+        </w:rPr>
+        <w:t>Armony</w:t>
+      </w:r>
+      <w:proofErr w:type="spellEnd"/>
+      <w:r>
+        <w:rPr>
+          <w:rFonts w:ascii="Times New Roman" w:hAnsi="Times New Roman" w:cs="Times New Roman"/>
+          <w:sz w:val="24"/>
+        </w:rPr>
+        <w:t>, 2025</w:t>
+      </w:r>
+      <w:r>
+        <w:rPr>
+          <w:rFonts w:ascii="Times New Roman" w:eastAsia="宋体" w:hAnsi="Times New Roman" w:cs="Times New Roman"/>
+          <w:noProof/>
+          <w:sz w:val="24"/>
         </w:rPr>
         <w:t>)</w:t>
       </w:r>
       <w:r>
         <w:rPr>
-          <w:rFonts w:ascii="Times New Roman" w:hAnsi="Times New Roman" w:cs="Times New Roman"/>
-          <w:noProof/>
-          <w:sz w:val="24"/>
-          <w:lang w:eastAsia="ja-JP"/>
+          <w:rFonts w:ascii="Times New Roman" w:eastAsia="宋体" w:hAnsi="Times New Roman" w:cs="Times New Roman"/>
+          <w:noProof/>
+          <w:sz w:val="24"/>
         </w:rPr>
         <w:t xml:space="preserve"> </w:t>
       </w:r>
       <w:r>
         <w:rPr>
           <w:rFonts w:ascii="Times New Roman" w:hAnsi="Times New Roman" w:cs="Times New Roman"/>
-          <w:noProof/>
-          <w:sz w:val="24"/>
-          <w:lang w:eastAsia="ja-JP"/>
-        </w:rPr>
-        <w:t xml:space="preserve">Specfically, </w:t>
+          <w:sz w:val="24"/>
+        </w:rPr>
+        <w:t xml:space="preserve">In contrast, an internal psychological condition refers to a state manifested within the </w:t>
+      </w:r>
+      <w:r>
+        <w:rPr>
+          <w:rFonts w:ascii="Times New Roman" w:hAnsi="Times New Roman" w:cs="Times New Roman"/>
+          <w:sz w:val="24"/>
+        </w:rPr>
+        <w:lastRenderedPageBreak/>
+        <w:t>individual at a psychological or physiological level.</w:t>
+      </w:r>
+      <w:r>
+        <w:rPr>
+          <w:rFonts w:ascii="Times New Roman" w:hAnsi="Times New Roman" w:cs="Times New Roman"/>
+          <w:sz w:val="24"/>
+        </w:rPr>
+        <w:t xml:space="preserve"> </w:t>
+      </w:r>
+      <w:r>
+        <w:rPr>
+          <w:rFonts w:ascii="Times New Roman" w:eastAsia="宋体" w:hAnsi="Times New Roman" w:cs="Times New Roman"/>
+          <w:noProof/>
+          <w:sz w:val="24"/>
+        </w:rPr>
+        <w:t xml:space="preserve">One apparent example is that </w:t>
+      </w:r>
+      <w:r>
+        <w:rPr>
+          <w:rFonts w:ascii="Times New Roman" w:hAnsi="Times New Roman" w:cs="Times New Roman"/>
+          <w:sz w:val="24"/>
+        </w:rPr>
+        <w:t>an individual's current emotional state may bias the perception of emotional facial expressions, such that the same facial stimulus may be interpreted differently depending on the perceiver's internal emotional state.</w:t>
       </w:r>
     </w:p>
     <w:p>
@@ -2735,13 +3467,93 @@
     </b:Author>
     <b:Volume>54</b:Volume>
     <b:Issue>5</b:Issue>
+    <b:RefOrder>6</b:RefOrder>
+  </b:Source>
+  <b:Source>
+    <b:Tag>Wai25</b:Tag>
+    <b:SourceType>ArticleInAPeriodical</b:SourceType>
+    <b:Guid>{F470DBC1-9F59-6844-B51B-D2E5694F6ACC}</b:Guid>
+    <b:Title>Neural correlates of power-related postures and their behavioural consequences: a preliminary electrophysiological investigation</b:Title>
+    <b:PeriodicalTitle>Social Cognitive and Affective Neuroscience</b:PeriodicalTitle>
+    <b:Year>2025</b:Year>
+    <b:Pages>nsaf036</b:Pages>
+    <b:Author>
+      <b:Author>
+        <b:NameList>
+          <b:Person>
+            <b:Last>Wainio-Theberge</b:Last>
+            <b:First>Soren</b:First>
+          </b:Person>
+          <b:Person>
+            <b:Last>Armony</b:Last>
+            <b:Middle>L</b:Middle>
+            <b:First>Jorge</b:First>
+          </b:Person>
+        </b:NameList>
+      </b:Author>
+    </b:Author>
+    <b:Volume>20</b:Volume>
+    <b:Issue>1</b:Issue>
+    <b:RefOrder>7</b:RefOrder>
+  </b:Source>
+  <b:Source>
+    <b:Tag>Kha23</b:Tag>
+    <b:SourceType>ArticleInAPeriodical</b:SourceType>
+    <b:Guid>{0BEE3F0E-E80D-634D-8AF9-FC1BE5DA5F3E}</b:Guid>
+    <b:Title>The consequences of sleep deprivation on cognitive performance</b:Title>
+    <b:PeriodicalTitle>Neurosciences (Riyadh)</b:PeriodicalTitle>
+    <b:Year>2023</b:Year>
+    <b:Pages>91-99</b:Pages>
+    <b:Author>
+      <b:Author>
+        <b:NameList>
+          <b:Person>
+            <b:Last>Khan</b:Last>
+            <b:Middle>A</b:Middle>
+            <b:First>Mohammad</b:First>
+          </b:Person>
+          <b:Person>
+            <b:Last>AI-Jahadali</b:Last>
+            <b:First>Hamdan</b:First>
+          </b:Person>
+        </b:NameList>
+      </b:Author>
+    </b:Author>
+    <b:Volume>28</b:Volume>
+    <b:Issue>2</b:Issue>
+    <b:RefOrder>8</b:RefOrder>
+  </b:Source>
+  <b:Source>
+    <b:Tag>Alh07</b:Tag>
+    <b:SourceType>ArticleInAPeriodical</b:SourceType>
+    <b:Guid>{7C608336-6C1D-5F48-9AA5-868640D8D2A8}</b:Guid>
+    <b:Title>Sleep deprivation: Impact on cognitive performance</b:Title>
+    <b:PeriodicalTitle>Neuropsychiatr Dis Treat</b:PeriodicalTitle>
+    <b:Year>2007</b:Year>
+    <b:Pages>553-567</b:Pages>
+    <b:Author>
+      <b:Author>
+        <b:NameList>
+          <b:Person>
+            <b:Last>Alhola</b:Last>
+            <b:First>Paula</b:First>
+          </b:Person>
+          <b:Person>
+            <b:Last>Polo-Kantola</b:Last>
+            <b:First>Päivi </b:First>
+          </b:Person>
+        </b:NameList>
+      </b:Author>
+    </b:Author>
+    <b:Volume>3</b:Volume>
+    <b:Issue>5</b:Issue>
     <b:RefOrder>1</b:RefOrder>
   </b:Source>
 </b:Sources>
 </file>
 
 <file path=customXml/itemProps1.xml><?xml version="1.0" encoding="utf-8"?>
-<ds:datastoreItem xmlns:ds="http://schemas.openxmlformats.org/officeDocument/2006/customXml" ds:itemID="{03978D43-C9CD-3A41-BF98-9B478D140524}">
+<ds:datastoreItem xmlns:ds="http://schemas.openxmlformats.org/officeDocument/2006/customXml" ds:itemID="{10A6AAAB-7868-A94A-A27B-8AED0916664B}">
   <ds:schemaRefs>
     <ds:schemaRef ds:uri="http://schemas.openxmlformats.org/officeDocument/2006/bibliography"/>
   </ds:schemaRefs>

</xml_diff>

<commit_message>
updating introduction of analysis report specficially
</commit_message>
<xml_diff>
--- a/Project1_Sleep_Deprivation_Cognition/Report/Analysis_Report.docx
+++ b/Project1_Sleep_Deprivation_Cognition/Report/Analysis_Report.docx
@@ -1235,6 +1235,7 @@
         <w:jc w:val="both"/>
         <w:rPr>
           <w:rFonts w:ascii="Times New Roman" w:hAnsi="Times New Roman" w:cs="Times New Roman"/>
+          <w:noProof/>
           <w:sz w:val="24"/>
         </w:rPr>
       </w:pPr>
@@ -1351,7 +1352,7 @@
           <w:rFonts w:ascii="Times New Roman" w:hAnsi="Times New Roman" w:cs="Times New Roman"/>
           <w:sz w:val="24"/>
         </w:rPr>
-        <w:t>, 2025). In contrast, an internal psychological condition refers to a state manifested within the individual at a psychological or physiological level, such as emotional state, fatigue, or motivation.</w:t>
+        <w:t>, 2025). In contrast, an internal psychological condition refers to a state manifested within the individual at a psychological or physiological level, such as emotional state, fatigue, or motivation</w:t>
       </w:r>
       <w:r>
         <w:rPr>
@@ -1391,6 +1392,14 @@
           <w:sz w:val="24"/>
         </w:rPr>
         <w:t>, 2022)</w:t>
+      </w:r>
+      <w:r>
+        <w:rPr>
+          <w:rFonts w:ascii="Times New Roman" w:eastAsia="宋体" w:hAnsi="Times New Roman" w:cs="Times New Roman" w:hint="eastAsia"/>
+          <w:noProof/>
+          <w:sz w:val="24"/>
+        </w:rPr>
+        <w:t>.</w:t>
       </w:r>
       <w:r>
         <w:rPr>
@@ -1463,7 +1472,23 @@
           <w:rFonts w:ascii="Times New Roman" w:hAnsi="Times New Roman" w:cs="Times New Roman"/>
           <w:sz w:val="24"/>
         </w:rPr>
-        <w:t>there is now substantial evidence suggests that the effects</w:t>
+        <w:t xml:space="preserve">there is now substantial evidence </w:t>
+      </w:r>
+      <w:proofErr w:type="spellStart"/>
+      <w:r>
+        <w:rPr>
+          <w:rFonts w:ascii="Times New Roman" w:hAnsi="Times New Roman" w:cs="Times New Roman" w:hint="eastAsia"/>
+          <w:sz w:val="24"/>
+        </w:rPr>
+        <w:t>suggeting</w:t>
+      </w:r>
+      <w:proofErr w:type="spellEnd"/>
+      <w:r>
+        <w:rPr>
+          <w:rFonts w:ascii="Times New Roman" w:hAnsi="Times New Roman" w:cs="Times New Roman"/>
+          <w:sz w:val="24"/>
+        </w:rPr>
+        <w:t xml:space="preserve"> that the effects</w:t>
       </w:r>
       <w:r>
         <w:rPr>
@@ -1722,14 +1747,14 @@
           <w:rFonts w:ascii="Times New Roman" w:hAnsi="Times New Roman" w:cs="Times New Roman"/>
           <w:sz w:val="24"/>
         </w:rPr>
-        <w:t>probably</w:t>
-      </w:r>
-      <w:r>
-        <w:rPr>
-          <w:rFonts w:ascii="Times New Roman" w:hAnsi="Times New Roman" w:cs="Times New Roman"/>
-          <w:sz w:val="24"/>
-        </w:rPr>
-        <w:t xml:space="preserve"> persist</w:t>
+        <w:t xml:space="preserve">suggested to impair attention, may </w:t>
+      </w:r>
+      <w:r>
+        <w:rPr>
+          <w:rFonts w:ascii="Times New Roman" w:hAnsi="Times New Roman" w:cs="Times New Roman"/>
+          <w:sz w:val="24"/>
+        </w:rPr>
+        <w:t>persist</w:t>
       </w:r>
       <w:r>
         <w:rPr>
@@ -1807,6 +1832,243 @@
           <w:sz w:val="24"/>
         </w:rPr>
         <w:t>.</w:t>
+      </w:r>
+    </w:p>
+    <w:p>
+      <w:pPr>
+        <w:spacing w:after="0" w:line="240" w:lineRule="atLeast"/>
+        <w:ind w:firstLineChars="100" w:firstLine="240"/>
+        <w:jc w:val="both"/>
+        <w:rPr>
+          <w:rFonts w:ascii="Times New Roman" w:hAnsi="Times New Roman" w:cs="Times New Roman"/>
+          <w:sz w:val="24"/>
+        </w:rPr>
+      </w:pPr>
+      <w:r>
+        <w:rPr>
+          <w:rFonts w:ascii="Times New Roman" w:hAnsi="Times New Roman" w:cs="Times New Roman"/>
+          <w:sz w:val="24"/>
+        </w:rPr>
+        <w:t>The publicly available Kaggle dataset</w:t>
+      </w:r>
+      <w:r>
+        <w:rPr>
+          <w:rFonts w:ascii="Times New Roman" w:hAnsi="Times New Roman" w:cs="Times New Roman"/>
+          <w:sz w:val="24"/>
+        </w:rPr>
+        <w:t xml:space="preserve"> used in the data analysis project</w:t>
+      </w:r>
+      <w:r>
+        <w:rPr>
+          <w:rFonts w:ascii="Times New Roman" w:hAnsi="Times New Roman" w:cs="Times New Roman"/>
+          <w:sz w:val="24"/>
+        </w:rPr>
+        <w:t xml:space="preserve"> </w:t>
+      </w:r>
+      <w:r>
+        <w:rPr>
+          <w:rFonts w:ascii="Times New Roman" w:hAnsi="Times New Roman" w:cs="Times New Roman"/>
+          <w:sz w:val="24"/>
+        </w:rPr>
+        <w:t>provides a broad range of behavioral, psychological, and cognitive performance measures</w:t>
+      </w:r>
+      <w:r>
+        <w:rPr>
+          <w:rFonts w:ascii="Times New Roman" w:hAnsi="Times New Roman" w:cs="Times New Roman"/>
+          <w:sz w:val="24"/>
+        </w:rPr>
+        <w:t xml:space="preserve"> </w:t>
+      </w:r>
+      <w:sdt>
+        <w:sdtPr>
+          <w:rPr>
+            <w:rFonts w:ascii="Times New Roman" w:hAnsi="Times New Roman" w:cs="Times New Roman"/>
+            <w:sz w:val="24"/>
+          </w:rPr>
+          <w:id w:val="71937401"/>
+          <w:citation/>
+        </w:sdtPr>
+        <w:sdtContent>
+          <w:r>
+            <w:rPr>
+              <w:rFonts w:ascii="Times New Roman" w:hAnsi="Times New Roman" w:cs="Times New Roman"/>
+              <w:sz w:val="24"/>
+            </w:rPr>
+            <w:fldChar w:fldCharType="begin"/>
+          </w:r>
+          <w:r>
+            <w:rPr>
+              <w:rFonts w:ascii="Times New Roman" w:eastAsia="宋体" w:hAnsi="Times New Roman" w:cs="Times New Roman"/>
+              <w:sz w:val="24"/>
+            </w:rPr>
+            <w:instrText xml:space="preserve"> CITATION sac24 \l 2052 </w:instrText>
+          </w:r>
+          <w:r>
+            <w:rPr>
+              <w:rFonts w:ascii="Times New Roman" w:hAnsi="Times New Roman" w:cs="Times New Roman"/>
+              <w:sz w:val="24"/>
+            </w:rPr>
+            <w:fldChar w:fldCharType="separate"/>
+          </w:r>
+          <w:r>
+            <w:rPr>
+              <w:rFonts w:ascii="Times New Roman" w:eastAsia="宋体" w:hAnsi="Times New Roman" w:cs="Times New Roman"/>
+              <w:noProof/>
+              <w:sz w:val="24"/>
+            </w:rPr>
+            <w:t>(sacramento technology, 2024)</w:t>
+          </w:r>
+          <w:r>
+            <w:rPr>
+              <w:rFonts w:ascii="Times New Roman" w:hAnsi="Times New Roman" w:cs="Times New Roman"/>
+              <w:sz w:val="24"/>
+            </w:rPr>
+            <w:fldChar w:fldCharType="end"/>
+          </w:r>
+        </w:sdtContent>
+      </w:sdt>
+      <w:r>
+        <w:rPr>
+          <w:rFonts w:ascii="Times New Roman" w:hAnsi="Times New Roman" w:cs="Times New Roman"/>
+          <w:sz w:val="24"/>
+        </w:rPr>
+        <w:t xml:space="preserve">. It provides one opportunity for the project to achieve two broad </w:t>
+      </w:r>
+      <w:r>
+        <w:rPr>
+          <w:rFonts w:ascii="Times New Roman" w:hAnsi="Times New Roman" w:cs="Times New Roman"/>
+          <w:sz w:val="24"/>
+        </w:rPr>
+        <w:t>purposes:</w:t>
+      </w:r>
+      <w:r>
+        <w:rPr>
+          <w:rFonts w:ascii="Times New Roman" w:hAnsi="Times New Roman" w:cs="Times New Roman"/>
+          <w:sz w:val="24"/>
+        </w:rPr>
+        <w:t xml:space="preserve"> (1) the examination of the broader correlational structure among these variables to understand their </w:t>
+      </w:r>
+      <w:r>
+        <w:rPr>
+          <w:rFonts w:ascii="Times New Roman" w:hAnsi="Times New Roman" w:cs="Times New Roman"/>
+          <w:sz w:val="24"/>
+        </w:rPr>
+        <w:t>standardized associations</w:t>
+      </w:r>
+      <w:r>
+        <w:rPr>
+          <w:rFonts w:ascii="Times New Roman" w:hAnsi="Times New Roman" w:cs="Times New Roman"/>
+          <w:sz w:val="24"/>
+        </w:rPr>
+        <w:t xml:space="preserve"> on cognitive performances differently </w:t>
+      </w:r>
+      <w:r>
+        <w:rPr>
+          <w:rFonts w:ascii="Times New Roman" w:hAnsi="Times New Roman" w:cs="Times New Roman"/>
+          <w:sz w:val="24"/>
+        </w:rPr>
+        <w:t xml:space="preserve">within </w:t>
+      </w:r>
+      <w:r>
+        <w:rPr>
+          <w:rFonts w:ascii="Times New Roman" w:hAnsi="Times New Roman" w:cs="Times New Roman"/>
+          <w:sz w:val="24"/>
+        </w:rPr>
+        <w:t>while also (2) selecting theoretically relevant conditions for more focused model-</w:t>
+      </w:r>
+      <w:r>
+        <w:rPr>
+          <w:rFonts w:ascii="Times New Roman" w:hAnsi="Times New Roman" w:cs="Times New Roman"/>
+          <w:sz w:val="24"/>
+        </w:rPr>
+        <w:t>driven</w:t>
+      </w:r>
+      <w:r>
+        <w:rPr>
+          <w:rFonts w:ascii="Times New Roman" w:hAnsi="Times New Roman" w:cs="Times New Roman"/>
+          <w:sz w:val="24"/>
+        </w:rPr>
+        <w:t xml:space="preserve"> analysis</w:t>
+      </w:r>
+      <w:r>
+        <w:rPr>
+          <w:rFonts w:ascii="Times New Roman" w:hAnsi="Times New Roman" w:cs="Times New Roman"/>
+          <w:sz w:val="24"/>
+        </w:rPr>
+        <w:t xml:space="preserve">. Accordingly, for the </w:t>
+      </w:r>
+      <w:r>
+        <w:rPr>
+          <w:rFonts w:ascii="Times New Roman" w:hAnsi="Times New Roman" w:cs="Times New Roman"/>
+          <w:sz w:val="24"/>
+        </w:rPr>
+        <w:t>first purpose</w:t>
+      </w:r>
+      <w:r>
+        <w:rPr>
+          <w:rFonts w:ascii="Times New Roman" w:hAnsi="Times New Roman" w:cs="Times New Roman"/>
+          <w:sz w:val="24"/>
+        </w:rPr>
+        <w:t xml:space="preserve">, </w:t>
+      </w:r>
+      <w:r>
+        <w:rPr>
+          <w:rFonts w:ascii="Times New Roman" w:hAnsi="Times New Roman" w:cs="Times New Roman"/>
+          <w:sz w:val="24"/>
+        </w:rPr>
+        <w:t xml:space="preserve">an exploratory correlation matrix heatmap is firstly established providing an overall presentation of all zero-order associations among </w:t>
+      </w:r>
+      <w:r>
+        <w:rPr>
+          <w:rFonts w:ascii="Times New Roman" w:hAnsi="Times New Roman" w:cs="Times New Roman"/>
+          <w:sz w:val="24"/>
+        </w:rPr>
+        <w:t>variables</w:t>
+      </w:r>
+      <w:r>
+        <w:rPr>
+          <w:rFonts w:ascii="Times New Roman" w:hAnsi="Times New Roman" w:cs="Times New Roman"/>
+          <w:sz w:val="24"/>
+        </w:rPr>
+        <w:t>.</w:t>
+      </w:r>
+    </w:p>
+    <w:p>
+      <w:pPr>
+        <w:spacing w:after="0" w:line="240" w:lineRule="atLeast"/>
+        <w:ind w:firstLineChars="100" w:firstLine="240"/>
+        <w:jc w:val="both"/>
+        <w:rPr>
+          <w:rFonts w:ascii="Times New Roman" w:hAnsi="Times New Roman" w:cs="Times New Roman"/>
+          <w:sz w:val="24"/>
+          <w:lang w:val="fr-CA"/>
+        </w:rPr>
+      </w:pPr>
+      <w:r>
+        <w:rPr>
+          <w:rFonts w:ascii="Times New Roman" w:hAnsi="Times New Roman" w:cs="Times New Roman"/>
+          <w:sz w:val="24"/>
+          <w:lang w:val="fr-CA"/>
+        </w:rPr>
+        <w:t xml:space="preserve">For the second </w:t>
+      </w:r>
+      <w:proofErr w:type="spellStart"/>
+      <w:r>
+        <w:rPr>
+          <w:rFonts w:ascii="Times New Roman" w:hAnsi="Times New Roman" w:cs="Times New Roman"/>
+          <w:sz w:val="24"/>
+          <w:lang w:val="fr-CA"/>
+        </w:rPr>
+        <w:t>purpose</w:t>
+      </w:r>
+      <w:proofErr w:type="spellEnd"/>
+      <w:r>
+        <w:rPr>
+          <w:rFonts w:ascii="Times New Roman" w:hAnsi="Times New Roman" w:cs="Times New Roman"/>
+          <w:sz w:val="24"/>
+          <w:lang w:val="fr-CA"/>
+        </w:rPr>
+        <w:t xml:space="preserve">. </w:t>
       </w:r>
     </w:p>
     <w:p>
@@ -1814,7 +2076,7 @@
         <w:spacing w:after="0" w:line="240" w:lineRule="atLeast"/>
         <w:jc w:val="both"/>
         <w:rPr>
-          <w:rFonts w:ascii="Times New Roman" w:hAnsi="Times New Roman" w:cs="Times New Roman" w:hint="eastAsia"/>
+          <w:rFonts w:ascii="Times New Roman" w:hAnsi="Times New Roman" w:cs="Times New Roman"/>
           <w:sz w:val="24"/>
         </w:rPr>
       </w:pPr>
@@ -3102,7 +3364,7 @@
     <b:Pages>14-20</b:Pages>
     <b:Volume>135</b:Volume>
     <b:Year>2015</b:Year>
-    <b:RefOrder>2</b:RefOrder>
+    <b:RefOrder>3</b:RefOrder>
   </b:Source>
   <b:Source>
     <b:Tag>Sch04</b:Tag>
@@ -3124,7 +3386,7 @@
       </b:Author>
     </b:Author>
     <b:Volume>55</b:Volume>
-    <b:RefOrder>3</b:RefOrder>
+    <b:RefOrder>4</b:RefOrder>
   </b:Source>
   <b:Source>
     <b:Tag>For11</b:Tag>
@@ -3164,7 +3426,7 @@
     <b:Pages>272-279</b:Pages>
     <b:Volume>15</b:Volume>
     <b:Issue>6</b:Issue>
-    <b:RefOrder>4</b:RefOrder>
+    <b:RefOrder>5</b:RefOrder>
   </b:Source>
   <b:Source>
     <b:Tag>Fla22</b:Tag>
@@ -3199,7 +3461,7 @@
         </b:NameList>
       </b:Author>
     </b:Author>
-    <b:RefOrder>5</b:RefOrder>
+    <b:RefOrder>6</b:RefOrder>
   </b:Source>
   <b:Source>
     <b:Tag>Gil07</b:Tag>
@@ -3226,7 +3488,7 @@
     </b:Author>
     <b:Volume>54</b:Volume>
     <b:Issue>5</b:Issue>
-    <b:RefOrder>6</b:RefOrder>
+    <b:RefOrder>7</b:RefOrder>
   </b:Source>
   <b:Source>
     <b:Tag>Wai25</b:Tag>
@@ -3253,7 +3515,7 @@
     </b:Author>
     <b:Volume>20</b:Volume>
     <b:Issue>1</b:Issue>
-    <b:RefOrder>7</b:RefOrder>
+    <b:RefOrder>8</b:RefOrder>
   </b:Source>
   <b:Source>
     <b:Tag>Kha23</b:Tag>
@@ -3280,7 +3542,7 @@
     </b:Author>
     <b:Volume>28</b:Volume>
     <b:Issue>2</b:Issue>
-    <b:RefOrder>8</b:RefOrder>
+    <b:RefOrder>9</b:RefOrder>
   </b:Source>
   <b:Source>
     <b:Tag>Alh07</b:Tag>
@@ -3306,7 +3568,7 @@
     </b:Author>
     <b:Volume>3</b:Volume>
     <b:Issue>5</b:Issue>
-    <b:RefOrder>9</b:RefOrder>
+    <b:RefOrder>10</b:RefOrder>
   </b:Source>
   <b:Source>
     <b:Tag>Tri21</b:Tag>
@@ -3336,7 +3598,7 @@
     </b:Author>
     <b:Volume>85</b:Volume>
     <b:Issue>3</b:Issue>
-    <b:RefOrder>10</b:RefOrder>
+    <b:RefOrder>11</b:RefOrder>
   </b:Source>
   <b:Source>
     <b:Tag>Har16</b:Tag>
@@ -3368,7 +3630,7 @@
         </b:NameList>
       </b:Author>
     </b:Author>
-    <b:RefOrder>11</b:RefOrder>
+    <b:RefOrder>12</b:RefOrder>
   </b:Source>
   <b:Source>
     <b:Tag>Roc15</b:Tag>
@@ -3406,7 +3668,7 @@
     </b:Author>
     <b:Volume>43</b:Volume>
     <b:Issue>5</b:Issue>
-    <b:RefOrder>12</b:RefOrder>
+    <b:RefOrder>13</b:RefOrder>
   </b:Source>
   <b:Source>
     <b:Tag>Pac10</b:Tag>
@@ -3439,11 +3701,25 @@
     <b:Issue>2</b:Issue>
     <b:RefOrder>1</b:RefOrder>
   </b:Source>
+  <b:Source>
+    <b:Tag>sac24</b:Tag>
+    <b:SourceType>InternetSite</b:SourceType>
+    <b:Guid>{5E65D40E-C455-4042-A0C7-FA54D9E833D1}</b:Guid>
+    <b:Year>2024</b:Year>
+    <b:Author>
+      <b:Author>
+        <b:Corporate>sacramento technology</b:Corporate>
+      </b:Author>
+    </b:Author>
+    <b:InternetSiteTitle>Kaggle</b:InternetSiteTitle>
+    <b:URL>https://www.kaggle.com/datasets/sacramentotechnology/sleep-deprivation-and-cognitive-performance</b:URL>
+    <b:RefOrder>2</b:RefOrder>
+  </b:Source>
 </b:Sources>
 </file>
 
 <file path=customXml/itemProps1.xml><?xml version="1.0" encoding="utf-8"?>
-<ds:datastoreItem xmlns:ds="http://schemas.openxmlformats.org/officeDocument/2006/customXml" ds:itemID="{B85665CA-0FE7-854E-945B-F18D7A5E0C7B}">
+<ds:datastoreItem xmlns:ds="http://schemas.openxmlformats.org/officeDocument/2006/customXml" ds:itemID="{7F572EC6-1590-0347-974A-8ED6F807B10B}">
   <ds:schemaRefs>
     <ds:schemaRef ds:uri="http://schemas.openxmlformats.org/officeDocument/2006/bibliography"/>
   </ds:schemaRefs>

</xml_diff>

<commit_message>
Finish introduction part of report
</commit_message>
<xml_diff>
--- a/Project1_Sleep_Deprivation_Cognition/Report/Analysis_Report.docx
+++ b/Project1_Sleep_Deprivation_Cognition/Report/Analysis_Report.docx
@@ -2002,9 +2002,17 @@
       <w:r>
         <w:rPr>
           <w:rFonts w:ascii="Times New Roman" w:hAnsi="Times New Roman" w:cs="Times New Roman"/>
-          <w:sz w:val="24"/>
-        </w:rPr>
-        <w:t xml:space="preserve"> firstly established providing an overall presentation of all zero-order associations among </w:t>
+          <w:noProof/>
+          <w:sz w:val="24"/>
+        </w:rPr>
+        <w:t xml:space="preserve"> </w:t>
+      </w:r>
+      <w:r>
+        <w:rPr>
+          <w:rFonts w:ascii="Times New Roman" w:hAnsi="Times New Roman" w:cs="Times New Roman"/>
+          <w:sz w:val="24"/>
+        </w:rPr>
+        <w:t xml:space="preserve">first established providing an overall presentation of all zero-order associations among </w:t>
       </w:r>
       <w:r>
         <w:rPr>
@@ -2027,132 +2035,593 @@
         <w:ind w:firstLineChars="100" w:firstLine="240"/>
         <w:jc w:val="both"/>
         <w:rPr>
+          <w:rFonts w:ascii="Times New Roman" w:hAnsi="Times New Roman" w:cs="Times New Roman"/>
+          <w:sz w:val="24"/>
+        </w:rPr>
+      </w:pPr>
+      <w:r>
+        <w:rPr>
+          <w:rFonts w:ascii="Times New Roman" w:hAnsi="Times New Roman" w:cs="Times New Roman"/>
+          <w:sz w:val="24"/>
+        </w:rPr>
+        <w:t xml:space="preserve">For the second broad purpose, the present project focused on two representative conditions derived from the conceptual framework introduced above. Sleep hours and stress level were treated as conditions primarily originating from behavioral and psychological domains, respectively. </w:t>
+      </w:r>
+      <w:r>
+        <w:rPr>
           <w:rFonts w:ascii="Times New Roman" w:hAnsi="Times New Roman" w:cs="Times New Roman" w:hint="eastAsia"/>
           <w:sz w:val="24"/>
         </w:rPr>
-      </w:pPr>
-      <w:r>
-        <w:rPr>
-          <w:rFonts w:ascii="Times New Roman" w:hAnsi="Times New Roman" w:cs="Times New Roman"/>
-          <w:sz w:val="24"/>
-        </w:rPr>
-        <w:t xml:space="preserve">For the second </w:t>
-      </w:r>
-      <w:r>
-        <w:rPr>
-          <w:rFonts w:ascii="Times New Roman" w:hAnsi="Times New Roman" w:cs="Times New Roman"/>
-          <w:sz w:val="24"/>
-        </w:rPr>
-        <w:t>purpose</w:t>
-      </w:r>
-      <w:r>
-        <w:rPr>
-          <w:rFonts w:ascii="Times New Roman" w:hAnsi="Times New Roman" w:cs="Times New Roman"/>
-          <w:sz w:val="24"/>
-        </w:rPr>
-        <w:t>,</w:t>
-      </w:r>
-      <w:r>
-        <w:rPr>
-          <w:rFonts w:ascii="Times New Roman" w:hAnsi="Times New Roman" w:cs="Times New Roman"/>
-          <w:sz w:val="24"/>
-        </w:rPr>
-        <w:t xml:space="preserve"> the present project focused on two representative conditions derived from the conceptual framework introduced above. Sleep hours and stress level was separately treated as conditions respectively originated from behavioral and psychology. A plenty of research has suggested their effects on different cognitive task performances.</w:t>
-      </w:r>
-      <w:r>
-        <w:rPr>
-          <w:rFonts w:ascii="Times New Roman" w:hAnsi="Times New Roman" w:cs="Times New Roman"/>
-          <w:sz w:val="24"/>
-        </w:rPr>
-        <w:t xml:space="preserve"> There are two specific aims in the, the theory-based analysis. The first one </w:t>
-      </w:r>
-      <w:r>
-        <w:rPr>
-          <w:rFonts w:ascii="Times New Roman" w:hAnsi="Times New Roman" w:cs="Times New Roman"/>
-          <w:sz w:val="24"/>
-        </w:rPr>
-        <w:t>is to attempt to</w:t>
-      </w:r>
-      <w:r>
-        <w:rPr>
-          <w:rFonts w:ascii="Times New Roman" w:hAnsi="Times New Roman" w:cs="Times New Roman"/>
-          <w:sz w:val="24"/>
-        </w:rPr>
-        <w:t xml:space="preserve"> estimate </w:t>
-      </w:r>
-      <w:r>
-        <w:rPr>
-          <w:rFonts w:ascii="Times New Roman" w:hAnsi="Times New Roman" w:cs="Times New Roman"/>
-          <w:sz w:val="24"/>
-        </w:rPr>
-        <w:t xml:space="preserve">the effects of the states on </w:t>
-      </w:r>
-      <w:r>
-        <w:rPr>
-          <w:rFonts w:ascii="Times New Roman" w:hAnsi="Times New Roman" w:cs="Times New Roman"/>
-          <w:sz w:val="24"/>
-        </w:rPr>
-        <w:t xml:space="preserve">high-order cognitive functioning. Specifically, the project firstly aimed </w:t>
-      </w:r>
-      <w:r>
-        <w:rPr>
-          <w:rFonts w:ascii="Times New Roman" w:hAnsi="Times New Roman" w:cs="Times New Roman"/>
-          <w:sz w:val="24"/>
-        </w:rPr>
-        <w:t>to examine the</w:t>
-      </w:r>
-      <w:r>
-        <w:rPr>
-          <w:rFonts w:ascii="Times New Roman" w:hAnsi="Times New Roman" w:cs="Times New Roman"/>
-          <w:sz w:val="24"/>
-        </w:rPr>
-        <w:t xml:space="preserve"> independent</w:t>
-      </w:r>
-      <w:r>
-        <w:rPr>
-          <w:rFonts w:ascii="Times New Roman" w:hAnsi="Times New Roman" w:cs="Times New Roman"/>
-          <w:sz w:val="24"/>
-        </w:rPr>
-        <w:t xml:space="preserve"> effects </w:t>
-      </w:r>
-      <w:r>
-        <w:rPr>
-          <w:rFonts w:ascii="Times New Roman" w:hAnsi="Times New Roman" w:cs="Times New Roman"/>
-          <w:sz w:val="24"/>
-        </w:rPr>
-        <w:t xml:space="preserve">and the joint explanatory power </w:t>
-      </w:r>
-      <w:r>
-        <w:rPr>
-          <w:rFonts w:ascii="Times New Roman" w:hAnsi="Times New Roman" w:cs="Times New Roman"/>
-          <w:sz w:val="24"/>
-        </w:rPr>
-        <w:t>of the two conditions</w:t>
-      </w:r>
-      <w:r>
-        <w:rPr>
-          <w:rFonts w:ascii="Times New Roman" w:hAnsi="Times New Roman" w:cs="Times New Roman"/>
-          <w:sz w:val="24"/>
-        </w:rPr>
-        <w:t xml:space="preserve"> on a high-order cognitive regulatory functioning</w:t>
-      </w:r>
-      <w:r>
-        <w:rPr>
-          <w:rFonts w:ascii="Times New Roman" w:hAnsi="Times New Roman" w:cs="Times New Roman"/>
-          <w:sz w:val="24"/>
-        </w:rPr>
-        <w:t xml:space="preserve">. Emotion regulation is </w:t>
+        <w:t>A la</w:t>
+      </w:r>
+      <w:r>
+        <w:rPr>
+          <w:rFonts w:ascii="Times New Roman" w:hAnsi="Times New Roman" w:cs="Times New Roman"/>
+          <w:sz w:val="24"/>
+        </w:rPr>
+        <w:t>rge body of</w:t>
+      </w:r>
+      <w:r>
+        <w:rPr>
+          <w:rFonts w:ascii="Times New Roman" w:hAnsi="Times New Roman" w:cs="Times New Roman" w:hint="eastAsia"/>
+          <w:sz w:val="24"/>
+        </w:rPr>
+        <w:t xml:space="preserve"> </w:t>
+      </w:r>
+      <w:r>
+        <w:rPr>
+          <w:rFonts w:ascii="Times New Roman" w:hAnsi="Times New Roman" w:cs="Times New Roman"/>
+          <w:sz w:val="24"/>
+        </w:rPr>
+        <w:t>studies have suggested that both factors are associated with performance across different cognitive tasks</w:t>
+      </w:r>
+      <w:r>
+        <w:rPr>
+          <w:rFonts w:ascii="Times New Roman" w:hAnsi="Times New Roman" w:cs="Times New Roman"/>
+          <w:sz w:val="24"/>
+        </w:rPr>
+        <w:t xml:space="preserve"> </w:t>
+      </w:r>
+      <w:r>
+        <w:rPr>
+          <w:rFonts w:ascii="Times New Roman" w:hAnsi="Times New Roman" w:cs="Times New Roman"/>
+          <w:noProof/>
+          <w:sz w:val="24"/>
+        </w:rPr>
+        <w:t>(Alhola &amp; Polo-Kantola, 2007</w:t>
+      </w:r>
+      <w:r>
+        <w:rPr>
+          <w:rFonts w:ascii="Times New Roman" w:hAnsi="Times New Roman" w:cs="Times New Roman"/>
+          <w:noProof/>
+          <w:sz w:val="24"/>
+        </w:rPr>
+        <w:t xml:space="preserve">; </w:t>
+      </w:r>
+      <w:r>
+        <w:rPr>
+          <w:rFonts w:ascii="Times New Roman" w:hAnsi="Times New Roman" w:cs="Times New Roman"/>
+          <w:noProof/>
+          <w:sz w:val="24"/>
+        </w:rPr>
+        <w:t>Khan &amp; AI-Jahadali, 2023</w:t>
+      </w:r>
+      <w:r>
+        <w:rPr>
+          <w:rFonts w:ascii="Times New Roman" w:hAnsi="Times New Roman" w:cs="Times New Roman"/>
+          <w:noProof/>
+          <w:sz w:val="24"/>
+        </w:rPr>
+        <w:t xml:space="preserve">; </w:t>
+      </w:r>
+      <w:r>
+        <w:rPr>
+          <w:rFonts w:ascii="Times New Roman" w:hAnsi="Times New Roman" w:cs="Times New Roman"/>
+          <w:noProof/>
+          <w:sz w:val="24"/>
+        </w:rPr>
+        <w:t>Nwikwe, 2025</w:t>
+      </w:r>
+      <w:r>
+        <w:rPr>
+          <w:rFonts w:ascii="Times New Roman" w:hAnsi="Times New Roman" w:cs="Times New Roman"/>
+          <w:noProof/>
+          <w:sz w:val="24"/>
+        </w:rPr>
+        <w:t>)</w:t>
+      </w:r>
+      <w:r>
+        <w:rPr>
+          <w:rFonts w:ascii="Times New Roman" w:hAnsi="Times New Roman" w:cs="Times New Roman"/>
+          <w:noProof/>
+          <w:sz w:val="24"/>
+        </w:rPr>
+        <w:t xml:space="preserve">. </w:t>
+      </w:r>
+      <w:r>
+        <w:rPr>
+          <w:rFonts w:ascii="Times New Roman" w:hAnsi="Times New Roman" w:cs="Times New Roman"/>
+          <w:sz w:val="24"/>
+        </w:rPr>
+        <w:t xml:space="preserve">Accordingly, the theory-driven analysis incorporated two specific aims. The first aim was to estimate the </w:t>
+      </w:r>
+      <w:r>
+        <w:rPr>
+          <w:rFonts w:ascii="Times New Roman" w:hAnsi="Times New Roman" w:cs="Times New Roman"/>
+          <w:sz w:val="24"/>
+        </w:rPr>
+        <w:t xml:space="preserve">effects </w:t>
+      </w:r>
+      <w:r>
+        <w:rPr>
+          <w:rFonts w:ascii="Times New Roman" w:hAnsi="Times New Roman" w:cs="Times New Roman"/>
+          <w:sz w:val="24"/>
+        </w:rPr>
+        <w:t xml:space="preserve">of these conditions </w:t>
+      </w:r>
+      <w:r>
+        <w:rPr>
+          <w:rFonts w:ascii="Times New Roman" w:hAnsi="Times New Roman" w:cs="Times New Roman"/>
+          <w:sz w:val="24"/>
+        </w:rPr>
+        <w:t>on</w:t>
+      </w:r>
+      <w:r>
+        <w:rPr>
+          <w:rFonts w:ascii="Times New Roman" w:hAnsi="Times New Roman" w:cs="Times New Roman"/>
+          <w:sz w:val="24"/>
+        </w:rPr>
+        <w:t xml:space="preserve"> higher-order cognitive functioning. Specifically, the project examined the independent contributions and combined explanatory power of sleep hours and stress level in relation to a higher-order regulatory function. Emotion regulation was selected as the representative higher-order regulatory outcome </w:t>
+      </w:r>
+      <w:r>
+        <w:rPr>
+          <w:rFonts w:ascii="Times New Roman" w:hAnsi="Times New Roman" w:cs="Times New Roman"/>
+          <w:sz w:val="24"/>
+        </w:rPr>
+        <w:t>since</w:t>
+      </w:r>
+      <w:r>
+        <w:rPr>
+          <w:rFonts w:ascii="Times New Roman" w:hAnsi="Times New Roman" w:cs="Times New Roman"/>
+          <w:sz w:val="24"/>
+        </w:rPr>
+        <w:t xml:space="preserve"> it</w:t>
+      </w:r>
+      <w:r>
+        <w:rPr>
+          <w:rFonts w:ascii="Times New Roman" w:hAnsi="Times New Roman" w:cs="Times New Roman"/>
+          <w:sz w:val="24"/>
+        </w:rPr>
+        <w:t xml:space="preserve">s </w:t>
+      </w:r>
+      <w:r>
+        <w:rPr>
+          <w:rFonts w:ascii="Times New Roman" w:hAnsi="Times New Roman" w:cs="Times New Roman"/>
+          <w:sz w:val="24"/>
+        </w:rPr>
+        <w:t>success</w:t>
+      </w:r>
+      <w:r>
+        <w:rPr>
+          <w:rFonts w:ascii="Times New Roman" w:hAnsi="Times New Roman" w:cs="Times New Roman"/>
+          <w:sz w:val="24"/>
+        </w:rPr>
+        <w:t xml:space="preserve"> </w:t>
+      </w:r>
+      <w:r>
+        <w:rPr>
+          <w:rFonts w:ascii="Times New Roman" w:hAnsi="Times New Roman" w:cs="Times New Roman" w:hint="eastAsia"/>
+          <w:sz w:val="24"/>
+        </w:rPr>
+        <w:t xml:space="preserve">largely </w:t>
+      </w:r>
+      <w:r>
+        <w:rPr>
+          <w:rFonts w:ascii="Times New Roman" w:hAnsi="Times New Roman" w:cs="Times New Roman"/>
+          <w:sz w:val="24"/>
+        </w:rPr>
+        <w:t>rel</w:t>
+      </w:r>
+      <w:r>
+        <w:rPr>
+          <w:rFonts w:ascii="Times New Roman" w:hAnsi="Times New Roman" w:cs="Times New Roman"/>
+          <w:sz w:val="24"/>
+        </w:rPr>
+        <w:t>ies</w:t>
+      </w:r>
+      <w:r>
+        <w:rPr>
+          <w:rFonts w:ascii="Times New Roman" w:hAnsi="Times New Roman" w:cs="Times New Roman"/>
+          <w:sz w:val="24"/>
+        </w:rPr>
+        <w:t xml:space="preserve"> </w:t>
+      </w:r>
+      <w:r>
+        <w:rPr>
+          <w:rFonts w:ascii="Times New Roman" w:hAnsi="Times New Roman" w:cs="Times New Roman"/>
+          <w:sz w:val="24"/>
+        </w:rPr>
+        <w:t xml:space="preserve">on the </w:t>
+      </w:r>
+      <w:r>
+        <w:rPr>
+          <w:rFonts w:ascii="Times New Roman" w:hAnsi="Times New Roman" w:cs="Times New Roman"/>
+          <w:sz w:val="24"/>
+        </w:rPr>
+        <w:t>coordination</w:t>
+      </w:r>
+      <w:r>
+        <w:rPr>
+          <w:rFonts w:ascii="Times New Roman" w:hAnsi="Times New Roman" w:cs="Times New Roman"/>
+          <w:sz w:val="24"/>
+        </w:rPr>
+        <w:t xml:space="preserve"> of </w:t>
+      </w:r>
+      <w:r>
+        <w:rPr>
+          <w:rFonts w:ascii="Times New Roman" w:hAnsi="Times New Roman" w:cs="Times New Roman"/>
+          <w:sz w:val="24"/>
+        </w:rPr>
+        <w:t>several basic</w:t>
+      </w:r>
+      <w:r>
+        <w:rPr>
+          <w:rFonts w:ascii="Times New Roman" w:hAnsi="Times New Roman" w:cs="Times New Roman"/>
+          <w:sz w:val="24"/>
+        </w:rPr>
+        <w:t xml:space="preserve"> cognitive processes</w:t>
+      </w:r>
+      <w:r>
+        <w:rPr>
+          <w:rFonts w:ascii="Times New Roman" w:hAnsi="Times New Roman" w:cs="Times New Roman" w:hint="eastAsia"/>
+          <w:sz w:val="24"/>
+        </w:rPr>
+        <w:t xml:space="preserve"> suc</w:t>
+      </w:r>
+      <w:r>
+        <w:rPr>
+          <w:rFonts w:ascii="Times New Roman" w:hAnsi="Times New Roman" w:cs="Times New Roman"/>
+          <w:sz w:val="24"/>
+        </w:rPr>
+        <w:t>h</w:t>
+      </w:r>
+      <w:r>
+        <w:rPr>
+          <w:rFonts w:ascii="Times New Roman" w:hAnsi="Times New Roman" w:cs="Times New Roman"/>
+          <w:sz w:val="24"/>
+        </w:rPr>
+        <w:t xml:space="preserve"> as selective attention, </w:t>
+      </w:r>
+      <w:r>
+        <w:rPr>
+          <w:rFonts w:ascii="Times New Roman" w:hAnsi="Times New Roman" w:cs="Times New Roman"/>
+          <w:sz w:val="24"/>
+        </w:rPr>
+        <w:t xml:space="preserve">working memory </w:t>
+      </w:r>
+      <w:r>
+        <w:rPr>
+          <w:rFonts w:ascii="Times New Roman" w:hAnsi="Times New Roman" w:cs="Times New Roman"/>
+          <w:sz w:val="24"/>
+        </w:rPr>
+        <w:t xml:space="preserve">and inhibitory control </w:t>
+      </w:r>
+      <w:sdt>
+        <w:sdtPr>
+          <w:rPr>
+            <w:rFonts w:ascii="Times New Roman" w:hAnsi="Times New Roman" w:cs="Times New Roman"/>
+            <w:sz w:val="24"/>
+          </w:rPr>
+          <w:id w:val="-1518537653"/>
+          <w:citation/>
+        </w:sdtPr>
+        <w:sdtContent>
+          <w:r>
+            <w:rPr>
+              <w:rFonts w:ascii="Times New Roman" w:hAnsi="Times New Roman" w:cs="Times New Roman"/>
+              <w:sz w:val="24"/>
+            </w:rPr>
+            <w:fldChar w:fldCharType="begin"/>
+          </w:r>
+          <w:r>
+            <w:rPr>
+              <w:rFonts w:ascii="Times New Roman" w:hAnsi="Times New Roman" w:cs="Times New Roman"/>
+              <w:sz w:val="24"/>
+            </w:rPr>
+            <w:instrText xml:space="preserve"> CITATION Koa23 \l 3084 </w:instrText>
+          </w:r>
+          <w:r>
+            <w:rPr>
+              <w:rFonts w:ascii="Times New Roman" w:hAnsi="Times New Roman" w:cs="Times New Roman"/>
+              <w:sz w:val="24"/>
+            </w:rPr>
+            <w:fldChar w:fldCharType="separate"/>
+          </w:r>
+          <w:r>
+            <w:rPr>
+              <w:rFonts w:ascii="Times New Roman" w:hAnsi="Times New Roman" w:cs="Times New Roman"/>
+              <w:noProof/>
+              <w:sz w:val="24"/>
+            </w:rPr>
+            <w:t>(Koay &amp; Meter, 2023)</w:t>
+          </w:r>
+          <w:r>
+            <w:rPr>
+              <w:rFonts w:ascii="Times New Roman" w:hAnsi="Times New Roman" w:cs="Times New Roman"/>
+              <w:sz w:val="24"/>
+            </w:rPr>
+            <w:fldChar w:fldCharType="end"/>
+          </w:r>
+        </w:sdtContent>
+      </w:sdt>
+      <w:r>
+        <w:rPr>
+          <w:rFonts w:ascii="Times New Roman" w:hAnsi="Times New Roman" w:cs="Times New Roman"/>
+          <w:sz w:val="24"/>
+        </w:rPr>
+        <w:t>. In addition, considering the dataset contains measurements on basic cognitive skills through cognitive performance tasks</w:t>
+      </w:r>
+      <w:r>
+        <w:rPr>
+          <w:rFonts w:ascii="Times New Roman" w:hAnsi="Times New Roman" w:cs="Times New Roman"/>
+          <w:sz w:val="24"/>
+        </w:rPr>
+        <w:t>, s</w:t>
+      </w:r>
+      <w:r>
+        <w:rPr>
+          <w:rFonts w:ascii="Times New Roman" w:hAnsi="Times New Roman" w:cs="Times New Roman"/>
+          <w:sz w:val="24"/>
+        </w:rPr>
+        <w:t xml:space="preserve">pecifically, </w:t>
+      </w:r>
+      <w:r>
+        <w:rPr>
+          <w:rFonts w:ascii="Times New Roman" w:hAnsi="Times New Roman" w:cs="Times New Roman"/>
+          <w:sz w:val="24"/>
+        </w:rPr>
+        <w:t xml:space="preserve">Stroop task reaction time (RT), N-back accuracy and the psychomotor Vigilance Test (PVT) RT are </w:t>
+      </w:r>
+      <w:r>
+        <w:rPr>
+          <w:rFonts w:ascii="Times New Roman" w:hAnsi="Times New Roman" w:cs="Times New Roman"/>
+          <w:sz w:val="24"/>
+        </w:rPr>
+        <w:t>expected</w:t>
+      </w:r>
+      <w:r>
+        <w:rPr>
+          <w:rFonts w:ascii="Times New Roman" w:hAnsi="Times New Roman" w:cs="Times New Roman"/>
+          <w:sz w:val="24"/>
+        </w:rPr>
+        <w:t xml:space="preserve"> to primarily measure selective attention and inhibition, working memory and sustained attention and behavioral alternes</w:t>
+      </w:r>
+      <w:r>
+        <w:rPr>
+          <w:rFonts w:ascii="Times New Roman" w:hAnsi="Times New Roman" w:cs="Times New Roman"/>
+          <w:sz w:val="24"/>
+        </w:rPr>
+        <w:t xml:space="preserve"> </w:t>
+      </w:r>
+      <w:r>
+        <w:rPr>
+          <w:rFonts w:ascii="Times New Roman" w:hAnsi="Times New Roman" w:cs="Times New Roman"/>
+          <w:noProof/>
+          <w:sz w:val="24"/>
+        </w:rPr>
+        <w:t>(</w:t>
+      </w:r>
+      <w:r>
+        <w:rPr>
+          <w:rFonts w:ascii="Times New Roman" w:hAnsi="Times New Roman" w:cs="Times New Roman"/>
+          <w:noProof/>
+          <w:sz w:val="24"/>
+        </w:rPr>
+        <w:t>Basner</w:t>
+      </w:r>
+      <w:r>
+        <w:rPr>
+          <w:rFonts w:ascii="Times New Roman" w:hAnsi="Times New Roman" w:cs="Times New Roman"/>
+          <w:noProof/>
+          <w:sz w:val="24"/>
+        </w:rPr>
+        <w:t xml:space="preserve"> et al.</w:t>
+      </w:r>
+      <w:r>
+        <w:rPr>
+          <w:rFonts w:ascii="Times New Roman" w:hAnsi="Times New Roman" w:cs="Times New Roman"/>
+          <w:noProof/>
+          <w:sz w:val="24"/>
+        </w:rPr>
+        <w:t>, 2021</w:t>
+      </w:r>
+      <w:r>
+        <w:rPr>
+          <w:rFonts w:ascii="Times New Roman" w:hAnsi="Times New Roman" w:cs="Times New Roman"/>
+          <w:noProof/>
+          <w:sz w:val="24"/>
+        </w:rPr>
+        <w:t xml:space="preserve">; </w:t>
+      </w:r>
+      <w:r>
+        <w:rPr>
+          <w:rFonts w:ascii="Times New Roman" w:hAnsi="Times New Roman" w:cs="Times New Roman"/>
+          <w:noProof/>
+          <w:sz w:val="24"/>
+        </w:rPr>
+        <w:t>Owe</w:t>
+      </w:r>
+      <w:r>
+        <w:rPr>
+          <w:rFonts w:ascii="Times New Roman" w:hAnsi="Times New Roman" w:cs="Times New Roman"/>
+          <w:noProof/>
+          <w:sz w:val="24"/>
+        </w:rPr>
+        <w:t>n et al,</w:t>
+      </w:r>
+      <w:r>
+        <w:rPr>
+          <w:rFonts w:ascii="Times New Roman" w:hAnsi="Times New Roman" w:cs="Times New Roman"/>
+          <w:noProof/>
+          <w:sz w:val="24"/>
+        </w:rPr>
+        <w:t>, 2005</w:t>
+      </w:r>
+      <w:r>
+        <w:rPr>
+          <w:rFonts w:ascii="Times New Roman" w:hAnsi="Times New Roman" w:cs="Times New Roman"/>
+          <w:noProof/>
+          <w:sz w:val="24"/>
+        </w:rPr>
+        <w:t xml:space="preserve">; </w:t>
+      </w:r>
+      <w:r>
+        <w:rPr>
+          <w:rFonts w:ascii="Times New Roman" w:hAnsi="Times New Roman" w:cs="Times New Roman"/>
+          <w:noProof/>
+          <w:sz w:val="24"/>
+        </w:rPr>
+        <w:t>Scarpina &amp; Tagini, 2017</w:t>
+      </w:r>
+      <w:r>
+        <w:rPr>
+          <w:rFonts w:ascii="Times New Roman" w:hAnsi="Times New Roman" w:cs="Times New Roman"/>
+          <w:noProof/>
+          <w:sz w:val="24"/>
+        </w:rPr>
+        <w:t>)</w:t>
+      </w:r>
+      <w:r>
+        <w:rPr>
+          <w:rFonts w:ascii="Times New Roman" w:hAnsi="Times New Roman" w:cs="Times New Roman"/>
+          <w:sz w:val="24"/>
+        </w:rPr>
+        <w:t xml:space="preserve"> it </w:t>
+      </w:r>
+      <w:r>
+        <w:rPr>
+          <w:rFonts w:ascii="Times New Roman" w:hAnsi="Times New Roman" w:cs="Times New Roman"/>
+          <w:sz w:val="24"/>
+        </w:rPr>
+        <w:t xml:space="preserve">raises the second aim of the project to examine whether these reflected basic cognitive functioning can be reasonably compressed and summarized to be one indication of a general cognitive ability if any. The second aim was to estimate the effects of the conditions on basic cognitive functioning constructs, and an exploratory principal component analysis (PCA), </w:t>
+      </w:r>
+      <w:r>
+        <w:rPr>
+          <w:rFonts w:ascii="Times New Roman" w:hAnsi="Times New Roman" w:cs="Times New Roman"/>
+          <w:sz w:val="24"/>
+        </w:rPr>
+        <w:t>attempting</w:t>
+      </w:r>
+      <w:r>
+        <w:rPr>
+          <w:rFonts w:ascii="Times New Roman" w:hAnsi="Times New Roman" w:cs="Times New Roman"/>
+          <w:sz w:val="24"/>
+        </w:rPr>
+        <w:t xml:space="preserve"> to compress the variables into </w:t>
+      </w:r>
+      <w:r>
+        <w:rPr>
+          <w:rFonts w:ascii="Times New Roman" w:hAnsi="Times New Roman" w:cs="Times New Roman"/>
+          <w:sz w:val="24"/>
+        </w:rPr>
+        <w:t xml:space="preserve">any potential </w:t>
+      </w:r>
+      <w:r>
+        <w:rPr>
+          <w:rFonts w:ascii="Times New Roman" w:hAnsi="Times New Roman" w:cs="Times New Roman"/>
+          <w:sz w:val="24"/>
+        </w:rPr>
+        <w:lastRenderedPageBreak/>
+        <w:t xml:space="preserve">broad cognitive performance dimension, was conducted. Nevertheless, if </w:t>
+      </w:r>
+      <w:r>
+        <w:rPr>
+          <w:rFonts w:ascii="Times New Roman" w:hAnsi="Times New Roman" w:cs="Times New Roman"/>
+          <w:sz w:val="24"/>
+        </w:rPr>
+        <w:t xml:space="preserve">a </w:t>
+      </w:r>
+      <w:r>
+        <w:rPr>
+          <w:rFonts w:ascii="Times New Roman" w:hAnsi="Times New Roman" w:cs="Times New Roman"/>
+          <w:sz w:val="24"/>
+        </w:rPr>
+        <w:t xml:space="preserve">practically information-preservation </w:t>
+      </w:r>
+      <w:r>
+        <w:rPr>
+          <w:rFonts w:ascii="Times New Roman" w:hAnsi="Times New Roman" w:cs="Times New Roman"/>
+          <w:sz w:val="24"/>
+        </w:rPr>
+        <w:t>meaningful common component could not be supported, the individual cognitive outcomes would instead be retained and examined separately. Subsequent model-based analyses were therefore conducted to estimate the associations of theoretically relevant behavioral and psychological conditions with their corresponding cognitive outcomes.</w:t>
       </w:r>
     </w:p>
     <w:p>
       <w:pPr>
         <w:spacing w:after="0" w:line="240" w:lineRule="atLeast"/>
+        <w:ind w:firstLineChars="100" w:firstLine="240"/>
         <w:jc w:val="both"/>
         <w:rPr>
           <w:rFonts w:ascii="Times New Roman" w:hAnsi="Times New Roman" w:cs="Times New Roman"/>
           <w:sz w:val="24"/>
+          <w:lang w:eastAsia="ja-JP"/>
         </w:rPr>
       </w:pPr>
+      <w:r>
+        <w:rPr>
+          <w:rFonts w:ascii="Times New Roman" w:hAnsi="Times New Roman" w:cs="Times New Roman"/>
+          <w:sz w:val="24"/>
+        </w:rPr>
+        <w:t xml:space="preserve">Overall, the </w:t>
+      </w:r>
+      <w:r>
+        <w:rPr>
+          <w:rFonts w:ascii="Times New Roman" w:hAnsi="Times New Roman" w:cs="Times New Roman"/>
+          <w:sz w:val="24"/>
+        </w:rPr>
+        <w:t xml:space="preserve">exploratory secondary data analysis </w:t>
+      </w:r>
+      <w:r>
+        <w:rPr>
+          <w:rFonts w:ascii="Times New Roman" w:hAnsi="Times New Roman" w:cs="Times New Roman"/>
+          <w:sz w:val="24"/>
+        </w:rPr>
+        <w:t xml:space="preserve">project </w:t>
+      </w:r>
+      <w:r>
+        <w:rPr>
+          <w:rFonts w:ascii="Times New Roman" w:hAnsi="Times New Roman" w:cs="Times New Roman"/>
+          <w:sz w:val="24"/>
+        </w:rPr>
+        <w:t>subsequently</w:t>
+      </w:r>
+      <w:r>
+        <w:rPr>
+          <w:rFonts w:ascii="Times New Roman" w:hAnsi="Times New Roman" w:cs="Times New Roman"/>
+          <w:sz w:val="24"/>
+        </w:rPr>
+        <w:t xml:space="preserve"> combined exploratory correlational mapping with theory-driven analyses to examine how behavioral and psychological conditions are associated with emotional regulation and cognitive performance</w:t>
+      </w:r>
+      <w:r>
+        <w:rPr>
+          <w:rFonts w:ascii="Times New Roman" w:hAnsi="Times New Roman" w:cs="Times New Roman"/>
+          <w:sz w:val="24"/>
+        </w:rPr>
+        <w:t xml:space="preserve">. Generally, for the first broad purpose it is expected to find certain statistically significant correlations between behavioral or psychological states and the cognitive performance measures in the dataset. </w:t>
+      </w:r>
+      <w:r>
+        <w:rPr>
+          <w:rFonts w:ascii="Times New Roman" w:hAnsi="Times New Roman" w:cs="Times New Roman"/>
+          <w:sz w:val="24"/>
+        </w:rPr>
+        <w:t>And for the second aim, it is expected that the theoretically selected behavioral and psychological conditions will show meaningful associations with their corresponding emotional and cognitive outcomes, while the exploratory PCA may identify whether the available cognitive measures can be reasonably summarized into a broader common cognitive performance dimension, thereby indirectly supporting existing theoretical and empirical evidence</w:t>
+      </w:r>
+      <w:r>
+        <w:rPr>
+          <w:rFonts w:ascii="Times New Roman" w:hAnsi="Times New Roman" w:cs="Times New Roman"/>
+          <w:sz w:val="24"/>
+        </w:rPr>
+        <w:t>.</w:t>
+      </w:r>
     </w:p>
     <w:sectPr>
       <w:pgSz w:w="11906" w:h="16838"/>
@@ -3437,7 +3906,7 @@
     <b:Pages>14-20</b:Pages>
     <b:Volume>135</b:Volume>
     <b:Year>2015</b:Year>
-    <b:RefOrder>3</b:RefOrder>
+    <b:RefOrder>4</b:RefOrder>
   </b:Source>
   <b:Source>
     <b:Tag>Sch04</b:Tag>
@@ -3459,7 +3928,7 @@
       </b:Author>
     </b:Author>
     <b:Volume>55</b:Volume>
-    <b:RefOrder>4</b:RefOrder>
+    <b:RefOrder>5</b:RefOrder>
   </b:Source>
   <b:Source>
     <b:Tag>For11</b:Tag>
@@ -3499,7 +3968,7 @@
     <b:Pages>272-279</b:Pages>
     <b:Volume>15</b:Volume>
     <b:Issue>6</b:Issue>
-    <b:RefOrder>5</b:RefOrder>
+    <b:RefOrder>6</b:RefOrder>
   </b:Source>
   <b:Source>
     <b:Tag>Fla22</b:Tag>
@@ -3534,7 +4003,7 @@
         </b:NameList>
       </b:Author>
     </b:Author>
-    <b:RefOrder>6</b:RefOrder>
+    <b:RefOrder>7</b:RefOrder>
   </b:Source>
   <b:Source>
     <b:Tag>Gil07</b:Tag>
@@ -3561,7 +4030,7 @@
     </b:Author>
     <b:Volume>54</b:Volume>
     <b:Issue>5</b:Issue>
-    <b:RefOrder>7</b:RefOrder>
+    <b:RefOrder>8</b:RefOrder>
   </b:Source>
   <b:Source>
     <b:Tag>Wai25</b:Tag>
@@ -3588,7 +4057,7 @@
     </b:Author>
     <b:Volume>20</b:Volume>
     <b:Issue>1</b:Issue>
-    <b:RefOrder>8</b:RefOrder>
+    <b:RefOrder>9</b:RefOrder>
   </b:Source>
   <b:Source>
     <b:Tag>Kha23</b:Tag>
@@ -3615,7 +4084,7 @@
     </b:Author>
     <b:Volume>28</b:Volume>
     <b:Issue>2</b:Issue>
-    <b:RefOrder>9</b:RefOrder>
+    <b:RefOrder>10</b:RefOrder>
   </b:Source>
   <b:Source>
     <b:Tag>Alh07</b:Tag>
@@ -3641,7 +4110,7 @@
     </b:Author>
     <b:Volume>3</b:Volume>
     <b:Issue>5</b:Issue>
-    <b:RefOrder>10</b:RefOrder>
+    <b:RefOrder>11</b:RefOrder>
   </b:Source>
   <b:Source>
     <b:Tag>Tri21</b:Tag>
@@ -3671,7 +4140,7 @@
     </b:Author>
     <b:Volume>85</b:Volume>
     <b:Issue>3</b:Issue>
-    <b:RefOrder>11</b:RefOrder>
+    <b:RefOrder>12</b:RefOrder>
   </b:Source>
   <b:Source>
     <b:Tag>Har16</b:Tag>
@@ -3703,7 +4172,7 @@
         </b:NameList>
       </b:Author>
     </b:Author>
-    <b:RefOrder>12</b:RefOrder>
+    <b:RefOrder>13</b:RefOrder>
   </b:Source>
   <b:Source>
     <b:Tag>Roc15</b:Tag>
@@ -3741,7 +4210,7 @@
     </b:Author>
     <b:Volume>43</b:Volume>
     <b:Issue>5</b:Issue>
-    <b:RefOrder>13</b:RefOrder>
+    <b:RefOrder>14</b:RefOrder>
   </b:Source>
   <b:Source>
     <b:Tag>Pac10</b:Tag>
@@ -3772,7 +4241,7 @@
     </b:Author>
     <b:Volume>21</b:Volume>
     <b:Issue>2</b:Issue>
-    <b:RefOrder>1</b:RefOrder>
+    <b:RefOrder>15</b:RefOrder>
   </b:Source>
   <b:Source>
     <b:Tag>sac24</b:Tag>
@@ -3786,13 +4255,169 @@
     </b:Author>
     <b:InternetSiteTitle>Kaggle</b:InternetSiteTitle>
     <b:URL>https://www.kaggle.com/datasets/sacramentotechnology/sleep-deprivation-and-cognitive-performance</b:URL>
+    <b:RefOrder>1</b:RefOrder>
+  </b:Source>
+  <b:Source>
+    <b:Tag>Koa23</b:Tag>
+    <b:SourceType>ArticleInAPeriodical</b:SourceType>
+    <b:Guid>{DA9E45D6-9AFE-D44A-8D94-95D33E2C8880}</b:Guid>
+    <b:Title>The Effect of Emotion Regulation on Executive Function</b:Title>
+    <b:Year>2023</b:Year>
+    <b:Author>
+      <b:Author>
+        <b:NameList>
+          <b:Person>
+            <b:Last>Koay</b:Last>
+            <b:Middle>Min</b:Middle>
+            <b:First>Jun</b:First>
+          </b:Person>
+          <b:Person>
+            <b:Last>Meter</b:Last>
+            <b:Middle>Van</b:Middle>
+            <b:First>Anna</b:First>
+          </b:Person>
+        </b:NameList>
+      </b:Author>
+    </b:Author>
+    <b:Pages>315-329</b:Pages>
+    <b:PeriodicalTitle>Journal of Cognitive Psychology</b:PeriodicalTitle>
+    <b:Volume>35</b:Volume>
+    <b:Issue>3</b:Issue>
     <b:RefOrder>2</b:RefOrder>
+  </b:Source>
+  <b:Source>
+    <b:Tag>Nwi25</b:Tag>
+    <b:SourceType>ArticleInAPeriodical</b:SourceType>
+    <b:Guid>{7C5B462D-3ABC-CB44-B00D-6660FAC2D21A}</b:Guid>
+    <b:Title>Effects of stress on cognitive performance</b:Title>
+    <b:PeriodicalTitle>Progress in Brain Research</b:PeriodicalTitle>
+    <b:Year>2025</b:Year>
+    <b:Pages>109-135</b:Pages>
+    <b:Author>
+      <b:Author>
+        <b:NameList>
+          <b:Person>
+            <b:Last>Nwikwe</b:Last>
+            <b:Middle>Chukwuma</b:Middle>
+            <b:First>David</b:First>
+          </b:Person>
+        </b:NameList>
+      </b:Author>
+    </b:Author>
+    <b:Volume>291</b:Volume>
+    <b:RefOrder>16</b:RefOrder>
+  </b:Source>
+  <b:Source>
+    <b:Tag>Sca17</b:Tag>
+    <b:SourceType>ArticleInAPeriodical</b:SourceType>
+    <b:Guid>{3B40CD78-B53D-3C42-BDCF-F6CAD110A1CE}</b:Guid>
+    <b:Title>The stroop color and word test</b:Title>
+    <b:PeriodicalTitle>Frontiers in psychology</b:PeriodicalTitle>
+    <b:Year>2017</b:Year>
+    <b:Pages>557</b:Pages>
+    <b:Author>
+      <b:Author>
+        <b:NameList>
+          <b:Person>
+            <b:Last>Scarpina</b:Last>
+            <b:First>Federica</b:First>
+          </b:Person>
+          <b:Person>
+            <b:Last>Tagini</b:Last>
+            <b:First>Sofia</b:First>
+          </b:Person>
+        </b:NameList>
+      </b:Author>
+    </b:Author>
+    <b:Volume>8</b:Volume>
+    <b:LCID>en-CA</b:LCID>
+    <b:RefOrder>17</b:RefOrder>
+  </b:Source>
+  <b:Source>
+    <b:Tag>Owe05</b:Tag>
+    <b:SourceType>ArticleInAPeriodical</b:SourceType>
+    <b:Guid>{442CFB72-24A9-534A-925A-3B7F6045695F}</b:Guid>
+    <b:Title>N‐back working memory paradigm: A meta‐analysis of normative functional neuroimaging studies</b:Title>
+    <b:PeriodicalTitle>Human brain mapping</b:PeriodicalTitle>
+    <b:Year>2005</b:Year>
+    <b:Pages>46-59</b:Pages>
+    <b:Volume>25</b:Volume>
+    <b:Issue>1</b:Issue>
+    <b:Author>
+      <b:Author>
+        <b:NameList>
+          <b:Person>
+            <b:Last>Owen</b:Last>
+            <b:Middle>M</b:Middle>
+            <b:First>Adrian</b:First>
+          </b:Person>
+          <b:Person>
+            <b:Last>McMillan</b:Last>
+            <b:Middle>M</b:Middle>
+            <b:First>Kathryn</b:First>
+          </b:Person>
+          <b:Person>
+            <b:Last>Laird</b:Last>
+            <b:Middle>R</b:Middle>
+            <b:First>Angela</b:First>
+          </b:Person>
+          <b:Person>
+            <b:Last>Bullmore</b:Last>
+            <b:First>Ed</b:First>
+          </b:Person>
+        </b:NameList>
+      </b:Author>
+    </b:Author>
+    <b:LCID>en-US</b:LCID>
+    <b:RefOrder>18</b:RefOrder>
+  </b:Source>
+  <b:Source>
+    <b:Tag>Bas21</b:Tag>
+    <b:SourceType>ArticleInAPeriodical</b:SourceType>
+    <b:Guid>{A26E71C2-4213-9D4F-AEC0-ACC8A5C5B200}</b:Guid>
+    <b:Title>Response speed measurements on the psychomotor vigilance test: how precise is precise enough?</b:Title>
+    <b:PeriodicalTitle>Sleep</b:PeriodicalTitle>
+    <b:Year>2021</b:Year>
+    <b:Pages>zsaa121</b:Pages>
+    <b:LCID>en-CA</b:LCID>
+    <b:Volume>44</b:Volume>
+    <b:Issue>1</b:Issue>
+    <b:Author>
+      <b:Author>
+        <b:NameList>
+          <b:Person>
+            <b:Last>Basner</b:Last>
+            <b:First>Mathias</b:First>
+          </b:Person>
+          <b:Person>
+            <b:Last>Moore</b:Last>
+            <b:Middle>M</b:Middle>
+            <b:First>Tyler</b:First>
+          </b:Person>
+          <b:Person>
+            <b:Last>Nasrini</b:Last>
+            <b:First>Jad</b:First>
+          </b:Person>
+          <b:Person>
+            <b:Last>Gur</b:Last>
+            <b:Middle>M</b:Middle>
+            <b:First>Ruben</b:First>
+          </b:Person>
+          <b:Person>
+            <b:Last>Dinges</b:Last>
+            <b:Middle>F</b:Middle>
+            <b:First>David</b:First>
+          </b:Person>
+        </b:NameList>
+      </b:Author>
+    </b:Author>
+    <b:RefOrder>3</b:RefOrder>
   </b:Source>
 </b:Sources>
 </file>
 
 <file path=customXml/itemProps1.xml><?xml version="1.0" encoding="utf-8"?>
-<ds:datastoreItem xmlns:ds="http://schemas.openxmlformats.org/officeDocument/2006/customXml" ds:itemID="{7F572EC6-1590-0347-974A-8ED6F807B10B}">
+<ds:datastoreItem xmlns:ds="http://schemas.openxmlformats.org/officeDocument/2006/customXml" ds:itemID="{583C16FB-E0F5-B246-81CC-FD3D41ECCE4B}">
   <ds:schemaRefs>
     <ds:schemaRef ds:uri="http://schemas.openxmlformats.org/officeDocument/2006/bibliography"/>
   </ds:schemaRefs>

</xml_diff>

<commit_message>
Elaboration of the code
</commit_message>
<xml_diff>
--- a/Project1_Sleep_Deprivation_Cognition/Report/Analysis_Report.docx
+++ b/Project1_Sleep_Deprivation_Cognition/Report/Analysis_Report.docx
@@ -1338,23 +1338,3201 @@
         <w:spacing w:after="0" w:line="240" w:lineRule="auto"/>
         <w:jc w:val="both"/>
         <w:rPr>
+          <w:rFonts w:ascii="Times New Roman" w:hAnsi="Times New Roman" w:cs="Times New Roman"/>
+          <w:b/>
+          <w:bCs/>
+          <w:sz w:val="26"/>
+          <w:szCs w:val="26"/>
+        </w:rPr>
+      </w:pPr>
+      <w:r>
+        <w:rPr>
           <w:rFonts w:ascii="Times New Roman" w:hAnsi="Times New Roman" w:cs="Times New Roman" w:hint="eastAsia"/>
           <w:b/>
           <w:bCs/>
           <w:sz w:val="26"/>
           <w:szCs w:val="26"/>
         </w:rPr>
+        <w:lastRenderedPageBreak/>
+        <w:t>Analyses Results</w:t>
+      </w:r>
+    </w:p>
+    <w:p>
+      <w:pPr>
+        <w:spacing w:after="0" w:line="240" w:lineRule="auto"/>
+        <w:jc w:val="both"/>
+        <w:rPr>
+          <w:rFonts w:ascii="Times New Roman" w:hAnsi="Times New Roman" w:cs="Times New Roman"/>
+          <w:b/>
+          <w:bCs/>
+          <w:sz w:val="24"/>
+        </w:rPr>
       </w:pPr>
       <w:r>
         <w:rPr>
           <w:rFonts w:ascii="Times New Roman" w:hAnsi="Times New Roman" w:cs="Times New Roman" w:hint="eastAsia"/>
           <w:b/>
           <w:bCs/>
-          <w:sz w:val="26"/>
-          <w:szCs w:val="26"/>
-        </w:rPr>
-        <w:lastRenderedPageBreak/>
-        <w:t>Analyses Results</w:t>
+          <w:sz w:val="24"/>
+        </w:rPr>
+        <w:t xml:space="preserve">-Exploratory Data </w:t>
+      </w:r>
+      <w:r>
+        <w:rPr>
+          <w:rFonts w:ascii="Times New Roman" w:hAnsi="Times New Roman" w:cs="Times New Roman"/>
+          <w:b/>
+          <w:bCs/>
+          <w:sz w:val="24"/>
+        </w:rPr>
+        <w:t>Analysis</w:t>
+      </w:r>
+      <w:r>
+        <w:rPr>
+          <w:rFonts w:ascii="Times New Roman" w:hAnsi="Times New Roman" w:cs="Times New Roman"/>
+          <w:b/>
+          <w:bCs/>
+          <w:sz w:val="24"/>
+        </w:rPr>
+        <w:t>:</w:t>
+      </w:r>
+    </w:p>
+    <w:p>
+      <w:pPr>
+        <w:spacing w:after="0" w:line="240" w:lineRule="auto"/>
+        <w:jc w:val="both"/>
+        <w:rPr>
+          <w:rFonts w:ascii="Times New Roman" w:hAnsi="Times New Roman" w:cs="Times New Roman"/>
+          <w:sz w:val="24"/>
+        </w:rPr>
+      </w:pPr>
+      <w:r>
+        <w:rPr>
+          <w:rFonts w:ascii="Times New Roman" w:hAnsi="Times New Roman" w:cs="Times New Roman"/>
+          <w:sz w:val="24"/>
+        </w:rPr>
+        <w:t xml:space="preserve"> </w:t>
+      </w:r>
+      <w:r>
+        <w:rPr>
+          <w:rFonts w:ascii="Times New Roman" w:hAnsi="Times New Roman" w:cs="Times New Roman"/>
+          <w:sz w:val="24"/>
+        </w:rPr>
+        <w:t xml:space="preserve"> </w:t>
+      </w:r>
+      <w:r>
+        <w:rPr>
+          <w:rFonts w:ascii="Times New Roman" w:hAnsi="Times New Roman" w:cs="Times New Roman"/>
+          <w:sz w:val="24"/>
+        </w:rPr>
+        <w:t xml:space="preserve">This </w:t>
+      </w:r>
+      <w:r>
+        <w:rPr>
+          <w:rFonts w:ascii="Times New Roman" w:hAnsi="Times New Roman" w:cs="Times New Roman"/>
+          <w:sz w:val="24"/>
+        </w:rPr>
+        <w:t xml:space="preserve">project </w:t>
+      </w:r>
+      <w:r>
+        <w:rPr>
+          <w:rFonts w:ascii="Times New Roman" w:hAnsi="Times New Roman" w:cs="Times New Roman"/>
+          <w:sz w:val="24"/>
+        </w:rPr>
+        <w:t xml:space="preserve">used the </w:t>
+      </w:r>
+      <w:r>
+        <w:rPr>
+          <w:rStyle w:val="HTML"/>
+          <w:rFonts w:ascii="Times New Roman" w:hAnsi="Times New Roman" w:cs="Times New Roman"/>
+        </w:rPr>
+        <w:t>Dataset.csv</w:t>
+      </w:r>
+      <w:r>
+        <w:rPr>
+          <w:rFonts w:ascii="Times New Roman" w:hAnsi="Times New Roman" w:cs="Times New Roman"/>
+          <w:sz w:val="24"/>
+        </w:rPr>
+        <w:t xml:space="preserve"> file stored in the </w:t>
+      </w:r>
+      <w:r>
+        <w:rPr>
+          <w:rStyle w:val="HTML"/>
+          <w:rFonts w:ascii="Times New Roman" w:hAnsi="Times New Roman" w:cs="Times New Roman"/>
+        </w:rPr>
+        <w:t>Report/</w:t>
+      </w:r>
+      <w:proofErr w:type="spellStart"/>
+      <w:r>
+        <w:rPr>
+          <w:rStyle w:val="HTML"/>
+          <w:rFonts w:ascii="Times New Roman" w:hAnsi="Times New Roman" w:cs="Times New Roman"/>
+        </w:rPr>
+        <w:t>Original_Dataset</w:t>
+      </w:r>
+      <w:proofErr w:type="spellEnd"/>
+      <w:r>
+        <w:rPr>
+          <w:rFonts w:ascii="Times New Roman" w:hAnsi="Times New Roman" w:cs="Times New Roman"/>
+          <w:sz w:val="24"/>
+        </w:rPr>
+        <w:t xml:space="preserve"> directory of the project repository. Before the formal analyses, an initial description and exploratory analysis of the dataset were conducted</w:t>
+      </w:r>
+      <w:r>
+        <w:rPr>
+          <w:rFonts w:ascii="Times New Roman" w:hAnsi="Times New Roman" w:cs="Times New Roman"/>
+          <w:sz w:val="24"/>
+        </w:rPr>
+        <w:t xml:space="preserve"> firstly</w:t>
+      </w:r>
+      <w:r>
+        <w:rPr>
+          <w:rFonts w:ascii="Times New Roman" w:hAnsi="Times New Roman" w:cs="Times New Roman"/>
+          <w:sz w:val="24"/>
+        </w:rPr>
+        <w:t xml:space="preserve">. The dataset contained 60 observations and 14 variables. </w:t>
+      </w:r>
+      <w:r>
+        <w:rPr>
+          <w:rFonts w:ascii="Times New Roman" w:hAnsi="Times New Roman" w:cs="Times New Roman"/>
+          <w:sz w:val="24"/>
+        </w:rPr>
+        <w:t>For these variables, only the variable gender is binary categorical variable, while all other variables are continuous. Then, i</w:t>
+      </w:r>
+      <w:r>
+        <w:rPr>
+          <w:rFonts w:ascii="Times New Roman" w:hAnsi="Times New Roman" w:cs="Times New Roman"/>
+          <w:sz w:val="24"/>
+        </w:rPr>
+        <w:t>nitial screening indicated</w:t>
+      </w:r>
+      <w:r>
+        <w:rPr>
+          <w:rFonts w:ascii="Times New Roman" w:hAnsi="Times New Roman" w:cs="Times New Roman"/>
+          <w:sz w:val="24"/>
+        </w:rPr>
+        <w:t xml:space="preserve"> that there </w:t>
+      </w:r>
+      <w:r>
+        <w:rPr>
+          <w:rFonts w:ascii="Times New Roman" w:hAnsi="Times New Roman" w:cs="Times New Roman"/>
+          <w:sz w:val="24"/>
+        </w:rPr>
+        <w:t>are</w:t>
+      </w:r>
+      <w:r>
+        <w:rPr>
+          <w:rFonts w:ascii="Times New Roman" w:hAnsi="Times New Roman" w:cs="Times New Roman"/>
+          <w:sz w:val="24"/>
+        </w:rPr>
+        <w:t xml:space="preserve"> no missing values or duplicated values in this dataset as described, th</w:t>
+      </w:r>
+      <w:r>
+        <w:rPr>
+          <w:rFonts w:ascii="Times New Roman" w:hAnsi="Times New Roman" w:cs="Times New Roman"/>
+          <w:sz w:val="24"/>
+        </w:rPr>
+        <w:t>us</w:t>
+      </w:r>
+      <w:r>
+        <w:rPr>
+          <w:rFonts w:ascii="Times New Roman" w:hAnsi="Times New Roman" w:cs="Times New Roman"/>
+          <w:sz w:val="24"/>
+        </w:rPr>
+        <w:t>, there is no need for</w:t>
+      </w:r>
+      <w:r>
+        <w:rPr>
+          <w:rFonts w:ascii="Times New Roman" w:hAnsi="Times New Roman" w:cs="Times New Roman"/>
+          <w:sz w:val="24"/>
+        </w:rPr>
+        <w:t xml:space="preserve"> missing-data handling and</w:t>
+      </w:r>
+      <w:r>
+        <w:rPr>
+          <w:rFonts w:ascii="Times New Roman" w:hAnsi="Times New Roman" w:cs="Times New Roman"/>
+          <w:sz w:val="24"/>
+        </w:rPr>
+        <w:t xml:space="preserve"> </w:t>
+      </w:r>
+      <w:r>
+        <w:rPr>
+          <w:rFonts w:ascii="Times New Roman" w:hAnsi="Times New Roman" w:cs="Times New Roman"/>
+          <w:sz w:val="24"/>
+        </w:rPr>
+        <w:t xml:space="preserve">further </w:t>
+      </w:r>
+      <w:r>
+        <w:rPr>
+          <w:rFonts w:ascii="Times New Roman" w:hAnsi="Times New Roman" w:cs="Times New Roman"/>
+          <w:sz w:val="24"/>
+        </w:rPr>
+        <w:t>measurements</w:t>
+      </w:r>
+      <w:r>
+        <w:rPr>
+          <w:rFonts w:ascii="Times New Roman" w:hAnsi="Times New Roman" w:cs="Times New Roman"/>
+          <w:sz w:val="24"/>
+        </w:rPr>
+        <w:t>. Descriptive statistics were then examined to characterize the distributions and central tendencies of the variables in the dataset.</w:t>
+      </w:r>
+      <w:r>
+        <w:rPr>
+          <w:rFonts w:ascii="Times New Roman" w:hAnsi="Times New Roman" w:cs="Times New Roman"/>
+          <w:sz w:val="24"/>
+        </w:rPr>
+        <w:t xml:space="preserve"> </w:t>
+      </w:r>
+      <w:r>
+        <w:rPr>
+          <w:rFonts w:ascii="Times New Roman" w:hAnsi="Times New Roman" w:cs="Times New Roman"/>
+          <w:sz w:val="24"/>
+        </w:rPr>
+        <w:t xml:space="preserve">Table 1 presents the descriptive summary of the primary </w:t>
+      </w:r>
+      <w:r>
+        <w:rPr>
+          <w:rFonts w:ascii="Times New Roman" w:hAnsi="Times New Roman" w:cs="Times New Roman"/>
+          <w:sz w:val="24"/>
+        </w:rPr>
+        <w:t xml:space="preserve">continuous </w:t>
+      </w:r>
+      <w:r>
+        <w:rPr>
+          <w:rFonts w:ascii="Times New Roman" w:hAnsi="Times New Roman" w:cs="Times New Roman"/>
+          <w:sz w:val="24"/>
+        </w:rPr>
+        <w:t>variables.</w:t>
+      </w:r>
+      <w:r>
+        <w:rPr>
+          <w:rFonts w:ascii="Times New Roman" w:hAnsi="Times New Roman" w:cs="Times New Roman"/>
+          <w:sz w:val="24"/>
+        </w:rPr>
+        <w:t xml:space="preserve"> </w:t>
+      </w:r>
+    </w:p>
+    <w:tbl>
+      <w:tblPr>
+        <w:tblStyle w:val="41"/>
+        <w:tblW w:w="9132" w:type="dxa"/>
+        <w:tblLook w:val="04A0" w:firstRow="1" w:lastRow="0" w:firstColumn="1" w:lastColumn="0" w:noHBand="0" w:noVBand="1"/>
+      </w:tblPr>
+      <w:tblGrid>
+        <w:gridCol w:w="2552"/>
+        <w:gridCol w:w="1150"/>
+        <w:gridCol w:w="1151"/>
+        <w:gridCol w:w="1151"/>
+        <w:gridCol w:w="1151"/>
+        <w:gridCol w:w="1067"/>
+        <w:gridCol w:w="910"/>
+      </w:tblGrid>
+      <w:tr>
+        <w:trPr>
+          <w:cnfStyle w:val="100000000000" w:firstRow="1" w:lastRow="0" w:firstColumn="0" w:lastColumn="0" w:oddVBand="0" w:evenVBand="0" w:oddHBand="0" w:evenHBand="0" w:firstRowFirstColumn="0" w:firstRowLastColumn="0" w:lastRowFirstColumn="0" w:lastRowLastColumn="0"/>
+        </w:trPr>
+        <w:tc>
+          <w:tcPr>
+            <w:cnfStyle w:val="001000000000" w:firstRow="0" w:lastRow="0" w:firstColumn="1" w:lastColumn="0" w:oddVBand="0" w:evenVBand="0" w:oddHBand="0" w:evenHBand="0" w:firstRowFirstColumn="0" w:firstRowLastColumn="0" w:lastRowFirstColumn="0" w:lastRowLastColumn="0"/>
+            <w:tcW w:w="2552" w:type="dxa"/>
+          </w:tcPr>
+          <w:p>
+            <w:pPr>
+              <w:rPr>
+                <w:rFonts w:ascii="Times New Roman" w:hAnsi="Times New Roman" w:cs="Times New Roman" w:hint="eastAsia"/>
+                <w:b w:val="0"/>
+                <w:bCs w:val="0"/>
+                <w:sz w:val="20"/>
+                <w:szCs w:val="20"/>
+                <w:lang w:val="fr-CA"/>
+              </w:rPr>
+            </w:pPr>
+            <w:r>
+              <w:rPr>
+                <w:rFonts w:ascii="Times New Roman" w:hAnsi="Times New Roman" w:cs="Times New Roman"/>
+                <w:b w:val="0"/>
+                <w:bCs w:val="0"/>
+                <w:sz w:val="20"/>
+                <w:szCs w:val="20"/>
+                <w:lang w:val="fr-CA"/>
+              </w:rPr>
+              <w:t>Variable</w:t>
+            </w:r>
+          </w:p>
+        </w:tc>
+        <w:tc>
+          <w:tcPr>
+            <w:tcW w:w="1150" w:type="dxa"/>
+          </w:tcPr>
+          <w:p>
+            <w:pPr>
+              <w:cnfStyle w:val="100000000000" w:firstRow="1" w:lastRow="0" w:firstColumn="0" w:lastColumn="0" w:oddVBand="0" w:evenVBand="0" w:oddHBand="0" w:evenHBand="0" w:firstRowFirstColumn="0" w:firstRowLastColumn="0" w:lastRowFirstColumn="0" w:lastRowLastColumn="0"/>
+              <w:rPr>
+                <w:rFonts w:ascii="Times New Roman" w:hAnsi="Times New Roman" w:cs="Times New Roman" w:hint="eastAsia"/>
+                <w:b w:val="0"/>
+                <w:bCs w:val="0"/>
+                <w:sz w:val="20"/>
+                <w:szCs w:val="20"/>
+              </w:rPr>
+            </w:pPr>
+            <w:r>
+              <w:rPr>
+                <w:rFonts w:ascii="Times New Roman" w:hAnsi="Times New Roman" w:cs="Times New Roman" w:hint="eastAsia"/>
+                <w:b w:val="0"/>
+                <w:bCs w:val="0"/>
+                <w:sz w:val="20"/>
+                <w:szCs w:val="20"/>
+              </w:rPr>
+              <w:t>Min</w:t>
+            </w:r>
+          </w:p>
+        </w:tc>
+        <w:tc>
+          <w:tcPr>
+            <w:tcW w:w="1151" w:type="dxa"/>
+          </w:tcPr>
+          <w:p>
+            <w:pPr>
+              <w:cnfStyle w:val="100000000000" w:firstRow="1" w:lastRow="0" w:firstColumn="0" w:lastColumn="0" w:oddVBand="0" w:evenVBand="0" w:oddHBand="0" w:evenHBand="0" w:firstRowFirstColumn="0" w:firstRowLastColumn="0" w:lastRowFirstColumn="0" w:lastRowLastColumn="0"/>
+              <w:rPr>
+                <w:rFonts w:ascii="Times New Roman" w:hAnsi="Times New Roman" w:cs="Times New Roman" w:hint="eastAsia"/>
+                <w:b w:val="0"/>
+                <w:bCs w:val="0"/>
+                <w:sz w:val="20"/>
+                <w:szCs w:val="20"/>
+              </w:rPr>
+            </w:pPr>
+            <w:r>
+              <w:rPr>
+                <w:rFonts w:ascii="Times New Roman" w:hAnsi="Times New Roman" w:cs="Times New Roman" w:hint="eastAsia"/>
+                <w:b w:val="0"/>
+                <w:bCs w:val="0"/>
+                <w:sz w:val="20"/>
+                <w:szCs w:val="20"/>
+              </w:rPr>
+              <w:t>Q1</w:t>
+            </w:r>
+          </w:p>
+        </w:tc>
+        <w:tc>
+          <w:tcPr>
+            <w:tcW w:w="1151" w:type="dxa"/>
+          </w:tcPr>
+          <w:p>
+            <w:pPr>
+              <w:cnfStyle w:val="100000000000" w:firstRow="1" w:lastRow="0" w:firstColumn="0" w:lastColumn="0" w:oddVBand="0" w:evenVBand="0" w:oddHBand="0" w:evenHBand="0" w:firstRowFirstColumn="0" w:firstRowLastColumn="0" w:lastRowFirstColumn="0" w:lastRowLastColumn="0"/>
+              <w:rPr>
+                <w:rFonts w:ascii="Times New Roman" w:hAnsi="Times New Roman" w:cs="Times New Roman"/>
+                <w:b w:val="0"/>
+                <w:bCs w:val="0"/>
+                <w:sz w:val="20"/>
+                <w:szCs w:val="20"/>
+              </w:rPr>
+            </w:pPr>
+            <w:r>
+              <w:rPr>
+                <w:rFonts w:ascii="Times New Roman" w:hAnsi="Times New Roman" w:cs="Times New Roman" w:hint="eastAsia"/>
+                <w:b w:val="0"/>
+                <w:bCs w:val="0"/>
+                <w:sz w:val="20"/>
+                <w:szCs w:val="20"/>
+              </w:rPr>
+              <w:t>Median</w:t>
+            </w:r>
+          </w:p>
+        </w:tc>
+        <w:tc>
+          <w:tcPr>
+            <w:tcW w:w="1151" w:type="dxa"/>
+          </w:tcPr>
+          <w:p>
+            <w:pPr>
+              <w:cnfStyle w:val="100000000000" w:firstRow="1" w:lastRow="0" w:firstColumn="0" w:lastColumn="0" w:oddVBand="0" w:evenVBand="0" w:oddHBand="0" w:evenHBand="0" w:firstRowFirstColumn="0" w:firstRowLastColumn="0" w:lastRowFirstColumn="0" w:lastRowLastColumn="0"/>
+              <w:rPr>
+                <w:rFonts w:ascii="Times New Roman" w:hAnsi="Times New Roman" w:cs="Times New Roman"/>
+                <w:b w:val="0"/>
+                <w:bCs w:val="0"/>
+                <w:sz w:val="20"/>
+                <w:szCs w:val="20"/>
+              </w:rPr>
+            </w:pPr>
+            <w:r>
+              <w:rPr>
+                <w:rFonts w:ascii="Times New Roman" w:hAnsi="Times New Roman" w:cs="Times New Roman" w:hint="eastAsia"/>
+                <w:b w:val="0"/>
+                <w:bCs w:val="0"/>
+                <w:sz w:val="20"/>
+                <w:szCs w:val="20"/>
+              </w:rPr>
+              <w:t>Mean</w:t>
+            </w:r>
+          </w:p>
+        </w:tc>
+        <w:tc>
+          <w:tcPr>
+            <w:tcW w:w="1067" w:type="dxa"/>
+          </w:tcPr>
+          <w:p>
+            <w:pPr>
+              <w:cnfStyle w:val="100000000000" w:firstRow="1" w:lastRow="0" w:firstColumn="0" w:lastColumn="0" w:oddVBand="0" w:evenVBand="0" w:oddHBand="0" w:evenHBand="0" w:firstRowFirstColumn="0" w:firstRowLastColumn="0" w:lastRowFirstColumn="0" w:lastRowLastColumn="0"/>
+              <w:rPr>
+                <w:rFonts w:ascii="Times New Roman" w:hAnsi="Times New Roman" w:cs="Times New Roman" w:hint="eastAsia"/>
+                <w:b w:val="0"/>
+                <w:bCs w:val="0"/>
+                <w:sz w:val="20"/>
+                <w:szCs w:val="20"/>
+              </w:rPr>
+            </w:pPr>
+            <w:r>
+              <w:rPr>
+                <w:rFonts w:ascii="Times New Roman" w:hAnsi="Times New Roman" w:cs="Times New Roman" w:hint="eastAsia"/>
+                <w:b w:val="0"/>
+                <w:bCs w:val="0"/>
+                <w:sz w:val="20"/>
+                <w:szCs w:val="20"/>
+              </w:rPr>
+              <w:t>Q3</w:t>
+            </w:r>
+          </w:p>
+        </w:tc>
+        <w:tc>
+          <w:tcPr>
+            <w:tcW w:w="910" w:type="dxa"/>
+          </w:tcPr>
+          <w:p>
+            <w:pPr>
+              <w:cnfStyle w:val="100000000000" w:firstRow="1" w:lastRow="0" w:firstColumn="0" w:lastColumn="0" w:oddVBand="0" w:evenVBand="0" w:oddHBand="0" w:evenHBand="0" w:firstRowFirstColumn="0" w:firstRowLastColumn="0" w:lastRowFirstColumn="0" w:lastRowLastColumn="0"/>
+              <w:rPr>
+                <w:rFonts w:ascii="Times New Roman" w:hAnsi="Times New Roman" w:cs="Times New Roman" w:hint="eastAsia"/>
+                <w:b w:val="0"/>
+                <w:bCs w:val="0"/>
+                <w:sz w:val="20"/>
+                <w:szCs w:val="20"/>
+              </w:rPr>
+            </w:pPr>
+            <w:r>
+              <w:rPr>
+                <w:rFonts w:ascii="Times New Roman" w:hAnsi="Times New Roman" w:cs="Times New Roman" w:hint="eastAsia"/>
+                <w:b w:val="0"/>
+                <w:bCs w:val="0"/>
+                <w:sz w:val="20"/>
+                <w:szCs w:val="20"/>
+              </w:rPr>
+              <w:t>M</w:t>
+            </w:r>
+            <w:r>
+              <w:rPr>
+                <w:rFonts w:ascii="Times New Roman" w:hAnsi="Times New Roman" w:cs="Times New Roman"/>
+                <w:b w:val="0"/>
+                <w:bCs w:val="0"/>
+                <w:sz w:val="20"/>
+                <w:szCs w:val="20"/>
+              </w:rPr>
+              <w:t>ax</w:t>
+            </w:r>
+          </w:p>
+        </w:tc>
+      </w:tr>
+      <w:tr>
+        <w:trPr>
+          <w:cnfStyle w:val="000000100000" w:firstRow="0" w:lastRow="0" w:firstColumn="0" w:lastColumn="0" w:oddVBand="0" w:evenVBand="0" w:oddHBand="1" w:evenHBand="0" w:firstRowFirstColumn="0" w:firstRowLastColumn="0" w:lastRowFirstColumn="0" w:lastRowLastColumn="0"/>
+        </w:trPr>
+        <w:tc>
+          <w:tcPr>
+            <w:cnfStyle w:val="001000000000" w:firstRow="0" w:lastRow="0" w:firstColumn="1" w:lastColumn="0" w:oddVBand="0" w:evenVBand="0" w:oddHBand="0" w:evenHBand="0" w:firstRowFirstColumn="0" w:firstRowLastColumn="0" w:lastRowFirstColumn="0" w:lastRowLastColumn="0"/>
+            <w:tcW w:w="2552" w:type="dxa"/>
+          </w:tcPr>
+          <w:p>
+            <w:pPr>
+              <w:jc w:val="both"/>
+              <w:rPr>
+                <w:rFonts w:ascii="Times New Roman" w:hAnsi="Times New Roman" w:cs="Times New Roman"/>
+                <w:b w:val="0"/>
+                <w:bCs w:val="0"/>
+                <w:sz w:val="20"/>
+                <w:szCs w:val="20"/>
+                <w:lang w:val="fr-CA"/>
+              </w:rPr>
+            </w:pPr>
+            <w:proofErr w:type="spellStart"/>
+            <w:r>
+              <w:rPr>
+                <w:rFonts w:ascii="Times New Roman" w:hAnsi="Times New Roman" w:cs="Times New Roman"/>
+                <w:b w:val="0"/>
+                <w:bCs w:val="0"/>
+                <w:sz w:val="20"/>
+                <w:szCs w:val="20"/>
+                <w:lang w:val="fr-CA"/>
+              </w:rPr>
+              <w:t>Sleep</w:t>
+            </w:r>
+            <w:proofErr w:type="spellEnd"/>
+            <w:r>
+              <w:rPr>
+                <w:rFonts w:ascii="Times New Roman" w:hAnsi="Times New Roman" w:cs="Times New Roman" w:hint="eastAsia"/>
+                <w:b w:val="0"/>
+                <w:bCs w:val="0"/>
+                <w:sz w:val="20"/>
+                <w:szCs w:val="20"/>
+                <w:lang w:val="fr-CA"/>
+              </w:rPr>
+              <w:t xml:space="preserve"> </w:t>
+            </w:r>
+            <w:proofErr w:type="spellStart"/>
+            <w:r>
+              <w:rPr>
+                <w:rFonts w:ascii="Times New Roman" w:hAnsi="Times New Roman" w:cs="Times New Roman"/>
+                <w:b w:val="0"/>
+                <w:bCs w:val="0"/>
+                <w:sz w:val="20"/>
+                <w:szCs w:val="20"/>
+                <w:lang w:val="fr-CA"/>
+              </w:rPr>
+              <w:t>Hours</w:t>
+            </w:r>
+            <w:proofErr w:type="spellEnd"/>
+          </w:p>
+        </w:tc>
+        <w:tc>
+          <w:tcPr>
+            <w:tcW w:w="1150" w:type="dxa"/>
+          </w:tcPr>
+          <w:p>
+            <w:pPr>
+              <w:jc w:val="center"/>
+              <w:cnfStyle w:val="000000100000" w:firstRow="0" w:lastRow="0" w:firstColumn="0" w:lastColumn="0" w:oddVBand="0" w:evenVBand="0" w:oddHBand="1" w:evenHBand="0" w:firstRowFirstColumn="0" w:firstRowLastColumn="0" w:lastRowFirstColumn="0" w:lastRowLastColumn="0"/>
+              <w:rPr>
+                <w:rFonts w:ascii="Times New Roman" w:hAnsi="Times New Roman" w:cs="Times New Roman"/>
+                <w:sz w:val="20"/>
+                <w:szCs w:val="20"/>
+                <w:lang w:val="fr-CA"/>
+              </w:rPr>
+            </w:pPr>
+            <w:r>
+              <w:rPr>
+                <w:rFonts w:ascii="Times New Roman" w:hAnsi="Times New Roman" w:cs="Times New Roman"/>
+                <w:sz w:val="20"/>
+                <w:szCs w:val="20"/>
+                <w:lang w:val="fr-CA"/>
+              </w:rPr>
+              <w:t>3.1</w:t>
+            </w:r>
+          </w:p>
+        </w:tc>
+        <w:tc>
+          <w:tcPr>
+            <w:tcW w:w="1151" w:type="dxa"/>
+          </w:tcPr>
+          <w:p>
+            <w:pPr>
+              <w:jc w:val="center"/>
+              <w:cnfStyle w:val="000000100000" w:firstRow="0" w:lastRow="0" w:firstColumn="0" w:lastColumn="0" w:oddVBand="0" w:evenVBand="0" w:oddHBand="1" w:evenHBand="0" w:firstRowFirstColumn="0" w:firstRowLastColumn="0" w:lastRowFirstColumn="0" w:lastRowLastColumn="0"/>
+              <w:rPr>
+                <w:rFonts w:ascii="Times New Roman" w:hAnsi="Times New Roman" w:cs="Times New Roman"/>
+                <w:sz w:val="20"/>
+                <w:szCs w:val="20"/>
+                <w:lang w:val="fr-CA"/>
+              </w:rPr>
+            </w:pPr>
+            <w:r>
+              <w:rPr>
+                <w:rFonts w:ascii="Times New Roman" w:hAnsi="Times New Roman" w:cs="Times New Roman"/>
+                <w:sz w:val="20"/>
+                <w:szCs w:val="20"/>
+                <w:lang w:val="fr-CA"/>
+              </w:rPr>
+              <w:t>4.1</w:t>
+            </w:r>
+          </w:p>
+        </w:tc>
+        <w:tc>
+          <w:tcPr>
+            <w:tcW w:w="1151" w:type="dxa"/>
+          </w:tcPr>
+          <w:p>
+            <w:pPr>
+              <w:jc w:val="center"/>
+              <w:cnfStyle w:val="000000100000" w:firstRow="0" w:lastRow="0" w:firstColumn="0" w:lastColumn="0" w:oddVBand="0" w:evenVBand="0" w:oddHBand="1" w:evenHBand="0" w:firstRowFirstColumn="0" w:firstRowLastColumn="0" w:lastRowFirstColumn="0" w:lastRowLastColumn="0"/>
+              <w:rPr>
+                <w:rFonts w:ascii="Times New Roman" w:hAnsi="Times New Roman" w:cs="Times New Roman"/>
+                <w:sz w:val="20"/>
+                <w:szCs w:val="20"/>
+                <w:lang w:val="fr-CA"/>
+              </w:rPr>
+            </w:pPr>
+            <w:r>
+              <w:rPr>
+                <w:rFonts w:ascii="Times New Roman" w:hAnsi="Times New Roman" w:cs="Times New Roman"/>
+                <w:sz w:val="20"/>
+                <w:szCs w:val="20"/>
+                <w:lang w:val="fr-CA"/>
+              </w:rPr>
+              <w:t>5.7</w:t>
+            </w:r>
+          </w:p>
+        </w:tc>
+        <w:tc>
+          <w:tcPr>
+            <w:tcW w:w="1151" w:type="dxa"/>
+          </w:tcPr>
+          <w:p>
+            <w:pPr>
+              <w:jc w:val="center"/>
+              <w:cnfStyle w:val="000000100000" w:firstRow="0" w:lastRow="0" w:firstColumn="0" w:lastColumn="0" w:oddVBand="0" w:evenVBand="0" w:oddHBand="1" w:evenHBand="0" w:firstRowFirstColumn="0" w:firstRowLastColumn="0" w:lastRowFirstColumn="0" w:lastRowLastColumn="0"/>
+              <w:rPr>
+                <w:rFonts w:ascii="Times New Roman" w:hAnsi="Times New Roman" w:cs="Times New Roman"/>
+                <w:sz w:val="20"/>
+                <w:szCs w:val="20"/>
+                <w:lang w:val="fr-CA"/>
+              </w:rPr>
+            </w:pPr>
+            <w:r>
+              <w:rPr>
+                <w:rFonts w:ascii="Times New Roman" w:hAnsi="Times New Roman" w:cs="Times New Roman"/>
+                <w:sz w:val="20"/>
+                <w:szCs w:val="20"/>
+                <w:lang w:val="fr-CA"/>
+              </w:rPr>
+              <w:t>5.8</w:t>
+            </w:r>
+          </w:p>
+        </w:tc>
+        <w:tc>
+          <w:tcPr>
+            <w:tcW w:w="1067" w:type="dxa"/>
+          </w:tcPr>
+          <w:p>
+            <w:pPr>
+              <w:jc w:val="center"/>
+              <w:cnfStyle w:val="000000100000" w:firstRow="0" w:lastRow="0" w:firstColumn="0" w:lastColumn="0" w:oddVBand="0" w:evenVBand="0" w:oddHBand="1" w:evenHBand="0" w:firstRowFirstColumn="0" w:firstRowLastColumn="0" w:lastRowFirstColumn="0" w:lastRowLastColumn="0"/>
+              <w:rPr>
+                <w:rFonts w:ascii="Times New Roman" w:hAnsi="Times New Roman" w:cs="Times New Roman"/>
+                <w:sz w:val="20"/>
+                <w:szCs w:val="20"/>
+                <w:lang w:val="fr-CA"/>
+              </w:rPr>
+            </w:pPr>
+            <w:r>
+              <w:rPr>
+                <w:rFonts w:ascii="Times New Roman" w:hAnsi="Times New Roman" w:cs="Times New Roman"/>
+                <w:sz w:val="20"/>
+                <w:szCs w:val="20"/>
+                <w:lang w:val="fr-CA"/>
+              </w:rPr>
+              <w:t>7.3</w:t>
+            </w:r>
+          </w:p>
+        </w:tc>
+        <w:tc>
+          <w:tcPr>
+            <w:tcW w:w="910" w:type="dxa"/>
+          </w:tcPr>
+          <w:p>
+            <w:pPr>
+              <w:jc w:val="center"/>
+              <w:cnfStyle w:val="000000100000" w:firstRow="0" w:lastRow="0" w:firstColumn="0" w:lastColumn="0" w:oddVBand="0" w:evenVBand="0" w:oddHBand="1" w:evenHBand="0" w:firstRowFirstColumn="0" w:firstRowLastColumn="0" w:lastRowFirstColumn="0" w:lastRowLastColumn="0"/>
+              <w:rPr>
+                <w:rFonts w:ascii="Times New Roman" w:hAnsi="Times New Roman" w:cs="Times New Roman"/>
+                <w:sz w:val="20"/>
+                <w:szCs w:val="20"/>
+                <w:lang w:val="fr-CA"/>
+              </w:rPr>
+            </w:pPr>
+            <w:r>
+              <w:rPr>
+                <w:rFonts w:ascii="Times New Roman" w:hAnsi="Times New Roman" w:cs="Times New Roman"/>
+                <w:sz w:val="20"/>
+                <w:szCs w:val="20"/>
+                <w:lang w:val="fr-CA"/>
+              </w:rPr>
+              <w:t>8.8</w:t>
+            </w:r>
+          </w:p>
+        </w:tc>
+      </w:tr>
+      <w:tr>
+        <w:tc>
+          <w:tcPr>
+            <w:cnfStyle w:val="001000000000" w:firstRow="0" w:lastRow="0" w:firstColumn="1" w:lastColumn="0" w:oddVBand="0" w:evenVBand="0" w:oddHBand="0" w:evenHBand="0" w:firstRowFirstColumn="0" w:firstRowLastColumn="0" w:lastRowFirstColumn="0" w:lastRowLastColumn="0"/>
+            <w:tcW w:w="2552" w:type="dxa"/>
+          </w:tcPr>
+          <w:p>
+            <w:pPr>
+              <w:jc w:val="both"/>
+              <w:rPr>
+                <w:rFonts w:ascii="Times New Roman" w:hAnsi="Times New Roman" w:cs="Times New Roman"/>
+                <w:b w:val="0"/>
+                <w:bCs w:val="0"/>
+                <w:sz w:val="20"/>
+                <w:szCs w:val="20"/>
+                <w:lang w:val="fr-CA"/>
+              </w:rPr>
+            </w:pPr>
+            <w:proofErr w:type="spellStart"/>
+            <w:r>
+              <w:rPr>
+                <w:rFonts w:ascii="Times New Roman" w:hAnsi="Times New Roman" w:cs="Times New Roman"/>
+                <w:b w:val="0"/>
+                <w:bCs w:val="0"/>
+                <w:sz w:val="20"/>
+                <w:szCs w:val="20"/>
+                <w:lang w:val="fr-CA"/>
+              </w:rPr>
+              <w:t>Sleep</w:t>
+            </w:r>
+            <w:proofErr w:type="spellEnd"/>
+            <w:r>
+              <w:rPr>
+                <w:rFonts w:ascii="Times New Roman" w:hAnsi="Times New Roman" w:cs="Times New Roman" w:hint="eastAsia"/>
+                <w:b w:val="0"/>
+                <w:bCs w:val="0"/>
+                <w:sz w:val="20"/>
+                <w:szCs w:val="20"/>
+                <w:lang w:val="fr-CA"/>
+              </w:rPr>
+              <w:t xml:space="preserve"> </w:t>
+            </w:r>
+            <w:proofErr w:type="spellStart"/>
+            <w:r>
+              <w:rPr>
+                <w:rFonts w:ascii="Times New Roman" w:hAnsi="Times New Roman" w:cs="Times New Roman"/>
+                <w:b w:val="0"/>
+                <w:bCs w:val="0"/>
+                <w:sz w:val="20"/>
+                <w:szCs w:val="20"/>
+                <w:lang w:val="fr-CA"/>
+              </w:rPr>
+              <w:t>Quality</w:t>
+            </w:r>
+            <w:proofErr w:type="spellEnd"/>
+          </w:p>
+        </w:tc>
+        <w:tc>
+          <w:tcPr>
+            <w:tcW w:w="1150" w:type="dxa"/>
+          </w:tcPr>
+          <w:p>
+            <w:pPr>
+              <w:jc w:val="center"/>
+              <w:cnfStyle w:val="000000000000" w:firstRow="0" w:lastRow="0" w:firstColumn="0" w:lastColumn="0" w:oddVBand="0" w:evenVBand="0" w:oddHBand="0" w:evenHBand="0" w:firstRowFirstColumn="0" w:firstRowLastColumn="0" w:lastRowFirstColumn="0" w:lastRowLastColumn="0"/>
+              <w:rPr>
+                <w:rFonts w:ascii="Times New Roman" w:hAnsi="Times New Roman" w:cs="Times New Roman"/>
+                <w:sz w:val="20"/>
+                <w:szCs w:val="20"/>
+                <w:lang w:val="fr-CA"/>
+              </w:rPr>
+            </w:pPr>
+            <w:r>
+              <w:rPr>
+                <w:rFonts w:ascii="Times New Roman" w:hAnsi="Times New Roman" w:cs="Times New Roman"/>
+                <w:sz w:val="20"/>
+                <w:szCs w:val="20"/>
+                <w:lang w:val="fr-CA"/>
+              </w:rPr>
+              <w:t>0.0</w:t>
+            </w:r>
+          </w:p>
+        </w:tc>
+        <w:tc>
+          <w:tcPr>
+            <w:tcW w:w="1151" w:type="dxa"/>
+          </w:tcPr>
+          <w:p>
+            <w:pPr>
+              <w:jc w:val="center"/>
+              <w:cnfStyle w:val="000000000000" w:firstRow="0" w:lastRow="0" w:firstColumn="0" w:lastColumn="0" w:oddVBand="0" w:evenVBand="0" w:oddHBand="0" w:evenHBand="0" w:firstRowFirstColumn="0" w:firstRowLastColumn="0" w:lastRowFirstColumn="0" w:lastRowLastColumn="0"/>
+              <w:rPr>
+                <w:rFonts w:ascii="Times New Roman" w:hAnsi="Times New Roman" w:cs="Times New Roman"/>
+                <w:sz w:val="20"/>
+                <w:szCs w:val="20"/>
+                <w:lang w:val="fr-CA"/>
+              </w:rPr>
+            </w:pPr>
+            <w:r>
+              <w:rPr>
+                <w:rFonts w:ascii="Times New Roman" w:hAnsi="Times New Roman" w:cs="Times New Roman"/>
+                <w:sz w:val="20"/>
+                <w:szCs w:val="20"/>
+                <w:lang w:val="fr-CA"/>
+              </w:rPr>
+              <w:t>4.0</w:t>
+            </w:r>
+          </w:p>
+        </w:tc>
+        <w:tc>
+          <w:tcPr>
+            <w:tcW w:w="1151" w:type="dxa"/>
+          </w:tcPr>
+          <w:p>
+            <w:pPr>
+              <w:jc w:val="center"/>
+              <w:cnfStyle w:val="000000000000" w:firstRow="0" w:lastRow="0" w:firstColumn="0" w:lastColumn="0" w:oddVBand="0" w:evenVBand="0" w:oddHBand="0" w:evenHBand="0" w:firstRowFirstColumn="0" w:firstRowLastColumn="0" w:lastRowFirstColumn="0" w:lastRowLastColumn="0"/>
+              <w:rPr>
+                <w:rFonts w:ascii="Times New Roman" w:hAnsi="Times New Roman" w:cs="Times New Roman"/>
+                <w:sz w:val="20"/>
+                <w:szCs w:val="20"/>
+                <w:lang w:val="fr-CA"/>
+              </w:rPr>
+            </w:pPr>
+            <w:r>
+              <w:rPr>
+                <w:rFonts w:ascii="Times New Roman" w:hAnsi="Times New Roman" w:cs="Times New Roman"/>
+                <w:sz w:val="20"/>
+                <w:szCs w:val="20"/>
+                <w:lang w:val="fr-CA"/>
+              </w:rPr>
+              <w:t>8.0</w:t>
+            </w:r>
+          </w:p>
+        </w:tc>
+        <w:tc>
+          <w:tcPr>
+            <w:tcW w:w="1151" w:type="dxa"/>
+          </w:tcPr>
+          <w:p>
+            <w:pPr>
+              <w:jc w:val="center"/>
+              <w:cnfStyle w:val="000000000000" w:firstRow="0" w:lastRow="0" w:firstColumn="0" w:lastColumn="0" w:oddVBand="0" w:evenVBand="0" w:oddHBand="0" w:evenHBand="0" w:firstRowFirstColumn="0" w:firstRowLastColumn="0" w:lastRowFirstColumn="0" w:lastRowLastColumn="0"/>
+              <w:rPr>
+                <w:rFonts w:ascii="Times New Roman" w:hAnsi="Times New Roman" w:cs="Times New Roman"/>
+                <w:sz w:val="20"/>
+                <w:szCs w:val="20"/>
+                <w:lang w:val="fr-CA"/>
+              </w:rPr>
+            </w:pPr>
+            <w:r>
+              <w:rPr>
+                <w:rFonts w:ascii="Times New Roman" w:hAnsi="Times New Roman" w:cs="Times New Roman"/>
+                <w:sz w:val="20"/>
+                <w:szCs w:val="20"/>
+                <w:lang w:val="fr-CA"/>
+              </w:rPr>
+              <w:t>8.3</w:t>
+            </w:r>
+          </w:p>
+        </w:tc>
+        <w:tc>
+          <w:tcPr>
+            <w:tcW w:w="1067" w:type="dxa"/>
+          </w:tcPr>
+          <w:p>
+            <w:pPr>
+              <w:jc w:val="center"/>
+              <w:cnfStyle w:val="000000000000" w:firstRow="0" w:lastRow="0" w:firstColumn="0" w:lastColumn="0" w:oddVBand="0" w:evenVBand="0" w:oddHBand="0" w:evenHBand="0" w:firstRowFirstColumn="0" w:firstRowLastColumn="0" w:lastRowFirstColumn="0" w:lastRowLastColumn="0"/>
+              <w:rPr>
+                <w:rFonts w:ascii="Times New Roman" w:hAnsi="Times New Roman" w:cs="Times New Roman"/>
+                <w:sz w:val="20"/>
+                <w:szCs w:val="20"/>
+                <w:lang w:val="fr-CA"/>
+              </w:rPr>
+            </w:pPr>
+            <w:r>
+              <w:rPr>
+                <w:rFonts w:ascii="Times New Roman" w:hAnsi="Times New Roman" w:cs="Times New Roman"/>
+                <w:sz w:val="20"/>
+                <w:szCs w:val="20"/>
+                <w:lang w:val="fr-CA"/>
+              </w:rPr>
+              <w:t>13.0</w:t>
+            </w:r>
+          </w:p>
+        </w:tc>
+        <w:tc>
+          <w:tcPr>
+            <w:tcW w:w="910" w:type="dxa"/>
+          </w:tcPr>
+          <w:p>
+            <w:pPr>
+              <w:jc w:val="center"/>
+              <w:cnfStyle w:val="000000000000" w:firstRow="0" w:lastRow="0" w:firstColumn="0" w:lastColumn="0" w:oddVBand="0" w:evenVBand="0" w:oddHBand="0" w:evenHBand="0" w:firstRowFirstColumn="0" w:firstRowLastColumn="0" w:lastRowFirstColumn="0" w:lastRowLastColumn="0"/>
+              <w:rPr>
+                <w:rFonts w:ascii="Times New Roman" w:hAnsi="Times New Roman" w:cs="Times New Roman"/>
+                <w:sz w:val="20"/>
+                <w:szCs w:val="20"/>
+                <w:lang w:val="fr-CA"/>
+              </w:rPr>
+            </w:pPr>
+            <w:r>
+              <w:rPr>
+                <w:rFonts w:ascii="Times New Roman" w:hAnsi="Times New Roman" w:cs="Times New Roman"/>
+                <w:sz w:val="20"/>
+                <w:szCs w:val="20"/>
+                <w:lang w:val="fr-CA"/>
+              </w:rPr>
+              <w:t>20.0</w:t>
+            </w:r>
+          </w:p>
+        </w:tc>
+      </w:tr>
+      <w:tr>
+        <w:trPr>
+          <w:cnfStyle w:val="000000100000" w:firstRow="0" w:lastRow="0" w:firstColumn="0" w:lastColumn="0" w:oddVBand="0" w:evenVBand="0" w:oddHBand="1" w:evenHBand="0" w:firstRowFirstColumn="0" w:firstRowLastColumn="0" w:lastRowFirstColumn="0" w:lastRowLastColumn="0"/>
+        </w:trPr>
+        <w:tc>
+          <w:tcPr>
+            <w:cnfStyle w:val="001000000000" w:firstRow="0" w:lastRow="0" w:firstColumn="1" w:lastColumn="0" w:oddVBand="0" w:evenVBand="0" w:oddHBand="0" w:evenHBand="0" w:firstRowFirstColumn="0" w:firstRowLastColumn="0" w:lastRowFirstColumn="0" w:lastRowLastColumn="0"/>
+            <w:tcW w:w="2552" w:type="dxa"/>
+          </w:tcPr>
+          <w:p>
+            <w:pPr>
+              <w:jc w:val="both"/>
+              <w:rPr>
+                <w:rFonts w:ascii="Times New Roman" w:hAnsi="Times New Roman" w:cs="Times New Roman"/>
+                <w:b w:val="0"/>
+                <w:bCs w:val="0"/>
+                <w:sz w:val="20"/>
+                <w:szCs w:val="20"/>
+                <w:lang w:val="fr-CA"/>
+              </w:rPr>
+            </w:pPr>
+            <w:proofErr w:type="spellStart"/>
+            <w:r>
+              <w:rPr>
+                <w:rFonts w:ascii="Times New Roman" w:hAnsi="Times New Roman" w:cs="Times New Roman"/>
+                <w:b w:val="0"/>
+                <w:bCs w:val="0"/>
+                <w:sz w:val="20"/>
+                <w:szCs w:val="20"/>
+                <w:lang w:val="fr-CA"/>
+              </w:rPr>
+              <w:t>Daytime</w:t>
+            </w:r>
+            <w:proofErr w:type="spellEnd"/>
+            <w:r>
+              <w:rPr>
+                <w:rFonts w:ascii="Times New Roman" w:hAnsi="Times New Roman" w:cs="Times New Roman" w:hint="eastAsia"/>
+                <w:b w:val="0"/>
+                <w:bCs w:val="0"/>
+                <w:sz w:val="20"/>
+                <w:szCs w:val="20"/>
+                <w:lang w:val="fr-CA"/>
+              </w:rPr>
+              <w:t xml:space="preserve"> </w:t>
+            </w:r>
+            <w:proofErr w:type="spellStart"/>
+            <w:r>
+              <w:rPr>
+                <w:rFonts w:ascii="Times New Roman" w:hAnsi="Times New Roman" w:cs="Times New Roman"/>
+                <w:b w:val="0"/>
+                <w:bCs w:val="0"/>
+                <w:sz w:val="20"/>
+                <w:szCs w:val="20"/>
+                <w:lang w:val="fr-CA"/>
+              </w:rPr>
+              <w:t>Sleepness</w:t>
+            </w:r>
+            <w:proofErr w:type="spellEnd"/>
+          </w:p>
+        </w:tc>
+        <w:tc>
+          <w:tcPr>
+            <w:tcW w:w="1150" w:type="dxa"/>
+          </w:tcPr>
+          <w:p>
+            <w:pPr>
+              <w:jc w:val="center"/>
+              <w:cnfStyle w:val="000000100000" w:firstRow="0" w:lastRow="0" w:firstColumn="0" w:lastColumn="0" w:oddVBand="0" w:evenVBand="0" w:oddHBand="1" w:evenHBand="0" w:firstRowFirstColumn="0" w:firstRowLastColumn="0" w:lastRowFirstColumn="0" w:lastRowLastColumn="0"/>
+              <w:rPr>
+                <w:rFonts w:ascii="Times New Roman" w:hAnsi="Times New Roman" w:cs="Times New Roman"/>
+                <w:sz w:val="20"/>
+                <w:szCs w:val="20"/>
+                <w:lang w:val="fr-CA"/>
+              </w:rPr>
+            </w:pPr>
+            <w:r>
+              <w:rPr>
+                <w:rFonts w:ascii="Times New Roman" w:hAnsi="Times New Roman" w:cs="Times New Roman"/>
+                <w:sz w:val="20"/>
+                <w:szCs w:val="20"/>
+                <w:lang w:val="fr-CA"/>
+              </w:rPr>
+              <w:t>0.0</w:t>
+            </w:r>
+          </w:p>
+        </w:tc>
+        <w:tc>
+          <w:tcPr>
+            <w:tcW w:w="1151" w:type="dxa"/>
+          </w:tcPr>
+          <w:p>
+            <w:pPr>
+              <w:jc w:val="center"/>
+              <w:cnfStyle w:val="000000100000" w:firstRow="0" w:lastRow="0" w:firstColumn="0" w:lastColumn="0" w:oddVBand="0" w:evenVBand="0" w:oddHBand="1" w:evenHBand="0" w:firstRowFirstColumn="0" w:firstRowLastColumn="0" w:lastRowFirstColumn="0" w:lastRowLastColumn="0"/>
+              <w:rPr>
+                <w:rFonts w:ascii="Times New Roman" w:hAnsi="Times New Roman" w:cs="Times New Roman"/>
+                <w:sz w:val="20"/>
+                <w:szCs w:val="20"/>
+                <w:lang w:val="fr-CA"/>
+              </w:rPr>
+            </w:pPr>
+            <w:r>
+              <w:rPr>
+                <w:rFonts w:ascii="Times New Roman" w:hAnsi="Times New Roman" w:cs="Times New Roman"/>
+                <w:sz w:val="20"/>
+                <w:szCs w:val="20"/>
+                <w:lang w:val="fr-CA"/>
+              </w:rPr>
+              <w:t>6.0</w:t>
+            </w:r>
+          </w:p>
+        </w:tc>
+        <w:tc>
+          <w:tcPr>
+            <w:tcW w:w="1151" w:type="dxa"/>
+          </w:tcPr>
+          <w:p>
+            <w:pPr>
+              <w:jc w:val="center"/>
+              <w:cnfStyle w:val="000000100000" w:firstRow="0" w:lastRow="0" w:firstColumn="0" w:lastColumn="0" w:oddVBand="0" w:evenVBand="0" w:oddHBand="1" w:evenHBand="0" w:firstRowFirstColumn="0" w:firstRowLastColumn="0" w:lastRowFirstColumn="0" w:lastRowLastColumn="0"/>
+              <w:rPr>
+                <w:rFonts w:ascii="Times New Roman" w:hAnsi="Times New Roman" w:cs="Times New Roman"/>
+                <w:sz w:val="20"/>
+                <w:szCs w:val="20"/>
+                <w:lang w:val="fr-CA"/>
+              </w:rPr>
+            </w:pPr>
+            <w:r>
+              <w:rPr>
+                <w:rFonts w:ascii="Times New Roman" w:hAnsi="Times New Roman" w:cs="Times New Roman"/>
+                <w:sz w:val="20"/>
+                <w:szCs w:val="20"/>
+                <w:lang w:val="fr-CA"/>
+              </w:rPr>
+              <w:t>11.5</w:t>
+            </w:r>
+          </w:p>
+        </w:tc>
+        <w:tc>
+          <w:tcPr>
+            <w:tcW w:w="1151" w:type="dxa"/>
+          </w:tcPr>
+          <w:p>
+            <w:pPr>
+              <w:jc w:val="center"/>
+              <w:cnfStyle w:val="000000100000" w:firstRow="0" w:lastRow="0" w:firstColumn="0" w:lastColumn="0" w:oddVBand="0" w:evenVBand="0" w:oddHBand="1" w:evenHBand="0" w:firstRowFirstColumn="0" w:firstRowLastColumn="0" w:lastRowFirstColumn="0" w:lastRowLastColumn="0"/>
+              <w:rPr>
+                <w:rFonts w:ascii="Times New Roman" w:hAnsi="Times New Roman" w:cs="Times New Roman"/>
+                <w:sz w:val="20"/>
+                <w:szCs w:val="20"/>
+                <w:lang w:val="fr-CA"/>
+              </w:rPr>
+            </w:pPr>
+            <w:r>
+              <w:rPr>
+                <w:rFonts w:ascii="Times New Roman" w:hAnsi="Times New Roman" w:cs="Times New Roman"/>
+                <w:sz w:val="20"/>
+                <w:szCs w:val="20"/>
+                <w:lang w:val="fr-CA"/>
+              </w:rPr>
+              <w:t>12.0</w:t>
+            </w:r>
+          </w:p>
+        </w:tc>
+        <w:tc>
+          <w:tcPr>
+            <w:tcW w:w="1067" w:type="dxa"/>
+          </w:tcPr>
+          <w:p>
+            <w:pPr>
+              <w:jc w:val="center"/>
+              <w:cnfStyle w:val="000000100000" w:firstRow="0" w:lastRow="0" w:firstColumn="0" w:lastColumn="0" w:oddVBand="0" w:evenVBand="0" w:oddHBand="1" w:evenHBand="0" w:firstRowFirstColumn="0" w:firstRowLastColumn="0" w:lastRowFirstColumn="0" w:lastRowLastColumn="0"/>
+              <w:rPr>
+                <w:rFonts w:ascii="Times New Roman" w:hAnsi="Times New Roman" w:cs="Times New Roman"/>
+                <w:sz w:val="20"/>
+                <w:szCs w:val="20"/>
+                <w:lang w:val="fr-CA"/>
+              </w:rPr>
+            </w:pPr>
+            <w:r>
+              <w:rPr>
+                <w:rFonts w:ascii="Times New Roman" w:hAnsi="Times New Roman" w:cs="Times New Roman"/>
+                <w:sz w:val="20"/>
+                <w:szCs w:val="20"/>
+                <w:lang w:val="fr-CA"/>
+              </w:rPr>
+              <w:t>19.0</w:t>
+            </w:r>
+          </w:p>
+        </w:tc>
+        <w:tc>
+          <w:tcPr>
+            <w:tcW w:w="910" w:type="dxa"/>
+          </w:tcPr>
+          <w:p>
+            <w:pPr>
+              <w:jc w:val="center"/>
+              <w:cnfStyle w:val="000000100000" w:firstRow="0" w:lastRow="0" w:firstColumn="0" w:lastColumn="0" w:oddVBand="0" w:evenVBand="0" w:oddHBand="1" w:evenHBand="0" w:firstRowFirstColumn="0" w:firstRowLastColumn="0" w:lastRowFirstColumn="0" w:lastRowLastColumn="0"/>
+              <w:rPr>
+                <w:rFonts w:ascii="Times New Roman" w:hAnsi="Times New Roman" w:cs="Times New Roman"/>
+                <w:sz w:val="20"/>
+                <w:szCs w:val="20"/>
+                <w:lang w:val="fr-CA"/>
+              </w:rPr>
+            </w:pPr>
+            <w:r>
+              <w:rPr>
+                <w:rFonts w:ascii="Times New Roman" w:hAnsi="Times New Roman" w:cs="Times New Roman"/>
+                <w:sz w:val="20"/>
+                <w:szCs w:val="20"/>
+                <w:lang w:val="fr-CA"/>
+              </w:rPr>
+              <w:t>24.0</w:t>
+            </w:r>
+          </w:p>
+        </w:tc>
+      </w:tr>
+      <w:tr>
+        <w:tc>
+          <w:tcPr>
+            <w:cnfStyle w:val="001000000000" w:firstRow="0" w:lastRow="0" w:firstColumn="1" w:lastColumn="0" w:oddVBand="0" w:evenVBand="0" w:oddHBand="0" w:evenHBand="0" w:firstRowFirstColumn="0" w:firstRowLastColumn="0" w:lastRowFirstColumn="0" w:lastRowLastColumn="0"/>
+            <w:tcW w:w="2552" w:type="dxa"/>
+          </w:tcPr>
+          <w:p>
+            <w:pPr>
+              <w:jc w:val="both"/>
+              <w:rPr>
+                <w:rFonts w:ascii="Times New Roman" w:hAnsi="Times New Roman" w:cs="Times New Roman"/>
+                <w:b w:val="0"/>
+                <w:bCs w:val="0"/>
+                <w:sz w:val="20"/>
+                <w:szCs w:val="20"/>
+                <w:lang w:val="fr-CA"/>
+              </w:rPr>
+            </w:pPr>
+            <w:r>
+              <w:rPr>
+                <w:rFonts w:ascii="Times New Roman" w:hAnsi="Times New Roman" w:cs="Times New Roman" w:hint="eastAsia"/>
+                <w:b w:val="0"/>
+                <w:bCs w:val="0"/>
+                <w:sz w:val="20"/>
+                <w:szCs w:val="20"/>
+              </w:rPr>
+              <w:t>Stroop</w:t>
+            </w:r>
+            <w:proofErr w:type="spellStart"/>
+            <w:r>
+              <w:rPr>
+                <w:rFonts w:ascii="Times New Roman" w:hAnsi="Times New Roman" w:cs="Times New Roman"/>
+                <w:b w:val="0"/>
+                <w:bCs w:val="0"/>
+                <w:sz w:val="20"/>
+                <w:szCs w:val="20"/>
+                <w:lang w:val="fr-CA"/>
+              </w:rPr>
+              <w:t>Task</w:t>
+            </w:r>
+            <w:proofErr w:type="spellEnd"/>
+            <w:r>
+              <w:rPr>
+                <w:rFonts w:ascii="Times New Roman" w:hAnsi="Times New Roman" w:cs="Times New Roman" w:hint="eastAsia"/>
+                <w:b w:val="0"/>
+                <w:bCs w:val="0"/>
+                <w:sz w:val="20"/>
+                <w:szCs w:val="20"/>
+                <w:lang w:val="fr-CA"/>
+              </w:rPr>
+              <w:t xml:space="preserve"> </w:t>
+            </w:r>
+            <w:proofErr w:type="spellStart"/>
+            <w:r>
+              <w:rPr>
+                <w:rFonts w:ascii="Times New Roman" w:hAnsi="Times New Roman" w:cs="Times New Roman"/>
+                <w:b w:val="0"/>
+                <w:bCs w:val="0"/>
+                <w:sz w:val="20"/>
+                <w:szCs w:val="20"/>
+                <w:lang w:val="fr-CA"/>
+              </w:rPr>
+              <w:t>Reactio</w:t>
+            </w:r>
+            <w:r>
+              <w:rPr>
+                <w:rFonts w:ascii="Times New Roman" w:hAnsi="Times New Roman" w:cs="Times New Roman" w:hint="eastAsia"/>
+                <w:b w:val="0"/>
+                <w:bCs w:val="0"/>
+                <w:sz w:val="20"/>
+                <w:szCs w:val="20"/>
+                <w:lang w:val="fr-CA"/>
+              </w:rPr>
+              <w:t>n</w:t>
+            </w:r>
+            <w:proofErr w:type="spellEnd"/>
+            <w:r>
+              <w:rPr>
+                <w:rFonts w:ascii="Times New Roman" w:hAnsi="Times New Roman" w:cs="Times New Roman"/>
+                <w:b w:val="0"/>
+                <w:bCs w:val="0"/>
+                <w:sz w:val="20"/>
+                <w:szCs w:val="20"/>
+                <w:lang w:val="fr-CA"/>
+              </w:rPr>
+              <w:t xml:space="preserve"> </w:t>
+            </w:r>
+            <w:r>
+              <w:rPr>
+                <w:rFonts w:ascii="Times New Roman" w:hAnsi="Times New Roman" w:cs="Times New Roman"/>
+                <w:b w:val="0"/>
+                <w:bCs w:val="0"/>
+                <w:sz w:val="20"/>
+                <w:szCs w:val="20"/>
+                <w:lang w:val="fr-CA"/>
+              </w:rPr>
+              <w:t>Time</w:t>
+            </w:r>
+          </w:p>
+        </w:tc>
+        <w:tc>
+          <w:tcPr>
+            <w:tcW w:w="1150" w:type="dxa"/>
+          </w:tcPr>
+          <w:p>
+            <w:pPr>
+              <w:jc w:val="center"/>
+              <w:cnfStyle w:val="000000000000" w:firstRow="0" w:lastRow="0" w:firstColumn="0" w:lastColumn="0" w:oddVBand="0" w:evenVBand="0" w:oddHBand="0" w:evenHBand="0" w:firstRowFirstColumn="0" w:firstRowLastColumn="0" w:lastRowFirstColumn="0" w:lastRowLastColumn="0"/>
+              <w:rPr>
+                <w:rFonts w:ascii="Times New Roman" w:hAnsi="Times New Roman" w:cs="Times New Roman"/>
+                <w:sz w:val="20"/>
+                <w:szCs w:val="20"/>
+                <w:lang w:val="fr-CA"/>
+              </w:rPr>
+            </w:pPr>
+            <w:r>
+              <w:rPr>
+                <w:rFonts w:ascii="Times New Roman" w:hAnsi="Times New Roman" w:cs="Times New Roman"/>
+                <w:sz w:val="20"/>
+                <w:szCs w:val="20"/>
+                <w:lang w:val="fr-CA"/>
+              </w:rPr>
+              <w:t>1.6</w:t>
+            </w:r>
+          </w:p>
+        </w:tc>
+        <w:tc>
+          <w:tcPr>
+            <w:tcW w:w="1151" w:type="dxa"/>
+          </w:tcPr>
+          <w:p>
+            <w:pPr>
+              <w:jc w:val="center"/>
+              <w:cnfStyle w:val="000000000000" w:firstRow="0" w:lastRow="0" w:firstColumn="0" w:lastColumn="0" w:oddVBand="0" w:evenVBand="0" w:oddHBand="0" w:evenHBand="0" w:firstRowFirstColumn="0" w:firstRowLastColumn="0" w:lastRowFirstColumn="0" w:lastRowLastColumn="0"/>
+              <w:rPr>
+                <w:rFonts w:ascii="Times New Roman" w:hAnsi="Times New Roman" w:cs="Times New Roman"/>
+                <w:sz w:val="20"/>
+                <w:szCs w:val="20"/>
+                <w:lang w:val="fr-CA"/>
+              </w:rPr>
+            </w:pPr>
+            <w:r>
+              <w:rPr>
+                <w:rFonts w:ascii="Times New Roman" w:hAnsi="Times New Roman" w:cs="Times New Roman"/>
+                <w:sz w:val="20"/>
+                <w:szCs w:val="20"/>
+                <w:lang w:val="fr-CA"/>
+              </w:rPr>
+              <w:t>2.6</w:t>
+            </w:r>
+          </w:p>
+        </w:tc>
+        <w:tc>
+          <w:tcPr>
+            <w:tcW w:w="1151" w:type="dxa"/>
+          </w:tcPr>
+          <w:p>
+            <w:pPr>
+              <w:jc w:val="center"/>
+              <w:cnfStyle w:val="000000000000" w:firstRow="0" w:lastRow="0" w:firstColumn="0" w:lastColumn="0" w:oddVBand="0" w:evenVBand="0" w:oddHBand="0" w:evenHBand="0" w:firstRowFirstColumn="0" w:firstRowLastColumn="0" w:lastRowFirstColumn="0" w:lastRowLastColumn="0"/>
+              <w:rPr>
+                <w:rFonts w:ascii="Times New Roman" w:hAnsi="Times New Roman" w:cs="Times New Roman"/>
+                <w:sz w:val="20"/>
+                <w:szCs w:val="20"/>
+                <w:lang w:val="fr-CA"/>
+              </w:rPr>
+            </w:pPr>
+            <w:r>
+              <w:rPr>
+                <w:rFonts w:ascii="Times New Roman" w:hAnsi="Times New Roman" w:cs="Times New Roman"/>
+                <w:sz w:val="20"/>
+                <w:szCs w:val="20"/>
+                <w:lang w:val="fr-CA"/>
+              </w:rPr>
+              <w:t>3.3</w:t>
+            </w:r>
+          </w:p>
+        </w:tc>
+        <w:tc>
+          <w:tcPr>
+            <w:tcW w:w="1151" w:type="dxa"/>
+          </w:tcPr>
+          <w:p>
+            <w:pPr>
+              <w:jc w:val="center"/>
+              <w:cnfStyle w:val="000000000000" w:firstRow="0" w:lastRow="0" w:firstColumn="0" w:lastColumn="0" w:oddVBand="0" w:evenVBand="0" w:oddHBand="0" w:evenHBand="0" w:firstRowFirstColumn="0" w:firstRowLastColumn="0" w:lastRowFirstColumn="0" w:lastRowLastColumn="0"/>
+              <w:rPr>
+                <w:rFonts w:ascii="Times New Roman" w:hAnsi="Times New Roman" w:cs="Times New Roman"/>
+                <w:sz w:val="20"/>
+                <w:szCs w:val="20"/>
+                <w:lang w:val="fr-CA"/>
+              </w:rPr>
+            </w:pPr>
+            <w:r>
+              <w:rPr>
+                <w:rFonts w:ascii="Times New Roman" w:hAnsi="Times New Roman" w:cs="Times New Roman"/>
+                <w:sz w:val="20"/>
+                <w:szCs w:val="20"/>
+                <w:lang w:val="fr-CA"/>
+              </w:rPr>
+              <w:t>3.2</w:t>
+            </w:r>
+          </w:p>
+        </w:tc>
+        <w:tc>
+          <w:tcPr>
+            <w:tcW w:w="1067" w:type="dxa"/>
+          </w:tcPr>
+          <w:p>
+            <w:pPr>
+              <w:jc w:val="center"/>
+              <w:cnfStyle w:val="000000000000" w:firstRow="0" w:lastRow="0" w:firstColumn="0" w:lastColumn="0" w:oddVBand="0" w:evenVBand="0" w:oddHBand="0" w:evenHBand="0" w:firstRowFirstColumn="0" w:firstRowLastColumn="0" w:lastRowFirstColumn="0" w:lastRowLastColumn="0"/>
+              <w:rPr>
+                <w:rFonts w:ascii="Times New Roman" w:hAnsi="Times New Roman" w:cs="Times New Roman"/>
+                <w:sz w:val="20"/>
+                <w:szCs w:val="20"/>
+                <w:lang w:val="fr-CA"/>
+              </w:rPr>
+            </w:pPr>
+            <w:r>
+              <w:rPr>
+                <w:rFonts w:ascii="Times New Roman" w:hAnsi="Times New Roman" w:cs="Times New Roman"/>
+                <w:sz w:val="20"/>
+                <w:szCs w:val="20"/>
+                <w:lang w:val="fr-CA"/>
+              </w:rPr>
+              <w:t>4.0</w:t>
+            </w:r>
+          </w:p>
+        </w:tc>
+        <w:tc>
+          <w:tcPr>
+            <w:tcW w:w="910" w:type="dxa"/>
+          </w:tcPr>
+          <w:p>
+            <w:pPr>
+              <w:jc w:val="center"/>
+              <w:cnfStyle w:val="000000000000" w:firstRow="0" w:lastRow="0" w:firstColumn="0" w:lastColumn="0" w:oddVBand="0" w:evenVBand="0" w:oddHBand="0" w:evenHBand="0" w:firstRowFirstColumn="0" w:firstRowLastColumn="0" w:lastRowFirstColumn="0" w:lastRowLastColumn="0"/>
+              <w:rPr>
+                <w:rFonts w:ascii="Times New Roman" w:hAnsi="Times New Roman" w:cs="Times New Roman"/>
+                <w:sz w:val="20"/>
+                <w:szCs w:val="20"/>
+                <w:lang w:val="fr-CA"/>
+              </w:rPr>
+            </w:pPr>
+            <w:r>
+              <w:rPr>
+                <w:rFonts w:ascii="Times New Roman" w:hAnsi="Times New Roman" w:cs="Times New Roman"/>
+                <w:sz w:val="20"/>
+                <w:szCs w:val="20"/>
+                <w:lang w:val="fr-CA"/>
+              </w:rPr>
+              <w:t>4.5</w:t>
+            </w:r>
+          </w:p>
+        </w:tc>
+      </w:tr>
+      <w:tr>
+        <w:trPr>
+          <w:cnfStyle w:val="000000100000" w:firstRow="0" w:lastRow="0" w:firstColumn="0" w:lastColumn="0" w:oddVBand="0" w:evenVBand="0" w:oddHBand="1" w:evenHBand="0" w:firstRowFirstColumn="0" w:firstRowLastColumn="0" w:lastRowFirstColumn="0" w:lastRowLastColumn="0"/>
+        </w:trPr>
+        <w:tc>
+          <w:tcPr>
+            <w:cnfStyle w:val="001000000000" w:firstRow="0" w:lastRow="0" w:firstColumn="1" w:lastColumn="0" w:oddVBand="0" w:evenVBand="0" w:oddHBand="0" w:evenHBand="0" w:firstRowFirstColumn="0" w:firstRowLastColumn="0" w:lastRowFirstColumn="0" w:lastRowLastColumn="0"/>
+            <w:tcW w:w="2552" w:type="dxa"/>
+          </w:tcPr>
+          <w:p>
+            <w:pPr>
+              <w:jc w:val="both"/>
+              <w:rPr>
+                <w:rFonts w:ascii="Times New Roman" w:hAnsi="Times New Roman" w:cs="Times New Roman"/>
+                <w:b w:val="0"/>
+                <w:bCs w:val="0"/>
+                <w:sz w:val="20"/>
+                <w:szCs w:val="20"/>
+                <w:lang w:val="fr-CA"/>
+              </w:rPr>
+            </w:pPr>
+            <w:proofErr w:type="spellStart"/>
+            <w:r>
+              <w:rPr>
+                <w:rFonts w:ascii="Times New Roman" w:hAnsi="Times New Roman" w:cs="Times New Roman"/>
+                <w:b w:val="0"/>
+                <w:bCs w:val="0"/>
+                <w:sz w:val="20"/>
+                <w:szCs w:val="20"/>
+                <w:lang w:val="fr-CA"/>
+              </w:rPr>
+              <w:t>NBack</w:t>
+            </w:r>
+            <w:proofErr w:type="spellEnd"/>
+            <w:r>
+              <w:rPr>
+                <w:rFonts w:ascii="Times New Roman" w:hAnsi="Times New Roman" w:cs="Times New Roman"/>
+                <w:b w:val="0"/>
+                <w:bCs w:val="0"/>
+                <w:sz w:val="20"/>
+                <w:szCs w:val="20"/>
+                <w:lang w:val="fr-CA"/>
+              </w:rPr>
+              <w:t xml:space="preserve"> </w:t>
+            </w:r>
+            <w:proofErr w:type="spellStart"/>
+            <w:r>
+              <w:rPr>
+                <w:rFonts w:ascii="Times New Roman" w:hAnsi="Times New Roman" w:cs="Times New Roman"/>
+                <w:b w:val="0"/>
+                <w:bCs w:val="0"/>
+                <w:sz w:val="20"/>
+                <w:szCs w:val="20"/>
+                <w:lang w:val="fr-CA"/>
+              </w:rPr>
+              <w:t>Accuracy</w:t>
+            </w:r>
+            <w:proofErr w:type="spellEnd"/>
+          </w:p>
+        </w:tc>
+        <w:tc>
+          <w:tcPr>
+            <w:tcW w:w="1150" w:type="dxa"/>
+          </w:tcPr>
+          <w:p>
+            <w:pPr>
+              <w:jc w:val="center"/>
+              <w:cnfStyle w:val="000000100000" w:firstRow="0" w:lastRow="0" w:firstColumn="0" w:lastColumn="0" w:oddVBand="0" w:evenVBand="0" w:oddHBand="1" w:evenHBand="0" w:firstRowFirstColumn="0" w:firstRowLastColumn="0" w:lastRowFirstColumn="0" w:lastRowLastColumn="0"/>
+              <w:rPr>
+                <w:rFonts w:ascii="Times New Roman" w:hAnsi="Times New Roman" w:cs="Times New Roman"/>
+                <w:sz w:val="20"/>
+                <w:szCs w:val="20"/>
+                <w:lang w:val="fr-CA"/>
+              </w:rPr>
+            </w:pPr>
+            <w:r>
+              <w:rPr>
+                <w:rFonts w:ascii="Times New Roman" w:hAnsi="Times New Roman" w:cs="Times New Roman"/>
+                <w:sz w:val="20"/>
+                <w:szCs w:val="20"/>
+                <w:lang w:val="fr-CA"/>
+              </w:rPr>
+              <w:t>50.9</w:t>
+            </w:r>
+          </w:p>
+        </w:tc>
+        <w:tc>
+          <w:tcPr>
+            <w:tcW w:w="1151" w:type="dxa"/>
+          </w:tcPr>
+          <w:p>
+            <w:pPr>
+              <w:jc w:val="center"/>
+              <w:cnfStyle w:val="000000100000" w:firstRow="0" w:lastRow="0" w:firstColumn="0" w:lastColumn="0" w:oddVBand="0" w:evenVBand="0" w:oddHBand="1" w:evenHBand="0" w:firstRowFirstColumn="0" w:firstRowLastColumn="0" w:lastRowFirstColumn="0" w:lastRowLastColumn="0"/>
+              <w:rPr>
+                <w:rFonts w:ascii="Times New Roman" w:hAnsi="Times New Roman" w:cs="Times New Roman"/>
+                <w:sz w:val="20"/>
+                <w:szCs w:val="20"/>
+                <w:lang w:val="fr-CA"/>
+              </w:rPr>
+            </w:pPr>
+            <w:r>
+              <w:rPr>
+                <w:rFonts w:ascii="Times New Roman" w:hAnsi="Times New Roman" w:cs="Times New Roman"/>
+                <w:sz w:val="20"/>
+                <w:szCs w:val="20"/>
+                <w:lang w:val="fr-CA"/>
+              </w:rPr>
+              <w:t>64.6</w:t>
+            </w:r>
+          </w:p>
+        </w:tc>
+        <w:tc>
+          <w:tcPr>
+            <w:tcW w:w="1151" w:type="dxa"/>
+          </w:tcPr>
+          <w:p>
+            <w:pPr>
+              <w:jc w:val="center"/>
+              <w:cnfStyle w:val="000000100000" w:firstRow="0" w:lastRow="0" w:firstColumn="0" w:lastColumn="0" w:oddVBand="0" w:evenVBand="0" w:oddHBand="1" w:evenHBand="0" w:firstRowFirstColumn="0" w:firstRowLastColumn="0" w:lastRowFirstColumn="0" w:lastRowLastColumn="0"/>
+              <w:rPr>
+                <w:rFonts w:ascii="Times New Roman" w:hAnsi="Times New Roman" w:cs="Times New Roman"/>
+                <w:sz w:val="20"/>
+                <w:szCs w:val="20"/>
+                <w:lang w:val="fr-CA"/>
+              </w:rPr>
+            </w:pPr>
+            <w:r>
+              <w:rPr>
+                <w:rFonts w:ascii="Times New Roman" w:hAnsi="Times New Roman" w:cs="Times New Roman"/>
+                <w:sz w:val="20"/>
+                <w:szCs w:val="20"/>
+                <w:lang w:val="fr-CA"/>
+              </w:rPr>
+              <w:t>74.3</w:t>
+            </w:r>
+          </w:p>
+        </w:tc>
+        <w:tc>
+          <w:tcPr>
+            <w:tcW w:w="1151" w:type="dxa"/>
+          </w:tcPr>
+          <w:p>
+            <w:pPr>
+              <w:jc w:val="center"/>
+              <w:cnfStyle w:val="000000100000" w:firstRow="0" w:lastRow="0" w:firstColumn="0" w:lastColumn="0" w:oddVBand="0" w:evenVBand="0" w:oddHBand="1" w:evenHBand="0" w:firstRowFirstColumn="0" w:firstRowLastColumn="0" w:lastRowFirstColumn="0" w:lastRowLastColumn="0"/>
+              <w:rPr>
+                <w:rFonts w:ascii="Times New Roman" w:hAnsi="Times New Roman" w:cs="Times New Roman"/>
+                <w:sz w:val="20"/>
+                <w:szCs w:val="20"/>
+                <w:lang w:val="fr-CA"/>
+              </w:rPr>
+            </w:pPr>
+            <w:r>
+              <w:rPr>
+                <w:rFonts w:ascii="Times New Roman" w:hAnsi="Times New Roman" w:cs="Times New Roman"/>
+                <w:sz w:val="20"/>
+                <w:szCs w:val="20"/>
+                <w:lang w:val="fr-CA"/>
+              </w:rPr>
+              <w:t>75.0</w:t>
+            </w:r>
+          </w:p>
+        </w:tc>
+        <w:tc>
+          <w:tcPr>
+            <w:tcW w:w="1067" w:type="dxa"/>
+          </w:tcPr>
+          <w:p>
+            <w:pPr>
+              <w:jc w:val="center"/>
+              <w:cnfStyle w:val="000000100000" w:firstRow="0" w:lastRow="0" w:firstColumn="0" w:lastColumn="0" w:oddVBand="0" w:evenVBand="0" w:oddHBand="1" w:evenHBand="0" w:firstRowFirstColumn="0" w:firstRowLastColumn="0" w:lastRowFirstColumn="0" w:lastRowLastColumn="0"/>
+              <w:rPr>
+                <w:rFonts w:ascii="Times New Roman" w:hAnsi="Times New Roman" w:cs="Times New Roman"/>
+                <w:sz w:val="20"/>
+                <w:szCs w:val="20"/>
+                <w:lang w:val="fr-CA"/>
+              </w:rPr>
+            </w:pPr>
+            <w:r>
+              <w:rPr>
+                <w:rFonts w:ascii="Times New Roman" w:hAnsi="Times New Roman" w:cs="Times New Roman"/>
+                <w:sz w:val="20"/>
+                <w:szCs w:val="20"/>
+                <w:lang w:val="fr-CA"/>
+              </w:rPr>
+              <w:t>85.6</w:t>
+            </w:r>
+          </w:p>
+        </w:tc>
+        <w:tc>
+          <w:tcPr>
+            <w:tcW w:w="910" w:type="dxa"/>
+          </w:tcPr>
+          <w:p>
+            <w:pPr>
+              <w:jc w:val="center"/>
+              <w:cnfStyle w:val="000000100000" w:firstRow="0" w:lastRow="0" w:firstColumn="0" w:lastColumn="0" w:oddVBand="0" w:evenVBand="0" w:oddHBand="1" w:evenHBand="0" w:firstRowFirstColumn="0" w:firstRowLastColumn="0" w:lastRowFirstColumn="0" w:lastRowLastColumn="0"/>
+              <w:rPr>
+                <w:rFonts w:ascii="Times New Roman" w:hAnsi="Times New Roman" w:cs="Times New Roman"/>
+                <w:sz w:val="20"/>
+                <w:szCs w:val="20"/>
+                <w:lang w:val="fr-CA"/>
+              </w:rPr>
+            </w:pPr>
+            <w:r>
+              <w:rPr>
+                <w:rFonts w:ascii="Times New Roman" w:hAnsi="Times New Roman" w:cs="Times New Roman"/>
+                <w:sz w:val="20"/>
+                <w:szCs w:val="20"/>
+                <w:lang w:val="fr-CA"/>
+              </w:rPr>
+              <w:t>99.7</w:t>
+            </w:r>
+          </w:p>
+        </w:tc>
+      </w:tr>
+      <w:tr>
+        <w:tc>
+          <w:tcPr>
+            <w:cnfStyle w:val="001000000000" w:firstRow="0" w:lastRow="0" w:firstColumn="1" w:lastColumn="0" w:oddVBand="0" w:evenVBand="0" w:oddHBand="0" w:evenHBand="0" w:firstRowFirstColumn="0" w:firstRowLastColumn="0" w:lastRowFirstColumn="0" w:lastRowLastColumn="0"/>
+            <w:tcW w:w="2552" w:type="dxa"/>
+          </w:tcPr>
+          <w:p>
+            <w:pPr>
+              <w:jc w:val="both"/>
+              <w:rPr>
+                <w:rFonts w:ascii="Times New Roman" w:hAnsi="Times New Roman" w:cs="Times New Roman"/>
+                <w:b w:val="0"/>
+                <w:bCs w:val="0"/>
+                <w:sz w:val="20"/>
+                <w:szCs w:val="20"/>
+                <w:lang w:val="fr-CA"/>
+              </w:rPr>
+            </w:pPr>
+            <w:r>
+              <w:rPr>
+                <w:rFonts w:ascii="Times New Roman" w:hAnsi="Times New Roman" w:cs="Times New Roman" w:hint="eastAsia"/>
+                <w:b w:val="0"/>
+                <w:bCs w:val="0"/>
+                <w:sz w:val="20"/>
+                <w:szCs w:val="20"/>
+              </w:rPr>
+              <w:t>Emotion</w:t>
+            </w:r>
+            <w:r>
+              <w:rPr>
+                <w:rFonts w:ascii="Times New Roman" w:hAnsi="Times New Roman" w:cs="Times New Roman"/>
+                <w:b w:val="0"/>
+                <w:bCs w:val="0"/>
+                <w:sz w:val="20"/>
+                <w:szCs w:val="20"/>
+              </w:rPr>
+              <w:t xml:space="preserve"> </w:t>
+            </w:r>
+            <w:proofErr w:type="spellStart"/>
+            <w:r>
+              <w:rPr>
+                <w:rFonts w:ascii="Times New Roman" w:hAnsi="Times New Roman" w:cs="Times New Roman"/>
+                <w:b w:val="0"/>
+                <w:bCs w:val="0"/>
+                <w:sz w:val="20"/>
+                <w:szCs w:val="20"/>
+                <w:lang w:val="fr-CA"/>
+              </w:rPr>
+              <w:t>Regulation</w:t>
+            </w:r>
+            <w:proofErr w:type="spellEnd"/>
+            <w:r>
+              <w:rPr>
+                <w:rFonts w:ascii="Times New Roman" w:hAnsi="Times New Roman" w:cs="Times New Roman"/>
+                <w:b w:val="0"/>
+                <w:bCs w:val="0"/>
+                <w:sz w:val="20"/>
+                <w:szCs w:val="20"/>
+                <w:lang w:val="fr-CA"/>
+              </w:rPr>
+              <w:t xml:space="preserve"> </w:t>
+            </w:r>
+            <w:r>
+              <w:rPr>
+                <w:rFonts w:ascii="Times New Roman" w:hAnsi="Times New Roman" w:cs="Times New Roman"/>
+                <w:b w:val="0"/>
+                <w:bCs w:val="0"/>
+                <w:sz w:val="20"/>
+                <w:szCs w:val="20"/>
+                <w:lang w:val="fr-CA"/>
+              </w:rPr>
+              <w:t>Score</w:t>
+            </w:r>
+          </w:p>
+        </w:tc>
+        <w:tc>
+          <w:tcPr>
+            <w:tcW w:w="1150" w:type="dxa"/>
+          </w:tcPr>
+          <w:p>
+            <w:pPr>
+              <w:jc w:val="center"/>
+              <w:cnfStyle w:val="000000000000" w:firstRow="0" w:lastRow="0" w:firstColumn="0" w:lastColumn="0" w:oddVBand="0" w:evenVBand="0" w:oddHBand="0" w:evenHBand="0" w:firstRowFirstColumn="0" w:firstRowLastColumn="0" w:lastRowFirstColumn="0" w:lastRowLastColumn="0"/>
+              <w:rPr>
+                <w:rFonts w:ascii="Times New Roman" w:hAnsi="Times New Roman" w:cs="Times New Roman"/>
+                <w:sz w:val="20"/>
+                <w:szCs w:val="20"/>
+                <w:lang w:val="fr-CA"/>
+              </w:rPr>
+            </w:pPr>
+            <w:r>
+              <w:rPr>
+                <w:rFonts w:ascii="Times New Roman" w:hAnsi="Times New Roman" w:cs="Times New Roman"/>
+                <w:sz w:val="20"/>
+                <w:szCs w:val="20"/>
+                <w:lang w:val="fr-CA"/>
+              </w:rPr>
+              <w:t>10.0</w:t>
+            </w:r>
+          </w:p>
+        </w:tc>
+        <w:tc>
+          <w:tcPr>
+            <w:tcW w:w="1151" w:type="dxa"/>
+          </w:tcPr>
+          <w:p>
+            <w:pPr>
+              <w:jc w:val="center"/>
+              <w:cnfStyle w:val="000000000000" w:firstRow="0" w:lastRow="0" w:firstColumn="0" w:lastColumn="0" w:oddVBand="0" w:evenVBand="0" w:oddHBand="0" w:evenHBand="0" w:firstRowFirstColumn="0" w:firstRowLastColumn="0" w:lastRowFirstColumn="0" w:lastRowLastColumn="0"/>
+              <w:rPr>
+                <w:rFonts w:ascii="Times New Roman" w:hAnsi="Times New Roman" w:cs="Times New Roman"/>
+                <w:sz w:val="20"/>
+                <w:szCs w:val="20"/>
+                <w:lang w:val="fr-CA"/>
+              </w:rPr>
+            </w:pPr>
+            <w:r>
+              <w:rPr>
+                <w:rFonts w:ascii="Times New Roman" w:hAnsi="Times New Roman" w:cs="Times New Roman"/>
+                <w:sz w:val="20"/>
+                <w:szCs w:val="20"/>
+                <w:lang w:val="fr-CA"/>
+              </w:rPr>
+              <w:t>25.0</w:t>
+            </w:r>
+          </w:p>
+        </w:tc>
+        <w:tc>
+          <w:tcPr>
+            <w:tcW w:w="1151" w:type="dxa"/>
+          </w:tcPr>
+          <w:p>
+            <w:pPr>
+              <w:jc w:val="center"/>
+              <w:cnfStyle w:val="000000000000" w:firstRow="0" w:lastRow="0" w:firstColumn="0" w:lastColumn="0" w:oddVBand="0" w:evenVBand="0" w:oddHBand="0" w:evenHBand="0" w:firstRowFirstColumn="0" w:firstRowLastColumn="0" w:lastRowFirstColumn="0" w:lastRowLastColumn="0"/>
+              <w:rPr>
+                <w:rFonts w:ascii="Times New Roman" w:hAnsi="Times New Roman" w:cs="Times New Roman"/>
+                <w:sz w:val="20"/>
+                <w:szCs w:val="20"/>
+                <w:lang w:val="fr-CA"/>
+              </w:rPr>
+            </w:pPr>
+            <w:r>
+              <w:rPr>
+                <w:rFonts w:ascii="Times New Roman" w:hAnsi="Times New Roman" w:cs="Times New Roman"/>
+                <w:sz w:val="20"/>
+                <w:szCs w:val="20"/>
+                <w:lang w:val="fr-CA"/>
+              </w:rPr>
+              <w:t>37.0</w:t>
+            </w:r>
+          </w:p>
+        </w:tc>
+        <w:tc>
+          <w:tcPr>
+            <w:tcW w:w="1151" w:type="dxa"/>
+          </w:tcPr>
+          <w:p>
+            <w:pPr>
+              <w:jc w:val="center"/>
+              <w:cnfStyle w:val="000000000000" w:firstRow="0" w:lastRow="0" w:firstColumn="0" w:lastColumn="0" w:oddVBand="0" w:evenVBand="0" w:oddHBand="0" w:evenHBand="0" w:firstRowFirstColumn="0" w:firstRowLastColumn="0" w:lastRowFirstColumn="0" w:lastRowLastColumn="0"/>
+              <w:rPr>
+                <w:rFonts w:ascii="Times New Roman" w:hAnsi="Times New Roman" w:cs="Times New Roman"/>
+                <w:sz w:val="20"/>
+                <w:szCs w:val="20"/>
+                <w:lang w:val="fr-CA"/>
+              </w:rPr>
+            </w:pPr>
+            <w:r>
+              <w:rPr>
+                <w:rFonts w:ascii="Times New Roman" w:hAnsi="Times New Roman" w:cs="Times New Roman"/>
+                <w:sz w:val="20"/>
+                <w:szCs w:val="20"/>
+                <w:lang w:val="fr-CA"/>
+              </w:rPr>
+              <w:t>38.2</w:t>
+            </w:r>
+          </w:p>
+        </w:tc>
+        <w:tc>
+          <w:tcPr>
+            <w:tcW w:w="1067" w:type="dxa"/>
+          </w:tcPr>
+          <w:p>
+            <w:pPr>
+              <w:jc w:val="center"/>
+              <w:cnfStyle w:val="000000000000" w:firstRow="0" w:lastRow="0" w:firstColumn="0" w:lastColumn="0" w:oddVBand="0" w:evenVBand="0" w:oddHBand="0" w:evenHBand="0" w:firstRowFirstColumn="0" w:firstRowLastColumn="0" w:lastRowFirstColumn="0" w:lastRowLastColumn="0"/>
+              <w:rPr>
+                <w:rFonts w:ascii="Times New Roman" w:hAnsi="Times New Roman" w:cs="Times New Roman"/>
+                <w:sz w:val="20"/>
+                <w:szCs w:val="20"/>
+                <w:lang w:val="fr-CA"/>
+              </w:rPr>
+            </w:pPr>
+            <w:r>
+              <w:rPr>
+                <w:rFonts w:ascii="Times New Roman" w:hAnsi="Times New Roman" w:cs="Times New Roman"/>
+                <w:sz w:val="20"/>
+                <w:szCs w:val="20"/>
+                <w:lang w:val="fr-CA"/>
+              </w:rPr>
+              <w:t>54.3</w:t>
+            </w:r>
+          </w:p>
+        </w:tc>
+        <w:tc>
+          <w:tcPr>
+            <w:tcW w:w="910" w:type="dxa"/>
+          </w:tcPr>
+          <w:p>
+            <w:pPr>
+              <w:jc w:val="center"/>
+              <w:cnfStyle w:val="000000000000" w:firstRow="0" w:lastRow="0" w:firstColumn="0" w:lastColumn="0" w:oddVBand="0" w:evenVBand="0" w:oddHBand="0" w:evenHBand="0" w:firstRowFirstColumn="0" w:firstRowLastColumn="0" w:lastRowFirstColumn="0" w:lastRowLastColumn="0"/>
+              <w:rPr>
+                <w:rFonts w:ascii="Times New Roman" w:hAnsi="Times New Roman" w:cs="Times New Roman"/>
+                <w:sz w:val="20"/>
+                <w:szCs w:val="20"/>
+                <w:lang w:val="fr-CA"/>
+              </w:rPr>
+            </w:pPr>
+            <w:r>
+              <w:rPr>
+                <w:rFonts w:ascii="Times New Roman" w:hAnsi="Times New Roman" w:cs="Times New Roman"/>
+                <w:sz w:val="20"/>
+                <w:szCs w:val="20"/>
+                <w:lang w:val="fr-CA"/>
+              </w:rPr>
+              <w:t>67.0</w:t>
+            </w:r>
+          </w:p>
+        </w:tc>
+      </w:tr>
+      <w:tr>
+        <w:trPr>
+          <w:cnfStyle w:val="000000100000" w:firstRow="0" w:lastRow="0" w:firstColumn="0" w:lastColumn="0" w:oddVBand="0" w:evenVBand="0" w:oddHBand="1" w:evenHBand="0" w:firstRowFirstColumn="0" w:firstRowLastColumn="0" w:lastRowFirstColumn="0" w:lastRowLastColumn="0"/>
+        </w:trPr>
+        <w:tc>
+          <w:tcPr>
+            <w:cnfStyle w:val="001000000000" w:firstRow="0" w:lastRow="0" w:firstColumn="1" w:lastColumn="0" w:oddVBand="0" w:evenVBand="0" w:oddHBand="0" w:evenHBand="0" w:firstRowFirstColumn="0" w:firstRowLastColumn="0" w:lastRowFirstColumn="0" w:lastRowLastColumn="0"/>
+            <w:tcW w:w="2552" w:type="dxa"/>
+          </w:tcPr>
+          <w:p>
+            <w:pPr>
+              <w:jc w:val="both"/>
+              <w:rPr>
+                <w:rFonts w:ascii="Times New Roman" w:hAnsi="Times New Roman" w:cs="Times New Roman"/>
+                <w:b w:val="0"/>
+                <w:bCs w:val="0"/>
+                <w:sz w:val="20"/>
+                <w:szCs w:val="20"/>
+                <w:lang w:val="fr-CA"/>
+              </w:rPr>
+            </w:pPr>
+            <w:r>
+              <w:rPr>
+                <w:rFonts w:ascii="Times New Roman" w:hAnsi="Times New Roman" w:cs="Times New Roman"/>
+                <w:b w:val="0"/>
+                <w:bCs w:val="0"/>
+                <w:sz w:val="20"/>
+                <w:szCs w:val="20"/>
+                <w:lang w:val="fr-CA"/>
+              </w:rPr>
+              <w:t>PVT</w:t>
+            </w:r>
+            <w:r>
+              <w:rPr>
+                <w:rFonts w:ascii="Times New Roman" w:hAnsi="Times New Roman" w:cs="Times New Roman"/>
+                <w:b w:val="0"/>
+                <w:bCs w:val="0"/>
+                <w:sz w:val="20"/>
+                <w:szCs w:val="20"/>
+                <w:lang w:val="fr-CA"/>
+              </w:rPr>
+              <w:t xml:space="preserve"> </w:t>
+            </w:r>
+            <w:proofErr w:type="spellStart"/>
+            <w:r>
+              <w:rPr>
+                <w:rFonts w:ascii="Times New Roman" w:hAnsi="Times New Roman" w:cs="Times New Roman"/>
+                <w:b w:val="0"/>
+                <w:bCs w:val="0"/>
+                <w:sz w:val="20"/>
+                <w:szCs w:val="20"/>
+                <w:lang w:val="fr-CA"/>
+              </w:rPr>
+              <w:t>Reaction</w:t>
+            </w:r>
+            <w:proofErr w:type="spellEnd"/>
+            <w:r>
+              <w:rPr>
+                <w:rFonts w:ascii="Times New Roman" w:hAnsi="Times New Roman" w:cs="Times New Roman"/>
+                <w:b w:val="0"/>
+                <w:bCs w:val="0"/>
+                <w:sz w:val="20"/>
+                <w:szCs w:val="20"/>
+                <w:lang w:val="fr-CA"/>
+              </w:rPr>
+              <w:t xml:space="preserve"> </w:t>
+            </w:r>
+            <w:r>
+              <w:rPr>
+                <w:rFonts w:ascii="Times New Roman" w:hAnsi="Times New Roman" w:cs="Times New Roman"/>
+                <w:b w:val="0"/>
+                <w:bCs w:val="0"/>
+                <w:sz w:val="20"/>
+                <w:szCs w:val="20"/>
+                <w:lang w:val="fr-CA"/>
+              </w:rPr>
+              <w:t>Time</w:t>
+            </w:r>
+          </w:p>
+        </w:tc>
+        <w:tc>
+          <w:tcPr>
+            <w:tcW w:w="1150" w:type="dxa"/>
+          </w:tcPr>
+          <w:p>
+            <w:pPr>
+              <w:jc w:val="center"/>
+              <w:cnfStyle w:val="000000100000" w:firstRow="0" w:lastRow="0" w:firstColumn="0" w:lastColumn="0" w:oddVBand="0" w:evenVBand="0" w:oddHBand="1" w:evenHBand="0" w:firstRowFirstColumn="0" w:firstRowLastColumn="0" w:lastRowFirstColumn="0" w:lastRowLastColumn="0"/>
+              <w:rPr>
+                <w:rFonts w:ascii="Times New Roman" w:hAnsi="Times New Roman" w:cs="Times New Roman"/>
+                <w:sz w:val="20"/>
+                <w:szCs w:val="20"/>
+                <w:lang w:val="fr-CA"/>
+              </w:rPr>
+            </w:pPr>
+            <w:r>
+              <w:rPr>
+                <w:rFonts w:ascii="Times New Roman" w:hAnsi="Times New Roman" w:cs="Times New Roman"/>
+                <w:sz w:val="20"/>
+                <w:szCs w:val="20"/>
+                <w:lang w:val="fr-CA"/>
+              </w:rPr>
+              <w:t>201.6</w:t>
+            </w:r>
+          </w:p>
+        </w:tc>
+        <w:tc>
+          <w:tcPr>
+            <w:tcW w:w="1151" w:type="dxa"/>
+          </w:tcPr>
+          <w:p>
+            <w:pPr>
+              <w:jc w:val="center"/>
+              <w:cnfStyle w:val="000000100000" w:firstRow="0" w:lastRow="0" w:firstColumn="0" w:lastColumn="0" w:oddVBand="0" w:evenVBand="0" w:oddHBand="1" w:evenHBand="0" w:firstRowFirstColumn="0" w:firstRowLastColumn="0" w:lastRowFirstColumn="0" w:lastRowLastColumn="0"/>
+              <w:rPr>
+                <w:rFonts w:ascii="Times New Roman" w:hAnsi="Times New Roman" w:cs="Times New Roman"/>
+                <w:sz w:val="20"/>
+                <w:szCs w:val="20"/>
+                <w:lang w:val="fr-CA"/>
+              </w:rPr>
+            </w:pPr>
+            <w:r>
+              <w:rPr>
+                <w:rFonts w:ascii="Times New Roman" w:hAnsi="Times New Roman" w:cs="Times New Roman"/>
+                <w:sz w:val="20"/>
+                <w:szCs w:val="20"/>
+                <w:lang w:val="fr-CA"/>
+              </w:rPr>
+              <w:t>257.5</w:t>
+            </w:r>
+          </w:p>
+        </w:tc>
+        <w:tc>
+          <w:tcPr>
+            <w:tcW w:w="1151" w:type="dxa"/>
+          </w:tcPr>
+          <w:p>
+            <w:pPr>
+              <w:jc w:val="center"/>
+              <w:cnfStyle w:val="000000100000" w:firstRow="0" w:lastRow="0" w:firstColumn="0" w:lastColumn="0" w:oddVBand="0" w:evenVBand="0" w:oddHBand="1" w:evenHBand="0" w:firstRowFirstColumn="0" w:firstRowLastColumn="0" w:lastRowFirstColumn="0" w:lastRowLastColumn="0"/>
+              <w:rPr>
+                <w:rFonts w:ascii="Times New Roman" w:hAnsi="Times New Roman" w:cs="Times New Roman"/>
+                <w:sz w:val="20"/>
+                <w:szCs w:val="20"/>
+                <w:lang w:val="fr-CA"/>
+              </w:rPr>
+            </w:pPr>
+            <w:r>
+              <w:rPr>
+                <w:rFonts w:ascii="Times New Roman" w:hAnsi="Times New Roman" w:cs="Times New Roman"/>
+                <w:sz w:val="20"/>
+                <w:szCs w:val="20"/>
+                <w:lang w:val="fr-CA"/>
+              </w:rPr>
+              <w:t>327.2</w:t>
+            </w:r>
+          </w:p>
+        </w:tc>
+        <w:tc>
+          <w:tcPr>
+            <w:tcW w:w="1151" w:type="dxa"/>
+          </w:tcPr>
+          <w:p>
+            <w:pPr>
+              <w:jc w:val="center"/>
+              <w:cnfStyle w:val="000000100000" w:firstRow="0" w:lastRow="0" w:firstColumn="0" w:lastColumn="0" w:oddVBand="0" w:evenVBand="0" w:oddHBand="1" w:evenHBand="0" w:firstRowFirstColumn="0" w:firstRowLastColumn="0" w:lastRowFirstColumn="0" w:lastRowLastColumn="0"/>
+              <w:rPr>
+                <w:rFonts w:ascii="Times New Roman" w:hAnsi="Times New Roman" w:cs="Times New Roman"/>
+                <w:sz w:val="20"/>
+                <w:szCs w:val="20"/>
+                <w:lang w:val="fr-CA"/>
+              </w:rPr>
+            </w:pPr>
+            <w:r>
+              <w:rPr>
+                <w:rFonts w:ascii="Times New Roman" w:hAnsi="Times New Roman" w:cs="Times New Roman"/>
+                <w:sz w:val="20"/>
+                <w:szCs w:val="20"/>
+                <w:lang w:val="fr-CA"/>
+              </w:rPr>
+              <w:t>332.5</w:t>
+            </w:r>
+          </w:p>
+        </w:tc>
+        <w:tc>
+          <w:tcPr>
+            <w:tcW w:w="1067" w:type="dxa"/>
+          </w:tcPr>
+          <w:p>
+            <w:pPr>
+              <w:jc w:val="center"/>
+              <w:cnfStyle w:val="000000100000" w:firstRow="0" w:lastRow="0" w:firstColumn="0" w:lastColumn="0" w:oddVBand="0" w:evenVBand="0" w:oddHBand="1" w:evenHBand="0" w:firstRowFirstColumn="0" w:firstRowLastColumn="0" w:lastRowFirstColumn="0" w:lastRowLastColumn="0"/>
+              <w:rPr>
+                <w:rFonts w:ascii="Times New Roman" w:hAnsi="Times New Roman" w:cs="Times New Roman"/>
+                <w:sz w:val="20"/>
+                <w:szCs w:val="20"/>
+                <w:lang w:val="fr-CA"/>
+              </w:rPr>
+            </w:pPr>
+            <w:r>
+              <w:rPr>
+                <w:rFonts w:ascii="Times New Roman" w:hAnsi="Times New Roman" w:cs="Times New Roman"/>
+                <w:sz w:val="20"/>
+                <w:szCs w:val="20"/>
+                <w:lang w:val="fr-CA"/>
+              </w:rPr>
+              <w:t>402.8</w:t>
+            </w:r>
+          </w:p>
+        </w:tc>
+        <w:tc>
+          <w:tcPr>
+            <w:tcW w:w="910" w:type="dxa"/>
+          </w:tcPr>
+          <w:p>
+            <w:pPr>
+              <w:jc w:val="center"/>
+              <w:cnfStyle w:val="000000100000" w:firstRow="0" w:lastRow="0" w:firstColumn="0" w:lastColumn="0" w:oddVBand="0" w:evenVBand="0" w:oddHBand="1" w:evenHBand="0" w:firstRowFirstColumn="0" w:firstRowLastColumn="0" w:lastRowFirstColumn="0" w:lastRowLastColumn="0"/>
+              <w:rPr>
+                <w:rFonts w:ascii="Times New Roman" w:hAnsi="Times New Roman" w:cs="Times New Roman"/>
+                <w:sz w:val="20"/>
+                <w:szCs w:val="20"/>
+                <w:lang w:val="fr-CA"/>
+              </w:rPr>
+            </w:pPr>
+            <w:r>
+              <w:rPr>
+                <w:rFonts w:ascii="Times New Roman" w:hAnsi="Times New Roman" w:cs="Times New Roman"/>
+                <w:sz w:val="20"/>
+                <w:szCs w:val="20"/>
+                <w:lang w:val="fr-CA"/>
+              </w:rPr>
+              <w:t>494.6</w:t>
+            </w:r>
+          </w:p>
+        </w:tc>
+      </w:tr>
+      <w:tr>
+        <w:tc>
+          <w:tcPr>
+            <w:cnfStyle w:val="001000000000" w:firstRow="0" w:lastRow="0" w:firstColumn="1" w:lastColumn="0" w:oddVBand="0" w:evenVBand="0" w:oddHBand="0" w:evenHBand="0" w:firstRowFirstColumn="0" w:firstRowLastColumn="0" w:lastRowFirstColumn="0" w:lastRowLastColumn="0"/>
+            <w:tcW w:w="2552" w:type="dxa"/>
+          </w:tcPr>
+          <w:p>
+            <w:pPr>
+              <w:jc w:val="both"/>
+              <w:rPr>
+                <w:rFonts w:ascii="Times New Roman" w:hAnsi="Times New Roman" w:cs="Times New Roman"/>
+                <w:b w:val="0"/>
+                <w:bCs w:val="0"/>
+                <w:sz w:val="20"/>
+                <w:szCs w:val="20"/>
+                <w:lang w:val="fr-CA"/>
+              </w:rPr>
+            </w:pPr>
+            <w:r>
+              <w:rPr>
+                <w:rFonts w:ascii="Times New Roman" w:hAnsi="Times New Roman" w:cs="Times New Roman"/>
+                <w:b w:val="0"/>
+                <w:bCs w:val="0"/>
+                <w:sz w:val="20"/>
+                <w:szCs w:val="20"/>
+                <w:lang w:val="fr-CA"/>
+              </w:rPr>
+              <w:t>Age</w:t>
+            </w:r>
+          </w:p>
+        </w:tc>
+        <w:tc>
+          <w:tcPr>
+            <w:tcW w:w="1150" w:type="dxa"/>
+          </w:tcPr>
+          <w:p>
+            <w:pPr>
+              <w:jc w:val="center"/>
+              <w:cnfStyle w:val="000000000000" w:firstRow="0" w:lastRow="0" w:firstColumn="0" w:lastColumn="0" w:oddVBand="0" w:evenVBand="0" w:oddHBand="0" w:evenHBand="0" w:firstRowFirstColumn="0" w:firstRowLastColumn="0" w:lastRowFirstColumn="0" w:lastRowLastColumn="0"/>
+              <w:rPr>
+                <w:rFonts w:ascii="Times New Roman" w:hAnsi="Times New Roman" w:cs="Times New Roman"/>
+                <w:sz w:val="20"/>
+                <w:szCs w:val="20"/>
+                <w:lang w:val="fr-CA"/>
+              </w:rPr>
+            </w:pPr>
+            <w:r>
+              <w:rPr>
+                <w:rFonts w:ascii="Times New Roman" w:hAnsi="Times New Roman" w:cs="Times New Roman"/>
+                <w:sz w:val="20"/>
+                <w:szCs w:val="20"/>
+                <w:lang w:val="fr-CA"/>
+              </w:rPr>
+              <w:t>18.0</w:t>
+            </w:r>
+          </w:p>
+        </w:tc>
+        <w:tc>
+          <w:tcPr>
+            <w:tcW w:w="1151" w:type="dxa"/>
+          </w:tcPr>
+          <w:p>
+            <w:pPr>
+              <w:jc w:val="center"/>
+              <w:cnfStyle w:val="000000000000" w:firstRow="0" w:lastRow="0" w:firstColumn="0" w:lastColumn="0" w:oddVBand="0" w:evenVBand="0" w:oddHBand="0" w:evenHBand="0" w:firstRowFirstColumn="0" w:firstRowLastColumn="0" w:lastRowFirstColumn="0" w:lastRowLastColumn="0"/>
+              <w:rPr>
+                <w:rFonts w:ascii="Times New Roman" w:hAnsi="Times New Roman" w:cs="Times New Roman"/>
+                <w:sz w:val="20"/>
+                <w:szCs w:val="20"/>
+                <w:lang w:val="fr-CA"/>
+              </w:rPr>
+            </w:pPr>
+            <w:r>
+              <w:rPr>
+                <w:rFonts w:ascii="Times New Roman" w:hAnsi="Times New Roman" w:cs="Times New Roman"/>
+                <w:sz w:val="20"/>
+                <w:szCs w:val="20"/>
+                <w:lang w:val="fr-CA"/>
+              </w:rPr>
+              <w:t>21.8</w:t>
+            </w:r>
+          </w:p>
+        </w:tc>
+        <w:tc>
+          <w:tcPr>
+            <w:tcW w:w="1151" w:type="dxa"/>
+          </w:tcPr>
+          <w:p>
+            <w:pPr>
+              <w:jc w:val="center"/>
+              <w:cnfStyle w:val="000000000000" w:firstRow="0" w:lastRow="0" w:firstColumn="0" w:lastColumn="0" w:oddVBand="0" w:evenVBand="0" w:oddHBand="0" w:evenHBand="0" w:firstRowFirstColumn="0" w:firstRowLastColumn="0" w:lastRowFirstColumn="0" w:lastRowLastColumn="0"/>
+              <w:rPr>
+                <w:rFonts w:ascii="Times New Roman" w:hAnsi="Times New Roman" w:cs="Times New Roman"/>
+                <w:sz w:val="20"/>
+                <w:szCs w:val="20"/>
+                <w:lang w:val="fr-CA"/>
+              </w:rPr>
+            </w:pPr>
+            <w:r>
+              <w:rPr>
+                <w:rFonts w:ascii="Times New Roman" w:hAnsi="Times New Roman" w:cs="Times New Roman"/>
+                <w:sz w:val="20"/>
+                <w:szCs w:val="20"/>
+                <w:lang w:val="fr-CA"/>
+              </w:rPr>
+              <w:t>28.5</w:t>
+            </w:r>
+          </w:p>
+        </w:tc>
+        <w:tc>
+          <w:tcPr>
+            <w:tcW w:w="1151" w:type="dxa"/>
+          </w:tcPr>
+          <w:p>
+            <w:pPr>
+              <w:jc w:val="center"/>
+              <w:cnfStyle w:val="000000000000" w:firstRow="0" w:lastRow="0" w:firstColumn="0" w:lastColumn="0" w:oddVBand="0" w:evenVBand="0" w:oddHBand="0" w:evenHBand="0" w:firstRowFirstColumn="0" w:firstRowLastColumn="0" w:lastRowFirstColumn="0" w:lastRowLastColumn="0"/>
+              <w:rPr>
+                <w:rFonts w:ascii="Times New Roman" w:hAnsi="Times New Roman" w:cs="Times New Roman"/>
+                <w:sz w:val="20"/>
+                <w:szCs w:val="20"/>
+                <w:lang w:val="fr-CA"/>
+              </w:rPr>
+            </w:pPr>
+            <w:r>
+              <w:rPr>
+                <w:rFonts w:ascii="Times New Roman" w:hAnsi="Times New Roman" w:cs="Times New Roman"/>
+                <w:sz w:val="20"/>
+                <w:szCs w:val="20"/>
+                <w:lang w:val="fr-CA"/>
+              </w:rPr>
+              <w:t>29.5</w:t>
+            </w:r>
+          </w:p>
+        </w:tc>
+        <w:tc>
+          <w:tcPr>
+            <w:tcW w:w="1067" w:type="dxa"/>
+          </w:tcPr>
+          <w:p>
+            <w:pPr>
+              <w:jc w:val="center"/>
+              <w:cnfStyle w:val="000000000000" w:firstRow="0" w:lastRow="0" w:firstColumn="0" w:lastColumn="0" w:oddVBand="0" w:evenVBand="0" w:oddHBand="0" w:evenHBand="0" w:firstRowFirstColumn="0" w:firstRowLastColumn="0" w:lastRowFirstColumn="0" w:lastRowLastColumn="0"/>
+              <w:rPr>
+                <w:rFonts w:ascii="Times New Roman" w:hAnsi="Times New Roman" w:cs="Times New Roman"/>
+                <w:sz w:val="20"/>
+                <w:szCs w:val="20"/>
+                <w:lang w:val="fr-CA"/>
+              </w:rPr>
+            </w:pPr>
+            <w:r>
+              <w:rPr>
+                <w:rFonts w:ascii="Times New Roman" w:hAnsi="Times New Roman" w:cs="Times New Roman"/>
+                <w:sz w:val="20"/>
+                <w:szCs w:val="20"/>
+                <w:lang w:val="fr-CA"/>
+              </w:rPr>
+              <w:t>36.0</w:t>
+            </w:r>
+          </w:p>
+        </w:tc>
+        <w:tc>
+          <w:tcPr>
+            <w:tcW w:w="910" w:type="dxa"/>
+          </w:tcPr>
+          <w:p>
+            <w:pPr>
+              <w:jc w:val="center"/>
+              <w:cnfStyle w:val="000000000000" w:firstRow="0" w:lastRow="0" w:firstColumn="0" w:lastColumn="0" w:oddVBand="0" w:evenVBand="0" w:oddHBand="0" w:evenHBand="0" w:firstRowFirstColumn="0" w:firstRowLastColumn="0" w:lastRowFirstColumn="0" w:lastRowLastColumn="0"/>
+              <w:rPr>
+                <w:rFonts w:ascii="Times New Roman" w:hAnsi="Times New Roman" w:cs="Times New Roman"/>
+                <w:sz w:val="20"/>
+                <w:szCs w:val="20"/>
+                <w:lang w:val="fr-CA"/>
+              </w:rPr>
+            </w:pPr>
+            <w:r>
+              <w:rPr>
+                <w:rFonts w:ascii="Times New Roman" w:hAnsi="Times New Roman" w:cs="Times New Roman"/>
+                <w:sz w:val="20"/>
+                <w:szCs w:val="20"/>
+                <w:lang w:val="fr-CA"/>
+              </w:rPr>
+              <w:t>43.0</w:t>
+            </w:r>
+          </w:p>
+        </w:tc>
+      </w:tr>
+      <w:tr>
+        <w:trPr>
+          <w:cnfStyle w:val="000000100000" w:firstRow="0" w:lastRow="0" w:firstColumn="0" w:lastColumn="0" w:oddVBand="0" w:evenVBand="0" w:oddHBand="1" w:evenHBand="0" w:firstRowFirstColumn="0" w:firstRowLastColumn="0" w:lastRowFirstColumn="0" w:lastRowLastColumn="0"/>
+        </w:trPr>
+        <w:tc>
+          <w:tcPr>
+            <w:cnfStyle w:val="001000000000" w:firstRow="0" w:lastRow="0" w:firstColumn="1" w:lastColumn="0" w:oddVBand="0" w:evenVBand="0" w:oddHBand="0" w:evenHBand="0" w:firstRowFirstColumn="0" w:firstRowLastColumn="0" w:lastRowFirstColumn="0" w:lastRowLastColumn="0"/>
+            <w:tcW w:w="2552" w:type="dxa"/>
+          </w:tcPr>
+          <w:p>
+            <w:pPr>
+              <w:jc w:val="both"/>
+              <w:rPr>
+                <w:rFonts w:ascii="Times New Roman" w:hAnsi="Times New Roman" w:cs="Times New Roman"/>
+                <w:b w:val="0"/>
+                <w:bCs w:val="0"/>
+                <w:sz w:val="20"/>
+                <w:szCs w:val="20"/>
+                <w:lang w:val="fr-CA"/>
+              </w:rPr>
+            </w:pPr>
+            <w:r>
+              <w:rPr>
+                <w:rFonts w:ascii="Times New Roman" w:hAnsi="Times New Roman" w:cs="Times New Roman"/>
+                <w:b w:val="0"/>
+                <w:bCs w:val="0"/>
+                <w:sz w:val="20"/>
+                <w:szCs w:val="20"/>
+                <w:lang w:val="fr-CA"/>
+              </w:rPr>
+              <w:t>BMI</w:t>
+            </w:r>
+          </w:p>
+        </w:tc>
+        <w:tc>
+          <w:tcPr>
+            <w:tcW w:w="1150" w:type="dxa"/>
+          </w:tcPr>
+          <w:p>
+            <w:pPr>
+              <w:jc w:val="center"/>
+              <w:cnfStyle w:val="000000100000" w:firstRow="0" w:lastRow="0" w:firstColumn="0" w:lastColumn="0" w:oddVBand="0" w:evenVBand="0" w:oddHBand="1" w:evenHBand="0" w:firstRowFirstColumn="0" w:firstRowLastColumn="0" w:lastRowFirstColumn="0" w:lastRowLastColumn="0"/>
+              <w:rPr>
+                <w:rFonts w:ascii="Times New Roman" w:hAnsi="Times New Roman" w:cs="Times New Roman"/>
+                <w:sz w:val="20"/>
+                <w:szCs w:val="20"/>
+                <w:lang w:val="fr-CA"/>
+              </w:rPr>
+            </w:pPr>
+            <w:r>
+              <w:rPr>
+                <w:rFonts w:ascii="Times New Roman" w:hAnsi="Times New Roman" w:cs="Times New Roman"/>
+                <w:sz w:val="20"/>
+                <w:szCs w:val="20"/>
+                <w:lang w:val="fr-CA"/>
+              </w:rPr>
+              <w:t>18.7</w:t>
+            </w:r>
+          </w:p>
+        </w:tc>
+        <w:tc>
+          <w:tcPr>
+            <w:tcW w:w="1151" w:type="dxa"/>
+          </w:tcPr>
+          <w:p>
+            <w:pPr>
+              <w:jc w:val="center"/>
+              <w:cnfStyle w:val="000000100000" w:firstRow="0" w:lastRow="0" w:firstColumn="0" w:lastColumn="0" w:oddVBand="0" w:evenVBand="0" w:oddHBand="1" w:evenHBand="0" w:firstRowFirstColumn="0" w:firstRowLastColumn="0" w:lastRowFirstColumn="0" w:lastRowLastColumn="0"/>
+              <w:rPr>
+                <w:rFonts w:ascii="Times New Roman" w:hAnsi="Times New Roman" w:cs="Times New Roman"/>
+                <w:sz w:val="20"/>
+                <w:szCs w:val="20"/>
+                <w:lang w:val="fr-CA"/>
+              </w:rPr>
+            </w:pPr>
+            <w:r>
+              <w:rPr>
+                <w:rFonts w:ascii="Times New Roman" w:hAnsi="Times New Roman" w:cs="Times New Roman"/>
+                <w:sz w:val="20"/>
+                <w:szCs w:val="20"/>
+                <w:lang w:val="fr-CA"/>
+              </w:rPr>
+              <w:t>23.6</w:t>
+            </w:r>
+          </w:p>
+        </w:tc>
+        <w:tc>
+          <w:tcPr>
+            <w:tcW w:w="1151" w:type="dxa"/>
+          </w:tcPr>
+          <w:p>
+            <w:pPr>
+              <w:jc w:val="center"/>
+              <w:cnfStyle w:val="000000100000" w:firstRow="0" w:lastRow="0" w:firstColumn="0" w:lastColumn="0" w:oddVBand="0" w:evenVBand="0" w:oddHBand="1" w:evenHBand="0" w:firstRowFirstColumn="0" w:firstRowLastColumn="0" w:lastRowFirstColumn="0" w:lastRowLastColumn="0"/>
+              <w:rPr>
+                <w:rFonts w:ascii="Times New Roman" w:hAnsi="Times New Roman" w:cs="Times New Roman"/>
+                <w:sz w:val="20"/>
+                <w:szCs w:val="20"/>
+                <w:lang w:val="fr-CA"/>
+              </w:rPr>
+            </w:pPr>
+            <w:r>
+              <w:rPr>
+                <w:rFonts w:ascii="Times New Roman" w:hAnsi="Times New Roman" w:cs="Times New Roman"/>
+                <w:sz w:val="20"/>
+                <w:szCs w:val="20"/>
+                <w:lang w:val="fr-CA"/>
+              </w:rPr>
+              <w:t>27.4</w:t>
+            </w:r>
+          </w:p>
+        </w:tc>
+        <w:tc>
+          <w:tcPr>
+            <w:tcW w:w="1151" w:type="dxa"/>
+          </w:tcPr>
+          <w:p>
+            <w:pPr>
+              <w:jc w:val="center"/>
+              <w:cnfStyle w:val="000000100000" w:firstRow="0" w:lastRow="0" w:firstColumn="0" w:lastColumn="0" w:oddVBand="0" w:evenVBand="0" w:oddHBand="1" w:evenHBand="0" w:firstRowFirstColumn="0" w:firstRowLastColumn="0" w:lastRowFirstColumn="0" w:lastRowLastColumn="0"/>
+              <w:rPr>
+                <w:rFonts w:ascii="Times New Roman" w:hAnsi="Times New Roman" w:cs="Times New Roman"/>
+                <w:sz w:val="20"/>
+                <w:szCs w:val="20"/>
+                <w:lang w:val="fr-CA"/>
+              </w:rPr>
+            </w:pPr>
+            <w:r>
+              <w:rPr>
+                <w:rFonts w:ascii="Times New Roman" w:hAnsi="Times New Roman" w:cs="Times New Roman"/>
+                <w:sz w:val="20"/>
+                <w:szCs w:val="20"/>
+                <w:lang w:val="fr-CA"/>
+              </w:rPr>
+              <w:t>27.3</w:t>
+            </w:r>
+          </w:p>
+        </w:tc>
+        <w:tc>
+          <w:tcPr>
+            <w:tcW w:w="1067" w:type="dxa"/>
+          </w:tcPr>
+          <w:p>
+            <w:pPr>
+              <w:jc w:val="center"/>
+              <w:cnfStyle w:val="000000100000" w:firstRow="0" w:lastRow="0" w:firstColumn="0" w:lastColumn="0" w:oddVBand="0" w:evenVBand="0" w:oddHBand="1" w:evenHBand="0" w:firstRowFirstColumn="0" w:firstRowLastColumn="0" w:lastRowFirstColumn="0" w:lastRowLastColumn="0"/>
+              <w:rPr>
+                <w:rFonts w:ascii="Times New Roman" w:hAnsi="Times New Roman" w:cs="Times New Roman"/>
+                <w:sz w:val="20"/>
+                <w:szCs w:val="20"/>
+                <w:lang w:val="fr-CA"/>
+              </w:rPr>
+            </w:pPr>
+            <w:r>
+              <w:rPr>
+                <w:rFonts w:ascii="Times New Roman" w:hAnsi="Times New Roman" w:cs="Times New Roman"/>
+                <w:sz w:val="20"/>
+                <w:szCs w:val="20"/>
+                <w:lang w:val="fr-CA"/>
+              </w:rPr>
+              <w:t>30.8</w:t>
+            </w:r>
+          </w:p>
+        </w:tc>
+        <w:tc>
+          <w:tcPr>
+            <w:tcW w:w="910" w:type="dxa"/>
+          </w:tcPr>
+          <w:p>
+            <w:pPr>
+              <w:jc w:val="center"/>
+              <w:cnfStyle w:val="000000100000" w:firstRow="0" w:lastRow="0" w:firstColumn="0" w:lastColumn="0" w:oddVBand="0" w:evenVBand="0" w:oddHBand="1" w:evenHBand="0" w:firstRowFirstColumn="0" w:firstRowLastColumn="0" w:lastRowFirstColumn="0" w:lastRowLastColumn="0"/>
+              <w:rPr>
+                <w:rFonts w:ascii="Times New Roman" w:hAnsi="Times New Roman" w:cs="Times New Roman"/>
+                <w:sz w:val="20"/>
+                <w:szCs w:val="20"/>
+                <w:lang w:val="fr-CA"/>
+              </w:rPr>
+            </w:pPr>
+            <w:r>
+              <w:rPr>
+                <w:rFonts w:ascii="Times New Roman" w:hAnsi="Times New Roman" w:cs="Times New Roman"/>
+                <w:sz w:val="20"/>
+                <w:szCs w:val="20"/>
+                <w:lang w:val="fr-CA"/>
+              </w:rPr>
+              <w:t>35.0</w:t>
+            </w:r>
+          </w:p>
+        </w:tc>
+      </w:tr>
+      <w:tr>
+        <w:tc>
+          <w:tcPr>
+            <w:cnfStyle w:val="001000000000" w:firstRow="0" w:lastRow="0" w:firstColumn="1" w:lastColumn="0" w:oddVBand="0" w:evenVBand="0" w:oddHBand="0" w:evenHBand="0" w:firstRowFirstColumn="0" w:firstRowLastColumn="0" w:lastRowFirstColumn="0" w:lastRowLastColumn="0"/>
+            <w:tcW w:w="2552" w:type="dxa"/>
+          </w:tcPr>
+          <w:p>
+            <w:pPr>
+              <w:jc w:val="both"/>
+              <w:rPr>
+                <w:rFonts w:ascii="Times New Roman" w:hAnsi="Times New Roman" w:cs="Times New Roman"/>
+                <w:b w:val="0"/>
+                <w:bCs w:val="0"/>
+                <w:sz w:val="20"/>
+                <w:szCs w:val="20"/>
+                <w:lang w:val="fr-CA"/>
+              </w:rPr>
+            </w:pPr>
+            <w:proofErr w:type="spellStart"/>
+            <w:r>
+              <w:rPr>
+                <w:rFonts w:ascii="Times New Roman" w:hAnsi="Times New Roman" w:cs="Times New Roman"/>
+                <w:b w:val="0"/>
+                <w:bCs w:val="0"/>
+                <w:sz w:val="20"/>
+                <w:szCs w:val="20"/>
+                <w:lang w:val="fr-CA"/>
+              </w:rPr>
+              <w:t>Caffeine</w:t>
+            </w:r>
+            <w:proofErr w:type="spellEnd"/>
+            <w:r>
+              <w:rPr>
+                <w:rFonts w:ascii="Times New Roman" w:hAnsi="Times New Roman" w:cs="Times New Roman"/>
+                <w:b w:val="0"/>
+                <w:bCs w:val="0"/>
+                <w:sz w:val="20"/>
+                <w:szCs w:val="20"/>
+                <w:lang w:val="fr-CA"/>
+              </w:rPr>
+              <w:t xml:space="preserve"> </w:t>
+            </w:r>
+            <w:proofErr w:type="spellStart"/>
+            <w:r>
+              <w:rPr>
+                <w:rFonts w:ascii="Times New Roman" w:hAnsi="Times New Roman" w:cs="Times New Roman"/>
+                <w:b w:val="0"/>
+                <w:bCs w:val="0"/>
+                <w:sz w:val="20"/>
+                <w:szCs w:val="20"/>
+                <w:lang w:val="fr-CA"/>
+              </w:rPr>
+              <w:t>Intake</w:t>
+            </w:r>
+            <w:proofErr w:type="spellEnd"/>
+          </w:p>
+        </w:tc>
+        <w:tc>
+          <w:tcPr>
+            <w:tcW w:w="1150" w:type="dxa"/>
+          </w:tcPr>
+          <w:p>
+            <w:pPr>
+              <w:jc w:val="center"/>
+              <w:cnfStyle w:val="000000000000" w:firstRow="0" w:lastRow="0" w:firstColumn="0" w:lastColumn="0" w:oddVBand="0" w:evenVBand="0" w:oddHBand="0" w:evenHBand="0" w:firstRowFirstColumn="0" w:firstRowLastColumn="0" w:lastRowFirstColumn="0" w:lastRowLastColumn="0"/>
+              <w:rPr>
+                <w:rFonts w:ascii="Times New Roman" w:hAnsi="Times New Roman" w:cs="Times New Roman"/>
+                <w:sz w:val="20"/>
+                <w:szCs w:val="20"/>
+                <w:lang w:val="fr-CA"/>
+              </w:rPr>
+            </w:pPr>
+            <w:r>
+              <w:rPr>
+                <w:rFonts w:ascii="Times New Roman" w:hAnsi="Times New Roman" w:cs="Times New Roman"/>
+                <w:sz w:val="20"/>
+                <w:szCs w:val="20"/>
+                <w:lang w:val="fr-CA"/>
+              </w:rPr>
+              <w:t>0.0</w:t>
+            </w:r>
+          </w:p>
+        </w:tc>
+        <w:tc>
+          <w:tcPr>
+            <w:tcW w:w="1151" w:type="dxa"/>
+          </w:tcPr>
+          <w:p>
+            <w:pPr>
+              <w:jc w:val="center"/>
+              <w:cnfStyle w:val="000000000000" w:firstRow="0" w:lastRow="0" w:firstColumn="0" w:lastColumn="0" w:oddVBand="0" w:evenVBand="0" w:oddHBand="0" w:evenHBand="0" w:firstRowFirstColumn="0" w:firstRowLastColumn="0" w:lastRowFirstColumn="0" w:lastRowLastColumn="0"/>
+              <w:rPr>
+                <w:rFonts w:ascii="Times New Roman" w:hAnsi="Times New Roman" w:cs="Times New Roman"/>
+                <w:sz w:val="20"/>
+                <w:szCs w:val="20"/>
+                <w:lang w:val="fr-CA"/>
+              </w:rPr>
+            </w:pPr>
+            <w:r>
+              <w:rPr>
+                <w:rFonts w:ascii="Times New Roman" w:hAnsi="Times New Roman" w:cs="Times New Roman"/>
+                <w:sz w:val="20"/>
+                <w:szCs w:val="20"/>
+                <w:lang w:val="fr-CA"/>
+              </w:rPr>
+              <w:t>1.0</w:t>
+            </w:r>
+          </w:p>
+        </w:tc>
+        <w:tc>
+          <w:tcPr>
+            <w:tcW w:w="1151" w:type="dxa"/>
+          </w:tcPr>
+          <w:p>
+            <w:pPr>
+              <w:jc w:val="center"/>
+              <w:cnfStyle w:val="000000000000" w:firstRow="0" w:lastRow="0" w:firstColumn="0" w:lastColumn="0" w:oddVBand="0" w:evenVBand="0" w:oddHBand="0" w:evenHBand="0" w:firstRowFirstColumn="0" w:firstRowLastColumn="0" w:lastRowFirstColumn="0" w:lastRowLastColumn="0"/>
+              <w:rPr>
+                <w:rFonts w:ascii="Times New Roman" w:hAnsi="Times New Roman" w:cs="Times New Roman"/>
+                <w:sz w:val="20"/>
+                <w:szCs w:val="20"/>
+                <w:lang w:val="fr-CA"/>
+              </w:rPr>
+            </w:pPr>
+            <w:r>
+              <w:rPr>
+                <w:rFonts w:ascii="Times New Roman" w:hAnsi="Times New Roman" w:cs="Times New Roman"/>
+                <w:sz w:val="20"/>
+                <w:szCs w:val="20"/>
+                <w:lang w:val="fr-CA"/>
+              </w:rPr>
+              <w:t>2.5</w:t>
+            </w:r>
+          </w:p>
+        </w:tc>
+        <w:tc>
+          <w:tcPr>
+            <w:tcW w:w="1151" w:type="dxa"/>
+          </w:tcPr>
+          <w:p>
+            <w:pPr>
+              <w:jc w:val="center"/>
+              <w:cnfStyle w:val="000000000000" w:firstRow="0" w:lastRow="0" w:firstColumn="0" w:lastColumn="0" w:oddVBand="0" w:evenVBand="0" w:oddHBand="0" w:evenHBand="0" w:firstRowFirstColumn="0" w:firstRowLastColumn="0" w:lastRowFirstColumn="0" w:lastRowLastColumn="0"/>
+              <w:rPr>
+                <w:rFonts w:ascii="Times New Roman" w:hAnsi="Times New Roman" w:cs="Times New Roman"/>
+                <w:sz w:val="20"/>
+                <w:szCs w:val="20"/>
+                <w:lang w:val="fr-CA"/>
+              </w:rPr>
+            </w:pPr>
+            <w:r>
+              <w:rPr>
+                <w:rFonts w:ascii="Times New Roman" w:hAnsi="Times New Roman" w:cs="Times New Roman"/>
+                <w:sz w:val="20"/>
+                <w:szCs w:val="20"/>
+                <w:lang w:val="fr-CA"/>
+              </w:rPr>
+              <w:t>2.4</w:t>
+            </w:r>
+          </w:p>
+        </w:tc>
+        <w:tc>
+          <w:tcPr>
+            <w:tcW w:w="1067" w:type="dxa"/>
+          </w:tcPr>
+          <w:p>
+            <w:pPr>
+              <w:jc w:val="center"/>
+              <w:cnfStyle w:val="000000000000" w:firstRow="0" w:lastRow="0" w:firstColumn="0" w:lastColumn="0" w:oddVBand="0" w:evenVBand="0" w:oddHBand="0" w:evenHBand="0" w:firstRowFirstColumn="0" w:firstRowLastColumn="0" w:lastRowFirstColumn="0" w:lastRowLastColumn="0"/>
+              <w:rPr>
+                <w:rFonts w:ascii="Times New Roman" w:hAnsi="Times New Roman" w:cs="Times New Roman"/>
+                <w:sz w:val="20"/>
+                <w:szCs w:val="20"/>
+                <w:lang w:val="fr-CA"/>
+              </w:rPr>
+            </w:pPr>
+            <w:r>
+              <w:rPr>
+                <w:rFonts w:ascii="Times New Roman" w:hAnsi="Times New Roman" w:cs="Times New Roman"/>
+                <w:sz w:val="20"/>
+                <w:szCs w:val="20"/>
+                <w:lang w:val="fr-CA"/>
+              </w:rPr>
+              <w:t>4.0</w:t>
+            </w:r>
+          </w:p>
+        </w:tc>
+        <w:tc>
+          <w:tcPr>
+            <w:tcW w:w="910" w:type="dxa"/>
+          </w:tcPr>
+          <w:p>
+            <w:pPr>
+              <w:jc w:val="center"/>
+              <w:cnfStyle w:val="000000000000" w:firstRow="0" w:lastRow="0" w:firstColumn="0" w:lastColumn="0" w:oddVBand="0" w:evenVBand="0" w:oddHBand="0" w:evenHBand="0" w:firstRowFirstColumn="0" w:firstRowLastColumn="0" w:lastRowFirstColumn="0" w:lastRowLastColumn="0"/>
+              <w:rPr>
+                <w:rFonts w:ascii="Times New Roman" w:hAnsi="Times New Roman" w:cs="Times New Roman"/>
+                <w:sz w:val="20"/>
+                <w:szCs w:val="20"/>
+                <w:lang w:val="fr-CA"/>
+              </w:rPr>
+            </w:pPr>
+            <w:r>
+              <w:rPr>
+                <w:rFonts w:ascii="Times New Roman" w:hAnsi="Times New Roman" w:cs="Times New Roman"/>
+                <w:sz w:val="20"/>
+                <w:szCs w:val="20"/>
+                <w:lang w:val="fr-CA"/>
+              </w:rPr>
+              <w:t>5.0</w:t>
+            </w:r>
+          </w:p>
+        </w:tc>
+      </w:tr>
+      <w:tr>
+        <w:trPr>
+          <w:cnfStyle w:val="000000100000" w:firstRow="0" w:lastRow="0" w:firstColumn="0" w:lastColumn="0" w:oddVBand="0" w:evenVBand="0" w:oddHBand="1" w:evenHBand="0" w:firstRowFirstColumn="0" w:firstRowLastColumn="0" w:lastRowFirstColumn="0" w:lastRowLastColumn="0"/>
+        </w:trPr>
+        <w:tc>
+          <w:tcPr>
+            <w:cnfStyle w:val="001000000000" w:firstRow="0" w:lastRow="0" w:firstColumn="1" w:lastColumn="0" w:oddVBand="0" w:evenVBand="0" w:oddHBand="0" w:evenHBand="0" w:firstRowFirstColumn="0" w:firstRowLastColumn="0" w:lastRowFirstColumn="0" w:lastRowLastColumn="0"/>
+            <w:tcW w:w="2552" w:type="dxa"/>
+          </w:tcPr>
+          <w:p>
+            <w:pPr>
+              <w:jc w:val="both"/>
+              <w:rPr>
+                <w:rFonts w:ascii="Times New Roman" w:hAnsi="Times New Roman" w:cs="Times New Roman"/>
+                <w:b w:val="0"/>
+                <w:bCs w:val="0"/>
+                <w:sz w:val="20"/>
+                <w:szCs w:val="20"/>
+                <w:lang w:val="fr-CA"/>
+              </w:rPr>
+            </w:pPr>
+            <w:r>
+              <w:rPr>
+                <w:rFonts w:ascii="Times New Roman" w:hAnsi="Times New Roman" w:cs="Times New Roman"/>
+                <w:b w:val="0"/>
+                <w:bCs w:val="0"/>
+                <w:sz w:val="20"/>
+                <w:szCs w:val="20"/>
+                <w:lang w:val="fr-CA"/>
+              </w:rPr>
+              <w:t>Physical</w:t>
+            </w:r>
+            <w:r>
+              <w:rPr>
+                <w:rFonts w:ascii="Times New Roman" w:hAnsi="Times New Roman" w:cs="Times New Roman"/>
+                <w:b w:val="0"/>
+                <w:bCs w:val="0"/>
+                <w:sz w:val="20"/>
+                <w:szCs w:val="20"/>
+                <w:lang w:val="fr-CA"/>
+              </w:rPr>
+              <w:t xml:space="preserve"> </w:t>
+            </w:r>
+            <w:r>
+              <w:rPr>
+                <w:rFonts w:ascii="Times New Roman" w:hAnsi="Times New Roman" w:cs="Times New Roman"/>
+                <w:b w:val="0"/>
+                <w:bCs w:val="0"/>
+                <w:sz w:val="20"/>
+                <w:szCs w:val="20"/>
+                <w:lang w:val="fr-CA"/>
+              </w:rPr>
+              <w:t>Activity</w:t>
+            </w:r>
+            <w:r>
+              <w:rPr>
+                <w:rFonts w:ascii="Times New Roman" w:hAnsi="Times New Roman" w:cs="Times New Roman"/>
+                <w:b w:val="0"/>
+                <w:bCs w:val="0"/>
+                <w:sz w:val="20"/>
+                <w:szCs w:val="20"/>
+                <w:lang w:val="fr-CA"/>
+              </w:rPr>
+              <w:t xml:space="preserve"> </w:t>
+            </w:r>
+            <w:proofErr w:type="spellStart"/>
+            <w:r>
+              <w:rPr>
+                <w:rFonts w:ascii="Times New Roman" w:hAnsi="Times New Roman" w:cs="Times New Roman"/>
+                <w:b w:val="0"/>
+                <w:bCs w:val="0"/>
+                <w:sz w:val="20"/>
+                <w:szCs w:val="20"/>
+                <w:lang w:val="fr-CA"/>
+              </w:rPr>
+              <w:t>Level</w:t>
+            </w:r>
+            <w:proofErr w:type="spellEnd"/>
+          </w:p>
+        </w:tc>
+        <w:tc>
+          <w:tcPr>
+            <w:tcW w:w="1150" w:type="dxa"/>
+          </w:tcPr>
+          <w:p>
+            <w:pPr>
+              <w:jc w:val="center"/>
+              <w:cnfStyle w:val="000000100000" w:firstRow="0" w:lastRow="0" w:firstColumn="0" w:lastColumn="0" w:oddVBand="0" w:evenVBand="0" w:oddHBand="1" w:evenHBand="0" w:firstRowFirstColumn="0" w:firstRowLastColumn="0" w:lastRowFirstColumn="0" w:lastRowLastColumn="0"/>
+              <w:rPr>
+                <w:rFonts w:ascii="Times New Roman" w:hAnsi="Times New Roman" w:cs="Times New Roman"/>
+                <w:sz w:val="20"/>
+                <w:szCs w:val="20"/>
+                <w:lang w:val="fr-CA"/>
+              </w:rPr>
+            </w:pPr>
+            <w:r>
+              <w:rPr>
+                <w:rFonts w:ascii="Times New Roman" w:hAnsi="Times New Roman" w:cs="Times New Roman"/>
+                <w:sz w:val="20"/>
+                <w:szCs w:val="20"/>
+                <w:lang w:val="fr-CA"/>
+              </w:rPr>
+              <w:t>0.0</w:t>
+            </w:r>
+          </w:p>
+        </w:tc>
+        <w:tc>
+          <w:tcPr>
+            <w:tcW w:w="1151" w:type="dxa"/>
+          </w:tcPr>
+          <w:p>
+            <w:pPr>
+              <w:jc w:val="center"/>
+              <w:cnfStyle w:val="000000100000" w:firstRow="0" w:lastRow="0" w:firstColumn="0" w:lastColumn="0" w:oddVBand="0" w:evenVBand="0" w:oddHBand="1" w:evenHBand="0" w:firstRowFirstColumn="0" w:firstRowLastColumn="0" w:lastRowFirstColumn="0" w:lastRowLastColumn="0"/>
+              <w:rPr>
+                <w:rFonts w:ascii="Times New Roman" w:hAnsi="Times New Roman" w:cs="Times New Roman"/>
+                <w:sz w:val="20"/>
+                <w:szCs w:val="20"/>
+                <w:lang w:val="fr-CA"/>
+              </w:rPr>
+            </w:pPr>
+            <w:r>
+              <w:rPr>
+                <w:rFonts w:ascii="Times New Roman" w:hAnsi="Times New Roman" w:cs="Times New Roman"/>
+                <w:sz w:val="20"/>
+                <w:szCs w:val="20"/>
+                <w:lang w:val="fr-CA"/>
+              </w:rPr>
+              <w:t>1.0</w:t>
+            </w:r>
+          </w:p>
+        </w:tc>
+        <w:tc>
+          <w:tcPr>
+            <w:tcW w:w="1151" w:type="dxa"/>
+          </w:tcPr>
+          <w:p>
+            <w:pPr>
+              <w:jc w:val="center"/>
+              <w:cnfStyle w:val="000000100000" w:firstRow="0" w:lastRow="0" w:firstColumn="0" w:lastColumn="0" w:oddVBand="0" w:evenVBand="0" w:oddHBand="1" w:evenHBand="0" w:firstRowFirstColumn="0" w:firstRowLastColumn="0" w:lastRowFirstColumn="0" w:lastRowLastColumn="0"/>
+              <w:rPr>
+                <w:rFonts w:ascii="Times New Roman" w:hAnsi="Times New Roman" w:cs="Times New Roman"/>
+                <w:sz w:val="20"/>
+                <w:szCs w:val="20"/>
+                <w:lang w:val="fr-CA"/>
+              </w:rPr>
+            </w:pPr>
+            <w:r>
+              <w:rPr>
+                <w:rFonts w:ascii="Times New Roman" w:hAnsi="Times New Roman" w:cs="Times New Roman"/>
+                <w:sz w:val="20"/>
+                <w:szCs w:val="20"/>
+                <w:lang w:val="fr-CA"/>
+              </w:rPr>
+              <w:t>4.0</w:t>
+            </w:r>
+          </w:p>
+        </w:tc>
+        <w:tc>
+          <w:tcPr>
+            <w:tcW w:w="1151" w:type="dxa"/>
+          </w:tcPr>
+          <w:p>
+            <w:pPr>
+              <w:jc w:val="center"/>
+              <w:cnfStyle w:val="000000100000" w:firstRow="0" w:lastRow="0" w:firstColumn="0" w:lastColumn="0" w:oddVBand="0" w:evenVBand="0" w:oddHBand="1" w:evenHBand="0" w:firstRowFirstColumn="0" w:firstRowLastColumn="0" w:lastRowFirstColumn="0" w:lastRowLastColumn="0"/>
+              <w:rPr>
+                <w:rFonts w:ascii="Times New Roman" w:hAnsi="Times New Roman" w:cs="Times New Roman"/>
+                <w:sz w:val="20"/>
+                <w:szCs w:val="20"/>
+                <w:lang w:val="fr-CA"/>
+              </w:rPr>
+            </w:pPr>
+            <w:r>
+              <w:rPr>
+                <w:rFonts w:ascii="Times New Roman" w:hAnsi="Times New Roman" w:cs="Times New Roman"/>
+                <w:sz w:val="20"/>
+                <w:szCs w:val="20"/>
+                <w:lang w:val="fr-CA"/>
+              </w:rPr>
+              <w:t>4.1</w:t>
+            </w:r>
+          </w:p>
+        </w:tc>
+        <w:tc>
+          <w:tcPr>
+            <w:tcW w:w="1067" w:type="dxa"/>
+          </w:tcPr>
+          <w:p>
+            <w:pPr>
+              <w:jc w:val="center"/>
+              <w:cnfStyle w:val="000000100000" w:firstRow="0" w:lastRow="0" w:firstColumn="0" w:lastColumn="0" w:oddVBand="0" w:evenVBand="0" w:oddHBand="1" w:evenHBand="0" w:firstRowFirstColumn="0" w:firstRowLastColumn="0" w:lastRowFirstColumn="0" w:lastRowLastColumn="0"/>
+              <w:rPr>
+                <w:rFonts w:ascii="Times New Roman" w:hAnsi="Times New Roman" w:cs="Times New Roman"/>
+                <w:sz w:val="20"/>
+                <w:szCs w:val="20"/>
+                <w:lang w:val="fr-CA"/>
+              </w:rPr>
+            </w:pPr>
+            <w:r>
+              <w:rPr>
+                <w:rFonts w:ascii="Times New Roman" w:hAnsi="Times New Roman" w:cs="Times New Roman"/>
+                <w:sz w:val="20"/>
+                <w:szCs w:val="20"/>
+                <w:lang w:val="fr-CA"/>
+              </w:rPr>
+              <w:t>6.0</w:t>
+            </w:r>
+          </w:p>
+        </w:tc>
+        <w:tc>
+          <w:tcPr>
+            <w:tcW w:w="910" w:type="dxa"/>
+          </w:tcPr>
+          <w:p>
+            <w:pPr>
+              <w:jc w:val="center"/>
+              <w:cnfStyle w:val="000000100000" w:firstRow="0" w:lastRow="0" w:firstColumn="0" w:lastColumn="0" w:oddVBand="0" w:evenVBand="0" w:oddHBand="1" w:evenHBand="0" w:firstRowFirstColumn="0" w:firstRowLastColumn="0" w:lastRowFirstColumn="0" w:lastRowLastColumn="0"/>
+              <w:rPr>
+                <w:rFonts w:ascii="Times New Roman" w:hAnsi="Times New Roman" w:cs="Times New Roman"/>
+                <w:sz w:val="20"/>
+                <w:szCs w:val="20"/>
+                <w:lang w:val="fr-CA"/>
+              </w:rPr>
+            </w:pPr>
+            <w:r>
+              <w:rPr>
+                <w:rFonts w:ascii="Times New Roman" w:hAnsi="Times New Roman" w:cs="Times New Roman"/>
+                <w:sz w:val="20"/>
+                <w:szCs w:val="20"/>
+                <w:lang w:val="fr-CA"/>
+              </w:rPr>
+              <w:t>10.0</w:t>
+            </w:r>
+          </w:p>
+        </w:tc>
+      </w:tr>
+      <w:tr>
+        <w:tc>
+          <w:tcPr>
+            <w:cnfStyle w:val="001000000000" w:firstRow="0" w:lastRow="0" w:firstColumn="1" w:lastColumn="0" w:oddVBand="0" w:evenVBand="0" w:oddHBand="0" w:evenHBand="0" w:firstRowFirstColumn="0" w:firstRowLastColumn="0" w:lastRowFirstColumn="0" w:lastRowLastColumn="0"/>
+            <w:tcW w:w="2552" w:type="dxa"/>
+          </w:tcPr>
+          <w:p>
+            <w:pPr>
+              <w:jc w:val="both"/>
+              <w:rPr>
+                <w:rFonts w:ascii="Times New Roman" w:hAnsi="Times New Roman" w:cs="Times New Roman"/>
+                <w:b w:val="0"/>
+                <w:bCs w:val="0"/>
+                <w:sz w:val="20"/>
+                <w:szCs w:val="20"/>
+                <w:lang w:val="fr-CA"/>
+              </w:rPr>
+            </w:pPr>
+            <w:r>
+              <w:rPr>
+                <w:rFonts w:ascii="Times New Roman" w:hAnsi="Times New Roman" w:cs="Times New Roman"/>
+                <w:b w:val="0"/>
+                <w:bCs w:val="0"/>
+                <w:sz w:val="20"/>
+                <w:szCs w:val="20"/>
+                <w:lang w:val="fr-CA"/>
+              </w:rPr>
+              <w:t>Stress</w:t>
+            </w:r>
+            <w:r>
+              <w:rPr>
+                <w:rFonts w:ascii="Times New Roman" w:hAnsi="Times New Roman" w:cs="Times New Roman"/>
+                <w:b w:val="0"/>
+                <w:bCs w:val="0"/>
+                <w:sz w:val="20"/>
+                <w:szCs w:val="20"/>
+                <w:lang w:val="fr-CA"/>
+              </w:rPr>
+              <w:t xml:space="preserve"> </w:t>
+            </w:r>
+            <w:proofErr w:type="spellStart"/>
+            <w:r>
+              <w:rPr>
+                <w:rFonts w:ascii="Times New Roman" w:hAnsi="Times New Roman" w:cs="Times New Roman"/>
+                <w:b w:val="0"/>
+                <w:bCs w:val="0"/>
+                <w:sz w:val="20"/>
+                <w:szCs w:val="20"/>
+                <w:lang w:val="fr-CA"/>
+              </w:rPr>
+              <w:t>Level</w:t>
+            </w:r>
+            <w:proofErr w:type="spellEnd"/>
+          </w:p>
+        </w:tc>
+        <w:tc>
+          <w:tcPr>
+            <w:tcW w:w="1150" w:type="dxa"/>
+          </w:tcPr>
+          <w:p>
+            <w:pPr>
+              <w:jc w:val="center"/>
+              <w:cnfStyle w:val="000000000000" w:firstRow="0" w:lastRow="0" w:firstColumn="0" w:lastColumn="0" w:oddVBand="0" w:evenVBand="0" w:oddHBand="0" w:evenHBand="0" w:firstRowFirstColumn="0" w:firstRowLastColumn="0" w:lastRowFirstColumn="0" w:lastRowLastColumn="0"/>
+              <w:rPr>
+                <w:rFonts w:ascii="Times New Roman" w:hAnsi="Times New Roman" w:cs="Times New Roman"/>
+                <w:sz w:val="20"/>
+                <w:szCs w:val="20"/>
+                <w:lang w:val="fr-CA"/>
+              </w:rPr>
+            </w:pPr>
+            <w:r>
+              <w:rPr>
+                <w:rFonts w:ascii="Times New Roman" w:hAnsi="Times New Roman" w:cs="Times New Roman"/>
+                <w:sz w:val="20"/>
+                <w:szCs w:val="20"/>
+                <w:lang w:val="fr-CA"/>
+              </w:rPr>
+              <w:t>0.0</w:t>
+            </w:r>
+          </w:p>
+        </w:tc>
+        <w:tc>
+          <w:tcPr>
+            <w:tcW w:w="1151" w:type="dxa"/>
+          </w:tcPr>
+          <w:p>
+            <w:pPr>
+              <w:jc w:val="center"/>
+              <w:cnfStyle w:val="000000000000" w:firstRow="0" w:lastRow="0" w:firstColumn="0" w:lastColumn="0" w:oddVBand="0" w:evenVBand="0" w:oddHBand="0" w:evenHBand="0" w:firstRowFirstColumn="0" w:firstRowLastColumn="0" w:lastRowFirstColumn="0" w:lastRowLastColumn="0"/>
+              <w:rPr>
+                <w:rFonts w:ascii="Times New Roman" w:hAnsi="Times New Roman" w:cs="Times New Roman"/>
+                <w:sz w:val="20"/>
+                <w:szCs w:val="20"/>
+                <w:lang w:val="fr-CA"/>
+              </w:rPr>
+            </w:pPr>
+            <w:r>
+              <w:rPr>
+                <w:rFonts w:ascii="Times New Roman" w:hAnsi="Times New Roman" w:cs="Times New Roman"/>
+                <w:sz w:val="20"/>
+                <w:szCs w:val="20"/>
+                <w:lang w:val="fr-CA"/>
+              </w:rPr>
+              <w:t>8.8</w:t>
+            </w:r>
+          </w:p>
+        </w:tc>
+        <w:tc>
+          <w:tcPr>
+            <w:tcW w:w="1151" w:type="dxa"/>
+          </w:tcPr>
+          <w:p>
+            <w:pPr>
+              <w:jc w:val="center"/>
+              <w:cnfStyle w:val="000000000000" w:firstRow="0" w:lastRow="0" w:firstColumn="0" w:lastColumn="0" w:oddVBand="0" w:evenVBand="0" w:oddHBand="0" w:evenHBand="0" w:firstRowFirstColumn="0" w:firstRowLastColumn="0" w:lastRowFirstColumn="0" w:lastRowLastColumn="0"/>
+              <w:rPr>
+                <w:rFonts w:ascii="Times New Roman" w:hAnsi="Times New Roman" w:cs="Times New Roman"/>
+                <w:sz w:val="20"/>
+                <w:szCs w:val="20"/>
+                <w:lang w:val="fr-CA"/>
+              </w:rPr>
+            </w:pPr>
+            <w:r>
+              <w:rPr>
+                <w:rFonts w:ascii="Times New Roman" w:hAnsi="Times New Roman" w:cs="Times New Roman"/>
+                <w:sz w:val="20"/>
+                <w:szCs w:val="20"/>
+                <w:lang w:val="fr-CA"/>
+              </w:rPr>
+              <w:t>17.5</w:t>
+            </w:r>
+          </w:p>
+        </w:tc>
+        <w:tc>
+          <w:tcPr>
+            <w:tcW w:w="1151" w:type="dxa"/>
+          </w:tcPr>
+          <w:p>
+            <w:pPr>
+              <w:jc w:val="center"/>
+              <w:cnfStyle w:val="000000000000" w:firstRow="0" w:lastRow="0" w:firstColumn="0" w:lastColumn="0" w:oddVBand="0" w:evenVBand="0" w:oddHBand="0" w:evenHBand="0" w:firstRowFirstColumn="0" w:firstRowLastColumn="0" w:lastRowFirstColumn="0" w:lastRowLastColumn="0"/>
+              <w:rPr>
+                <w:rFonts w:ascii="Times New Roman" w:hAnsi="Times New Roman" w:cs="Times New Roman"/>
+                <w:sz w:val="20"/>
+                <w:szCs w:val="20"/>
+                <w:lang w:val="fr-CA"/>
+              </w:rPr>
+            </w:pPr>
+            <w:r>
+              <w:rPr>
+                <w:rFonts w:ascii="Times New Roman" w:hAnsi="Times New Roman" w:cs="Times New Roman"/>
+                <w:sz w:val="20"/>
+                <w:szCs w:val="20"/>
+                <w:lang w:val="fr-CA"/>
+              </w:rPr>
+              <w:t>17.9</w:t>
+            </w:r>
+          </w:p>
+        </w:tc>
+        <w:tc>
+          <w:tcPr>
+            <w:tcW w:w="1067" w:type="dxa"/>
+          </w:tcPr>
+          <w:p>
+            <w:pPr>
+              <w:jc w:val="center"/>
+              <w:cnfStyle w:val="000000000000" w:firstRow="0" w:lastRow="0" w:firstColumn="0" w:lastColumn="0" w:oddVBand="0" w:evenVBand="0" w:oddHBand="0" w:evenHBand="0" w:firstRowFirstColumn="0" w:firstRowLastColumn="0" w:lastRowFirstColumn="0" w:lastRowLastColumn="0"/>
+              <w:rPr>
+                <w:rFonts w:ascii="Times New Roman" w:hAnsi="Times New Roman" w:cs="Times New Roman"/>
+                <w:sz w:val="20"/>
+                <w:szCs w:val="20"/>
+                <w:lang w:val="fr-CA"/>
+              </w:rPr>
+            </w:pPr>
+            <w:r>
+              <w:rPr>
+                <w:rFonts w:ascii="Times New Roman" w:hAnsi="Times New Roman" w:cs="Times New Roman"/>
+                <w:sz w:val="20"/>
+                <w:szCs w:val="20"/>
+                <w:lang w:val="fr-CA"/>
+              </w:rPr>
+              <w:t>26.3</w:t>
+            </w:r>
+          </w:p>
+        </w:tc>
+        <w:tc>
+          <w:tcPr>
+            <w:tcW w:w="910" w:type="dxa"/>
+          </w:tcPr>
+          <w:p>
+            <w:pPr>
+              <w:jc w:val="center"/>
+              <w:cnfStyle w:val="000000000000" w:firstRow="0" w:lastRow="0" w:firstColumn="0" w:lastColumn="0" w:oddVBand="0" w:evenVBand="0" w:oddHBand="0" w:evenHBand="0" w:firstRowFirstColumn="0" w:firstRowLastColumn="0" w:lastRowFirstColumn="0" w:lastRowLastColumn="0"/>
+              <w:rPr>
+                <w:rFonts w:ascii="Times New Roman" w:hAnsi="Times New Roman" w:cs="Times New Roman"/>
+                <w:sz w:val="20"/>
+                <w:szCs w:val="20"/>
+                <w:lang w:val="fr-CA"/>
+              </w:rPr>
+            </w:pPr>
+            <w:r>
+              <w:rPr>
+                <w:rFonts w:ascii="Times New Roman" w:hAnsi="Times New Roman" w:cs="Times New Roman"/>
+                <w:sz w:val="20"/>
+                <w:szCs w:val="20"/>
+                <w:lang w:val="fr-CA"/>
+              </w:rPr>
+              <w:t>40.0</w:t>
+            </w:r>
+          </w:p>
+        </w:tc>
+      </w:tr>
+    </w:tbl>
+    <w:p>
+      <w:pPr>
+        <w:spacing w:after="0" w:line="240" w:lineRule="auto"/>
+        <w:jc w:val="both"/>
+        <w:rPr>
+          <w:rFonts w:ascii="Times New Roman" w:hAnsi="Times New Roman" w:cs="Times New Roman"/>
+          <w:sz w:val="20"/>
+          <w:szCs w:val="20"/>
+        </w:rPr>
+      </w:pPr>
+      <w:r>
+        <w:rPr>
+          <w:rFonts w:ascii="Times New Roman" w:hAnsi="Times New Roman" w:cs="Times New Roman"/>
+          <w:sz w:val="20"/>
+          <w:szCs w:val="20"/>
+        </w:rPr>
+        <w:t xml:space="preserve">Table 1. Descriptive statistics for the primary continuous variables. Q1 and Q3 represent first and </w:t>
+      </w:r>
+      <w:r>
+        <w:rPr>
+          <w:rFonts w:ascii="Times New Roman" w:hAnsi="Times New Roman" w:cs="Times New Roman"/>
+          <w:sz w:val="20"/>
+          <w:szCs w:val="20"/>
+        </w:rPr>
+        <w:t>first and third quartiles</w:t>
+      </w:r>
+      <w:r>
+        <w:rPr>
+          <w:rFonts w:ascii="Times New Roman" w:hAnsi="Times New Roman" w:cs="Times New Roman"/>
+          <w:sz w:val="20"/>
+          <w:szCs w:val="20"/>
+        </w:rPr>
+        <w:t xml:space="preserve"> (25</w:t>
+      </w:r>
+      <w:r>
+        <w:rPr>
+          <w:rFonts w:ascii="Times New Roman" w:hAnsi="Times New Roman" w:cs="Times New Roman"/>
+          <w:sz w:val="20"/>
+          <w:szCs w:val="20"/>
+          <w:vertAlign w:val="superscript"/>
+        </w:rPr>
+        <w:t>th</w:t>
+      </w:r>
+      <w:r>
+        <w:rPr>
+          <w:rFonts w:ascii="Times New Roman" w:hAnsi="Times New Roman" w:cs="Times New Roman"/>
+          <w:sz w:val="20"/>
+          <w:szCs w:val="20"/>
+        </w:rPr>
+        <w:t xml:space="preserve"> percentile and 75</w:t>
+      </w:r>
+      <w:r>
+        <w:rPr>
+          <w:rFonts w:ascii="Times New Roman" w:hAnsi="Times New Roman" w:cs="Times New Roman"/>
+          <w:sz w:val="20"/>
+          <w:szCs w:val="20"/>
+          <w:vertAlign w:val="superscript"/>
+        </w:rPr>
+        <w:t>th</w:t>
+      </w:r>
+      <w:r>
+        <w:rPr>
+          <w:rFonts w:ascii="Times New Roman" w:hAnsi="Times New Roman" w:cs="Times New Roman"/>
+          <w:sz w:val="20"/>
+          <w:szCs w:val="20"/>
+        </w:rPr>
+        <w:t xml:space="preserve"> percentile), respectively</w:t>
       </w:r>
     </w:p>
     <w:sectPr>
@@ -2361,6 +5539,247 @@
       <w:szCs w:val="24"/>
     </w:rPr>
   </w:style>
+  <w:style w:type="table" w:styleId="af3">
+    <w:name w:val="Table Grid"/>
+    <w:basedOn w:val="a1"/>
+    <w:uiPriority w:val="39"/>
+    <w:rsid w:val="0083467E"/>
+    <w:pPr>
+      <w:spacing w:after="0" w:line="240" w:lineRule="auto"/>
+    </w:pPr>
+    <w:tblPr>
+      <w:tblBorders>
+        <w:top w:val="single" w:sz="4" w:space="0" w:color="auto"/>
+        <w:left w:val="single" w:sz="4" w:space="0" w:color="auto"/>
+        <w:bottom w:val="single" w:sz="4" w:space="0" w:color="auto"/>
+        <w:right w:val="single" w:sz="4" w:space="0" w:color="auto"/>
+        <w:insideH w:val="single" w:sz="4" w:space="0" w:color="auto"/>
+        <w:insideV w:val="single" w:sz="4" w:space="0" w:color="auto"/>
+      </w:tblBorders>
+    </w:tblPr>
+  </w:style>
+  <w:style w:type="table" w:styleId="31">
+    <w:name w:val="Plain Table 3"/>
+    <w:basedOn w:val="a1"/>
+    <w:uiPriority w:val="43"/>
+    <w:rsid w:val="00916BE8"/>
+    <w:pPr>
+      <w:spacing w:after="0" w:line="240" w:lineRule="auto"/>
+    </w:pPr>
+    <w:tblPr>
+      <w:tblStyleRowBandSize w:val="1"/>
+      <w:tblStyleColBandSize w:val="1"/>
+    </w:tblPr>
+    <w:tblStylePr w:type="firstRow">
+      <w:rPr>
+        <w:b/>
+        <w:bCs/>
+        <w:caps/>
+      </w:rPr>
+      <w:tblPr/>
+      <w:tcPr>
+        <w:tcBorders>
+          <w:bottom w:val="single" w:sz="4" w:space="0" w:color="7F7F7F" w:themeColor="text1" w:themeTint="80"/>
+        </w:tcBorders>
+      </w:tcPr>
+    </w:tblStylePr>
+    <w:tblStylePr w:type="lastRow">
+      <w:rPr>
+        <w:b/>
+        <w:bCs/>
+        <w:caps/>
+      </w:rPr>
+      <w:tblPr/>
+      <w:tcPr>
+        <w:tcBorders>
+          <w:top w:val="nil"/>
+        </w:tcBorders>
+      </w:tcPr>
+    </w:tblStylePr>
+    <w:tblStylePr w:type="firstCol">
+      <w:rPr>
+        <w:b/>
+        <w:bCs/>
+        <w:caps/>
+      </w:rPr>
+      <w:tblPr/>
+      <w:tcPr>
+        <w:tcBorders>
+          <w:right w:val="single" w:sz="4" w:space="0" w:color="7F7F7F" w:themeColor="text1" w:themeTint="80"/>
+        </w:tcBorders>
+      </w:tcPr>
+    </w:tblStylePr>
+    <w:tblStylePr w:type="lastCol">
+      <w:rPr>
+        <w:b/>
+        <w:bCs/>
+        <w:caps/>
+      </w:rPr>
+      <w:tblPr/>
+      <w:tcPr>
+        <w:tcBorders>
+          <w:left w:val="nil"/>
+        </w:tcBorders>
+      </w:tcPr>
+    </w:tblStylePr>
+    <w:tblStylePr w:type="band1Vert">
+      <w:tblPr/>
+      <w:tcPr>
+        <w:shd w:val="clear" w:color="auto" w:fill="F2F2F2" w:themeFill="background1" w:themeFillShade="F2"/>
+      </w:tcPr>
+    </w:tblStylePr>
+    <w:tblStylePr w:type="band1Horz">
+      <w:tblPr/>
+      <w:tcPr>
+        <w:shd w:val="clear" w:color="auto" w:fill="F2F2F2" w:themeFill="background1" w:themeFillShade="F2"/>
+      </w:tcPr>
+    </w:tblStylePr>
+    <w:tblStylePr w:type="neCell">
+      <w:tblPr/>
+      <w:tcPr>
+        <w:tcBorders>
+          <w:left w:val="nil"/>
+        </w:tcBorders>
+      </w:tcPr>
+    </w:tblStylePr>
+    <w:tblStylePr w:type="nwCell">
+      <w:tblPr/>
+      <w:tcPr>
+        <w:tcBorders>
+          <w:right w:val="nil"/>
+        </w:tcBorders>
+      </w:tcPr>
+    </w:tblStylePr>
+  </w:style>
+  <w:style w:type="table" w:styleId="41">
+    <w:name w:val="Plain Table 4"/>
+    <w:basedOn w:val="a1"/>
+    <w:uiPriority w:val="44"/>
+    <w:rsid w:val="00916BE8"/>
+    <w:pPr>
+      <w:spacing w:after="0" w:line="240" w:lineRule="auto"/>
+    </w:pPr>
+    <w:tblPr>
+      <w:tblStyleRowBandSize w:val="1"/>
+      <w:tblStyleColBandSize w:val="1"/>
+    </w:tblPr>
+    <w:tblStylePr w:type="firstRow">
+      <w:rPr>
+        <w:b/>
+        <w:bCs/>
+      </w:rPr>
+    </w:tblStylePr>
+    <w:tblStylePr w:type="lastRow">
+      <w:rPr>
+        <w:b/>
+        <w:bCs/>
+      </w:rPr>
+    </w:tblStylePr>
+    <w:tblStylePr w:type="firstCol">
+      <w:rPr>
+        <w:b/>
+        <w:bCs/>
+      </w:rPr>
+    </w:tblStylePr>
+    <w:tblStylePr w:type="lastCol">
+      <w:rPr>
+        <w:b/>
+        <w:bCs/>
+      </w:rPr>
+    </w:tblStylePr>
+    <w:tblStylePr w:type="band1Vert">
+      <w:tblPr/>
+      <w:tcPr>
+        <w:shd w:val="clear" w:color="auto" w:fill="F2F2F2" w:themeFill="background1" w:themeFillShade="F2"/>
+      </w:tcPr>
+    </w:tblStylePr>
+    <w:tblStylePr w:type="band1Horz">
+      <w:tblPr/>
+      <w:tcPr>
+        <w:shd w:val="clear" w:color="auto" w:fill="F2F2F2" w:themeFill="background1" w:themeFillShade="F2"/>
+      </w:tcPr>
+    </w:tblStylePr>
+  </w:style>
+  <w:style w:type="table" w:styleId="21">
+    <w:name w:val="Plain Table 2"/>
+    <w:basedOn w:val="a1"/>
+    <w:uiPriority w:val="42"/>
+    <w:rsid w:val="00916BE8"/>
+    <w:pPr>
+      <w:spacing w:after="0" w:line="240" w:lineRule="auto"/>
+    </w:pPr>
+    <w:tblPr>
+      <w:tblStyleRowBandSize w:val="1"/>
+      <w:tblStyleColBandSize w:val="1"/>
+      <w:tblBorders>
+        <w:top w:val="single" w:sz="4" w:space="0" w:color="7F7F7F" w:themeColor="text1" w:themeTint="80"/>
+        <w:bottom w:val="single" w:sz="4" w:space="0" w:color="7F7F7F" w:themeColor="text1" w:themeTint="80"/>
+      </w:tblBorders>
+    </w:tblPr>
+    <w:tblStylePr w:type="firstRow">
+      <w:rPr>
+        <w:b/>
+        <w:bCs/>
+      </w:rPr>
+      <w:tblPr/>
+      <w:tcPr>
+        <w:tcBorders>
+          <w:bottom w:val="single" w:sz="4" w:space="0" w:color="7F7F7F" w:themeColor="text1" w:themeTint="80"/>
+        </w:tcBorders>
+      </w:tcPr>
+    </w:tblStylePr>
+    <w:tblStylePr w:type="lastRow">
+      <w:rPr>
+        <w:b/>
+        <w:bCs/>
+      </w:rPr>
+      <w:tblPr/>
+      <w:tcPr>
+        <w:tcBorders>
+          <w:top w:val="single" w:sz="4" w:space="0" w:color="7F7F7F" w:themeColor="text1" w:themeTint="80"/>
+        </w:tcBorders>
+      </w:tcPr>
+    </w:tblStylePr>
+    <w:tblStylePr w:type="firstCol">
+      <w:rPr>
+        <w:b/>
+        <w:bCs/>
+      </w:rPr>
+    </w:tblStylePr>
+    <w:tblStylePr w:type="lastCol">
+      <w:rPr>
+        <w:b/>
+        <w:bCs/>
+      </w:rPr>
+    </w:tblStylePr>
+    <w:tblStylePr w:type="band1Vert">
+      <w:tblPr/>
+      <w:tcPr>
+        <w:tcBorders>
+          <w:left w:val="single" w:sz="4" w:space="0" w:color="7F7F7F" w:themeColor="text1" w:themeTint="80"/>
+          <w:right w:val="single" w:sz="4" w:space="0" w:color="7F7F7F" w:themeColor="text1" w:themeTint="80"/>
+        </w:tcBorders>
+      </w:tcPr>
+    </w:tblStylePr>
+    <w:tblStylePr w:type="band2Vert">
+      <w:tblPr/>
+      <w:tcPr>
+        <w:tcBorders>
+          <w:left w:val="single" w:sz="4" w:space="0" w:color="7F7F7F" w:themeColor="text1" w:themeTint="80"/>
+          <w:right w:val="single" w:sz="4" w:space="0" w:color="7F7F7F" w:themeColor="text1" w:themeTint="80"/>
+        </w:tcBorders>
+      </w:tcPr>
+    </w:tblStylePr>
+    <w:tblStylePr w:type="band1Horz">
+      <w:tblPr/>
+      <w:tcPr>
+        <w:tcBorders>
+          <w:top w:val="single" w:sz="4" w:space="0" w:color="7F7F7F" w:themeColor="text1" w:themeTint="80"/>
+          <w:bottom w:val="single" w:sz="4" w:space="0" w:color="7F7F7F" w:themeColor="text1" w:themeTint="80"/>
+        </w:tcBorders>
+      </w:tcPr>
+    </w:tblStylePr>
+  </w:style>
 </w:styles>
 </file>
 

</xml_diff>

<commit_message>
Updating formal analysis for EDA Part
</commit_message>
<xml_diff>
--- a/Project1_Sleep_Deprivation_Cognition/Report/Analysis_Report.docx
+++ b/Project1_Sleep_Deprivation_Cognition/Report/Analysis_Report.docx
@@ -764,6 +764,18 @@
           <w:szCs w:val="26"/>
           <w14:ligatures w14:val="none"/>
         </w:rPr>
+        <w:t xml:space="preserve">Broad </w:t>
+      </w:r>
+      <w:r>
+        <w:rPr>
+          <w:rFonts w:ascii="Times New Roman" w:eastAsia="宋体" w:hAnsi="Times New Roman" w:cs="Times New Roman"/>
+          <w:b/>
+          <w:bCs/>
+          <w:kern w:val="0"/>
+          <w:sz w:val="26"/>
+          <w:szCs w:val="26"/>
+          <w14:ligatures w14:val="none"/>
+        </w:rPr>
         <w:t>Introduction:</w:t>
       </w:r>
     </w:p>
@@ -834,6 +846,7 @@
       <w:pPr>
         <w:widowControl/>
         <w:spacing w:after="0" w:line="240" w:lineRule="auto"/>
+        <w:ind w:firstLineChars="100" w:firstLine="240"/>
         <w:jc w:val="both"/>
         <w:rPr>
           <w:rFonts w:ascii="Times New Roman" w:eastAsia="宋体" w:hAnsi="Times New Roman" w:cs="Times New Roman"/>
@@ -1000,28 +1013,6 @@
           <w14:ligatures w14:val="none"/>
         </w:rPr>
         <w:t xml:space="preserve"> et al., 2010; Roca et al., 2015), or vice versa.</w:t>
-      </w:r>
-    </w:p>
-    <w:p>
-      <w:pPr>
-        <w:widowControl/>
-        <w:spacing w:after="0" w:line="240" w:lineRule="auto"/>
-        <w:jc w:val="both"/>
-        <w:rPr>
-          <w:rFonts w:ascii="Times New Roman" w:eastAsia="宋体" w:hAnsi="Times New Roman" w:cs="Times New Roman"/>
-          <w:kern w:val="0"/>
-          <w:sz w:val="24"/>
-          <w14:ligatures w14:val="none"/>
-        </w:rPr>
-      </w:pPr>
-      <w:r>
-        <w:rPr>
-          <w:rFonts w:ascii="Times New Roman" w:eastAsia="宋体" w:hAnsi="Times New Roman" w:cs="Times New Roman"/>
-          <w:kern w:val="0"/>
-          <w:sz w:val="24"/>
-          <w14:ligatures w14:val="none"/>
-        </w:rPr>
-        <w:t>The publicly available Kaggle dataset used in the data analyses project provides a broad range of behavioral, psychological, and cognitive performance measures (Sacramento Technology, 2024). It provides an opportunity for the project to achieve two broad purposes: (1) the examination of the broader correlational structure among these variables to understand their standardized associations with cognitive performance differently, while also (2) selecting theoretically relevant conditions for more focused model-driven analyses. Accordingly, for the first purpose, an exploratory correlation matrix heatmap was first established, providing an overall presentation of all zero-order associations among variables.</w:t>
       </w:r>
     </w:p>
     <w:p>
@@ -1044,6 +1035,29 @@
           <w:sz w:val="24"/>
           <w14:ligatures w14:val="none"/>
         </w:rPr>
+        <w:t>The publicly available Kaggle dataset used in the data analyses project provides a broad range of behavioral, psychological, and cognitive performance measures (Sacramento Technology, 2024). It provides an opportunity for the project to achieve two broad purposes: (1) the examination of the broader correlational structure among these variables to understand their standardized associations with cognitive performance differently, while also (2) selecting theoretically relevant conditions for more focused model-driven analyses. Accordingly, for the first purpose, an exploratory correlation matrix heatmap was first established, providing an overall presentation of all zero-order associations among variables.</w:t>
+      </w:r>
+    </w:p>
+    <w:p>
+      <w:pPr>
+        <w:widowControl/>
+        <w:spacing w:after="0" w:line="240" w:lineRule="auto"/>
+        <w:ind w:firstLineChars="100" w:firstLine="240"/>
+        <w:jc w:val="both"/>
+        <w:rPr>
+          <w:rFonts w:ascii="Times New Roman" w:eastAsia="宋体" w:hAnsi="Times New Roman" w:cs="Times New Roman"/>
+          <w:kern w:val="0"/>
+          <w:sz w:val="24"/>
+          <w14:ligatures w14:val="none"/>
+        </w:rPr>
+      </w:pPr>
+      <w:r>
+        <w:rPr>
+          <w:rFonts w:ascii="Times New Roman" w:eastAsia="宋体" w:hAnsi="Times New Roman" w:cs="Times New Roman"/>
+          <w:kern w:val="0"/>
+          <w:sz w:val="24"/>
+          <w14:ligatures w14:val="none"/>
+        </w:rPr>
         <w:t>For the second broad purpose, the present project focused on two representative conditions derived from the conceptual framework introduced above. Sleep hours and stress level were treated as conditions primarily originating from behavioral and psychological domains, respectively. A large body of studies has suggested that both factors are associated with performance across different cognitive tasks (</w:t>
       </w:r>
       <w:proofErr w:type="spellStart"/>
@@ -1393,7 +1407,7 @@
           <w:bCs/>
           <w:sz w:val="24"/>
         </w:rPr>
-        <w:t>:</w:t>
+        <w:t xml:space="preserve"> (EDA):</w:t>
       </w:r>
     </w:p>
     <w:p>
@@ -1475,28 +1489,126 @@
           <w:rFonts w:ascii="Times New Roman" w:hAnsi="Times New Roman" w:cs="Times New Roman"/>
           <w:sz w:val="24"/>
         </w:rPr>
-        <w:t xml:space="preserve"> directory of the project repository. Before the formal analyses, an initial description and exploratory analysis of the dataset were conducted</w:t>
-      </w:r>
-      <w:r>
-        <w:rPr>
-          <w:rFonts w:ascii="Times New Roman" w:hAnsi="Times New Roman" w:cs="Times New Roman"/>
-          <w:sz w:val="24"/>
-        </w:rPr>
-        <w:t xml:space="preserve"> firstly</w:t>
-      </w:r>
-      <w:r>
-        <w:rPr>
-          <w:rFonts w:ascii="Times New Roman" w:hAnsi="Times New Roman" w:cs="Times New Roman"/>
-          <w:sz w:val="24"/>
-        </w:rPr>
-        <w:t xml:space="preserve">. The dataset contained 60 observations and 14 variables. </w:t>
-      </w:r>
-      <w:r>
-        <w:rPr>
-          <w:rFonts w:ascii="Times New Roman" w:hAnsi="Times New Roman" w:cs="Times New Roman"/>
-          <w:sz w:val="24"/>
-        </w:rPr>
-        <w:t>For these variables, only the variable gender is binary categorical variable, while all other variables are continuous. Then, i</w:t>
+        <w:t xml:space="preserve"> directory of the project repository. </w:t>
+      </w:r>
+      <w:r>
+        <w:rPr>
+          <w:rFonts w:ascii="Times New Roman" w:hAnsi="Times New Roman" w:cs="Times New Roman"/>
+          <w:sz w:val="24"/>
+        </w:rPr>
+        <w:t>Prior to formal analyses, an initial descriptive and exploratory analysis was conducted.</w:t>
+      </w:r>
+      <w:r>
+        <w:rPr>
+          <w:rFonts w:ascii="Times New Roman" w:hAnsi="Times New Roman" w:cs="Times New Roman"/>
+          <w:sz w:val="24"/>
+        </w:rPr>
+        <w:t xml:space="preserve"> The dataset contained 60 observations and 14 variables. </w:t>
+      </w:r>
+      <w:r>
+        <w:rPr>
+          <w:rFonts w:ascii="Times New Roman" w:hAnsi="Times New Roman" w:cs="Times New Roman"/>
+          <w:sz w:val="24"/>
+        </w:rPr>
+        <w:t>For these variables, only the variable gender is binary categorical variable</w:t>
+      </w:r>
+      <w:r>
+        <w:rPr>
+          <w:rFonts w:ascii="Times New Roman" w:hAnsi="Times New Roman" w:cs="Times New Roman" w:hint="eastAsia"/>
+          <w:sz w:val="24"/>
+        </w:rPr>
+        <w:t xml:space="preserve"> </w:t>
+      </w:r>
+      <w:r>
+        <w:rPr>
+          <w:rFonts w:ascii="Times New Roman" w:hAnsi="Times New Roman" w:cs="Times New Roman"/>
+          <w:sz w:val="24"/>
+        </w:rPr>
+        <w:t>(</w:t>
+      </w:r>
+      <w:r>
+        <w:rPr>
+          <w:rFonts w:ascii="Times New Roman" w:hAnsi="Times New Roman" w:cs="Times New Roman"/>
+          <w:sz w:val="24"/>
+        </w:rPr>
+        <w:t>male vs. female)</w:t>
+      </w:r>
+      <w:r>
+        <w:rPr>
+          <w:rFonts w:ascii="Times New Roman" w:hAnsi="Times New Roman" w:cs="Times New Roman"/>
+          <w:sz w:val="24"/>
+        </w:rPr>
+        <w:t xml:space="preserve">, while all other variables are continuous. </w:t>
+      </w:r>
+      <w:r>
+        <w:rPr>
+          <w:rFonts w:ascii="Times New Roman" w:hAnsi="Times New Roman" w:cs="Times New Roman"/>
+          <w:sz w:val="24"/>
+        </w:rPr>
+        <w:t xml:space="preserve">Descriptive statistics were </w:t>
+      </w:r>
+      <w:r>
+        <w:rPr>
+          <w:rFonts w:ascii="Times New Roman" w:hAnsi="Times New Roman" w:cs="Times New Roman"/>
+          <w:sz w:val="24"/>
+        </w:rPr>
+        <w:t>subsequently</w:t>
+      </w:r>
+      <w:r>
+        <w:rPr>
+          <w:rFonts w:ascii="Times New Roman" w:hAnsi="Times New Roman" w:cs="Times New Roman"/>
+          <w:sz w:val="24"/>
+        </w:rPr>
+        <w:t xml:space="preserve"> examined to characterize the distributions and central tendencies of the variables in the dataset.</w:t>
+      </w:r>
+      <w:r>
+        <w:rPr>
+          <w:rFonts w:ascii="Times New Roman" w:hAnsi="Times New Roman" w:cs="Times New Roman"/>
+          <w:sz w:val="24"/>
+        </w:rPr>
+        <w:t xml:space="preserve"> </w:t>
+      </w:r>
+      <w:r>
+        <w:rPr>
+          <w:rFonts w:ascii="Times New Roman" w:hAnsi="Times New Roman" w:cs="Times New Roman"/>
+          <w:sz w:val="24"/>
+        </w:rPr>
+        <w:t>Here, t</w:t>
+      </w:r>
+      <w:r>
+        <w:rPr>
+          <w:rFonts w:ascii="Times New Roman" w:hAnsi="Times New Roman" w:cs="Times New Roman"/>
+          <w:sz w:val="24"/>
+        </w:rPr>
+        <w:t xml:space="preserve">able 1 presents the descriptive summary of the primary </w:t>
+      </w:r>
+      <w:r>
+        <w:rPr>
+          <w:rFonts w:ascii="Times New Roman" w:hAnsi="Times New Roman" w:cs="Times New Roman"/>
+          <w:sz w:val="24"/>
+        </w:rPr>
+        <w:t xml:space="preserve">continuous </w:t>
+      </w:r>
+      <w:r>
+        <w:rPr>
+          <w:rFonts w:ascii="Times New Roman" w:hAnsi="Times New Roman" w:cs="Times New Roman"/>
+          <w:sz w:val="24"/>
+        </w:rPr>
+        <w:t>variables.</w:t>
+      </w:r>
+      <w:r>
+        <w:rPr>
+          <w:rFonts w:ascii="Times New Roman" w:hAnsi="Times New Roman" w:cs="Times New Roman"/>
+          <w:sz w:val="24"/>
+        </w:rPr>
+        <w:t xml:space="preserve"> Eventually,</w:t>
+      </w:r>
+      <w:r>
+        <w:rPr>
+          <w:rFonts w:ascii="Times New Roman" w:hAnsi="Times New Roman" w:cs="Times New Roman"/>
+          <w:sz w:val="24"/>
+        </w:rPr>
+        <w:t xml:space="preserve"> i</w:t>
       </w:r>
       <w:r>
         <w:rPr>
@@ -1510,105 +1622,88 @@
           <w:rFonts w:ascii="Times New Roman" w:hAnsi="Times New Roman" w:cs="Times New Roman"/>
           <w:sz w:val="24"/>
         </w:rPr>
-        <w:t xml:space="preserve"> that there </w:t>
-      </w:r>
-      <w:r>
-        <w:rPr>
-          <w:rFonts w:ascii="Times New Roman" w:hAnsi="Times New Roman" w:cs="Times New Roman"/>
-          <w:sz w:val="24"/>
-        </w:rPr>
-        <w:t>are</w:t>
-      </w:r>
-      <w:r>
-        <w:rPr>
-          <w:rFonts w:ascii="Times New Roman" w:hAnsi="Times New Roman" w:cs="Times New Roman"/>
-          <w:sz w:val="24"/>
-        </w:rPr>
-        <w:t xml:space="preserve"> no missing values or duplicated values in this dataset as described, th</w:t>
-      </w:r>
-      <w:r>
-        <w:rPr>
-          <w:rFonts w:ascii="Times New Roman" w:hAnsi="Times New Roman" w:cs="Times New Roman"/>
-          <w:sz w:val="24"/>
-        </w:rPr>
-        <w:t>us</w:t>
-      </w:r>
-      <w:r>
-        <w:rPr>
-          <w:rFonts w:ascii="Times New Roman" w:hAnsi="Times New Roman" w:cs="Times New Roman"/>
-          <w:sz w:val="24"/>
-        </w:rPr>
-        <w:t>, there is no need for</w:t>
-      </w:r>
-      <w:r>
-        <w:rPr>
-          <w:rFonts w:ascii="Times New Roman" w:hAnsi="Times New Roman" w:cs="Times New Roman"/>
-          <w:sz w:val="24"/>
-        </w:rPr>
-        <w:t xml:space="preserve"> missing-data handling and</w:t>
-      </w:r>
-      <w:r>
-        <w:rPr>
-          <w:rFonts w:ascii="Times New Roman" w:hAnsi="Times New Roman" w:cs="Times New Roman"/>
-          <w:sz w:val="24"/>
+        <w:t xml:space="preserve"> that there are no missing values or duplicated values in this dataset as described, th</w:t>
+      </w:r>
+      <w:r>
+        <w:rPr>
+          <w:rFonts w:ascii="Times New Roman" w:hAnsi="Times New Roman" w:cs="Times New Roman"/>
+          <w:sz w:val="24"/>
+        </w:rPr>
+        <w:t>erefore</w:t>
+      </w:r>
+      <w:r>
+        <w:rPr>
+          <w:rFonts w:ascii="Times New Roman" w:hAnsi="Times New Roman" w:cs="Times New Roman"/>
+          <w:sz w:val="24"/>
+        </w:rPr>
+        <w:t xml:space="preserve">, </w:t>
+      </w:r>
+      <w:r>
+        <w:rPr>
+          <w:rFonts w:ascii="Times New Roman" w:hAnsi="Times New Roman" w:cs="Times New Roman"/>
+          <w:sz w:val="24"/>
+        </w:rPr>
+        <w:t>there is no need</w:t>
+      </w:r>
+      <w:r>
+        <w:rPr>
+          <w:rFonts w:ascii="Times New Roman" w:hAnsi="Times New Roman" w:cs="Times New Roman"/>
+          <w:sz w:val="24"/>
+        </w:rPr>
+        <w:t xml:space="preserve"> for imputation or further data cleaning</w:t>
+      </w:r>
+    </w:p>
+    <w:p>
+      <w:pPr>
+        <w:spacing w:after="0" w:line="240" w:lineRule="auto"/>
+        <w:jc w:val="both"/>
+        <w:rPr>
+          <w:rFonts w:ascii="Times New Roman" w:hAnsi="Times New Roman" w:cs="Times New Roman"/>
+          <w:b/>
+          <w:bCs/>
+          <w:sz w:val="20"/>
+          <w:szCs w:val="20"/>
+        </w:rPr>
+      </w:pPr>
+    </w:p>
+    <w:p>
+      <w:pPr>
+        <w:spacing w:after="0" w:line="240" w:lineRule="auto"/>
+        <w:jc w:val="both"/>
+        <w:rPr>
+          <w:rFonts w:ascii="Times New Roman" w:hAnsi="Times New Roman" w:cs="Times New Roman" w:hint="eastAsia"/>
+          <w:b/>
+          <w:bCs/>
+          <w:sz w:val="24"/>
+        </w:rPr>
+      </w:pPr>
+      <w:r>
+        <w:rPr>
+          <w:rFonts w:ascii="Times New Roman" w:hAnsi="Times New Roman" w:cs="Times New Roman"/>
+          <w:b/>
+          <w:bCs/>
+          <w:sz w:val="20"/>
+          <w:szCs w:val="20"/>
+        </w:rPr>
+        <w:t>Table 1.</w:t>
+      </w:r>
+      <w:r>
+        <w:rPr>
+          <w:rFonts w:ascii="Times New Roman" w:hAnsi="Times New Roman" w:cs="Times New Roman" w:hint="eastAsia"/>
+          <w:b/>
+          <w:bCs/>
+          <w:sz w:val="20"/>
+          <w:szCs w:val="20"/>
         </w:rPr>
         <w:t xml:space="preserve"> </w:t>
       </w:r>
       <w:r>
         <w:rPr>
           <w:rFonts w:ascii="Times New Roman" w:hAnsi="Times New Roman" w:cs="Times New Roman"/>
-          <w:sz w:val="24"/>
-        </w:rPr>
-        <w:t xml:space="preserve">further </w:t>
-      </w:r>
-      <w:r>
-        <w:rPr>
-          <w:rFonts w:ascii="Times New Roman" w:hAnsi="Times New Roman" w:cs="Times New Roman"/>
-          <w:sz w:val="24"/>
-        </w:rPr>
-        <w:t>measurements</w:t>
-      </w:r>
-      <w:r>
-        <w:rPr>
-          <w:rFonts w:ascii="Times New Roman" w:hAnsi="Times New Roman" w:cs="Times New Roman"/>
-          <w:sz w:val="24"/>
-        </w:rPr>
-        <w:t>. Descriptive statistics were then examined to characterize the distributions and central tendencies of the variables in the dataset.</w:t>
-      </w:r>
-      <w:r>
-        <w:rPr>
-          <w:rFonts w:ascii="Times New Roman" w:hAnsi="Times New Roman" w:cs="Times New Roman"/>
-          <w:sz w:val="24"/>
-        </w:rPr>
-        <w:t xml:space="preserve"> </w:t>
-      </w:r>
-      <w:r>
-        <w:rPr>
-          <w:rFonts w:ascii="Times New Roman" w:hAnsi="Times New Roman" w:cs="Times New Roman"/>
-          <w:sz w:val="24"/>
-        </w:rPr>
-        <w:t xml:space="preserve">Table 1 presents the descriptive summary of the primary </w:t>
-      </w:r>
-      <w:r>
-        <w:rPr>
-          <w:rFonts w:ascii="Times New Roman" w:hAnsi="Times New Roman" w:cs="Times New Roman"/>
-          <w:sz w:val="24"/>
-        </w:rPr>
-        <w:t xml:space="preserve">continuous </w:t>
-      </w:r>
-      <w:r>
-        <w:rPr>
-          <w:rFonts w:ascii="Times New Roman" w:hAnsi="Times New Roman" w:cs="Times New Roman"/>
-          <w:sz w:val="24"/>
-        </w:rPr>
-        <w:t>variables.</w:t>
-      </w:r>
-      <w:r>
-        <w:rPr>
-          <w:rFonts w:ascii="Times New Roman" w:hAnsi="Times New Roman" w:cs="Times New Roman"/>
-          <w:sz w:val="24"/>
-        </w:rPr>
-        <w:t xml:space="preserve"> </w:t>
+          <w:sz w:val="20"/>
+          <w:szCs w:val="20"/>
+        </w:rPr>
+        <w:t>Descriptive statistics for the primary continuous variables.</w:t>
       </w:r>
     </w:p>
     <w:tbl>
@@ -1639,18 +1734,14 @@
             <w:pPr>
               <w:rPr>
                 <w:rFonts w:ascii="Times New Roman" w:hAnsi="Times New Roman" w:cs="Times New Roman" w:hint="eastAsia"/>
-                <w:b w:val="0"/>
-                <w:bCs w:val="0"/>
-                <w:sz w:val="20"/>
-                <w:szCs w:val="20"/>
-                <w:lang w:val="fr-CA"/>
-              </w:rPr>
-            </w:pPr>
-            <w:r>
-              <w:rPr>
-                <w:rFonts w:ascii="Times New Roman" w:hAnsi="Times New Roman" w:cs="Times New Roman"/>
-                <w:b w:val="0"/>
-                <w:bCs w:val="0"/>
+                <w:sz w:val="20"/>
+                <w:szCs w:val="20"/>
+                <w:lang w:val="fr-CA"/>
+              </w:rPr>
+            </w:pPr>
+            <w:r>
+              <w:rPr>
+                <w:rFonts w:ascii="Times New Roman" w:hAnsi="Times New Roman" w:cs="Times New Roman"/>
                 <w:sz w:val="20"/>
                 <w:szCs w:val="20"/>
                 <w:lang w:val="fr-CA"/>
@@ -1668,8 +1759,6 @@
               <w:cnfStyle w:val="100000000000" w:firstRow="1" w:lastRow="0" w:firstColumn="0" w:lastColumn="0" w:oddVBand="0" w:evenVBand="0" w:oddHBand="0" w:evenHBand="0" w:firstRowFirstColumn="0" w:firstRowLastColumn="0" w:lastRowFirstColumn="0" w:lastRowLastColumn="0"/>
               <w:rPr>
                 <w:rFonts w:ascii="Times New Roman" w:hAnsi="Times New Roman" w:cs="Times New Roman" w:hint="eastAsia"/>
-                <w:b w:val="0"/>
-                <w:bCs w:val="0"/>
                 <w:sz w:val="20"/>
                 <w:szCs w:val="20"/>
               </w:rPr>
@@ -1677,8 +1766,6 @@
             <w:r>
               <w:rPr>
                 <w:rFonts w:ascii="Times New Roman" w:hAnsi="Times New Roman" w:cs="Times New Roman" w:hint="eastAsia"/>
-                <w:b w:val="0"/>
-                <w:bCs w:val="0"/>
                 <w:sz w:val="20"/>
                 <w:szCs w:val="20"/>
               </w:rPr>
@@ -1695,8 +1782,6 @@
               <w:cnfStyle w:val="100000000000" w:firstRow="1" w:lastRow="0" w:firstColumn="0" w:lastColumn="0" w:oddVBand="0" w:evenVBand="0" w:oddHBand="0" w:evenHBand="0" w:firstRowFirstColumn="0" w:firstRowLastColumn="0" w:lastRowFirstColumn="0" w:lastRowLastColumn="0"/>
               <w:rPr>
                 <w:rFonts w:ascii="Times New Roman" w:hAnsi="Times New Roman" w:cs="Times New Roman" w:hint="eastAsia"/>
-                <w:b w:val="0"/>
-                <w:bCs w:val="0"/>
                 <w:sz w:val="20"/>
                 <w:szCs w:val="20"/>
               </w:rPr>
@@ -1704,8 +1789,6 @@
             <w:r>
               <w:rPr>
                 <w:rFonts w:ascii="Times New Roman" w:hAnsi="Times New Roman" w:cs="Times New Roman" w:hint="eastAsia"/>
-                <w:b w:val="0"/>
-                <w:bCs w:val="0"/>
                 <w:sz w:val="20"/>
                 <w:szCs w:val="20"/>
               </w:rPr>
@@ -1722,8 +1805,6 @@
               <w:cnfStyle w:val="100000000000" w:firstRow="1" w:lastRow="0" w:firstColumn="0" w:lastColumn="0" w:oddVBand="0" w:evenVBand="0" w:oddHBand="0" w:evenHBand="0" w:firstRowFirstColumn="0" w:firstRowLastColumn="0" w:lastRowFirstColumn="0" w:lastRowLastColumn="0"/>
               <w:rPr>
                 <w:rFonts w:ascii="Times New Roman" w:hAnsi="Times New Roman" w:cs="Times New Roman"/>
-                <w:b w:val="0"/>
-                <w:bCs w:val="0"/>
                 <w:sz w:val="20"/>
                 <w:szCs w:val="20"/>
               </w:rPr>
@@ -1731,8 +1812,6 @@
             <w:r>
               <w:rPr>
                 <w:rFonts w:ascii="Times New Roman" w:hAnsi="Times New Roman" w:cs="Times New Roman" w:hint="eastAsia"/>
-                <w:b w:val="0"/>
-                <w:bCs w:val="0"/>
                 <w:sz w:val="20"/>
                 <w:szCs w:val="20"/>
               </w:rPr>
@@ -1749,8 +1828,6 @@
               <w:cnfStyle w:val="100000000000" w:firstRow="1" w:lastRow="0" w:firstColumn="0" w:lastColumn="0" w:oddVBand="0" w:evenVBand="0" w:oddHBand="0" w:evenHBand="0" w:firstRowFirstColumn="0" w:firstRowLastColumn="0" w:lastRowFirstColumn="0" w:lastRowLastColumn="0"/>
               <w:rPr>
                 <w:rFonts w:ascii="Times New Roman" w:hAnsi="Times New Roman" w:cs="Times New Roman"/>
-                <w:b w:val="0"/>
-                <w:bCs w:val="0"/>
                 <w:sz w:val="20"/>
                 <w:szCs w:val="20"/>
               </w:rPr>
@@ -1758,8 +1835,6 @@
             <w:r>
               <w:rPr>
                 <w:rFonts w:ascii="Times New Roman" w:hAnsi="Times New Roman" w:cs="Times New Roman" w:hint="eastAsia"/>
-                <w:b w:val="0"/>
-                <w:bCs w:val="0"/>
                 <w:sz w:val="20"/>
                 <w:szCs w:val="20"/>
               </w:rPr>
@@ -1776,8 +1851,6 @@
               <w:cnfStyle w:val="100000000000" w:firstRow="1" w:lastRow="0" w:firstColumn="0" w:lastColumn="0" w:oddVBand="0" w:evenVBand="0" w:oddHBand="0" w:evenHBand="0" w:firstRowFirstColumn="0" w:firstRowLastColumn="0" w:lastRowFirstColumn="0" w:lastRowLastColumn="0"/>
               <w:rPr>
                 <w:rFonts w:ascii="Times New Roman" w:hAnsi="Times New Roman" w:cs="Times New Roman" w:hint="eastAsia"/>
-                <w:b w:val="0"/>
-                <w:bCs w:val="0"/>
                 <w:sz w:val="20"/>
                 <w:szCs w:val="20"/>
               </w:rPr>
@@ -1785,8 +1858,6 @@
             <w:r>
               <w:rPr>
                 <w:rFonts w:ascii="Times New Roman" w:hAnsi="Times New Roman" w:cs="Times New Roman" w:hint="eastAsia"/>
-                <w:b w:val="0"/>
-                <w:bCs w:val="0"/>
                 <w:sz w:val="20"/>
                 <w:szCs w:val="20"/>
               </w:rPr>
@@ -1803,8 +1874,6 @@
               <w:cnfStyle w:val="100000000000" w:firstRow="1" w:lastRow="0" w:firstColumn="0" w:lastColumn="0" w:oddVBand="0" w:evenVBand="0" w:oddHBand="0" w:evenHBand="0" w:firstRowFirstColumn="0" w:firstRowLastColumn="0" w:lastRowFirstColumn="0" w:lastRowLastColumn="0"/>
               <w:rPr>
                 <w:rFonts w:ascii="Times New Roman" w:hAnsi="Times New Roman" w:cs="Times New Roman" w:hint="eastAsia"/>
-                <w:b w:val="0"/>
-                <w:bCs w:val="0"/>
                 <w:sz w:val="20"/>
                 <w:szCs w:val="20"/>
               </w:rPr>
@@ -1812,8 +1881,6 @@
             <w:r>
               <w:rPr>
                 <w:rFonts w:ascii="Times New Roman" w:hAnsi="Times New Roman" w:cs="Times New Roman" w:hint="eastAsia"/>
-                <w:b w:val="0"/>
-                <w:bCs w:val="0"/>
                 <w:sz w:val="20"/>
                 <w:szCs w:val="20"/>
               </w:rPr>
@@ -1822,8 +1889,6 @@
             <w:r>
               <w:rPr>
                 <w:rFonts w:ascii="Times New Roman" w:hAnsi="Times New Roman" w:cs="Times New Roman"/>
-                <w:b w:val="0"/>
-                <w:bCs w:val="0"/>
                 <w:sz w:val="20"/>
                 <w:szCs w:val="20"/>
               </w:rPr>
@@ -2758,7 +2823,6 @@
                 <w:lang w:val="fr-CA"/>
               </w:rPr>
             </w:pPr>
-            <w:proofErr w:type="spellStart"/>
             <w:r>
               <w:rPr>
                 <w:rFonts w:ascii="Times New Roman" w:hAnsi="Times New Roman" w:cs="Times New Roman"/>
@@ -2768,9 +2832,30 @@
                 <w:szCs w:val="20"/>
                 <w:lang w:val="fr-CA"/>
               </w:rPr>
-              <w:t>NBack</w:t>
-            </w:r>
-            <w:proofErr w:type="spellEnd"/>
+              <w:t>N</w:t>
+            </w:r>
+            <w:r>
+              <w:rPr>
+                <w:rFonts w:ascii="Times New Roman" w:hAnsi="Times New Roman" w:cs="Times New Roman" w:hint="eastAsia"/>
+                <w:b w:val="0"/>
+                <w:bCs w:val="0"/>
+                <w:sz w:val="20"/>
+                <w:szCs w:val="20"/>
+                <w:lang w:val="fr-CA"/>
+              </w:rPr>
+              <w:t>-</w:t>
+            </w:r>
+            <w:r>
+              <w:rPr>
+                <w:rFonts w:ascii="Times New Roman" w:hAnsi="Times New Roman" w:cs="Times New Roman"/>
+                <w:b w:val="0"/>
+                <w:bCs w:val="0"/>
+                <w:sz w:val="20"/>
+                <w:szCs w:val="20"/>
+                <w:lang w:val="fr-CA"/>
+              </w:rPr>
+              <w:t>Back</w:t>
+            </w:r>
             <w:r>
               <w:rPr>
                 <w:rFonts w:ascii="Times New Roman" w:hAnsi="Times New Roman" w:cs="Times New Roman"/>
@@ -4474,15 +4559,47 @@
           <w:rFonts w:ascii="Times New Roman" w:hAnsi="Times New Roman" w:cs="Times New Roman"/>
           <w:sz w:val="20"/>
           <w:szCs w:val="20"/>
+          <w:lang w:val="fr-CA"/>
         </w:rPr>
       </w:pPr>
       <w:r>
         <w:rPr>
-          <w:rFonts w:ascii="Times New Roman" w:hAnsi="Times New Roman" w:cs="Times New Roman"/>
+          <w:rFonts w:ascii="Times New Roman" w:hAnsi="Times New Roman" w:cs="Times New Roman" w:hint="eastAsia"/>
+          <w:b/>
+          <w:bCs/>
+          <w:noProof/>
           <w:sz w:val="20"/>
           <w:szCs w:val="20"/>
         </w:rPr>
-        <w:t xml:space="preserve">Table 1. Descriptive statistics for the primary continuous variables. Q1 and Q3 represent first and </w:t>
+        <w:t>Note</w:t>
+      </w:r>
+      <w:r>
+        <w:rPr>
+          <w:rFonts w:ascii="Times New Roman" w:hAnsi="Times New Roman" w:cs="Times New Roman"/>
+          <w:b/>
+          <w:bCs/>
+          <w:noProof/>
+          <w:sz w:val="20"/>
+          <w:szCs w:val="20"/>
+        </w:rPr>
+        <w:t> :</w:t>
+      </w:r>
+      <w:r>
+        <w:rPr>
+          <w:rFonts w:ascii="Times New Roman" w:hAnsi="Times New Roman" w:cs="Times New Roman"/>
+          <w:noProof/>
+          <w:sz w:val="20"/>
+          <w:szCs w:val="20"/>
+        </w:rPr>
+        <w:t xml:space="preserve"> </w:t>
+      </w:r>
+      <w:r>
+        <w:rPr>
+          <w:rFonts w:ascii="Times New Roman" w:hAnsi="Times New Roman" w:cs="Times New Roman"/>
+          <w:sz w:val="20"/>
+          <w:szCs w:val="20"/>
+        </w:rPr>
+        <w:t xml:space="preserve">Q1 and Q3 represent first and </w:t>
       </w:r>
       <w:r>
         <w:rPr>
@@ -4532,7 +4649,401 @@
           <w:sz w:val="20"/>
           <w:szCs w:val="20"/>
         </w:rPr>
-        <w:t xml:space="preserve"> percentile), respectively</w:t>
+        <w:t xml:space="preserve"> percentile)</w:t>
+      </w:r>
+    </w:p>
+    <w:p>
+      <w:pPr>
+        <w:spacing w:after="0" w:line="240" w:lineRule="auto"/>
+        <w:jc w:val="both"/>
+        <w:rPr>
+          <w:rFonts w:ascii="Times New Roman" w:hAnsi="Times New Roman" w:cs="Times New Roman"/>
+          <w:sz w:val="20"/>
+          <w:szCs w:val="20"/>
+        </w:rPr>
+      </w:pPr>
+      <w:r>
+        <w:rPr>
+          <w:rFonts w:ascii="Times New Roman" w:hAnsi="Times New Roman" w:cs="Times New Roman"/>
+          <w:sz w:val="20"/>
+          <w:szCs w:val="20"/>
+        </w:rPr>
+        <w:t xml:space="preserve"> </w:t>
+      </w:r>
+    </w:p>
+    <w:p>
+      <w:pPr>
+        <w:spacing w:after="0" w:line="240" w:lineRule="auto"/>
+        <w:jc w:val="both"/>
+        <w:rPr>
+          <w:rFonts w:ascii="Times New Roman" w:hAnsi="Times New Roman" w:cs="Times New Roman"/>
+          <w:sz w:val="20"/>
+          <w:szCs w:val="20"/>
+        </w:rPr>
+      </w:pPr>
+      <w:r>
+        <w:rPr>
+          <w:rFonts w:ascii="Times New Roman" w:hAnsi="Times New Roman" w:cs="Times New Roman" w:hint="eastAsia"/>
+          <w:sz w:val="20"/>
+          <w:szCs w:val="20"/>
+        </w:rPr>
+        <w:t xml:space="preserve">  The</w:t>
+      </w:r>
+    </w:p>
+    <w:p>
+      <w:pPr>
+        <w:spacing w:after="0" w:line="240" w:lineRule="auto"/>
+        <w:jc w:val="both"/>
+        <w:rPr>
+          <w:rFonts w:ascii="Times New Roman" w:hAnsi="Times New Roman" w:cs="Times New Roman" w:hint="eastAsia"/>
+          <w:sz w:val="20"/>
+          <w:szCs w:val="20"/>
+        </w:rPr>
+      </w:pPr>
+      <w:r>
+        <w:rPr>
+          <w:rFonts w:ascii="Times New Roman" w:hAnsi="Times New Roman" w:cs="Times New Roman"/>
+          <w:sz w:val="20"/>
+          <w:szCs w:val="20"/>
+        </w:rPr>
+        <w:t>S</w:t>
+      </w:r>
+      <w:r>
+        <w:rPr>
+          <w:rFonts w:ascii="Times New Roman" w:hAnsi="Times New Roman" w:cs="Times New Roman" w:hint="eastAsia"/>
+          <w:sz w:val="20"/>
+          <w:szCs w:val="20"/>
+        </w:rPr>
+        <w:t>dasdasda</w:t>
+      </w:r>
+    </w:p>
+    <w:p>
+      <w:pPr>
+        <w:spacing w:after="0" w:line="240" w:lineRule="auto"/>
+        <w:ind w:firstLineChars="100" w:firstLine="240"/>
+        <w:jc w:val="both"/>
+        <w:rPr>
+          <w:rFonts w:ascii="Times New Roman" w:hAnsi="Times New Roman" w:cs="Times New Roman"/>
+          <w:sz w:val="24"/>
+        </w:rPr>
+      </w:pPr>
+      <w:r>
+        <w:rPr>
+          <w:rFonts w:ascii="Times New Roman" w:hAnsi="Times New Roman" w:cs="Times New Roman"/>
+          <w:sz w:val="24"/>
+        </w:rPr>
+        <w:t xml:space="preserve">The Correlation Matrix Heatmap (CMH), showing zero-order </w:t>
+      </w:r>
+      <w:r>
+        <w:rPr>
+          <w:rFonts w:ascii="Times New Roman" w:hAnsi="Times New Roman" w:cs="Times New Roman" w:hint="eastAsia"/>
+          <w:sz w:val="24"/>
+        </w:rPr>
+        <w:t>c</w:t>
+      </w:r>
+      <w:r>
+        <w:rPr>
+          <w:rFonts w:ascii="Times New Roman" w:hAnsi="Times New Roman" w:cs="Times New Roman"/>
+          <w:sz w:val="24"/>
+        </w:rPr>
+        <w:t xml:space="preserve">orrelations among variables, is useful in EDA because it provides a matrix that can simultaneously display the direction and magnitude of pairwise correlation estimates among multiple variables. The CMH was therefore applied beforehand for multivariate EDA, as shown in Figure 1.2. </w:t>
+      </w:r>
+      <w:r>
+        <w:rPr>
+          <w:rFonts w:ascii="Times New Roman" w:hAnsi="Times New Roman" w:cs="Times New Roman"/>
+          <w:sz w:val="24"/>
+        </w:rPr>
+        <w:t>Visually, t</w:t>
+      </w:r>
+      <w:r>
+        <w:rPr>
+          <w:rFonts w:ascii="Times New Roman" w:hAnsi="Times New Roman" w:cs="Times New Roman"/>
+          <w:sz w:val="24"/>
+        </w:rPr>
+        <w:t xml:space="preserve">he CMH indicates that the magnitude of the observed standardized correlations was generally small and that none of them were statistically significant, suggesting that, in the present sample, there was insufficient evidence to support non-zero population-level pairwise correlations among the examined variables. However, diagnostic assessment remains necessary because the validity of correlation-based inference depends on relevant statistical assumptions, and the absence of statistically significant zero-order correlations does not preclude the usefulness of further model-based analyses </w:t>
+      </w:r>
+      <w:r>
+        <w:rPr>
+          <w:rFonts w:ascii="Times New Roman" w:hAnsi="Times New Roman" w:cs="Times New Roman"/>
+          <w:sz w:val="24"/>
+        </w:rPr>
+        <w:t>examining</w:t>
+      </w:r>
+      <w:r>
+        <w:rPr>
+          <w:rFonts w:ascii="Times New Roman" w:hAnsi="Times New Roman" w:cs="Times New Roman"/>
+          <w:sz w:val="24"/>
+        </w:rPr>
+        <w:t xml:space="preserve"> conditional associations and more specific theoretical relationships</w:t>
+      </w:r>
+      <w:r>
+        <w:rPr>
+          <w:rFonts w:ascii="Times New Roman" w:hAnsi="Times New Roman" w:cs="Times New Roman"/>
+          <w:sz w:val="24"/>
+        </w:rPr>
+        <w:t xml:space="preserve"> in subsequent formal analyses</w:t>
+      </w:r>
+    </w:p>
+    <w:p>
+      <w:pPr>
+        <w:spacing w:after="0" w:line="240" w:lineRule="auto"/>
+        <w:jc w:val="both"/>
+        <w:rPr>
+          <w:rFonts w:ascii="Times New Roman" w:hAnsi="Times New Roman" w:cs="Times New Roman"/>
+          <w:i/>
+          <w:iCs/>
+          <w:sz w:val="24"/>
+        </w:rPr>
+      </w:pPr>
+    </w:p>
+    <w:p>
+      <w:pPr>
+        <w:spacing w:after="0" w:line="240" w:lineRule="auto"/>
+        <w:jc w:val="both"/>
+        <w:rPr>
+          <w:rStyle w:val="af4"/>
+          <w:rFonts w:ascii="Times New Roman" w:hAnsi="Times New Roman" w:cs="Times New Roman"/>
+          <w:sz w:val="20"/>
+          <w:szCs w:val="20"/>
+          <w:lang w:val="fr-CA"/>
+        </w:rPr>
+      </w:pPr>
+    </w:p>
+    <w:p>
+      <w:pPr>
+        <w:spacing w:after="0" w:line="240" w:lineRule="auto"/>
+        <w:jc w:val="both"/>
+        <w:rPr>
+          <w:rFonts w:ascii="Times New Roman" w:hAnsi="Times New Roman" w:cs="Times New Roman"/>
+          <w:sz w:val="20"/>
+          <w:szCs w:val="20"/>
+        </w:rPr>
+      </w:pPr>
+      <w:r>
+        <w:rPr>
+          <w:rFonts w:ascii="Times New Roman" w:hAnsi="Times New Roman" w:cs="Times New Roman"/>
+          <w:i/>
+          <w:iCs/>
+          <w:noProof/>
+          <w:sz w:val="20"/>
+          <w:szCs w:val="20"/>
+        </w:rPr>
+        <w:drawing>
+          <wp:anchor distT="0" distB="0" distL="114300" distR="114300" simplePos="0" relativeHeight="251658240" behindDoc="0" locked="0" layoutInCell="1" allowOverlap="1" wp14:anchorId="6C018DE2" wp14:editId="76458CA2">
+            <wp:simplePos x="0" y="0"/>
+            <wp:positionH relativeFrom="column">
+              <wp:posOffset>1270</wp:posOffset>
+            </wp:positionH>
+            <wp:positionV relativeFrom="paragraph">
+              <wp:posOffset>403072</wp:posOffset>
+            </wp:positionV>
+            <wp:extent cx="5262245" cy="3794760"/>
+            <wp:effectExtent l="0" t="0" r="0" b="2540"/>
+            <wp:wrapSquare wrapText="bothSides"/>
+            <wp:docPr id="1973497771" name="图片 1" descr="图片包含 日程表&#10;&#10;描述已自动生成"/>
+            <wp:cNvGraphicFramePr>
+              <a:graphicFrameLocks xmlns:a="http://schemas.openxmlformats.org/drawingml/2006/main" noChangeAspect="1"/>
+            </wp:cNvGraphicFramePr>
+            <a:graphic xmlns:a="http://schemas.openxmlformats.org/drawingml/2006/main">
+              <a:graphicData uri="http://schemas.openxmlformats.org/drawingml/2006/picture">
+                <pic:pic xmlns:pic="http://schemas.openxmlformats.org/drawingml/2006/picture">
+                  <pic:nvPicPr>
+                    <pic:cNvPr id="1973497771" name="图片 1" descr="图片包含 日程表&#10;&#10;描述已自动生成"/>
+                    <pic:cNvPicPr/>
+                  </pic:nvPicPr>
+                  <pic:blipFill>
+                    <a:blip r:embed="rId7" cstate="print">
+                      <a:extLst>
+                        <a:ext uri="{28A0092B-C50C-407E-A947-70E740481C1C}">
+                          <a14:useLocalDpi xmlns:a14="http://schemas.microsoft.com/office/drawing/2010/main" val="0"/>
+                        </a:ext>
+                      </a:extLst>
+                    </a:blip>
+                    <a:stretch>
+                      <a:fillRect/>
+                    </a:stretch>
+                  </pic:blipFill>
+                  <pic:spPr>
+                    <a:xfrm>
+                      <a:off x="0" y="0"/>
+                      <a:ext cx="5262245" cy="3794760"/>
+                    </a:xfrm>
+                    <a:prstGeom prst="rect">
+                      <a:avLst/>
+                    </a:prstGeom>
+                  </pic:spPr>
+                </pic:pic>
+              </a:graphicData>
+            </a:graphic>
+            <wp14:sizeRelH relativeFrom="page">
+              <wp14:pctWidth>0</wp14:pctWidth>
+            </wp14:sizeRelH>
+            <wp14:sizeRelV relativeFrom="page">
+              <wp14:pctHeight>0</wp14:pctHeight>
+            </wp14:sizeRelV>
+          </wp:anchor>
+        </w:drawing>
+      </w:r>
+      <w:r>
+        <w:rPr>
+          <w:rStyle w:val="af4"/>
+          <w:rFonts w:ascii="Times New Roman" w:hAnsi="Times New Roman" w:cs="Times New Roman"/>
+          <w:sz w:val="20"/>
+          <w:szCs w:val="20"/>
+        </w:rPr>
+        <w:t>Figure 1.2</w:t>
+      </w:r>
+      <w:r>
+        <w:rPr>
+          <w:rFonts w:ascii="Times New Roman" w:hAnsi="Times New Roman" w:cs="Times New Roman"/>
+          <w:sz w:val="20"/>
+          <w:szCs w:val="20"/>
+        </w:rPr>
+        <w:br/>
+      </w:r>
+      <w:r>
+        <w:rPr>
+          <w:rStyle w:val="af2"/>
+          <w:rFonts w:ascii="Times New Roman" w:hAnsi="Times New Roman" w:cs="Times New Roman"/>
+          <w:sz w:val="20"/>
+          <w:szCs w:val="20"/>
+        </w:rPr>
+        <w:t>Correlation Matrix Heatmap (CMH) for Multivariate EDA</w:t>
+      </w:r>
+    </w:p>
+    <w:p>
+      <w:pPr>
+        <w:spacing w:after="0" w:line="240" w:lineRule="auto"/>
+        <w:jc w:val="both"/>
+        <w:rPr>
+          <w:rFonts w:ascii="Times New Roman" w:hAnsi="Times New Roman" w:cs="Times New Roman"/>
+          <w:sz w:val="20"/>
+          <w:szCs w:val="20"/>
+        </w:rPr>
+      </w:pPr>
+      <w:r>
+        <w:rPr>
+          <w:rFonts w:ascii="Times New Roman" w:hAnsi="Times New Roman" w:cs="Times New Roman" w:hint="eastAsia"/>
+          <w:i/>
+          <w:iCs/>
+          <w:sz w:val="24"/>
+        </w:rPr>
+        <w:t>Note</w:t>
+      </w:r>
+      <w:r>
+        <w:rPr>
+          <w:rFonts w:ascii="Times New Roman" w:hAnsi="Times New Roman" w:cs="Times New Roman"/>
+          <w:i/>
+          <w:iCs/>
+          <w:sz w:val="20"/>
+          <w:szCs w:val="20"/>
+        </w:rPr>
+        <w:t>.</w:t>
+      </w:r>
+      <w:r>
+        <w:rPr>
+          <w:rFonts w:ascii="Times New Roman" w:hAnsi="Times New Roman" w:cs="Times New Roman"/>
+          <w:sz w:val="20"/>
+          <w:szCs w:val="20"/>
+        </w:rPr>
+        <w:t xml:space="preserve"> Cell values represent zero-order Pearson correlation coefficients. Positive correlations are shown in blue and negative correlations in red, with color intensity indicating the magnitude of the correlation.</w:t>
+      </w:r>
+      <w:r>
+        <w:rPr>
+          <w:rFonts w:ascii="Times New Roman" w:hAnsi="Times New Roman" w:cs="Times New Roman" w:hint="eastAsia"/>
+          <w:sz w:val="20"/>
+          <w:szCs w:val="20"/>
+        </w:rPr>
+        <w:t xml:space="preserve"> </w:t>
+      </w:r>
+      <w:r>
+        <w:rPr>
+          <w:rFonts w:ascii="Times New Roman" w:hAnsi="Times New Roman" w:cs="Times New Roman"/>
+          <w:sz w:val="20"/>
+          <w:szCs w:val="20"/>
+        </w:rPr>
+        <w:t xml:space="preserve">No off-diagonal correlations </w:t>
+      </w:r>
+      <w:proofErr w:type="gramStart"/>
+      <w:r>
+        <w:rPr>
+          <w:rFonts w:ascii="Times New Roman" w:hAnsi="Times New Roman" w:cs="Times New Roman" w:hint="eastAsia"/>
+          <w:sz w:val="20"/>
+          <w:szCs w:val="20"/>
+        </w:rPr>
+        <w:t>reaches</w:t>
+      </w:r>
+      <w:proofErr w:type="gramEnd"/>
+      <w:r>
+        <w:rPr>
+          <w:rFonts w:ascii="Times New Roman" w:hAnsi="Times New Roman" w:cs="Times New Roman" w:hint="eastAsia"/>
+          <w:sz w:val="20"/>
+          <w:szCs w:val="20"/>
+        </w:rPr>
+        <w:t xml:space="preserve"> </w:t>
+      </w:r>
+      <w:r>
+        <w:rPr>
+          <w:rFonts w:ascii="Times New Roman" w:hAnsi="Times New Roman" w:cs="Times New Roman"/>
+          <w:sz w:val="20"/>
+          <w:szCs w:val="20"/>
+        </w:rPr>
+        <w:t xml:space="preserve">statistical significance </w:t>
+      </w:r>
+      <w:r>
+        <w:rPr>
+          <w:rFonts w:ascii="Times New Roman" w:hAnsi="Times New Roman" w:cs="Times New Roman" w:hint="eastAsia"/>
+          <w:sz w:val="20"/>
+          <w:szCs w:val="20"/>
+        </w:rPr>
+        <w:t>i</w:t>
+      </w:r>
+      <w:r>
+        <w:rPr>
+          <w:rFonts w:ascii="Times New Roman" w:hAnsi="Times New Roman" w:cs="Times New Roman"/>
+          <w:sz w:val="20"/>
+          <w:szCs w:val="20"/>
+        </w:rPr>
+        <w:t>n the present sample.</w:t>
+      </w:r>
+    </w:p>
+    <w:p>
+      <w:pPr>
+        <w:spacing w:after="0" w:line="240" w:lineRule="auto"/>
+        <w:jc w:val="both"/>
+        <w:rPr>
+          <w:rFonts w:ascii="Times New Roman" w:hAnsi="Times New Roman" w:cs="Times New Roman" w:hint="eastAsia"/>
+          <w:sz w:val="20"/>
+          <w:szCs w:val="20"/>
+        </w:rPr>
+      </w:pPr>
+    </w:p>
+    <w:p>
+      <w:pPr>
+        <w:spacing w:after="0" w:line="240" w:lineRule="auto"/>
+        <w:jc w:val="both"/>
+        <w:rPr>
+          <w:rFonts w:ascii="Times New Roman" w:hAnsi="Times New Roman" w:cs="Times New Roman"/>
+          <w:sz w:val="24"/>
+        </w:rPr>
+      </w:pPr>
+      <w:r>
+        <w:rPr>
+          <w:rFonts w:ascii="Times New Roman" w:hAnsi="Times New Roman" w:cs="Times New Roman" w:hint="eastAsia"/>
+          <w:b/>
+          <w:bCs/>
+          <w:sz w:val="24"/>
+        </w:rPr>
+        <w:t>-</w:t>
+      </w:r>
+      <w:r>
+        <w:rPr>
+          <w:rFonts w:ascii="Times New Roman" w:hAnsi="Times New Roman" w:cs="Times New Roman"/>
+          <w:b/>
+          <w:bCs/>
+          <w:sz w:val="24"/>
+        </w:rPr>
+        <w:t>Analysis-Specific Data Preprocessing and Preparation</w:t>
       </w:r>
     </w:p>
     <w:sectPr>
@@ -4543,6 +5054,56 @@
     </w:sectPr>
   </w:body>
 </w:document>
+</file>
+
+<file path=word/endnotes.xml><?xml version="1.0" encoding="utf-8"?>
+<w:endnotes xmlns:wpc="http://schemas.microsoft.com/office/word/2010/wordprocessingCanvas" xmlns:cx="http://schemas.microsoft.com/office/drawing/2014/chartex" xmlns:cx1="http://schemas.microsoft.com/office/drawing/2015/9/8/chartex" xmlns:cx2="http://schemas.microsoft.com/office/drawing/2015/10/21/chartex" xmlns:cx3="http://schemas.microsoft.com/office/drawing/2016/5/9/chartex" xmlns:cx4="http://schemas.microsoft.com/office/drawing/2016/5/10/chartex" xmlns:cx5="http://schemas.microsoft.com/office/drawing/2016/5/11/chartex" xmlns:cx6="http://schemas.microsoft.com/office/drawing/2016/5/12/chartex" xmlns:cx7="http://schemas.microsoft.com/office/drawing/2016/5/13/chartex" xmlns:cx8="http://schemas.microsoft.com/office/drawing/2016/5/14/chartex" xmlns:mc="http://schemas.openxmlformats.org/markup-compatibility/2006" xmlns:aink="http://schemas.microsoft.com/office/drawing/2016/ink" xmlns:am3d="http://schemas.microsoft.com/office/drawing/2017/model3d" xmlns:o="urn:schemas-microsoft-com:office:office" xmlns:oel="http://schemas.microsoft.com/office/2019/extlst" xmlns:r="http://schemas.openxmlformats.org/officeDocument/2006/relationships" xmlns:m="http://schemas.openxmlformats.org/officeDocument/2006/math" xmlns:v="urn:schemas-microsoft-com:vml" xmlns:wp14="http://schemas.microsoft.com/office/word/2010/wordprocessingDrawing" xmlns:wp="http://schemas.openxmlformats.org/drawingml/2006/wordprocessingDrawing" xmlns:w10="urn:schemas-microsoft-com:office:word" xmlns:w="http://schemas.openxmlformats.org/wordprocessingml/2006/main" xmlns:w14="http://schemas.microsoft.com/office/word/2010/wordml" xmlns:w15="http://schemas.microsoft.com/office/word/2012/wordml" xmlns:w16cex="http://schemas.microsoft.com/office/word/2018/wordml/cex" xmlns:w16cid="http://schemas.microsoft.com/office/word/2016/wordml/cid" xmlns:w16="http://schemas.microsoft.com/office/word/2018/wordml" xmlns:w16du="http://schemas.microsoft.com/office/word/2023/wordml/word16du" xmlns:w16sdtdh="http://schemas.microsoft.com/office/word/2020/wordml/sdtdatahash" xmlns:w16sdtfl="http://schemas.microsoft.com/office/word/2024/wordml/sdtformatlock" xmlns:w16se="http://schemas.microsoft.com/office/word/2015/wordml/symex" xmlns:wpg="http://schemas.microsoft.com/office/word/2010/wordprocessingGroup" xmlns:wpi="http://schemas.microsoft.com/office/word/2010/wordprocessingInk" xmlns:wne="http://schemas.microsoft.com/office/word/2006/wordml" xmlns:wps="http://schemas.microsoft.com/office/word/2010/wordprocessingShape" mc:Ignorable="w14 w15 w16se w16cid w16 w16cex w16sdtdh w16sdtfl w16du wp14">
+  <w:endnote w:type="separator" w:id="-1">
+    <w:p>
+      <w:pPr>
+        <w:spacing w:after="0" w:line="240" w:lineRule="auto"/>
+      </w:pPr>
+      <w:r>
+        <w:separator/>
+      </w:r>
+    </w:p>
+  </w:endnote>
+  <w:endnote w:type="continuationSeparator" w:id="0">
+    <w:p>
+      <w:pPr>
+        <w:spacing w:after="0" w:line="240" w:lineRule="auto"/>
+      </w:pPr>
+      <w:r>
+        <w:continuationSeparator/>
+      </w:r>
+    </w:p>
+  </w:endnote>
+</w:endnotes>
+</file>
+
+<file path=word/footnotes.xml><?xml version="1.0" encoding="utf-8"?>
+<w:footnotes xmlns:wpc="http://schemas.microsoft.com/office/word/2010/wordprocessingCanvas" xmlns:cx="http://schemas.microsoft.com/office/drawing/2014/chartex" xmlns:cx1="http://schemas.microsoft.com/office/drawing/2015/9/8/chartex" xmlns:cx2="http://schemas.microsoft.com/office/drawing/2015/10/21/chartex" xmlns:cx3="http://schemas.microsoft.com/office/drawing/2016/5/9/chartex" xmlns:cx4="http://schemas.microsoft.com/office/drawing/2016/5/10/chartex" xmlns:cx5="http://schemas.microsoft.com/office/drawing/2016/5/11/chartex" xmlns:cx6="http://schemas.microsoft.com/office/drawing/2016/5/12/chartex" xmlns:cx7="http://schemas.microsoft.com/office/drawing/2016/5/13/chartex" xmlns:cx8="http://schemas.microsoft.com/office/drawing/2016/5/14/chartex" xmlns:mc="http://schemas.openxmlformats.org/markup-compatibility/2006" xmlns:aink="http://schemas.microsoft.com/office/drawing/2016/ink" xmlns:am3d="http://schemas.microsoft.com/office/drawing/2017/model3d" xmlns:o="urn:schemas-microsoft-com:office:office" xmlns:oel="http://schemas.microsoft.com/office/2019/extlst" xmlns:r="http://schemas.openxmlformats.org/officeDocument/2006/relationships" xmlns:m="http://schemas.openxmlformats.org/officeDocument/2006/math" xmlns:v="urn:schemas-microsoft-com:vml" xmlns:wp14="http://schemas.microsoft.com/office/word/2010/wordprocessingDrawing" xmlns:wp="http://schemas.openxmlformats.org/drawingml/2006/wordprocessingDrawing" xmlns:w10="urn:schemas-microsoft-com:office:word" xmlns:w="http://schemas.openxmlformats.org/wordprocessingml/2006/main" xmlns:w14="http://schemas.microsoft.com/office/word/2010/wordml" xmlns:w15="http://schemas.microsoft.com/office/word/2012/wordml" xmlns:w16cex="http://schemas.microsoft.com/office/word/2018/wordml/cex" xmlns:w16cid="http://schemas.microsoft.com/office/word/2016/wordml/cid" xmlns:w16="http://schemas.microsoft.com/office/word/2018/wordml" xmlns:w16du="http://schemas.microsoft.com/office/word/2023/wordml/word16du" xmlns:w16sdtdh="http://schemas.microsoft.com/office/word/2020/wordml/sdtdatahash" xmlns:w16sdtfl="http://schemas.microsoft.com/office/word/2024/wordml/sdtformatlock" xmlns:w16se="http://schemas.microsoft.com/office/word/2015/wordml/symex" xmlns:wpg="http://schemas.microsoft.com/office/word/2010/wordprocessingGroup" xmlns:wpi="http://schemas.microsoft.com/office/word/2010/wordprocessingInk" xmlns:wne="http://schemas.microsoft.com/office/word/2006/wordml" xmlns:wps="http://schemas.microsoft.com/office/word/2010/wordprocessingShape" mc:Ignorable="w14 w15 w16se w16cid w16 w16cex w16sdtdh w16sdtfl w16du wp14">
+  <w:footnote w:type="separator" w:id="-1">
+    <w:p>
+      <w:pPr>
+        <w:spacing w:after="0" w:line="240" w:lineRule="auto"/>
+      </w:pPr>
+      <w:r>
+        <w:separator/>
+      </w:r>
+    </w:p>
+  </w:footnote>
+  <w:footnote w:type="continuationSeparator" w:id="0">
+    <w:p>
+      <w:pPr>
+        <w:spacing w:after="0" w:line="240" w:lineRule="auto"/>
+      </w:pPr>
+      <w:r>
+        <w:continuationSeparator/>
+      </w:r>
+    </w:p>
+  </w:footnote>
+</w:footnotes>
 </file>
 
 <file path=word/styles.xml><?xml version="1.0" encoding="utf-8"?>
@@ -5780,6 +6341,80 @@
       </w:tcPr>
     </w:tblStylePr>
   </w:style>
+  <w:style w:type="character" w:styleId="af4">
+    <w:name w:val="Strong"/>
+    <w:basedOn w:val="a0"/>
+    <w:uiPriority w:val="22"/>
+    <w:qFormat/>
+    <w:rsid w:val="000D6F36"/>
+    <w:rPr>
+      <w:b/>
+      <w:bCs/>
+    </w:rPr>
+  </w:style>
+  <w:style w:type="paragraph" w:styleId="af5">
+    <w:name w:val="header"/>
+    <w:basedOn w:val="a"/>
+    <w:link w:val="af6"/>
+    <w:uiPriority w:val="99"/>
+    <w:unhideWhenUsed/>
+    <w:rsid w:val="000D6F36"/>
+    <w:pPr>
+      <w:tabs>
+        <w:tab w:val="center" w:pos="4153"/>
+        <w:tab w:val="right" w:pos="8306"/>
+      </w:tabs>
+      <w:snapToGrid w:val="0"/>
+      <w:spacing w:line="240" w:lineRule="auto"/>
+      <w:jc w:val="center"/>
+    </w:pPr>
+    <w:rPr>
+      <w:sz w:val="18"/>
+      <w:szCs w:val="18"/>
+    </w:rPr>
+  </w:style>
+  <w:style w:type="character" w:customStyle="1" w:styleId="af6">
+    <w:name w:val="页眉 字符"/>
+    <w:basedOn w:val="a0"/>
+    <w:link w:val="af5"/>
+    <w:uiPriority w:val="99"/>
+    <w:rsid w:val="000D6F36"/>
+    <w:rPr>
+      <w:sz w:val="18"/>
+      <w:szCs w:val="18"/>
+    </w:rPr>
+  </w:style>
+  <w:style w:type="paragraph" w:styleId="af7">
+    <w:name w:val="footer"/>
+    <w:basedOn w:val="a"/>
+    <w:link w:val="af8"/>
+    <w:uiPriority w:val="99"/>
+    <w:unhideWhenUsed/>
+    <w:rsid w:val="000D6F36"/>
+    <w:pPr>
+      <w:tabs>
+        <w:tab w:val="center" w:pos="4153"/>
+        <w:tab w:val="right" w:pos="8306"/>
+      </w:tabs>
+      <w:snapToGrid w:val="0"/>
+      <w:spacing w:line="240" w:lineRule="auto"/>
+    </w:pPr>
+    <w:rPr>
+      <w:sz w:val="18"/>
+      <w:szCs w:val="18"/>
+    </w:rPr>
+  </w:style>
+  <w:style w:type="character" w:customStyle="1" w:styleId="af8">
+    <w:name w:val="页脚 字符"/>
+    <w:basedOn w:val="a0"/>
+    <w:link w:val="af7"/>
+    <w:uiPriority w:val="99"/>
+    <w:rsid w:val="000D6F36"/>
+    <w:rPr>
+      <w:sz w:val="18"/>
+      <w:szCs w:val="18"/>
+    </w:rPr>
+  </w:style>
 </w:styles>
 </file>
 

</xml_diff>

<commit_message>
Updating Data Preprocessing and Preparation Module
</commit_message>
<xml_diff>
--- a/Project1_Sleep_Deprivation_Cognition/Report/Analysis_Report.docx
+++ b/Project1_Sleep_Deprivation_Cognition/Report/Analysis_Report.docx
@@ -5382,32 +5382,1352 @@
     </w:p>
     <w:p>
       <w:pPr>
+        <w:pStyle w:val="ae"/>
+        <w:spacing w:before="0" w:beforeAutospacing="0" w:after="0" w:afterAutospacing="0"/>
+        <w:jc w:val="both"/>
+        <w:rPr>
+          <w:rFonts w:ascii="Times New Roman" w:hAnsi="Times New Roman" w:cs="Times New Roman"/>
+        </w:rPr>
+      </w:pPr>
+      <w:r>
+        <w:rPr>
+          <w:rFonts w:ascii="Times New Roman" w:hAnsi="Times New Roman" w:cs="Times New Roman"/>
+          <w:b/>
+          <w:bCs/>
+        </w:rPr>
+        <w:t xml:space="preserve"> </w:t>
+      </w:r>
+      <w:r>
+        <w:rPr>
+          <w:rFonts w:ascii="Times New Roman" w:hAnsi="Times New Roman" w:cs="Times New Roman"/>
+          <w:b/>
+          <w:bCs/>
+        </w:rPr>
+        <w:t xml:space="preserve"> </w:t>
+      </w:r>
+      <w:r>
+        <w:rPr>
+          <w:rFonts w:ascii="Times New Roman" w:hAnsi="Times New Roman" w:cs="Times New Roman"/>
+        </w:rPr>
+        <w:t xml:space="preserve">To provide a more practically meaningful interpretation of regression coefficients </w:t>
+      </w:r>
+      <w:r>
+        <w:rPr>
+          <w:rFonts w:ascii="Times New Roman" w:hAnsi="Times New Roman" w:cs="Times New Roman"/>
+        </w:rPr>
+        <w:t>(</w:t>
+      </w:r>
+      <w:r>
+        <w:rPr>
+          <w:rFonts w:ascii="Times New Roman" w:hAnsi="Times New Roman" w:cs="Times New Roman"/>
+        </w:rPr>
+        <w:t xml:space="preserve">e.g. 0 sleep hours, emotional regulation scores and stress level are meaningless and unrealistic), </w:t>
+      </w:r>
+      <w:r>
+        <w:rPr>
+          <w:rFonts w:ascii="Times New Roman" w:hAnsi="Times New Roman" w:cs="Times New Roman"/>
+        </w:rPr>
+        <w:t xml:space="preserve">mean-centering was conducted for every predictor variable of interest by shifting the reference point from the original value of 0 to the corresponding sample means. Table 2 shows the descriptive summary of the mean-centered predictor variables and the outcome variables of interest. Emotion regulation scores were retained in both their original and mean-centered forms. As mathematically expected, the means of all mean-centered predictor variables were approximately 0, while the variance and standard deviation of the mean-centered emotion regulation scores were </w:t>
+      </w:r>
+      <w:r>
+        <w:rPr>
+          <w:rFonts w:ascii="Times New Roman" w:hAnsi="Times New Roman" w:cs="Times New Roman"/>
+        </w:rPr>
+        <w:t>the same</w:t>
+      </w:r>
+      <w:r>
+        <w:rPr>
+          <w:rFonts w:ascii="Times New Roman" w:hAnsi="Times New Roman" w:cs="Times New Roman"/>
+        </w:rPr>
+        <w:t xml:space="preserve"> as those of the original scores.</w:t>
+      </w:r>
+    </w:p>
+    <w:p>
+      <w:pPr>
+        <w:pStyle w:val="ae"/>
+        <w:spacing w:before="0" w:beforeAutospacing="0" w:after="0" w:afterAutospacing="0"/>
+        <w:ind w:firstLineChars="100" w:firstLine="240"/>
+        <w:jc w:val="both"/>
+        <w:rPr>
+          <w:rFonts w:ascii="Times New Roman" w:hAnsi="Times New Roman" w:cs="Times New Roman"/>
+        </w:rPr>
+      </w:pPr>
+      <w:r>
+        <w:rPr>
+          <w:rFonts w:ascii="Times New Roman" w:hAnsi="Times New Roman" w:cs="Times New Roman"/>
+        </w:rPr>
+        <w:t>The PSS-10 provides a basis for transforming continuous stress-level scores into a categorical variable. A commonly used PSS-10 categorization criterion</w:t>
+      </w:r>
+      <w:r>
+        <w:rPr>
+          <w:rFonts w:ascii="Times New Roman" w:hAnsi="Times New Roman" w:cs="Times New Roman"/>
+        </w:rPr>
+        <w:t xml:space="preserve"> which has been </w:t>
+      </w:r>
+      <w:r>
+        <w:rPr>
+          <w:rFonts w:ascii="Times New Roman" w:hAnsi="Times New Roman" w:cs="Times New Roman"/>
+        </w:rPr>
+        <w:lastRenderedPageBreak/>
+        <w:t xml:space="preserve">validated in previous </w:t>
+      </w:r>
+      <w:proofErr w:type="spellStart"/>
+      <w:r>
+        <w:rPr>
+          <w:rFonts w:ascii="Times New Roman" w:hAnsi="Times New Roman" w:cs="Times New Roman"/>
+        </w:rPr>
+        <w:t>popualtions</w:t>
+      </w:r>
+      <w:proofErr w:type="spellEnd"/>
+      <w:r>
+        <w:rPr>
+          <w:rFonts w:ascii="Times New Roman" w:hAnsi="Times New Roman" w:cs="Times New Roman"/>
+        </w:rPr>
+        <w:t xml:space="preserve"> was applied to stress-level scores in this module for the ANCOVA in Aim 2, where stress group was treated as the factor. Basically, if an individual’s stress-level score was less than 14, the individual was classified into the low-stress group; otherwise, if the score was between 14 and 26, the individual was classified into the moderate-stress group; otherwise, the individual was classified into the high-stress group (Adamson et al., 2020).</w:t>
+      </w:r>
+    </w:p>
+    <w:p>
+      <w:pPr>
         <w:spacing w:after="0" w:line="240" w:lineRule="auto"/>
         <w:jc w:val="both"/>
         <w:rPr>
           <w:rFonts w:ascii="Times New Roman" w:hAnsi="Times New Roman" w:cs="Times New Roman"/>
           <w:sz w:val="24"/>
-          <w:lang w:val="fr-CA"/>
         </w:rPr>
       </w:pPr>
-      <w:r>
+    </w:p>
+    <w:p>
+      <w:pPr>
+        <w:spacing w:after="0" w:line="240" w:lineRule="auto"/>
         <w:rPr>
           <w:rFonts w:ascii="Times New Roman" w:hAnsi="Times New Roman" w:cs="Times New Roman"/>
           <w:b/>
           <w:bCs/>
-          <w:sz w:val="24"/>
-          <w:lang w:val="fr-CA"/>
-        </w:rPr>
-        <w:t xml:space="preserve">  </w:t>
-      </w:r>
-      <w:r>
-        <w:rPr>
-          <w:rFonts w:ascii="Times New Roman" w:hAnsi="Times New Roman" w:cs="Times New Roman"/>
-          <w:sz w:val="24"/>
-          <w:lang w:val="fr-CA"/>
-        </w:rPr>
-        <w:t>For</w:t>
-      </w:r>
+          <w:sz w:val="20"/>
+          <w:szCs w:val="20"/>
+        </w:rPr>
+      </w:pPr>
+      <w:r>
+        <w:rPr>
+          <w:rFonts w:ascii="Times New Roman" w:hAnsi="Times New Roman" w:cs="Times New Roman" w:hint="eastAsia"/>
+          <w:b/>
+          <w:bCs/>
+          <w:sz w:val="20"/>
+          <w:szCs w:val="20"/>
+        </w:rPr>
+        <w:t>Table 2</w:t>
+      </w:r>
+    </w:p>
+    <w:p>
+      <w:pPr>
+        <w:spacing w:after="0" w:line="240" w:lineRule="auto"/>
+        <w:rPr>
+          <w:rFonts w:ascii="Times New Roman" w:hAnsi="Times New Roman" w:cs="Times New Roman" w:hint="eastAsia"/>
+          <w:i/>
+          <w:iCs/>
+          <w:sz w:val="24"/>
+        </w:rPr>
+      </w:pPr>
+      <w:r>
+        <w:rPr>
+          <w:rFonts w:ascii="Times New Roman" w:hAnsi="Times New Roman" w:cs="Times New Roman" w:hint="eastAsia"/>
+          <w:i/>
+          <w:iCs/>
+          <w:sz w:val="24"/>
+        </w:rPr>
+        <w:t>Descriptive Statistics of Mean-centering Predictors and Outcomes</w:t>
+      </w:r>
+    </w:p>
+    <w:tbl>
+      <w:tblPr>
+        <w:tblStyle w:val="41"/>
+        <w:tblpPr w:leftFromText="180" w:rightFromText="180" w:vertAnchor="text" w:horzAnchor="margin" w:tblpY="61"/>
+        <w:tblW w:w="8222" w:type="dxa"/>
+        <w:tblLook w:val="04A0" w:firstRow="1" w:lastRow="0" w:firstColumn="1" w:lastColumn="0" w:noHBand="0" w:noVBand="1"/>
+      </w:tblPr>
+      <w:tblGrid>
+        <w:gridCol w:w="2641"/>
+        <w:gridCol w:w="2074"/>
+        <w:gridCol w:w="2074"/>
+        <w:gridCol w:w="1433"/>
+      </w:tblGrid>
+      <w:tr>
+        <w:trPr>
+          <w:cnfStyle w:val="100000000000" w:firstRow="1" w:lastRow="0" w:firstColumn="0" w:lastColumn="0" w:oddVBand="0" w:evenVBand="0" w:oddHBand="0" w:evenHBand="0" w:firstRowFirstColumn="0" w:firstRowLastColumn="0" w:lastRowFirstColumn="0" w:lastRowLastColumn="0"/>
+        </w:trPr>
+        <w:tc>
+          <w:tcPr>
+            <w:cnfStyle w:val="001000000000" w:firstRow="0" w:lastRow="0" w:firstColumn="1" w:lastColumn="0" w:oddVBand="0" w:evenVBand="0" w:oddHBand="0" w:evenHBand="0" w:firstRowFirstColumn="0" w:firstRowLastColumn="0" w:lastRowFirstColumn="0" w:lastRowLastColumn="0"/>
+            <w:tcW w:w="2641" w:type="dxa"/>
+          </w:tcPr>
+          <w:p>
+            <w:pPr>
+              <w:jc w:val="both"/>
+              <w:rPr>
+                <w:rFonts w:ascii="Times New Roman" w:hAnsi="Times New Roman" w:cs="Times New Roman" w:hint="eastAsia"/>
+                <w:sz w:val="24"/>
+                <w:lang w:val="fr-CA"/>
+              </w:rPr>
+            </w:pPr>
+            <w:r>
+              <w:rPr>
+                <w:rFonts w:ascii="Times New Roman" w:hAnsi="Times New Roman" w:cs="Times New Roman"/>
+                <w:sz w:val="20"/>
+                <w:szCs w:val="20"/>
+                <w:lang w:val="fr-CA"/>
+              </w:rPr>
+              <w:t>Variable</w:t>
+            </w:r>
+          </w:p>
+        </w:tc>
+        <w:tc>
+          <w:tcPr>
+            <w:tcW w:w="2074" w:type="dxa"/>
+          </w:tcPr>
+          <w:p>
+            <w:pPr>
+              <w:jc w:val="both"/>
+              <w:cnfStyle w:val="100000000000" w:firstRow="1" w:lastRow="0" w:firstColumn="0" w:lastColumn="0" w:oddVBand="0" w:evenVBand="0" w:oddHBand="0" w:evenHBand="0" w:firstRowFirstColumn="0" w:firstRowLastColumn="0" w:lastRowFirstColumn="0" w:lastRowLastColumn="0"/>
+              <w:rPr>
+                <w:rFonts w:ascii="Times New Roman" w:hAnsi="Times New Roman" w:cs="Times New Roman"/>
+                <w:sz w:val="24"/>
+              </w:rPr>
+            </w:pPr>
+            <w:r>
+              <w:rPr>
+                <w:rFonts w:ascii="Times New Roman" w:hAnsi="Times New Roman" w:cs="Times New Roman"/>
+                <w:sz w:val="24"/>
+                <w:lang w:val="fr-CA"/>
+              </w:rPr>
+              <w:t>Mean</w:t>
+            </w:r>
+          </w:p>
+        </w:tc>
+        <w:tc>
+          <w:tcPr>
+            <w:tcW w:w="2074" w:type="dxa"/>
+          </w:tcPr>
+          <w:p>
+            <w:pPr>
+              <w:jc w:val="both"/>
+              <w:cnfStyle w:val="100000000000" w:firstRow="1" w:lastRow="0" w:firstColumn="0" w:lastColumn="0" w:oddVBand="0" w:evenVBand="0" w:oddHBand="0" w:evenHBand="0" w:firstRowFirstColumn="0" w:firstRowLastColumn="0" w:lastRowFirstColumn="0" w:lastRowLastColumn="0"/>
+              <w:rPr>
+                <w:rFonts w:ascii="Times New Roman" w:hAnsi="Times New Roman" w:cs="Times New Roman"/>
+                <w:sz w:val="24"/>
+                <w:lang w:val="fr-CA"/>
+              </w:rPr>
+            </w:pPr>
+            <w:r>
+              <w:rPr>
+                <w:rFonts w:ascii="Times New Roman" w:hAnsi="Times New Roman" w:cs="Times New Roman"/>
+                <w:sz w:val="24"/>
+                <w:lang w:val="fr-CA"/>
+              </w:rPr>
+              <w:t>Variance</w:t>
+            </w:r>
+          </w:p>
+        </w:tc>
+        <w:tc>
+          <w:tcPr>
+            <w:tcW w:w="1433" w:type="dxa"/>
+          </w:tcPr>
+          <w:p>
+            <w:pPr>
+              <w:jc w:val="both"/>
+              <w:cnfStyle w:val="100000000000" w:firstRow="1" w:lastRow="0" w:firstColumn="0" w:lastColumn="0" w:oddVBand="0" w:evenVBand="0" w:oddHBand="0" w:evenHBand="0" w:firstRowFirstColumn="0" w:firstRowLastColumn="0" w:lastRowFirstColumn="0" w:lastRowLastColumn="0"/>
+              <w:rPr>
+                <w:rFonts w:ascii="Times New Roman" w:hAnsi="Times New Roman" w:cs="Times New Roman"/>
+                <w:sz w:val="24"/>
+                <w:lang w:val="fr-CA"/>
+              </w:rPr>
+            </w:pPr>
+            <w:r>
+              <w:rPr>
+                <w:rFonts w:ascii="Times New Roman" w:hAnsi="Times New Roman" w:cs="Times New Roman"/>
+                <w:sz w:val="24"/>
+                <w:lang w:val="fr-CA"/>
+              </w:rPr>
+              <w:t>SD</w:t>
+            </w:r>
+          </w:p>
+        </w:tc>
+      </w:tr>
+      <w:tr>
+        <w:trPr>
+          <w:cnfStyle w:val="000000100000" w:firstRow="0" w:lastRow="0" w:firstColumn="0" w:lastColumn="0" w:oddVBand="0" w:evenVBand="0" w:oddHBand="1" w:evenHBand="0" w:firstRowFirstColumn="0" w:firstRowLastColumn="0" w:lastRowFirstColumn="0" w:lastRowLastColumn="0"/>
+        </w:trPr>
+        <w:tc>
+          <w:tcPr>
+            <w:cnfStyle w:val="001000000000" w:firstRow="0" w:lastRow="0" w:firstColumn="1" w:lastColumn="0" w:oddVBand="0" w:evenVBand="0" w:oddHBand="0" w:evenHBand="0" w:firstRowFirstColumn="0" w:firstRowLastColumn="0" w:lastRowFirstColumn="0" w:lastRowLastColumn="0"/>
+            <w:tcW w:w="2641" w:type="dxa"/>
+          </w:tcPr>
+          <w:p>
+            <w:pPr>
+              <w:jc w:val="both"/>
+              <w:rPr>
+                <w:rFonts w:ascii="Times New Roman" w:hAnsi="Times New Roman" w:cs="Times New Roman"/>
+                <w:b w:val="0"/>
+                <w:bCs w:val="0"/>
+                <w:sz w:val="20"/>
+                <w:szCs w:val="20"/>
+                <w:lang w:val="fr-CA"/>
+              </w:rPr>
+            </w:pPr>
+            <w:proofErr w:type="spellStart"/>
+            <w:r>
+              <w:rPr>
+                <w:rFonts w:ascii="Times New Roman" w:hAnsi="Times New Roman" w:cs="Times New Roman"/>
+                <w:b w:val="0"/>
+                <w:bCs w:val="0"/>
+                <w:sz w:val="20"/>
+                <w:szCs w:val="20"/>
+                <w:lang w:val="fr-CA"/>
+              </w:rPr>
+              <w:t>C_</w:t>
+            </w:r>
+            <w:r>
+              <w:rPr>
+                <w:rFonts w:ascii="Times New Roman" w:hAnsi="Times New Roman" w:cs="Times New Roman"/>
+                <w:b w:val="0"/>
+                <w:bCs w:val="0"/>
+                <w:sz w:val="20"/>
+                <w:szCs w:val="20"/>
+                <w:lang w:val="fr-CA"/>
+              </w:rPr>
+              <w:t>Sleep</w:t>
+            </w:r>
+            <w:proofErr w:type="spellEnd"/>
+            <w:r>
+              <w:rPr>
+                <w:rFonts w:ascii="Times New Roman" w:hAnsi="Times New Roman" w:cs="Times New Roman"/>
+                <w:b w:val="0"/>
+                <w:bCs w:val="0"/>
+                <w:sz w:val="20"/>
+                <w:szCs w:val="20"/>
+                <w:lang w:val="fr-CA"/>
+              </w:rPr>
+              <w:t xml:space="preserve"> </w:t>
+            </w:r>
+            <w:proofErr w:type="spellStart"/>
+            <w:r>
+              <w:rPr>
+                <w:rFonts w:ascii="Times New Roman" w:hAnsi="Times New Roman" w:cs="Times New Roman"/>
+                <w:b w:val="0"/>
+                <w:bCs w:val="0"/>
+                <w:sz w:val="20"/>
+                <w:szCs w:val="20"/>
+                <w:lang w:val="fr-CA"/>
+              </w:rPr>
+              <w:t>Hours</w:t>
+            </w:r>
+            <w:proofErr w:type="spellEnd"/>
+          </w:p>
+        </w:tc>
+        <w:tc>
+          <w:tcPr>
+            <w:tcW w:w="2074" w:type="dxa"/>
+          </w:tcPr>
+          <w:p>
+            <w:pPr>
+              <w:jc w:val="center"/>
+              <w:cnfStyle w:val="000000100000" w:firstRow="0" w:lastRow="0" w:firstColumn="0" w:lastColumn="0" w:oddVBand="0" w:evenVBand="0" w:oddHBand="1" w:evenHBand="0" w:firstRowFirstColumn="0" w:firstRowLastColumn="0" w:lastRowFirstColumn="0" w:lastRowLastColumn="0"/>
+              <w:rPr>
+                <w:rFonts w:ascii="Times New Roman" w:hAnsi="Times New Roman" w:cs="Times New Roman"/>
+                <w:sz w:val="20"/>
+                <w:szCs w:val="20"/>
+                <w:lang w:val="fr-CA"/>
+              </w:rPr>
+            </w:pPr>
+            <w:r>
+              <w:rPr>
+                <w:rFonts w:ascii="Times New Roman" w:hAnsi="Times New Roman" w:cs="Times New Roman"/>
+                <w:sz w:val="20"/>
+                <w:szCs w:val="20"/>
+                <w:lang w:val="fr-CA"/>
+              </w:rPr>
+              <w:t>0.0</w:t>
+            </w:r>
+          </w:p>
+        </w:tc>
+        <w:tc>
+          <w:tcPr>
+            <w:tcW w:w="2074" w:type="dxa"/>
+          </w:tcPr>
+          <w:p>
+            <w:pPr>
+              <w:jc w:val="center"/>
+              <w:cnfStyle w:val="000000100000" w:firstRow="0" w:lastRow="0" w:firstColumn="0" w:lastColumn="0" w:oddVBand="0" w:evenVBand="0" w:oddHBand="1" w:evenHBand="0" w:firstRowFirstColumn="0" w:firstRowLastColumn="0" w:lastRowFirstColumn="0" w:lastRowLastColumn="0"/>
+              <w:rPr>
+                <w:rFonts w:ascii="Times New Roman" w:hAnsi="Times New Roman" w:cs="Times New Roman"/>
+                <w:sz w:val="20"/>
+                <w:szCs w:val="20"/>
+                <w:lang w:val="fr-CA"/>
+              </w:rPr>
+            </w:pPr>
+            <w:r>
+              <w:rPr>
+                <w:rFonts w:ascii="Times New Roman" w:hAnsi="Times New Roman" w:cs="Times New Roman"/>
+                <w:sz w:val="20"/>
+                <w:szCs w:val="20"/>
+                <w:lang w:val="fr-CA"/>
+              </w:rPr>
+              <w:t>3.4</w:t>
+            </w:r>
+          </w:p>
+        </w:tc>
+        <w:tc>
+          <w:tcPr>
+            <w:tcW w:w="1433" w:type="dxa"/>
+          </w:tcPr>
+          <w:p>
+            <w:pPr>
+              <w:jc w:val="center"/>
+              <w:cnfStyle w:val="000000100000" w:firstRow="0" w:lastRow="0" w:firstColumn="0" w:lastColumn="0" w:oddVBand="0" w:evenVBand="0" w:oddHBand="1" w:evenHBand="0" w:firstRowFirstColumn="0" w:firstRowLastColumn="0" w:lastRowFirstColumn="0" w:lastRowLastColumn="0"/>
+              <w:rPr>
+                <w:rFonts w:ascii="Times New Roman" w:hAnsi="Times New Roman" w:cs="Times New Roman"/>
+                <w:sz w:val="20"/>
+                <w:szCs w:val="20"/>
+                <w:lang w:val="fr-CA"/>
+              </w:rPr>
+            </w:pPr>
+            <w:r>
+              <w:rPr>
+                <w:rFonts w:ascii="Times New Roman" w:hAnsi="Times New Roman" w:cs="Times New Roman"/>
+                <w:sz w:val="20"/>
+                <w:szCs w:val="20"/>
+                <w:lang w:val="fr-CA"/>
+              </w:rPr>
+              <w:t>1.8</w:t>
+            </w:r>
+          </w:p>
+        </w:tc>
+      </w:tr>
+      <w:tr>
+        <w:trPr>
+          <w:trHeight w:val="291"/>
+        </w:trPr>
+        <w:tc>
+          <w:tcPr>
+            <w:cnfStyle w:val="001000000000" w:firstRow="0" w:lastRow="0" w:firstColumn="1" w:lastColumn="0" w:oddVBand="0" w:evenVBand="0" w:oddHBand="0" w:evenHBand="0" w:firstRowFirstColumn="0" w:firstRowLastColumn="0" w:lastRowFirstColumn="0" w:lastRowLastColumn="0"/>
+            <w:tcW w:w="2641" w:type="dxa"/>
+          </w:tcPr>
+          <w:p>
+            <w:pPr>
+              <w:jc w:val="both"/>
+              <w:rPr>
+                <w:rFonts w:ascii="Times New Roman" w:hAnsi="Times New Roman" w:cs="Times New Roman"/>
+                <w:b w:val="0"/>
+                <w:bCs w:val="0"/>
+                <w:sz w:val="20"/>
+                <w:szCs w:val="20"/>
+              </w:rPr>
+            </w:pPr>
+            <w:proofErr w:type="spellStart"/>
+            <w:r>
+              <w:rPr>
+                <w:rFonts w:ascii="Times New Roman" w:hAnsi="Times New Roman" w:cs="Times New Roman"/>
+                <w:b w:val="0"/>
+                <w:bCs w:val="0"/>
+                <w:sz w:val="20"/>
+                <w:szCs w:val="20"/>
+              </w:rPr>
+              <w:t>C_</w:t>
+            </w:r>
+            <w:r>
+              <w:rPr>
+                <w:rFonts w:ascii="Times New Roman" w:hAnsi="Times New Roman" w:cs="Times New Roman"/>
+                <w:b w:val="0"/>
+                <w:bCs w:val="0"/>
+                <w:sz w:val="20"/>
+                <w:szCs w:val="20"/>
+              </w:rPr>
+              <w:t>Emotion</w:t>
+            </w:r>
+            <w:proofErr w:type="spellEnd"/>
+            <w:r>
+              <w:rPr>
+                <w:rFonts w:ascii="Times New Roman" w:hAnsi="Times New Roman" w:cs="Times New Roman"/>
+                <w:b w:val="0"/>
+                <w:bCs w:val="0"/>
+                <w:sz w:val="20"/>
+                <w:szCs w:val="20"/>
+              </w:rPr>
+              <w:t xml:space="preserve"> Regulation Scores</w:t>
+            </w:r>
+          </w:p>
+        </w:tc>
+        <w:tc>
+          <w:tcPr>
+            <w:tcW w:w="2074" w:type="dxa"/>
+          </w:tcPr>
+          <w:p>
+            <w:pPr>
+              <w:jc w:val="center"/>
+              <w:cnfStyle w:val="000000000000" w:firstRow="0" w:lastRow="0" w:firstColumn="0" w:lastColumn="0" w:oddVBand="0" w:evenVBand="0" w:oddHBand="0" w:evenHBand="0" w:firstRowFirstColumn="0" w:firstRowLastColumn="0" w:lastRowFirstColumn="0" w:lastRowLastColumn="0"/>
+              <w:rPr>
+                <w:rFonts w:ascii="Times New Roman" w:hAnsi="Times New Roman" w:cs="Times New Roman"/>
+                <w:sz w:val="20"/>
+                <w:szCs w:val="20"/>
+                <w:lang w:val="fr-CA"/>
+              </w:rPr>
+            </w:pPr>
+            <w:r>
+              <w:rPr>
+                <w:rFonts w:ascii="Times New Roman" w:hAnsi="Times New Roman" w:cs="Times New Roman"/>
+                <w:sz w:val="20"/>
+                <w:szCs w:val="20"/>
+                <w:lang w:val="fr-CA"/>
+              </w:rPr>
+              <w:t>0.0</w:t>
+            </w:r>
+          </w:p>
+        </w:tc>
+        <w:tc>
+          <w:tcPr>
+            <w:tcW w:w="2074" w:type="dxa"/>
+          </w:tcPr>
+          <w:p>
+            <w:pPr>
+              <w:jc w:val="center"/>
+              <w:cnfStyle w:val="000000000000" w:firstRow="0" w:lastRow="0" w:firstColumn="0" w:lastColumn="0" w:oddVBand="0" w:evenVBand="0" w:oddHBand="0" w:evenHBand="0" w:firstRowFirstColumn="0" w:firstRowLastColumn="0" w:lastRowFirstColumn="0" w:lastRowLastColumn="0"/>
+              <w:rPr>
+                <w:rFonts w:ascii="Times New Roman" w:hAnsi="Times New Roman" w:cs="Times New Roman"/>
+                <w:sz w:val="20"/>
+                <w:szCs w:val="20"/>
+                <w:lang w:val="fr-CA"/>
+              </w:rPr>
+            </w:pPr>
+            <w:r>
+              <w:rPr>
+                <w:rFonts w:ascii="Times New Roman" w:hAnsi="Times New Roman" w:cs="Times New Roman"/>
+                <w:sz w:val="20"/>
+                <w:szCs w:val="20"/>
+                <w:lang w:val="fr-CA"/>
+              </w:rPr>
+              <w:t>293.6</w:t>
+            </w:r>
+          </w:p>
+        </w:tc>
+        <w:tc>
+          <w:tcPr>
+            <w:tcW w:w="1433" w:type="dxa"/>
+          </w:tcPr>
+          <w:p>
+            <w:pPr>
+              <w:jc w:val="center"/>
+              <w:cnfStyle w:val="000000000000" w:firstRow="0" w:lastRow="0" w:firstColumn="0" w:lastColumn="0" w:oddVBand="0" w:evenVBand="0" w:oddHBand="0" w:evenHBand="0" w:firstRowFirstColumn="0" w:firstRowLastColumn="0" w:lastRowFirstColumn="0" w:lastRowLastColumn="0"/>
+              <w:rPr>
+                <w:rFonts w:ascii="Times New Roman" w:hAnsi="Times New Roman" w:cs="Times New Roman"/>
+                <w:sz w:val="20"/>
+                <w:szCs w:val="20"/>
+                <w:lang w:val="fr-CA"/>
+              </w:rPr>
+            </w:pPr>
+            <w:r>
+              <w:rPr>
+                <w:rFonts w:ascii="Times New Roman" w:hAnsi="Times New Roman" w:cs="Times New Roman"/>
+                <w:sz w:val="20"/>
+                <w:szCs w:val="20"/>
+                <w:lang w:val="fr-CA"/>
+              </w:rPr>
+              <w:t>17.1</w:t>
+            </w:r>
+          </w:p>
+        </w:tc>
+      </w:tr>
+      <w:tr>
+        <w:trPr>
+          <w:cnfStyle w:val="000000100000" w:firstRow="0" w:lastRow="0" w:firstColumn="0" w:lastColumn="0" w:oddVBand="0" w:evenVBand="0" w:oddHBand="1" w:evenHBand="0" w:firstRowFirstColumn="0" w:firstRowLastColumn="0" w:lastRowFirstColumn="0" w:lastRowLastColumn="0"/>
+        </w:trPr>
+        <w:tc>
+          <w:tcPr>
+            <w:cnfStyle w:val="001000000000" w:firstRow="0" w:lastRow="0" w:firstColumn="1" w:lastColumn="0" w:oddVBand="0" w:evenVBand="0" w:oddHBand="0" w:evenHBand="0" w:firstRowFirstColumn="0" w:firstRowLastColumn="0" w:lastRowFirstColumn="0" w:lastRowLastColumn="0"/>
+            <w:tcW w:w="2641" w:type="dxa"/>
+          </w:tcPr>
+          <w:p>
+            <w:pPr>
+              <w:jc w:val="both"/>
+              <w:rPr>
+                <w:rFonts w:ascii="Times New Roman" w:hAnsi="Times New Roman" w:cs="Times New Roman"/>
+                <w:b w:val="0"/>
+                <w:bCs w:val="0"/>
+                <w:sz w:val="20"/>
+                <w:szCs w:val="20"/>
+                <w:lang w:val="fr-CA"/>
+              </w:rPr>
+            </w:pPr>
+            <w:proofErr w:type="spellStart"/>
+            <w:r>
+              <w:rPr>
+                <w:rFonts w:ascii="Times New Roman" w:hAnsi="Times New Roman" w:cs="Times New Roman"/>
+                <w:b w:val="0"/>
+                <w:bCs w:val="0"/>
+                <w:sz w:val="20"/>
+                <w:szCs w:val="20"/>
+                <w:lang w:val="fr-CA"/>
+              </w:rPr>
+              <w:t>C_Stress_Level</w:t>
+            </w:r>
+            <w:proofErr w:type="spellEnd"/>
+            <w:r>
+              <w:rPr>
+                <w:rFonts w:ascii="Times New Roman" w:hAnsi="Times New Roman" w:cs="Times New Roman"/>
+                <w:b w:val="0"/>
+                <w:bCs w:val="0"/>
+                <w:sz w:val="20"/>
+                <w:szCs w:val="20"/>
+                <w:lang w:val="fr-CA"/>
+              </w:rPr>
+              <w:t xml:space="preserve"> Scores</w:t>
+            </w:r>
+          </w:p>
+        </w:tc>
+        <w:tc>
+          <w:tcPr>
+            <w:tcW w:w="2074" w:type="dxa"/>
+          </w:tcPr>
+          <w:p>
+            <w:pPr>
+              <w:jc w:val="center"/>
+              <w:cnfStyle w:val="000000100000" w:firstRow="0" w:lastRow="0" w:firstColumn="0" w:lastColumn="0" w:oddVBand="0" w:evenVBand="0" w:oddHBand="1" w:evenHBand="0" w:firstRowFirstColumn="0" w:firstRowLastColumn="0" w:lastRowFirstColumn="0" w:lastRowLastColumn="0"/>
+              <w:rPr>
+                <w:rFonts w:ascii="Times New Roman" w:hAnsi="Times New Roman" w:cs="Times New Roman"/>
+                <w:sz w:val="20"/>
+                <w:szCs w:val="20"/>
+                <w:lang w:val="fr-CA"/>
+              </w:rPr>
+            </w:pPr>
+            <w:r>
+              <w:rPr>
+                <w:rFonts w:ascii="Times New Roman" w:hAnsi="Times New Roman" w:cs="Times New Roman"/>
+                <w:sz w:val="20"/>
+                <w:szCs w:val="20"/>
+                <w:lang w:val="fr-CA"/>
+              </w:rPr>
+              <w:t>0.0</w:t>
+            </w:r>
+          </w:p>
+        </w:tc>
+        <w:tc>
+          <w:tcPr>
+            <w:tcW w:w="2074" w:type="dxa"/>
+          </w:tcPr>
+          <w:p>
+            <w:pPr>
+              <w:jc w:val="center"/>
+              <w:cnfStyle w:val="000000100000" w:firstRow="0" w:lastRow="0" w:firstColumn="0" w:lastColumn="0" w:oddVBand="0" w:evenVBand="0" w:oddHBand="1" w:evenHBand="0" w:firstRowFirstColumn="0" w:firstRowLastColumn="0" w:lastRowFirstColumn="0" w:lastRowLastColumn="0"/>
+              <w:rPr>
+                <w:rFonts w:ascii="Times New Roman" w:hAnsi="Times New Roman" w:cs="Times New Roman"/>
+                <w:sz w:val="20"/>
+                <w:szCs w:val="20"/>
+                <w:lang w:val="fr-CA"/>
+              </w:rPr>
+            </w:pPr>
+            <w:r>
+              <w:rPr>
+                <w:rFonts w:ascii="Times New Roman" w:hAnsi="Times New Roman" w:cs="Times New Roman"/>
+                <w:sz w:val="20"/>
+                <w:szCs w:val="20"/>
+                <w:lang w:val="fr-CA"/>
+              </w:rPr>
+              <w:t>121.3</w:t>
+            </w:r>
+          </w:p>
+        </w:tc>
+        <w:tc>
+          <w:tcPr>
+            <w:tcW w:w="1433" w:type="dxa"/>
+          </w:tcPr>
+          <w:p>
+            <w:pPr>
+              <w:jc w:val="center"/>
+              <w:cnfStyle w:val="000000100000" w:firstRow="0" w:lastRow="0" w:firstColumn="0" w:lastColumn="0" w:oddVBand="0" w:evenVBand="0" w:oddHBand="1" w:evenHBand="0" w:firstRowFirstColumn="0" w:firstRowLastColumn="0" w:lastRowFirstColumn="0" w:lastRowLastColumn="0"/>
+              <w:rPr>
+                <w:rFonts w:ascii="Times New Roman" w:hAnsi="Times New Roman" w:cs="Times New Roman"/>
+                <w:sz w:val="20"/>
+                <w:szCs w:val="20"/>
+                <w:lang w:val="fr-CA"/>
+              </w:rPr>
+            </w:pPr>
+            <w:r>
+              <w:rPr>
+                <w:rFonts w:ascii="Times New Roman" w:hAnsi="Times New Roman" w:cs="Times New Roman"/>
+                <w:sz w:val="20"/>
+                <w:szCs w:val="20"/>
+                <w:lang w:val="fr-CA"/>
+              </w:rPr>
+              <w:t>11.0</w:t>
+            </w:r>
+          </w:p>
+        </w:tc>
+      </w:tr>
+      <w:tr>
+        <w:tc>
+          <w:tcPr>
+            <w:cnfStyle w:val="001000000000" w:firstRow="0" w:lastRow="0" w:firstColumn="1" w:lastColumn="0" w:oddVBand="0" w:evenVBand="0" w:oddHBand="0" w:evenHBand="0" w:firstRowFirstColumn="0" w:firstRowLastColumn="0" w:lastRowFirstColumn="0" w:lastRowLastColumn="0"/>
+            <w:tcW w:w="2641" w:type="dxa"/>
+          </w:tcPr>
+          <w:p>
+            <w:pPr>
+              <w:jc w:val="both"/>
+              <w:rPr>
+                <w:rFonts w:ascii="Times New Roman" w:hAnsi="Times New Roman" w:cs="Times New Roman"/>
+                <w:b w:val="0"/>
+                <w:bCs w:val="0"/>
+                <w:sz w:val="20"/>
+                <w:szCs w:val="20"/>
+                <w:lang w:val="fr-CA"/>
+              </w:rPr>
+            </w:pPr>
+            <w:proofErr w:type="spellStart"/>
+            <w:r>
+              <w:rPr>
+                <w:rFonts w:ascii="Times New Roman" w:hAnsi="Times New Roman" w:cs="Times New Roman"/>
+                <w:b w:val="0"/>
+                <w:bCs w:val="0"/>
+                <w:sz w:val="20"/>
+                <w:szCs w:val="20"/>
+                <w:lang w:val="fr-CA"/>
+              </w:rPr>
+              <w:t>Emotion</w:t>
+            </w:r>
+            <w:proofErr w:type="spellEnd"/>
+            <w:r>
+              <w:rPr>
+                <w:rFonts w:ascii="Times New Roman" w:hAnsi="Times New Roman" w:cs="Times New Roman"/>
+                <w:b w:val="0"/>
+                <w:bCs w:val="0"/>
+                <w:sz w:val="20"/>
+                <w:szCs w:val="20"/>
+                <w:lang w:val="fr-CA"/>
+              </w:rPr>
+              <w:t xml:space="preserve"> </w:t>
+            </w:r>
+            <w:proofErr w:type="spellStart"/>
+            <w:r>
+              <w:rPr>
+                <w:rFonts w:ascii="Times New Roman" w:hAnsi="Times New Roman" w:cs="Times New Roman"/>
+                <w:b w:val="0"/>
+                <w:bCs w:val="0"/>
+                <w:sz w:val="20"/>
+                <w:szCs w:val="20"/>
+                <w:lang w:val="fr-CA"/>
+              </w:rPr>
+              <w:t>Regualtion</w:t>
+            </w:r>
+            <w:proofErr w:type="spellEnd"/>
+            <w:r>
+              <w:rPr>
+                <w:rFonts w:ascii="Times New Roman" w:hAnsi="Times New Roman" w:cs="Times New Roman"/>
+                <w:b w:val="0"/>
+                <w:bCs w:val="0"/>
+                <w:sz w:val="20"/>
+                <w:szCs w:val="20"/>
+                <w:lang w:val="fr-CA"/>
+              </w:rPr>
+              <w:t xml:space="preserve"> Scores</w:t>
+            </w:r>
+          </w:p>
+        </w:tc>
+        <w:tc>
+          <w:tcPr>
+            <w:tcW w:w="2074" w:type="dxa"/>
+          </w:tcPr>
+          <w:p>
+            <w:pPr>
+              <w:jc w:val="center"/>
+              <w:cnfStyle w:val="000000000000" w:firstRow="0" w:lastRow="0" w:firstColumn="0" w:lastColumn="0" w:oddVBand="0" w:evenVBand="0" w:oddHBand="0" w:evenHBand="0" w:firstRowFirstColumn="0" w:firstRowLastColumn="0" w:lastRowFirstColumn="0" w:lastRowLastColumn="0"/>
+              <w:rPr>
+                <w:rFonts w:ascii="Times New Roman" w:hAnsi="Times New Roman" w:cs="Times New Roman"/>
+                <w:sz w:val="20"/>
+                <w:szCs w:val="20"/>
+                <w:lang w:val="fr-CA"/>
+              </w:rPr>
+            </w:pPr>
+            <w:r>
+              <w:rPr>
+                <w:rFonts w:ascii="Times New Roman" w:hAnsi="Times New Roman" w:cs="Times New Roman"/>
+                <w:sz w:val="20"/>
+                <w:szCs w:val="20"/>
+                <w:lang w:val="fr-CA"/>
+              </w:rPr>
+              <w:t>38.2</w:t>
+            </w:r>
+          </w:p>
+        </w:tc>
+        <w:tc>
+          <w:tcPr>
+            <w:tcW w:w="2074" w:type="dxa"/>
+          </w:tcPr>
+          <w:p>
+            <w:pPr>
+              <w:jc w:val="center"/>
+              <w:cnfStyle w:val="000000000000" w:firstRow="0" w:lastRow="0" w:firstColumn="0" w:lastColumn="0" w:oddVBand="0" w:evenVBand="0" w:oddHBand="0" w:evenHBand="0" w:firstRowFirstColumn="0" w:firstRowLastColumn="0" w:lastRowFirstColumn="0" w:lastRowLastColumn="0"/>
+              <w:rPr>
+                <w:rFonts w:ascii="Times New Roman" w:hAnsi="Times New Roman" w:cs="Times New Roman"/>
+                <w:sz w:val="20"/>
+                <w:szCs w:val="20"/>
+                <w:lang w:val="fr-CA"/>
+              </w:rPr>
+            </w:pPr>
+            <w:r>
+              <w:rPr>
+                <w:rFonts w:ascii="Times New Roman" w:hAnsi="Times New Roman" w:cs="Times New Roman"/>
+                <w:sz w:val="20"/>
+                <w:szCs w:val="20"/>
+                <w:lang w:val="fr-CA"/>
+              </w:rPr>
+              <w:t>293.6</w:t>
+            </w:r>
+          </w:p>
+        </w:tc>
+        <w:tc>
+          <w:tcPr>
+            <w:tcW w:w="1433" w:type="dxa"/>
+          </w:tcPr>
+          <w:p>
+            <w:pPr>
+              <w:jc w:val="center"/>
+              <w:cnfStyle w:val="000000000000" w:firstRow="0" w:lastRow="0" w:firstColumn="0" w:lastColumn="0" w:oddVBand="0" w:evenVBand="0" w:oddHBand="0" w:evenHBand="0" w:firstRowFirstColumn="0" w:firstRowLastColumn="0" w:lastRowFirstColumn="0" w:lastRowLastColumn="0"/>
+              <w:rPr>
+                <w:rFonts w:ascii="Times New Roman" w:hAnsi="Times New Roman" w:cs="Times New Roman"/>
+                <w:sz w:val="20"/>
+                <w:szCs w:val="20"/>
+                <w:lang w:val="fr-CA"/>
+              </w:rPr>
+            </w:pPr>
+            <w:r>
+              <w:rPr>
+                <w:rFonts w:ascii="Times New Roman" w:hAnsi="Times New Roman" w:cs="Times New Roman"/>
+                <w:sz w:val="20"/>
+                <w:szCs w:val="20"/>
+                <w:lang w:val="fr-CA"/>
+              </w:rPr>
+              <w:t>17.1</w:t>
+            </w:r>
+          </w:p>
+        </w:tc>
+      </w:tr>
+      <w:tr>
+        <w:trPr>
+          <w:cnfStyle w:val="000000100000" w:firstRow="0" w:lastRow="0" w:firstColumn="0" w:lastColumn="0" w:oddVBand="0" w:evenVBand="0" w:oddHBand="1" w:evenHBand="0" w:firstRowFirstColumn="0" w:firstRowLastColumn="0" w:lastRowFirstColumn="0" w:lastRowLastColumn="0"/>
+        </w:trPr>
+        <w:tc>
+          <w:tcPr>
+            <w:cnfStyle w:val="001000000000" w:firstRow="0" w:lastRow="0" w:firstColumn="1" w:lastColumn="0" w:oddVBand="0" w:evenVBand="0" w:oddHBand="0" w:evenHBand="0" w:firstRowFirstColumn="0" w:firstRowLastColumn="0" w:lastRowFirstColumn="0" w:lastRowLastColumn="0"/>
+            <w:tcW w:w="2641" w:type="dxa"/>
+          </w:tcPr>
+          <w:p>
+            <w:pPr>
+              <w:jc w:val="both"/>
+              <w:rPr>
+                <w:rFonts w:ascii="Times New Roman" w:hAnsi="Times New Roman" w:cs="Times New Roman"/>
+                <w:b w:val="0"/>
+                <w:bCs w:val="0"/>
+                <w:sz w:val="20"/>
+                <w:szCs w:val="20"/>
+                <w:lang w:val="fr-CA"/>
+              </w:rPr>
+            </w:pPr>
+            <w:r>
+              <w:rPr>
+                <w:rFonts w:ascii="Times New Roman" w:hAnsi="Times New Roman" w:cs="Times New Roman"/>
+                <w:b w:val="0"/>
+                <w:bCs w:val="0"/>
+                <w:sz w:val="20"/>
+                <w:szCs w:val="20"/>
+                <w:lang w:val="fr-CA"/>
+              </w:rPr>
+              <w:t xml:space="preserve">Stroop </w:t>
+            </w:r>
+            <w:proofErr w:type="spellStart"/>
+            <w:r>
+              <w:rPr>
+                <w:rFonts w:ascii="Times New Roman" w:hAnsi="Times New Roman" w:cs="Times New Roman"/>
+                <w:b w:val="0"/>
+                <w:bCs w:val="0"/>
+                <w:sz w:val="20"/>
+                <w:szCs w:val="20"/>
+                <w:lang w:val="fr-CA"/>
+              </w:rPr>
+              <w:t>Task</w:t>
+            </w:r>
+            <w:proofErr w:type="spellEnd"/>
+            <w:r>
+              <w:rPr>
+                <w:rFonts w:ascii="Times New Roman" w:hAnsi="Times New Roman" w:cs="Times New Roman"/>
+                <w:b w:val="0"/>
+                <w:bCs w:val="0"/>
+                <w:sz w:val="20"/>
+                <w:szCs w:val="20"/>
+                <w:lang w:val="fr-CA"/>
+              </w:rPr>
+              <w:t xml:space="preserve"> </w:t>
+            </w:r>
+            <w:proofErr w:type="spellStart"/>
+            <w:r>
+              <w:rPr>
+                <w:rFonts w:ascii="Times New Roman" w:hAnsi="Times New Roman" w:cs="Times New Roman"/>
+                <w:b w:val="0"/>
+                <w:bCs w:val="0"/>
+                <w:sz w:val="20"/>
+                <w:szCs w:val="20"/>
+                <w:lang w:val="fr-CA"/>
+              </w:rPr>
+              <w:t>Reaction</w:t>
+            </w:r>
+            <w:proofErr w:type="spellEnd"/>
+            <w:r>
+              <w:rPr>
+                <w:rFonts w:ascii="Times New Roman" w:hAnsi="Times New Roman" w:cs="Times New Roman"/>
+                <w:b w:val="0"/>
+                <w:bCs w:val="0"/>
+                <w:sz w:val="20"/>
+                <w:szCs w:val="20"/>
+                <w:lang w:val="fr-CA"/>
+              </w:rPr>
+              <w:t xml:space="preserve"> Time</w:t>
+            </w:r>
+          </w:p>
+        </w:tc>
+        <w:tc>
+          <w:tcPr>
+            <w:tcW w:w="2074" w:type="dxa"/>
+          </w:tcPr>
+          <w:p>
+            <w:pPr>
+              <w:jc w:val="center"/>
+              <w:cnfStyle w:val="000000100000" w:firstRow="0" w:lastRow="0" w:firstColumn="0" w:lastColumn="0" w:oddVBand="0" w:evenVBand="0" w:oddHBand="1" w:evenHBand="0" w:firstRowFirstColumn="0" w:firstRowLastColumn="0" w:lastRowFirstColumn="0" w:lastRowLastColumn="0"/>
+              <w:rPr>
+                <w:rFonts w:ascii="Times New Roman" w:hAnsi="Times New Roman" w:cs="Times New Roman"/>
+                <w:sz w:val="20"/>
+                <w:szCs w:val="20"/>
+                <w:lang w:val="fr-CA"/>
+              </w:rPr>
+            </w:pPr>
+            <w:r>
+              <w:rPr>
+                <w:rFonts w:ascii="Times New Roman" w:hAnsi="Times New Roman" w:cs="Times New Roman"/>
+                <w:sz w:val="20"/>
+                <w:szCs w:val="20"/>
+                <w:lang w:val="fr-CA"/>
+              </w:rPr>
+              <w:t>3.2</w:t>
+            </w:r>
+          </w:p>
+        </w:tc>
+        <w:tc>
+          <w:tcPr>
+            <w:tcW w:w="2074" w:type="dxa"/>
+          </w:tcPr>
+          <w:p>
+            <w:pPr>
+              <w:jc w:val="center"/>
+              <w:cnfStyle w:val="000000100000" w:firstRow="0" w:lastRow="0" w:firstColumn="0" w:lastColumn="0" w:oddVBand="0" w:evenVBand="0" w:oddHBand="1" w:evenHBand="0" w:firstRowFirstColumn="0" w:firstRowLastColumn="0" w:lastRowFirstColumn="0" w:lastRowLastColumn="0"/>
+              <w:rPr>
+                <w:rFonts w:ascii="Times New Roman" w:hAnsi="Times New Roman" w:cs="Times New Roman"/>
+                <w:sz w:val="20"/>
+                <w:szCs w:val="20"/>
+                <w:lang w:val="fr-CA"/>
+              </w:rPr>
+            </w:pPr>
+            <w:r>
+              <w:rPr>
+                <w:rFonts w:ascii="Times New Roman" w:hAnsi="Times New Roman" w:cs="Times New Roman"/>
+                <w:sz w:val="20"/>
+                <w:szCs w:val="20"/>
+                <w:lang w:val="fr-CA"/>
+              </w:rPr>
+              <w:t>0.7</w:t>
+            </w:r>
+          </w:p>
+        </w:tc>
+        <w:tc>
+          <w:tcPr>
+            <w:tcW w:w="1433" w:type="dxa"/>
+          </w:tcPr>
+          <w:p>
+            <w:pPr>
+              <w:jc w:val="center"/>
+              <w:cnfStyle w:val="000000100000" w:firstRow="0" w:lastRow="0" w:firstColumn="0" w:lastColumn="0" w:oddVBand="0" w:evenVBand="0" w:oddHBand="1" w:evenHBand="0" w:firstRowFirstColumn="0" w:firstRowLastColumn="0" w:lastRowFirstColumn="0" w:lastRowLastColumn="0"/>
+              <w:rPr>
+                <w:rFonts w:ascii="Times New Roman" w:hAnsi="Times New Roman" w:cs="Times New Roman"/>
+                <w:sz w:val="20"/>
+                <w:szCs w:val="20"/>
+                <w:lang w:val="fr-CA"/>
+              </w:rPr>
+            </w:pPr>
+            <w:r>
+              <w:rPr>
+                <w:rFonts w:ascii="Times New Roman" w:hAnsi="Times New Roman" w:cs="Times New Roman"/>
+                <w:sz w:val="20"/>
+                <w:szCs w:val="20"/>
+                <w:lang w:val="fr-CA"/>
+              </w:rPr>
+              <w:t>0.8</w:t>
+            </w:r>
+          </w:p>
+        </w:tc>
+      </w:tr>
+      <w:tr>
+        <w:tc>
+          <w:tcPr>
+            <w:cnfStyle w:val="001000000000" w:firstRow="0" w:lastRow="0" w:firstColumn="1" w:lastColumn="0" w:oddVBand="0" w:evenVBand="0" w:oddHBand="0" w:evenHBand="0" w:firstRowFirstColumn="0" w:firstRowLastColumn="0" w:lastRowFirstColumn="0" w:lastRowLastColumn="0"/>
+            <w:tcW w:w="2641" w:type="dxa"/>
+          </w:tcPr>
+          <w:p>
+            <w:pPr>
+              <w:jc w:val="both"/>
+              <w:rPr>
+                <w:rFonts w:ascii="Times New Roman" w:hAnsi="Times New Roman" w:cs="Times New Roman"/>
+                <w:b w:val="0"/>
+                <w:bCs w:val="0"/>
+                <w:sz w:val="20"/>
+                <w:szCs w:val="20"/>
+                <w:lang w:val="fr-CA"/>
+              </w:rPr>
+            </w:pPr>
+            <w:r>
+              <w:rPr>
+                <w:rFonts w:ascii="Times New Roman" w:hAnsi="Times New Roman" w:cs="Times New Roman"/>
+                <w:b w:val="0"/>
+                <w:bCs w:val="0"/>
+                <w:sz w:val="20"/>
+                <w:szCs w:val="20"/>
+                <w:lang w:val="fr-CA"/>
+              </w:rPr>
+              <w:t>N-</w:t>
+            </w:r>
+            <w:r>
+              <w:rPr>
+                <w:rFonts w:ascii="Times New Roman" w:hAnsi="Times New Roman" w:cs="Times New Roman"/>
+                <w:b w:val="0"/>
+                <w:bCs w:val="0"/>
+                <w:sz w:val="20"/>
+                <w:szCs w:val="20"/>
+                <w:lang w:val="fr-CA"/>
+              </w:rPr>
+              <w:t>B</w:t>
+            </w:r>
+            <w:r>
+              <w:rPr>
+                <w:rFonts w:ascii="Times New Roman" w:hAnsi="Times New Roman" w:cs="Times New Roman"/>
+                <w:b w:val="0"/>
+                <w:bCs w:val="0"/>
+                <w:sz w:val="20"/>
+                <w:szCs w:val="20"/>
+                <w:lang w:val="fr-CA"/>
+              </w:rPr>
+              <w:t>ack Accuracy</w:t>
+            </w:r>
+          </w:p>
+        </w:tc>
+        <w:tc>
+          <w:tcPr>
+            <w:tcW w:w="2074" w:type="dxa"/>
+          </w:tcPr>
+          <w:p>
+            <w:pPr>
+              <w:jc w:val="center"/>
+              <w:cnfStyle w:val="000000000000" w:firstRow="0" w:lastRow="0" w:firstColumn="0" w:lastColumn="0" w:oddVBand="0" w:evenVBand="0" w:oddHBand="0" w:evenHBand="0" w:firstRowFirstColumn="0" w:firstRowLastColumn="0" w:lastRowFirstColumn="0" w:lastRowLastColumn="0"/>
+              <w:rPr>
+                <w:rFonts w:ascii="Times New Roman" w:hAnsi="Times New Roman" w:cs="Times New Roman"/>
+                <w:sz w:val="20"/>
+                <w:szCs w:val="20"/>
+                <w:lang w:val="fr-CA"/>
+              </w:rPr>
+            </w:pPr>
+            <w:r>
+              <w:rPr>
+                <w:rFonts w:ascii="Times New Roman" w:hAnsi="Times New Roman" w:cs="Times New Roman"/>
+                <w:sz w:val="20"/>
+                <w:szCs w:val="20"/>
+                <w:lang w:val="fr-CA"/>
+              </w:rPr>
+              <w:t>75.0</w:t>
+            </w:r>
+          </w:p>
+        </w:tc>
+        <w:tc>
+          <w:tcPr>
+            <w:tcW w:w="2074" w:type="dxa"/>
+          </w:tcPr>
+          <w:p>
+            <w:pPr>
+              <w:jc w:val="center"/>
+              <w:cnfStyle w:val="000000000000" w:firstRow="0" w:lastRow="0" w:firstColumn="0" w:lastColumn="0" w:oddVBand="0" w:evenVBand="0" w:oddHBand="0" w:evenHBand="0" w:firstRowFirstColumn="0" w:firstRowLastColumn="0" w:lastRowFirstColumn="0" w:lastRowLastColumn="0"/>
+              <w:rPr>
+                <w:rFonts w:ascii="Times New Roman" w:hAnsi="Times New Roman" w:cs="Times New Roman"/>
+                <w:sz w:val="20"/>
+                <w:szCs w:val="20"/>
+                <w:lang w:val="fr-CA"/>
+              </w:rPr>
+            </w:pPr>
+            <w:r>
+              <w:rPr>
+                <w:rFonts w:ascii="Times New Roman" w:hAnsi="Times New Roman" w:cs="Times New Roman"/>
+                <w:sz w:val="20"/>
+                <w:szCs w:val="20"/>
+                <w:lang w:val="fr-CA"/>
+              </w:rPr>
+              <w:t>186.9</w:t>
+            </w:r>
+          </w:p>
+        </w:tc>
+        <w:tc>
+          <w:tcPr>
+            <w:tcW w:w="1433" w:type="dxa"/>
+          </w:tcPr>
+          <w:p>
+            <w:pPr>
+              <w:jc w:val="center"/>
+              <w:cnfStyle w:val="000000000000" w:firstRow="0" w:lastRow="0" w:firstColumn="0" w:lastColumn="0" w:oddVBand="0" w:evenVBand="0" w:oddHBand="0" w:evenHBand="0" w:firstRowFirstColumn="0" w:firstRowLastColumn="0" w:lastRowFirstColumn="0" w:lastRowLastColumn="0"/>
+              <w:rPr>
+                <w:rFonts w:ascii="Times New Roman" w:hAnsi="Times New Roman" w:cs="Times New Roman"/>
+                <w:sz w:val="20"/>
+                <w:szCs w:val="20"/>
+                <w:lang w:val="fr-CA"/>
+              </w:rPr>
+            </w:pPr>
+            <w:r>
+              <w:rPr>
+                <w:rFonts w:ascii="Times New Roman" w:hAnsi="Times New Roman" w:cs="Times New Roman"/>
+                <w:sz w:val="20"/>
+                <w:szCs w:val="20"/>
+                <w:lang w:val="fr-CA"/>
+              </w:rPr>
+              <w:t>13.7</w:t>
+            </w:r>
+          </w:p>
+        </w:tc>
+      </w:tr>
+      <w:tr>
+        <w:trPr>
+          <w:cnfStyle w:val="000000100000" w:firstRow="0" w:lastRow="0" w:firstColumn="0" w:lastColumn="0" w:oddVBand="0" w:evenVBand="0" w:oddHBand="1" w:evenHBand="0" w:firstRowFirstColumn="0" w:firstRowLastColumn="0" w:lastRowFirstColumn="0" w:lastRowLastColumn="0"/>
+        </w:trPr>
+        <w:tc>
+          <w:tcPr>
+            <w:cnfStyle w:val="001000000000" w:firstRow="0" w:lastRow="0" w:firstColumn="1" w:lastColumn="0" w:oddVBand="0" w:evenVBand="0" w:oddHBand="0" w:evenHBand="0" w:firstRowFirstColumn="0" w:firstRowLastColumn="0" w:lastRowFirstColumn="0" w:lastRowLastColumn="0"/>
+            <w:tcW w:w="2641" w:type="dxa"/>
+          </w:tcPr>
+          <w:p>
+            <w:pPr>
+              <w:jc w:val="both"/>
+              <w:rPr>
+                <w:rFonts w:ascii="Times New Roman" w:hAnsi="Times New Roman" w:cs="Times New Roman"/>
+                <w:b w:val="0"/>
+                <w:bCs w:val="0"/>
+                <w:sz w:val="20"/>
+                <w:szCs w:val="20"/>
+                <w:lang w:val="fr-CA"/>
+              </w:rPr>
+            </w:pPr>
+            <w:r>
+              <w:rPr>
+                <w:rFonts w:ascii="Times New Roman" w:hAnsi="Times New Roman" w:cs="Times New Roman"/>
+                <w:b w:val="0"/>
+                <w:bCs w:val="0"/>
+                <w:sz w:val="20"/>
+                <w:szCs w:val="20"/>
+                <w:lang w:val="fr-CA"/>
+              </w:rPr>
+              <w:t xml:space="preserve">PVT </w:t>
+            </w:r>
+            <w:proofErr w:type="spellStart"/>
+            <w:r>
+              <w:rPr>
+                <w:rFonts w:ascii="Times New Roman" w:hAnsi="Times New Roman" w:cs="Times New Roman"/>
+                <w:b w:val="0"/>
+                <w:bCs w:val="0"/>
+                <w:sz w:val="20"/>
+                <w:szCs w:val="20"/>
+                <w:lang w:val="fr-CA"/>
+              </w:rPr>
+              <w:t>Reaction</w:t>
+            </w:r>
+            <w:proofErr w:type="spellEnd"/>
+            <w:r>
+              <w:rPr>
+                <w:rFonts w:ascii="Times New Roman" w:hAnsi="Times New Roman" w:cs="Times New Roman"/>
+                <w:b w:val="0"/>
+                <w:bCs w:val="0"/>
+                <w:sz w:val="20"/>
+                <w:szCs w:val="20"/>
+                <w:lang w:val="fr-CA"/>
+              </w:rPr>
+              <w:t xml:space="preserve"> Time</w:t>
+            </w:r>
+          </w:p>
+        </w:tc>
+        <w:tc>
+          <w:tcPr>
+            <w:tcW w:w="2074" w:type="dxa"/>
+          </w:tcPr>
+          <w:p>
+            <w:pPr>
+              <w:jc w:val="center"/>
+              <w:cnfStyle w:val="000000100000" w:firstRow="0" w:lastRow="0" w:firstColumn="0" w:lastColumn="0" w:oddVBand="0" w:evenVBand="0" w:oddHBand="1" w:evenHBand="0" w:firstRowFirstColumn="0" w:firstRowLastColumn="0" w:lastRowFirstColumn="0" w:lastRowLastColumn="0"/>
+              <w:rPr>
+                <w:rFonts w:ascii="Times New Roman" w:hAnsi="Times New Roman" w:cs="Times New Roman"/>
+                <w:sz w:val="20"/>
+                <w:szCs w:val="20"/>
+                <w:lang w:val="fr-CA"/>
+              </w:rPr>
+            </w:pPr>
+            <w:r>
+              <w:rPr>
+                <w:rFonts w:ascii="Times New Roman" w:hAnsi="Times New Roman" w:cs="Times New Roman"/>
+                <w:sz w:val="20"/>
+                <w:szCs w:val="20"/>
+                <w:lang w:val="fr-CA"/>
+              </w:rPr>
+              <w:t>332.5</w:t>
+            </w:r>
+          </w:p>
+        </w:tc>
+        <w:tc>
+          <w:tcPr>
+            <w:tcW w:w="2074" w:type="dxa"/>
+          </w:tcPr>
+          <w:p>
+            <w:pPr>
+              <w:jc w:val="center"/>
+              <w:cnfStyle w:val="000000100000" w:firstRow="0" w:lastRow="0" w:firstColumn="0" w:lastColumn="0" w:oddVBand="0" w:evenVBand="0" w:oddHBand="1" w:evenHBand="0" w:firstRowFirstColumn="0" w:firstRowLastColumn="0" w:lastRowFirstColumn="0" w:lastRowLastColumn="0"/>
+              <w:rPr>
+                <w:rFonts w:ascii="Times New Roman" w:hAnsi="Times New Roman" w:cs="Times New Roman"/>
+                <w:sz w:val="20"/>
+                <w:szCs w:val="20"/>
+                <w:lang w:val="fr-CA"/>
+              </w:rPr>
+            </w:pPr>
+            <w:r>
+              <w:rPr>
+                <w:rFonts w:ascii="Times New Roman" w:hAnsi="Times New Roman" w:cs="Times New Roman"/>
+                <w:sz w:val="20"/>
+                <w:szCs w:val="20"/>
+                <w:lang w:val="fr-CA"/>
+              </w:rPr>
+              <w:t>7708.9</w:t>
+            </w:r>
+          </w:p>
+        </w:tc>
+        <w:tc>
+          <w:tcPr>
+            <w:tcW w:w="1433" w:type="dxa"/>
+          </w:tcPr>
+          <w:p>
+            <w:pPr>
+              <w:jc w:val="center"/>
+              <w:cnfStyle w:val="000000100000" w:firstRow="0" w:lastRow="0" w:firstColumn="0" w:lastColumn="0" w:oddVBand="0" w:evenVBand="0" w:oddHBand="1" w:evenHBand="0" w:firstRowFirstColumn="0" w:firstRowLastColumn="0" w:lastRowFirstColumn="0" w:lastRowLastColumn="0"/>
+              <w:rPr>
+                <w:rFonts w:ascii="Times New Roman" w:hAnsi="Times New Roman" w:cs="Times New Roman"/>
+                <w:sz w:val="20"/>
+                <w:szCs w:val="20"/>
+                <w:lang w:val="fr-CA"/>
+              </w:rPr>
+            </w:pPr>
+            <w:r>
+              <w:rPr>
+                <w:rFonts w:ascii="Times New Roman" w:hAnsi="Times New Roman" w:cs="Times New Roman"/>
+                <w:sz w:val="20"/>
+                <w:szCs w:val="20"/>
+                <w:lang w:val="fr-CA"/>
+              </w:rPr>
+              <w:t>87.8</w:t>
+            </w:r>
+          </w:p>
+        </w:tc>
+      </w:tr>
+    </w:tbl>
+    <w:p>
+      <w:pPr>
+        <w:spacing w:after="0" w:line="240" w:lineRule="auto"/>
+        <w:rPr>
+          <w:rFonts w:ascii="Times New Roman" w:hAnsi="Times New Roman" w:cs="Times New Roman"/>
+          <w:sz w:val="20"/>
+          <w:szCs w:val="20"/>
+        </w:rPr>
+      </w:pPr>
+      <w:r>
+        <w:rPr>
+          <w:rFonts w:ascii="Times New Roman" w:hAnsi="Times New Roman" w:cs="Times New Roman" w:hint="eastAsia"/>
+          <w:sz w:val="20"/>
+          <w:szCs w:val="20"/>
+        </w:rPr>
+        <w:t>No</w:t>
+      </w:r>
+      <w:r>
+        <w:rPr>
+          <w:rFonts w:ascii="Times New Roman" w:hAnsi="Times New Roman" w:cs="Times New Roman"/>
+          <w:sz w:val="20"/>
+          <w:szCs w:val="20"/>
+        </w:rPr>
+        <w:t xml:space="preserve">te: </w:t>
+      </w:r>
+      <w:proofErr w:type="spellStart"/>
+      <w:r>
+        <w:rPr>
+          <w:rFonts w:ascii="Times New Roman" w:hAnsi="Times New Roman" w:cs="Times New Roman"/>
+          <w:sz w:val="20"/>
+          <w:szCs w:val="20"/>
+        </w:rPr>
+        <w:t>C_Sleep</w:t>
+      </w:r>
+      <w:proofErr w:type="spellEnd"/>
+      <w:r>
+        <w:rPr>
+          <w:rFonts w:ascii="Times New Roman" w:hAnsi="Times New Roman" w:cs="Times New Roman"/>
+          <w:sz w:val="20"/>
+          <w:szCs w:val="20"/>
+        </w:rPr>
+        <w:t xml:space="preserve"> hours, </w:t>
+      </w:r>
+      <w:proofErr w:type="spellStart"/>
+      <w:r>
+        <w:rPr>
+          <w:rFonts w:ascii="Times New Roman" w:hAnsi="Times New Roman" w:cs="Times New Roman"/>
+          <w:sz w:val="20"/>
+          <w:szCs w:val="20"/>
+        </w:rPr>
+        <w:t>C_emotion</w:t>
+      </w:r>
+      <w:proofErr w:type="spellEnd"/>
+      <w:r>
+        <w:rPr>
+          <w:rFonts w:ascii="Times New Roman" w:hAnsi="Times New Roman" w:cs="Times New Roman"/>
+          <w:sz w:val="20"/>
+          <w:szCs w:val="20"/>
+        </w:rPr>
+        <w:t xml:space="preserve"> regulation scores and </w:t>
+      </w:r>
+      <w:proofErr w:type="spellStart"/>
+      <w:r>
+        <w:rPr>
+          <w:rFonts w:ascii="Times New Roman" w:hAnsi="Times New Roman" w:cs="Times New Roman"/>
+          <w:sz w:val="20"/>
+          <w:szCs w:val="20"/>
+        </w:rPr>
+        <w:t>c_stress</w:t>
+      </w:r>
+      <w:proofErr w:type="spellEnd"/>
+      <w:r>
+        <w:rPr>
+          <w:rFonts w:ascii="Times New Roman" w:hAnsi="Times New Roman" w:cs="Times New Roman"/>
+          <w:sz w:val="20"/>
+          <w:szCs w:val="20"/>
+        </w:rPr>
+        <w:t xml:space="preserve"> level scores represents mean-centering predictors respectively</w:t>
+      </w:r>
+    </w:p>
+    <w:p>
+      <w:pPr>
+        <w:spacing w:after="0" w:line="240" w:lineRule="auto"/>
+        <w:jc w:val="both"/>
+        <w:rPr>
+          <w:rFonts w:ascii="Times New Roman" w:hAnsi="Times New Roman" w:cs="Times New Roman" w:hint="eastAsia"/>
+          <w:sz w:val="24"/>
+        </w:rPr>
+      </w:pPr>
     </w:p>
     <w:sectPr>
       <w:pgSz w:w="11906" w:h="16838"/>
@@ -7102,7 +8422,7 @@
     </b:Author>
     <b:Volume>8</b:Volume>
     <b:LCID>en-CA</b:LCID>
-    <b:RefOrder>4</b:RefOrder>
+    <b:RefOrder>2</b:RefOrder>
   </b:Source>
   <b:Source>
     <b:Tag>Owe05</b:Tag>
@@ -7140,7 +8460,7 @@
       </b:Author>
     </b:Author>
     <b:LCID>en-US</b:LCID>
-    <b:RefOrder>5</b:RefOrder>
+    <b:RefOrder>3</b:RefOrder>
   </b:Source>
   <b:Source>
     <b:Tag>Bas21</b:Tag>
@@ -7182,7 +8502,7 @@
         </b:NameList>
       </b:Author>
     </b:Author>
-    <b:RefOrder>6</b:RefOrder>
+    <b:RefOrder>4</b:RefOrder>
   </b:Source>
   <b:Source>
     <b:Tag>Alh07</b:Tag>
@@ -7209,7 +8529,7 @@
     <b:Volume>3</b:Volume>
     <b:Issue>5</b:Issue>
     <b:LCID>en-CA</b:LCID>
-    <b:RefOrder>7</b:RefOrder>
+    <b:RefOrder>5</b:RefOrder>
   </b:Source>
   <b:Source>
     <b:Tag>Fla22</b:Tag>
@@ -7245,7 +8565,7 @@
       </b:Author>
     </b:Author>
     <b:LCID>en-CA</b:LCID>
-    <b:RefOrder>8</b:RefOrder>
+    <b:RefOrder>6</b:RefOrder>
   </b:Source>
   <b:Source>
     <b:Tag>For11</b:Tag>
@@ -7286,7 +8606,7 @@
     <b:Volume>15</b:Volume>
     <b:Issue>6</b:Issue>
     <b:LCID>en-CA</b:LCID>
-    <b:RefOrder>9</b:RefOrder>
+    <b:RefOrder>7</b:RefOrder>
   </b:Source>
   <b:Source>
     <b:Tag>Fra</b:Tag>
@@ -7313,7 +8633,7 @@
     <b:Volume>135</b:Volume>
     <b:Year>2015</b:Year>
     <b:LCID>en-CA</b:LCID>
-    <b:RefOrder>10</b:RefOrder>
+    <b:RefOrder>8</b:RefOrder>
   </b:Source>
   <b:Source>
     <b:Tag>Gil07</b:Tag>
@@ -7341,7 +8661,7 @@
     <b:Volume>54</b:Volume>
     <b:Issue>5</b:Issue>
     <b:LCID>en-CA</b:LCID>
-    <b:RefOrder>11</b:RefOrder>
+    <b:RefOrder>9</b:RefOrder>
   </b:Source>
   <b:Source>
     <b:Tag>Har16</b:Tag>
@@ -7374,7 +8694,7 @@
       </b:Author>
     </b:Author>
     <b:LCID>en-CA</b:LCID>
-    <b:RefOrder>12</b:RefOrder>
+    <b:RefOrder>10</b:RefOrder>
   </b:Source>
   <b:Source>
     <b:Tag>Koa23</b:Tag>
@@ -7403,7 +8723,7 @@
     <b:Volume>35</b:Volume>
     <b:Issue>3</b:Issue>
     <b:LCID>en-CA</b:LCID>
-    <b:RefOrder>2</b:RefOrder>
+    <b:RefOrder>11</b:RefOrder>
   </b:Source>
   <b:Source>
     <b:Tag>Nwi25</b:Tag>
@@ -7426,7 +8746,7 @@
     </b:Author>
     <b:Volume>291</b:Volume>
     <b:LCID>en-CA</b:LCID>
-    <b:RefOrder>14</b:RefOrder>
+    <b:RefOrder>12</b:RefOrder>
   </b:Source>
   <b:Source>
     <b:Tag>Pac10</b:Tag>
@@ -7458,7 +8778,7 @@
     <b:Volume>21</b:Volume>
     <b:Issue>2</b:Issue>
     <b:LCID>en-CA</b:LCID>
-    <b:RefOrder>15</b:RefOrder>
+    <b:RefOrder>13</b:RefOrder>
   </b:Source>
   <b:Source>
     <b:Tag>Roc15</b:Tag>
@@ -7497,7 +8817,7 @@
     <b:Volume>43</b:Volume>
     <b:Issue>5</b:Issue>
     <b:LCID>en-CA</b:LCID>
-    <b:RefOrder>16</b:RefOrder>
+    <b:RefOrder>14</b:RefOrder>
   </b:Source>
   <b:Source>
     <b:Tag>Sch04</b:Tag>
@@ -7520,7 +8840,7 @@
     </b:Author>
     <b:Volume>55</b:Volume>
     <b:LCID>en-CA</b:LCID>
-    <b:RefOrder>17</b:RefOrder>
+    <b:RefOrder>15</b:RefOrder>
   </b:Source>
   <b:Source>
     <b:Tag>Tri21</b:Tag>
@@ -7551,7 +8871,7 @@
     <b:Volume>85</b:Volume>
     <b:Issue>3</b:Issue>
     <b:LCID>en-CA</b:LCID>
-    <b:RefOrder>18</b:RefOrder>
+    <b:RefOrder>16</b:RefOrder>
   </b:Source>
   <b:Source>
     <b:Tag>Wai25</b:Tag>
@@ -7579,7 +8899,7 @@
     <b:Volume>20</b:Volume>
     <b:Issue>1</b:Issue>
     <b:LCID>en-CA</b:LCID>
-    <b:RefOrder>19</b:RefOrder>
+    <b:RefOrder>17</b:RefOrder>
   </b:Source>
   <b:Source>
     <b:Tag>sac24</b:Tag>
@@ -7594,7 +8914,7 @@
     <b:InternetSiteTitle>Kaggle</b:InternetSiteTitle>
     <b:URL>https://www.kaggle.com/datasets/sacramentotechnology/sleep-deprivation-and-cognitive-performance</b:URL>
     <b:LCID>en-CA</b:LCID>
-    <b:RefOrder>1</b:RefOrder>
+    <b:RefOrder>18</b:RefOrder>
   </b:Source>
   <b:Source>
     <b:Tag>Coh83</b:Tag>
@@ -7624,7 +8944,7 @@
     </b:Author>
     <b:Volume>24</b:Volume>
     <b:Issue>4</b:Issue>
-    <b:RefOrder>20</b:RefOrder>
+    <b:RefOrder>19</b:RefOrder>
   </b:Source>
   <b:Source>
     <b:Tag>Ada20</b:Tag>
@@ -7688,7 +9008,7 @@
         </b:NameList>
       </b:Author>
     </b:Author>
-    <b:RefOrder>3</b:RefOrder>
+    <b:RefOrder>1</b:RefOrder>
   </b:Source>
   <b:Source>
     <b:Tag>Kha23</b:Tag>
@@ -7716,13 +9036,13 @@
     <b:Volume>28</b:Volume>
     <b:Issue>2</b:Issue>
     <b:LCID>en-CA</b:LCID>
-    <b:RefOrder>13</b:RefOrder>
+    <b:RefOrder>20</b:RefOrder>
   </b:Source>
 </b:Sources>
 </file>
 
 <file path=customXml/itemProps1.xml><?xml version="1.0" encoding="utf-8"?>
-<ds:datastoreItem xmlns:ds="http://schemas.openxmlformats.org/officeDocument/2006/customXml" ds:itemID="{ED561CEB-6E5F-FC42-823F-07FB923DE5AF}">
+<ds:datastoreItem xmlns:ds="http://schemas.openxmlformats.org/officeDocument/2006/customXml" ds:itemID="{D58226C4-47D5-9347-8678-D74461A4D5BF}">
   <ds:schemaRefs>
     <ds:schemaRef ds:uri="http://schemas.openxmlformats.org/officeDocument/2006/bibliography"/>
   </ds:schemaRefs>

</xml_diff>

<commit_message>
Updating of Preparation in prior to formal data analysis; updating descriptions for assumptions diagnostics
</commit_message>
<xml_diff>
--- a/Project1_Sleep_Deprivation_Cognition/Report/Analysis_Report.docx
+++ b/Project1_Sleep_Deprivation_Cognition/Report/Analysis_Report.docx
@@ -5427,7 +5427,19 @@
         <w:rPr>
           <w:rFonts w:ascii="Times New Roman" w:hAnsi="Times New Roman" w:cs="Times New Roman"/>
         </w:rPr>
-        <w:t xml:space="preserve">mean-centering was conducted for every predictor variable of interest by shifting the reference point from the original value of 0 to the corresponding sample means. Table 2 shows the descriptive summary of the mean-centered predictor variables and the outcome variables of interest. Emotion regulation scores were retained in both their original and mean-centered forms. As mathematically expected, the means of all mean-centered predictor variables were approximately 0, while the variance and standard deviation of the mean-centered emotion regulation scores were </w:t>
+        <w:t xml:space="preserve">mean-centering was conducted for </w:t>
+      </w:r>
+      <w:r>
+        <w:rPr>
+          <w:rFonts w:ascii="Times New Roman" w:hAnsi="Times New Roman" w:cs="Times New Roman"/>
+        </w:rPr>
+        <w:t xml:space="preserve">every </w:t>
+      </w:r>
+      <w:r>
+        <w:rPr>
+          <w:rFonts w:ascii="Times New Roman" w:hAnsi="Times New Roman" w:cs="Times New Roman"/>
+        </w:rPr>
+        <w:t xml:space="preserve">predictor variable of interest by shifting the reference point from the original value of 0 to the corresponding sample means. Table 2 shows the descriptive summary of the mean-centered predictor variables and the outcome variables of interest. Emotion regulation scores were retained in both their original and mean-centered forms. As mathematically expected, the means of all mean-centered predictor variables were approximately 0, while the variance and standard deviation of the mean-centered emotion regulation scores were </w:t>
       </w:r>
       <w:r>
         <w:rPr>
@@ -6722,12 +6734,121 @@
     <w:p>
       <w:pPr>
         <w:spacing w:after="0" w:line="240" w:lineRule="auto"/>
+        <w:rPr>
+          <w:rFonts w:ascii="Times New Roman" w:hAnsi="Times New Roman" w:cs="Times New Roman"/>
+          <w:sz w:val="24"/>
+        </w:rPr>
+      </w:pPr>
+    </w:p>
+    <w:p>
+      <w:pPr>
+        <w:spacing w:after="0" w:line="240" w:lineRule="auto"/>
+        <w:rPr>
+          <w:rFonts w:ascii="Times New Roman" w:hAnsi="Times New Roman" w:cs="Times New Roman" w:hint="eastAsia"/>
+          <w:b/>
+          <w:bCs/>
+          <w:sz w:val="24"/>
+        </w:rPr>
+      </w:pPr>
+      <w:r>
+        <w:rPr>
+          <w:rFonts w:ascii="Times New Roman" w:hAnsi="Times New Roman" w:cs="Times New Roman" w:hint="eastAsia"/>
+          <w:b/>
+          <w:bCs/>
+          <w:sz w:val="24"/>
+        </w:rPr>
+        <w:t>-Construction of F</w:t>
+      </w:r>
+      <w:r>
+        <w:rPr>
+          <w:rFonts w:ascii="Times New Roman" w:hAnsi="Times New Roman" w:cs="Times New Roman"/>
+          <w:b/>
+          <w:bCs/>
+          <w:sz w:val="24"/>
+        </w:rPr>
+        <w:t>u</w:t>
+      </w:r>
+      <w:r>
+        <w:rPr>
+          <w:rFonts w:ascii="Times New Roman" w:hAnsi="Times New Roman" w:cs="Times New Roman" w:hint="eastAsia"/>
+          <w:b/>
+          <w:bCs/>
+          <w:sz w:val="24"/>
+        </w:rPr>
+        <w:t>nctions for Assumptions Diagnostics</w:t>
+      </w:r>
+    </w:p>
+    <w:p>
+      <w:pPr>
+        <w:spacing w:after="0" w:line="240" w:lineRule="auto"/>
+        <w:ind w:firstLineChars="100" w:firstLine="240"/>
         <w:jc w:val="both"/>
         <w:rPr>
           <w:rFonts w:ascii="Times New Roman" w:hAnsi="Times New Roman" w:cs="Times New Roman" w:hint="eastAsia"/>
           <w:sz w:val="24"/>
         </w:rPr>
       </w:pPr>
+      <w:r>
+        <w:rPr>
+          <w:rFonts w:ascii="Times New Roman" w:hAnsi="Times New Roman" w:cs="Times New Roman"/>
+          <w:sz w:val="24"/>
+        </w:rPr>
+        <w:t>Conceptually, since the OLS coefficient estimator is a linear function of population errors conditional on the predictor structure, its corresponding sampling distribution depends on the distributional and variance properties of those errors. Thus, assumptions targeting the population error structure, assessed indirectly through residuals, should be reasonably satisfied to support accurate estimation of uncertainty and valid inference based on the theoretical sampling distribution. Here, diagnostic procedures were implemented as reusable functions in a separate module to allow consistent application across fitted models.</w:t>
+      </w:r>
+      <w:r>
+        <w:rPr>
+          <w:rFonts w:ascii="Times New Roman" w:eastAsia="宋体" w:hAnsi="Times New Roman" w:cs="Times New Roman"/>
+          <w:kern w:val="0"/>
+          <w:sz w:val="24"/>
+          <w14:ligatures w14:val="none"/>
+        </w:rPr>
+        <w:t xml:space="preserve"> </w:t>
+      </w:r>
+      <w:r>
+        <w:rPr>
+          <w:rFonts w:ascii="Times New Roman" w:eastAsia="宋体" w:hAnsi="Times New Roman" w:cs="Times New Roman"/>
+          <w:kern w:val="0"/>
+          <w:sz w:val="24"/>
+          <w14:ligatures w14:val="none"/>
+        </w:rPr>
+        <w:t>(See functions in the codes</w:t>
+      </w:r>
+      <w:r>
+        <w:rPr>
+          <w:rFonts w:ascii="Times New Roman" w:eastAsia="宋体" w:hAnsi="Times New Roman" w:cs="Times New Roman"/>
+          <w:kern w:val="0"/>
+          <w:sz w:val="24"/>
+          <w14:ligatures w14:val="none"/>
+        </w:rPr>
+        <w:t>,</w:t>
+      </w:r>
+      <w:r>
+        <w:rPr>
+          <w:rFonts w:ascii="Times New Roman" w:eastAsia="宋体" w:hAnsi="Times New Roman" w:cs="Times New Roman"/>
+          <w:kern w:val="0"/>
+          <w:sz w:val="24"/>
+          <w14:ligatures w14:val="none"/>
+        </w:rPr>
+        <w:t xml:space="preserve"> where</w:t>
+      </w:r>
+      <w:r>
+        <w:rPr>
+          <w:rFonts w:ascii="Times New Roman" w:eastAsia="宋体" w:hAnsi="Times New Roman" w:cs="Times New Roman"/>
+          <w:kern w:val="0"/>
+          <w:sz w:val="24"/>
+          <w14:ligatures w14:val="none"/>
+        </w:rPr>
+        <w:t xml:space="preserve"> assumption diagnostics functions are listed</w:t>
+      </w:r>
+      <w:r>
+        <w:rPr>
+          <w:rFonts w:ascii="Times New Roman" w:eastAsia="宋体" w:hAnsi="Times New Roman" w:cs="Times New Roman"/>
+          <w:kern w:val="0"/>
+          <w:sz w:val="24"/>
+          <w14:ligatures w14:val="none"/>
+        </w:rPr>
+        <w:t>)</w:t>
+      </w:r>
     </w:p>
     <w:sectPr>
       <w:pgSz w:w="11906" w:h="16838"/>

</xml_diff>

<commit_message>
improve organization of parts in prior to formal analysis
</commit_message>
<xml_diff>
--- a/Project1_Sleep_Deprivation_Cognition/Report/Analysis_Report.docx
+++ b/Project1_Sleep_Deprivation_Cognition/Report/Analysis_Report.docx
@@ -754,18 +754,6 @@
           <w14:ligatures w14:val="none"/>
         </w:rPr>
       </w:pPr>
-      <w:r>
-        <w:rPr>
-          <w:rFonts w:ascii="Times New Roman" w:eastAsia="宋体" w:hAnsi="Times New Roman" w:cs="Times New Roman"/>
-          <w:b/>
-          <w:bCs/>
-          <w:kern w:val="0"/>
-          <w:sz w:val="26"/>
-          <w:szCs w:val="26"/>
-          <w14:ligatures w14:val="none"/>
-        </w:rPr>
-        <w:t xml:space="preserve">Broad </w:t>
-      </w:r>
       <w:r>
         <w:rPr>
           <w:rFonts w:ascii="Times New Roman" w:eastAsia="宋体" w:hAnsi="Times New Roman" w:cs="Times New Roman"/>
@@ -6804,10 +6792,8 @@
         <w:ind w:firstLineChars="100" w:firstLine="240"/>
         <w:jc w:val="both"/>
         <w:rPr>
-          <w:rFonts w:ascii="Times New Roman" w:eastAsia="宋体" w:hAnsi="Times New Roman" w:cs="Times New Roman" w:hint="eastAsia"/>
-          <w:kern w:val="0"/>
-          <w:sz w:val="24"/>
-          <w14:ligatures w14:val="none"/>
+          <w:rFonts w:ascii="Times New Roman" w:hAnsi="Times New Roman" w:cs="Times New Roman" w:hint="eastAsia"/>
+          <w:sz w:val="24"/>
         </w:rPr>
       </w:pPr>
       <w:r>
@@ -6815,166 +6801,14 @@
           <w:rFonts w:ascii="Times New Roman" w:hAnsi="Times New Roman" w:cs="Times New Roman"/>
           <w:sz w:val="24"/>
         </w:rPr>
-        <w:t>Conceptually</w:t>
-      </w:r>
-      <w:r>
-        <w:rPr>
-          <w:rFonts w:ascii="Times New Roman" w:hAnsi="Times New Roman" w:cs="Times New Roman"/>
-          <w:sz w:val="24"/>
-        </w:rPr>
-        <w:t xml:space="preserve"> and mathematically</w:t>
-      </w:r>
-      <w:r>
-        <w:rPr>
-          <w:rFonts w:ascii="Times New Roman" w:hAnsi="Times New Roman" w:cs="Times New Roman"/>
-          <w:sz w:val="24"/>
-        </w:rPr>
-        <w:t>, since the OLS coefficient estimator is a linear function of population errors conditional on the predictor structure, its corresponding sampling distribution depends on the distributional and variance properties of those errors. Thus, assumptions targeting the population error structure, assessed indirectly through residuals, should be reasonably satisfied to support accurate estimation of uncertainty and valid inference based on the theoretical sampling distribution. Here,</w:t>
-      </w:r>
-      <w:r>
-        <w:rPr>
-          <w:rStyle w:val="20"/>
+        <w:t>Conceptually and mathematically, since the OLS coefficient estimator is a linear function of population errors conditional on the predictor structure, its corresponding sampling distribution depends on the distributional and variance properties of those errors. Thus, assumptions targeting the population error structure, assessed indirectly through residuals, should be reasonably satisfied to support accurate estimation of uncertainty and valid inference based on the theoretical sampling distribution. Here, to facilitate this, I implemented diagnostic procedures as reusable functions in a separate module, allowing consistent application across fitted models (see the “Symbols” section in the code file, where the defined assumption-diagnostic functions are listed</w:t>
+      </w:r>
+      <w:r>
+        <w:rPr>
           <w:rFonts w:ascii="Times New Roman" w:hAnsi="Times New Roman" w:cs="Times New Roman" w:hint="eastAsia"/>
-          <w:color w:val="0F1115"/>
-          <w:sz w:val="24"/>
-          <w:szCs w:val="24"/>
-          <w:shd w:val="clear" w:color="auto" w:fill="FFFFFF"/>
-        </w:rPr>
-        <w:t xml:space="preserve"> to</w:t>
-      </w:r>
-      <w:r>
-        <w:rPr>
-          <w:rStyle w:val="af4"/>
-          <w:rFonts w:ascii="Times New Roman" w:hAnsi="Times New Roman" w:cs="Times New Roman"/>
-          <w:color w:val="0F1115"/>
-          <w:sz w:val="24"/>
-          <w:shd w:val="clear" w:color="auto" w:fill="FFFFFF"/>
-        </w:rPr>
-        <w:t xml:space="preserve"> </w:t>
-      </w:r>
-      <w:r>
-        <w:rPr>
-          <w:rStyle w:val="af4"/>
-          <w:rFonts w:ascii="Times New Roman" w:hAnsi="Times New Roman" w:cs="Times New Roman"/>
-          <w:b w:val="0"/>
-          <w:bCs w:val="0"/>
-          <w:color w:val="0F1115"/>
-          <w:sz w:val="24"/>
-          <w:shd w:val="clear" w:color="auto" w:fill="FFFFFF"/>
-        </w:rPr>
-        <w:t xml:space="preserve">facilitate this, </w:t>
-      </w:r>
-      <w:r>
-        <w:rPr>
-          <w:rStyle w:val="af4"/>
-          <w:rFonts w:ascii="Times New Roman" w:hAnsi="Times New Roman" w:cs="Times New Roman" w:hint="eastAsia"/>
-          <w:b w:val="0"/>
-          <w:bCs w:val="0"/>
-          <w:color w:val="0F1115"/>
-          <w:sz w:val="24"/>
-          <w:shd w:val="clear" w:color="auto" w:fill="FFFFFF"/>
-        </w:rPr>
-        <w:t>I</w:t>
-      </w:r>
-      <w:r>
-        <w:rPr>
-          <w:rStyle w:val="af4"/>
-          <w:rFonts w:ascii="Times New Roman" w:hAnsi="Times New Roman" w:cs="Times New Roman" w:hint="eastAsia"/>
-          <w:b w:val="0"/>
-          <w:bCs w:val="0"/>
-          <w:color w:val="0F1115"/>
-          <w:sz w:val="24"/>
-          <w:shd w:val="clear" w:color="auto" w:fill="FFFFFF"/>
-        </w:rPr>
-        <w:t xml:space="preserve"> </w:t>
-      </w:r>
-      <w:r>
-        <w:rPr>
-          <w:rStyle w:val="af4"/>
-          <w:rFonts w:ascii="Times New Roman" w:hAnsi="Times New Roman" w:cs="Times New Roman"/>
-          <w:b w:val="0"/>
-          <w:bCs w:val="0"/>
-          <w:color w:val="0F1115"/>
-          <w:sz w:val="24"/>
-          <w:shd w:val="clear" w:color="auto" w:fill="FFFFFF"/>
-        </w:rPr>
-        <w:t>implemented diagnostic procedures as reusable functions in a separate module</w:t>
-      </w:r>
-      <w:r>
-        <w:rPr>
-          <w:rStyle w:val="af2"/>
-          <w:rFonts w:ascii="Times New Roman" w:hAnsi="Times New Roman" w:cs="Times New Roman"/>
-          <w:color w:val="0F1115"/>
-          <w:sz w:val="24"/>
-          <w:shd w:val="clear" w:color="auto" w:fill="FFFFFF"/>
-        </w:rPr>
-        <w:t xml:space="preserve">, </w:t>
-      </w:r>
-      <w:r>
-        <w:rPr>
-          <w:rStyle w:val="af2"/>
-          <w:rFonts w:ascii="Times New Roman" w:hAnsi="Times New Roman" w:cs="Times New Roman"/>
-          <w:i w:val="0"/>
-          <w:iCs w:val="0"/>
-          <w:color w:val="0F1115"/>
-          <w:sz w:val="24"/>
-          <w:shd w:val="clear" w:color="auto" w:fill="FFFFFF"/>
-        </w:rPr>
-        <w:t>allowing consistent application across fitted models </w:t>
-      </w:r>
-      <w:r>
-        <w:rPr>
-          <w:rFonts w:ascii="Times New Roman" w:eastAsia="宋体" w:hAnsi="Times New Roman" w:cs="Times New Roman"/>
-          <w:kern w:val="0"/>
-          <w:sz w:val="24"/>
-          <w14:ligatures w14:val="none"/>
-        </w:rPr>
-        <w:t>(See functions in the codes</w:t>
-      </w:r>
-      <w:r>
-        <w:rPr>
-          <w:rFonts w:ascii="Times New Roman" w:eastAsia="宋体" w:hAnsi="Times New Roman" w:cs="Times New Roman"/>
-          <w:kern w:val="0"/>
-          <w:sz w:val="24"/>
-          <w14:ligatures w14:val="none"/>
-        </w:rPr>
-        <w:t>,</w:t>
-      </w:r>
-      <w:r>
-        <w:rPr>
-          <w:rFonts w:ascii="Times New Roman" w:eastAsia="宋体" w:hAnsi="Times New Roman" w:cs="Times New Roman"/>
-          <w:kern w:val="0"/>
-          <w:sz w:val="24"/>
-          <w14:ligatures w14:val="none"/>
-        </w:rPr>
-        <w:t xml:space="preserve"> where</w:t>
-      </w:r>
-      <w:r>
-        <w:rPr>
-          <w:rFonts w:ascii="Times New Roman" w:eastAsia="宋体" w:hAnsi="Times New Roman" w:cs="Times New Roman"/>
-          <w:kern w:val="0"/>
-          <w:sz w:val="24"/>
-          <w14:ligatures w14:val="none"/>
-        </w:rPr>
-        <w:t xml:space="preserve"> assumption diagnostics functions are listed</w:t>
-      </w:r>
-      <w:r>
-        <w:rPr>
-          <w:rFonts w:ascii="Times New Roman" w:eastAsia="宋体" w:hAnsi="Times New Roman" w:cs="Times New Roman"/>
-          <w:kern w:val="0"/>
-          <w:sz w:val="24"/>
-          <w14:ligatures w14:val="none"/>
+          <w:sz w:val="24"/>
         </w:rPr>
         <w:t>)</w:t>
-      </w:r>
-      <w:r>
-        <w:rPr>
-          <w:rFonts w:ascii="Times New Roman" w:eastAsia="宋体" w:hAnsi="Times New Roman" w:cs="Times New Roman" w:hint="eastAsia"/>
-          <w:kern w:val="0"/>
-          <w:sz w:val="24"/>
-          <w14:ligatures w14:val="none"/>
-        </w:rPr>
-        <w:t>.</w:t>
       </w:r>
     </w:p>
     <w:p>
@@ -7123,11 +6957,13 @@
     <w:p>
       <w:pPr>
         <w:spacing w:after="0" w:line="240" w:lineRule="auto"/>
-        <w:ind w:firstLineChars="100" w:firstLine="240"/>
         <w:jc w:val="both"/>
         <w:rPr>
           <w:rFonts w:ascii="Times New Roman" w:hAnsi="Times New Roman" w:cs="Times New Roman"/>
-          <w:sz w:val="24"/>
+          <w:b/>
+          <w:bCs/>
+          <w:sz w:val="26"/>
+          <w:szCs w:val="26"/>
         </w:rPr>
       </w:pPr>
     </w:p>
@@ -7136,21 +6972,107 @@
         <w:spacing w:after="0" w:line="240" w:lineRule="auto"/>
         <w:jc w:val="both"/>
         <w:rPr>
-          <w:rFonts w:ascii="Times New Roman" w:hAnsi="Times New Roman" w:cs="Times New Roman"/>
-          <w:sz w:val="24"/>
-        </w:rPr>
-      </w:pPr>
-      <w:r>
-        <w:rPr>
-          <w:rFonts w:ascii="Times New Roman" w:hAnsi="Times New Roman" w:cs="Times New Roman"/>
+          <w:rFonts w:ascii="Times New Roman" w:hAnsi="Times New Roman" w:cs="Times New Roman" w:hint="eastAsia"/>
           <w:b/>
           <w:bCs/>
           <w:sz w:val="26"/>
           <w:szCs w:val="26"/>
+          <w:lang w:val="fr-CA"/>
+        </w:rPr>
+      </w:pPr>
+      <w:r>
+        <w:rPr>
+          <w:rFonts w:ascii="Times New Roman" w:hAnsi="Times New Roman" w:cs="Times New Roman"/>
+          <w:b/>
+          <w:bCs/>
+          <w:sz w:val="26"/>
+          <w:szCs w:val="26"/>
         </w:rPr>
         <w:lastRenderedPageBreak/>
-        <w:t>-FORMAL DATA ANALYSIS</w:t>
-      </w:r>
+        <w:t>-Results</w:t>
+      </w:r>
+    </w:p>
+    <w:p>
+      <w:pPr>
+        <w:spacing w:after="0" w:line="240" w:lineRule="auto"/>
+        <w:jc w:val="both"/>
+        <w:rPr>
+          <w:rFonts w:ascii="Times New Roman" w:hAnsi="Times New Roman" w:cs="Times New Roman"/>
+          <w:b/>
+          <w:bCs/>
+          <w:i/>
+          <w:iCs/>
+          <w:sz w:val="26"/>
+          <w:szCs w:val="26"/>
+        </w:rPr>
+      </w:pPr>
+      <w:r>
+        <w:rPr>
+          <w:rFonts w:ascii="Times New Roman" w:hAnsi="Times New Roman" w:cs="Times New Roman"/>
+          <w:b/>
+          <w:bCs/>
+          <w:sz w:val="26"/>
+          <w:szCs w:val="26"/>
+        </w:rPr>
+        <w:t>AIM1</w:t>
+      </w:r>
+      <w:r>
+        <w:rPr>
+          <w:rFonts w:ascii="Times New Roman" w:hAnsi="Times New Roman" w:cs="Times New Roman"/>
+          <w:b/>
+          <w:bCs/>
+          <w:sz w:val="26"/>
+          <w:szCs w:val="26"/>
+        </w:rPr>
+        <w:t>:</w:t>
+      </w:r>
+      <w:r>
+        <w:rPr>
+          <w:rFonts w:ascii="Times New Roman" w:hAnsi="Times New Roman" w:cs="Times New Roman"/>
+          <w:b/>
+          <w:bCs/>
+          <w:sz w:val="26"/>
+          <w:szCs w:val="26"/>
+          <w:lang w:eastAsia="ja-JP"/>
+        </w:rPr>
+        <w:t xml:space="preserve"> </w:t>
+      </w:r>
+      <w:proofErr w:type="spellStart"/>
+      <w:r>
+        <w:rPr>
+          <w:rFonts w:ascii="Times New Roman" w:hAnsi="Times New Roman" w:cs="Times New Roman"/>
+          <w:b/>
+          <w:bCs/>
+          <w:i/>
+          <w:iCs/>
+          <w:sz w:val="26"/>
+          <w:szCs w:val="26"/>
+        </w:rPr>
+        <w:t>Behavioural</w:t>
+      </w:r>
+      <w:proofErr w:type="spellEnd"/>
+      <w:r>
+        <w:rPr>
+          <w:rFonts w:ascii="Times New Roman" w:hAnsi="Times New Roman" w:cs="Times New Roman"/>
+          <w:b/>
+          <w:bCs/>
+          <w:i/>
+          <w:iCs/>
+          <w:sz w:val="26"/>
+          <w:szCs w:val="26"/>
+        </w:rPr>
+        <w:t xml:space="preserve"> and Psychological Contributors and Emotion Regulation Ability</w:t>
+      </w:r>
+    </w:p>
+    <w:p>
+      <w:pPr>
+        <w:spacing w:after="0" w:line="240" w:lineRule="auto"/>
+        <w:jc w:val="both"/>
+        <w:rPr>
+          <w:rFonts w:ascii="Times New Roman" w:hAnsi="Times New Roman" w:cs="Times New Roman"/>
+          <w:sz w:val="24"/>
+        </w:rPr>
+      </w:pPr>
     </w:p>
     <w:sectPr>
       <w:pgSz w:w="11906" w:h="16838"/>

</xml_diff>

<commit_message>
Elaboration of conceptual framework introducted in the Introduction
</commit_message>
<xml_diff>
--- a/Project1_Sleep_Deprivation_Cognition/Report/Analysis_Report.docx
+++ b/Project1_Sleep_Deprivation_Cognition/Report/Analysis_Report.docx
@@ -744,6 +744,18 @@
         <w:spacing w:after="0" w:line="240" w:lineRule="auto"/>
         <w:jc w:val="both"/>
         <w:outlineLvl w:val="2"/>
+        <w:rPr>
+          <w:rFonts w:ascii="Times New Roman" w:eastAsia="宋体" w:hAnsi="Times New Roman" w:cs="Times New Roman"/>
+          <w:b/>
+          <w:bCs/>
+          <w:kern w:val="0"/>
+          <w:sz w:val="26"/>
+          <w:szCs w:val="26"/>
+          <w:lang w:val="fr-CA"/>
+          <w14:ligatures w14:val="none"/>
+        </w:rPr>
+      </w:pPr>
+      <w:r>
         <w:rPr>
           <w:rFonts w:ascii="Times New Roman" w:eastAsia="宋体" w:hAnsi="Times New Roman" w:cs="Times New Roman"/>
           <w:b/>
@@ -753,479 +765,951 @@
           <w:szCs w:val="26"/>
           <w14:ligatures w14:val="none"/>
         </w:rPr>
-      </w:pPr>
-      <w:r>
+        <w:t>Introduction</w:t>
+      </w:r>
+    </w:p>
+    <w:p>
+      <w:pPr>
+        <w:widowControl/>
+        <w:spacing w:after="0" w:line="240" w:lineRule="auto"/>
+        <w:ind w:firstLineChars="100" w:firstLine="240"/>
+        <w:jc w:val="both"/>
+        <w:rPr>
+          <w:rFonts w:ascii="Times New Roman" w:hAnsi="Times New Roman" w:cs="Times New Roman"/>
+          <w:sz w:val="24"/>
+        </w:rPr>
+      </w:pPr>
+      <w:r>
+        <w:rPr>
+          <w:rFonts w:ascii="Times New Roman" w:eastAsia="宋体" w:hAnsi="Times New Roman" w:cs="Times New Roman"/>
+          <w:kern w:val="0"/>
+          <w:sz w:val="24"/>
+          <w14:ligatures w14:val="none"/>
+        </w:rPr>
+        <w:t xml:space="preserve">Cognitive processing is one of the most fundamental topics in psychology and neuroscience, as it provides a framework for understanding functionally segregated yet integrated information-processing mechanisms underlying the way individuals interact with the surrounding environment (Frank &amp; </w:t>
+      </w:r>
+      <w:proofErr w:type="spellStart"/>
+      <w:r>
+        <w:rPr>
+          <w:rFonts w:ascii="Times New Roman" w:eastAsia="宋体" w:hAnsi="Times New Roman" w:cs="Times New Roman"/>
+          <w:kern w:val="0"/>
+          <w:sz w:val="24"/>
+          <w14:ligatures w14:val="none"/>
+        </w:rPr>
+        <w:t>Badre</w:t>
+      </w:r>
+      <w:proofErr w:type="spellEnd"/>
+      <w:r>
+        <w:rPr>
+          <w:rFonts w:ascii="Times New Roman" w:eastAsia="宋体" w:hAnsi="Times New Roman" w:cs="Times New Roman"/>
+          <w:kern w:val="0"/>
+          <w:sz w:val="24"/>
+          <w14:ligatures w14:val="none"/>
+        </w:rPr>
+        <w:t xml:space="preserve">, 2015; Schall, 2004; </w:t>
+      </w:r>
+      <w:proofErr w:type="spellStart"/>
+      <w:r>
+        <w:rPr>
+          <w:rFonts w:ascii="Times New Roman" w:eastAsia="宋体" w:hAnsi="Times New Roman" w:cs="Times New Roman"/>
+          <w:kern w:val="0"/>
+          <w:sz w:val="24"/>
+          <w14:ligatures w14:val="none"/>
+        </w:rPr>
+        <w:t>Forstmann</w:t>
+      </w:r>
+      <w:proofErr w:type="spellEnd"/>
+      <w:r>
+        <w:rPr>
+          <w:rFonts w:ascii="Times New Roman" w:eastAsia="宋体" w:hAnsi="Times New Roman" w:cs="Times New Roman"/>
+          <w:kern w:val="0"/>
+          <w:sz w:val="24"/>
+          <w14:ligatures w14:val="none"/>
+        </w:rPr>
+        <w:t xml:space="preserve"> et al., 2011). </w:t>
+      </w:r>
+      <w:r>
+        <w:rPr>
+          <w:rFonts w:ascii="Times New Roman" w:hAnsi="Times New Roman" w:cs="Times New Roman"/>
+          <w:sz w:val="24"/>
+        </w:rPr>
+        <w:t>Presented information may influence observable performance both directly, as the immediate input to cognitive processing, and indirectly, by interacting with the broader processing context under which cognition operates. For the present framework, this processing context includes both prior experience and the individual’s current internal state.</w:t>
+      </w:r>
+    </w:p>
+    <w:p>
+      <w:pPr>
+        <w:widowControl/>
+        <w:spacing w:after="0" w:line="240" w:lineRule="auto"/>
+        <w:ind w:firstLineChars="100" w:firstLine="240"/>
+        <w:jc w:val="both"/>
+        <w:rPr>
+          <w:rFonts w:ascii="Times New Roman" w:eastAsia="宋体" w:hAnsi="Times New Roman" w:cs="Times New Roman"/>
+          <w:kern w:val="0"/>
+          <w:sz w:val="24"/>
+          <w14:ligatures w14:val="none"/>
+        </w:rPr>
+      </w:pPr>
+      <w:r>
+        <w:rPr>
+          <w:rFonts w:ascii="Times New Roman" w:hAnsi="Times New Roman" w:cs="Times New Roman"/>
+          <w:sz w:val="24"/>
+        </w:rPr>
+        <w:t xml:space="preserve">Considering that cognitive processing is sensitive to an individual’s experience and current state, certain studies support a broader conceptualization of cognitive functioning as dynamically state- and context-dependent, meaning that the expected processing outcome may vary depending on contextual conditions even when the immediate processing input remains unchanged, thereby potentially altering an individual’s performance (Flavell et al., 2022; Gilbert &amp; Sigman, 2007). For the present framework and data analyses, contextual contributors to variation in cognitive processing can be broadly distinguished into two categories. One can be conceptualized as an experience-related contributor, referring to influences arising from prior experiences or an individual’s interactions with the surrounding environment that subsequently shape the context under which cognitive functioning occurs, even when those experiences are not themselves properties of the immediate processing input. </w:t>
+      </w:r>
+      <w:r>
+        <w:rPr>
+          <w:rFonts w:ascii="Times New Roman" w:hAnsi="Times New Roman" w:cs="Times New Roman"/>
+          <w:sz w:val="24"/>
+        </w:rPr>
+        <w:lastRenderedPageBreak/>
+        <w:t>Examples include insufficient sleep and body posture (</w:t>
+      </w:r>
+      <w:proofErr w:type="spellStart"/>
+      <w:r>
+        <w:rPr>
+          <w:rFonts w:ascii="Times New Roman" w:hAnsi="Times New Roman" w:cs="Times New Roman"/>
+          <w:sz w:val="24"/>
+        </w:rPr>
+        <w:t>Alhola</w:t>
+      </w:r>
+      <w:proofErr w:type="spellEnd"/>
+      <w:r>
+        <w:rPr>
+          <w:rFonts w:ascii="Times New Roman" w:hAnsi="Times New Roman" w:cs="Times New Roman"/>
+          <w:sz w:val="24"/>
+        </w:rPr>
+        <w:t xml:space="preserve"> &amp; Polo-</w:t>
+      </w:r>
+      <w:proofErr w:type="spellStart"/>
+      <w:r>
+        <w:rPr>
+          <w:rFonts w:ascii="Times New Roman" w:hAnsi="Times New Roman" w:cs="Times New Roman"/>
+          <w:sz w:val="24"/>
+        </w:rPr>
+        <w:t>Kantola</w:t>
+      </w:r>
+      <w:proofErr w:type="spellEnd"/>
+      <w:r>
+        <w:rPr>
+          <w:rFonts w:ascii="Times New Roman" w:hAnsi="Times New Roman" w:cs="Times New Roman"/>
+          <w:sz w:val="24"/>
+        </w:rPr>
+        <w:t>, 2007; Khan &amp; Al-</w:t>
+      </w:r>
+      <w:proofErr w:type="spellStart"/>
+      <w:r>
+        <w:rPr>
+          <w:rFonts w:ascii="Times New Roman" w:hAnsi="Times New Roman" w:cs="Times New Roman"/>
+          <w:sz w:val="24"/>
+        </w:rPr>
+        <w:t>Jahdali</w:t>
+      </w:r>
+      <w:proofErr w:type="spellEnd"/>
+      <w:r>
+        <w:rPr>
+          <w:rFonts w:ascii="Times New Roman" w:hAnsi="Times New Roman" w:cs="Times New Roman"/>
+          <w:sz w:val="24"/>
+        </w:rPr>
+        <w:t xml:space="preserve">, 2023; </w:t>
+      </w:r>
+      <w:proofErr w:type="spellStart"/>
+      <w:r>
+        <w:rPr>
+          <w:rFonts w:ascii="Times New Roman" w:hAnsi="Times New Roman" w:cs="Times New Roman"/>
+          <w:sz w:val="24"/>
+        </w:rPr>
+        <w:t>Wainio</w:t>
+      </w:r>
+      <w:proofErr w:type="spellEnd"/>
+      <w:r>
+        <w:rPr>
+          <w:rFonts w:ascii="Times New Roman" w:hAnsi="Times New Roman" w:cs="Times New Roman"/>
+          <w:sz w:val="24"/>
+        </w:rPr>
+        <w:t xml:space="preserve">-Theberge &amp; </w:t>
+      </w:r>
+      <w:proofErr w:type="spellStart"/>
+      <w:r>
+        <w:rPr>
+          <w:rFonts w:ascii="Times New Roman" w:hAnsi="Times New Roman" w:cs="Times New Roman"/>
+          <w:sz w:val="24"/>
+        </w:rPr>
+        <w:t>Armony</w:t>
+      </w:r>
+      <w:proofErr w:type="spellEnd"/>
+      <w:r>
+        <w:rPr>
+          <w:rFonts w:ascii="Times New Roman" w:hAnsi="Times New Roman" w:cs="Times New Roman"/>
+          <w:sz w:val="24"/>
+        </w:rPr>
+        <w:t>, 2025). In contrast, a psychophysiological-state contributor refers to a condition manifested within the individual at psychological and/or physiological levels, such as emotional state, fatigue, or motivation (Flavell et al., 2022). For example, perception of the emotional content of a picture or an ambiguous facial expression may be biased by the perceiver’s current emotional state (</w:t>
+      </w:r>
+      <w:proofErr w:type="spellStart"/>
+      <w:r>
+        <w:rPr>
+          <w:rFonts w:ascii="Times New Roman" w:hAnsi="Times New Roman" w:cs="Times New Roman"/>
+          <w:sz w:val="24"/>
+        </w:rPr>
+        <w:t>Trilla</w:t>
+      </w:r>
+      <w:proofErr w:type="spellEnd"/>
+      <w:r>
+        <w:rPr>
+          <w:rFonts w:ascii="Times New Roman" w:hAnsi="Times New Roman" w:cs="Times New Roman"/>
+          <w:sz w:val="24"/>
+        </w:rPr>
+        <w:t xml:space="preserve"> et al., 2021; Harris et al., 2016). Substantial evidence further suggests that these contextual influences may operate partly through modulation of the neural and physiological mechanisms underlying cognitive functioning. Importantly, the two types of contributors are not necessaril</w:t>
+      </w:r>
+      <w:r>
+        <w:rPr>
+          <w:rFonts w:ascii="Times New Roman" w:hAnsi="Times New Roman" w:cs="Times New Roman"/>
+          <w:sz w:val="24"/>
+        </w:rPr>
+        <w:t xml:space="preserve">y independent and </w:t>
+      </w:r>
+      <w:r>
+        <w:rPr>
+          <w:rFonts w:ascii="Times New Roman" w:hAnsi="Times New Roman" w:cs="Times New Roman"/>
+          <w:sz w:val="24"/>
+        </w:rPr>
+        <w:t>may influence cognitive processing and its observable outcomes either independently or interactively</w:t>
+      </w:r>
+      <w:r>
+        <w:rPr>
+          <w:rFonts w:ascii="Times New Roman" w:hAnsi="Times New Roman" w:cs="Times New Roman"/>
+          <w:sz w:val="24"/>
+        </w:rPr>
+        <w:t xml:space="preserve">. </w:t>
+      </w:r>
+      <w:r>
+        <w:rPr>
+          <w:rFonts w:ascii="Times New Roman" w:hAnsi="Times New Roman" w:cs="Times New Roman"/>
+          <w:sz w:val="24"/>
+        </w:rPr>
+        <w:t>Psychophysiological states may themselves be elicited or modified by prior experience and human–environment interaction, whereas relatively persistent psychological conditions, such as trait anxiety or depressive states, may continue to affect cognitive performance even in the absence of an immediate external trigger (Pacheco-</w:t>
+      </w:r>
+      <w:proofErr w:type="spellStart"/>
+      <w:r>
+        <w:rPr>
+          <w:rFonts w:ascii="Times New Roman" w:hAnsi="Times New Roman" w:cs="Times New Roman"/>
+          <w:sz w:val="24"/>
+        </w:rPr>
+        <w:t>Unguetti</w:t>
+      </w:r>
+      <w:proofErr w:type="spellEnd"/>
+      <w:r>
+        <w:rPr>
+          <w:rFonts w:ascii="Times New Roman" w:hAnsi="Times New Roman" w:cs="Times New Roman"/>
+          <w:sz w:val="24"/>
+        </w:rPr>
+        <w:t xml:space="preserve"> et al., 2010; Roca et al., 2015). </w:t>
+      </w:r>
+      <w:r>
+        <w:rPr>
+          <w:rFonts w:ascii="Times New Roman" w:hAnsi="Times New Roman" w:cs="Times New Roman"/>
+          <w:sz w:val="24"/>
+        </w:rPr>
+        <w:t>C</w:t>
+      </w:r>
+      <w:r>
+        <w:rPr>
+          <w:rFonts w:ascii="Times New Roman" w:hAnsi="Times New Roman" w:cs="Times New Roman"/>
+          <w:sz w:val="24"/>
+        </w:rPr>
+        <w:t xml:space="preserve">onversely, internal psychophysiological states may also shape </w:t>
+      </w:r>
+      <w:r>
+        <w:rPr>
+          <w:rFonts w:ascii="Times New Roman" w:hAnsi="Times New Roman" w:cs="Times New Roman" w:hint="eastAsia"/>
+          <w:sz w:val="24"/>
+        </w:rPr>
+        <w:t>one</w:t>
+      </w:r>
+      <w:r>
+        <w:rPr>
+          <w:rFonts w:ascii="Times New Roman" w:hAnsi="Times New Roman" w:cs="Times New Roman"/>
+          <w:sz w:val="24"/>
+        </w:rPr>
+        <w:t xml:space="preserve">’s </w:t>
+      </w:r>
+      <w:r>
+        <w:rPr>
+          <w:rFonts w:ascii="Times New Roman" w:hAnsi="Times New Roman" w:cs="Times New Roman"/>
+          <w:sz w:val="24"/>
+        </w:rPr>
+        <w:t>subsequent interactions with the surrounding environment, thereby further influencing cognitive functioning and observable performance.</w:t>
+      </w:r>
+    </w:p>
+    <w:p>
+      <w:pPr>
+        <w:widowControl/>
+        <w:spacing w:after="0" w:line="240" w:lineRule="auto"/>
+        <w:ind w:firstLineChars="100" w:firstLine="240"/>
+        <w:jc w:val="both"/>
+        <w:rPr>
+          <w:rFonts w:ascii="Times New Roman" w:eastAsia="宋体" w:hAnsi="Times New Roman" w:cs="Times New Roman"/>
+          <w:kern w:val="0"/>
+          <w:sz w:val="24"/>
+          <w14:ligatures w14:val="none"/>
+        </w:rPr>
+      </w:pPr>
+      <w:r>
+        <w:rPr>
+          <w:rFonts w:ascii="Times New Roman" w:eastAsia="宋体" w:hAnsi="Times New Roman" w:cs="Times New Roman"/>
+          <w:kern w:val="0"/>
+          <w:sz w:val="24"/>
+          <w14:ligatures w14:val="none"/>
+        </w:rPr>
+        <w:t>The publicly available Kaggle dataset</w:t>
+      </w:r>
+      <w:r>
+        <w:rPr>
+          <w:rFonts w:ascii="Times New Roman" w:eastAsia="宋体" w:hAnsi="Times New Roman" w:cs="Times New Roman"/>
+          <w:kern w:val="0"/>
+          <w:sz w:val="24"/>
+          <w14:ligatures w14:val="none"/>
+        </w:rPr>
+        <w:t xml:space="preserve"> </w:t>
+      </w:r>
+      <w:r>
+        <w:rPr>
+          <w:rFonts w:ascii="Times New Roman" w:eastAsia="宋体" w:hAnsi="Times New Roman" w:cs="Times New Roman" w:hint="eastAsia"/>
+          <w:kern w:val="0"/>
+          <w:sz w:val="24"/>
+          <w14:ligatures w14:val="none"/>
+        </w:rPr>
+        <w:t>u</w:t>
+      </w:r>
+      <w:r>
+        <w:rPr>
+          <w:rFonts w:ascii="Times New Roman" w:eastAsia="宋体" w:hAnsi="Times New Roman" w:cs="Times New Roman"/>
+          <w:kern w:val="0"/>
+          <w:sz w:val="24"/>
+          <w14:ligatures w14:val="none"/>
+        </w:rPr>
+        <w:t xml:space="preserve">sed in the data analyses project provides a broad range of behavioral, psychological, and cognitive performance measures (Sacramento Technology, 2024). It provides an opportunity for the project to achieve two broad purposes: (1) the examination of the broader </w:t>
+      </w:r>
+      <w:r>
+        <w:rPr>
+          <w:rFonts w:ascii="Times New Roman" w:eastAsia="宋体" w:hAnsi="Times New Roman" w:cs="Times New Roman"/>
+          <w:kern w:val="0"/>
+          <w:sz w:val="24"/>
+          <w14:ligatures w14:val="none"/>
+        </w:rPr>
+        <w:t>association</w:t>
+      </w:r>
+      <w:r>
+        <w:rPr>
+          <w:rFonts w:ascii="Times New Roman" w:eastAsia="宋体" w:hAnsi="Times New Roman" w:cs="Times New Roman"/>
+          <w:kern w:val="0"/>
+          <w:sz w:val="24"/>
+          <w14:ligatures w14:val="none"/>
+        </w:rPr>
+        <w:t xml:space="preserve"> structure among these variables to understand their </w:t>
+      </w:r>
+      <w:r>
+        <w:rPr>
+          <w:rFonts w:ascii="Times New Roman" w:eastAsia="宋体" w:hAnsi="Times New Roman" w:cs="Times New Roman"/>
+          <w:kern w:val="0"/>
+          <w:sz w:val="24"/>
+          <w14:ligatures w14:val="none"/>
+        </w:rPr>
+        <w:t xml:space="preserve">contributions on </w:t>
+      </w:r>
+      <w:r>
+        <w:rPr>
+          <w:rFonts w:ascii="Times New Roman" w:eastAsia="宋体" w:hAnsi="Times New Roman" w:cs="Times New Roman"/>
+          <w:kern w:val="0"/>
+          <w:sz w:val="24"/>
+          <w14:ligatures w14:val="none"/>
+        </w:rPr>
+        <w:t xml:space="preserve">cognitive performance </w:t>
+      </w:r>
+      <w:r>
+        <w:rPr>
+          <w:rFonts w:ascii="Times New Roman" w:eastAsia="宋体" w:hAnsi="Times New Roman" w:cs="Times New Roman"/>
+          <w:kern w:val="0"/>
+          <w:sz w:val="24"/>
+          <w14:ligatures w14:val="none"/>
+        </w:rPr>
+        <w:t>distinctively</w:t>
+      </w:r>
+      <w:r>
+        <w:rPr>
+          <w:rFonts w:ascii="Times New Roman" w:eastAsia="宋体" w:hAnsi="Times New Roman" w:cs="Times New Roman"/>
+          <w:kern w:val="0"/>
+          <w:sz w:val="24"/>
+          <w14:ligatures w14:val="none"/>
+        </w:rPr>
+        <w:t>, while also (2) selecting theoretically relevant conditions for more focused model-driven analyses. Accordingly, for the first purpose, an exploratory correlation matrix heatmap was first established, providing an overall presentation of all zero-order associations among variables.</w:t>
+      </w:r>
+    </w:p>
+    <w:p>
+      <w:pPr>
+        <w:widowControl/>
+        <w:spacing w:after="0" w:line="240" w:lineRule="auto"/>
+        <w:ind w:firstLineChars="100" w:firstLine="240"/>
+        <w:jc w:val="both"/>
+        <w:rPr>
+          <w:rFonts w:ascii="Times New Roman" w:eastAsia="宋体" w:hAnsi="Times New Roman" w:cs="Times New Roman"/>
+          <w:kern w:val="0"/>
+          <w:sz w:val="24"/>
+          <w14:ligatures w14:val="none"/>
+        </w:rPr>
+      </w:pPr>
+      <w:r>
+        <w:rPr>
+          <w:rFonts w:ascii="Times New Roman" w:eastAsia="宋体" w:hAnsi="Times New Roman" w:cs="Times New Roman"/>
+          <w:kern w:val="0"/>
+          <w:sz w:val="24"/>
+          <w14:ligatures w14:val="none"/>
+        </w:rPr>
+        <w:t>For the second broad purpose, the present project focused on two representative conditions derived from the conceptual framework introduced above. Sleep hours and stress level</w:t>
+      </w:r>
+      <w:r>
+        <w:rPr>
+          <w:rFonts w:ascii="Times New Roman" w:eastAsia="宋体" w:hAnsi="Times New Roman" w:cs="Times New Roman"/>
+          <w:kern w:val="0"/>
+          <w:sz w:val="24"/>
+          <w14:ligatures w14:val="none"/>
+        </w:rPr>
+        <w:t xml:space="preserve"> scores</w:t>
+      </w:r>
+      <w:r>
+        <w:rPr>
+          <w:rFonts w:ascii="Times New Roman" w:eastAsia="宋体" w:hAnsi="Times New Roman" w:cs="Times New Roman"/>
+          <w:kern w:val="0"/>
+          <w:sz w:val="24"/>
+          <w14:ligatures w14:val="none"/>
+        </w:rPr>
+        <w:t xml:space="preserve"> were </w:t>
+      </w:r>
+      <w:r>
+        <w:rPr>
+          <w:rFonts w:ascii="Times New Roman" w:eastAsia="宋体" w:hAnsi="Times New Roman" w:cs="Times New Roman"/>
+          <w:kern w:val="0"/>
+          <w:sz w:val="24"/>
+          <w14:ligatures w14:val="none"/>
+        </w:rPr>
+        <w:t>taken</w:t>
+      </w:r>
+      <w:r>
+        <w:rPr>
+          <w:rFonts w:ascii="Times New Roman" w:eastAsia="宋体" w:hAnsi="Times New Roman" w:cs="Times New Roman"/>
+          <w:kern w:val="0"/>
+          <w:sz w:val="24"/>
+          <w14:ligatures w14:val="none"/>
+        </w:rPr>
+        <w:t xml:space="preserve"> as </w:t>
+      </w:r>
+      <w:r>
+        <w:rPr>
+          <w:rFonts w:ascii="Times New Roman" w:eastAsia="宋体" w:hAnsi="Times New Roman" w:cs="Times New Roman"/>
+          <w:kern w:val="0"/>
+          <w:sz w:val="24"/>
+          <w14:ligatures w14:val="none"/>
+        </w:rPr>
+        <w:t>contexts</w:t>
+      </w:r>
+      <w:r>
+        <w:rPr>
+          <w:rFonts w:ascii="Times New Roman" w:eastAsia="宋体" w:hAnsi="Times New Roman" w:cs="Times New Roman"/>
+          <w:kern w:val="0"/>
+          <w:sz w:val="24"/>
+          <w14:ligatures w14:val="none"/>
+        </w:rPr>
+        <w:t xml:space="preserve"> primarily originating from </w:t>
+      </w:r>
+      <w:r>
+        <w:rPr>
+          <w:rFonts w:ascii="Times New Roman" w:eastAsia="宋体" w:hAnsi="Times New Roman" w:cs="Times New Roman"/>
+          <w:kern w:val="0"/>
+          <w:sz w:val="24"/>
+          <w14:ligatures w14:val="none"/>
+        </w:rPr>
+        <w:t>experience</w:t>
+      </w:r>
+      <w:r>
+        <w:rPr>
+          <w:rFonts w:ascii="Times New Roman" w:eastAsia="宋体" w:hAnsi="Times New Roman" w:cs="Times New Roman"/>
+          <w:kern w:val="0"/>
+          <w:sz w:val="24"/>
+          <w14:ligatures w14:val="none"/>
+        </w:rPr>
+        <w:t xml:space="preserve"> and </w:t>
+      </w:r>
+      <w:r>
+        <w:rPr>
+          <w:rFonts w:ascii="Times New Roman" w:eastAsia="宋体" w:hAnsi="Times New Roman" w:cs="Times New Roman"/>
+          <w:kern w:val="0"/>
+          <w:sz w:val="24"/>
+          <w14:ligatures w14:val="none"/>
+        </w:rPr>
+        <w:t>psychophysiological</w:t>
+      </w:r>
+      <w:r>
+        <w:rPr>
+          <w:rFonts w:ascii="Times New Roman" w:eastAsia="宋体" w:hAnsi="Times New Roman" w:cs="Times New Roman"/>
+          <w:kern w:val="0"/>
+          <w:sz w:val="24"/>
+          <w14:ligatures w14:val="none"/>
+        </w:rPr>
+        <w:t xml:space="preserve"> domains, respectively. A large body of studies has suggested that </w:t>
+      </w:r>
+      <w:r>
+        <w:rPr>
+          <w:rFonts w:ascii="Times New Roman" w:eastAsia="宋体" w:hAnsi="Times New Roman" w:cs="Times New Roman"/>
+          <w:kern w:val="0"/>
+          <w:sz w:val="24"/>
+          <w14:ligatures w14:val="none"/>
+        </w:rPr>
+        <w:t xml:space="preserve">the </w:t>
+      </w:r>
+      <w:r>
+        <w:rPr>
+          <w:rFonts w:ascii="Times New Roman" w:eastAsia="宋体" w:hAnsi="Times New Roman" w:cs="Times New Roman"/>
+          <w:kern w:val="0"/>
+          <w:sz w:val="24"/>
+          <w14:ligatures w14:val="none"/>
+        </w:rPr>
+        <w:t xml:space="preserve">factors </w:t>
+      </w:r>
+      <w:r>
+        <w:rPr>
+          <w:rFonts w:ascii="Times New Roman" w:eastAsia="宋体" w:hAnsi="Times New Roman" w:cs="Times New Roman"/>
+          <w:kern w:val="0"/>
+          <w:sz w:val="24"/>
+          <w14:ligatures w14:val="none"/>
+        </w:rPr>
+        <w:t>affect cognitive functioning and therefore associate</w:t>
+      </w:r>
+      <w:r>
+        <w:rPr>
+          <w:rFonts w:ascii="Times New Roman" w:eastAsia="宋体" w:hAnsi="Times New Roman" w:cs="Times New Roman"/>
+          <w:kern w:val="0"/>
+          <w:sz w:val="24"/>
+          <w14:ligatures w14:val="none"/>
+        </w:rPr>
+        <w:t xml:space="preserve"> with performance across different cognitive tasks (</w:t>
+      </w:r>
+      <w:proofErr w:type="spellStart"/>
+      <w:r>
+        <w:rPr>
+          <w:rFonts w:ascii="Times New Roman" w:eastAsia="宋体" w:hAnsi="Times New Roman" w:cs="Times New Roman"/>
+          <w:kern w:val="0"/>
+          <w:sz w:val="24"/>
+          <w14:ligatures w14:val="none"/>
+        </w:rPr>
+        <w:t>Alhola</w:t>
+      </w:r>
+      <w:proofErr w:type="spellEnd"/>
+      <w:r>
+        <w:rPr>
+          <w:rFonts w:ascii="Times New Roman" w:eastAsia="宋体" w:hAnsi="Times New Roman" w:cs="Times New Roman"/>
+          <w:kern w:val="0"/>
+          <w:sz w:val="24"/>
+          <w14:ligatures w14:val="none"/>
+        </w:rPr>
+        <w:t xml:space="preserve"> &amp; Polo-</w:t>
+      </w:r>
+      <w:proofErr w:type="spellStart"/>
+      <w:r>
+        <w:rPr>
+          <w:rFonts w:ascii="Times New Roman" w:eastAsia="宋体" w:hAnsi="Times New Roman" w:cs="Times New Roman"/>
+          <w:kern w:val="0"/>
+          <w:sz w:val="24"/>
+          <w14:ligatures w14:val="none"/>
+        </w:rPr>
+        <w:t>Kantola</w:t>
+      </w:r>
+      <w:proofErr w:type="spellEnd"/>
+      <w:r>
+        <w:rPr>
+          <w:rFonts w:ascii="Times New Roman" w:eastAsia="宋体" w:hAnsi="Times New Roman" w:cs="Times New Roman"/>
+          <w:kern w:val="0"/>
+          <w:sz w:val="24"/>
+          <w14:ligatures w14:val="none"/>
+        </w:rPr>
+        <w:t>, 2007; Khan &amp; Al-</w:t>
+      </w:r>
+      <w:proofErr w:type="spellStart"/>
+      <w:r>
+        <w:rPr>
+          <w:rFonts w:ascii="Times New Roman" w:eastAsia="宋体" w:hAnsi="Times New Roman" w:cs="Times New Roman"/>
+          <w:kern w:val="0"/>
+          <w:sz w:val="24"/>
+          <w14:ligatures w14:val="none"/>
+        </w:rPr>
+        <w:t>Jahdali</w:t>
+      </w:r>
+      <w:proofErr w:type="spellEnd"/>
+      <w:r>
+        <w:rPr>
+          <w:rFonts w:ascii="Times New Roman" w:eastAsia="宋体" w:hAnsi="Times New Roman" w:cs="Times New Roman"/>
+          <w:kern w:val="0"/>
+          <w:sz w:val="24"/>
+          <w14:ligatures w14:val="none"/>
+        </w:rPr>
+        <w:t xml:space="preserve">, 2023; </w:t>
+      </w:r>
+      <w:proofErr w:type="spellStart"/>
+      <w:r>
+        <w:rPr>
+          <w:rFonts w:ascii="Times New Roman" w:eastAsia="宋体" w:hAnsi="Times New Roman" w:cs="Times New Roman"/>
+          <w:kern w:val="0"/>
+          <w:sz w:val="24"/>
+          <w14:ligatures w14:val="none"/>
+        </w:rPr>
+        <w:t>Nwikwe</w:t>
+      </w:r>
+      <w:proofErr w:type="spellEnd"/>
+      <w:r>
+        <w:rPr>
+          <w:rFonts w:ascii="Times New Roman" w:eastAsia="宋体" w:hAnsi="Times New Roman" w:cs="Times New Roman"/>
+          <w:kern w:val="0"/>
+          <w:sz w:val="24"/>
+          <w14:ligatures w14:val="none"/>
+        </w:rPr>
+        <w:t xml:space="preserve">, 2025). Accordingly, the theory-driven analysis incorporated two specific aims. The first aim was to estimate the effects of these conditions on higher-order cognitive functioning. Specifically, the project examined the independent contributions and combined explanatory power of sleep hours and stress level in relation to a higher-order regulatory function. Emotion regulation was selected as the representative higher-order regulatory outcome since its success largely relies on the coordination of several basic cognitive processes such as selective attention, working memory, and inhibitory control (Koay &amp; Meter, 2023). In addition, considering that the dataset contains measurements of basic cognitive skills through cognitive performance tasks, specifically, Stroop task reaction time (RT), N-back accuracy, and psychomotor vigilance test (PVT) RT are expected to primarily measure selective attention and inhibition, working memory, and </w:t>
+      </w:r>
+      <w:r>
+        <w:rPr>
+          <w:rFonts w:ascii="Times New Roman" w:eastAsia="宋体" w:hAnsi="Times New Roman" w:cs="Times New Roman"/>
+          <w:kern w:val="0"/>
+          <w:sz w:val="24"/>
+          <w14:ligatures w14:val="none"/>
+        </w:rPr>
+        <w:lastRenderedPageBreak/>
+        <w:t>sustained attention and behavioral alertness (</w:t>
+      </w:r>
+      <w:proofErr w:type="spellStart"/>
+      <w:r>
+        <w:rPr>
+          <w:rFonts w:ascii="Times New Roman" w:eastAsia="宋体" w:hAnsi="Times New Roman" w:cs="Times New Roman"/>
+          <w:kern w:val="0"/>
+          <w:sz w:val="24"/>
+          <w14:ligatures w14:val="none"/>
+        </w:rPr>
+        <w:t>Basner</w:t>
+      </w:r>
+      <w:proofErr w:type="spellEnd"/>
+      <w:r>
+        <w:rPr>
+          <w:rFonts w:ascii="Times New Roman" w:eastAsia="宋体" w:hAnsi="Times New Roman" w:cs="Times New Roman"/>
+          <w:kern w:val="0"/>
+          <w:sz w:val="24"/>
+          <w14:ligatures w14:val="none"/>
+        </w:rPr>
+        <w:t xml:space="preserve"> et al., 2021; Owen et al., 2005; </w:t>
+      </w:r>
+      <w:proofErr w:type="spellStart"/>
+      <w:r>
+        <w:rPr>
+          <w:rFonts w:ascii="Times New Roman" w:eastAsia="宋体" w:hAnsi="Times New Roman" w:cs="Times New Roman"/>
+          <w:kern w:val="0"/>
+          <w:sz w:val="24"/>
+          <w14:ligatures w14:val="none"/>
+        </w:rPr>
+        <w:t>Scarpina</w:t>
+      </w:r>
+      <w:proofErr w:type="spellEnd"/>
+      <w:r>
+        <w:rPr>
+          <w:rFonts w:ascii="Times New Roman" w:eastAsia="宋体" w:hAnsi="Times New Roman" w:cs="Times New Roman"/>
+          <w:kern w:val="0"/>
+          <w:sz w:val="24"/>
+          <w14:ligatures w14:val="none"/>
+        </w:rPr>
+        <w:t xml:space="preserve"> &amp; </w:t>
+      </w:r>
+      <w:proofErr w:type="spellStart"/>
+      <w:r>
+        <w:rPr>
+          <w:rFonts w:ascii="Times New Roman" w:eastAsia="宋体" w:hAnsi="Times New Roman" w:cs="Times New Roman"/>
+          <w:kern w:val="0"/>
+          <w:sz w:val="24"/>
+          <w14:ligatures w14:val="none"/>
+        </w:rPr>
+        <w:t>Tagini</w:t>
+      </w:r>
+      <w:proofErr w:type="spellEnd"/>
+      <w:r>
+        <w:rPr>
+          <w:rFonts w:ascii="Times New Roman" w:eastAsia="宋体" w:hAnsi="Times New Roman" w:cs="Times New Roman"/>
+          <w:kern w:val="0"/>
+          <w:sz w:val="24"/>
+          <w14:ligatures w14:val="none"/>
+        </w:rPr>
+        <w:t xml:space="preserve">, 2017), respectively. </w:t>
+      </w:r>
+      <w:r>
+        <w:rPr>
+          <w:rFonts w:ascii="Times New Roman" w:hAnsi="Times New Roman" w:cs="Times New Roman"/>
+          <w:sz w:val="24"/>
+        </w:rPr>
+        <w:t xml:space="preserve">This </w:t>
+      </w:r>
+      <w:r>
+        <w:rPr>
+          <w:rFonts w:ascii="Times New Roman" w:hAnsi="Times New Roman" w:cs="Times New Roman"/>
+          <w:sz w:val="24"/>
+        </w:rPr>
+        <w:t xml:space="preserve">raised a second question, and it </w:t>
+      </w:r>
+      <w:r>
+        <w:rPr>
+          <w:rFonts w:ascii="Times New Roman" w:hAnsi="Times New Roman" w:cs="Times New Roman"/>
+          <w:sz w:val="24"/>
+        </w:rPr>
+        <w:t xml:space="preserve">motivated the second aim of the project: to </w:t>
+      </w:r>
+      <w:r>
+        <w:rPr>
+          <w:rFonts w:ascii="Times New Roman" w:hAnsi="Times New Roman" w:cs="Times New Roman"/>
+          <w:sz w:val="24"/>
+        </w:rPr>
+        <w:t>test</w:t>
+      </w:r>
+      <w:r>
+        <w:rPr>
+          <w:rFonts w:ascii="Times New Roman" w:hAnsi="Times New Roman" w:cs="Times New Roman"/>
+          <w:sz w:val="24"/>
+        </w:rPr>
+        <w:t xml:space="preserve"> whether the measures</w:t>
+      </w:r>
+      <w:r>
+        <w:rPr>
+          <w:rFonts w:ascii="Times New Roman" w:hAnsi="Times New Roman" w:cs="Times New Roman"/>
+          <w:sz w:val="24"/>
+        </w:rPr>
+        <w:t xml:space="preserve"> of cognitive performance constructs</w:t>
+      </w:r>
+      <w:r>
+        <w:rPr>
+          <w:rFonts w:ascii="Times New Roman" w:hAnsi="Times New Roman" w:cs="Times New Roman"/>
+          <w:sz w:val="24"/>
+        </w:rPr>
+        <w:t xml:space="preserve"> could be reasonably summarized by a broader common cognitive-performance dimension</w:t>
+      </w:r>
+      <w:r>
+        <w:rPr>
+          <w:rFonts w:ascii="Times New Roman" w:hAnsi="Times New Roman" w:cs="Times New Roman"/>
+          <w:sz w:val="24"/>
+        </w:rPr>
+        <w:t xml:space="preserve"> if possible</w:t>
+      </w:r>
+      <w:r>
+        <w:rPr>
+          <w:rFonts w:ascii="Times New Roman" w:hAnsi="Times New Roman" w:cs="Times New Roman"/>
+          <w:sz w:val="24"/>
+        </w:rPr>
+        <w:t>. If a meaningful broader dimension could be identified, it would provide a more parsimonious representation of the available cognitive performance measures;</w:t>
+      </w:r>
+      <w:r>
+        <w:rPr>
+          <w:rFonts w:ascii="Times New Roman" w:hAnsi="Times New Roman" w:cs="Times New Roman"/>
+          <w:sz w:val="24"/>
+        </w:rPr>
+        <w:t xml:space="preserve"> </w:t>
+      </w:r>
+      <w:r>
+        <w:rPr>
+          <w:rFonts w:ascii="Times New Roman" w:eastAsia="宋体" w:hAnsi="Times New Roman" w:cs="Times New Roman"/>
+          <w:kern w:val="0"/>
+          <w:sz w:val="24"/>
+          <w14:ligatures w14:val="none"/>
+        </w:rPr>
+        <w:t>Nevertheless</w:t>
+      </w:r>
+      <w:r>
+        <w:rPr>
+          <w:rFonts w:ascii="Times New Roman" w:eastAsia="宋体" w:hAnsi="Times New Roman" w:cs="Times New Roman"/>
+          <w:kern w:val="0"/>
+          <w:sz w:val="24"/>
+          <w14:ligatures w14:val="none"/>
+        </w:rPr>
+        <w:t>, if a practically meaningful common component with sufficient information preservation could not be supported, the individual cognitive outcomes would instead be retained and examined separately. Subsequent model-based analyses were th</w:t>
+      </w:r>
+      <w:r>
+        <w:rPr>
+          <w:rFonts w:ascii="Times New Roman" w:eastAsia="宋体" w:hAnsi="Times New Roman" w:cs="Times New Roman"/>
+          <w:kern w:val="0"/>
+          <w:sz w:val="24"/>
+          <w14:ligatures w14:val="none"/>
+        </w:rPr>
+        <w:t>us</w:t>
+      </w:r>
+      <w:r>
+        <w:rPr>
+          <w:rFonts w:ascii="Times New Roman" w:eastAsia="宋体" w:hAnsi="Times New Roman" w:cs="Times New Roman"/>
+          <w:kern w:val="0"/>
+          <w:sz w:val="24"/>
+          <w14:ligatures w14:val="none"/>
+        </w:rPr>
+        <w:t xml:space="preserve"> conducted to estimate the associations of theoretically relevant behavioral and psychological conditions with their corresponding cognitive outcomes.</w:t>
+      </w:r>
+    </w:p>
+    <w:p>
+      <w:pPr>
+        <w:widowControl/>
+        <w:spacing w:after="0" w:line="240" w:lineRule="auto"/>
+        <w:ind w:firstLineChars="100" w:firstLine="240"/>
+        <w:jc w:val="both"/>
+        <w:rPr>
+          <w:rFonts w:ascii="Times New Roman" w:eastAsia="宋体" w:hAnsi="Times New Roman" w:cs="Times New Roman" w:hint="eastAsia"/>
+          <w:kern w:val="0"/>
+          <w:sz w:val="24"/>
+          <w14:ligatures w14:val="none"/>
+        </w:rPr>
+      </w:pPr>
+      <w:r>
+        <w:rPr>
+          <w:rFonts w:ascii="Times New Roman" w:hAnsi="Times New Roman" w:cs="Times New Roman" w:hint="eastAsia"/>
+          <w:sz w:val="24"/>
+        </w:rPr>
+        <w:t>In summary,</w:t>
+      </w:r>
+      <w:r>
+        <w:rPr>
+          <w:rFonts w:ascii="Times New Roman" w:hAnsi="Times New Roman" w:cs="Times New Roman"/>
+          <w:sz w:val="24"/>
+        </w:rPr>
+        <w:t xml:space="preserve"> the present </w:t>
+      </w:r>
+      <w:r>
+        <w:rPr>
+          <w:rFonts w:ascii="Times New Roman" w:hAnsi="Times New Roman" w:cs="Times New Roman"/>
+          <w:sz w:val="24"/>
+        </w:rPr>
+        <w:t xml:space="preserve">analysis </w:t>
+      </w:r>
+      <w:r>
+        <w:rPr>
+          <w:rFonts w:ascii="Times New Roman" w:hAnsi="Times New Roman" w:cs="Times New Roman"/>
+          <w:sz w:val="24"/>
+        </w:rPr>
+        <w:t xml:space="preserve">project combined exploratory association mapping with theory-driven model-based analyses to </w:t>
+      </w:r>
+      <w:r>
+        <w:rPr>
+          <w:rFonts w:ascii="Times New Roman" w:hAnsi="Times New Roman" w:cs="Times New Roman"/>
+          <w:sz w:val="24"/>
+        </w:rPr>
+        <w:t>evaluate</w:t>
+      </w:r>
+      <w:r>
+        <w:rPr>
+          <w:rFonts w:ascii="Times New Roman" w:hAnsi="Times New Roman" w:cs="Times New Roman"/>
+          <w:sz w:val="24"/>
+        </w:rPr>
+        <w:t xml:space="preserve"> how experience-related and psychophysiological-state factors were associated with emotion regulation and cognitive performance</w:t>
+      </w:r>
+      <w:r>
+        <w:rPr>
+          <w:rFonts w:ascii="Times New Roman" w:eastAsia="宋体" w:hAnsi="Times New Roman" w:cs="Times New Roman"/>
+          <w:kern w:val="0"/>
+          <w:sz w:val="24"/>
+          <w14:ligatures w14:val="none"/>
+        </w:rPr>
+        <w:t xml:space="preserve">. </w:t>
+      </w:r>
+      <w:r>
+        <w:rPr>
+          <w:rFonts w:ascii="Times New Roman" w:eastAsia="宋体" w:hAnsi="Times New Roman" w:cs="Times New Roman"/>
+          <w:kern w:val="0"/>
+          <w:sz w:val="24"/>
+          <w14:ligatures w14:val="none"/>
+        </w:rPr>
+        <w:t xml:space="preserve">In general, </w:t>
+      </w:r>
+      <w:r>
+        <w:rPr>
+          <w:rFonts w:ascii="Times New Roman" w:hAnsi="Times New Roman" w:cs="Times New Roman"/>
+          <w:sz w:val="24"/>
+        </w:rPr>
+        <w:t>f</w:t>
+      </w:r>
+      <w:r>
+        <w:rPr>
+          <w:rFonts w:ascii="Times New Roman" w:hAnsi="Times New Roman" w:cs="Times New Roman"/>
+          <w:sz w:val="24"/>
+        </w:rPr>
+        <w:t>or the exploratory purpose, no specific pairwise association was treated as a confirmatory hypothesis; rather, the correlation structure was examined to characterize the overall pattern of relationships in the dataset</w:t>
+      </w:r>
+      <w:r>
+        <w:rPr>
+          <w:rFonts w:ascii="Times New Roman" w:eastAsia="宋体" w:hAnsi="Times New Roman" w:cs="Times New Roman"/>
+          <w:kern w:val="0"/>
+          <w:sz w:val="24"/>
+          <w14:ligatures w14:val="none"/>
+        </w:rPr>
+        <w:t>.</w:t>
+      </w:r>
+      <w:r>
+        <w:rPr>
+          <w:rFonts w:ascii="Times New Roman" w:eastAsia="宋体" w:hAnsi="Times New Roman" w:cs="Times New Roman"/>
+          <w:kern w:val="0"/>
+          <w:sz w:val="24"/>
+          <w14:ligatures w14:val="none"/>
+        </w:rPr>
+        <w:t xml:space="preserve"> And for the second aim, it is expected that the theoretically selected behavioral and psychological conditions will show meaningful associations with their corresponding emotional and cognitive outcomes, while </w:t>
+      </w:r>
+      <w:r>
+        <w:rPr>
+          <w:rFonts w:ascii="Times New Roman" w:eastAsia="宋体" w:hAnsi="Times New Roman" w:cs="Times New Roman"/>
+          <w:kern w:val="0"/>
+          <w:sz w:val="24"/>
+          <w14:ligatures w14:val="none"/>
+        </w:rPr>
+        <w:t>I attempt to identify</w:t>
+      </w:r>
+      <w:r>
+        <w:rPr>
+          <w:rFonts w:ascii="Times New Roman" w:eastAsia="宋体" w:hAnsi="Times New Roman" w:cs="Times New Roman"/>
+          <w:kern w:val="0"/>
+          <w:sz w:val="24"/>
+          <w14:ligatures w14:val="none"/>
+        </w:rPr>
+        <w:t xml:space="preserve"> whether the available cognitive measures can be reasonably summarized into a broader common cognitive performance dimension, thereby indirectly supporting existing theoretical and empirical evidence.</w:t>
+      </w:r>
+      <w:r>
+        <w:rPr>
+          <w:rFonts w:ascii="Times New Roman" w:eastAsia="宋体" w:hAnsi="Times New Roman" w:cs="Times New Roman" w:hint="eastAsia"/>
+          <w:kern w:val="0"/>
+          <w:sz w:val="24"/>
+          <w14:ligatures w14:val="none"/>
+        </w:rPr>
+        <w:t xml:space="preserve"> </w:t>
+      </w:r>
+    </w:p>
+    <w:p>
+      <w:pPr>
+        <w:spacing w:after="0" w:line="240" w:lineRule="auto"/>
+        <w:jc w:val="both"/>
         <w:rPr>
           <w:rFonts w:ascii="Times New Roman" w:eastAsia="宋体" w:hAnsi="Times New Roman" w:cs="Times New Roman"/>
           <w:b/>
           <w:bCs/>
           <w:kern w:val="0"/>
-          <w:sz w:val="26"/>
-          <w:szCs w:val="26"/>
+          <w:sz w:val="24"/>
           <w14:ligatures w14:val="none"/>
         </w:rPr>
-        <w:t>Introduction:</w:t>
-      </w:r>
-    </w:p>
-    <w:p>
-      <w:pPr>
-        <w:widowControl/>
-        <w:spacing w:after="0" w:line="240" w:lineRule="auto"/>
-        <w:ind w:firstLineChars="100" w:firstLine="240"/>
-        <w:jc w:val="both"/>
-        <w:rPr>
-          <w:rFonts w:ascii="Times New Roman" w:eastAsia="宋体" w:hAnsi="Times New Roman" w:cs="Times New Roman"/>
-          <w:kern w:val="0"/>
-          <w:sz w:val="24"/>
-          <w14:ligatures w14:val="none"/>
-        </w:rPr>
-      </w:pPr>
-      <w:r>
-        <w:rPr>
-          <w:rFonts w:ascii="Times New Roman" w:eastAsia="宋体" w:hAnsi="Times New Roman" w:cs="Times New Roman"/>
-          <w:kern w:val="0"/>
-          <w:sz w:val="24"/>
-          <w14:ligatures w14:val="none"/>
-        </w:rPr>
-        <w:t xml:space="preserve">Cognitive processing is one of the most fundamental topics in psychology and neuroscience, as it provides a framework for understanding functionally segregated yet integrated information-processing mechanisms underlying the way individuals interact with the surrounding environment (Frank &amp; </w:t>
-      </w:r>
-      <w:proofErr w:type="spellStart"/>
-      <w:r>
-        <w:rPr>
-          <w:rFonts w:ascii="Times New Roman" w:eastAsia="宋体" w:hAnsi="Times New Roman" w:cs="Times New Roman"/>
-          <w:kern w:val="0"/>
-          <w:sz w:val="24"/>
-          <w14:ligatures w14:val="none"/>
-        </w:rPr>
-        <w:t>Badre</w:t>
-      </w:r>
-      <w:proofErr w:type="spellEnd"/>
-      <w:r>
-        <w:rPr>
-          <w:rFonts w:ascii="Times New Roman" w:eastAsia="宋体" w:hAnsi="Times New Roman" w:cs="Times New Roman"/>
-          <w:kern w:val="0"/>
-          <w:sz w:val="24"/>
-          <w14:ligatures w14:val="none"/>
-        </w:rPr>
-        <w:t xml:space="preserve">, 2015; Schall, 2004; </w:t>
-      </w:r>
-      <w:proofErr w:type="spellStart"/>
-      <w:r>
-        <w:rPr>
-          <w:rFonts w:ascii="Times New Roman" w:eastAsia="宋体" w:hAnsi="Times New Roman" w:cs="Times New Roman"/>
-          <w:kern w:val="0"/>
-          <w:sz w:val="24"/>
-          <w14:ligatures w14:val="none"/>
-        </w:rPr>
-        <w:t>Forstmann</w:t>
-      </w:r>
-      <w:proofErr w:type="spellEnd"/>
-      <w:r>
-        <w:rPr>
-          <w:rFonts w:ascii="Times New Roman" w:eastAsia="宋体" w:hAnsi="Times New Roman" w:cs="Times New Roman"/>
-          <w:kern w:val="0"/>
-          <w:sz w:val="24"/>
-          <w14:ligatures w14:val="none"/>
-        </w:rPr>
-        <w:t xml:space="preserve"> et al., 2011). Presented information may affect the outcomes, or observable performance, through both its direct role as processed input and its indirect role in shaping the state and condition under which processing occurs. </w:t>
-      </w:r>
-    </w:p>
-    <w:p>
-      <w:pPr>
-        <w:widowControl/>
-        <w:spacing w:after="0" w:line="240" w:lineRule="auto"/>
-        <w:ind w:firstLineChars="100" w:firstLine="240"/>
-        <w:jc w:val="both"/>
-        <w:rPr>
-          <w:rFonts w:ascii="Times New Roman" w:eastAsia="宋体" w:hAnsi="Times New Roman" w:cs="Times New Roman"/>
-          <w:kern w:val="0"/>
-          <w:sz w:val="24"/>
-          <w14:ligatures w14:val="none"/>
-        </w:rPr>
-      </w:pPr>
-      <w:r>
-        <w:rPr>
-          <w:rFonts w:ascii="Times New Roman" w:eastAsia="宋体" w:hAnsi="Times New Roman" w:cs="Times New Roman"/>
-          <w:kern w:val="0"/>
-          <w:sz w:val="24"/>
-          <w14:ligatures w14:val="none"/>
-        </w:rPr>
-        <w:t>Certain studies support a broader conceptualization of cognitive processing as dynamically state-dependent, meaning that the expected processing outcome may be modulated by the current state even when the immediate processing input remains unchanged, thereby potentially altering an individual’s response (Flavell et al., 2022; Gilbert &amp; Sigman, 2007). For the present framework and data analyses, conditions contributing to variation in cognitive processing can be broadly distinguished into two types. One can be conceptualized as a behavioral condition, referring to a condition generated by prior behavior or activity that subsequently alters the context under which information is processed, although the condition itself is not necessarily related to the properties of the immediate processing input. Examples include insufficient sleep and body posture (</w:t>
-      </w:r>
-      <w:proofErr w:type="spellStart"/>
-      <w:r>
-        <w:rPr>
-          <w:rFonts w:ascii="Times New Roman" w:eastAsia="宋体" w:hAnsi="Times New Roman" w:cs="Times New Roman"/>
-          <w:kern w:val="0"/>
-          <w:sz w:val="24"/>
-          <w14:ligatures w14:val="none"/>
-        </w:rPr>
-        <w:t>Alhola</w:t>
-      </w:r>
-      <w:proofErr w:type="spellEnd"/>
-      <w:r>
-        <w:rPr>
-          <w:rFonts w:ascii="Times New Roman" w:eastAsia="宋体" w:hAnsi="Times New Roman" w:cs="Times New Roman"/>
-          <w:kern w:val="0"/>
-          <w:sz w:val="24"/>
-          <w14:ligatures w14:val="none"/>
-        </w:rPr>
-        <w:t xml:space="preserve"> &amp; Polo-</w:t>
-      </w:r>
-      <w:proofErr w:type="spellStart"/>
-      <w:r>
-        <w:rPr>
-          <w:rFonts w:ascii="Times New Roman" w:eastAsia="宋体" w:hAnsi="Times New Roman" w:cs="Times New Roman"/>
-          <w:kern w:val="0"/>
-          <w:sz w:val="24"/>
-          <w14:ligatures w14:val="none"/>
-        </w:rPr>
-        <w:t>Kantola</w:t>
-      </w:r>
-      <w:proofErr w:type="spellEnd"/>
-      <w:r>
-        <w:rPr>
-          <w:rFonts w:ascii="Times New Roman" w:eastAsia="宋体" w:hAnsi="Times New Roman" w:cs="Times New Roman"/>
-          <w:kern w:val="0"/>
-          <w:sz w:val="24"/>
-          <w14:ligatures w14:val="none"/>
-        </w:rPr>
-        <w:t>, 2007; Khan &amp; Al-</w:t>
-      </w:r>
-      <w:proofErr w:type="spellStart"/>
-      <w:r>
-        <w:rPr>
-          <w:rFonts w:ascii="Times New Roman" w:eastAsia="宋体" w:hAnsi="Times New Roman" w:cs="Times New Roman"/>
-          <w:kern w:val="0"/>
-          <w:sz w:val="24"/>
-          <w14:ligatures w14:val="none"/>
-        </w:rPr>
-        <w:t>Jahdali</w:t>
-      </w:r>
-      <w:proofErr w:type="spellEnd"/>
-      <w:r>
-        <w:rPr>
-          <w:rFonts w:ascii="Times New Roman" w:eastAsia="宋体" w:hAnsi="Times New Roman" w:cs="Times New Roman"/>
-          <w:kern w:val="0"/>
-          <w:sz w:val="24"/>
-          <w14:ligatures w14:val="none"/>
-        </w:rPr>
-        <w:t xml:space="preserve">, 2023; </w:t>
-      </w:r>
-      <w:proofErr w:type="spellStart"/>
-      <w:r>
-        <w:rPr>
-          <w:rFonts w:ascii="Times New Roman" w:eastAsia="宋体" w:hAnsi="Times New Roman" w:cs="Times New Roman"/>
-          <w:kern w:val="0"/>
-          <w:sz w:val="24"/>
-          <w14:ligatures w14:val="none"/>
-        </w:rPr>
-        <w:t>Wainio</w:t>
-      </w:r>
-      <w:proofErr w:type="spellEnd"/>
-      <w:r>
-        <w:rPr>
-          <w:rFonts w:ascii="Times New Roman" w:eastAsia="宋体" w:hAnsi="Times New Roman" w:cs="Times New Roman"/>
-          <w:kern w:val="0"/>
-          <w:sz w:val="24"/>
-          <w14:ligatures w14:val="none"/>
-        </w:rPr>
-        <w:t xml:space="preserve">-Theberge &amp; </w:t>
-      </w:r>
-      <w:proofErr w:type="spellStart"/>
-      <w:r>
-        <w:rPr>
-          <w:rFonts w:ascii="Times New Roman" w:eastAsia="宋体" w:hAnsi="Times New Roman" w:cs="Times New Roman"/>
-          <w:kern w:val="0"/>
-          <w:sz w:val="24"/>
-          <w14:ligatures w14:val="none"/>
-        </w:rPr>
-        <w:t>Armony</w:t>
-      </w:r>
-      <w:proofErr w:type="spellEnd"/>
-      <w:r>
-        <w:rPr>
-          <w:rFonts w:ascii="Times New Roman" w:eastAsia="宋体" w:hAnsi="Times New Roman" w:cs="Times New Roman"/>
-          <w:kern w:val="0"/>
-          <w:sz w:val="24"/>
-          <w14:ligatures w14:val="none"/>
-        </w:rPr>
-        <w:t xml:space="preserve">, 2025). In contrast, an internal psychological condition refers to a state manifested within the individual at a psychological or physiological level, such as emotional state, fatigue, or motivation (Flavell et al., 2022). For instance, the same </w:t>
-      </w:r>
-      <w:r>
-        <w:rPr>
-          <w:rFonts w:ascii="Times New Roman" w:eastAsia="宋体" w:hAnsi="Times New Roman" w:cs="Times New Roman"/>
-          <w:kern w:val="0"/>
-          <w:sz w:val="24"/>
-          <w14:ligatures w14:val="none"/>
-        </w:rPr>
-        <w:lastRenderedPageBreak/>
-        <w:t>stimulus may bias emotion perception depending on the perceiver’s current emotional state (</w:t>
-      </w:r>
-      <w:proofErr w:type="spellStart"/>
-      <w:r>
-        <w:rPr>
-          <w:rFonts w:ascii="Times New Roman" w:eastAsia="宋体" w:hAnsi="Times New Roman" w:cs="Times New Roman"/>
-          <w:kern w:val="0"/>
-          <w:sz w:val="24"/>
-          <w14:ligatures w14:val="none"/>
-        </w:rPr>
-        <w:t>Trilla</w:t>
-      </w:r>
-      <w:proofErr w:type="spellEnd"/>
-      <w:r>
-        <w:rPr>
-          <w:rFonts w:ascii="Times New Roman" w:eastAsia="宋体" w:hAnsi="Times New Roman" w:cs="Times New Roman"/>
-          <w:kern w:val="0"/>
-          <w:sz w:val="24"/>
-          <w14:ligatures w14:val="none"/>
-        </w:rPr>
-        <w:t xml:space="preserve"> et al., 2021; Harris et al., 2016). Although there is now substantial evidence suggesting that the effects are potentially through modulation of the neural and physiological mechanisms implementing cognitive processing, investigations into their effects on cognitive performance are ongoing since these behavioral conditions and internal psychological states may influence cognitive and behavioral outcomes either independently or interactively. Specifically, the effects of the two types of conditions on cognitive performance are not necessarily independent, and internal states may be induced by prior behavior or environmental conditions, while some states, such as trait anxiety and depression, suggested to impair attention, may persist and affect cognitive performance even in the absence of an immediate external trigger (Pacheco-</w:t>
-      </w:r>
-      <w:proofErr w:type="spellStart"/>
-      <w:r>
-        <w:rPr>
-          <w:rFonts w:ascii="Times New Roman" w:eastAsia="宋体" w:hAnsi="Times New Roman" w:cs="Times New Roman"/>
-          <w:kern w:val="0"/>
-          <w:sz w:val="24"/>
-          <w14:ligatures w14:val="none"/>
-        </w:rPr>
-        <w:t>Unguetti</w:t>
-      </w:r>
-      <w:proofErr w:type="spellEnd"/>
-      <w:r>
-        <w:rPr>
-          <w:rFonts w:ascii="Times New Roman" w:eastAsia="宋体" w:hAnsi="Times New Roman" w:cs="Times New Roman"/>
-          <w:kern w:val="0"/>
-          <w:sz w:val="24"/>
-          <w14:ligatures w14:val="none"/>
-        </w:rPr>
-        <w:t xml:space="preserve"> et al., 2010; Roca et al., 2015), or vice versa.</w:t>
-      </w:r>
-    </w:p>
-    <w:p>
-      <w:pPr>
-        <w:widowControl/>
-        <w:spacing w:after="0" w:line="240" w:lineRule="auto"/>
-        <w:ind w:firstLineChars="100" w:firstLine="240"/>
-        <w:jc w:val="both"/>
-        <w:rPr>
-          <w:rFonts w:ascii="Times New Roman" w:eastAsia="宋体" w:hAnsi="Times New Roman" w:cs="Times New Roman"/>
-          <w:kern w:val="0"/>
-          <w:sz w:val="24"/>
-          <w14:ligatures w14:val="none"/>
-        </w:rPr>
-      </w:pPr>
-      <w:r>
-        <w:rPr>
-          <w:rFonts w:ascii="Times New Roman" w:eastAsia="宋体" w:hAnsi="Times New Roman" w:cs="Times New Roman"/>
-          <w:kern w:val="0"/>
-          <w:sz w:val="24"/>
-          <w14:ligatures w14:val="none"/>
-        </w:rPr>
-        <w:t>The publicly available Kaggle dataset used in the data analyses project provides a broad range of behavioral, psychological, and cognitive performance measures (Sacramento Technology, 2024). It provides an opportunity for the project to achieve two broad purposes: (1) the examination of the broader correlational structure among these variables to understand their standardized associations with cognitive performance differently, while also (2) selecting theoretically relevant conditions for more focused model-driven analyses. Accordingly, for the first purpose, an exploratory correlation matrix heatmap was first established, providing an overall presentation of all zero-order associations among variables.</w:t>
-      </w:r>
-    </w:p>
-    <w:p>
-      <w:pPr>
-        <w:widowControl/>
-        <w:spacing w:after="0" w:line="240" w:lineRule="auto"/>
-        <w:ind w:firstLineChars="100" w:firstLine="240"/>
-        <w:jc w:val="both"/>
-        <w:rPr>
-          <w:rFonts w:ascii="Times New Roman" w:eastAsia="宋体" w:hAnsi="Times New Roman" w:cs="Times New Roman"/>
-          <w:kern w:val="0"/>
-          <w:sz w:val="24"/>
-          <w14:ligatures w14:val="none"/>
-        </w:rPr>
-      </w:pPr>
-      <w:r>
-        <w:rPr>
-          <w:rFonts w:ascii="Times New Roman" w:eastAsia="宋体" w:hAnsi="Times New Roman" w:cs="Times New Roman"/>
-          <w:kern w:val="0"/>
-          <w:sz w:val="24"/>
-          <w14:ligatures w14:val="none"/>
-        </w:rPr>
-        <w:t>For the second broad purpose, the present project focused on two representative conditions derived from the conceptual framework introduced above. Sleep hours and stress level were treated as conditions primarily originating from behavioral and psychological domains, respectively. A large body of studies has suggested that both factors are associated with performance across different cognitive tasks (</w:t>
-      </w:r>
-      <w:proofErr w:type="spellStart"/>
-      <w:r>
-        <w:rPr>
-          <w:rFonts w:ascii="Times New Roman" w:eastAsia="宋体" w:hAnsi="Times New Roman" w:cs="Times New Roman"/>
-          <w:kern w:val="0"/>
-          <w:sz w:val="24"/>
-          <w14:ligatures w14:val="none"/>
-        </w:rPr>
-        <w:t>Alhola</w:t>
-      </w:r>
-      <w:proofErr w:type="spellEnd"/>
-      <w:r>
-        <w:rPr>
-          <w:rFonts w:ascii="Times New Roman" w:eastAsia="宋体" w:hAnsi="Times New Roman" w:cs="Times New Roman"/>
-          <w:kern w:val="0"/>
-          <w:sz w:val="24"/>
-          <w14:ligatures w14:val="none"/>
-        </w:rPr>
-        <w:t xml:space="preserve"> &amp; Polo-</w:t>
-      </w:r>
-      <w:proofErr w:type="spellStart"/>
-      <w:r>
-        <w:rPr>
-          <w:rFonts w:ascii="Times New Roman" w:eastAsia="宋体" w:hAnsi="Times New Roman" w:cs="Times New Roman"/>
-          <w:kern w:val="0"/>
-          <w:sz w:val="24"/>
-          <w14:ligatures w14:val="none"/>
-        </w:rPr>
-        <w:t>Kantola</w:t>
-      </w:r>
-      <w:proofErr w:type="spellEnd"/>
-      <w:r>
-        <w:rPr>
-          <w:rFonts w:ascii="Times New Roman" w:eastAsia="宋体" w:hAnsi="Times New Roman" w:cs="Times New Roman"/>
-          <w:kern w:val="0"/>
-          <w:sz w:val="24"/>
-          <w14:ligatures w14:val="none"/>
-        </w:rPr>
-        <w:t>, 2007; Khan &amp; Al-</w:t>
-      </w:r>
-      <w:proofErr w:type="spellStart"/>
-      <w:r>
-        <w:rPr>
-          <w:rFonts w:ascii="Times New Roman" w:eastAsia="宋体" w:hAnsi="Times New Roman" w:cs="Times New Roman"/>
-          <w:kern w:val="0"/>
-          <w:sz w:val="24"/>
-          <w14:ligatures w14:val="none"/>
-        </w:rPr>
-        <w:t>Jahdali</w:t>
-      </w:r>
-      <w:proofErr w:type="spellEnd"/>
-      <w:r>
-        <w:rPr>
-          <w:rFonts w:ascii="Times New Roman" w:eastAsia="宋体" w:hAnsi="Times New Roman" w:cs="Times New Roman"/>
-          <w:kern w:val="0"/>
-          <w:sz w:val="24"/>
-          <w14:ligatures w14:val="none"/>
-        </w:rPr>
-        <w:t xml:space="preserve">, 2023; </w:t>
-      </w:r>
-      <w:proofErr w:type="spellStart"/>
-      <w:r>
-        <w:rPr>
-          <w:rFonts w:ascii="Times New Roman" w:eastAsia="宋体" w:hAnsi="Times New Roman" w:cs="Times New Roman"/>
-          <w:kern w:val="0"/>
-          <w:sz w:val="24"/>
-          <w14:ligatures w14:val="none"/>
-        </w:rPr>
-        <w:t>Nwikwe</w:t>
-      </w:r>
-      <w:proofErr w:type="spellEnd"/>
-      <w:r>
-        <w:rPr>
-          <w:rFonts w:ascii="Times New Roman" w:eastAsia="宋体" w:hAnsi="Times New Roman" w:cs="Times New Roman"/>
-          <w:kern w:val="0"/>
-          <w:sz w:val="24"/>
-          <w14:ligatures w14:val="none"/>
-        </w:rPr>
-        <w:t>, 2025). Accordingly, the theory-driven analysis incorporated two specific aims. The first aim was to estimate the effects of these conditions on higher-order cognitive functioning. Specifically, the project examined the independent contributions and combined explanatory power of sleep hours and stress level in relation to a higher-order regulatory function. Emotion regulation was selected as the representative higher-order regulatory outcome since its success largely relies on the coordination of several basic cognitive processes such as selective attention, working memory, and inhibitory control (Koay &amp; Meter, 2023). In addition, considering that the dataset contains measurements of basic cognitive skills through cognitive performance tasks, specifically, Stroop task reaction time (RT), N-back accuracy, and psychomotor vigilance test (PVT) RT are expected to primarily measure selective attention and inhibition, working memory, and sustained attention and behavioral alertness (</w:t>
-      </w:r>
-      <w:proofErr w:type="spellStart"/>
-      <w:r>
-        <w:rPr>
-          <w:rFonts w:ascii="Times New Roman" w:eastAsia="宋体" w:hAnsi="Times New Roman" w:cs="Times New Roman"/>
-          <w:kern w:val="0"/>
-          <w:sz w:val="24"/>
-          <w14:ligatures w14:val="none"/>
-        </w:rPr>
-        <w:t>Basner</w:t>
-      </w:r>
-      <w:proofErr w:type="spellEnd"/>
-      <w:r>
-        <w:rPr>
-          <w:rFonts w:ascii="Times New Roman" w:eastAsia="宋体" w:hAnsi="Times New Roman" w:cs="Times New Roman"/>
-          <w:kern w:val="0"/>
-          <w:sz w:val="24"/>
-          <w14:ligatures w14:val="none"/>
-        </w:rPr>
-        <w:t xml:space="preserve"> et al., 2021; Owen et al., 2005; </w:t>
-      </w:r>
-      <w:proofErr w:type="spellStart"/>
-      <w:r>
-        <w:rPr>
-          <w:rFonts w:ascii="Times New Roman" w:eastAsia="宋体" w:hAnsi="Times New Roman" w:cs="Times New Roman"/>
-          <w:kern w:val="0"/>
-          <w:sz w:val="24"/>
-          <w14:ligatures w14:val="none"/>
-        </w:rPr>
-        <w:t>Scarpina</w:t>
-      </w:r>
-      <w:proofErr w:type="spellEnd"/>
-      <w:r>
-        <w:rPr>
-          <w:rFonts w:ascii="Times New Roman" w:eastAsia="宋体" w:hAnsi="Times New Roman" w:cs="Times New Roman"/>
-          <w:kern w:val="0"/>
-          <w:sz w:val="24"/>
-          <w14:ligatures w14:val="none"/>
-        </w:rPr>
-        <w:t xml:space="preserve"> &amp; </w:t>
-      </w:r>
-      <w:proofErr w:type="spellStart"/>
-      <w:r>
-        <w:rPr>
-          <w:rFonts w:ascii="Times New Roman" w:eastAsia="宋体" w:hAnsi="Times New Roman" w:cs="Times New Roman"/>
-          <w:kern w:val="0"/>
-          <w:sz w:val="24"/>
-          <w14:ligatures w14:val="none"/>
-        </w:rPr>
-        <w:t>Tagini</w:t>
-      </w:r>
-      <w:proofErr w:type="spellEnd"/>
-      <w:r>
-        <w:rPr>
-          <w:rFonts w:ascii="Times New Roman" w:eastAsia="宋体" w:hAnsi="Times New Roman" w:cs="Times New Roman"/>
-          <w:kern w:val="0"/>
-          <w:sz w:val="24"/>
-          <w14:ligatures w14:val="none"/>
-        </w:rPr>
-        <w:t xml:space="preserve">, 2017), respectively. This raises the second aim of the project: to examine whether these reflected basic cognitive functions can be reasonably compressed and summarized to be one indication of a general cognitive ability, if any. The second aim was to estimate the effects of the conditions on basic cognitive functioning constructs, and an exploratory principal component analysis (PCA), attempting to compress the variables </w:t>
-      </w:r>
-      <w:r>
-        <w:rPr>
-          <w:rFonts w:ascii="Times New Roman" w:eastAsia="宋体" w:hAnsi="Times New Roman" w:cs="Times New Roman"/>
-          <w:kern w:val="0"/>
-          <w:sz w:val="24"/>
-          <w14:ligatures w14:val="none"/>
-        </w:rPr>
-        <w:lastRenderedPageBreak/>
-        <w:t>into any potential broad cognitive performance dimension, was conducted. Nevertheless, if a practically meaningful common component with sufficient information preservation could not be supported, the individual cognitive outcomes would instead be retained and examined separately. Subsequent model-based analyses were therefore conducted to estimate the associations of theoretically relevant behavioral and psychological conditions with their corresponding cognitive outcomes.</w:t>
-      </w:r>
-    </w:p>
-    <w:p>
-      <w:pPr>
-        <w:widowControl/>
+      </w:pPr>
+    </w:p>
+    <w:p>
+      <w:pPr>
         <w:spacing w:after="0" w:line="240" w:lineRule="auto"/>
         <w:jc w:val="both"/>
         <w:rPr>
-          <w:rFonts w:ascii="Times New Roman" w:eastAsia="宋体" w:hAnsi="Times New Roman" w:cs="Times New Roman"/>
+          <w:rFonts w:ascii="Times New Roman" w:eastAsia="宋体" w:hAnsi="Times New Roman" w:cs="Times New Roman" w:hint="eastAsia"/>
+          <w:b/>
+          <w:bCs/>
           <w:kern w:val="0"/>
           <w:sz w:val="24"/>
           <w14:ligatures w14:val="none"/>
         </w:rPr>
       </w:pPr>
       <w:r>
-        <w:rPr>
-          <w:rFonts w:ascii="Times New Roman" w:eastAsia="宋体" w:hAnsi="Times New Roman" w:cs="Times New Roman"/>
-          <w:kern w:val="0"/>
-          <w:sz w:val="24"/>
-          <w14:ligatures w14:val="none"/>
-        </w:rPr>
-        <w:t>Overall, the exploratory secondary data analyses project subsequently combined exploratory correlational mapping with theory-driven analyses to examine how behavioral and psychological conditions are associated with emotional regulation and cognitive performance. Generally, for the first broad purpose, it is expected that certain statistically significant correlations will be found between behavioral or psychological states and the cognitive performance measures in the dataset. And for the second aim, it is expected that the theoretically selected behavioral and psychological conditions will show meaningful associations with their corresponding emotional and cognitive outcomes, while the exploratory PCA may identify whether the available cognitive measures can be reasonably summarized into a broader common cognitive performance dimension, thereby indirectly supporting existing theoretical and empirical evidence.</w:t>
-      </w:r>
-    </w:p>
-    <w:p>
-      <w:pPr>
-        <w:widowControl/>
-        <w:spacing w:after="0" w:line="240" w:lineRule="auto"/>
-        <w:outlineLvl w:val="2"/>
         <w:rPr>
           <w:rFonts w:ascii="Times New Roman" w:eastAsia="宋体" w:hAnsi="Times New Roman" w:cs="Times New Roman"/>
           <w:b/>
@@ -1234,95 +1718,74 @@
           <w:sz w:val="24"/>
           <w14:ligatures w14:val="none"/>
         </w:rPr>
-      </w:pPr>
-    </w:p>
-    <w:p>
-      <w:pPr>
-        <w:widowControl/>
-        <w:spacing w:after="0" w:line="240" w:lineRule="auto"/>
-        <w:outlineLvl w:val="2"/>
+        <w:t>Theoretical</w:t>
+      </w:r>
+      <w:r>
+        <w:rPr>
+          <w:rFonts w:ascii="Times New Roman" w:eastAsia="宋体" w:hAnsi="Times New Roman" w:cs="Times New Roman" w:hint="eastAsia"/>
+          <w:b/>
+          <w:bCs/>
+          <w:kern w:val="0"/>
+          <w:sz w:val="24"/>
+          <w14:ligatures w14:val="none"/>
+        </w:rPr>
+        <w:t xml:space="preserve"> </w:t>
+      </w:r>
+      <w:r>
         <w:rPr>
           <w:rFonts w:ascii="Times New Roman" w:eastAsia="宋体" w:hAnsi="Times New Roman" w:cs="Times New Roman"/>
           <w:b/>
           <w:bCs/>
           <w:kern w:val="0"/>
-          <w:sz w:val="26"/>
-          <w:szCs w:val="26"/>
+          <w:sz w:val="24"/>
           <w14:ligatures w14:val="none"/>
         </w:rPr>
-      </w:pPr>
+        <w:t>Basis</w:t>
+      </w:r>
+      <w:r>
+        <w:rPr>
+          <w:rFonts w:ascii="Times New Roman" w:eastAsia="宋体" w:hAnsi="Times New Roman" w:cs="Times New Roman" w:hint="eastAsia"/>
+          <w:b/>
+          <w:bCs/>
+          <w:kern w:val="0"/>
+          <w:sz w:val="24"/>
+          <w14:ligatures w14:val="none"/>
+        </w:rPr>
+        <w:t xml:space="preserve"> and Applied Analysis Methods</w:t>
+      </w:r>
+    </w:p>
+    <w:p>
+      <w:pPr>
+        <w:spacing w:after="0" w:line="240" w:lineRule="auto"/>
+        <w:jc w:val="both"/>
+        <w:rPr>
+          <w:rFonts w:ascii="Times New Roman" w:eastAsia="宋体" w:hAnsi="Times New Roman" w:cs="Times New Roman" w:hint="eastAsia"/>
+          <w:kern w:val="0"/>
+          <w:sz w:val="24"/>
+          <w14:ligatures w14:val="none"/>
+        </w:rPr>
+      </w:pPr>
+      <w:r>
+        <w:rPr>
+          <w:rFonts w:ascii="Times New Roman" w:eastAsia="宋体" w:hAnsi="Times New Roman" w:cs="Times New Roman" w:hint="eastAsia"/>
+          <w:b/>
+          <w:bCs/>
+          <w:kern w:val="0"/>
+          <w:sz w:val="24"/>
+          <w14:ligatures w14:val="none"/>
+        </w:rPr>
+        <w:t>-Aim1:</w:t>
+      </w:r>
       <w:r>
         <w:rPr>
           <w:rFonts w:ascii="Times New Roman" w:eastAsia="宋体" w:hAnsi="Times New Roman" w:cs="Times New Roman"/>
           <w:b/>
           <w:bCs/>
           <w:kern w:val="0"/>
-          <w:sz w:val="26"/>
-          <w:szCs w:val="26"/>
+          <w:sz w:val="24"/>
           <w14:ligatures w14:val="none"/>
         </w:rPr>
-        <w:t>Data and Methods</w:t>
-      </w:r>
-    </w:p>
-    <w:p>
-      <w:pPr>
-        <w:widowControl/>
-        <w:spacing w:after="0" w:line="240" w:lineRule="auto"/>
-        <w:ind w:firstLineChars="100" w:firstLine="240"/>
-        <w:jc w:val="both"/>
-        <w:rPr>
-          <w:rFonts w:ascii="Times New Roman" w:eastAsia="宋体" w:hAnsi="Times New Roman" w:cs="Times New Roman"/>
-          <w:kern w:val="0"/>
-          <w:sz w:val="24"/>
-          <w14:ligatures w14:val="none"/>
-        </w:rPr>
-      </w:pPr>
-      <w:r>
-        <w:rPr>
-          <w:rFonts w:ascii="Times New Roman" w:eastAsia="宋体" w:hAnsi="Times New Roman" w:cs="Times New Roman"/>
-          <w:kern w:val="0"/>
-          <w:sz w:val="24"/>
-          <w14:ligatures w14:val="none"/>
-        </w:rPr>
-        <w:t xml:space="preserve">The dataset titled </w:t>
-      </w:r>
-      <w:r>
-        <w:rPr>
-          <w:rFonts w:ascii="Times New Roman" w:eastAsia="宋体" w:hAnsi="Times New Roman" w:cs="Times New Roman"/>
-          <w:i/>
-          <w:iCs/>
-          <w:kern w:val="0"/>
-          <w:sz w:val="24"/>
-          <w14:ligatures w14:val="none"/>
-        </w:rPr>
-        <w:t>Sleep Deprivation &amp; Cognitive Performance</w:t>
-      </w:r>
-      <w:r>
-        <w:rPr>
-          <w:rFonts w:ascii="Times New Roman" w:eastAsia="宋体" w:hAnsi="Times New Roman" w:cs="Times New Roman"/>
-          <w:kern w:val="0"/>
-          <w:sz w:val="24"/>
-          <w14:ligatures w14:val="none"/>
-        </w:rPr>
-        <w:t xml:space="preserve"> is publicly available on Kaggle and was used for the present secondary data analyses (Sacramento Technology, 2024). The dataset contained 60 observations and 14 original variables. Descriptive statistics and an exploratory Pearson correlation heatmap were first used to summarize the overall data structure in terms of correlations among all continuous variables. Data preparation targeting predictor variables of interest was conducted before formal analyses, including mean-centering where appropriate. Continuous stress scores were operationally categorized into low-, moderate-, and high-stress groups for group-based analyses based on criteria derived from the Perceived Stress Scale (PSS-10) (Adamson et al., 2020; Cohen et al., 1983). </w:t>
-      </w:r>
-      <w:r>
-        <w:rPr>
-          <w:rFonts w:ascii="Times New Roman" w:eastAsia="宋体" w:hAnsi="Times New Roman" w:cs="Times New Roman" w:hint="eastAsia"/>
-          <w:kern w:val="0"/>
-          <w:sz w:val="24"/>
-          <w14:ligatures w14:val="none"/>
-        </w:rPr>
-        <w:t>Overall</w:t>
-      </w:r>
-      <w:r>
-        <w:rPr>
-          <w:rFonts w:ascii="Times New Roman" w:eastAsia="宋体" w:hAnsi="Times New Roman" w:cs="Times New Roman"/>
-          <w:kern w:val="0"/>
-          <w:sz w:val="24"/>
-          <w14:ligatures w14:val="none"/>
-        </w:rPr>
-        <w:t>, the project operationalized emotion regulation (the higher-order outcome) using the emotion regulation score, and the two representative types of conditions using sleep hours and stress levels and its PSS-10 categorization version. Basic cognitive performance was assessed using the Stroop RT, N-back accuracy, and PVT RT variables. In the subsequent formal analyses for the first aim, examining associations between the conditions of interest as predictors and emotion regulation as the outcome, statistical analyses included simple and multiple linear regression, nested model comparison, and interaction analysis. For the second aim, examining associations between the theoretically selected predictive states and potential broader or individual task-specific cognitive performance, exploratory PCA, regression models, and ANCOVA were conducted. To support the validity and accuracy of statistical inference and estimation, model assumptions were evaluated for each fitted model using diagnostic procedures implemented as reusable functions in a separate module for consistent and convenient application. All analyses were conducted in R using RStudio.</w:t>
+        <w:t xml:space="preserve"> Behavioral and Psychological Conditions </w:t>
       </w:r>
     </w:p>
     <w:p>
@@ -1330,7 +1793,329 @@
         <w:spacing w:after="0" w:line="240" w:lineRule="auto"/>
         <w:jc w:val="both"/>
         <w:rPr>
-          <w:rFonts w:ascii="Times New Roman" w:hAnsi="Times New Roman" w:cs="Times New Roman"/>
+          <w:rFonts w:ascii="Times New Roman" w:eastAsia="宋体" w:hAnsi="Times New Roman" w:cs="Times New Roman"/>
+          <w:b/>
+          <w:bCs/>
+          <w:kern w:val="0"/>
+          <w:sz w:val="24"/>
+          <w14:ligatures w14:val="none"/>
+        </w:rPr>
+      </w:pPr>
+    </w:p>
+    <w:p>
+      <w:pPr>
+        <w:spacing w:after="0" w:line="240" w:lineRule="auto"/>
+        <w:jc w:val="both"/>
+        <w:rPr>
+          <w:rFonts w:ascii="Times New Roman" w:eastAsia="宋体" w:hAnsi="Times New Roman" w:cs="Times New Roman"/>
+          <w:b/>
+          <w:bCs/>
+          <w:kern w:val="0"/>
+          <w:sz w:val="24"/>
+          <w14:ligatures w14:val="none"/>
+        </w:rPr>
+      </w:pPr>
+    </w:p>
+    <w:p>
+      <w:pPr>
+        <w:spacing w:after="0" w:line="240" w:lineRule="auto"/>
+        <w:jc w:val="both"/>
+        <w:rPr>
+          <w:rFonts w:ascii="Times New Roman" w:eastAsia="宋体" w:hAnsi="Times New Roman" w:cs="Times New Roman"/>
+          <w:b/>
+          <w:bCs/>
+          <w:kern w:val="0"/>
+          <w:sz w:val="24"/>
+          <w14:ligatures w14:val="none"/>
+        </w:rPr>
+      </w:pPr>
+    </w:p>
+    <w:p>
+      <w:pPr>
+        <w:spacing w:after="0" w:line="240" w:lineRule="auto"/>
+        <w:jc w:val="both"/>
+        <w:rPr>
+          <w:rFonts w:ascii="Times New Roman" w:eastAsia="宋体" w:hAnsi="Times New Roman" w:cs="Times New Roman"/>
+          <w:b/>
+          <w:bCs/>
+          <w:kern w:val="0"/>
+          <w:sz w:val="24"/>
+          <w14:ligatures w14:val="none"/>
+        </w:rPr>
+      </w:pPr>
+    </w:p>
+    <w:p>
+      <w:pPr>
+        <w:spacing w:after="0" w:line="240" w:lineRule="auto"/>
+        <w:jc w:val="both"/>
+        <w:rPr>
+          <w:rFonts w:ascii="Times New Roman" w:eastAsia="宋体" w:hAnsi="Times New Roman" w:cs="Times New Roman"/>
+          <w:b/>
+          <w:bCs/>
+          <w:kern w:val="0"/>
+          <w:sz w:val="24"/>
+          <w14:ligatures w14:val="none"/>
+        </w:rPr>
+      </w:pPr>
+    </w:p>
+    <w:p>
+      <w:pPr>
+        <w:spacing w:after="0" w:line="240" w:lineRule="auto"/>
+        <w:jc w:val="both"/>
+        <w:rPr>
+          <w:rFonts w:ascii="Times New Roman" w:eastAsia="宋体" w:hAnsi="Times New Roman" w:cs="Times New Roman"/>
+          <w:b/>
+          <w:bCs/>
+          <w:kern w:val="0"/>
+          <w:sz w:val="24"/>
+          <w14:ligatures w14:val="none"/>
+        </w:rPr>
+      </w:pPr>
+    </w:p>
+    <w:p>
+      <w:pPr>
+        <w:spacing w:after="0" w:line="240" w:lineRule="auto"/>
+        <w:jc w:val="both"/>
+        <w:rPr>
+          <w:rFonts w:ascii="Times New Roman" w:eastAsia="宋体" w:hAnsi="Times New Roman" w:cs="Times New Roman"/>
+          <w:b/>
+          <w:bCs/>
+          <w:kern w:val="0"/>
+          <w:sz w:val="24"/>
+          <w14:ligatures w14:val="none"/>
+        </w:rPr>
+      </w:pPr>
+    </w:p>
+    <w:p>
+      <w:pPr>
+        <w:spacing w:after="0" w:line="240" w:lineRule="auto"/>
+        <w:jc w:val="both"/>
+        <w:rPr>
+          <w:rFonts w:ascii="Times New Roman" w:eastAsia="宋体" w:hAnsi="Times New Roman" w:cs="Times New Roman"/>
+          <w:b/>
+          <w:bCs/>
+          <w:kern w:val="0"/>
+          <w:sz w:val="24"/>
+          <w14:ligatures w14:val="none"/>
+        </w:rPr>
+      </w:pPr>
+    </w:p>
+    <w:p>
+      <w:pPr>
+        <w:spacing w:after="0" w:line="240" w:lineRule="auto"/>
+        <w:jc w:val="both"/>
+        <w:rPr>
+          <w:rFonts w:ascii="Times New Roman" w:eastAsia="宋体" w:hAnsi="Times New Roman" w:cs="Times New Roman"/>
+          <w:b/>
+          <w:bCs/>
+          <w:kern w:val="0"/>
+          <w:sz w:val="24"/>
+          <w14:ligatures w14:val="none"/>
+        </w:rPr>
+      </w:pPr>
+    </w:p>
+    <w:p>
+      <w:pPr>
+        <w:spacing w:after="0" w:line="240" w:lineRule="auto"/>
+        <w:jc w:val="both"/>
+        <w:rPr>
+          <w:rFonts w:ascii="Times New Roman" w:eastAsia="宋体" w:hAnsi="Times New Roman" w:cs="Times New Roman"/>
+          <w:b/>
+          <w:bCs/>
+          <w:kern w:val="0"/>
+          <w:sz w:val="24"/>
+          <w14:ligatures w14:val="none"/>
+        </w:rPr>
+      </w:pPr>
+    </w:p>
+    <w:p>
+      <w:pPr>
+        <w:spacing w:after="0" w:line="240" w:lineRule="auto"/>
+        <w:jc w:val="both"/>
+        <w:rPr>
+          <w:rFonts w:ascii="Times New Roman" w:eastAsia="宋体" w:hAnsi="Times New Roman" w:cs="Times New Roman"/>
+          <w:b/>
+          <w:bCs/>
+          <w:kern w:val="0"/>
+          <w:sz w:val="24"/>
+          <w14:ligatures w14:val="none"/>
+        </w:rPr>
+      </w:pPr>
+    </w:p>
+    <w:p>
+      <w:pPr>
+        <w:spacing w:after="0" w:line="240" w:lineRule="auto"/>
+        <w:jc w:val="both"/>
+        <w:rPr>
+          <w:rFonts w:ascii="Times New Roman" w:eastAsia="宋体" w:hAnsi="Times New Roman" w:cs="Times New Roman"/>
+          <w:b/>
+          <w:bCs/>
+          <w:kern w:val="0"/>
+          <w:sz w:val="24"/>
+          <w14:ligatures w14:val="none"/>
+        </w:rPr>
+      </w:pPr>
+    </w:p>
+    <w:p>
+      <w:pPr>
+        <w:spacing w:after="0" w:line="240" w:lineRule="auto"/>
+        <w:jc w:val="both"/>
+        <w:rPr>
+          <w:rFonts w:ascii="Times New Roman" w:eastAsia="宋体" w:hAnsi="Times New Roman" w:cs="Times New Roman"/>
+          <w:b/>
+          <w:bCs/>
+          <w:kern w:val="0"/>
+          <w:sz w:val="24"/>
+          <w14:ligatures w14:val="none"/>
+        </w:rPr>
+      </w:pPr>
+    </w:p>
+    <w:p>
+      <w:pPr>
+        <w:spacing w:after="0" w:line="240" w:lineRule="auto"/>
+        <w:jc w:val="both"/>
+        <w:rPr>
+          <w:rFonts w:ascii="Times New Roman" w:eastAsia="宋体" w:hAnsi="Times New Roman" w:cs="Times New Roman"/>
+          <w:b/>
+          <w:bCs/>
+          <w:kern w:val="0"/>
+          <w:sz w:val="24"/>
+          <w14:ligatures w14:val="none"/>
+        </w:rPr>
+      </w:pPr>
+    </w:p>
+    <w:p>
+      <w:pPr>
+        <w:spacing w:after="0" w:line="240" w:lineRule="auto"/>
+        <w:jc w:val="both"/>
+        <w:rPr>
+          <w:rFonts w:ascii="Times New Roman" w:eastAsia="宋体" w:hAnsi="Times New Roman" w:cs="Times New Roman"/>
+          <w:b/>
+          <w:bCs/>
+          <w:kern w:val="0"/>
+          <w:sz w:val="24"/>
+          <w14:ligatures w14:val="none"/>
+        </w:rPr>
+      </w:pPr>
+    </w:p>
+    <w:p>
+      <w:pPr>
+        <w:spacing w:after="0" w:line="240" w:lineRule="auto"/>
+        <w:jc w:val="both"/>
+        <w:rPr>
+          <w:rFonts w:ascii="Times New Roman" w:eastAsia="宋体" w:hAnsi="Times New Roman" w:cs="Times New Roman"/>
+          <w:b/>
+          <w:bCs/>
+          <w:kern w:val="0"/>
+          <w:sz w:val="24"/>
+          <w14:ligatures w14:val="none"/>
+        </w:rPr>
+      </w:pPr>
+    </w:p>
+    <w:p>
+      <w:pPr>
+        <w:spacing w:after="0" w:line="240" w:lineRule="auto"/>
+        <w:jc w:val="both"/>
+        <w:rPr>
+          <w:rFonts w:ascii="Times New Roman" w:eastAsia="宋体" w:hAnsi="Times New Roman" w:cs="Times New Roman"/>
+          <w:b/>
+          <w:bCs/>
+          <w:kern w:val="0"/>
+          <w:sz w:val="24"/>
+          <w14:ligatures w14:val="none"/>
+        </w:rPr>
+      </w:pPr>
+    </w:p>
+    <w:p>
+      <w:pPr>
+        <w:spacing w:after="0" w:line="240" w:lineRule="auto"/>
+        <w:jc w:val="both"/>
+        <w:rPr>
+          <w:rFonts w:ascii="Times New Roman" w:eastAsia="宋体" w:hAnsi="Times New Roman" w:cs="Times New Roman"/>
+          <w:b/>
+          <w:bCs/>
+          <w:kern w:val="0"/>
+          <w:sz w:val="24"/>
+          <w14:ligatures w14:val="none"/>
+        </w:rPr>
+      </w:pPr>
+    </w:p>
+    <w:p>
+      <w:pPr>
+        <w:spacing w:after="0" w:line="240" w:lineRule="auto"/>
+        <w:jc w:val="both"/>
+        <w:rPr>
+          <w:rFonts w:ascii="Times New Roman" w:eastAsia="宋体" w:hAnsi="Times New Roman" w:cs="Times New Roman"/>
+          <w:b/>
+          <w:bCs/>
+          <w:kern w:val="0"/>
+          <w:sz w:val="24"/>
+          <w14:ligatures w14:val="none"/>
+        </w:rPr>
+      </w:pPr>
+    </w:p>
+    <w:p>
+      <w:pPr>
+        <w:spacing w:after="0" w:line="240" w:lineRule="auto"/>
+        <w:jc w:val="both"/>
+        <w:rPr>
+          <w:rFonts w:ascii="Times New Roman" w:eastAsia="宋体" w:hAnsi="Times New Roman" w:cs="Times New Roman"/>
+          <w:b/>
+          <w:bCs/>
+          <w:kern w:val="0"/>
+          <w:sz w:val="24"/>
+          <w14:ligatures w14:val="none"/>
+        </w:rPr>
+      </w:pPr>
+    </w:p>
+    <w:p>
+      <w:pPr>
+        <w:spacing w:after="0" w:line="240" w:lineRule="auto"/>
+        <w:jc w:val="both"/>
+        <w:rPr>
+          <w:rFonts w:ascii="Times New Roman" w:eastAsia="宋体" w:hAnsi="Times New Roman" w:cs="Times New Roman"/>
+          <w:b/>
+          <w:bCs/>
+          <w:kern w:val="0"/>
+          <w:sz w:val="24"/>
+          <w14:ligatures w14:val="none"/>
+        </w:rPr>
+      </w:pPr>
+    </w:p>
+    <w:p>
+      <w:pPr>
+        <w:spacing w:after="0" w:line="240" w:lineRule="auto"/>
+        <w:jc w:val="both"/>
+        <w:rPr>
+          <w:rFonts w:ascii="Times New Roman" w:eastAsia="宋体" w:hAnsi="Times New Roman" w:cs="Times New Roman"/>
+          <w:b/>
+          <w:bCs/>
+          <w:kern w:val="0"/>
+          <w:sz w:val="24"/>
+          <w14:ligatures w14:val="none"/>
+        </w:rPr>
+      </w:pPr>
+    </w:p>
+    <w:p>
+      <w:pPr>
+        <w:spacing w:after="0" w:line="240" w:lineRule="auto"/>
+        <w:jc w:val="both"/>
+        <w:rPr>
+          <w:rFonts w:ascii="Times New Roman" w:eastAsia="宋体" w:hAnsi="Times New Roman" w:cs="Times New Roman"/>
+          <w:b/>
+          <w:bCs/>
+          <w:kern w:val="0"/>
+          <w:sz w:val="24"/>
+          <w14:ligatures w14:val="none"/>
+        </w:rPr>
+      </w:pPr>
+    </w:p>
+    <w:p>
+      <w:pPr>
+        <w:spacing w:after="0" w:line="240" w:lineRule="auto"/>
+        <w:jc w:val="both"/>
+        <w:rPr>
+          <w:rFonts w:ascii="Times New Roman" w:hAnsi="Times New Roman" w:cs="Times New Roman" w:hint="eastAsia"/>
           <w:sz w:val="24"/>
         </w:rPr>
       </w:pPr>
@@ -1347,7 +2132,11 @@
           <w:szCs w:val="26"/>
         </w:rPr>
       </w:pPr>
-      <w:r>
+    </w:p>
+    <w:p>
+      <w:pPr>
+        <w:spacing w:after="0" w:line="240" w:lineRule="auto"/>
+        <w:jc w:val="both"/>
         <w:rPr>
           <w:rFonts w:ascii="Times New Roman" w:hAnsi="Times New Roman" w:cs="Times New Roman"/>
           <w:b/>
@@ -1355,7 +2144,41 @@
           <w:sz w:val="26"/>
           <w:szCs w:val="26"/>
         </w:rPr>
-        <w:lastRenderedPageBreak/>
+      </w:pPr>
+    </w:p>
+    <w:p>
+      <w:pPr>
+        <w:spacing w:after="0" w:line="240" w:lineRule="auto"/>
+        <w:jc w:val="both"/>
+        <w:rPr>
+          <w:rFonts w:ascii="Times New Roman" w:hAnsi="Times New Roman" w:cs="Times New Roman"/>
+          <w:b/>
+          <w:bCs/>
+          <w:sz w:val="26"/>
+          <w:szCs w:val="26"/>
+        </w:rPr>
+      </w:pPr>
+    </w:p>
+    <w:p>
+      <w:pPr>
+        <w:spacing w:after="0" w:line="240" w:lineRule="auto"/>
+        <w:jc w:val="both"/>
+        <w:rPr>
+          <w:rFonts w:ascii="Times New Roman" w:hAnsi="Times New Roman" w:cs="Times New Roman"/>
+          <w:b/>
+          <w:bCs/>
+          <w:sz w:val="26"/>
+          <w:szCs w:val="26"/>
+        </w:rPr>
+      </w:pPr>
+      <w:r>
+        <w:rPr>
+          <w:rFonts w:ascii="Times New Roman" w:hAnsi="Times New Roman" w:cs="Times New Roman"/>
+          <w:b/>
+          <w:bCs/>
+          <w:sz w:val="26"/>
+          <w:szCs w:val="26"/>
+        </w:rPr>
         <w:t>PREPARATION</w:t>
       </w:r>
       <w:r>
@@ -5012,7 +5835,7 @@
           <w:sz w:val="24"/>
           <w:shd w:val="clear" w:color="auto" w:fill="FFFFFF"/>
         </w:rPr>
-        <w:t xml:space="preserve">eed for variable transformations. </w:t>
+        <w:t xml:space="preserve">eed for </w:t>
       </w:r>
       <w:r>
         <w:rPr>
@@ -5024,7 +5847,8 @@
           <w:sz w:val="24"/>
           <w:shd w:val="clear" w:color="auto" w:fill="FFFFFF"/>
         </w:rPr>
-        <w:t>F</w:t>
+        <w:lastRenderedPageBreak/>
+        <w:t xml:space="preserve">variable transformations. </w:t>
       </w:r>
       <w:r>
         <w:rPr>
@@ -5036,7 +5860,7 @@
           <w:sz w:val="24"/>
           <w:shd w:val="clear" w:color="auto" w:fill="FFFFFF"/>
         </w:rPr>
-        <w:t>urther diagnostic procedures based on model residuals will be performed to evaluate the validity of the inferential assumptions</w:t>
+        <w:t>F</w:t>
       </w:r>
       <w:r>
         <w:rPr>
@@ -5048,7 +5872,7 @@
           <w:sz w:val="24"/>
           <w:shd w:val="clear" w:color="auto" w:fill="FFFFFF"/>
         </w:rPr>
-        <w:t xml:space="preserve"> in formal analyses</w:t>
+        <w:t>urther diagnostic procedures based on model residuals will be performed to evaluate the validity of the inferential assumptions</w:t>
       </w:r>
       <w:r>
         <w:rPr>
@@ -5060,6 +5884,18 @@
           <w:sz w:val="24"/>
           <w:shd w:val="clear" w:color="auto" w:fill="FFFFFF"/>
         </w:rPr>
+        <w:t xml:space="preserve"> in formal analyses</w:t>
+      </w:r>
+      <w:r>
+        <w:rPr>
+          <w:rStyle w:val="af2"/>
+          <w:rFonts w:ascii="Times New Roman" w:hAnsi="Times New Roman" w:cs="Times New Roman"/>
+          <w:i w:val="0"/>
+          <w:iCs w:val="0"/>
+          <w:color w:val="0F1115"/>
+          <w:sz w:val="24"/>
+          <w:shd w:val="clear" w:color="auto" w:fill="FFFFFF"/>
+        </w:rPr>
         <w:t>.</w:t>
       </w:r>
     </w:p>
@@ -5106,15 +5942,7 @@
           <w:rFonts w:ascii="Times New Roman" w:hAnsi="Times New Roman" w:cs="Times New Roman"/>
           <w:sz w:val="24"/>
         </w:rPr>
-        <w:t xml:space="preserve">he CMH indicates that the magnitude of the observed standardized correlations was generally small and that none of them were statistically significant, suggesting that, in the present sample, there was insufficient evidence to support non-zero population-level pairwise correlations among the examined variables. However, </w:t>
-      </w:r>
-      <w:r>
-        <w:rPr>
-          <w:rFonts w:ascii="Times New Roman" w:hAnsi="Times New Roman" w:cs="Times New Roman"/>
-          <w:sz w:val="24"/>
-        </w:rPr>
-        <w:lastRenderedPageBreak/>
-        <w:t xml:space="preserve">diagnostic assessment remains necessary because the validity of correlation-based inference depends on relevant statistical assumptions, and the absence of statistically significant zero-order correlations does not preclude the usefulness of further model-based analyses </w:t>
+        <w:t xml:space="preserve">he CMH indicates that the magnitude of the observed standardized correlations was generally small and that none of them were statistically significant, suggesting that, in the present sample, there was insufficient evidence to support non-zero population-level pairwise correlations among the examined variables. However, diagnostic assessment remains necessary because the validity of correlation-based inference depends on relevant statistical assumptions, and the absence of statistically significant zero-order correlations does not preclude the usefulness of further model-based analyses </w:t>
       </w:r>
       <w:r>
         <w:rPr>
@@ -5147,7 +5975,7 @@
           <w:rFonts w:ascii="Times New Roman" w:hAnsi="Times New Roman" w:cs="Times New Roman"/>
           <w:sz w:val="20"/>
           <w:szCs w:val="20"/>
-          <w:lang w:val="fr-CA" w:eastAsia="ja-JP"/>
+          <w:lang w:eastAsia="ja-JP"/>
         </w:rPr>
       </w:pPr>
     </w:p>
@@ -5171,7 +5999,7 @@
           <w:szCs w:val="20"/>
         </w:rPr>
         <w:drawing>
-          <wp:anchor distT="0" distB="0" distL="114300" distR="114300" simplePos="0" relativeHeight="251658240" behindDoc="0" locked="0" layoutInCell="1" allowOverlap="1" wp14:anchorId="6C018DE2" wp14:editId="50817CD7">
+          <wp:anchor distT="0" distB="0" distL="114300" distR="114300" simplePos="0" relativeHeight="251658240" behindDoc="0" locked="0" layoutInCell="1" allowOverlap="1" wp14:anchorId="6C018DE2" wp14:editId="13534812">
             <wp:simplePos x="0" y="0"/>
             <wp:positionH relativeFrom="column">
               <wp:posOffset>1270</wp:posOffset>
@@ -5194,7 +6022,7 @@
                     <pic:cNvPicPr/>
                   </pic:nvPicPr>
                   <pic:blipFill>
-                    <a:blip r:embed="rId7" cstate="print">
+                    <a:blip r:embed="rId8" cstate="print">
                       <a:extLst>
                         <a:ext uri="{28A0092B-C50C-407E-A947-70E740481C1C}">
                           <a14:useLocalDpi xmlns:a14="http://schemas.microsoft.com/office/drawing/2010/main" val="0"/>
@@ -5429,7 +6257,14 @@
         <w:rPr>
           <w:rFonts w:ascii="Times New Roman" w:hAnsi="Times New Roman" w:cs="Times New Roman"/>
         </w:rPr>
-        <w:t xml:space="preserve">e.g. 0 sleep hours, emotional regulation scores and stress level are meaningless and unrealistic), </w:t>
+        <w:t xml:space="preserve">e.g. 0 sleep hours, emotional regulation scores and stress level are meaningless and </w:t>
+      </w:r>
+      <w:r>
+        <w:rPr>
+          <w:rFonts w:ascii="Times New Roman" w:hAnsi="Times New Roman" w:cs="Times New Roman"/>
+        </w:rPr>
+        <w:lastRenderedPageBreak/>
+        <w:t xml:space="preserve">unrealistic), </w:t>
       </w:r>
       <w:r>
         <w:rPr>
@@ -5447,19 +6282,7 @@
         <w:rPr>
           <w:rFonts w:ascii="Times New Roman" w:hAnsi="Times New Roman" w:cs="Times New Roman"/>
         </w:rPr>
-        <w:t xml:space="preserve">predictor variable of interest by shifting the reference point from the original value of 0 to the corresponding sample means. Table 2 shows the descriptive summary of the mean-centered predictor variables and the outcome variables of interest. Emotion regulation scores were retained in both their original and mean-centered forms. As mathematically expected, the means of all mean-centered predictor variables were approximately 0, while the variance and standard deviation of the mean-centered emotion regulation scores were </w:t>
-      </w:r>
-      <w:r>
-        <w:rPr>
-          <w:rFonts w:ascii="Times New Roman" w:hAnsi="Times New Roman" w:cs="Times New Roman"/>
-        </w:rPr>
-        <w:t>the same</w:t>
-      </w:r>
-      <w:r>
-        <w:rPr>
-          <w:rFonts w:ascii="Times New Roman" w:hAnsi="Times New Roman" w:cs="Times New Roman"/>
-        </w:rPr>
-        <w:t xml:space="preserve"> as those of the original scores.</w:t>
+        <w:t>predictor variable of interest by shifting the reference point from the original value of 0 to the corresponding sample means. Table 2 shows the descriptive summary of the mean-centered predictor variables and the outcome variables of interest. Emotion regulation scores were retained in both their original and mean-centered forms. As mathematically expected, the means of all mean-centered predictor variables were approximately 0, while the variance and standard deviation of the mean-centered emotion regulation scores were the same as those of the original scores.</w:t>
       </w:r>
     </w:p>
     <w:p>
@@ -5482,14 +6305,7 @@
         <w:rPr>
           <w:rFonts w:ascii="Times New Roman" w:hAnsi="Times New Roman" w:cs="Times New Roman"/>
         </w:rPr>
-        <w:t xml:space="preserve"> which has been </w:t>
-      </w:r>
-      <w:r>
-        <w:rPr>
-          <w:rFonts w:ascii="Times New Roman" w:hAnsi="Times New Roman" w:cs="Times New Roman"/>
-        </w:rPr>
-        <w:lastRenderedPageBreak/>
-        <w:t xml:space="preserve">validated in previous </w:t>
+        <w:t xml:space="preserve"> which has been validated in previous </w:t>
       </w:r>
       <w:proofErr w:type="spellStart"/>
       <w:r>
@@ -5542,7 +6358,7 @@
       <w:pPr>
         <w:spacing w:after="0" w:line="240" w:lineRule="auto"/>
         <w:rPr>
-          <w:rFonts w:ascii="Times New Roman" w:hAnsi="Times New Roman" w:cs="Times New Roman" w:hint="eastAsia"/>
+          <w:rFonts w:ascii="Times New Roman" w:hAnsi="Times New Roman" w:cs="Times New Roman"/>
           <w:i/>
           <w:iCs/>
           <w:sz w:val="24"/>
@@ -5584,7 +6400,7 @@
             <w:pPr>
               <w:jc w:val="both"/>
               <w:rPr>
-                <w:rFonts w:ascii="Times New Roman" w:hAnsi="Times New Roman" w:cs="Times New Roman" w:hint="eastAsia"/>
+                <w:rFonts w:ascii="Times New Roman" w:hAnsi="Times New Roman" w:cs="Times New Roman"/>
                 <w:sz w:val="24"/>
                 <w:lang w:val="fr-CA"/>
               </w:rPr>
@@ -6752,12 +7568,30 @@
       <w:pPr>
         <w:spacing w:after="0" w:line="240" w:lineRule="auto"/>
         <w:rPr>
+          <w:rFonts w:ascii="Times New Roman" w:hAnsi="Times New Roman" w:cs="Times New Roman"/>
+          <w:b/>
+          <w:bCs/>
+          <w:sz w:val="24"/>
+        </w:rPr>
+      </w:pPr>
+      <w:r>
+        <w:rPr>
           <w:rFonts w:ascii="Times New Roman" w:hAnsi="Times New Roman" w:cs="Times New Roman" w:hint="eastAsia"/>
           <w:b/>
           <w:bCs/>
           <w:sz w:val="24"/>
         </w:rPr>
-      </w:pPr>
+        <w:t>-Construction of F</w:t>
+      </w:r>
+      <w:r>
+        <w:rPr>
+          <w:rFonts w:ascii="Times New Roman" w:hAnsi="Times New Roman" w:cs="Times New Roman"/>
+          <w:b/>
+          <w:bCs/>
+          <w:sz w:val="24"/>
+        </w:rPr>
+        <w:t>u</w:t>
+      </w:r>
       <w:r>
         <w:rPr>
           <w:rFonts w:ascii="Times New Roman" w:hAnsi="Times New Roman" w:cs="Times New Roman" w:hint="eastAsia"/>
@@ -6765,24 +7599,6 @@
           <w:bCs/>
           <w:sz w:val="24"/>
         </w:rPr>
-        <w:t>-Construction of F</w:t>
-      </w:r>
-      <w:r>
-        <w:rPr>
-          <w:rFonts w:ascii="Times New Roman" w:hAnsi="Times New Roman" w:cs="Times New Roman"/>
-          <w:b/>
-          <w:bCs/>
-          <w:sz w:val="24"/>
-        </w:rPr>
-        <w:t>u</w:t>
-      </w:r>
-      <w:r>
-        <w:rPr>
-          <w:rFonts w:ascii="Times New Roman" w:hAnsi="Times New Roman" w:cs="Times New Roman" w:hint="eastAsia"/>
-          <w:b/>
-          <w:bCs/>
-          <w:sz w:val="24"/>
-        </w:rPr>
         <w:t>nctions for Assumptions Diagnostics</w:t>
       </w:r>
     </w:p>
@@ -6792,7 +7608,7 @@
         <w:ind w:firstLineChars="100" w:firstLine="240"/>
         <w:jc w:val="both"/>
         <w:rPr>
-          <w:rFonts w:ascii="Times New Roman" w:hAnsi="Times New Roman" w:cs="Times New Roman" w:hint="eastAsia"/>
+          <w:rFonts w:ascii="Times New Roman" w:hAnsi="Times New Roman" w:cs="Times New Roman"/>
           <w:sz w:val="24"/>
         </w:rPr>
       </w:pPr>
@@ -6977,19 +7793,30 @@
           <w:bCs/>
           <w:sz w:val="26"/>
           <w:szCs w:val="26"/>
-          <w:lang w:val="fr-CA"/>
-        </w:rPr>
-      </w:pPr>
-      <w:r>
-        <w:rPr>
-          <w:rFonts w:ascii="Times New Roman" w:hAnsi="Times New Roman" w:cs="Times New Roman"/>
+        </w:rPr>
+      </w:pPr>
+    </w:p>
+    <w:p>
+      <w:pPr>
+        <w:spacing w:after="0" w:line="240" w:lineRule="auto"/>
+        <w:jc w:val="both"/>
+        <w:rPr>
+          <w:rFonts w:ascii="Times New Roman" w:hAnsi="Times New Roman" w:cs="Times New Roman" w:hint="eastAsia"/>
           <w:b/>
           <w:bCs/>
           <w:sz w:val="26"/>
           <w:szCs w:val="26"/>
         </w:rPr>
-        <w:lastRenderedPageBreak/>
-        <w:t>-Results</w:t>
+      </w:pPr>
+      <w:r>
+        <w:rPr>
+          <w:rFonts w:ascii="Times New Roman" w:hAnsi="Times New Roman" w:cs="Times New Roman" w:hint="eastAsia"/>
+          <w:b/>
+          <w:bCs/>
+          <w:sz w:val="26"/>
+          <w:szCs w:val="26"/>
+        </w:rPr>
+        <w:t>-Analysis Results</w:t>
       </w:r>
     </w:p>
     <w:p>
@@ -7069,7 +7896,20 @@
         <w:spacing w:after="0" w:line="240" w:lineRule="auto"/>
         <w:jc w:val="both"/>
         <w:rPr>
-          <w:rFonts w:ascii="Times New Roman" w:hAnsi="Times New Roman" w:cs="Times New Roman"/>
+          <w:rFonts w:ascii="Times New Roman" w:hAnsi="Times New Roman" w:cs="Times New Roman" w:hint="eastAsia"/>
+          <w:b/>
+          <w:bCs/>
+          <w:sz w:val="26"/>
+          <w:szCs w:val="26"/>
+        </w:rPr>
+      </w:pPr>
+    </w:p>
+    <w:p>
+      <w:pPr>
+        <w:spacing w:after="0" w:line="240" w:lineRule="auto"/>
+        <w:jc w:val="both"/>
+        <w:rPr>
+          <w:rFonts w:ascii="Times New Roman" w:hAnsi="Times New Roman" w:cs="Times New Roman" w:hint="eastAsia"/>
           <w:sz w:val="24"/>
         </w:rPr>
       </w:pPr>
@@ -7132,6 +7972,127 @@
     </w:p>
   </w:footnote>
 </w:footnotes>
+</file>
+
+<file path=word/numbering.xml><?xml version="1.0" encoding="utf-8"?>
+<w:numbering xmlns:wpc="http://schemas.microsoft.com/office/word/2010/wordprocessingCanvas" xmlns:cx="http://schemas.microsoft.com/office/drawing/2014/chartex" xmlns:cx1="http://schemas.microsoft.com/office/drawing/2015/9/8/chartex" xmlns:cx2="http://schemas.microsoft.com/office/drawing/2015/10/21/chartex" xmlns:cx3="http://schemas.microsoft.com/office/drawing/2016/5/9/chartex" xmlns:cx4="http://schemas.microsoft.com/office/drawing/2016/5/10/chartex" xmlns:cx5="http://schemas.microsoft.com/office/drawing/2016/5/11/chartex" xmlns:cx6="http://schemas.microsoft.com/office/drawing/2016/5/12/chartex" xmlns:cx7="http://schemas.microsoft.com/office/drawing/2016/5/13/chartex" xmlns:cx8="http://schemas.microsoft.com/office/drawing/2016/5/14/chartex" xmlns:mc="http://schemas.openxmlformats.org/markup-compatibility/2006" xmlns:aink="http://schemas.microsoft.com/office/drawing/2016/ink" xmlns:am3d="http://schemas.microsoft.com/office/drawing/2017/model3d" xmlns:o="urn:schemas-microsoft-com:office:office" xmlns:oel="http://schemas.microsoft.com/office/2019/extlst" xmlns:r="http://schemas.openxmlformats.org/officeDocument/2006/relationships" xmlns:m="http://schemas.openxmlformats.org/officeDocument/2006/math" xmlns:v="urn:schemas-microsoft-com:vml" xmlns:wp14="http://schemas.microsoft.com/office/word/2010/wordprocessingDrawing" xmlns:wp="http://schemas.openxmlformats.org/drawingml/2006/wordprocessingDrawing" xmlns:w10="urn:schemas-microsoft-com:office:word" xmlns:w="http://schemas.openxmlformats.org/wordprocessingml/2006/main" xmlns:w14="http://schemas.microsoft.com/office/word/2010/wordml" xmlns:w15="http://schemas.microsoft.com/office/word/2012/wordml" xmlns:w16cex="http://schemas.microsoft.com/office/word/2018/wordml/cex" xmlns:w16cid="http://schemas.microsoft.com/office/word/2016/wordml/cid" xmlns:w16="http://schemas.microsoft.com/office/word/2018/wordml" xmlns:w16du="http://schemas.microsoft.com/office/word/2023/wordml/word16du" xmlns:w16sdtdh="http://schemas.microsoft.com/office/word/2020/wordml/sdtdatahash" xmlns:w16sdtfl="http://schemas.microsoft.com/office/word/2024/wordml/sdtformatlock" xmlns:w16se="http://schemas.microsoft.com/office/word/2015/wordml/symex" xmlns:wpg="http://schemas.microsoft.com/office/word/2010/wordprocessingGroup" xmlns:wpi="http://schemas.microsoft.com/office/word/2010/wordprocessingInk" xmlns:wne="http://schemas.microsoft.com/office/word/2006/wordml" xmlns:wps="http://schemas.microsoft.com/office/word/2010/wordprocessingShape" mc:Ignorable="w14 w15 w16se w16cid w16 w16cex w16sdtdh w16sdtfl w16du wp14">
+  <w:abstractNum w:abstractNumId="0" w15:restartNumberingAfterBreak="0">
+    <w:nsid w:val="7F147F8A"/>
+    <w:multiLevelType w:val="hybridMultilevel"/>
+    <w:tmpl w:val="CF662D38"/>
+    <w:lvl w:ilvl="0" w:tplc="4D1E07B4">
+      <w:start w:val="87"/>
+      <w:numFmt w:val="bullet"/>
+      <w:lvlText w:val="-"/>
+      <w:lvlJc w:val="left"/>
+      <w:pPr>
+        <w:ind w:left="360" w:hanging="360"/>
+      </w:pPr>
+      <w:rPr>
+        <w:rFonts w:ascii="Times New Roman" w:eastAsia="宋体" w:hAnsi="Times New Roman" w:cs="Times New Roman" w:hint="default"/>
+      </w:rPr>
+    </w:lvl>
+    <w:lvl w:ilvl="1" w:tplc="04090003" w:tentative="1">
+      <w:start w:val="1"/>
+      <w:numFmt w:val="bullet"/>
+      <w:lvlText w:val=""/>
+      <w:lvlJc w:val="left"/>
+      <w:pPr>
+        <w:ind w:left="880" w:hanging="440"/>
+      </w:pPr>
+      <w:rPr>
+        <w:rFonts w:ascii="Wingdings" w:hAnsi="Wingdings" w:hint="default"/>
+      </w:rPr>
+    </w:lvl>
+    <w:lvl w:ilvl="2" w:tplc="04090005" w:tentative="1">
+      <w:start w:val="1"/>
+      <w:numFmt w:val="bullet"/>
+      <w:lvlText w:val=""/>
+      <w:lvlJc w:val="left"/>
+      <w:pPr>
+        <w:ind w:left="1320" w:hanging="440"/>
+      </w:pPr>
+      <w:rPr>
+        <w:rFonts w:ascii="Wingdings" w:hAnsi="Wingdings" w:hint="default"/>
+      </w:rPr>
+    </w:lvl>
+    <w:lvl w:ilvl="3" w:tplc="04090001" w:tentative="1">
+      <w:start w:val="1"/>
+      <w:numFmt w:val="bullet"/>
+      <w:lvlText w:val=""/>
+      <w:lvlJc w:val="left"/>
+      <w:pPr>
+        <w:ind w:left="1760" w:hanging="440"/>
+      </w:pPr>
+      <w:rPr>
+        <w:rFonts w:ascii="Wingdings" w:hAnsi="Wingdings" w:hint="default"/>
+      </w:rPr>
+    </w:lvl>
+    <w:lvl w:ilvl="4" w:tplc="04090003" w:tentative="1">
+      <w:start w:val="1"/>
+      <w:numFmt w:val="bullet"/>
+      <w:lvlText w:val=""/>
+      <w:lvlJc w:val="left"/>
+      <w:pPr>
+        <w:ind w:left="2200" w:hanging="440"/>
+      </w:pPr>
+      <w:rPr>
+        <w:rFonts w:ascii="Wingdings" w:hAnsi="Wingdings" w:hint="default"/>
+      </w:rPr>
+    </w:lvl>
+    <w:lvl w:ilvl="5" w:tplc="04090005" w:tentative="1">
+      <w:start w:val="1"/>
+      <w:numFmt w:val="bullet"/>
+      <w:lvlText w:val=""/>
+      <w:lvlJc w:val="left"/>
+      <w:pPr>
+        <w:ind w:left="2640" w:hanging="440"/>
+      </w:pPr>
+      <w:rPr>
+        <w:rFonts w:ascii="Wingdings" w:hAnsi="Wingdings" w:hint="default"/>
+      </w:rPr>
+    </w:lvl>
+    <w:lvl w:ilvl="6" w:tplc="04090001" w:tentative="1">
+      <w:start w:val="1"/>
+      <w:numFmt w:val="bullet"/>
+      <w:lvlText w:val=""/>
+      <w:lvlJc w:val="left"/>
+      <w:pPr>
+        <w:ind w:left="3080" w:hanging="440"/>
+      </w:pPr>
+      <w:rPr>
+        <w:rFonts w:ascii="Wingdings" w:hAnsi="Wingdings" w:hint="default"/>
+      </w:rPr>
+    </w:lvl>
+    <w:lvl w:ilvl="7" w:tplc="04090003" w:tentative="1">
+      <w:start w:val="1"/>
+      <w:numFmt w:val="bullet"/>
+      <w:lvlText w:val=""/>
+      <w:lvlJc w:val="left"/>
+      <w:pPr>
+        <w:ind w:left="3520" w:hanging="440"/>
+      </w:pPr>
+      <w:rPr>
+        <w:rFonts w:ascii="Wingdings" w:hAnsi="Wingdings" w:hint="default"/>
+      </w:rPr>
+    </w:lvl>
+    <w:lvl w:ilvl="8" w:tplc="04090005" w:tentative="1">
+      <w:start w:val="1"/>
+      <w:numFmt w:val="bullet"/>
+      <w:lvlText w:val=""/>
+      <w:lvlJc w:val="left"/>
+      <w:pPr>
+        <w:ind w:left="3960" w:hanging="440"/>
+      </w:pPr>
+      <w:rPr>
+        <w:rFonts w:ascii="Wingdings" w:hAnsi="Wingdings" w:hint="default"/>
+      </w:rPr>
+    </w:lvl>
+  </w:abstractNum>
+  <w:num w:numId="1" w16cid:durableId="1622802952">
+    <w:abstractNumId w:val="0"/>
+  </w:num>
+</w:numbering>
 </file>
 
 <file path=word/styles.xml><?xml version="1.0" encoding="utf-8"?>

</xml_diff>

<commit_message>
Elaboration of Specific introduction for AIM1 (Therotical framework and applied analysis methods and models)
</commit_message>
<xml_diff>
--- a/Project1_Sleep_Deprivation_Cognition/Report/Analysis_Report.docx
+++ b/Project1_Sleep_Deprivation_Cognition/Report/Analysis_Report.docx
@@ -249,7 +249,6 @@
         </w:rPr>
         <w:t xml:space="preserve"> </w:t>
       </w:r>
-      <w:proofErr w:type="spellStart"/>
       <w:r>
         <w:rPr>
           <w:rFonts w:ascii="Times New Roman" w:hAnsi="Times New Roman" w:cs="Times New Roman"/>
@@ -257,7 +256,6 @@
         </w:rPr>
         <w:t>Github</w:t>
       </w:r>
-      <w:proofErr w:type="spellEnd"/>
     </w:p>
     <w:p>
       <w:pPr>
@@ -791,35 +789,7 @@
         <w:rPr>
           <w:rFonts w:ascii="Times New Roman" w:hAnsi="Times New Roman" w:cs="Times New Roman"/>
         </w:rPr>
-        <w:t xml:space="preserve">Cognitive processing is one of the most fundamental topics in psychology and neuroscience, as it provides a framework for understanding functionally segregated yet integrated information-processing mechanisms underlying how individuals interact with the surrounding environment (Frank &amp; </w:t>
-      </w:r>
-      <w:proofErr w:type="spellStart"/>
-      <w:r>
-        <w:rPr>
-          <w:rFonts w:ascii="Times New Roman" w:hAnsi="Times New Roman" w:cs="Times New Roman"/>
-        </w:rPr>
-        <w:t>Badre</w:t>
-      </w:r>
-      <w:proofErr w:type="spellEnd"/>
-      <w:r>
-        <w:rPr>
-          <w:rFonts w:ascii="Times New Roman" w:hAnsi="Times New Roman" w:cs="Times New Roman"/>
-        </w:rPr>
-        <w:t xml:space="preserve">, 2015; Schall, 2004; </w:t>
-      </w:r>
-      <w:proofErr w:type="spellStart"/>
-      <w:r>
-        <w:rPr>
-          <w:rFonts w:ascii="Times New Roman" w:hAnsi="Times New Roman" w:cs="Times New Roman"/>
-        </w:rPr>
-        <w:t>Forstmann</w:t>
-      </w:r>
-      <w:proofErr w:type="spellEnd"/>
-      <w:r>
-        <w:rPr>
-          <w:rFonts w:ascii="Times New Roman" w:hAnsi="Times New Roman" w:cs="Times New Roman"/>
-        </w:rPr>
-        <w:t xml:space="preserve"> et al., 2011). Presented information may influence observable performance both directly, as the immediate input to cognitive processing, and indirectly, by interacting with the broader processing context under which cognition operates. For the present framework, this context includes both prior experience and the individual’s current internal state.</w:t>
+        <w:t>Cognitive processing is one of the most fundamental topics in psychology and neuroscience, as it provides a framework for understanding functionally segregated yet integrated information-processing mechanisms underlying how individuals interact with the surrounding environment (Frank &amp; Badre, 2015; Schall, 2004; Forstmann et al., 2011). Presented information may influence observable performance both directly, as the immediate input to cognitive processing, and indirectly, by interacting with the broader processing context under which cognition operates. For the present framework, this context includes both prior experience and the individual’s current internal state.</w:t>
       </w:r>
     </w:p>
     <w:p>
@@ -836,112 +806,14 @@
         <w:rPr>
           <w:rFonts w:ascii="Times New Roman" w:hAnsi="Times New Roman" w:cs="Times New Roman"/>
         </w:rPr>
-        <w:t>Certain studies support a broader conceptualization of cognitive functioning as dynamically state- and context-dependent, such that processing outcomes may vary across contextual conditions even when the immediate processing input remains unchanged (Flavell et al., 2022; Gilbert &amp; Sigman, 2007). For the present analyses, these contextual contributors are broadly distinguished into two categories. Experience-related contributors refer to influences arising from prior experiences or interactions with the surrounding environment that subsequently shape cognitive functioning. Examples include insufficient sleep and body posture (</w:t>
-      </w:r>
-      <w:proofErr w:type="spellStart"/>
-      <w:r>
-        <w:rPr>
-          <w:rFonts w:ascii="Times New Roman" w:hAnsi="Times New Roman" w:cs="Times New Roman"/>
-        </w:rPr>
-        <w:t>Alhola</w:t>
-      </w:r>
-      <w:proofErr w:type="spellEnd"/>
-      <w:r>
-        <w:rPr>
-          <w:rFonts w:ascii="Times New Roman" w:hAnsi="Times New Roman" w:cs="Times New Roman"/>
-        </w:rPr>
-        <w:t xml:space="preserve"> &amp; Polo-</w:t>
-      </w:r>
-      <w:proofErr w:type="spellStart"/>
-      <w:r>
-        <w:rPr>
-          <w:rFonts w:ascii="Times New Roman" w:hAnsi="Times New Roman" w:cs="Times New Roman"/>
-        </w:rPr>
-        <w:t>Kantola</w:t>
-      </w:r>
-      <w:proofErr w:type="spellEnd"/>
-      <w:r>
-        <w:rPr>
-          <w:rFonts w:ascii="Times New Roman" w:hAnsi="Times New Roman" w:cs="Times New Roman"/>
-        </w:rPr>
-        <w:t>, 2007; Khan &amp; Al-</w:t>
-      </w:r>
-      <w:proofErr w:type="spellStart"/>
-      <w:r>
-        <w:rPr>
-          <w:rFonts w:ascii="Times New Roman" w:hAnsi="Times New Roman" w:cs="Times New Roman"/>
-        </w:rPr>
-        <w:t>Jahdali</w:t>
-      </w:r>
-      <w:proofErr w:type="spellEnd"/>
-      <w:r>
-        <w:rPr>
-          <w:rFonts w:ascii="Times New Roman" w:hAnsi="Times New Roman" w:cs="Times New Roman"/>
-        </w:rPr>
-        <w:t xml:space="preserve">, 2023; </w:t>
-      </w:r>
-      <w:proofErr w:type="spellStart"/>
-      <w:r>
-        <w:rPr>
-          <w:rFonts w:ascii="Times New Roman" w:hAnsi="Times New Roman" w:cs="Times New Roman"/>
-        </w:rPr>
-        <w:t>Wainio</w:t>
-      </w:r>
-      <w:proofErr w:type="spellEnd"/>
-      <w:r>
-        <w:rPr>
-          <w:rFonts w:ascii="Times New Roman" w:hAnsi="Times New Roman" w:cs="Times New Roman"/>
-        </w:rPr>
-        <w:t xml:space="preserve">-Theberge &amp; </w:t>
-      </w:r>
-      <w:proofErr w:type="spellStart"/>
-      <w:r>
-        <w:rPr>
-          <w:rFonts w:ascii="Times New Roman" w:hAnsi="Times New Roman" w:cs="Times New Roman"/>
-        </w:rPr>
-        <w:t>Armony</w:t>
-      </w:r>
-      <w:proofErr w:type="spellEnd"/>
-      <w:r>
-        <w:rPr>
-          <w:rFonts w:ascii="Times New Roman" w:hAnsi="Times New Roman" w:cs="Times New Roman"/>
-        </w:rPr>
-        <w:t>, 2025). In contrast, psychophysiological-state contributors refer to conditions manifested within the individual at psychological and/or physiological levels, such as emotional state, fatigue, or motivation (Flavell et al., 2022). For example, perception of emotional information may be biased by the perceiver’s current emotional state (</w:t>
-      </w:r>
-      <w:proofErr w:type="spellStart"/>
-      <w:r>
-        <w:rPr>
-          <w:rFonts w:ascii="Times New Roman" w:hAnsi="Times New Roman" w:cs="Times New Roman"/>
-        </w:rPr>
-        <w:t>Trilla</w:t>
-      </w:r>
-      <w:proofErr w:type="spellEnd"/>
-      <w:r>
-        <w:rPr>
-          <w:rFonts w:ascii="Times New Roman" w:hAnsi="Times New Roman" w:cs="Times New Roman"/>
-        </w:rPr>
-        <w:t xml:space="preserve"> et al., 2021; Harris et </w:t>
+        <w:t xml:space="preserve">Certain studies support a broader conceptualization of cognitive functioning as dynamically state- and context-dependent, such that processing outcomes may vary across contextual conditions even when the immediate processing input remains unchanged (Flavell et al., 2022; Gilbert &amp; Sigman, 2007). For the present analyses, these contextual contributors are broadly distinguished into two categories. Experience-related contributors refer to influences arising from prior experiences or interactions with the surrounding environment that subsequently shape cognitive functioning. Examples include insufficient sleep and body posture (Alhola &amp; Polo-Kantola, 2007; Khan &amp; Al-Jahdali, 2023; Wainio-Theberge &amp; Armony, 2025). In contrast, psychophysiological-state contributors refer to conditions manifested within the individual at psychological and/or physiological levels, such as emotional state, fatigue, or motivation (Flavell et al., 2022). For example, perception of emotional information may be biased by the perceiver’s current emotional state (Trilla et al., 2021; Harris et </w:t>
       </w:r>
       <w:r>
         <w:rPr>
           <w:rFonts w:ascii="Times New Roman" w:hAnsi="Times New Roman" w:cs="Times New Roman"/>
         </w:rPr>
         <w:lastRenderedPageBreak/>
-        <w:t>al., 2016). These contextual influences may operate partly through modulation of neural and physiological mechanisms underlying cognitive functioning. Importantly, the two categories are not necessarily independent: psychophysiological states may be elicited or modified by prior experience, while relatively persistent conditions such as trait anxiety or depressive states may continue to influence cognitive performance even without an immediate external trigger (Pacheco-</w:t>
-      </w:r>
-      <w:proofErr w:type="spellStart"/>
-      <w:r>
-        <w:rPr>
-          <w:rFonts w:ascii="Times New Roman" w:hAnsi="Times New Roman" w:cs="Times New Roman"/>
-        </w:rPr>
-        <w:t>Unguetti</w:t>
-      </w:r>
-      <w:proofErr w:type="spellEnd"/>
-      <w:r>
-        <w:rPr>
-          <w:rFonts w:ascii="Times New Roman" w:hAnsi="Times New Roman" w:cs="Times New Roman"/>
-        </w:rPr>
-        <w:t xml:space="preserve"> et al., 2010; Roca et al., 2015). Conversely, internal states may also shape subsequent interactions with the surrounding environment.</w:t>
+        <w:t>al., 2016). These contextual influences may operate partly through modulation of neural and physiological mechanisms underlying cognitive functioning. Importantly, the two categories are not necessarily independent: psychophysiological states may be elicited or modified by prior experience, while relatively persistent conditions such as trait anxiety or depressive states may continue to influence cognitive performance even without an immediate external trigger (Pacheco-Unguetti et al., 2010; Roca et al., 2015). Conversely, internal states may also shape subsequent interactions with the surrounding environment.</w:t>
       </w:r>
     </w:p>
     <w:p>
@@ -974,63 +846,7 @@
         <w:rPr>
           <w:rFonts w:ascii="Times New Roman" w:hAnsi="Times New Roman" w:cs="Times New Roman"/>
         </w:rPr>
-        <w:t>For the second purpose, sleep hours and stress-level scores were selected as representative experience-related and psychophysiological-state predictors, respectively. Previous studies have linked both factors to variation in cognitive functioning and performance across different cognitive tasks (</w:t>
-      </w:r>
-      <w:proofErr w:type="spellStart"/>
-      <w:r>
-        <w:rPr>
-          <w:rFonts w:ascii="Times New Roman" w:hAnsi="Times New Roman" w:cs="Times New Roman"/>
-        </w:rPr>
-        <w:t>Alhola</w:t>
-      </w:r>
-      <w:proofErr w:type="spellEnd"/>
-      <w:r>
-        <w:rPr>
-          <w:rFonts w:ascii="Times New Roman" w:hAnsi="Times New Roman" w:cs="Times New Roman"/>
-        </w:rPr>
-        <w:t xml:space="preserve"> &amp; Polo-</w:t>
-      </w:r>
-      <w:proofErr w:type="spellStart"/>
-      <w:r>
-        <w:rPr>
-          <w:rFonts w:ascii="Times New Roman" w:hAnsi="Times New Roman" w:cs="Times New Roman"/>
-        </w:rPr>
-        <w:t>Kantola</w:t>
-      </w:r>
-      <w:proofErr w:type="spellEnd"/>
-      <w:r>
-        <w:rPr>
-          <w:rFonts w:ascii="Times New Roman" w:hAnsi="Times New Roman" w:cs="Times New Roman"/>
-        </w:rPr>
-        <w:t>, 2007; Khan &amp; Al-</w:t>
-      </w:r>
-      <w:proofErr w:type="spellStart"/>
-      <w:r>
-        <w:rPr>
-          <w:rFonts w:ascii="Times New Roman" w:hAnsi="Times New Roman" w:cs="Times New Roman"/>
-        </w:rPr>
-        <w:t>Jahdali</w:t>
-      </w:r>
-      <w:proofErr w:type="spellEnd"/>
-      <w:r>
-        <w:rPr>
-          <w:rFonts w:ascii="Times New Roman" w:hAnsi="Times New Roman" w:cs="Times New Roman"/>
-        </w:rPr>
-        <w:t xml:space="preserve">, 2023; </w:t>
-      </w:r>
-      <w:proofErr w:type="spellStart"/>
-      <w:r>
-        <w:rPr>
-          <w:rFonts w:ascii="Times New Roman" w:hAnsi="Times New Roman" w:cs="Times New Roman"/>
-        </w:rPr>
-        <w:t>Nwikwe</w:t>
-      </w:r>
-      <w:proofErr w:type="spellEnd"/>
-      <w:r>
-        <w:rPr>
-          <w:rFonts w:ascii="Times New Roman" w:hAnsi="Times New Roman" w:cs="Times New Roman"/>
-        </w:rPr>
-        <w:t>, 2025). The first specific aim was therefore to examine their independent contributions and combined explanatory value in relation to higher-order regulatory functioning. Emotion regulation was selected as the representative higher-order outcome because successful regulation relies on the coordination of cognitive processes including selective attention, working memory, and inhibitory control (Koay &amp; Meter, 2023).</w:t>
+        <w:t>For the second purpose, sleep hours and stress-level scores were selected as representative experience-related and psychophysiological-state predictors, respectively. Previous studies have linked both factors to variation in cognitive functioning and performance across different cognitive tasks (Alhola &amp; Polo-Kantola, 2007; Khan &amp; Al-Jahdali, 2023; Nwikwe, 2025). The first specific aim was therefore to examine their independent contributions and combined explanatory value in relation to higher-order regulatory functioning. Emotion regulation was selected as the representative higher-order outcome because successful regulation relies on the coordination of cognitive processes including selective attention, working memory, and inhibitory control (Koay &amp; Meter, 2023).</w:t>
       </w:r>
     </w:p>
     <w:p>
@@ -1047,49 +863,7 @@
         <w:rPr>
           <w:rFonts w:ascii="Times New Roman" w:hAnsi="Times New Roman" w:cs="Times New Roman"/>
         </w:rPr>
-        <w:t>The dataset also contains task-based measures of more basic cognitive functions. Stroop task reaction time (RT), N-back accuracy, and psychomotor vigilance test (PVT) RT are expected to primarily reflect selective attention and inhibition, working memory, and sustained attention and behavioral alertness, respectively (</w:t>
-      </w:r>
-      <w:proofErr w:type="spellStart"/>
-      <w:r>
-        <w:rPr>
-          <w:rFonts w:ascii="Times New Roman" w:hAnsi="Times New Roman" w:cs="Times New Roman"/>
-        </w:rPr>
-        <w:t>Basner</w:t>
-      </w:r>
-      <w:proofErr w:type="spellEnd"/>
-      <w:r>
-        <w:rPr>
-          <w:rFonts w:ascii="Times New Roman" w:hAnsi="Times New Roman" w:cs="Times New Roman"/>
-        </w:rPr>
-        <w:t xml:space="preserve"> et al., 2021; Owen et al., 2005; </w:t>
-      </w:r>
-      <w:proofErr w:type="spellStart"/>
-      <w:r>
-        <w:rPr>
-          <w:rFonts w:ascii="Times New Roman" w:hAnsi="Times New Roman" w:cs="Times New Roman"/>
-        </w:rPr>
-        <w:t>Scarpina</w:t>
-      </w:r>
-      <w:proofErr w:type="spellEnd"/>
-      <w:r>
-        <w:rPr>
-          <w:rFonts w:ascii="Times New Roman" w:hAnsi="Times New Roman" w:cs="Times New Roman"/>
-        </w:rPr>
-        <w:t xml:space="preserve"> &amp; </w:t>
-      </w:r>
-      <w:proofErr w:type="spellStart"/>
-      <w:r>
-        <w:rPr>
-          <w:rFonts w:ascii="Times New Roman" w:hAnsi="Times New Roman" w:cs="Times New Roman"/>
-        </w:rPr>
-        <w:t>Tagini</w:t>
-      </w:r>
-      <w:proofErr w:type="spellEnd"/>
-      <w:r>
-        <w:rPr>
-          <w:rFonts w:ascii="Times New Roman" w:hAnsi="Times New Roman" w:cs="Times New Roman"/>
-        </w:rPr>
-        <w:t>, 2017). This motivated the second aim: to examine whether these cognitive-performance measures could be reasonably summarized into a broader common dimension while retaining meaningful information from the original measures. If such a dimension could not be supported, the individual cognitive outcomes would instead be retained and examined separately. Subsequent model-based analyses were then used to examine theoretically relevant associations with these cognitive outcomes.</w:t>
+        <w:t>The dataset also contains task-based measures of more basic cognitive functions. Stroop task reaction time (RT), N-back accuracy, and psychomotor vigilance test (PVT) RT are expected to primarily reflect selective attention and inhibition, working memory, and sustained attention and behavioral alertness, respectively (Basner et al., 2021; Owen et al., 2005; Scarpina &amp; Tagini, 2017). This motivated the second aim: to examine whether these cognitive-performance measures could be reasonably summarized into a broader common dimension while retaining meaningful information from the original measures. If such a dimension could not be supported, the individual cognitive outcomes would instead be retained and examined separately. Subsequent model-based analyses were then used to examine theoretically relevant associations with these cognitive outcomes.</w:t>
       </w:r>
     </w:p>
     <w:p>
@@ -1168,234 +942,146 @@
     </w:p>
     <w:p>
       <w:pPr>
-        <w:spacing w:after="0" w:line="240" w:lineRule="auto"/>
+        <w:pStyle w:val="ae"/>
+        <w:spacing w:before="0" w:beforeAutospacing="0" w:after="0" w:afterAutospacing="0"/>
         <w:jc w:val="both"/>
         <w:rPr>
           <w:rFonts w:ascii="Times New Roman" w:hAnsi="Times New Roman" w:cs="Times New Roman"/>
-          <w:sz w:val="24"/>
         </w:rPr>
       </w:pPr>
       <w:r>
         <w:rPr>
-          <w:rFonts w:ascii="Times New Roman" w:eastAsia="宋体" w:hAnsi="Times New Roman" w:cs="Times New Roman"/>
-          <w:b/>
-          <w:bCs/>
-          <w:kern w:val="0"/>
-          <w:sz w:val="24"/>
-          <w14:ligatures w14:val="none"/>
+          <w:rFonts w:ascii="Times New Roman" w:hAnsi="Times New Roman" w:cs="Times New Roman"/>
+        </w:rPr>
+        <w:t xml:space="preserve">  </w:t>
+      </w:r>
+      <w:r>
+        <w:rPr>
+          <w:rStyle w:val="af4"/>
+          <w:rFonts w:ascii="Times New Roman" w:hAnsi="Times New Roman" w:cs="Times New Roman"/>
+          <w:b w:val="0"/>
+          <w:bCs w:val="0"/>
+        </w:rPr>
+        <w:t>Aim 1 examined the contributions of experience-related and psychophysiological-state factors to emotion regulation. Emotion regulation is conceptualized as a higher-order regulatory function relying on coordinated executive processes (Schulze et al., 2026). Evidence suggests that concurrent cognitive demands can interfere with regulation success or cognitive-task performance, consistent with competition for cognitive-control resources (Friese et al., 2013; Gan et al., 2017). Neuroimaging studies further indicate recruitment of prefrontal control regions overlapping with systems supporting attention and inhibitory control (Kohn et al., 2014; Martin &amp; Ochsner, 2016). Sleep duration and stress level were therefore selected as theoretically relevant predictors. Sleep deprivation has been associated with poorer adaptive emotion regulation and altered prefrontal–limbic control, supporting sleep duration as an experience-related predictor (Tempesta et al., 2018; Tomaso et al., 2021), whereas stress can alter prefrontal executive-control functioning and emotion-regulation effectiveness, supporting its treatment as a psychophysiological-state predictor (Tsai et al., 2019; Langer et al., 2025).</w:t>
+      </w:r>
+    </w:p>
+    <w:p>
+      <w:pPr>
+        <w:pStyle w:val="ae"/>
+        <w:spacing w:before="0" w:beforeAutospacing="0" w:after="0" w:afterAutospacing="0"/>
+        <w:ind w:firstLineChars="100" w:firstLine="240"/>
+        <w:jc w:val="both"/>
+        <w:rPr>
+          <w:rFonts w:ascii="Times New Roman" w:hAnsi="Times New Roman" w:cs="Times New Roman"/>
+        </w:rPr>
+      </w:pPr>
+      <w:r>
+        <w:rPr>
+          <w:rStyle w:val="af4"/>
+          <w:rFonts w:ascii="Times New Roman" w:hAnsi="Times New Roman" w:cs="Times New Roman"/>
+          <w:b w:val="0"/>
+          <w:bCs w:val="0"/>
+        </w:rPr>
+        <w:t>The Aim 1 analysis</w:t>
+      </w:r>
+      <w:r>
+        <w:rPr>
+          <w:rStyle w:val="af4"/>
+          <w:rFonts w:ascii="Times New Roman" w:hAnsi="Times New Roman" w:cs="Times New Roman" w:hint="eastAsia"/>
+          <w:b w:val="0"/>
+          <w:bCs w:val="0"/>
+        </w:rPr>
+        <w:t xml:space="preserve"> therefore</w:t>
+      </w:r>
+      <w:r>
+        <w:rPr>
+          <w:rStyle w:val="af4"/>
+          <w:rFonts w:ascii="Times New Roman" w:hAnsi="Times New Roman" w:cs="Times New Roman" w:hint="eastAsia"/>
+          <w:b w:val="0"/>
+          <w:bCs w:val="0"/>
         </w:rPr>
         <w:t xml:space="preserve"> </w:t>
       </w:r>
       <w:r>
         <w:rPr>
-          <w:rFonts w:ascii="Times New Roman" w:eastAsia="宋体" w:hAnsi="Times New Roman" w:cs="Times New Roman" w:hint="eastAsia"/>
-          <w:b/>
-          <w:bCs/>
-          <w:kern w:val="0"/>
-          <w:sz w:val="24"/>
-          <w14:ligatures w14:val="none"/>
+          <w:rStyle w:val="af4"/>
+          <w:rFonts w:ascii="Times New Roman" w:hAnsi="Times New Roman" w:cs="Times New Roman"/>
+          <w:b w:val="0"/>
+          <w:bCs w:val="0"/>
+        </w:rPr>
+        <w:t xml:space="preserve">proceeded sequentially. A simple linear regression first examined the association between sleep duration and emotion regulation, with longer sleep hypothesized to predict higher emotion regulation scores. Stress level was then added in a multiple regression to estimate the unique conditional association of each predictor while adjusting for the other and to test whether stress explained additional variance beyond sleep hours alone. </w:t>
+      </w:r>
+      <w:r>
+        <w:rPr>
+          <w:rFonts w:ascii="Times New Roman" w:hAnsi="Times New Roman" w:cs="Times New Roman"/>
+        </w:rPr>
+        <w:t>Eventually</w:t>
+      </w:r>
+      <w:r>
+        <w:rPr>
+          <w:rFonts w:ascii="Times New Roman" w:hAnsi="Times New Roman" w:cs="Times New Roman"/>
+        </w:rPr>
+        <w:t xml:space="preserve">, a sleep-hours × stress-level interaction was introduced to examine whether the association between either predictor and emotion regulation depended on the level of the other. I tentatively expected a positive interaction, such that the negative association between stress and emotion regulation would </w:t>
+      </w:r>
+      <w:r>
+        <w:rPr>
+          <w:rFonts w:ascii="Times New Roman" w:hAnsi="Times New Roman" w:cs="Times New Roman"/>
+        </w:rPr>
+        <w:t xml:space="preserve">be </w:t>
+      </w:r>
+      <w:r>
+        <w:rPr>
+          <w:rFonts w:ascii="Times New Roman" w:hAnsi="Times New Roman" w:cs="Times New Roman"/>
+        </w:rPr>
+        <w:t>weaken as sleep duration increased</w:t>
+      </w:r>
+      <w:r>
+        <w:rPr>
+          <w:rFonts w:ascii="Times New Roman" w:hAnsi="Times New Roman" w:cs="Times New Roman"/>
+        </w:rPr>
+        <w:t>.</w:t>
+      </w:r>
+      <w:r>
+        <w:rPr>
+          <w:rFonts w:ascii="Times New Roman" w:hAnsi="Times New Roman" w:cs="Times New Roman"/>
         </w:rPr>
         <w:t xml:space="preserve"> </w:t>
       </w:r>
       <w:r>
         <w:rPr>
           <w:rFonts w:ascii="Times New Roman" w:hAnsi="Times New Roman" w:cs="Times New Roman"/>
-          <w:sz w:val="24"/>
-        </w:rPr>
-        <w:t>A</w:t>
-      </w:r>
-      <w:r>
-        <w:rPr>
-          <w:rFonts w:ascii="Times New Roman" w:hAnsi="Times New Roman" w:cs="Times New Roman"/>
-          <w:sz w:val="24"/>
-        </w:rPr>
-        <w:t>im 1 examined the contributions of experience-related and psychophysiological-state contributors to emotion regulation.</w:t>
-      </w:r>
-      <w:r>
-        <w:rPr>
-          <w:rFonts w:ascii="Times New Roman" w:eastAsia="宋体" w:hAnsi="Times New Roman" w:cs="Times New Roman"/>
-          <w:kern w:val="0"/>
-          <w:sz w:val="24"/>
-          <w14:ligatures w14:val="none"/>
-        </w:rPr>
-        <w:t xml:space="preserve"> </w:t>
-      </w:r>
-      <w:r>
-        <w:rPr>
-          <w:rFonts w:ascii="Times New Roman" w:hAnsi="Times New Roman" w:cs="Times New Roman"/>
-          <w:sz w:val="24"/>
-        </w:rPr>
-        <w:t xml:space="preserve">Emotion regulation is conceptualized as a higher-order regulatory function relying on coordinated executive processes. </w:t>
-      </w:r>
-      <w:sdt>
-        <w:sdtPr>
-          <w:rPr>
-            <w:rFonts w:ascii="Times New Roman" w:hAnsi="Times New Roman" w:cs="Times New Roman"/>
-            <w:sz w:val="24"/>
-          </w:rPr>
-          <w:id w:val="17671638"/>
-          <w:citation/>
-        </w:sdtPr>
-        <w:sdtContent>
-          <w:r>
-            <w:rPr>
-              <w:rFonts w:ascii="Times New Roman" w:hAnsi="Times New Roman" w:cs="Times New Roman"/>
-              <w:sz w:val="24"/>
-            </w:rPr>
-            <w:fldChar w:fldCharType="begin"/>
-          </w:r>
-          <w:r>
-            <w:rPr>
-              <w:rFonts w:ascii="Times New Roman" w:eastAsia="宋体" w:hAnsi="Times New Roman" w:cs="Times New Roman"/>
-              <w:sz w:val="24"/>
-            </w:rPr>
-            <w:instrText xml:space="preserve"> CITATION Sch26 \l 2052 </w:instrText>
-          </w:r>
-          <w:r>
-            <w:rPr>
-              <w:rFonts w:ascii="Times New Roman" w:hAnsi="Times New Roman" w:cs="Times New Roman"/>
-              <w:sz w:val="24"/>
-            </w:rPr>
-            <w:fldChar w:fldCharType="separate"/>
-          </w:r>
-          <w:r>
-            <w:rPr>
-              <w:rFonts w:ascii="Times New Roman" w:eastAsia="宋体" w:hAnsi="Times New Roman" w:cs="Times New Roman"/>
-              <w:noProof/>
-              <w:sz w:val="24"/>
-            </w:rPr>
-            <w:t>(Schulze, et al., 2026)</w:t>
-          </w:r>
-          <w:r>
-            <w:rPr>
-              <w:rFonts w:ascii="Times New Roman" w:hAnsi="Times New Roman" w:cs="Times New Roman"/>
-              <w:sz w:val="24"/>
-            </w:rPr>
-            <w:fldChar w:fldCharType="end"/>
-          </w:r>
-        </w:sdtContent>
-      </w:sdt>
-      <w:r>
-        <w:rPr>
-          <w:rFonts w:ascii="Times New Roman" w:hAnsi="Times New Roman" w:cs="Times New Roman"/>
-          <w:sz w:val="24"/>
-        </w:rPr>
-        <w:t xml:space="preserve"> evidence suggests that concurrent cognitive demands can interfere with regulation success or performance in cognitive task, consistent with competition for cognitive-control resources </w:t>
-      </w:r>
-      <w:r>
-        <w:rPr>
-          <w:rFonts w:ascii="Times New Roman" w:eastAsia="宋体" w:hAnsi="Times New Roman" w:cs="Times New Roman"/>
-          <w:noProof/>
-          <w:sz w:val="24"/>
-        </w:rPr>
-        <w:t>(Friese et a., 2013; Gan et al., 2017)</w:t>
-      </w:r>
-      <w:r>
-        <w:rPr>
-          <w:rFonts w:ascii="Times New Roman" w:hAnsi="Times New Roman" w:cs="Times New Roman"/>
-          <w:sz w:val="24"/>
-        </w:rPr>
-        <w:t xml:space="preserve">. Neuroimaging studies further indicate recruitment of prefrontal control regions overlapping with systems supporting attention and inhibitory control </w:t>
-      </w:r>
-      <w:r>
-        <w:rPr>
-          <w:rFonts w:ascii="Times New Roman" w:hAnsi="Times New Roman" w:cs="Times New Roman"/>
-          <w:noProof/>
-          <w:sz w:val="24"/>
-        </w:rPr>
-        <w:t xml:space="preserve">(Martin &amp; Ochsner, 2016; Kohn, et al., 2014). </w:t>
-      </w:r>
-      <w:r>
-        <w:rPr>
-          <w:rFonts w:ascii="Times New Roman" w:hAnsi="Times New Roman" w:cs="Times New Roman"/>
-          <w:sz w:val="24"/>
-        </w:rPr>
-        <w:t>Given the dependence of emotion regulation on coordinated cognitive-control systems,</w:t>
-      </w:r>
-      <w:r>
-        <w:t xml:space="preserve"> </w:t>
-      </w:r>
-      <w:r>
-        <w:rPr>
-          <w:rFonts w:ascii="Times New Roman" w:hAnsi="Times New Roman" w:cs="Times New Roman"/>
-          <w:noProof/>
-          <w:sz w:val="24"/>
-        </w:rPr>
-        <w:t>Sleep</w:t>
-      </w:r>
-      <w:r>
-        <w:rPr>
-          <w:rFonts w:ascii="Times New Roman" w:hAnsi="Times New Roman" w:cs="Times New Roman"/>
-          <w:sz w:val="24"/>
-        </w:rPr>
-        <w:t xml:space="preserve"> duration and stress level were selected as theoretically relevant predictors because both have been linked to variation in the functioning of these regulatory system. Sleep </w:t>
-      </w:r>
-      <w:r>
-        <w:rPr>
-          <w:rFonts w:ascii="Times New Roman" w:hAnsi="Times New Roman" w:cs="Times New Roman"/>
-          <w:sz w:val="24"/>
-        </w:rPr>
-        <w:t>deprivation</w:t>
-      </w:r>
-      <w:r>
-        <w:rPr>
-          <w:rFonts w:ascii="Times New Roman" w:hAnsi="Times New Roman" w:cs="Times New Roman"/>
-          <w:sz w:val="24"/>
-        </w:rPr>
-        <w:t xml:space="preserve"> has been associated with poorer adaptive emotion regulation and disrupted prefrontal–limbic control, supporting its treatment as an experience-related predictor (</w:t>
-      </w:r>
-      <w:r>
-        <w:rPr>
-          <w:rFonts w:ascii="Times New Roman" w:hAnsi="Times New Roman" w:cs="Times New Roman"/>
-          <w:noProof/>
-          <w:sz w:val="24"/>
-        </w:rPr>
-        <w:t>Tempesta</w:t>
-      </w:r>
-      <w:r>
-        <w:rPr>
-          <w:rFonts w:ascii="Times New Roman" w:hAnsi="Times New Roman" w:cs="Times New Roman"/>
-          <w:noProof/>
-          <w:sz w:val="24"/>
-        </w:rPr>
-        <w:t xml:space="preserve"> et al.</w:t>
-      </w:r>
-      <w:r>
-        <w:rPr>
-          <w:rFonts w:ascii="Times New Roman" w:hAnsi="Times New Roman" w:cs="Times New Roman"/>
-          <w:noProof/>
-          <w:sz w:val="24"/>
-        </w:rPr>
-        <w:t>, 2018</w:t>
-      </w:r>
-      <w:r>
-        <w:rPr>
-          <w:rFonts w:ascii="Times New Roman" w:hAnsi="Times New Roman" w:cs="Times New Roman"/>
-          <w:noProof/>
-          <w:sz w:val="24"/>
-        </w:rPr>
-        <w:t>;</w:t>
-      </w:r>
-      <w:r>
-        <w:rPr>
-          <w:rFonts w:ascii="Times New Roman" w:hAnsi="Times New Roman" w:cs="Times New Roman"/>
-          <w:sz w:val="24"/>
-        </w:rPr>
-        <w:t xml:space="preserve"> Tomaso et al., 20</w:t>
-      </w:r>
-      <w:r>
-        <w:rPr>
-          <w:rFonts w:ascii="Times New Roman" w:hAnsi="Times New Roman" w:cs="Times New Roman"/>
-          <w:sz w:val="24"/>
-        </w:rPr>
-        <w:t>21</w:t>
-      </w:r>
-      <w:r>
-        <w:rPr>
-          <w:rFonts w:ascii="Times New Roman" w:hAnsi="Times New Roman" w:cs="Times New Roman"/>
-          <w:sz w:val="24"/>
-        </w:rPr>
-        <w:t>). Stress, in contrast, can alter prefrontal executive-control functioning and emotion-regulation effectiveness, although its effects may vary with timing, intensity, and regulatory strategy, supporting its treatment as a psychophysiological-state predictor (Tsai et al., 2019; Langer et al., 2025).</w:t>
+        </w:rPr>
+        <w:t>E</w:t>
+      </w:r>
+      <w:r>
+        <w:rPr>
+          <w:rFonts w:ascii="Times New Roman" w:hAnsi="Times New Roman" w:cs="Times New Roman"/>
+        </w:rPr>
+        <w:t xml:space="preserve">quivalently, that the beneficial </w:t>
+      </w:r>
+      <w:r>
+        <w:rPr>
+          <w:rFonts w:ascii="Times New Roman" w:hAnsi="Times New Roman" w:cs="Times New Roman"/>
+        </w:rPr>
+        <w:t xml:space="preserve">effect one extra </w:t>
+      </w:r>
+      <w:r>
+        <w:rPr>
+          <w:rFonts w:ascii="Times New Roman" w:hAnsi="Times New Roman" w:cs="Times New Roman"/>
+        </w:rPr>
+        <w:t xml:space="preserve">sleep </w:t>
+      </w:r>
+      <w:r>
+        <w:rPr>
+          <w:rFonts w:ascii="Times New Roman" w:hAnsi="Times New Roman" w:cs="Times New Roman"/>
+        </w:rPr>
+        <w:t>brought on</w:t>
+      </w:r>
+      <w:r>
+        <w:rPr>
+          <w:rFonts w:ascii="Times New Roman" w:hAnsi="Times New Roman" w:cs="Times New Roman"/>
+        </w:rPr>
+        <w:t xml:space="preserve"> emotion regulation would become stronger at higher stress levels.</w:t>
       </w:r>
     </w:p>
     <w:p>
@@ -1403,93 +1089,6 @@
         <w:spacing w:after="0" w:line="240" w:lineRule="auto"/>
         <w:jc w:val="both"/>
         <w:rPr>
-          <w:rFonts w:ascii="Times New Roman" w:hAnsi="Times New Roman" w:cs="Times New Roman" w:hint="eastAsia"/>
-          <w:sz w:val="24"/>
-        </w:rPr>
-      </w:pPr>
-      <w:r>
-        <w:rPr>
-          <w:rFonts w:ascii="Times New Roman" w:hAnsi="Times New Roman" w:cs="Times New Roman" w:hint="eastAsia"/>
-          <w:sz w:val="24"/>
-        </w:rPr>
-        <w:t xml:space="preserve">  Th</w:t>
-      </w:r>
-      <w:r>
-        <w:rPr>
-          <w:rFonts w:ascii="Times New Roman" w:hAnsi="Times New Roman" w:cs="Times New Roman"/>
-          <w:sz w:val="24"/>
-        </w:rPr>
-        <w:t xml:space="preserve">e analysis flow for the aim1 module is as following; Firstly, a simple linear regression is constructed where sleep hours is predictor variable and emotion regulation scores is outcome </w:t>
-      </w:r>
-      <w:r>
-        <w:rPr>
-          <w:rFonts w:ascii="Times New Roman" w:hAnsi="Times New Roman" w:cs="Times New Roman" w:hint="eastAsia"/>
-          <w:sz w:val="24"/>
-        </w:rPr>
-        <w:t>variable for</w:t>
-      </w:r>
-      <w:r>
-        <w:rPr>
-          <w:rFonts w:ascii="Times New Roman" w:hAnsi="Times New Roman" w:cs="Times New Roman"/>
-          <w:sz w:val="24"/>
-        </w:rPr>
-        <w:t xml:space="preserve"> </w:t>
-      </w:r>
-      <w:r>
-        <w:rPr>
-          <w:rFonts w:ascii="Times New Roman" w:hAnsi="Times New Roman" w:cs="Times New Roman"/>
-          <w:sz w:val="24"/>
-        </w:rPr>
-        <w:t>examining</w:t>
-      </w:r>
-      <w:r>
-        <w:rPr>
-          <w:rFonts w:ascii="Times New Roman" w:hAnsi="Times New Roman" w:cs="Times New Roman"/>
-          <w:sz w:val="24"/>
-        </w:rPr>
-        <w:t xml:space="preserve"> the effects of sleep hours on emotion regulation. Based on </w:t>
-      </w:r>
-      <w:r>
-        <w:rPr>
-          <w:rFonts w:ascii="Times New Roman" w:hAnsi="Times New Roman" w:cs="Times New Roman"/>
-          <w:sz w:val="24"/>
-        </w:rPr>
-        <w:t>the prior theoretical evidence</w:t>
-      </w:r>
-      <w:r>
-        <w:rPr>
-          <w:rFonts w:ascii="Times New Roman" w:hAnsi="Times New Roman" w:cs="Times New Roman"/>
-          <w:sz w:val="24"/>
-        </w:rPr>
-        <w:t xml:space="preserve">, it is hypothesized that </w:t>
-      </w:r>
-      <w:r>
-        <w:rPr>
-          <w:rFonts w:ascii="Times New Roman" w:hAnsi="Times New Roman" w:cs="Times New Roman"/>
-          <w:sz w:val="24"/>
-        </w:rPr>
-        <w:t xml:space="preserve">the sleep hours should be positively associated with emotion regulation scores. Subsequently, a multiple linear regression where continuous stress level scores is incorporated as the new predictor variable for two purposes: (1) separately examining effect of experience-related or psychophysiological-related predictor, here, sleep hours and stress levels, on outcome in controlling for another one for their conditional effects, </w:t>
-      </w:r>
-      <w:r>
-        <w:rPr>
-          <w:rFonts w:ascii="Times New Roman" w:hAnsi="Times New Roman" w:cs="Times New Roman"/>
-          <w:sz w:val="24"/>
-        </w:rPr>
-        <w:t>their direct</w:t>
-      </w:r>
-      <w:r>
-        <w:rPr>
-          <w:rFonts w:ascii="Times New Roman" w:hAnsi="Times New Roman" w:cs="Times New Roman"/>
-          <w:sz w:val="24"/>
-        </w:rPr>
-        <w:t xml:space="preserve"> effects. (2) examining whether incorporation of </w:t>
-      </w:r>
-    </w:p>
-    <w:p>
-      <w:pPr>
-        <w:spacing w:after="0" w:line="240" w:lineRule="auto"/>
-        <w:jc w:val="both"/>
-        <w:rPr>
           <w:rFonts w:ascii="Times New Roman" w:eastAsia="宋体" w:hAnsi="Times New Roman" w:cs="Times New Roman"/>
           <w:b/>
           <w:bCs/>
@@ -1510,7 +1109,79 @@
         <w:t>-Aim2 Overview and Methods</w:t>
       </w:r>
     </w:p>
-    <w:p/>
+    <w:p>
+      <w:pPr>
+        <w:spacing w:after="0"/>
+        <w:jc w:val="both"/>
+        <w:rPr>
+          <w:rFonts w:ascii="Times New Roman" w:hAnsi="Times New Roman" w:cs="Times New Roman"/>
+          <w:sz w:val="24"/>
+        </w:rPr>
+      </w:pPr>
+      <w:r>
+        <w:rPr>
+          <w:rFonts w:hint="eastAsia"/>
+        </w:rPr>
+        <w:t xml:space="preserve">  </w:t>
+      </w:r>
+      <w:r>
+        <w:rPr>
+          <w:rFonts w:ascii="Times New Roman" w:hAnsi="Times New Roman" w:cs="Times New Roman"/>
+          <w:sz w:val="24"/>
+        </w:rPr>
+        <w:t xml:space="preserve">In the module for aim2, </w:t>
+      </w:r>
+      <w:r>
+        <w:rPr>
+          <w:rFonts w:ascii="Times New Roman" w:hAnsi="Times New Roman" w:cs="Times New Roman"/>
+          <w:sz w:val="24"/>
+        </w:rPr>
+        <w:t xml:space="preserve">I </w:t>
+      </w:r>
+      <w:r>
+        <w:rPr>
+          <w:rFonts w:ascii="Times New Roman" w:hAnsi="Times New Roman" w:cs="Times New Roman"/>
+          <w:sz w:val="24"/>
+        </w:rPr>
+        <w:t>continuously</w:t>
+      </w:r>
+      <w:r>
+        <w:rPr>
+          <w:rFonts w:ascii="Times New Roman" w:hAnsi="Times New Roman" w:cs="Times New Roman"/>
+          <w:sz w:val="24"/>
+        </w:rPr>
+        <w:t xml:space="preserve"> examine</w:t>
+      </w:r>
+      <w:r>
+        <w:rPr>
+          <w:rFonts w:ascii="Times New Roman" w:hAnsi="Times New Roman" w:cs="Times New Roman"/>
+          <w:sz w:val="24"/>
+        </w:rPr>
+        <w:t xml:space="preserve"> the </w:t>
+      </w:r>
+      <w:r>
+        <w:rPr>
+          <w:rFonts w:ascii="Times New Roman" w:hAnsi="Times New Roman" w:cs="Times New Roman"/>
+          <w:sz w:val="24"/>
+        </w:rPr>
+        <w:t>associations between experience-based predictor and psychophysiology-based predictors and performance in cognitive tasks</w:t>
+      </w:r>
+      <w:r>
+        <w:rPr>
+          <w:rFonts w:ascii="Times New Roman" w:hAnsi="Times New Roman" w:cs="Times New Roman"/>
+          <w:sz w:val="24"/>
+        </w:rPr>
+        <w:t xml:space="preserve">. </w:t>
+      </w:r>
+      <w:r>
+        <w:rPr>
+          <w:rFonts w:ascii="Times New Roman" w:hAnsi="Times New Roman" w:cs="Times New Roman"/>
+          <w:sz w:val="24"/>
+          <w:lang w:val="fr-CA"/>
+        </w:rPr>
+        <w:t xml:space="preserve">However, in this aim, the strating point primary cogntive cosntructs of regulatory control, defiend as  </w:t>
+      </w:r>
+    </w:p>
     <w:p/>
     <w:p/>
     <w:p>
@@ -1603,6 +1274,26 @@
           <w:szCs w:val="26"/>
         </w:rPr>
       </w:pPr>
+      <w:r>
+        <w:rPr>
+          <w:rFonts w:ascii="Times New Roman" w:hAnsi="Times New Roman" w:cs="Times New Roman"/>
+          <w:b/>
+          <w:bCs/>
+          <w:sz w:val="26"/>
+          <w:szCs w:val="26"/>
+        </w:rPr>
+        <w:t>RESULTS</w:t>
+      </w:r>
+      <w:r>
+        <w:rPr>
+          <w:rFonts w:ascii="Times New Roman" w:hAnsi="Times New Roman" w:cs="Times New Roman"/>
+          <w:b/>
+          <w:bCs/>
+          <w:sz w:val="26"/>
+          <w:szCs w:val="26"/>
+        </w:rPr>
+        <w:t xml:space="preserve"> AND DISCUSSION</w:t>
+      </w:r>
     </w:p>
     <w:p>
       <w:pPr>
@@ -1616,6 +1307,36 @@
           <w:szCs w:val="26"/>
         </w:rPr>
       </w:pPr>
+      <w:r>
+        <w:rPr>
+          <w:rFonts w:ascii="Times New Roman" w:hAnsi="Times New Roman" w:cs="Times New Roman" w:hint="eastAsia"/>
+          <w:b/>
+          <w:bCs/>
+          <w:sz w:val="26"/>
+          <w:szCs w:val="26"/>
+        </w:rPr>
+        <w:t xml:space="preserve">Exploratory Data </w:t>
+      </w:r>
+      <w:r>
+        <w:rPr>
+          <w:rFonts w:ascii="Times New Roman" w:hAnsi="Times New Roman" w:cs="Times New Roman"/>
+          <w:b/>
+          <w:bCs/>
+          <w:sz w:val="26"/>
+          <w:szCs w:val="26"/>
+        </w:rPr>
+        <w:t>Analysis</w:t>
+      </w:r>
+      <w:r>
+        <w:rPr>
+          <w:rFonts w:ascii="Times New Roman" w:hAnsi="Times New Roman" w:cs="Times New Roman"/>
+          <w:b/>
+          <w:bCs/>
+          <w:sz w:val="26"/>
+          <w:szCs w:val="26"/>
+        </w:rPr>
+        <w:t xml:space="preserve"> (EDA):</w:t>
+      </w:r>
     </w:p>
     <w:p>
       <w:pPr>
@@ -1623,179 +1344,9 @@
         <w:jc w:val="both"/>
         <w:rPr>
           <w:rFonts w:ascii="Times New Roman" w:hAnsi="Times New Roman" w:cs="Times New Roman"/>
-          <w:b/>
-          <w:bCs/>
-          <w:sz w:val="26"/>
-          <w:szCs w:val="26"/>
+          <w:sz w:val="24"/>
         </w:rPr>
       </w:pPr>
-    </w:p>
-    <w:p>
-      <w:pPr>
-        <w:spacing w:after="0" w:line="240" w:lineRule="auto"/>
-        <w:jc w:val="both"/>
-        <w:rPr>
-          <w:rFonts w:ascii="Times New Roman" w:hAnsi="Times New Roman" w:cs="Times New Roman"/>
-          <w:b/>
-          <w:bCs/>
-          <w:sz w:val="26"/>
-          <w:szCs w:val="26"/>
-        </w:rPr>
-      </w:pPr>
-    </w:p>
-    <w:p>
-      <w:pPr>
-        <w:spacing w:after="0" w:line="240" w:lineRule="auto"/>
-        <w:jc w:val="both"/>
-        <w:rPr>
-          <w:rFonts w:ascii="Times New Roman" w:hAnsi="Times New Roman" w:cs="Times New Roman"/>
-          <w:b/>
-          <w:bCs/>
-          <w:sz w:val="26"/>
-          <w:szCs w:val="26"/>
-        </w:rPr>
-      </w:pPr>
-    </w:p>
-    <w:p>
-      <w:pPr>
-        <w:spacing w:after="0" w:line="240" w:lineRule="auto"/>
-        <w:jc w:val="both"/>
-        <w:rPr>
-          <w:rFonts w:ascii="Times New Roman" w:hAnsi="Times New Roman" w:cs="Times New Roman"/>
-          <w:b/>
-          <w:bCs/>
-          <w:sz w:val="26"/>
-          <w:szCs w:val="26"/>
-        </w:rPr>
-      </w:pPr>
-    </w:p>
-    <w:p>
-      <w:pPr>
-        <w:spacing w:after="0" w:line="240" w:lineRule="auto"/>
-        <w:jc w:val="both"/>
-        <w:rPr>
-          <w:rFonts w:ascii="Times New Roman" w:hAnsi="Times New Roman" w:cs="Times New Roman"/>
-          <w:b/>
-          <w:bCs/>
-          <w:sz w:val="26"/>
-          <w:szCs w:val="26"/>
-        </w:rPr>
-      </w:pPr>
-    </w:p>
-    <w:p>
-      <w:pPr>
-        <w:spacing w:after="0" w:line="240" w:lineRule="auto"/>
-        <w:jc w:val="both"/>
-        <w:rPr>
-          <w:rFonts w:ascii="Times New Roman" w:hAnsi="Times New Roman" w:cs="Times New Roman"/>
-          <w:b/>
-          <w:bCs/>
-          <w:sz w:val="26"/>
-          <w:szCs w:val="26"/>
-        </w:rPr>
-      </w:pPr>
-    </w:p>
-    <w:p>
-      <w:pPr>
-        <w:spacing w:after="0" w:line="240" w:lineRule="auto"/>
-        <w:jc w:val="both"/>
-        <w:rPr>
-          <w:rFonts w:ascii="Times New Roman" w:hAnsi="Times New Roman" w:cs="Times New Roman"/>
-          <w:b/>
-          <w:bCs/>
-          <w:sz w:val="26"/>
-          <w:szCs w:val="26"/>
-        </w:rPr>
-      </w:pPr>
-    </w:p>
-    <w:p>
-      <w:pPr>
-        <w:spacing w:after="0" w:line="240" w:lineRule="auto"/>
-        <w:jc w:val="both"/>
-        <w:rPr>
-          <w:rFonts w:ascii="Times New Roman" w:hAnsi="Times New Roman" w:cs="Times New Roman"/>
-          <w:b/>
-          <w:bCs/>
-          <w:sz w:val="26"/>
-          <w:szCs w:val="26"/>
-        </w:rPr>
-      </w:pPr>
-    </w:p>
-    <w:p>
-      <w:pPr>
-        <w:spacing w:after="0" w:line="240" w:lineRule="auto"/>
-        <w:jc w:val="both"/>
-        <w:rPr>
-          <w:rFonts w:ascii="Times New Roman" w:hAnsi="Times New Roman" w:cs="Times New Roman"/>
-          <w:b/>
-          <w:bCs/>
-          <w:sz w:val="26"/>
-          <w:szCs w:val="26"/>
-        </w:rPr>
-      </w:pPr>
-      <w:r>
-        <w:rPr>
-          <w:rFonts w:ascii="Times New Roman" w:hAnsi="Times New Roman" w:cs="Times New Roman"/>
-          <w:b/>
-          <w:bCs/>
-          <w:sz w:val="26"/>
-          <w:szCs w:val="26"/>
-        </w:rPr>
-        <w:t>RESULTS</w:t>
-      </w:r>
-    </w:p>
-    <w:p>
-      <w:pPr>
-        <w:spacing w:after="0" w:line="240" w:lineRule="auto"/>
-        <w:jc w:val="both"/>
-        <w:rPr>
-          <w:rFonts w:ascii="Times New Roman" w:hAnsi="Times New Roman" w:cs="Times New Roman"/>
-          <w:b/>
-          <w:bCs/>
-          <w:sz w:val="26"/>
-          <w:szCs w:val="26"/>
-        </w:rPr>
-      </w:pPr>
-      <w:r>
-        <w:rPr>
-          <w:rFonts w:ascii="Times New Roman" w:hAnsi="Times New Roman" w:cs="Times New Roman" w:hint="eastAsia"/>
-          <w:b/>
-          <w:bCs/>
-          <w:sz w:val="26"/>
-          <w:szCs w:val="26"/>
-        </w:rPr>
-        <w:t xml:space="preserve">Exploratory Data </w:t>
-      </w:r>
-      <w:r>
-        <w:rPr>
-          <w:rFonts w:ascii="Times New Roman" w:hAnsi="Times New Roman" w:cs="Times New Roman"/>
-          <w:b/>
-          <w:bCs/>
-          <w:sz w:val="26"/>
-          <w:szCs w:val="26"/>
-        </w:rPr>
-        <w:t>Analysis</w:t>
-      </w:r>
-      <w:r>
-        <w:rPr>
-          <w:rFonts w:ascii="Times New Roman" w:hAnsi="Times New Roman" w:cs="Times New Roman"/>
-          <w:b/>
-          <w:bCs/>
-          <w:sz w:val="26"/>
-          <w:szCs w:val="26"/>
-        </w:rPr>
-        <w:t xml:space="preserve"> (EDA):</w:t>
-      </w:r>
-    </w:p>
-    <w:p>
-      <w:pPr>
-        <w:spacing w:after="0" w:line="240" w:lineRule="auto"/>
-        <w:jc w:val="both"/>
-        <w:rPr>
-          <w:rFonts w:ascii="Times New Roman" w:hAnsi="Times New Roman" w:cs="Times New Roman"/>
-          <w:sz w:val="24"/>
-        </w:rPr>
-      </w:pPr>
       <w:r>
         <w:rPr>
           <w:rFonts w:ascii="Times New Roman" w:hAnsi="Times New Roman" w:cs="Times New Roman"/>
@@ -1850,17 +1401,8 @@
           <w:rStyle w:val="HTML"/>
           <w:rFonts w:ascii="Times New Roman" w:hAnsi="Times New Roman" w:cs="Times New Roman"/>
         </w:rPr>
-        <w:t>Report/</w:t>
-      </w:r>
-      <w:proofErr w:type="spellStart"/>
-      <w:r>
-        <w:rPr>
-          <w:rStyle w:val="HTML"/>
-          <w:rFonts w:ascii="Times New Roman" w:hAnsi="Times New Roman" w:cs="Times New Roman"/>
-        </w:rPr>
-        <w:t>Original_Dataset</w:t>
-      </w:r>
-      <w:proofErr w:type="spellEnd"/>
+        <w:t>Report/Original_Dataset</w:t>
+      </w:r>
       <w:r>
         <w:rPr>
           <w:rFonts w:ascii="Times New Roman" w:hAnsi="Times New Roman" w:cs="Times New Roman"/>
@@ -2295,7 +1837,6 @@
                 <w:lang w:val="fr-CA"/>
               </w:rPr>
             </w:pPr>
-            <w:proofErr w:type="spellStart"/>
             <w:r>
               <w:rPr>
                 <w:rFonts w:ascii="Times New Roman" w:hAnsi="Times New Roman" w:cs="Times New Roman"/>
@@ -2307,7 +1848,6 @@
               </w:rPr>
               <w:t>Sleep</w:t>
             </w:r>
-            <w:proofErr w:type="spellEnd"/>
             <w:r>
               <w:rPr>
                 <w:rFonts w:ascii="Times New Roman" w:hAnsi="Times New Roman" w:cs="Times New Roman" w:hint="eastAsia"/>
@@ -2319,7 +1859,6 @@
               </w:rPr>
               <w:t xml:space="preserve"> </w:t>
             </w:r>
-            <w:proofErr w:type="spellStart"/>
             <w:r>
               <w:rPr>
                 <w:rFonts w:ascii="Times New Roman" w:hAnsi="Times New Roman" w:cs="Times New Roman"/>
@@ -2331,7 +1870,6 @@
               </w:rPr>
               <w:t>Hours</w:t>
             </w:r>
-            <w:proofErr w:type="spellEnd"/>
           </w:p>
         </w:tc>
         <w:tc>
@@ -2509,7 +2047,6 @@
                 <w:lang w:val="fr-CA"/>
               </w:rPr>
             </w:pPr>
-            <w:proofErr w:type="spellStart"/>
             <w:r>
               <w:rPr>
                 <w:rFonts w:ascii="Times New Roman" w:hAnsi="Times New Roman" w:cs="Times New Roman"/>
@@ -2521,7 +2058,6 @@
               </w:rPr>
               <w:t>Sleep</w:t>
             </w:r>
-            <w:proofErr w:type="spellEnd"/>
             <w:r>
               <w:rPr>
                 <w:rFonts w:ascii="Times New Roman" w:hAnsi="Times New Roman" w:cs="Times New Roman" w:hint="eastAsia"/>
@@ -2533,7 +2069,6 @@
               </w:rPr>
               <w:t xml:space="preserve"> </w:t>
             </w:r>
-            <w:proofErr w:type="spellStart"/>
             <w:r>
               <w:rPr>
                 <w:rFonts w:ascii="Times New Roman" w:hAnsi="Times New Roman" w:cs="Times New Roman"/>
@@ -2545,7 +2080,6 @@
               </w:rPr>
               <w:t>Quality</w:t>
             </w:r>
-            <w:proofErr w:type="spellEnd"/>
           </w:p>
         </w:tc>
         <w:tc>
@@ -2726,7 +2260,6 @@
                 <w:lang w:val="fr-CA"/>
               </w:rPr>
             </w:pPr>
-            <w:proofErr w:type="spellStart"/>
             <w:r>
               <w:rPr>
                 <w:rFonts w:ascii="Times New Roman" w:hAnsi="Times New Roman" w:cs="Times New Roman"/>
@@ -2738,7 +2271,6 @@
               </w:rPr>
               <w:t>Daytime</w:t>
             </w:r>
-            <w:proofErr w:type="spellEnd"/>
             <w:r>
               <w:rPr>
                 <w:rFonts w:ascii="Times New Roman" w:hAnsi="Times New Roman" w:cs="Times New Roman" w:hint="eastAsia"/>
@@ -2750,7 +2282,6 @@
               </w:rPr>
               <w:t xml:space="preserve"> </w:t>
             </w:r>
-            <w:proofErr w:type="spellStart"/>
             <w:r>
               <w:rPr>
                 <w:rFonts w:ascii="Times New Roman" w:hAnsi="Times New Roman" w:cs="Times New Roman"/>
@@ -2762,7 +2293,6 @@
               </w:rPr>
               <w:t>Sleepness</w:t>
             </w:r>
-            <w:proofErr w:type="spellEnd"/>
           </w:p>
         </w:tc>
         <w:tc>
@@ -2950,7 +2480,6 @@
               </w:rPr>
               <w:t>Stroop</w:t>
             </w:r>
-            <w:proofErr w:type="spellStart"/>
             <w:r>
               <w:rPr>
                 <w:rFonts w:ascii="Times New Roman" w:hAnsi="Times New Roman" w:cs="Times New Roman"/>
@@ -2962,7 +2491,6 @@
               </w:rPr>
               <w:t>Task</w:t>
             </w:r>
-            <w:proofErr w:type="spellEnd"/>
             <w:r>
               <w:rPr>
                 <w:rFonts w:ascii="Times New Roman" w:hAnsi="Times New Roman" w:cs="Times New Roman" w:hint="eastAsia"/>
@@ -2974,7 +2502,6 @@
               </w:rPr>
               <w:t xml:space="preserve"> </w:t>
             </w:r>
-            <w:proofErr w:type="spellStart"/>
             <w:r>
               <w:rPr>
                 <w:rFonts w:ascii="Times New Roman" w:hAnsi="Times New Roman" w:cs="Times New Roman"/>
@@ -2997,7 +2524,6 @@
               </w:rPr>
               <w:t>n</w:t>
             </w:r>
-            <w:proofErr w:type="spellEnd"/>
             <w:r>
               <w:rPr>
                 <w:rFonts w:ascii="Times New Roman" w:hAnsi="Times New Roman" w:cs="Times New Roman"/>
@@ -3244,7 +2770,6 @@
               </w:rPr>
               <w:t xml:space="preserve"> </w:t>
             </w:r>
-            <w:proofErr w:type="spellStart"/>
             <w:r>
               <w:rPr>
                 <w:rFonts w:ascii="Times New Roman" w:hAnsi="Times New Roman" w:cs="Times New Roman"/>
@@ -3256,7 +2781,6 @@
               </w:rPr>
               <w:t>Accuracy</w:t>
             </w:r>
-            <w:proofErr w:type="spellEnd"/>
           </w:p>
         </w:tc>
         <w:tc>
@@ -3454,7 +2978,6 @@
               </w:rPr>
               <w:t xml:space="preserve"> </w:t>
             </w:r>
-            <w:proofErr w:type="spellStart"/>
             <w:r>
               <w:rPr>
                 <w:rFonts w:ascii="Times New Roman" w:hAnsi="Times New Roman" w:cs="Times New Roman"/>
@@ -3466,7 +2989,6 @@
               </w:rPr>
               <w:t>Regulation</w:t>
             </w:r>
-            <w:proofErr w:type="spellEnd"/>
             <w:r>
               <w:rPr>
                 <w:rFonts w:ascii="Times New Roman" w:hAnsi="Times New Roman" w:cs="Times New Roman"/>
@@ -3691,7 +3213,6 @@
               </w:rPr>
               <w:t xml:space="preserve"> </w:t>
             </w:r>
-            <w:proofErr w:type="spellStart"/>
             <w:r>
               <w:rPr>
                 <w:rFonts w:ascii="Times New Roman" w:hAnsi="Times New Roman" w:cs="Times New Roman"/>
@@ -3703,7 +3224,6 @@
               </w:rPr>
               <w:t>Reaction</w:t>
             </w:r>
-            <w:proofErr w:type="spellEnd"/>
             <w:r>
               <w:rPr>
                 <w:rFonts w:ascii="Times New Roman" w:hAnsi="Times New Roman" w:cs="Times New Roman"/>
@@ -4282,7 +3802,6 @@
                 <w:lang w:val="fr-CA"/>
               </w:rPr>
             </w:pPr>
-            <w:proofErr w:type="spellStart"/>
             <w:r>
               <w:rPr>
                 <w:rFonts w:ascii="Times New Roman" w:hAnsi="Times New Roman" w:cs="Times New Roman"/>
@@ -4294,7 +3813,6 @@
               </w:rPr>
               <w:t>Caffeine</w:t>
             </w:r>
-            <w:proofErr w:type="spellEnd"/>
             <w:r>
               <w:rPr>
                 <w:rFonts w:ascii="Times New Roman" w:hAnsi="Times New Roman" w:cs="Times New Roman"/>
@@ -4306,7 +3824,6 @@
               </w:rPr>
               <w:t xml:space="preserve"> </w:t>
             </w:r>
-            <w:proofErr w:type="spellStart"/>
             <w:r>
               <w:rPr>
                 <w:rFonts w:ascii="Times New Roman" w:hAnsi="Times New Roman" w:cs="Times New Roman"/>
@@ -4318,7 +3835,6 @@
               </w:rPr>
               <w:t>Intake</w:t>
             </w:r>
-            <w:proofErr w:type="spellEnd"/>
           </w:p>
         </w:tc>
         <w:tc>
@@ -4543,7 +4059,6 @@
               </w:rPr>
               <w:t xml:space="preserve"> </w:t>
             </w:r>
-            <w:proofErr w:type="spellStart"/>
             <w:r>
               <w:rPr>
                 <w:rFonts w:ascii="Times New Roman" w:hAnsi="Times New Roman" w:cs="Times New Roman"/>
@@ -4555,7 +4070,6 @@
               </w:rPr>
               <w:t>Level</w:t>
             </w:r>
-            <w:proofErr w:type="spellEnd"/>
           </w:p>
         </w:tc>
         <w:tc>
@@ -4755,7 +4269,6 @@
               </w:rPr>
               <w:t xml:space="preserve"> </w:t>
             </w:r>
-            <w:proofErr w:type="spellStart"/>
             <w:r>
               <w:rPr>
                 <w:rFonts w:ascii="Times New Roman" w:hAnsi="Times New Roman" w:cs="Times New Roman"/>
@@ -4767,7 +4280,6 @@
               </w:rPr>
               <w:t>Level</w:t>
             </w:r>
-            <w:proofErr w:type="spellEnd"/>
           </w:p>
         </w:tc>
         <w:tc>
@@ -5381,20 +4893,7 @@
           <w:sz w:val="24"/>
           <w:shd w:val="clear" w:color="auto" w:fill="FFFFFF"/>
         </w:rPr>
-        <w:t xml:space="preserve">eed for </w:t>
-      </w:r>
-      <w:r>
-        <w:rPr>
-          <w:rStyle w:val="af2"/>
-          <w:rFonts w:ascii="Times New Roman" w:hAnsi="Times New Roman" w:cs="Times New Roman"/>
-          <w:i w:val="0"/>
-          <w:iCs w:val="0"/>
-          <w:color w:val="0F1115"/>
-          <w:sz w:val="24"/>
-          <w:shd w:val="clear" w:color="auto" w:fill="FFFFFF"/>
-        </w:rPr>
-        <w:lastRenderedPageBreak/>
-        <w:t xml:space="preserve">variable transformations. </w:t>
+        <w:t xml:space="preserve">eed for variable transformations. </w:t>
       </w:r>
       <w:r>
         <w:rPr>
@@ -5488,7 +4987,15 @@
           <w:rFonts w:ascii="Times New Roman" w:hAnsi="Times New Roman" w:cs="Times New Roman"/>
           <w:sz w:val="24"/>
         </w:rPr>
-        <w:t xml:space="preserve">he CMH indicates that the magnitude of the observed standardized correlations was generally small and that none of them were statistically significant, suggesting that, in the present sample, there was insufficient evidence to support non-zero population-level pairwise correlations among the examined variables. However, diagnostic assessment remains necessary because the validity of correlation-based inference depends on relevant statistical assumptions, and the absence of statistically significant zero-order correlations does not preclude the usefulness of further model-based analyses </w:t>
+        <w:t xml:space="preserve">he CMH indicates that the magnitude of the observed standardized correlations was generally small and that none of them were statistically significant, </w:t>
+      </w:r>
+      <w:r>
+        <w:rPr>
+          <w:rFonts w:ascii="Times New Roman" w:hAnsi="Times New Roman" w:cs="Times New Roman"/>
+          <w:sz w:val="24"/>
+        </w:rPr>
+        <w:lastRenderedPageBreak/>
+        <w:t xml:space="preserve">suggesting that, in the present sample, there was insufficient evidence to support non-zero population-level pairwise correlations among the examined variables. However, diagnostic assessment remains necessary because the validity of correlation-based inference depends on relevant statistical assumptions, and the absence of statistically significant zero-order correlations does not preclude the usefulness of further model-based analyses </w:t>
       </w:r>
       <w:r>
         <w:rPr>
@@ -5803,14 +5310,7 @@
         <w:rPr>
           <w:rFonts w:ascii="Times New Roman" w:hAnsi="Times New Roman" w:cs="Times New Roman"/>
         </w:rPr>
-        <w:t xml:space="preserve">e.g. 0 sleep hours, emotional regulation scores and stress level are meaningless and </w:t>
-      </w:r>
-      <w:r>
-        <w:rPr>
-          <w:rFonts w:ascii="Times New Roman" w:hAnsi="Times New Roman" w:cs="Times New Roman"/>
-        </w:rPr>
-        <w:lastRenderedPageBreak/>
-        <w:t xml:space="preserve">unrealistic), </w:t>
+        <w:t xml:space="preserve">e.g. 0 sleep hours, emotional regulation scores and stress level are meaningless and unrealistic), </w:t>
       </w:r>
       <w:r>
         <w:rPr>
@@ -5845,6 +5345,7 @@
         <w:rPr>
           <w:rFonts w:ascii="Times New Roman" w:hAnsi="Times New Roman" w:cs="Times New Roman"/>
         </w:rPr>
+        <w:lastRenderedPageBreak/>
         <w:t>The PSS-10 provides a basis for transforming continuous stress-level scores into a categorical variable. A commonly used PSS-10 categorization criterion</w:t>
       </w:r>
       <w:r>
@@ -6053,7 +5554,6 @@
                 <w:lang w:val="fr-CA"/>
               </w:rPr>
             </w:pPr>
-            <w:proofErr w:type="spellStart"/>
             <w:r>
               <w:rPr>
                 <w:rFonts w:ascii="Times New Roman" w:hAnsi="Times New Roman" w:cs="Times New Roman"/>
@@ -6074,33 +5574,8 @@
                 <w:szCs w:val="20"/>
                 <w:lang w:val="fr-CA"/>
               </w:rPr>
-              <w:t>Sleep</w:t>
-            </w:r>
-            <w:proofErr w:type="spellEnd"/>
-            <w:r>
-              <w:rPr>
-                <w:rFonts w:ascii="Times New Roman" w:hAnsi="Times New Roman" w:cs="Times New Roman"/>
-                <w:b w:val="0"/>
-                <w:bCs w:val="0"/>
-                <w:sz w:val="20"/>
-                <w:szCs w:val="20"/>
-                <w:lang w:val="fr-CA"/>
-              </w:rPr>
-              <w:t xml:space="preserve"> </w:t>
-            </w:r>
-            <w:proofErr w:type="spellStart"/>
-            <w:r>
-              <w:rPr>
-                <w:rFonts w:ascii="Times New Roman" w:hAnsi="Times New Roman" w:cs="Times New Roman"/>
-                <w:b w:val="0"/>
-                <w:bCs w:val="0"/>
-                <w:sz w:val="20"/>
-                <w:szCs w:val="20"/>
-                <w:lang w:val="fr-CA"/>
-              </w:rPr>
-              <w:t>Hours</w:t>
-            </w:r>
-            <w:proofErr w:type="spellEnd"/>
+              <w:t>Sleep Hours</w:t>
+            </w:r>
           </w:p>
         </w:tc>
         <w:tc>
@@ -6202,7 +5677,6 @@
                 <w:szCs w:val="20"/>
               </w:rPr>
             </w:pPr>
-            <w:proofErr w:type="spellStart"/>
             <w:r>
               <w:rPr>
                 <w:rFonts w:ascii="Times New Roman" w:hAnsi="Times New Roman" w:cs="Times New Roman"/>
@@ -6221,18 +5695,7 @@
                 <w:sz w:val="20"/>
                 <w:szCs w:val="20"/>
               </w:rPr>
-              <w:t>Emotion</w:t>
-            </w:r>
-            <w:proofErr w:type="spellEnd"/>
-            <w:r>
-              <w:rPr>
-                <w:rFonts w:ascii="Times New Roman" w:hAnsi="Times New Roman" w:cs="Times New Roman"/>
-                <w:b w:val="0"/>
-                <w:bCs w:val="0"/>
-                <w:sz w:val="20"/>
-                <w:szCs w:val="20"/>
-              </w:rPr>
-              <w:t xml:space="preserve"> Regulation Scores</w:t>
+              <w:t>Emotion Regulation Scores</w:t>
             </w:r>
           </w:p>
         </w:tc>
@@ -6336,7 +5799,6 @@
                 <w:lang w:val="fr-CA"/>
               </w:rPr>
             </w:pPr>
-            <w:proofErr w:type="spellStart"/>
             <w:r>
               <w:rPr>
                 <w:rFonts w:ascii="Times New Roman" w:hAnsi="Times New Roman" w:cs="Times New Roman"/>
@@ -6346,10 +5808,98 @@
                 <w:szCs w:val="20"/>
                 <w:lang w:val="fr-CA"/>
               </w:rPr>
-              <w:t>C_Stress_Level</w:t>
-            </w:r>
-            <w:proofErr w:type="spellEnd"/>
-            <w:r>
+              <w:t>C_Stress_Level Scores</w:t>
+            </w:r>
+          </w:p>
+        </w:tc>
+        <w:tc>
+          <w:tcPr>
+            <w:tcW w:w="2074" w:type="dxa"/>
+          </w:tcPr>
+          <w:p>
+            <w:pPr>
+              <w:jc w:val="center"/>
+              <w:cnfStyle w:val="000000100000" w:firstRow="0" w:lastRow="0" w:firstColumn="0" w:lastColumn="0" w:oddVBand="0" w:evenVBand="0" w:oddHBand="1" w:evenHBand="0" w:firstRowFirstColumn="0" w:firstRowLastColumn="0" w:lastRowFirstColumn="0" w:lastRowLastColumn="0"/>
+              <w:rPr>
+                <w:rFonts w:ascii="Times New Roman" w:hAnsi="Times New Roman" w:cs="Times New Roman"/>
+                <w:sz w:val="20"/>
+                <w:szCs w:val="20"/>
+                <w:lang w:val="fr-CA"/>
+              </w:rPr>
+            </w:pPr>
+            <w:r>
+              <w:rPr>
+                <w:rFonts w:ascii="Times New Roman" w:hAnsi="Times New Roman" w:cs="Times New Roman"/>
+                <w:sz w:val="20"/>
+                <w:szCs w:val="20"/>
+                <w:lang w:val="fr-CA"/>
+              </w:rPr>
+              <w:t>0.0</w:t>
+            </w:r>
+          </w:p>
+        </w:tc>
+        <w:tc>
+          <w:tcPr>
+            <w:tcW w:w="2074" w:type="dxa"/>
+          </w:tcPr>
+          <w:p>
+            <w:pPr>
+              <w:jc w:val="center"/>
+              <w:cnfStyle w:val="000000100000" w:firstRow="0" w:lastRow="0" w:firstColumn="0" w:lastColumn="0" w:oddVBand="0" w:evenVBand="0" w:oddHBand="1" w:evenHBand="0" w:firstRowFirstColumn="0" w:firstRowLastColumn="0" w:lastRowFirstColumn="0" w:lastRowLastColumn="0"/>
+              <w:rPr>
+                <w:rFonts w:ascii="Times New Roman" w:hAnsi="Times New Roman" w:cs="Times New Roman"/>
+                <w:sz w:val="20"/>
+                <w:szCs w:val="20"/>
+                <w:lang w:val="fr-CA"/>
+              </w:rPr>
+            </w:pPr>
+            <w:r>
+              <w:rPr>
+                <w:rFonts w:ascii="Times New Roman" w:hAnsi="Times New Roman" w:cs="Times New Roman"/>
+                <w:sz w:val="20"/>
+                <w:szCs w:val="20"/>
+                <w:lang w:val="fr-CA"/>
+              </w:rPr>
+              <w:t>121.3</w:t>
+            </w:r>
+          </w:p>
+        </w:tc>
+        <w:tc>
+          <w:tcPr>
+            <w:tcW w:w="1433" w:type="dxa"/>
+          </w:tcPr>
+          <w:p>
+            <w:pPr>
+              <w:jc w:val="center"/>
+              <w:cnfStyle w:val="000000100000" w:firstRow="0" w:lastRow="0" w:firstColumn="0" w:lastColumn="0" w:oddVBand="0" w:evenVBand="0" w:oddHBand="1" w:evenHBand="0" w:firstRowFirstColumn="0" w:firstRowLastColumn="0" w:lastRowFirstColumn="0" w:lastRowLastColumn="0"/>
+              <w:rPr>
+                <w:rFonts w:ascii="Times New Roman" w:hAnsi="Times New Roman" w:cs="Times New Roman"/>
+                <w:sz w:val="20"/>
+                <w:szCs w:val="20"/>
+                <w:lang w:val="fr-CA"/>
+              </w:rPr>
+            </w:pPr>
+            <w:r>
+              <w:rPr>
+                <w:rFonts w:ascii="Times New Roman" w:hAnsi="Times New Roman" w:cs="Times New Roman"/>
+                <w:sz w:val="20"/>
+                <w:szCs w:val="20"/>
+                <w:lang w:val="fr-CA"/>
+              </w:rPr>
+              <w:t>11.0</w:t>
+            </w:r>
+          </w:p>
+        </w:tc>
+      </w:tr>
+      <w:tr>
+        <w:tc>
+          <w:tcPr>
+            <w:cnfStyle w:val="001000000000" w:firstRow="0" w:lastRow="0" w:firstColumn="1" w:lastColumn="0" w:oddVBand="0" w:evenVBand="0" w:oddHBand="0" w:evenHBand="0" w:firstRowFirstColumn="0" w:firstRowLastColumn="0" w:lastRowFirstColumn="0" w:lastRowLastColumn="0"/>
+            <w:tcW w:w="2641" w:type="dxa"/>
+          </w:tcPr>
+          <w:p>
+            <w:pPr>
+              <w:jc w:val="both"/>
               <w:rPr>
                 <w:rFonts w:ascii="Times New Roman" w:hAnsi="Times New Roman" w:cs="Times New Roman"/>
                 <w:b w:val="0"/>
@@ -6358,98 +5908,8 @@
                 <w:szCs w:val="20"/>
                 <w:lang w:val="fr-CA"/>
               </w:rPr>
-              <w:t xml:space="preserve"> Scores</w:t>
-            </w:r>
-          </w:p>
-        </w:tc>
-        <w:tc>
-          <w:tcPr>
-            <w:tcW w:w="2074" w:type="dxa"/>
-          </w:tcPr>
-          <w:p>
-            <w:pPr>
-              <w:jc w:val="center"/>
-              <w:cnfStyle w:val="000000100000" w:firstRow="0" w:lastRow="0" w:firstColumn="0" w:lastColumn="0" w:oddVBand="0" w:evenVBand="0" w:oddHBand="1" w:evenHBand="0" w:firstRowFirstColumn="0" w:firstRowLastColumn="0" w:lastRowFirstColumn="0" w:lastRowLastColumn="0"/>
-              <w:rPr>
-                <w:rFonts w:ascii="Times New Roman" w:hAnsi="Times New Roman" w:cs="Times New Roman"/>
-                <w:sz w:val="20"/>
-                <w:szCs w:val="20"/>
-                <w:lang w:val="fr-CA"/>
-              </w:rPr>
-            </w:pPr>
-            <w:r>
-              <w:rPr>
-                <w:rFonts w:ascii="Times New Roman" w:hAnsi="Times New Roman" w:cs="Times New Roman"/>
-                <w:sz w:val="20"/>
-                <w:szCs w:val="20"/>
-                <w:lang w:val="fr-CA"/>
-              </w:rPr>
-              <w:t>0.0</w:t>
-            </w:r>
-          </w:p>
-        </w:tc>
-        <w:tc>
-          <w:tcPr>
-            <w:tcW w:w="2074" w:type="dxa"/>
-          </w:tcPr>
-          <w:p>
-            <w:pPr>
-              <w:jc w:val="center"/>
-              <w:cnfStyle w:val="000000100000" w:firstRow="0" w:lastRow="0" w:firstColumn="0" w:lastColumn="0" w:oddVBand="0" w:evenVBand="0" w:oddHBand="1" w:evenHBand="0" w:firstRowFirstColumn="0" w:firstRowLastColumn="0" w:lastRowFirstColumn="0" w:lastRowLastColumn="0"/>
-              <w:rPr>
-                <w:rFonts w:ascii="Times New Roman" w:hAnsi="Times New Roman" w:cs="Times New Roman"/>
-                <w:sz w:val="20"/>
-                <w:szCs w:val="20"/>
-                <w:lang w:val="fr-CA"/>
-              </w:rPr>
-            </w:pPr>
-            <w:r>
-              <w:rPr>
-                <w:rFonts w:ascii="Times New Roman" w:hAnsi="Times New Roman" w:cs="Times New Roman"/>
-                <w:sz w:val="20"/>
-                <w:szCs w:val="20"/>
-                <w:lang w:val="fr-CA"/>
-              </w:rPr>
-              <w:t>121.3</w:t>
-            </w:r>
-          </w:p>
-        </w:tc>
-        <w:tc>
-          <w:tcPr>
-            <w:tcW w:w="1433" w:type="dxa"/>
-          </w:tcPr>
-          <w:p>
-            <w:pPr>
-              <w:jc w:val="center"/>
-              <w:cnfStyle w:val="000000100000" w:firstRow="0" w:lastRow="0" w:firstColumn="0" w:lastColumn="0" w:oddVBand="0" w:evenVBand="0" w:oddHBand="1" w:evenHBand="0" w:firstRowFirstColumn="0" w:firstRowLastColumn="0" w:lastRowFirstColumn="0" w:lastRowLastColumn="0"/>
-              <w:rPr>
-                <w:rFonts w:ascii="Times New Roman" w:hAnsi="Times New Roman" w:cs="Times New Roman"/>
-                <w:sz w:val="20"/>
-                <w:szCs w:val="20"/>
-                <w:lang w:val="fr-CA"/>
-              </w:rPr>
-            </w:pPr>
-            <w:r>
-              <w:rPr>
-                <w:rFonts w:ascii="Times New Roman" w:hAnsi="Times New Roman" w:cs="Times New Roman"/>
-                <w:sz w:val="20"/>
-                <w:szCs w:val="20"/>
-                <w:lang w:val="fr-CA"/>
-              </w:rPr>
-              <w:t>11.0</w:t>
-            </w:r>
-          </w:p>
-        </w:tc>
-      </w:tr>
-      <w:tr>
-        <w:tc>
-          <w:tcPr>
-            <w:cnfStyle w:val="001000000000" w:firstRow="0" w:lastRow="0" w:firstColumn="1" w:lastColumn="0" w:oddVBand="0" w:evenVBand="0" w:oddHBand="0" w:evenHBand="0" w:firstRowFirstColumn="0" w:firstRowLastColumn="0" w:lastRowFirstColumn="0" w:lastRowLastColumn="0"/>
-            <w:tcW w:w="2641" w:type="dxa"/>
-          </w:tcPr>
-          <w:p>
-            <w:pPr>
-              <w:jc w:val="both"/>
+            </w:pPr>
+            <w:r>
               <w:rPr>
                 <w:rFonts w:ascii="Times New Roman" w:hAnsi="Times New Roman" w:cs="Times New Roman"/>
                 <w:b w:val="0"/>
@@ -6458,54 +5918,7 @@
                 <w:szCs w:val="20"/>
                 <w:lang w:val="fr-CA"/>
               </w:rPr>
-            </w:pPr>
-            <w:proofErr w:type="spellStart"/>
-            <w:r>
-              <w:rPr>
-                <w:rFonts w:ascii="Times New Roman" w:hAnsi="Times New Roman" w:cs="Times New Roman"/>
-                <w:b w:val="0"/>
-                <w:bCs w:val="0"/>
-                <w:sz w:val="20"/>
-                <w:szCs w:val="20"/>
-                <w:lang w:val="fr-CA"/>
-              </w:rPr>
-              <w:t>Emotion</w:t>
-            </w:r>
-            <w:proofErr w:type="spellEnd"/>
-            <w:r>
-              <w:rPr>
-                <w:rFonts w:ascii="Times New Roman" w:hAnsi="Times New Roman" w:cs="Times New Roman"/>
-                <w:b w:val="0"/>
-                <w:bCs w:val="0"/>
-                <w:sz w:val="20"/>
-                <w:szCs w:val="20"/>
-                <w:lang w:val="fr-CA"/>
-              </w:rPr>
-              <w:t xml:space="preserve"> </w:t>
-            </w:r>
-            <w:proofErr w:type="spellStart"/>
-            <w:r>
-              <w:rPr>
-                <w:rFonts w:ascii="Times New Roman" w:hAnsi="Times New Roman" w:cs="Times New Roman"/>
-                <w:b w:val="0"/>
-                <w:bCs w:val="0"/>
-                <w:sz w:val="20"/>
-                <w:szCs w:val="20"/>
-                <w:lang w:val="fr-CA"/>
-              </w:rPr>
-              <w:t>Regualtion</w:t>
-            </w:r>
-            <w:proofErr w:type="spellEnd"/>
-            <w:r>
-              <w:rPr>
-                <w:rFonts w:ascii="Times New Roman" w:hAnsi="Times New Roman" w:cs="Times New Roman"/>
-                <w:b w:val="0"/>
-                <w:bCs w:val="0"/>
-                <w:sz w:val="20"/>
-                <w:szCs w:val="20"/>
-                <w:lang w:val="fr-CA"/>
-              </w:rPr>
-              <w:t xml:space="preserve"> Scores</w:t>
+              <w:t>Emotion Regualtion Scores</w:t>
             </w:r>
           </w:p>
         </w:tc>
@@ -6618,55 +6031,7 @@
                 <w:szCs w:val="20"/>
                 <w:lang w:val="fr-CA"/>
               </w:rPr>
-              <w:t xml:space="preserve">Stroop </w:t>
-            </w:r>
-            <w:proofErr w:type="spellStart"/>
-            <w:r>
-              <w:rPr>
-                <w:rFonts w:ascii="Times New Roman" w:hAnsi="Times New Roman" w:cs="Times New Roman"/>
-                <w:b w:val="0"/>
-                <w:bCs w:val="0"/>
-                <w:sz w:val="20"/>
-                <w:szCs w:val="20"/>
-                <w:lang w:val="fr-CA"/>
-              </w:rPr>
-              <w:t>Task</w:t>
-            </w:r>
-            <w:proofErr w:type="spellEnd"/>
-            <w:r>
-              <w:rPr>
-                <w:rFonts w:ascii="Times New Roman" w:hAnsi="Times New Roman" w:cs="Times New Roman"/>
-                <w:b w:val="0"/>
-                <w:bCs w:val="0"/>
-                <w:sz w:val="20"/>
-                <w:szCs w:val="20"/>
-                <w:lang w:val="fr-CA"/>
-              </w:rPr>
-              <w:t xml:space="preserve"> </w:t>
-            </w:r>
-            <w:proofErr w:type="spellStart"/>
-            <w:r>
-              <w:rPr>
-                <w:rFonts w:ascii="Times New Roman" w:hAnsi="Times New Roman" w:cs="Times New Roman"/>
-                <w:b w:val="0"/>
-                <w:bCs w:val="0"/>
-                <w:sz w:val="20"/>
-                <w:szCs w:val="20"/>
-                <w:lang w:val="fr-CA"/>
-              </w:rPr>
-              <w:t>Reaction</w:t>
-            </w:r>
-            <w:proofErr w:type="spellEnd"/>
-            <w:r>
-              <w:rPr>
-                <w:rFonts w:ascii="Times New Roman" w:hAnsi="Times New Roman" w:cs="Times New Roman"/>
-                <w:b w:val="0"/>
-                <w:bCs w:val="0"/>
-                <w:sz w:val="20"/>
-                <w:szCs w:val="20"/>
-                <w:lang w:val="fr-CA"/>
-              </w:rPr>
-              <w:t xml:space="preserve"> Time</w:t>
+              <w:t>Stroop Task Reaction Time</w:t>
             </w:r>
           </w:p>
         </w:tc>
@@ -6911,31 +6276,7 @@
                 <w:szCs w:val="20"/>
                 <w:lang w:val="fr-CA"/>
               </w:rPr>
-              <w:t xml:space="preserve">PVT </w:t>
-            </w:r>
-            <w:proofErr w:type="spellStart"/>
-            <w:r>
-              <w:rPr>
-                <w:rFonts w:ascii="Times New Roman" w:hAnsi="Times New Roman" w:cs="Times New Roman"/>
-                <w:b w:val="0"/>
-                <w:bCs w:val="0"/>
-                <w:sz w:val="20"/>
-                <w:szCs w:val="20"/>
-                <w:lang w:val="fr-CA"/>
-              </w:rPr>
-              <w:t>Reaction</w:t>
-            </w:r>
-            <w:proofErr w:type="spellEnd"/>
-            <w:r>
-              <w:rPr>
-                <w:rFonts w:ascii="Times New Roman" w:hAnsi="Times New Roman" w:cs="Times New Roman"/>
-                <w:b w:val="0"/>
-                <w:bCs w:val="0"/>
-                <w:sz w:val="20"/>
-                <w:szCs w:val="20"/>
-                <w:lang w:val="fr-CA"/>
-              </w:rPr>
-              <w:t xml:space="preserve"> Time</w:t>
+              <w:t>PVT Reaction Time</w:t>
             </w:r>
           </w:p>
         </w:tc>
@@ -7042,61 +6383,7 @@
           <w:sz w:val="20"/>
           <w:szCs w:val="20"/>
         </w:rPr>
-        <w:t xml:space="preserve">te: </w:t>
-      </w:r>
-      <w:proofErr w:type="spellStart"/>
-      <w:r>
-        <w:rPr>
-          <w:rFonts w:ascii="Times New Roman" w:hAnsi="Times New Roman" w:cs="Times New Roman"/>
-          <w:sz w:val="20"/>
-          <w:szCs w:val="20"/>
-        </w:rPr>
-        <w:t>C_Sleep</w:t>
-      </w:r>
-      <w:proofErr w:type="spellEnd"/>
-      <w:r>
-        <w:rPr>
-          <w:rFonts w:ascii="Times New Roman" w:hAnsi="Times New Roman" w:cs="Times New Roman"/>
-          <w:sz w:val="20"/>
-          <w:szCs w:val="20"/>
-        </w:rPr>
-        <w:t xml:space="preserve"> hours, </w:t>
-      </w:r>
-      <w:proofErr w:type="spellStart"/>
-      <w:r>
-        <w:rPr>
-          <w:rFonts w:ascii="Times New Roman" w:hAnsi="Times New Roman" w:cs="Times New Roman"/>
-          <w:sz w:val="20"/>
-          <w:szCs w:val="20"/>
-        </w:rPr>
-        <w:t>C_emotion</w:t>
-      </w:r>
-      <w:proofErr w:type="spellEnd"/>
-      <w:r>
-        <w:rPr>
-          <w:rFonts w:ascii="Times New Roman" w:hAnsi="Times New Roman" w:cs="Times New Roman"/>
-          <w:sz w:val="20"/>
-          <w:szCs w:val="20"/>
-        </w:rPr>
-        <w:t xml:space="preserve"> regulation scores and </w:t>
-      </w:r>
-      <w:proofErr w:type="spellStart"/>
-      <w:r>
-        <w:rPr>
-          <w:rFonts w:ascii="Times New Roman" w:hAnsi="Times New Roman" w:cs="Times New Roman"/>
-          <w:sz w:val="20"/>
-          <w:szCs w:val="20"/>
-        </w:rPr>
-        <w:t>c_stress</w:t>
-      </w:r>
-      <w:proofErr w:type="spellEnd"/>
-      <w:r>
-        <w:rPr>
-          <w:rFonts w:ascii="Times New Roman" w:hAnsi="Times New Roman" w:cs="Times New Roman"/>
-          <w:sz w:val="20"/>
-          <w:szCs w:val="20"/>
-        </w:rPr>
-        <w:t xml:space="preserve"> level scores represents mean-centering predictors respectively</w:t>
+        <w:t>te: C_Sleep hours, C_emotion regulation scores and c_stress level scores represents mean-centering predictors respectively</w:t>
       </w:r>
     </w:p>
     <w:p>
@@ -7204,7 +6491,7 @@
           <w:sz w:val="26"/>
           <w:szCs w:val="26"/>
         </w:rPr>
-        <w:t>-Aim1 Analysis Results</w:t>
+        <w:t xml:space="preserve">-Aim1 Analysis </w:t>
       </w:r>
     </w:p>
     <w:p>
@@ -7212,7 +6499,7 @@
         <w:spacing w:after="0" w:line="240" w:lineRule="auto"/>
         <w:jc w:val="both"/>
         <w:rPr>
-          <w:rFonts w:ascii="Times New Roman" w:hAnsi="Times New Roman" w:cs="Times New Roman"/>
+          <w:rFonts w:ascii="Times New Roman" w:hAnsi="Times New Roman" w:cs="Times New Roman" w:hint="eastAsia"/>
           <w:b/>
           <w:bCs/>
           <w:sz w:val="26"/>
@@ -7227,7 +6514,7 @@
           <w:sz w:val="26"/>
           <w:szCs w:val="26"/>
         </w:rPr>
-        <w:t>-Aim2 Analysis Results</w:t>
+        <w:t>-Aim2 Analysis</w:t>
       </w:r>
     </w:p>
     <w:p>
@@ -7240,7 +6527,6 @@
           <w:bCs/>
           <w:sz w:val="26"/>
           <w:szCs w:val="26"/>
-          <w:lang w:val="fr-CA"/>
         </w:rPr>
       </w:pPr>
       <w:r>
@@ -7250,24 +6536,19 @@
           <w:bCs/>
           <w:sz w:val="26"/>
           <w:szCs w:val="26"/>
-          <w:lang w:val="fr-CA"/>
-        </w:rPr>
-        <w:t>-DISCUSSION</w:t>
-      </w:r>
-    </w:p>
-    <w:p>
-      <w:pPr>
-        <w:spacing w:after="0" w:line="240" w:lineRule="auto"/>
-        <w:jc w:val="both"/>
+        </w:rPr>
+        <w:t>-</w:t>
+      </w:r>
+      <w:r>
         <w:rPr>
           <w:rFonts w:ascii="Times New Roman" w:hAnsi="Times New Roman" w:cs="Times New Roman"/>
           <w:b/>
           <w:bCs/>
           <w:sz w:val="26"/>
           <w:szCs w:val="26"/>
-          <w:lang w:val="fr-CA"/>
-        </w:rPr>
-      </w:pPr>
+        </w:rPr>
+        <w:t xml:space="preserve">OVERALL </w:t>
+      </w:r>
       <w:r>
         <w:rPr>
           <w:rFonts w:ascii="Times New Roman" w:hAnsi="Times New Roman" w:cs="Times New Roman"/>
@@ -7275,10 +6556,8 @@
           <w:bCs/>
           <w:sz w:val="26"/>
           <w:szCs w:val="26"/>
-          <w:lang w:val="fr-CA"/>
-        </w:rPr>
-        <w:lastRenderedPageBreak/>
-        <w:t>-CONCLUSION</w:t>
+        </w:rPr>
+        <w:t>CONCLUSION</w:t>
       </w:r>
     </w:p>
     <w:p>
@@ -7293,7 +6572,6 @@
           <w:iCs/>
           <w:sz w:val="26"/>
           <w:szCs w:val="26"/>
-          <w:lang w:val="fr-CA"/>
         </w:rPr>
       </w:pPr>
       <w:r>
@@ -7303,7 +6581,6 @@
           <w:bCs/>
           <w:sz w:val="26"/>
           <w:szCs w:val="26"/>
-          <w:lang w:val="fr-CA"/>
         </w:rPr>
         <w:t>-LIMITATION</w:t>
       </w:r>

</xml_diff>

<commit_message>
aim2 specific introduction elboration
</commit_message>
<xml_diff>
--- a/Project1_Sleep_Deprivation_Cognition/Report/Analysis_Report.docx
+++ b/Project1_Sleep_Deprivation_Cognition/Report/Analysis_Report.docx
@@ -249,6 +249,7 @@
         </w:rPr>
         <w:t xml:space="preserve"> </w:t>
       </w:r>
+      <w:proofErr w:type="spellStart"/>
       <w:r>
         <w:rPr>
           <w:rFonts w:ascii="Times New Roman" w:hAnsi="Times New Roman" w:cs="Times New Roman"/>
@@ -256,6 +257,7 @@
         </w:rPr>
         <w:t>Github</w:t>
       </w:r>
+      <w:proofErr w:type="spellEnd"/>
     </w:p>
     <w:p>
       <w:pPr>
@@ -789,7 +791,35 @@
         <w:rPr>
           <w:rFonts w:ascii="Times New Roman" w:hAnsi="Times New Roman" w:cs="Times New Roman"/>
         </w:rPr>
-        <w:t>Cognitive processing is one of the most fundamental topics in psychology and neuroscience, as it provides a framework for understanding functionally segregated yet integrated information-processing mechanisms underlying how individuals interact with the surrounding environment (Frank &amp; Badre, 2015; Schall, 2004; Forstmann et al., 2011). Presented information may influence observable performance both directly, as the immediate input to cognitive processing, and indirectly, by interacting with the broader processing context under which cognition operates. For the present framework, this context includes both prior experience and the individual’s current internal state.</w:t>
+        <w:t xml:space="preserve">Cognitive processing is one of the most fundamental topics in psychology and neuroscience, as it provides a framework for understanding functionally segregated yet integrated information-processing mechanisms underlying how individuals interact with the surrounding environment (Frank &amp; </w:t>
+      </w:r>
+      <w:proofErr w:type="spellStart"/>
+      <w:r>
+        <w:rPr>
+          <w:rFonts w:ascii="Times New Roman" w:hAnsi="Times New Roman" w:cs="Times New Roman"/>
+        </w:rPr>
+        <w:t>Badre</w:t>
+      </w:r>
+      <w:proofErr w:type="spellEnd"/>
+      <w:r>
+        <w:rPr>
+          <w:rFonts w:ascii="Times New Roman" w:hAnsi="Times New Roman" w:cs="Times New Roman"/>
+        </w:rPr>
+        <w:t xml:space="preserve">, 2015; Schall, 2004; </w:t>
+      </w:r>
+      <w:proofErr w:type="spellStart"/>
+      <w:r>
+        <w:rPr>
+          <w:rFonts w:ascii="Times New Roman" w:hAnsi="Times New Roman" w:cs="Times New Roman"/>
+        </w:rPr>
+        <w:t>Forstmann</w:t>
+      </w:r>
+      <w:proofErr w:type="spellEnd"/>
+      <w:r>
+        <w:rPr>
+          <w:rFonts w:ascii="Times New Roman" w:hAnsi="Times New Roman" w:cs="Times New Roman"/>
+        </w:rPr>
+        <w:t xml:space="preserve"> et al., 2011). Presented information may influence observable performance both directly, as the immediate input to cognitive processing, and indirectly, by interacting with the broader processing context under which cognition operates. For the present framework, this context includes both prior experience and the individual’s current internal state.</w:t>
       </w:r>
     </w:p>
     <w:p>
@@ -806,14 +836,112 @@
         <w:rPr>
           <w:rFonts w:ascii="Times New Roman" w:hAnsi="Times New Roman" w:cs="Times New Roman"/>
         </w:rPr>
-        <w:t xml:space="preserve">Certain studies support a broader conceptualization of cognitive functioning as dynamically state- and context-dependent, such that processing outcomes may vary across contextual conditions even when the immediate processing input remains unchanged (Flavell et al., 2022; Gilbert &amp; Sigman, 2007). For the present analyses, these contextual contributors are broadly distinguished into two categories. Experience-related contributors refer to influences arising from prior experiences or interactions with the surrounding environment that subsequently shape cognitive functioning. Examples include insufficient sleep and body posture (Alhola &amp; Polo-Kantola, 2007; Khan &amp; Al-Jahdali, 2023; Wainio-Theberge &amp; Armony, 2025). In contrast, psychophysiological-state contributors refer to conditions manifested within the individual at psychological and/or physiological levels, such as emotional state, fatigue, or motivation (Flavell et al., 2022). For example, perception of emotional information may be biased by the perceiver’s current emotional state (Trilla et al., 2021; Harris et </w:t>
+        <w:t>Certain studies support a broader conceptualization of cognitive functioning as dynamically state- and context-dependent, such that processing outcomes may vary across contextual conditions even when the immediate processing input remains unchanged (Flavell et al., 2022; Gilbert &amp; Sigman, 2007). For the present analyses, these contextual contributors are broadly distinguished into two categories. Experience-related contributors refer to influences arising from prior experiences or interactions with the surrounding environment that subsequently shape cognitive functioning. Examples include insufficient sleep and body posture (</w:t>
+      </w:r>
+      <w:proofErr w:type="spellStart"/>
+      <w:r>
+        <w:rPr>
+          <w:rFonts w:ascii="Times New Roman" w:hAnsi="Times New Roman" w:cs="Times New Roman"/>
+        </w:rPr>
+        <w:t>Alhola</w:t>
+      </w:r>
+      <w:proofErr w:type="spellEnd"/>
+      <w:r>
+        <w:rPr>
+          <w:rFonts w:ascii="Times New Roman" w:hAnsi="Times New Roman" w:cs="Times New Roman"/>
+        </w:rPr>
+        <w:t xml:space="preserve"> &amp; Polo-</w:t>
+      </w:r>
+      <w:proofErr w:type="spellStart"/>
+      <w:r>
+        <w:rPr>
+          <w:rFonts w:ascii="Times New Roman" w:hAnsi="Times New Roman" w:cs="Times New Roman"/>
+        </w:rPr>
+        <w:t>Kantola</w:t>
+      </w:r>
+      <w:proofErr w:type="spellEnd"/>
+      <w:r>
+        <w:rPr>
+          <w:rFonts w:ascii="Times New Roman" w:hAnsi="Times New Roman" w:cs="Times New Roman"/>
+        </w:rPr>
+        <w:t>, 2007; Khan &amp; Al-</w:t>
+      </w:r>
+      <w:proofErr w:type="spellStart"/>
+      <w:r>
+        <w:rPr>
+          <w:rFonts w:ascii="Times New Roman" w:hAnsi="Times New Roman" w:cs="Times New Roman"/>
+        </w:rPr>
+        <w:t>Jahdali</w:t>
+      </w:r>
+      <w:proofErr w:type="spellEnd"/>
+      <w:r>
+        <w:rPr>
+          <w:rFonts w:ascii="Times New Roman" w:hAnsi="Times New Roman" w:cs="Times New Roman"/>
+        </w:rPr>
+        <w:t xml:space="preserve">, 2023; </w:t>
+      </w:r>
+      <w:proofErr w:type="spellStart"/>
+      <w:r>
+        <w:rPr>
+          <w:rFonts w:ascii="Times New Roman" w:hAnsi="Times New Roman" w:cs="Times New Roman"/>
+        </w:rPr>
+        <w:t>Wainio</w:t>
+      </w:r>
+      <w:proofErr w:type="spellEnd"/>
+      <w:r>
+        <w:rPr>
+          <w:rFonts w:ascii="Times New Roman" w:hAnsi="Times New Roman" w:cs="Times New Roman"/>
+        </w:rPr>
+        <w:t xml:space="preserve">-Theberge &amp; </w:t>
+      </w:r>
+      <w:proofErr w:type="spellStart"/>
+      <w:r>
+        <w:rPr>
+          <w:rFonts w:ascii="Times New Roman" w:hAnsi="Times New Roman" w:cs="Times New Roman"/>
+        </w:rPr>
+        <w:t>Armony</w:t>
+      </w:r>
+      <w:proofErr w:type="spellEnd"/>
+      <w:r>
+        <w:rPr>
+          <w:rFonts w:ascii="Times New Roman" w:hAnsi="Times New Roman" w:cs="Times New Roman"/>
+        </w:rPr>
+        <w:t>, 2025). In contrast, psychophysiological-state contributors refer to conditions manifested within the individual at psychological and/or physiological levels, such as emotional state, fatigue, or motivation (Flavell et al., 2022). For example, perception of emotional information may be biased by the perceiver’s current emotional state (</w:t>
+      </w:r>
+      <w:proofErr w:type="spellStart"/>
+      <w:r>
+        <w:rPr>
+          <w:rFonts w:ascii="Times New Roman" w:hAnsi="Times New Roman" w:cs="Times New Roman"/>
+        </w:rPr>
+        <w:t>Trilla</w:t>
+      </w:r>
+      <w:proofErr w:type="spellEnd"/>
+      <w:r>
+        <w:rPr>
+          <w:rFonts w:ascii="Times New Roman" w:hAnsi="Times New Roman" w:cs="Times New Roman"/>
+        </w:rPr>
+        <w:t xml:space="preserve"> et al., 2021; Harris et </w:t>
       </w:r>
       <w:r>
         <w:rPr>
           <w:rFonts w:ascii="Times New Roman" w:hAnsi="Times New Roman" w:cs="Times New Roman"/>
         </w:rPr>
         <w:lastRenderedPageBreak/>
-        <w:t>al., 2016). These contextual influences may operate partly through modulation of neural and physiological mechanisms underlying cognitive functioning. Importantly, the two categories are not necessarily independent: psychophysiological states may be elicited or modified by prior experience, while relatively persistent conditions such as trait anxiety or depressive states may continue to influence cognitive performance even without an immediate external trigger (Pacheco-Unguetti et al., 2010; Roca et al., 2015). Conversely, internal states may also shape subsequent interactions with the surrounding environment.</w:t>
+        <w:t>al., 2016). These contextual influences may operate partly through modulation of neural and physiological mechanisms underlying cognitive functioning. Importantly, the two categories are not necessarily independent: psychophysiological states may be elicited or modified by prior experience, while relatively persistent conditions such as trait anxiety or depressive states may continue to influence cognitive performance even without an immediate external trigger (Pacheco-</w:t>
+      </w:r>
+      <w:proofErr w:type="spellStart"/>
+      <w:r>
+        <w:rPr>
+          <w:rFonts w:ascii="Times New Roman" w:hAnsi="Times New Roman" w:cs="Times New Roman"/>
+        </w:rPr>
+        <w:t>Unguetti</w:t>
+      </w:r>
+      <w:proofErr w:type="spellEnd"/>
+      <w:r>
+        <w:rPr>
+          <w:rFonts w:ascii="Times New Roman" w:hAnsi="Times New Roman" w:cs="Times New Roman"/>
+        </w:rPr>
+        <w:t xml:space="preserve"> et al., 2010; Roca et al., 2015). Conversely, internal states may also shape subsequent interactions with the surrounding environment.</w:t>
       </w:r>
     </w:p>
     <w:p>
@@ -846,7 +974,63 @@
         <w:rPr>
           <w:rFonts w:ascii="Times New Roman" w:hAnsi="Times New Roman" w:cs="Times New Roman"/>
         </w:rPr>
-        <w:t>For the second purpose, sleep hours and stress-level scores were selected as representative experience-related and psychophysiological-state predictors, respectively. Previous studies have linked both factors to variation in cognitive functioning and performance across different cognitive tasks (Alhola &amp; Polo-Kantola, 2007; Khan &amp; Al-Jahdali, 2023; Nwikwe, 2025). The first specific aim was therefore to examine their independent contributions and combined explanatory value in relation to higher-order regulatory functioning. Emotion regulation was selected as the representative higher-order outcome because successful regulation relies on the coordination of cognitive processes including selective attention, working memory, and inhibitory control (Koay &amp; Meter, 2023).</w:t>
+        <w:t>For the second purpose, sleep hours and stress-level scores were selected as representative experience-related and psychophysiological-state predictors, respectively. Previous studies have linked both factors to variation in cognitive functioning and performance across different cognitive tasks (</w:t>
+      </w:r>
+      <w:proofErr w:type="spellStart"/>
+      <w:r>
+        <w:rPr>
+          <w:rFonts w:ascii="Times New Roman" w:hAnsi="Times New Roman" w:cs="Times New Roman"/>
+        </w:rPr>
+        <w:t>Alhola</w:t>
+      </w:r>
+      <w:proofErr w:type="spellEnd"/>
+      <w:r>
+        <w:rPr>
+          <w:rFonts w:ascii="Times New Roman" w:hAnsi="Times New Roman" w:cs="Times New Roman"/>
+        </w:rPr>
+        <w:t xml:space="preserve"> &amp; Polo-</w:t>
+      </w:r>
+      <w:proofErr w:type="spellStart"/>
+      <w:r>
+        <w:rPr>
+          <w:rFonts w:ascii="Times New Roman" w:hAnsi="Times New Roman" w:cs="Times New Roman"/>
+        </w:rPr>
+        <w:t>Kantola</w:t>
+      </w:r>
+      <w:proofErr w:type="spellEnd"/>
+      <w:r>
+        <w:rPr>
+          <w:rFonts w:ascii="Times New Roman" w:hAnsi="Times New Roman" w:cs="Times New Roman"/>
+        </w:rPr>
+        <w:t>, 2007; Khan &amp; Al-</w:t>
+      </w:r>
+      <w:proofErr w:type="spellStart"/>
+      <w:r>
+        <w:rPr>
+          <w:rFonts w:ascii="Times New Roman" w:hAnsi="Times New Roman" w:cs="Times New Roman"/>
+        </w:rPr>
+        <w:t>Jahdali</w:t>
+      </w:r>
+      <w:proofErr w:type="spellEnd"/>
+      <w:r>
+        <w:rPr>
+          <w:rFonts w:ascii="Times New Roman" w:hAnsi="Times New Roman" w:cs="Times New Roman"/>
+        </w:rPr>
+        <w:t xml:space="preserve">, 2023; </w:t>
+      </w:r>
+      <w:proofErr w:type="spellStart"/>
+      <w:r>
+        <w:rPr>
+          <w:rFonts w:ascii="Times New Roman" w:hAnsi="Times New Roman" w:cs="Times New Roman"/>
+        </w:rPr>
+        <w:t>Nwikwe</w:t>
+      </w:r>
+      <w:proofErr w:type="spellEnd"/>
+      <w:r>
+        <w:rPr>
+          <w:rFonts w:ascii="Times New Roman" w:hAnsi="Times New Roman" w:cs="Times New Roman"/>
+        </w:rPr>
+        <w:t>, 2025). The first specific aim was therefore to examine their independent contributions and combined explanatory value in relation to higher-order regulatory functioning. Emotion regulation was selected as the representative higher-order outcome because successful regulation relies on the coordination of cognitive processes including selective attention, working memory, and inhibitory control (Koay &amp; Meter, 2023).</w:t>
       </w:r>
     </w:p>
     <w:p>
@@ -863,7 +1047,31 @@
         <w:rPr>
           <w:rFonts w:ascii="Times New Roman" w:hAnsi="Times New Roman" w:cs="Times New Roman"/>
         </w:rPr>
-        <w:t>The dataset also contains task-based measures of more basic cognitive functions. Stroop task reaction time (RT), N-back accuracy, and psychomotor vigilance test (PVT) RT are expected to primarily reflect selective attention and inhibition, working memory, and sustained attention and behavioral alertness, respectively (Basner et al., 2021; Owen et al., 2005; Scarpina &amp; Tagini, 2017). This motivated the second aim: to examine whether these cognitive-performance measures could be reasonably summarized into a broader common dimension while retaining meaningful information from the original measures. If such a dimension could not be supported, the individual cognitive outcomes would instead be retained and examined separately. Subsequent model-based analyses were then used to examine theoretically relevant associations with these cognitive outcomes.</w:t>
+        <w:t>The dataset also contains task-based measures of more basic cognitive functions</w:t>
+      </w:r>
+      <w:r>
+        <w:rPr>
+          <w:rFonts w:ascii="Times New Roman" w:hAnsi="Times New Roman" w:cs="Times New Roman"/>
+        </w:rPr>
+        <w:t xml:space="preserve"> measured from </w:t>
+      </w:r>
+      <w:r>
+        <w:rPr>
+          <w:rFonts w:ascii="Times New Roman" w:hAnsi="Times New Roman" w:cs="Times New Roman"/>
+        </w:rPr>
+        <w:t>Stroop task reaction time (RT), N-back accuracy, and psychomotor vigilance test (PVT) RT</w:t>
+      </w:r>
+      <w:r>
+        <w:rPr>
+          <w:rFonts w:ascii="Times New Roman" w:hAnsi="Times New Roman" w:cs="Times New Roman"/>
+        </w:rPr>
+        <w:t xml:space="preserve">. </w:t>
+      </w:r>
+      <w:r>
+        <w:rPr>
+          <w:rFonts w:ascii="Times New Roman" w:hAnsi="Times New Roman" w:cs="Times New Roman"/>
+        </w:rPr>
+        <w:t>This motivated the second aim: to examine whether these cognitive-performance measures could be reasonably summarized into a broader common dimension while retaining meaningful information from the original measures. If such a dimension could not be supported, the individual cognitive outcomes would instead be retained and examined separately. Subsequent model-based analyses were then used to examine theoretically relevant associations with these cognitive outcomes.</w:t>
       </w:r>
     </w:p>
     <w:p>
@@ -880,14 +1088,7 @@
         <w:rPr>
           <w:rFonts w:ascii="Times New Roman" w:hAnsi="Times New Roman" w:cs="Times New Roman"/>
         </w:rPr>
-        <w:t xml:space="preserve">In summary, the present secondary data analysis project combined exploratory association mapping with theory-driven model-based analyses to evaluate how experience-related and psychophysiological-state factors were associated with emotion regulation and cognitive performance. No specific pairwise association in the exploratory analysis was treated as a confirmatory hypothesis; rather, the correlation structure was examined to characterize the overall pattern of relationships in the dataset. For the theory-driven analyses, the selected contextual predictors were expected to show meaningful associations with their corresponding emotional and cognitive </w:t>
-      </w:r>
-      <w:r>
-        <w:rPr>
-          <w:rFonts w:ascii="Times New Roman" w:hAnsi="Times New Roman" w:cs="Times New Roman"/>
-        </w:rPr>
-        <w:lastRenderedPageBreak/>
-        <w:t>outcomes, while the available cognitive measures were also examined for the possibility of a broader common performance dimension.</w:t>
+        <w:t>In summary, the present secondary data analysis project combined exploratory association mapping with theory-driven model-based analyses to evaluate how experience-related and psychophysiological-state factors were associated with emotion regulation and cognitive performance. No specific pairwise association in the exploratory analysis was treated as a confirmatory hypothesis; rather, the correlation structure was examined to characterize the overall pattern of relationships in the dataset. For the theory-driven analyses, the selected contextual predictors were expected to show meaningful associations with their corresponding emotional and cognitive outcomes, while the available cognitive measures were also examined for the possibility of a broader common performance dimension.</w:t>
       </w:r>
     </w:p>
     <w:p>
@@ -917,7 +1118,11 @@
           <w14:ligatures w14:val="none"/>
         </w:rPr>
       </w:pPr>
-      <w:r>
+    </w:p>
+    <w:p>
+      <w:pPr>
+        <w:spacing w:after="0" w:line="240" w:lineRule="auto"/>
+        <w:jc w:val="both"/>
         <w:rPr>
           <w:rFonts w:ascii="Times New Roman" w:eastAsia="宋体" w:hAnsi="Times New Roman" w:cs="Times New Roman"/>
           <w:b/>
@@ -926,6 +1131,17 @@
           <w:sz w:val="24"/>
           <w14:ligatures w14:val="none"/>
         </w:rPr>
+      </w:pPr>
+      <w:r>
+        <w:rPr>
+          <w:rFonts w:ascii="Times New Roman" w:eastAsia="宋体" w:hAnsi="Times New Roman" w:cs="Times New Roman"/>
+          <w:b/>
+          <w:bCs/>
+          <w:kern w:val="0"/>
+          <w:sz w:val="24"/>
+          <w14:ligatures w14:val="none"/>
+        </w:rPr>
+        <w:lastRenderedPageBreak/>
         <w:t>-Aim1</w:t>
       </w:r>
       <w:r>
@@ -1021,7 +1237,21 @@
         <w:rPr>
           <w:rFonts w:ascii="Times New Roman" w:hAnsi="Times New Roman" w:cs="Times New Roman"/>
         </w:rPr>
-        <w:t xml:space="preserve">, a sleep-hours × stress-level interaction was introduced to examine whether the association between either predictor and emotion regulation depended on the level of the other. I tentatively expected a positive interaction, such that the negative association between stress and emotion regulation would </w:t>
+        <w:t xml:space="preserve">, a sleep-hours × stress-level interaction was introduced to examine whether the association between either predictor </w:t>
+      </w:r>
+      <w:proofErr w:type="gramStart"/>
+      <w:r>
+        <w:rPr>
+          <w:rFonts w:ascii="Times New Roman" w:hAnsi="Times New Roman" w:cs="Times New Roman"/>
+        </w:rPr>
+        <w:t>and</w:t>
+      </w:r>
+      <w:proofErr w:type="gramEnd"/>
+      <w:r>
+        <w:rPr>
+          <w:rFonts w:ascii="Times New Roman" w:hAnsi="Times New Roman" w:cs="Times New Roman"/>
+        </w:rPr>
+        <w:t xml:space="preserve"> emotion regulation depended on the level of the other. I tentatively expected a positive interaction, such that the negative association between stress and emotion regulation would </w:t>
       </w:r>
       <w:r>
         <w:rPr>
@@ -1111,11 +1341,13 @@
     </w:p>
     <w:p>
       <w:pPr>
-        <w:spacing w:after="0"/>
+        <w:pStyle w:val="ae"/>
+        <w:spacing w:before="0" w:beforeAutospacing="0" w:after="0" w:afterAutospacing="0"/>
         <w:jc w:val="both"/>
         <w:rPr>
           <w:rFonts w:ascii="Times New Roman" w:hAnsi="Times New Roman" w:cs="Times New Roman"/>
-          <w:sz w:val="24"/>
+          <w:b/>
+          <w:bCs/>
         </w:rPr>
       </w:pPr>
       <w:r>
@@ -1126,70 +1358,209 @@
       </w:r>
       <w:r>
         <w:rPr>
-          <w:rFonts w:ascii="Times New Roman" w:hAnsi="Times New Roman" w:cs="Times New Roman"/>
-          <w:sz w:val="24"/>
-        </w:rPr>
-        <w:t xml:space="preserve">In the module for aim2, </w:t>
-      </w:r>
-      <w:r>
-        <w:rPr>
-          <w:rFonts w:ascii="Times New Roman" w:hAnsi="Times New Roman" w:cs="Times New Roman"/>
-          <w:sz w:val="24"/>
-        </w:rPr>
-        <w:t xml:space="preserve">I </w:t>
-      </w:r>
-      <w:r>
-        <w:rPr>
-          <w:rFonts w:ascii="Times New Roman" w:hAnsi="Times New Roman" w:cs="Times New Roman"/>
-          <w:sz w:val="24"/>
-        </w:rPr>
-        <w:t>continuously</w:t>
-      </w:r>
-      <w:r>
-        <w:rPr>
-          <w:rFonts w:ascii="Times New Roman" w:hAnsi="Times New Roman" w:cs="Times New Roman"/>
-          <w:sz w:val="24"/>
-        </w:rPr>
-        <w:t xml:space="preserve"> examine</w:t>
-      </w:r>
-      <w:r>
-        <w:rPr>
-          <w:rFonts w:ascii="Times New Roman" w:hAnsi="Times New Roman" w:cs="Times New Roman"/>
-          <w:sz w:val="24"/>
-        </w:rPr>
-        <w:t xml:space="preserve"> the </w:t>
-      </w:r>
-      <w:r>
-        <w:rPr>
-          <w:rFonts w:ascii="Times New Roman" w:hAnsi="Times New Roman" w:cs="Times New Roman"/>
-          <w:sz w:val="24"/>
-        </w:rPr>
-        <w:t>associations between experience-based predictor and psychophysiology-based predictors and performance in cognitive tasks</w:t>
-      </w:r>
-      <w:r>
-        <w:rPr>
-          <w:rFonts w:ascii="Times New Roman" w:hAnsi="Times New Roman" w:cs="Times New Roman"/>
-          <w:sz w:val="24"/>
-        </w:rPr>
-        <w:t xml:space="preserve">. </w:t>
-      </w:r>
-      <w:r>
-        <w:rPr>
-          <w:rFonts w:ascii="Times New Roman" w:hAnsi="Times New Roman" w:cs="Times New Roman"/>
-          <w:sz w:val="24"/>
-          <w:lang w:val="fr-CA"/>
-        </w:rPr>
-        <w:t xml:space="preserve">However, in this aim, the strating point primary cogntive cosntructs of regulatory control, defiend as  </w:t>
-      </w:r>
-    </w:p>
-    <w:p/>
-    <w:p/>
+          <w:rStyle w:val="af4"/>
+          <w:rFonts w:ascii="Times New Roman" w:hAnsi="Times New Roman" w:cs="Times New Roman"/>
+          <w:b w:val="0"/>
+          <w:bCs w:val="0"/>
+        </w:rPr>
+        <w:t xml:space="preserve">Aim 2 further examined associations between experience-related and psychophysiological-state contributors and cognitive-task performance. In contrast to Aim 1, which focused on emotion regulation as a higher-order regulatory process, </w:t>
+      </w:r>
+      <w:proofErr w:type="gramStart"/>
+      <w:r>
+        <w:rPr>
+          <w:rStyle w:val="af4"/>
+          <w:rFonts w:ascii="Times New Roman" w:hAnsi="Times New Roman" w:cs="Times New Roman"/>
+          <w:b w:val="0"/>
+          <w:bCs w:val="0"/>
+        </w:rPr>
+        <w:t>Aim</w:t>
+      </w:r>
+      <w:proofErr w:type="gramEnd"/>
+      <w:r>
+        <w:rPr>
+          <w:rStyle w:val="af4"/>
+          <w:rFonts w:ascii="Times New Roman" w:hAnsi="Times New Roman" w:cs="Times New Roman"/>
+          <w:b w:val="0"/>
+          <w:bCs w:val="0"/>
+        </w:rPr>
+        <w:t xml:space="preserve"> 2 targeted more basic executive and attentional functions. Stroop RT, N-back accuracy, and PVT RT were treated as measures primarily reflecting selective attention and inhibitory control, working memory, and sustained attention and behavioral alertness, respectively (</w:t>
+      </w:r>
+      <w:proofErr w:type="spellStart"/>
+      <w:r>
+        <w:rPr>
+          <w:rStyle w:val="af4"/>
+          <w:rFonts w:ascii="Times New Roman" w:hAnsi="Times New Roman" w:cs="Times New Roman"/>
+          <w:b w:val="0"/>
+          <w:bCs w:val="0"/>
+        </w:rPr>
+        <w:t>Basner</w:t>
+      </w:r>
+      <w:proofErr w:type="spellEnd"/>
+      <w:r>
+        <w:rPr>
+          <w:rStyle w:val="af4"/>
+          <w:rFonts w:ascii="Times New Roman" w:hAnsi="Times New Roman" w:cs="Times New Roman"/>
+          <w:b w:val="0"/>
+          <w:bCs w:val="0"/>
+        </w:rPr>
+        <w:t xml:space="preserve"> et al., 2021; Owen et al., 2005; </w:t>
+      </w:r>
+      <w:proofErr w:type="spellStart"/>
+      <w:r>
+        <w:rPr>
+          <w:rStyle w:val="af4"/>
+          <w:rFonts w:ascii="Times New Roman" w:hAnsi="Times New Roman" w:cs="Times New Roman"/>
+          <w:b w:val="0"/>
+          <w:bCs w:val="0"/>
+        </w:rPr>
+        <w:t>Scarpina</w:t>
+      </w:r>
+      <w:proofErr w:type="spellEnd"/>
+      <w:r>
+        <w:rPr>
+          <w:rStyle w:val="af4"/>
+          <w:rFonts w:ascii="Times New Roman" w:hAnsi="Times New Roman" w:cs="Times New Roman"/>
+          <w:b w:val="0"/>
+          <w:bCs w:val="0"/>
+        </w:rPr>
+        <w:t xml:space="preserve"> &amp; </w:t>
+      </w:r>
+      <w:proofErr w:type="spellStart"/>
+      <w:r>
+        <w:rPr>
+          <w:rStyle w:val="af4"/>
+          <w:rFonts w:ascii="Times New Roman" w:hAnsi="Times New Roman" w:cs="Times New Roman"/>
+          <w:b w:val="0"/>
+          <w:bCs w:val="0"/>
+        </w:rPr>
+        <w:t>Tagini</w:t>
+      </w:r>
+      <w:proofErr w:type="spellEnd"/>
+      <w:r>
+        <w:rPr>
+          <w:rStyle w:val="af4"/>
+          <w:rFonts w:ascii="Times New Roman" w:hAnsi="Times New Roman" w:cs="Times New Roman"/>
+          <w:b w:val="0"/>
+          <w:bCs w:val="0"/>
+        </w:rPr>
+        <w:t>, 2017).</w:t>
+      </w:r>
+    </w:p>
+    <w:p>
+      <w:pPr>
+        <w:pStyle w:val="ae"/>
+        <w:spacing w:before="0" w:beforeAutospacing="0" w:after="0" w:afterAutospacing="0"/>
+        <w:jc w:val="both"/>
+        <w:rPr>
+          <w:rFonts w:ascii="Times New Roman" w:hAnsi="Times New Roman" w:cs="Times New Roman"/>
+          <w:b/>
+          <w:bCs/>
+        </w:rPr>
+      </w:pPr>
+      <w:r>
+        <w:rPr>
+          <w:rStyle w:val="af4"/>
+          <w:rFonts w:ascii="Times New Roman" w:hAnsi="Times New Roman" w:cs="Times New Roman"/>
+          <w:b w:val="0"/>
+          <w:bCs w:val="0"/>
+        </w:rPr>
+        <w:t>An exploratory PCA was first conducted to examine whether the three task measures could be summarized by a broader common performance dimension. If such a dimension were present, the first principal component was expected to account for a substantial proportion of the total variance and show a theoretically coherent loading pattern, with Stroop RT and PVT RT loading in the opposite direction to N-back accuracy because better performance is reflected by lower reaction times but higher accuracy. If a meaningful single-component solution was not supported, separate task-specific models were examined.</w:t>
+      </w:r>
+      <w:r>
+        <w:rPr>
+          <w:rFonts w:ascii="Times New Roman" w:hAnsi="Times New Roman" w:cs="Times New Roman" w:hint="eastAsia"/>
+          <w:b/>
+          <w:bCs/>
+        </w:rPr>
+        <w:t xml:space="preserve"> </w:t>
+      </w:r>
+      <w:r>
+        <w:rPr>
+          <w:rStyle w:val="af4"/>
+          <w:rFonts w:ascii="Times New Roman" w:hAnsi="Times New Roman" w:cs="Times New Roman"/>
+          <w:b w:val="0"/>
+          <w:bCs w:val="0"/>
+        </w:rPr>
+        <w:t xml:space="preserve">For Stroop performance, a negative association </w:t>
+      </w:r>
+      <w:r>
+        <w:rPr>
+          <w:rStyle w:val="af4"/>
+          <w:rFonts w:ascii="Times New Roman" w:hAnsi="Times New Roman" w:cs="Times New Roman"/>
+          <w:b w:val="0"/>
+          <w:bCs w:val="0"/>
+        </w:rPr>
+        <w:lastRenderedPageBreak/>
+        <w:t>between emotion-regulation scores and RT was tentatively expected. Because effective emotion regulation can involve attentional deployment (</w:t>
+      </w:r>
+      <w:proofErr w:type="spellStart"/>
+      <w:r>
+        <w:rPr>
+          <w:rStyle w:val="af4"/>
+          <w:rFonts w:ascii="Times New Roman" w:hAnsi="Times New Roman" w:cs="Times New Roman"/>
+          <w:b w:val="0"/>
+          <w:bCs w:val="0"/>
+        </w:rPr>
+        <w:t>Wadlinger</w:t>
+      </w:r>
+      <w:proofErr w:type="spellEnd"/>
+      <w:r>
+        <w:rPr>
+          <w:rStyle w:val="af4"/>
+          <w:rFonts w:ascii="Times New Roman" w:hAnsi="Times New Roman" w:cs="Times New Roman"/>
+          <w:b w:val="0"/>
+          <w:bCs w:val="0"/>
+        </w:rPr>
+        <w:t xml:space="preserve"> &amp; </w:t>
+      </w:r>
+      <w:proofErr w:type="spellStart"/>
+      <w:r>
+        <w:rPr>
+          <w:rStyle w:val="af4"/>
+          <w:rFonts w:ascii="Times New Roman" w:hAnsi="Times New Roman" w:cs="Times New Roman"/>
+          <w:b w:val="0"/>
+          <w:bCs w:val="0"/>
+        </w:rPr>
+        <w:t>Isaacowitz</w:t>
+      </w:r>
+      <w:proofErr w:type="spellEnd"/>
+      <w:r>
+        <w:rPr>
+          <w:rStyle w:val="af4"/>
+          <w:rFonts w:ascii="Times New Roman" w:hAnsi="Times New Roman" w:cs="Times New Roman"/>
+          <w:b w:val="0"/>
+          <w:bCs w:val="0"/>
+        </w:rPr>
+        <w:t>, 2011), stronger emotion-regulatory ability may also be associated with more efficient non-emotional attentional control if these mechanisms are partly domain-general. For N-back performance, higher stress was expected to be associated with lower accuracy, consistent with evidence linking stress to impaired working-memory and prefrontal executive functioning (Fourteen &amp; Fabre, 2026; Schoofs et al., 2008). Finally, PVT performance was examined across low-, moderate-, and high-stress groups using ANCOVA, with emotion-regulation scores included as a covariate, to test whether sustained attention differed across broader stress levels after adjusting for individual differences in emotion regulation.</w:t>
+      </w:r>
+    </w:p>
     <w:p>
       <w:pPr>
         <w:spacing w:after="0" w:line="240" w:lineRule="auto"/>
         <w:jc w:val="both"/>
         <w:rPr>
           <w:rFonts w:ascii="Times New Roman" w:hAnsi="Times New Roman" w:cs="Times New Roman"/>
+          <w:sz w:val="24"/>
+        </w:rPr>
+      </w:pPr>
+    </w:p>
+    <w:p>
+      <w:pPr>
+        <w:spacing w:after="0" w:line="240" w:lineRule="auto"/>
+        <w:jc w:val="both"/>
+        <w:rPr>
+          <w:rFonts w:ascii="Times New Roman" w:hAnsi="Times New Roman" w:cs="Times New Roman" w:hint="eastAsia"/>
+          <w:noProof/>
+          <w:sz w:val="24"/>
+        </w:rPr>
+      </w:pPr>
+    </w:p>
+    <w:p>
+      <w:pPr>
+        <w:spacing w:after="0" w:line="240" w:lineRule="auto"/>
+        <w:jc w:val="both"/>
+        <w:rPr>
+          <w:rFonts w:ascii="Times New Roman" w:hAnsi="Times New Roman" w:cs="Times New Roman"/>
           <w:b/>
           <w:bCs/>
           <w:sz w:val="26"/>
@@ -1274,7 +1645,11 @@
           <w:szCs w:val="26"/>
         </w:rPr>
       </w:pPr>
-      <w:r>
+    </w:p>
+    <w:p>
+      <w:pPr>
+        <w:spacing w:after="0" w:line="240" w:lineRule="auto"/>
+        <w:jc w:val="both"/>
         <w:rPr>
           <w:rFonts w:ascii="Times New Roman" w:hAnsi="Times New Roman" w:cs="Times New Roman"/>
           <w:b/>
@@ -1282,9 +1657,12 @@
           <w:sz w:val="26"/>
           <w:szCs w:val="26"/>
         </w:rPr>
-        <w:t>RESULTS</w:t>
-      </w:r>
-      <w:r>
+      </w:pPr>
+    </w:p>
+    <w:p>
+      <w:pPr>
+        <w:spacing w:after="0" w:line="240" w:lineRule="auto"/>
+        <w:jc w:val="both"/>
         <w:rPr>
           <w:rFonts w:ascii="Times New Roman" w:hAnsi="Times New Roman" w:cs="Times New Roman"/>
           <w:b/>
@@ -1292,8 +1670,7 @@
           <w:sz w:val="26"/>
           <w:szCs w:val="26"/>
         </w:rPr>
-        <w:t xml:space="preserve"> AND DISCUSSION</w:t>
-      </w:r>
+      </w:pPr>
     </w:p>
     <w:p>
       <w:pPr>
@@ -1307,17 +1684,24 @@
           <w:szCs w:val="26"/>
         </w:rPr>
       </w:pPr>
-      <w:r>
-        <w:rPr>
-          <w:rFonts w:ascii="Times New Roman" w:hAnsi="Times New Roman" w:cs="Times New Roman" w:hint="eastAsia"/>
+    </w:p>
+    <w:p>
+      <w:pPr>
+        <w:spacing w:after="0" w:line="240" w:lineRule="auto"/>
+        <w:jc w:val="both"/>
+        <w:rPr>
+          <w:rFonts w:ascii="Times New Roman" w:hAnsi="Times New Roman" w:cs="Times New Roman"/>
           <w:b/>
           <w:bCs/>
           <w:sz w:val="26"/>
           <w:szCs w:val="26"/>
         </w:rPr>
-        <w:t xml:space="preserve">Exploratory Data </w:t>
-      </w:r>
-      <w:r>
+      </w:pPr>
+    </w:p>
+    <w:p>
+      <w:pPr>
+        <w:spacing w:after="0" w:line="240" w:lineRule="auto"/>
+        <w:jc w:val="both"/>
         <w:rPr>
           <w:rFonts w:ascii="Times New Roman" w:hAnsi="Times New Roman" w:cs="Times New Roman"/>
           <w:b/>
@@ -1325,9 +1709,12 @@
           <w:sz w:val="26"/>
           <w:szCs w:val="26"/>
         </w:rPr>
-        <w:t>Analysis</w:t>
-      </w:r>
-      <w:r>
+      </w:pPr>
+    </w:p>
+    <w:p>
+      <w:pPr>
+        <w:spacing w:after="0" w:line="240" w:lineRule="auto"/>
+        <w:jc w:val="both"/>
         <w:rPr>
           <w:rFonts w:ascii="Times New Roman" w:hAnsi="Times New Roman" w:cs="Times New Roman"/>
           <w:b/>
@@ -1335,8 +1722,7 @@
           <w:sz w:val="26"/>
           <w:szCs w:val="26"/>
         </w:rPr>
-        <w:t xml:space="preserve"> (EDA):</w:t>
-      </w:r>
+      </w:pPr>
     </w:p>
     <w:p>
       <w:pPr>
@@ -1344,6 +1730,277 @@
         <w:jc w:val="both"/>
         <w:rPr>
           <w:rFonts w:ascii="Times New Roman" w:hAnsi="Times New Roman" w:cs="Times New Roman"/>
+          <w:b/>
+          <w:bCs/>
+          <w:sz w:val="26"/>
+          <w:szCs w:val="26"/>
+        </w:rPr>
+      </w:pPr>
+    </w:p>
+    <w:p>
+      <w:pPr>
+        <w:spacing w:after="0" w:line="240" w:lineRule="auto"/>
+        <w:jc w:val="both"/>
+        <w:rPr>
+          <w:rFonts w:ascii="Times New Roman" w:hAnsi="Times New Roman" w:cs="Times New Roman"/>
+          <w:b/>
+          <w:bCs/>
+          <w:sz w:val="26"/>
+          <w:szCs w:val="26"/>
+        </w:rPr>
+      </w:pPr>
+    </w:p>
+    <w:p>
+      <w:pPr>
+        <w:spacing w:after="0" w:line="240" w:lineRule="auto"/>
+        <w:jc w:val="both"/>
+        <w:rPr>
+          <w:rFonts w:ascii="Times New Roman" w:hAnsi="Times New Roman" w:cs="Times New Roman"/>
+          <w:b/>
+          <w:bCs/>
+          <w:sz w:val="26"/>
+          <w:szCs w:val="26"/>
+        </w:rPr>
+      </w:pPr>
+    </w:p>
+    <w:p>
+      <w:pPr>
+        <w:spacing w:after="0" w:line="240" w:lineRule="auto"/>
+        <w:jc w:val="both"/>
+        <w:rPr>
+          <w:rFonts w:ascii="Times New Roman" w:hAnsi="Times New Roman" w:cs="Times New Roman"/>
+          <w:b/>
+          <w:bCs/>
+          <w:sz w:val="26"/>
+          <w:szCs w:val="26"/>
+        </w:rPr>
+      </w:pPr>
+    </w:p>
+    <w:p>
+      <w:pPr>
+        <w:spacing w:after="0" w:line="240" w:lineRule="auto"/>
+        <w:jc w:val="both"/>
+        <w:rPr>
+          <w:rFonts w:ascii="Times New Roman" w:hAnsi="Times New Roman" w:cs="Times New Roman"/>
+          <w:b/>
+          <w:bCs/>
+          <w:sz w:val="26"/>
+          <w:szCs w:val="26"/>
+        </w:rPr>
+      </w:pPr>
+    </w:p>
+    <w:p>
+      <w:pPr>
+        <w:spacing w:after="0" w:line="240" w:lineRule="auto"/>
+        <w:jc w:val="both"/>
+        <w:rPr>
+          <w:rFonts w:ascii="Times New Roman" w:hAnsi="Times New Roman" w:cs="Times New Roman"/>
+          <w:b/>
+          <w:bCs/>
+          <w:sz w:val="26"/>
+          <w:szCs w:val="26"/>
+        </w:rPr>
+      </w:pPr>
+    </w:p>
+    <w:p>
+      <w:pPr>
+        <w:spacing w:after="0" w:line="240" w:lineRule="auto"/>
+        <w:jc w:val="both"/>
+        <w:rPr>
+          <w:rFonts w:ascii="Times New Roman" w:hAnsi="Times New Roman" w:cs="Times New Roman"/>
+          <w:b/>
+          <w:bCs/>
+          <w:sz w:val="26"/>
+          <w:szCs w:val="26"/>
+        </w:rPr>
+      </w:pPr>
+    </w:p>
+    <w:p>
+      <w:pPr>
+        <w:spacing w:after="0" w:line="240" w:lineRule="auto"/>
+        <w:jc w:val="both"/>
+        <w:rPr>
+          <w:rFonts w:ascii="Times New Roman" w:hAnsi="Times New Roman" w:cs="Times New Roman"/>
+          <w:b/>
+          <w:bCs/>
+          <w:sz w:val="26"/>
+          <w:szCs w:val="26"/>
+        </w:rPr>
+      </w:pPr>
+    </w:p>
+    <w:p>
+      <w:pPr>
+        <w:spacing w:after="0" w:line="240" w:lineRule="auto"/>
+        <w:jc w:val="both"/>
+        <w:rPr>
+          <w:rFonts w:ascii="Times New Roman" w:hAnsi="Times New Roman" w:cs="Times New Roman"/>
+          <w:b/>
+          <w:bCs/>
+          <w:sz w:val="26"/>
+          <w:szCs w:val="26"/>
+        </w:rPr>
+      </w:pPr>
+    </w:p>
+    <w:p>
+      <w:pPr>
+        <w:spacing w:after="0" w:line="240" w:lineRule="auto"/>
+        <w:jc w:val="both"/>
+        <w:rPr>
+          <w:rFonts w:ascii="Times New Roman" w:hAnsi="Times New Roman" w:cs="Times New Roman"/>
+          <w:b/>
+          <w:bCs/>
+          <w:sz w:val="26"/>
+          <w:szCs w:val="26"/>
+        </w:rPr>
+      </w:pPr>
+    </w:p>
+    <w:p>
+      <w:pPr>
+        <w:spacing w:after="0" w:line="240" w:lineRule="auto"/>
+        <w:jc w:val="both"/>
+        <w:rPr>
+          <w:rFonts w:ascii="Times New Roman" w:hAnsi="Times New Roman" w:cs="Times New Roman"/>
+          <w:b/>
+          <w:bCs/>
+          <w:sz w:val="26"/>
+          <w:szCs w:val="26"/>
+        </w:rPr>
+      </w:pPr>
+    </w:p>
+    <w:p>
+      <w:pPr>
+        <w:spacing w:after="0" w:line="240" w:lineRule="auto"/>
+        <w:jc w:val="both"/>
+        <w:rPr>
+          <w:rFonts w:ascii="Times New Roman" w:hAnsi="Times New Roman" w:cs="Times New Roman"/>
+          <w:b/>
+          <w:bCs/>
+          <w:sz w:val="26"/>
+          <w:szCs w:val="26"/>
+        </w:rPr>
+      </w:pPr>
+    </w:p>
+    <w:p>
+      <w:pPr>
+        <w:spacing w:after="0" w:line="240" w:lineRule="auto"/>
+        <w:jc w:val="both"/>
+        <w:rPr>
+          <w:rFonts w:ascii="Times New Roman" w:hAnsi="Times New Roman" w:cs="Times New Roman"/>
+          <w:b/>
+          <w:bCs/>
+          <w:sz w:val="26"/>
+          <w:szCs w:val="26"/>
+        </w:rPr>
+      </w:pPr>
+    </w:p>
+    <w:p>
+      <w:pPr>
+        <w:spacing w:after="0" w:line="240" w:lineRule="auto"/>
+        <w:jc w:val="both"/>
+        <w:rPr>
+          <w:rFonts w:ascii="Times New Roman" w:hAnsi="Times New Roman" w:cs="Times New Roman"/>
+          <w:b/>
+          <w:bCs/>
+          <w:sz w:val="26"/>
+          <w:szCs w:val="26"/>
+        </w:rPr>
+      </w:pPr>
+    </w:p>
+    <w:p>
+      <w:pPr>
+        <w:spacing w:after="0" w:line="240" w:lineRule="auto"/>
+        <w:jc w:val="both"/>
+        <w:rPr>
+          <w:rFonts w:ascii="Times New Roman" w:hAnsi="Times New Roman" w:cs="Times New Roman"/>
+          <w:b/>
+          <w:bCs/>
+          <w:sz w:val="26"/>
+          <w:szCs w:val="26"/>
+        </w:rPr>
+      </w:pPr>
+    </w:p>
+    <w:p>
+      <w:pPr>
+        <w:spacing w:after="0" w:line="240" w:lineRule="auto"/>
+        <w:jc w:val="both"/>
+        <w:rPr>
+          <w:rFonts w:ascii="Times New Roman" w:hAnsi="Times New Roman" w:cs="Times New Roman"/>
+          <w:b/>
+          <w:bCs/>
+          <w:sz w:val="26"/>
+          <w:szCs w:val="26"/>
+        </w:rPr>
+      </w:pPr>
+      <w:r>
+        <w:rPr>
+          <w:rFonts w:ascii="Times New Roman" w:hAnsi="Times New Roman" w:cs="Times New Roman"/>
+          <w:b/>
+          <w:bCs/>
+          <w:sz w:val="26"/>
+          <w:szCs w:val="26"/>
+        </w:rPr>
+        <w:t>RESULTS</w:t>
+      </w:r>
+      <w:r>
+        <w:rPr>
+          <w:rFonts w:ascii="Times New Roman" w:hAnsi="Times New Roman" w:cs="Times New Roman"/>
+          <w:b/>
+          <w:bCs/>
+          <w:sz w:val="26"/>
+          <w:szCs w:val="26"/>
+        </w:rPr>
+        <w:t xml:space="preserve"> AND DISCUSSION</w:t>
+      </w:r>
+    </w:p>
+    <w:p>
+      <w:pPr>
+        <w:spacing w:after="0" w:line="240" w:lineRule="auto"/>
+        <w:jc w:val="both"/>
+        <w:rPr>
+          <w:rFonts w:ascii="Times New Roman" w:hAnsi="Times New Roman" w:cs="Times New Roman"/>
+          <w:b/>
+          <w:bCs/>
+          <w:sz w:val="26"/>
+          <w:szCs w:val="26"/>
+        </w:rPr>
+      </w:pPr>
+      <w:r>
+        <w:rPr>
+          <w:rFonts w:ascii="Times New Roman" w:hAnsi="Times New Roman" w:cs="Times New Roman" w:hint="eastAsia"/>
+          <w:b/>
+          <w:bCs/>
+          <w:sz w:val="26"/>
+          <w:szCs w:val="26"/>
+        </w:rPr>
+        <w:t xml:space="preserve">Exploratory Data </w:t>
+      </w:r>
+      <w:r>
+        <w:rPr>
+          <w:rFonts w:ascii="Times New Roman" w:hAnsi="Times New Roman" w:cs="Times New Roman"/>
+          <w:b/>
+          <w:bCs/>
+          <w:sz w:val="26"/>
+          <w:szCs w:val="26"/>
+        </w:rPr>
+        <w:t>Analysis</w:t>
+      </w:r>
+      <w:r>
+        <w:rPr>
+          <w:rFonts w:ascii="Times New Roman" w:hAnsi="Times New Roman" w:cs="Times New Roman"/>
+          <w:b/>
+          <w:bCs/>
+          <w:sz w:val="26"/>
+          <w:szCs w:val="26"/>
+        </w:rPr>
+        <w:t xml:space="preserve"> (EDA):</w:t>
+      </w:r>
+    </w:p>
+    <w:p>
+      <w:pPr>
+        <w:spacing w:after="0" w:line="240" w:lineRule="auto"/>
+        <w:jc w:val="both"/>
+        <w:rPr>
+          <w:rFonts w:ascii="Times New Roman" w:hAnsi="Times New Roman" w:cs="Times New Roman"/>
           <w:sz w:val="24"/>
         </w:rPr>
       </w:pPr>
@@ -1401,14 +2058,31 @@
           <w:rStyle w:val="HTML"/>
           <w:rFonts w:ascii="Times New Roman" w:hAnsi="Times New Roman" w:cs="Times New Roman"/>
         </w:rPr>
-        <w:t>Report/Original_Dataset</w:t>
-      </w:r>
-      <w:r>
-        <w:rPr>
-          <w:rFonts w:ascii="Times New Roman" w:hAnsi="Times New Roman" w:cs="Times New Roman"/>
-          <w:sz w:val="24"/>
-        </w:rPr>
-        <w:t xml:space="preserve"> directory of the project repository. </w:t>
+        <w:t>Report/</w:t>
+      </w:r>
+      <w:proofErr w:type="spellStart"/>
+      <w:r>
+        <w:rPr>
+          <w:rStyle w:val="HTML"/>
+          <w:rFonts w:ascii="Times New Roman" w:hAnsi="Times New Roman" w:cs="Times New Roman"/>
+        </w:rPr>
+        <w:t>Original_Dataset</w:t>
+      </w:r>
+      <w:proofErr w:type="spellEnd"/>
+      <w:r>
+        <w:rPr>
+          <w:rFonts w:ascii="Times New Roman" w:hAnsi="Times New Roman" w:cs="Times New Roman"/>
+          <w:sz w:val="24"/>
+        </w:rPr>
+        <w:t xml:space="preserve"> directory </w:t>
+      </w:r>
+      <w:r>
+        <w:rPr>
+          <w:rFonts w:ascii="Times New Roman" w:hAnsi="Times New Roman" w:cs="Times New Roman"/>
+          <w:sz w:val="24"/>
+        </w:rPr>
+        <w:lastRenderedPageBreak/>
+        <w:t xml:space="preserve">of the project repository. </w:t>
       </w:r>
       <w:r>
         <w:rPr>
@@ -1837,6 +2511,7 @@
                 <w:lang w:val="fr-CA"/>
               </w:rPr>
             </w:pPr>
+            <w:proofErr w:type="spellStart"/>
             <w:r>
               <w:rPr>
                 <w:rFonts w:ascii="Times New Roman" w:hAnsi="Times New Roman" w:cs="Times New Roman"/>
@@ -1848,6 +2523,7 @@
               </w:rPr>
               <w:t>Sleep</w:t>
             </w:r>
+            <w:proofErr w:type="spellEnd"/>
             <w:r>
               <w:rPr>
                 <w:rFonts w:ascii="Times New Roman" w:hAnsi="Times New Roman" w:cs="Times New Roman" w:hint="eastAsia"/>
@@ -1859,6 +2535,7 @@
               </w:rPr>
               <w:t xml:space="preserve"> </w:t>
             </w:r>
+            <w:proofErr w:type="spellStart"/>
             <w:r>
               <w:rPr>
                 <w:rFonts w:ascii="Times New Roman" w:hAnsi="Times New Roman" w:cs="Times New Roman"/>
@@ -1870,6 +2547,7 @@
               </w:rPr>
               <w:t>Hours</w:t>
             </w:r>
+            <w:proofErr w:type="spellEnd"/>
           </w:p>
         </w:tc>
         <w:tc>
@@ -2047,6 +2725,7 @@
                 <w:lang w:val="fr-CA"/>
               </w:rPr>
             </w:pPr>
+            <w:proofErr w:type="spellStart"/>
             <w:r>
               <w:rPr>
                 <w:rFonts w:ascii="Times New Roman" w:hAnsi="Times New Roman" w:cs="Times New Roman"/>
@@ -2058,6 +2737,7 @@
               </w:rPr>
               <w:t>Sleep</w:t>
             </w:r>
+            <w:proofErr w:type="spellEnd"/>
             <w:r>
               <w:rPr>
                 <w:rFonts w:ascii="Times New Roman" w:hAnsi="Times New Roman" w:cs="Times New Roman" w:hint="eastAsia"/>
@@ -2069,6 +2749,7 @@
               </w:rPr>
               <w:t xml:space="preserve"> </w:t>
             </w:r>
+            <w:proofErr w:type="spellStart"/>
             <w:r>
               <w:rPr>
                 <w:rFonts w:ascii="Times New Roman" w:hAnsi="Times New Roman" w:cs="Times New Roman"/>
@@ -2080,6 +2761,7 @@
               </w:rPr>
               <w:t>Quality</w:t>
             </w:r>
+            <w:proofErr w:type="spellEnd"/>
           </w:p>
         </w:tc>
         <w:tc>
@@ -2260,6 +2942,7 @@
                 <w:lang w:val="fr-CA"/>
               </w:rPr>
             </w:pPr>
+            <w:proofErr w:type="spellStart"/>
             <w:r>
               <w:rPr>
                 <w:rFonts w:ascii="Times New Roman" w:hAnsi="Times New Roman" w:cs="Times New Roman"/>
@@ -2271,6 +2954,7 @@
               </w:rPr>
               <w:t>Daytime</w:t>
             </w:r>
+            <w:proofErr w:type="spellEnd"/>
             <w:r>
               <w:rPr>
                 <w:rFonts w:ascii="Times New Roman" w:hAnsi="Times New Roman" w:cs="Times New Roman" w:hint="eastAsia"/>
@@ -2282,6 +2966,7 @@
               </w:rPr>
               <w:t xml:space="preserve"> </w:t>
             </w:r>
+            <w:proofErr w:type="spellStart"/>
             <w:r>
               <w:rPr>
                 <w:rFonts w:ascii="Times New Roman" w:hAnsi="Times New Roman" w:cs="Times New Roman"/>
@@ -2293,6 +2978,7 @@
               </w:rPr>
               <w:t>Sleepness</w:t>
             </w:r>
+            <w:proofErr w:type="spellEnd"/>
           </w:p>
         </w:tc>
         <w:tc>
@@ -2480,6 +3166,7 @@
               </w:rPr>
               <w:t>Stroop</w:t>
             </w:r>
+            <w:proofErr w:type="spellStart"/>
             <w:r>
               <w:rPr>
                 <w:rFonts w:ascii="Times New Roman" w:hAnsi="Times New Roman" w:cs="Times New Roman"/>
@@ -2491,6 +3178,7 @@
               </w:rPr>
               <w:t>Task</w:t>
             </w:r>
+            <w:proofErr w:type="spellEnd"/>
             <w:r>
               <w:rPr>
                 <w:rFonts w:ascii="Times New Roman" w:hAnsi="Times New Roman" w:cs="Times New Roman" w:hint="eastAsia"/>
@@ -2502,6 +3190,7 @@
               </w:rPr>
               <w:t xml:space="preserve"> </w:t>
             </w:r>
+            <w:proofErr w:type="spellStart"/>
             <w:r>
               <w:rPr>
                 <w:rFonts w:ascii="Times New Roman" w:hAnsi="Times New Roman" w:cs="Times New Roman"/>
@@ -2524,6 +3213,7 @@
               </w:rPr>
               <w:t>n</w:t>
             </w:r>
+            <w:proofErr w:type="spellEnd"/>
             <w:r>
               <w:rPr>
                 <w:rFonts w:ascii="Times New Roman" w:hAnsi="Times New Roman" w:cs="Times New Roman"/>
@@ -2770,6 +3460,7 @@
               </w:rPr>
               <w:t xml:space="preserve"> </w:t>
             </w:r>
+            <w:proofErr w:type="spellStart"/>
             <w:r>
               <w:rPr>
                 <w:rFonts w:ascii="Times New Roman" w:hAnsi="Times New Roman" w:cs="Times New Roman"/>
@@ -2781,6 +3472,7 @@
               </w:rPr>
               <w:t>Accuracy</w:t>
             </w:r>
+            <w:proofErr w:type="spellEnd"/>
           </w:p>
         </w:tc>
         <w:tc>
@@ -2978,6 +3670,7 @@
               </w:rPr>
               <w:t xml:space="preserve"> </w:t>
             </w:r>
+            <w:proofErr w:type="spellStart"/>
             <w:r>
               <w:rPr>
                 <w:rFonts w:ascii="Times New Roman" w:hAnsi="Times New Roman" w:cs="Times New Roman"/>
@@ -2989,6 +3682,7 @@
               </w:rPr>
               <w:t>Regulation</w:t>
             </w:r>
+            <w:proofErr w:type="spellEnd"/>
             <w:r>
               <w:rPr>
                 <w:rFonts w:ascii="Times New Roman" w:hAnsi="Times New Roman" w:cs="Times New Roman"/>
@@ -3213,6 +3907,7 @@
               </w:rPr>
               <w:t xml:space="preserve"> </w:t>
             </w:r>
+            <w:proofErr w:type="spellStart"/>
             <w:r>
               <w:rPr>
                 <w:rFonts w:ascii="Times New Roman" w:hAnsi="Times New Roman" w:cs="Times New Roman"/>
@@ -3224,6 +3919,7 @@
               </w:rPr>
               <w:t>Reaction</w:t>
             </w:r>
+            <w:proofErr w:type="spellEnd"/>
             <w:r>
               <w:rPr>
                 <w:rFonts w:ascii="Times New Roman" w:hAnsi="Times New Roman" w:cs="Times New Roman"/>
@@ -3802,6 +4498,7 @@
                 <w:lang w:val="fr-CA"/>
               </w:rPr>
             </w:pPr>
+            <w:proofErr w:type="spellStart"/>
             <w:r>
               <w:rPr>
                 <w:rFonts w:ascii="Times New Roman" w:hAnsi="Times New Roman" w:cs="Times New Roman"/>
@@ -3813,6 +4510,7 @@
               </w:rPr>
               <w:t>Caffeine</w:t>
             </w:r>
+            <w:proofErr w:type="spellEnd"/>
             <w:r>
               <w:rPr>
                 <w:rFonts w:ascii="Times New Roman" w:hAnsi="Times New Roman" w:cs="Times New Roman"/>
@@ -3824,6 +4522,7 @@
               </w:rPr>
               <w:t xml:space="preserve"> </w:t>
             </w:r>
+            <w:proofErr w:type="spellStart"/>
             <w:r>
               <w:rPr>
                 <w:rFonts w:ascii="Times New Roman" w:hAnsi="Times New Roman" w:cs="Times New Roman"/>
@@ -3835,6 +4534,7 @@
               </w:rPr>
               <w:t>Intake</w:t>
             </w:r>
+            <w:proofErr w:type="spellEnd"/>
           </w:p>
         </w:tc>
         <w:tc>
@@ -4059,6 +4759,7 @@
               </w:rPr>
               <w:t xml:space="preserve"> </w:t>
             </w:r>
+            <w:proofErr w:type="spellStart"/>
             <w:r>
               <w:rPr>
                 <w:rFonts w:ascii="Times New Roman" w:hAnsi="Times New Roman" w:cs="Times New Roman"/>
@@ -4070,6 +4771,7 @@
               </w:rPr>
               <w:t>Level</w:t>
             </w:r>
+            <w:proofErr w:type="spellEnd"/>
           </w:p>
         </w:tc>
         <w:tc>
@@ -4269,6 +4971,7 @@
               </w:rPr>
               <w:t xml:space="preserve"> </w:t>
             </w:r>
+            <w:proofErr w:type="spellStart"/>
             <w:r>
               <w:rPr>
                 <w:rFonts w:ascii="Times New Roman" w:hAnsi="Times New Roman" w:cs="Times New Roman"/>
@@ -4280,6 +4983,7 @@
               </w:rPr>
               <w:t>Level</w:t>
             </w:r>
+            <w:proofErr w:type="spellEnd"/>
           </w:p>
         </w:tc>
         <w:tc>
@@ -4987,7 +5691,7 @@
           <w:rFonts w:ascii="Times New Roman" w:hAnsi="Times New Roman" w:cs="Times New Roman"/>
           <w:sz w:val="24"/>
         </w:rPr>
-        <w:t xml:space="preserve">he CMH indicates that the magnitude of the observed standardized correlations was generally small and that none of them were statistically significant, </w:t>
+        <w:t>he CMH indicates that the magnitude of the observed standardized correlations was generally small and that none of them were statistically significant, suggesting that, in the present sample, there was insufficient evidence to support non-zero population-level pairwise correlations among the examined variables. However, diagnostic assessment remains necessary because the validity of correlation-based inference depends on relevant statistical assumptions, and the absence of statistically significant zero-order correlations does not preclude the usefulness of further model-</w:t>
       </w:r>
       <w:r>
         <w:rPr>
@@ -4995,7 +5699,7 @@
           <w:sz w:val="24"/>
         </w:rPr>
         <w:lastRenderedPageBreak/>
-        <w:t xml:space="preserve">suggesting that, in the present sample, there was insufficient evidence to support non-zero population-level pairwise correlations among the examined variables. However, diagnostic assessment remains necessary because the validity of correlation-based inference depends on relevant statistical assumptions, and the absence of statistically significant zero-order correlations does not preclude the usefulness of further model-based analyses </w:t>
+        <w:t xml:space="preserve">based analyses </w:t>
       </w:r>
       <w:r>
         <w:rPr>
@@ -5345,26 +6049,32 @@
         <w:rPr>
           <w:rFonts w:ascii="Times New Roman" w:hAnsi="Times New Roman" w:cs="Times New Roman"/>
         </w:rPr>
+        <w:t>The PSS-10 provides a basis for transforming continuous stress-level scores into a categorical variable. A commonly used PSS-10 categorization criterion</w:t>
+      </w:r>
+      <w:r>
+        <w:rPr>
+          <w:rFonts w:ascii="Times New Roman" w:hAnsi="Times New Roman" w:cs="Times New Roman"/>
+        </w:rPr>
+        <w:t xml:space="preserve"> which has been validated in previous </w:t>
+      </w:r>
+      <w:r>
+        <w:rPr>
+          <w:rFonts w:ascii="Times New Roman" w:hAnsi="Times New Roman" w:cs="Times New Roman"/>
+        </w:rPr>
+        <w:t>populations</w:t>
+      </w:r>
+      <w:r>
+        <w:rPr>
+          <w:rFonts w:ascii="Times New Roman" w:hAnsi="Times New Roman" w:cs="Times New Roman"/>
+        </w:rPr>
+        <w:t xml:space="preserve"> was applied to stress-level scores in this module for the ANCOVA in Aim 2, where stress group was treated as the factor. Basically, if an individual’s stress-level score was less than 14, the individual was classified into the </w:t>
+      </w:r>
+      <w:r>
+        <w:rPr>
+          <w:rFonts w:ascii="Times New Roman" w:hAnsi="Times New Roman" w:cs="Times New Roman"/>
+        </w:rPr>
         <w:lastRenderedPageBreak/>
-        <w:t>The PSS-10 provides a basis for transforming continuous stress-level scores into a categorical variable. A commonly used PSS-10 categorization criterion</w:t>
-      </w:r>
-      <w:r>
-        <w:rPr>
-          <w:rFonts w:ascii="Times New Roman" w:hAnsi="Times New Roman" w:cs="Times New Roman"/>
-        </w:rPr>
-        <w:t xml:space="preserve"> which has been validated in previous </w:t>
-      </w:r>
-      <w:r>
-        <w:rPr>
-          <w:rFonts w:ascii="Times New Roman" w:hAnsi="Times New Roman" w:cs="Times New Roman"/>
-        </w:rPr>
-        <w:t>populations</w:t>
-      </w:r>
-      <w:r>
-        <w:rPr>
-          <w:rFonts w:ascii="Times New Roman" w:hAnsi="Times New Roman" w:cs="Times New Roman"/>
-        </w:rPr>
-        <w:t xml:space="preserve"> was applied to stress-level scores in this module for the ANCOVA in Aim 2, where stress group was treated as the factor. Basically, if an individual’s stress-level score was less than 14, the individual was classified into the low-stress group; otherwise, if the score was between 14 and 26, the individual was classified into the moderate-stress group; otherwise, the individual was classified into the high-stress group (Adamson et al., 2020).</w:t>
+        <w:t>low-stress group; otherwise, if the score was between 14 and 26, the individual was classified into the moderate-stress group; otherwise, the individual was classified into the high-stress group (Adamson et al., 2020).</w:t>
       </w:r>
     </w:p>
     <w:p>
@@ -5554,6 +6264,7 @@
                 <w:lang w:val="fr-CA"/>
               </w:rPr>
             </w:pPr>
+            <w:proofErr w:type="spellStart"/>
             <w:r>
               <w:rPr>
                 <w:rFonts w:ascii="Times New Roman" w:hAnsi="Times New Roman" w:cs="Times New Roman"/>
@@ -5574,8 +6285,33 @@
                 <w:szCs w:val="20"/>
                 <w:lang w:val="fr-CA"/>
               </w:rPr>
-              <w:t>Sleep Hours</w:t>
-            </w:r>
+              <w:t>Sleep</w:t>
+            </w:r>
+            <w:proofErr w:type="spellEnd"/>
+            <w:r>
+              <w:rPr>
+                <w:rFonts w:ascii="Times New Roman" w:hAnsi="Times New Roman" w:cs="Times New Roman"/>
+                <w:b w:val="0"/>
+                <w:bCs w:val="0"/>
+                <w:sz w:val="20"/>
+                <w:szCs w:val="20"/>
+                <w:lang w:val="fr-CA"/>
+              </w:rPr>
+              <w:t xml:space="preserve"> </w:t>
+            </w:r>
+            <w:proofErr w:type="spellStart"/>
+            <w:r>
+              <w:rPr>
+                <w:rFonts w:ascii="Times New Roman" w:hAnsi="Times New Roman" w:cs="Times New Roman"/>
+                <w:b w:val="0"/>
+                <w:bCs w:val="0"/>
+                <w:sz w:val="20"/>
+                <w:szCs w:val="20"/>
+                <w:lang w:val="fr-CA"/>
+              </w:rPr>
+              <w:t>Hours</w:t>
+            </w:r>
+            <w:proofErr w:type="spellEnd"/>
           </w:p>
         </w:tc>
         <w:tc>
@@ -5677,6 +6413,7 @@
                 <w:szCs w:val="20"/>
               </w:rPr>
             </w:pPr>
+            <w:proofErr w:type="spellStart"/>
             <w:r>
               <w:rPr>
                 <w:rFonts w:ascii="Times New Roman" w:hAnsi="Times New Roman" w:cs="Times New Roman"/>
@@ -5695,7 +6432,18 @@
                 <w:sz w:val="20"/>
                 <w:szCs w:val="20"/>
               </w:rPr>
-              <w:t>Emotion Regulation Scores</w:t>
+              <w:t>Emotion</w:t>
+            </w:r>
+            <w:proofErr w:type="spellEnd"/>
+            <w:r>
+              <w:rPr>
+                <w:rFonts w:ascii="Times New Roman" w:hAnsi="Times New Roman" w:cs="Times New Roman"/>
+                <w:b w:val="0"/>
+                <w:bCs w:val="0"/>
+                <w:sz w:val="20"/>
+                <w:szCs w:val="20"/>
+              </w:rPr>
+              <w:t xml:space="preserve"> Regulation Scores</w:t>
             </w:r>
           </w:p>
         </w:tc>
@@ -5799,6 +6547,7 @@
                 <w:lang w:val="fr-CA"/>
               </w:rPr>
             </w:pPr>
+            <w:proofErr w:type="spellStart"/>
             <w:r>
               <w:rPr>
                 <w:rFonts w:ascii="Times New Roman" w:hAnsi="Times New Roman" w:cs="Times New Roman"/>
@@ -5808,7 +6557,19 @@
                 <w:szCs w:val="20"/>
                 <w:lang w:val="fr-CA"/>
               </w:rPr>
-              <w:t>C_Stress_Level Scores</w:t>
+              <w:t>C_Stress_Level</w:t>
+            </w:r>
+            <w:proofErr w:type="spellEnd"/>
+            <w:r>
+              <w:rPr>
+                <w:rFonts w:ascii="Times New Roman" w:hAnsi="Times New Roman" w:cs="Times New Roman"/>
+                <w:b w:val="0"/>
+                <w:bCs w:val="0"/>
+                <w:sz w:val="20"/>
+                <w:szCs w:val="20"/>
+                <w:lang w:val="fr-CA"/>
+              </w:rPr>
+              <w:t xml:space="preserve"> Scores</w:t>
             </w:r>
           </w:p>
         </w:tc>
@@ -5909,6 +6670,7 @@
                 <w:lang w:val="fr-CA"/>
               </w:rPr>
             </w:pPr>
+            <w:proofErr w:type="spellStart"/>
             <w:r>
               <w:rPr>
                 <w:rFonts w:ascii="Times New Roman" w:hAnsi="Times New Roman" w:cs="Times New Roman"/>
@@ -5918,7 +6680,43 @@
                 <w:szCs w:val="20"/>
                 <w:lang w:val="fr-CA"/>
               </w:rPr>
-              <w:t>Emotion Regualtion Scores</w:t>
+              <w:t>Emotion</w:t>
+            </w:r>
+            <w:proofErr w:type="spellEnd"/>
+            <w:r>
+              <w:rPr>
+                <w:rFonts w:ascii="Times New Roman" w:hAnsi="Times New Roman" w:cs="Times New Roman"/>
+                <w:b w:val="0"/>
+                <w:bCs w:val="0"/>
+                <w:sz w:val="20"/>
+                <w:szCs w:val="20"/>
+                <w:lang w:val="fr-CA"/>
+              </w:rPr>
+              <w:t xml:space="preserve"> </w:t>
+            </w:r>
+            <w:proofErr w:type="spellStart"/>
+            <w:r>
+              <w:rPr>
+                <w:rFonts w:ascii="Times New Roman" w:hAnsi="Times New Roman" w:cs="Times New Roman"/>
+                <w:b w:val="0"/>
+                <w:bCs w:val="0"/>
+                <w:sz w:val="20"/>
+                <w:szCs w:val="20"/>
+                <w:lang w:val="fr-CA"/>
+              </w:rPr>
+              <w:t>Regualtion</w:t>
+            </w:r>
+            <w:proofErr w:type="spellEnd"/>
+            <w:r>
+              <w:rPr>
+                <w:rFonts w:ascii="Times New Roman" w:hAnsi="Times New Roman" w:cs="Times New Roman"/>
+                <w:b w:val="0"/>
+                <w:bCs w:val="0"/>
+                <w:sz w:val="20"/>
+                <w:szCs w:val="20"/>
+                <w:lang w:val="fr-CA"/>
+              </w:rPr>
+              <w:t xml:space="preserve"> Scores</w:t>
             </w:r>
           </w:p>
         </w:tc>
@@ -6031,7 +6829,55 @@
                 <w:szCs w:val="20"/>
                 <w:lang w:val="fr-CA"/>
               </w:rPr>
-              <w:t>Stroop Task Reaction Time</w:t>
+              <w:t xml:space="preserve">Stroop </w:t>
+            </w:r>
+            <w:proofErr w:type="spellStart"/>
+            <w:r>
+              <w:rPr>
+                <w:rFonts w:ascii="Times New Roman" w:hAnsi="Times New Roman" w:cs="Times New Roman"/>
+                <w:b w:val="0"/>
+                <w:bCs w:val="0"/>
+                <w:sz w:val="20"/>
+                <w:szCs w:val="20"/>
+                <w:lang w:val="fr-CA"/>
+              </w:rPr>
+              <w:t>Task</w:t>
+            </w:r>
+            <w:proofErr w:type="spellEnd"/>
+            <w:r>
+              <w:rPr>
+                <w:rFonts w:ascii="Times New Roman" w:hAnsi="Times New Roman" w:cs="Times New Roman"/>
+                <w:b w:val="0"/>
+                <w:bCs w:val="0"/>
+                <w:sz w:val="20"/>
+                <w:szCs w:val="20"/>
+                <w:lang w:val="fr-CA"/>
+              </w:rPr>
+              <w:t xml:space="preserve"> </w:t>
+            </w:r>
+            <w:proofErr w:type="spellStart"/>
+            <w:r>
+              <w:rPr>
+                <w:rFonts w:ascii="Times New Roman" w:hAnsi="Times New Roman" w:cs="Times New Roman"/>
+                <w:b w:val="0"/>
+                <w:bCs w:val="0"/>
+                <w:sz w:val="20"/>
+                <w:szCs w:val="20"/>
+                <w:lang w:val="fr-CA"/>
+              </w:rPr>
+              <w:t>Reaction</w:t>
+            </w:r>
+            <w:proofErr w:type="spellEnd"/>
+            <w:r>
+              <w:rPr>
+                <w:rFonts w:ascii="Times New Roman" w:hAnsi="Times New Roman" w:cs="Times New Roman"/>
+                <w:b w:val="0"/>
+                <w:bCs w:val="0"/>
+                <w:sz w:val="20"/>
+                <w:szCs w:val="20"/>
+                <w:lang w:val="fr-CA"/>
+              </w:rPr>
+              <w:t xml:space="preserve"> Time</w:t>
             </w:r>
           </w:p>
         </w:tc>
@@ -6276,7 +7122,31 @@
                 <w:szCs w:val="20"/>
                 <w:lang w:val="fr-CA"/>
               </w:rPr>
-              <w:t>PVT Reaction Time</w:t>
+              <w:t xml:space="preserve">PVT </w:t>
+            </w:r>
+            <w:proofErr w:type="spellStart"/>
+            <w:r>
+              <w:rPr>
+                <w:rFonts w:ascii="Times New Roman" w:hAnsi="Times New Roman" w:cs="Times New Roman"/>
+                <w:b w:val="0"/>
+                <w:bCs w:val="0"/>
+                <w:sz w:val="20"/>
+                <w:szCs w:val="20"/>
+                <w:lang w:val="fr-CA"/>
+              </w:rPr>
+              <w:t>Reaction</w:t>
+            </w:r>
+            <w:proofErr w:type="spellEnd"/>
+            <w:r>
+              <w:rPr>
+                <w:rFonts w:ascii="Times New Roman" w:hAnsi="Times New Roman" w:cs="Times New Roman"/>
+                <w:b w:val="0"/>
+                <w:bCs w:val="0"/>
+                <w:sz w:val="20"/>
+                <w:szCs w:val="20"/>
+                <w:lang w:val="fr-CA"/>
+              </w:rPr>
+              <w:t xml:space="preserve"> Time</w:t>
             </w:r>
           </w:p>
         </w:tc>
@@ -6383,7 +7253,61 @@
           <w:sz w:val="20"/>
           <w:szCs w:val="20"/>
         </w:rPr>
-        <w:t>te: C_Sleep hours, C_emotion regulation scores and c_stress level scores represents mean-centering predictors respectively</w:t>
+        <w:t xml:space="preserve">te: </w:t>
+      </w:r>
+      <w:proofErr w:type="spellStart"/>
+      <w:r>
+        <w:rPr>
+          <w:rFonts w:ascii="Times New Roman" w:hAnsi="Times New Roman" w:cs="Times New Roman"/>
+          <w:sz w:val="20"/>
+          <w:szCs w:val="20"/>
+        </w:rPr>
+        <w:t>C_Sleep</w:t>
+      </w:r>
+      <w:proofErr w:type="spellEnd"/>
+      <w:r>
+        <w:rPr>
+          <w:rFonts w:ascii="Times New Roman" w:hAnsi="Times New Roman" w:cs="Times New Roman"/>
+          <w:sz w:val="20"/>
+          <w:szCs w:val="20"/>
+        </w:rPr>
+        <w:t xml:space="preserve"> hours, </w:t>
+      </w:r>
+      <w:proofErr w:type="spellStart"/>
+      <w:r>
+        <w:rPr>
+          <w:rFonts w:ascii="Times New Roman" w:hAnsi="Times New Roman" w:cs="Times New Roman"/>
+          <w:sz w:val="20"/>
+          <w:szCs w:val="20"/>
+        </w:rPr>
+        <w:t>C_emotion</w:t>
+      </w:r>
+      <w:proofErr w:type="spellEnd"/>
+      <w:r>
+        <w:rPr>
+          <w:rFonts w:ascii="Times New Roman" w:hAnsi="Times New Roman" w:cs="Times New Roman"/>
+          <w:sz w:val="20"/>
+          <w:szCs w:val="20"/>
+        </w:rPr>
+        <w:t xml:space="preserve"> regulation scores and </w:t>
+      </w:r>
+      <w:proofErr w:type="spellStart"/>
+      <w:r>
+        <w:rPr>
+          <w:rFonts w:ascii="Times New Roman" w:hAnsi="Times New Roman" w:cs="Times New Roman"/>
+          <w:sz w:val="20"/>
+          <w:szCs w:val="20"/>
+        </w:rPr>
+        <w:t>c_stress</w:t>
+      </w:r>
+      <w:proofErr w:type="spellEnd"/>
+      <w:r>
+        <w:rPr>
+          <w:rFonts w:ascii="Times New Roman" w:hAnsi="Times New Roman" w:cs="Times New Roman"/>
+          <w:sz w:val="20"/>
+          <w:szCs w:val="20"/>
+        </w:rPr>
+        <w:t xml:space="preserve"> level scores represents mean-centering predictors respectively</w:t>
       </w:r>
     </w:p>
     <w:p>
@@ -8422,7 +9346,7 @@
     </b:Author>
     <b:Volume>8</b:Volume>
     <b:LCID>en-CA</b:LCID>
-    <b:RefOrder>3</b:RefOrder>
+    <b:RefOrder>2</b:RefOrder>
   </b:Source>
   <b:Source>
     <b:Tag>Owe05</b:Tag>
@@ -8460,7 +9384,7 @@
       </b:Author>
     </b:Author>
     <b:LCID>en-US</b:LCID>
-    <b:RefOrder>4</b:RefOrder>
+    <b:RefOrder>3</b:RefOrder>
   </b:Source>
   <b:Source>
     <b:Tag>Bas21</b:Tag>
@@ -8502,7 +9426,7 @@
         </b:NameList>
       </b:Author>
     </b:Author>
-    <b:RefOrder>5</b:RefOrder>
+    <b:RefOrder>4</b:RefOrder>
   </b:Source>
   <b:Source>
     <b:Tag>Alh07</b:Tag>
@@ -8529,7 +9453,7 @@
     <b:Volume>3</b:Volume>
     <b:Issue>5</b:Issue>
     <b:LCID>en-CA</b:LCID>
-    <b:RefOrder>6</b:RefOrder>
+    <b:RefOrder>5</b:RefOrder>
   </b:Source>
   <b:Source>
     <b:Tag>Fla22</b:Tag>
@@ -8565,7 +9489,7 @@
       </b:Author>
     </b:Author>
     <b:LCID>en-CA</b:LCID>
-    <b:RefOrder>7</b:RefOrder>
+    <b:RefOrder>6</b:RefOrder>
   </b:Source>
   <b:Source>
     <b:Tag>For11</b:Tag>
@@ -8606,7 +9530,7 @@
     <b:Volume>15</b:Volume>
     <b:Issue>6</b:Issue>
     <b:LCID>en-CA</b:LCID>
-    <b:RefOrder>8</b:RefOrder>
+    <b:RefOrder>7</b:RefOrder>
   </b:Source>
   <b:Source>
     <b:Tag>Fra</b:Tag>
@@ -8633,7 +9557,7 @@
     <b:Volume>135</b:Volume>
     <b:Year>2015</b:Year>
     <b:LCID>en-CA</b:LCID>
-    <b:RefOrder>9</b:RefOrder>
+    <b:RefOrder>8</b:RefOrder>
   </b:Source>
   <b:Source>
     <b:Tag>Gil07</b:Tag>
@@ -8661,7 +9585,7 @@
     <b:Volume>54</b:Volume>
     <b:Issue>5</b:Issue>
     <b:LCID>en-CA</b:LCID>
-    <b:RefOrder>10</b:RefOrder>
+    <b:RefOrder>9</b:RefOrder>
   </b:Source>
   <b:Source>
     <b:Tag>Har16</b:Tag>
@@ -8694,7 +9618,7 @@
       </b:Author>
     </b:Author>
     <b:LCID>en-CA</b:LCID>
-    <b:RefOrder>11</b:RefOrder>
+    <b:RefOrder>10</b:RefOrder>
   </b:Source>
   <b:Source>
     <b:Tag>Koa23</b:Tag>
@@ -8723,7 +9647,7 @@
     <b:Volume>35</b:Volume>
     <b:Issue>3</b:Issue>
     <b:LCID>en-CA</b:LCID>
-    <b:RefOrder>12</b:RefOrder>
+    <b:RefOrder>11</b:RefOrder>
   </b:Source>
   <b:Source>
     <b:Tag>Nwi25</b:Tag>
@@ -8746,7 +9670,7 @@
     </b:Author>
     <b:Volume>291</b:Volume>
     <b:LCID>en-CA</b:LCID>
-    <b:RefOrder>13</b:RefOrder>
+    <b:RefOrder>12</b:RefOrder>
   </b:Source>
   <b:Source>
     <b:Tag>Pac10</b:Tag>
@@ -8778,7 +9702,7 @@
     <b:Volume>21</b:Volume>
     <b:Issue>2</b:Issue>
     <b:LCID>en-CA</b:LCID>
-    <b:RefOrder>14</b:RefOrder>
+    <b:RefOrder>13</b:RefOrder>
   </b:Source>
   <b:Source>
     <b:Tag>Roc15</b:Tag>
@@ -8817,7 +9741,7 @@
     <b:Volume>43</b:Volume>
     <b:Issue>5</b:Issue>
     <b:LCID>en-CA</b:LCID>
-    <b:RefOrder>15</b:RefOrder>
+    <b:RefOrder>14</b:RefOrder>
   </b:Source>
   <b:Source>
     <b:Tag>Sch04</b:Tag>
@@ -8840,7 +9764,7 @@
     </b:Author>
     <b:Volume>55</b:Volume>
     <b:LCID>en-CA</b:LCID>
-    <b:RefOrder>16</b:RefOrder>
+    <b:RefOrder>15</b:RefOrder>
   </b:Source>
   <b:Source>
     <b:Tag>Tri21</b:Tag>
@@ -8871,7 +9795,7 @@
     <b:Volume>85</b:Volume>
     <b:Issue>3</b:Issue>
     <b:LCID>en-CA</b:LCID>
-    <b:RefOrder>17</b:RefOrder>
+    <b:RefOrder>16</b:RefOrder>
   </b:Source>
   <b:Source>
     <b:Tag>Wai25</b:Tag>
@@ -8899,7 +9823,7 @@
     <b:Volume>20</b:Volume>
     <b:Issue>1</b:Issue>
     <b:LCID>en-CA</b:LCID>
-    <b:RefOrder>18</b:RefOrder>
+    <b:RefOrder>17</b:RefOrder>
   </b:Source>
   <b:Source>
     <b:Tag>sac24</b:Tag>
@@ -8914,7 +9838,7 @@
     <b:InternetSiteTitle>Kaggle</b:InternetSiteTitle>
     <b:URL>https://www.kaggle.com/datasets/sacramentotechnology/sleep-deprivation-and-cognitive-performance</b:URL>
     <b:LCID>en-CA</b:LCID>
-    <b:RefOrder>19</b:RefOrder>
+    <b:RefOrder>18</b:RefOrder>
   </b:Source>
   <b:Source>
     <b:Tag>Coh83</b:Tag>
@@ -8944,7 +9868,7 @@
     </b:Author>
     <b:Volume>24</b:Volume>
     <b:Issue>4</b:Issue>
-    <b:RefOrder>20</b:RefOrder>
+    <b:RefOrder>19</b:RefOrder>
   </b:Source>
   <b:Source>
     <b:Tag>Ada20</b:Tag>
@@ -9008,7 +9932,7 @@
         </b:NameList>
       </b:Author>
     </b:Author>
-    <b:RefOrder>21</b:RefOrder>
+    <b:RefOrder>20</b:RefOrder>
   </b:Source>
   <b:Source>
     <b:Tag>Kha23</b:Tag>
@@ -9036,7 +9960,7 @@
     <b:Volume>28</b:Volume>
     <b:Issue>2</b:Issue>
     <b:LCID>en-CA</b:LCID>
-    <b:RefOrder>22</b:RefOrder>
+    <b:RefOrder>21</b:RefOrder>
   </b:Source>
   <b:Source>
     <b:Tag>Koh14</b:Tag>
@@ -9081,7 +10005,7 @@
       </b:Author>
     </b:Author>
     <b:LCID>en-CA</b:LCID>
-    <b:RefOrder>23</b:RefOrder>
+    <b:RefOrder>22</b:RefOrder>
   </b:Source>
   <b:Source>
     <b:Tag>Mar16</b:Tag>
@@ -9109,7 +10033,7 @@
       </b:Author>
     </b:Author>
     <b:LCID>en-CA</b:LCID>
-    <b:RefOrder>24</b:RefOrder>
+    <b:RefOrder>23</b:RefOrder>
   </b:Source>
   <b:Source>
     <b:Tag>Gan17</b:Tag>
@@ -9147,7 +10071,7 @@
       </b:Author>
     </b:Author>
     <b:LCID>en-CA</b:LCID>
-    <b:RefOrder>25</b:RefOrder>
+    <b:RefOrder>24</b:RefOrder>
   </b:Source>
   <b:Source>
     <b:Tag>Fri13</b:Tag>
@@ -9186,7 +10110,7 @@
       </b:Author>
     </b:Author>
     <b:LCID>en-CA</b:LCID>
-    <b:RefOrder>26</b:RefOrder>
+    <b:RefOrder>25</b:RefOrder>
   </b:Source>
   <b:Source>
     <b:Tag>Sch26</b:Tag>
@@ -9228,7 +10152,7 @@
       </b:Author>
     </b:Author>
     <b:LCID>en-CA</b:LCID>
-    <b:RefOrder>1</b:RefOrder>
+    <b:RefOrder>26</b:RefOrder>
   </b:Source>
   <b:Source>
     <b:Tag>Tem18</b:Tag>
@@ -9299,37 +10223,6 @@
     <b:RefOrder>28</b:RefOrder>
   </b:Source>
   <b:Source>
-    <b:Tag>Tsa19</b:Tag>
-    <b:SourceType>ArticleInAPeriodical</b:SourceType>
-    <b:Guid>{5CA5923E-EC33-F446-8261-CBBB94406111}</b:Guid>
-    <b:Title>Stress and executive control: Mechanisms, moderators, and malleability</b:Title>
-    <b:PeriodicalTitle>Brain and Cognition</b:PeriodicalTitle>
-    <b:Year>2019</b:Year>
-    <b:Pages>54-59</b:Pages>
-    <b:Volume>133</b:Volume>
-    <b:Author>
-      <b:Author>
-        <b:NameList>
-          <b:Person>
-            <b:Last>Tsai</b:Last>
-            <b:First>Nancy</b:First>
-          </b:Person>
-          <b:Person>
-            <b:Last>Eccles</b:Last>
-            <b:Middle>S</b:Middle>
-            <b:First>Jacquelynne</b:First>
-          </b:Person>
-          <b:Person>
-            <b:Last>Jaeggi</b:Last>
-            <b:Middle>M</b:Middle>
-            <b:First>Susanne</b:First>
-          </b:Person>
-        </b:NameList>
-      </b:Author>
-    </b:Author>
-    <b:RefOrder>29</b:RefOrder>
-  </b:Source>
-  <b:Source>
     <b:Tag>Lan25</b:Tag>
     <b:SourceType>ArticleInAPeriodical</b:SourceType>
     <b:Guid>{1AA78971-5C3F-5D47-83BC-7F34AAD23663}</b:Guid>
@@ -9364,13 +10257,133 @@
         </b:NameList>
       </b:Author>
     </b:Author>
-    <b:RefOrder>2</b:RefOrder>
+    <b:RefOrder>30</b:RefOrder>
+  </b:Source>
+  <b:Source>
+    <b:Tag>Sch08</b:Tag>
+    <b:SourceType>ArticleInAPeriodical</b:SourceType>
+    <b:Guid>{01250879-64BD-3446-8042-74951EFC4EE0}</b:Guid>
+    <b:Title>Psychosocial stress induces working memory impairments in an n-back paradigm</b:Title>
+    <b:PeriodicalTitle>Psychoneuroendocrinology</b:PeriodicalTitle>
+    <b:Year>2008</b:Year>
+    <b:Pages>643-653</b:Pages>
+    <b:Author>
+      <b:Author>
+        <b:NameList>
+          <b:Person>
+            <b:Last>Schoofs</b:Last>
+            <b:First>Daniela</b:First>
+          </b:Person>
+          <b:Person>
+            <b:Last>Preuß</b:Last>
+            <b:First>Diana</b:First>
+          </b:Person>
+          <b:Person>
+            <b:Last>Wolf</b:Last>
+            <b:Middle>T</b:Middle>
+            <b:First>Oliver</b:First>
+          </b:Person>
+        </b:NameList>
+      </b:Author>
+    </b:Author>
+    <b:LCID>en-CA</b:LCID>
+    <b:Volume>33</b:Volume>
+    <b:Issue>5</b:Issue>
+    <b:RefOrder>32</b:RefOrder>
+  </b:Source>
+  <b:Source>
+    <b:Tag>Feu26</b:Tag>
+    <b:SourceType>ArticleInAPeriodical</b:SourceType>
+    <b:Guid>{EE6F6AAE-73A9-044E-86D5-5FCE695318C6}</b:Guid>
+    <b:LCID>en-CA</b:LCID>
+    <b:Title>How Emotions Influence Cognitive Control: A Within-Subject Investigation.</b:Title>
+    <b:PeriodicalTitle>Behavioral Sciences</b:PeriodicalTitle>
+    <b:Year>2026</b:Year>
+    <b:Pages>89</b:Pages>
+    <b:Volume>16</b:Volume>
+    <b:Issue>1</b:Issue>
+    <b:Author>
+      <b:Author>
+        <b:NameList>
+          <b:Person>
+            <b:Last>Feutren</b:Last>
+            <b:First>Tristan</b:First>
+          </b:Person>
+          <b:Person>
+            <b:Last>Fabre</b:Last>
+            <b:First>Ludovic</b:First>
+          </b:Person>
+        </b:NameList>
+      </b:Author>
+    </b:Author>
+    <b:RefOrder>1</b:RefOrder>
+  </b:Source>
+  <b:Source>
+    <b:Tag>Wad11</b:Tag>
+    <b:SourceType>ArticleInAPeriodical</b:SourceType>
+    <b:Guid>{282DFB10-E0EE-AB4B-BB65-124476C4B1F2}</b:Guid>
+    <b:Title>Fixing our focus: Training attention to regulate emotion</b:Title>
+    <b:PeriodicalTitle>Personality and social psychology review</b:PeriodicalTitle>
+    <b:Year>2011</b:Year>
+    <b:Pages>75-102</b:Pages>
+    <b:Author>
+      <b:Author>
+        <b:NameList>
+          <b:Person>
+            <b:Last>Wadlinger</b:Last>
+            <b:Middle>A</b:Middle>
+            <b:First>Heather</b:First>
+          </b:Person>
+          <b:Person>
+            <b:Last>Issacowitz</b:Last>
+            <b:Middle>M</b:Middle>
+            <b:First>Derek</b:First>
+          </b:Person>
+        </b:NameList>
+      </b:Author>
+    </b:Author>
+    <b:Volume>15</b:Volume>
+    <b:Issue>1</b:Issue>
+    <b:RefOrder>31</b:RefOrder>
+    <b:LCID>en-CA</b:LCID>
+  </b:Source>
+  <b:Source>
+    <b:Tag>Tsa19</b:Tag>
+    <b:SourceType>ArticleInAPeriodical</b:SourceType>
+    <b:Guid>{65798610-B9A9-8544-AA31-38103EE55940}</b:Guid>
+    <b:Title>Stress and executive control: Mechanisms, moderators, and malleability</b:Title>
+    <b:PeriodicalTitle>Brain and Cognition</b:PeriodicalTitle>
+    <b:Year>2019</b:Year>
+    <b:Pages>54-59</b:Pages>
+    <b:Volume>133</b:Volume>
+    <b:Author>
+      <b:Author>
+        <b:NameList>
+          <b:Person>
+            <b:Last>Tsai</b:Last>
+            <b:First>Nancy</b:First>
+          </b:Person>
+          <b:Person>
+            <b:Last>Eccles</b:Last>
+            <b:Middle>S</b:Middle>
+            <b:First>Jacquelynne</b:First>
+          </b:Person>
+          <b:Person>
+            <b:Last>Jaeggi</b:Last>
+            <b:Middle>M</b:Middle>
+            <b:First>Susanne</b:First>
+          </b:Person>
+        </b:NameList>
+      </b:Author>
+    </b:Author>
+    <b:RefOrder>29</b:RefOrder>
+    <b:LCID>en-CA</b:LCID>
   </b:Source>
 </b:Sources>
 </file>
 
 <file path=customXml/itemProps1.xml><?xml version="1.0" encoding="utf-8"?>
-<ds:datastoreItem xmlns:ds="http://schemas.openxmlformats.org/officeDocument/2006/customXml" ds:itemID="{684B714B-F76E-A44A-BD8F-5831B45EAC92}">
+<ds:datastoreItem xmlns:ds="http://schemas.openxmlformats.org/officeDocument/2006/customXml" ds:itemID="{B0DE5416-AF8E-1440-A6A2-ED43E0BC0FCD}">
   <ds:schemaRefs>
     <ds:schemaRef ds:uri="http://schemas.openxmlformats.org/officeDocument/2006/bibliography"/>
   </ds:schemaRefs>

</xml_diff>

<commit_message>
elbaoration of analysis result and discussion
</commit_message>
<xml_diff>
--- a/Project1_Sleep_Deprivation_Cognition/Report/Analysis_Report.docx
+++ b/Project1_Sleep_Deprivation_Cognition/Report/Analysis_Report.docx
@@ -1531,7 +1531,25 @@
           <w:b w:val="0"/>
           <w:bCs w:val="0"/>
         </w:rPr>
-        <w:t>, 2011), stronger emotion-regulatory ability may also be associated with more efficient non-emotional attentional control if these mechanisms are partly domain-general. For N-back performance, higher stress was expected to be associated with lower accuracy, consistent with evidence linking stress to impaired working-memory and prefrontal executive functioning (Fourteen &amp; Fabre, 2026; Schoofs et al., 2008). Finally, PVT performance was examined across low-, moderate-, and high-stress groups using ANCOVA, with emotion-regulation scores included as a covariate, to test whether sustained attention differed across broader stress levels after adjusting for individual differences in emotion regulation.</w:t>
+        <w:t xml:space="preserve">, 2011), stronger emotion-regulatory ability may also be associated with more efficient non-emotional attentional control if these mechanisms are partly domain-general. For N-back performance, higher stress was expected to be associated with lower accuracy, consistent with evidence linking stress to impaired working-memory and prefrontal executive functioning (Fourteen &amp; Fabre, 2026; Schoofs et al., 2008). Finally, PVT performance was examined across low-, moderate-, and high-stress groups using ANCOVA, with emotion-regulation scores included as a covariate, to test whether sustained attention differed across broader stress levels </w:t>
+      </w:r>
+      <w:r>
+        <w:rPr>
+          <w:rStyle w:val="af4"/>
+          <w:rFonts w:ascii="Times New Roman" w:hAnsi="Times New Roman" w:cs="Times New Roman"/>
+          <w:b w:val="0"/>
+          <w:bCs w:val="0"/>
+        </w:rPr>
+        <w:t xml:space="preserve">conditionally </w:t>
+      </w:r>
+      <w:r>
+        <w:rPr>
+          <w:rStyle w:val="af4"/>
+          <w:rFonts w:ascii="Times New Roman" w:hAnsi="Times New Roman" w:cs="Times New Roman"/>
+          <w:b w:val="0"/>
+          <w:bCs w:val="0"/>
+        </w:rPr>
+        <w:t>after adjusting for individual differences in emotion regulation.</w:t>
       </w:r>
     </w:p>
     <w:p>
@@ -1549,7 +1567,7 @@
         <w:spacing w:after="0" w:line="240" w:lineRule="auto"/>
         <w:jc w:val="both"/>
         <w:rPr>
-          <w:rFonts w:ascii="Times New Roman" w:hAnsi="Times New Roman" w:cs="Times New Roman" w:hint="eastAsia"/>
+          <w:rFonts w:ascii="Times New Roman" w:hAnsi="Times New Roman" w:cs="Times New Roman"/>
           <w:noProof/>
           <w:sz w:val="24"/>
         </w:rPr>
@@ -1931,7 +1949,11 @@
           <w:szCs w:val="26"/>
         </w:rPr>
       </w:pPr>
-      <w:r>
+    </w:p>
+    <w:p>
+      <w:pPr>
+        <w:spacing w:after="0" w:line="240" w:lineRule="auto"/>
+        <w:jc w:val="both"/>
         <w:rPr>
           <w:rFonts w:ascii="Times New Roman" w:hAnsi="Times New Roman" w:cs="Times New Roman"/>
           <w:b/>
@@ -1939,9 +1961,12 @@
           <w:sz w:val="26"/>
           <w:szCs w:val="26"/>
         </w:rPr>
-        <w:t>RESULTS</w:t>
-      </w:r>
-      <w:r>
+      </w:pPr>
+    </w:p>
+    <w:p>
+      <w:pPr>
+        <w:spacing w:after="0" w:line="240" w:lineRule="auto"/>
+        <w:jc w:val="both"/>
         <w:rPr>
           <w:rFonts w:ascii="Times New Roman" w:hAnsi="Times New Roman" w:cs="Times New Roman"/>
           <w:b/>
@@ -1949,8 +1974,7 @@
           <w:sz w:val="26"/>
           <w:szCs w:val="26"/>
         </w:rPr>
-        <w:t xml:space="preserve"> AND DISCUSSION</w:t>
-      </w:r>
+      </w:pPr>
     </w:p>
     <w:p>
       <w:pPr>
@@ -1966,13 +1990,14 @@
       </w:pPr>
       <w:r>
         <w:rPr>
-          <w:rFonts w:ascii="Times New Roman" w:hAnsi="Times New Roman" w:cs="Times New Roman" w:hint="eastAsia"/>
+          <w:rFonts w:ascii="Times New Roman" w:hAnsi="Times New Roman" w:cs="Times New Roman"/>
           <w:b/>
           <w:bCs/>
           <w:sz w:val="26"/>
           <w:szCs w:val="26"/>
         </w:rPr>
-        <w:t xml:space="preserve">Exploratory Data </w:t>
+        <w:lastRenderedPageBreak/>
+        <w:t>RESULTS</w:t>
       </w:r>
       <w:r>
         <w:rPr>
@@ -1982,9 +2007,13 @@
           <w:sz w:val="26"/>
           <w:szCs w:val="26"/>
         </w:rPr>
-        <w:t>Analysis</w:t>
-      </w:r>
-      <w:r>
+        <w:t xml:space="preserve"> AND DISCUSSION</w:t>
+      </w:r>
+    </w:p>
+    <w:p>
+      <w:pPr>
+        <w:spacing w:after="0" w:line="240" w:lineRule="auto"/>
+        <w:jc w:val="both"/>
         <w:rPr>
           <w:rFonts w:ascii="Times New Roman" w:hAnsi="Times New Roman" w:cs="Times New Roman"/>
           <w:b/>
@@ -1992,6 +2021,35 @@
           <w:sz w:val="26"/>
           <w:szCs w:val="26"/>
         </w:rPr>
+      </w:pPr>
+      <w:r>
+        <w:rPr>
+          <w:rFonts w:ascii="Times New Roman" w:hAnsi="Times New Roman" w:cs="Times New Roman" w:hint="eastAsia"/>
+          <w:b/>
+          <w:bCs/>
+          <w:sz w:val="26"/>
+          <w:szCs w:val="26"/>
+        </w:rPr>
+        <w:t xml:space="preserve">Exploratory Data </w:t>
+      </w:r>
+      <w:r>
+        <w:rPr>
+          <w:rFonts w:ascii="Times New Roman" w:hAnsi="Times New Roman" w:cs="Times New Roman"/>
+          <w:b/>
+          <w:bCs/>
+          <w:sz w:val="26"/>
+          <w:szCs w:val="26"/>
+        </w:rPr>
+        <w:t>Analysis</w:t>
+      </w:r>
+      <w:r>
+        <w:rPr>
+          <w:rFonts w:ascii="Times New Roman" w:hAnsi="Times New Roman" w:cs="Times New Roman"/>
+          <w:b/>
+          <w:bCs/>
+          <w:sz w:val="26"/>
+          <w:szCs w:val="26"/>
+        </w:rPr>
         <w:t xml:space="preserve"> (EDA):</w:t>
       </w:r>
     </w:p>
@@ -2074,15 +2132,7 @@
           <w:rFonts w:ascii="Times New Roman" w:hAnsi="Times New Roman" w:cs="Times New Roman"/>
           <w:sz w:val="24"/>
         </w:rPr>
-        <w:t xml:space="preserve"> directory </w:t>
-      </w:r>
-      <w:r>
-        <w:rPr>
-          <w:rFonts w:ascii="Times New Roman" w:hAnsi="Times New Roman" w:cs="Times New Roman"/>
-          <w:sz w:val="24"/>
-        </w:rPr>
-        <w:lastRenderedPageBreak/>
-        <w:t xml:space="preserve">of the project repository. </w:t>
+        <w:t xml:space="preserve"> directory of the project repository. </w:t>
       </w:r>
       <w:r>
         <w:rPr>
@@ -5691,7 +5741,7 @@
           <w:rFonts w:ascii="Times New Roman" w:hAnsi="Times New Roman" w:cs="Times New Roman"/>
           <w:sz w:val="24"/>
         </w:rPr>
-        <w:t>he CMH indicates that the magnitude of the observed standardized correlations was generally small and that none of them were statistically significant, suggesting that, in the present sample, there was insufficient evidence to support non-zero population-level pairwise correlations among the examined variables. However, diagnostic assessment remains necessary because the validity of correlation-based inference depends on relevant statistical assumptions, and the absence of statistically significant zero-order correlations does not preclude the usefulness of further model-</w:t>
+        <w:t xml:space="preserve">he CMH indicates that the magnitude of the observed standardized correlations was generally small and that none of them were statistically significant, suggesting that, in the present sample, there was insufficient evidence to support non-zero population-level pairwise correlations among the examined variables. However, </w:t>
       </w:r>
       <w:r>
         <w:rPr>
@@ -5699,7 +5749,7 @@
           <w:sz w:val="24"/>
         </w:rPr>
         <w:lastRenderedPageBreak/>
-        <w:t xml:space="preserve">based analyses </w:t>
+        <w:t xml:space="preserve">diagnostic assessment remains necessary because the validity of correlation-based inference depends on relevant statistical assumptions, and the absence of statistically significant zero-order correlations does not preclude the usefulness of further model-based analyses </w:t>
       </w:r>
       <w:r>
         <w:rPr>
@@ -5756,7 +5806,7 @@
           <w:szCs w:val="20"/>
         </w:rPr>
         <w:drawing>
-          <wp:anchor distT="0" distB="0" distL="114300" distR="114300" simplePos="0" relativeHeight="251658240" behindDoc="0" locked="0" layoutInCell="1" allowOverlap="1" wp14:anchorId="6C018DE2" wp14:editId="18238C6D">
+          <wp:anchor distT="0" distB="0" distL="114300" distR="114300" simplePos="0" relativeHeight="251658240" behindDoc="0" locked="0" layoutInCell="1" allowOverlap="1" wp14:anchorId="6C018DE2" wp14:editId="3081F761">
             <wp:simplePos x="0" y="0"/>
             <wp:positionH relativeFrom="column">
               <wp:posOffset>1270</wp:posOffset>
@@ -6055,7 +6105,14 @@
         <w:rPr>
           <w:rFonts w:ascii="Times New Roman" w:hAnsi="Times New Roman" w:cs="Times New Roman"/>
         </w:rPr>
-        <w:t xml:space="preserve"> which has been validated in previous </w:t>
+        <w:t xml:space="preserve"> which has been </w:t>
+      </w:r>
+      <w:r>
+        <w:rPr>
+          <w:rFonts w:ascii="Times New Roman" w:hAnsi="Times New Roman" w:cs="Times New Roman"/>
+        </w:rPr>
+        <w:lastRenderedPageBreak/>
+        <w:t xml:space="preserve">validated in previous </w:t>
       </w:r>
       <w:r>
         <w:rPr>
@@ -6067,14 +6124,7 @@
         <w:rPr>
           <w:rFonts w:ascii="Times New Roman" w:hAnsi="Times New Roman" w:cs="Times New Roman"/>
         </w:rPr>
-        <w:t xml:space="preserve"> was applied to stress-level scores in this module for the ANCOVA in Aim 2, where stress group was treated as the factor. Basically, if an individual’s stress-level score was less than 14, the individual was classified into the </w:t>
-      </w:r>
-      <w:r>
-        <w:rPr>
-          <w:rFonts w:ascii="Times New Roman" w:hAnsi="Times New Roman" w:cs="Times New Roman"/>
-        </w:rPr>
-        <w:lastRenderedPageBreak/>
-        <w:t>low-stress group; otherwise, if the score was between 14 and 26, the individual was classified into the moderate-stress group; otherwise, the individual was classified into the high-stress group (Adamson et al., 2020).</w:t>
+        <w:t xml:space="preserve"> was applied to stress-level scores in this module for the ANCOVA in Aim 2, where stress group was treated as the factor. Basically, if an individual’s stress-level score was less than 14, the individual was classified into the low-stress group; otherwise, if the score was between 14 and 26, the individual was classified into the moderate-stress group; otherwise, the individual was classified into the high-stress group (Adamson et al., 2020).</w:t>
       </w:r>
     </w:p>
     <w:p>
@@ -7415,7 +7465,17 @@
           <w:sz w:val="26"/>
           <w:szCs w:val="26"/>
         </w:rPr>
-        <w:t xml:space="preserve">-Aim1 Analysis </w:t>
+        <w:t>-Aim1</w:t>
+      </w:r>
+      <w:r>
+        <w:rPr>
+          <w:rFonts w:ascii="Times New Roman" w:hAnsi="Times New Roman" w:cs="Times New Roman"/>
+          <w:b/>
+          <w:bCs/>
+          <w:sz w:val="26"/>
+          <w:szCs w:val="26"/>
+        </w:rPr>
+        <w:t xml:space="preserve"> Results and Discussions</w:t>
       </w:r>
     </w:p>
     <w:p>
@@ -7423,22 +7483,238 @@
         <w:spacing w:after="0" w:line="240" w:lineRule="auto"/>
         <w:jc w:val="both"/>
         <w:rPr>
-          <w:rFonts w:ascii="Times New Roman" w:hAnsi="Times New Roman" w:cs="Times New Roman" w:hint="eastAsia"/>
+          <w:rFonts w:ascii="Times New Roman" w:hAnsi="Times New Roman" w:cs="Times New Roman"/>
+          <w:sz w:val="24"/>
+        </w:rPr>
+      </w:pPr>
+      <w:r>
+        <w:rPr>
+          <w:rFonts w:ascii="Times New Roman" w:hAnsi="Times New Roman" w:cs="Times New Roman"/>
           <w:b/>
           <w:bCs/>
           <w:sz w:val="26"/>
           <w:szCs w:val="26"/>
         </w:rPr>
-      </w:pPr>
-      <w:r>
-        <w:rPr>
-          <w:rFonts w:ascii="Times New Roman" w:hAnsi="Times New Roman" w:cs="Times New Roman"/>
-          <w:b/>
-          <w:bCs/>
+        <w:t xml:space="preserve"> </w:t>
+      </w:r>
+      <w:r>
+        <w:rPr>
+          <w:rFonts w:ascii="Times New Roman" w:hAnsi="Times New Roman" w:cs="Times New Roman"/>
           <w:sz w:val="26"/>
           <w:szCs w:val="26"/>
         </w:rPr>
-        <w:t>-Aim2 Analysis</w:t>
+        <w:t xml:space="preserve"> </w:t>
+      </w:r>
+      <w:r>
+        <w:rPr>
+          <w:rFonts w:ascii="Times New Roman" w:hAnsi="Times New Roman" w:cs="Times New Roman"/>
+          <w:sz w:val="26"/>
+          <w:szCs w:val="26"/>
+        </w:rPr>
+        <w:t>Model1.1</w:t>
+      </w:r>
+      <w:r>
+        <w:rPr>
+          <w:rFonts w:ascii="Times New Roman" w:hAnsi="Times New Roman" w:cs="Times New Roman"/>
+          <w:sz w:val="24"/>
+        </w:rPr>
+        <w:t xml:space="preserve"> established a simple linear regression to examine the effect of sleep hours (mean-centering) and emotion regulation scores. At sample level, the result indicates that</w:t>
+      </w:r>
+      <w:r>
+        <w:rPr>
+          <w:rFonts w:ascii="Times New Roman" w:hAnsi="Times New Roman" w:cs="Times New Roman"/>
+          <w:sz w:val="24"/>
+        </w:rPr>
+        <w:t xml:space="preserve"> </w:t>
+      </w:r>
+      <w:r>
+        <w:rPr>
+          <w:rFonts w:ascii="Times New Roman" w:hAnsi="Times New Roman" w:cs="Times New Roman" w:hint="eastAsia"/>
+          <w:sz w:val="24"/>
+        </w:rPr>
+        <w:t>each</w:t>
+      </w:r>
+      <w:r>
+        <w:rPr>
+          <w:rFonts w:ascii="Times New Roman" w:hAnsi="Times New Roman" w:cs="Times New Roman"/>
+          <w:sz w:val="24"/>
+        </w:rPr>
+        <w:t xml:space="preserve"> one</w:t>
+      </w:r>
+      <w:r>
+        <w:rPr>
+          <w:rFonts w:ascii="Times New Roman" w:hAnsi="Times New Roman" w:cs="Times New Roman"/>
+          <w:sz w:val="24"/>
+        </w:rPr>
+        <w:t xml:space="preserve"> hour</w:t>
+      </w:r>
+      <w:r>
+        <w:rPr>
+          <w:rFonts w:ascii="Times New Roman" w:hAnsi="Times New Roman" w:cs="Times New Roman"/>
+          <w:sz w:val="24"/>
+        </w:rPr>
+        <w:t xml:space="preserve"> increase in sleep </w:t>
+      </w:r>
+      <w:r>
+        <w:rPr>
+          <w:rFonts w:ascii="Times New Roman" w:hAnsi="Times New Roman" w:cs="Times New Roman" w:hint="eastAsia"/>
+          <w:sz w:val="24"/>
+        </w:rPr>
+        <w:t>duration</w:t>
+      </w:r>
+      <w:r>
+        <w:rPr>
+          <w:rFonts w:ascii="Times New Roman" w:hAnsi="Times New Roman" w:cs="Times New Roman"/>
+          <w:sz w:val="24"/>
+        </w:rPr>
+        <w:t xml:space="preserve"> </w:t>
+      </w:r>
+      <w:r>
+        <w:rPr>
+          <w:rFonts w:ascii="Times New Roman" w:hAnsi="Times New Roman" w:cs="Times New Roman"/>
+          <w:sz w:val="24"/>
+        </w:rPr>
+        <w:t>above</w:t>
+      </w:r>
+      <w:r>
+        <w:rPr>
+          <w:rFonts w:ascii="Times New Roman" w:hAnsi="Times New Roman" w:cs="Times New Roman"/>
+          <w:sz w:val="24"/>
+        </w:rPr>
+        <w:t xml:space="preserve"> the sample mean </w:t>
+      </w:r>
+      <w:r>
+        <w:rPr>
+          <w:rFonts w:ascii="Times New Roman" w:hAnsi="Times New Roman" w:cs="Times New Roman" w:hint="eastAsia"/>
+          <w:sz w:val="24"/>
+        </w:rPr>
+        <w:t>was</w:t>
+      </w:r>
+      <w:r>
+        <w:rPr>
+          <w:rFonts w:ascii="Times New Roman" w:hAnsi="Times New Roman" w:cs="Times New Roman"/>
+          <w:sz w:val="24"/>
+        </w:rPr>
+        <w:t xml:space="preserve"> associated with 1.67</w:t>
+      </w:r>
+      <w:r>
+        <w:rPr>
+          <w:rFonts w:ascii="Times New Roman" w:hAnsi="Times New Roman" w:cs="Times New Roman" w:hint="eastAsia"/>
+          <w:sz w:val="24"/>
+        </w:rPr>
+        <w:t xml:space="preserve">-point </w:t>
+      </w:r>
+      <w:r>
+        <w:rPr>
+          <w:rFonts w:ascii="Times New Roman" w:hAnsi="Times New Roman" w:cs="Times New Roman"/>
+          <w:sz w:val="24"/>
+        </w:rPr>
+        <w:t xml:space="preserve">decrease </w:t>
+      </w:r>
+      <w:r>
+        <w:rPr>
+          <w:rFonts w:ascii="Times New Roman" w:hAnsi="Times New Roman" w:cs="Times New Roman" w:hint="eastAsia"/>
+          <w:sz w:val="24"/>
+        </w:rPr>
+        <w:t>in</w:t>
+      </w:r>
+      <w:r>
+        <w:rPr>
+          <w:rFonts w:ascii="Times New Roman" w:hAnsi="Times New Roman" w:cs="Times New Roman"/>
+          <w:sz w:val="24"/>
+        </w:rPr>
+        <w:t xml:space="preserve"> emotion regulation</w:t>
+      </w:r>
+      <w:r>
+        <w:rPr>
+          <w:rFonts w:ascii="Times New Roman" w:hAnsi="Times New Roman" w:cs="Times New Roman" w:hint="eastAsia"/>
+          <w:sz w:val="24"/>
+        </w:rPr>
+        <w:t xml:space="preserve"> </w:t>
+      </w:r>
+      <w:r>
+        <w:rPr>
+          <w:rFonts w:ascii="Times New Roman" w:hAnsi="Times New Roman" w:cs="Times New Roman"/>
+          <w:sz w:val="24"/>
+        </w:rPr>
+        <w:t>score,</w:t>
+      </w:r>
+      <w:r>
+        <w:rPr>
+          <w:rFonts w:ascii="Times New Roman" w:hAnsi="Times New Roman" w:cs="Times New Roman"/>
+          <w:sz w:val="24"/>
+        </w:rPr>
+        <w:t xml:space="preserve"> but this result is not statistically significant, b = -1.67, SE = 1.21, t-value = -1.38 and p-value = 0.17 </w:t>
+      </w:r>
+      <w:r>
+        <w:rPr>
+          <w:rFonts w:ascii="Times New Roman" w:hAnsi="Times New Roman" w:cs="Times New Roman"/>
+          <w:sz w:val="24"/>
+        </w:rPr>
+        <w:t>&gt;</w:t>
+      </w:r>
+      <w:r>
+        <w:rPr>
+          <w:rFonts w:ascii="Times New Roman" w:hAnsi="Times New Roman" w:cs="Times New Roman" w:hint="eastAsia"/>
+          <w:sz w:val="24"/>
+        </w:rPr>
+        <w:t xml:space="preserve"> 0.05. </w:t>
+      </w:r>
+      <w:r>
+        <w:rPr>
+          <w:rFonts w:ascii="Times New Roman" w:hAnsi="Times New Roman" w:cs="Times New Roman" w:hint="eastAsia"/>
+          <w:sz w:val="24"/>
+        </w:rPr>
+        <w:t>Th</w:t>
+      </w:r>
+      <w:r>
+        <w:rPr>
+          <w:rFonts w:ascii="Times New Roman" w:hAnsi="Times New Roman" w:cs="Times New Roman"/>
+          <w:sz w:val="24"/>
+        </w:rPr>
+        <w:t>e model merely captures</w:t>
+      </w:r>
+      <w:r>
+        <w:rPr>
+          <w:rFonts w:ascii="Times New Roman" w:hAnsi="Times New Roman" w:cs="Times New Roman" w:hint="eastAsia"/>
+          <w:sz w:val="24"/>
+        </w:rPr>
+        <w:t xml:space="preserve"> </w:t>
+      </w:r>
+      <w:r>
+        <w:rPr>
+          <w:rFonts w:ascii="Times New Roman" w:hAnsi="Times New Roman" w:cs="Times New Roman"/>
+          <w:sz w:val="24"/>
+        </w:rPr>
+        <w:t>approximately</w:t>
+      </w:r>
+      <w:r>
+        <w:rPr>
+          <w:rFonts w:ascii="Times New Roman" w:hAnsi="Times New Roman" w:cs="Times New Roman" w:hint="eastAsia"/>
+          <w:sz w:val="24"/>
+        </w:rPr>
+        <w:t xml:space="preserve"> 3.2% </w:t>
+      </w:r>
+      <w:r>
+        <w:rPr>
+          <w:rFonts w:ascii="Times New Roman" w:hAnsi="Times New Roman" w:cs="Times New Roman"/>
+          <w:sz w:val="24"/>
+        </w:rPr>
+        <w:t>variance of emotion regulation scores R^2</w:t>
+      </w:r>
+      <w:r>
+        <w:rPr>
+          <w:rFonts w:ascii="Times New Roman" w:hAnsi="Times New Roman" w:cs="Times New Roman"/>
+          <w:sz w:val="24"/>
+        </w:rPr>
+        <w:t xml:space="preserve"> </w:t>
+      </w:r>
+      <w:r>
+        <w:rPr>
+          <w:rFonts w:ascii="Times New Roman" w:hAnsi="Times New Roman" w:cs="Times New Roman"/>
+          <w:sz w:val="24"/>
+        </w:rPr>
+        <w:t>= 0.03, apparently leaving most of the outcome variance unexplained by this model. Figure 2.1 shows the relationship between sleep durations and emotion regulation with confidence interval band.</w:t>
       </w:r>
     </w:p>
     <w:p>
@@ -7446,6 +7722,309 @@
         <w:spacing w:after="0" w:line="240" w:lineRule="auto"/>
         <w:jc w:val="both"/>
         <w:rPr>
+          <w:rFonts w:ascii="Times New Roman" w:eastAsia="宋体" w:hAnsi="Times New Roman" w:cs="Times New Roman"/>
+          <w:sz w:val="24"/>
+        </w:rPr>
+      </w:pPr>
+      <w:r>
+        <w:rPr>
+          <w:rFonts w:ascii="Times New Roman" w:hAnsi="Times New Roman" w:cs="Times New Roman"/>
+          <w:sz w:val="24"/>
+        </w:rPr>
+        <w:t xml:space="preserve">  </w:t>
+      </w:r>
+      <w:r>
+        <w:rPr>
+          <w:rFonts w:ascii="Times New Roman" w:hAnsi="Times New Roman" w:cs="Times New Roman"/>
+          <w:sz w:val="24"/>
+        </w:rPr>
+        <w:t xml:space="preserve">Assumption diagnostics were then conducted to assess whether estimated sampling distribution of the regression coefficients could be considered sufficiently consistent with theoretical expectations for </w:t>
+      </w:r>
+      <w:r>
+        <w:rPr>
+          <w:rFonts w:ascii="Times New Roman" w:hAnsi="Times New Roman" w:cs="Times New Roman" w:hint="eastAsia"/>
+          <w:sz w:val="24"/>
+        </w:rPr>
+        <w:t>accurate</w:t>
+      </w:r>
+      <w:r>
+        <w:rPr>
+          <w:rFonts w:ascii="Times New Roman" w:hAnsi="Times New Roman" w:cs="Times New Roman"/>
+          <w:sz w:val="24"/>
+        </w:rPr>
+        <w:t xml:space="preserve"> inference</w:t>
+      </w:r>
+      <w:r>
+        <w:rPr>
+          <w:rFonts w:ascii="Times New Roman" w:hAnsi="Times New Roman" w:cs="Times New Roman" w:hint="eastAsia"/>
+          <w:sz w:val="24"/>
+        </w:rPr>
+        <w:t xml:space="preserve"> and estimation</w:t>
+      </w:r>
+      <w:r>
+        <w:rPr>
+          <w:rFonts w:ascii="Times New Roman" w:hAnsi="Times New Roman" w:cs="Times New Roman"/>
+          <w:sz w:val="24"/>
+        </w:rPr>
+        <w:t>.</w:t>
+      </w:r>
+      <w:r>
+        <w:rPr>
+          <w:rFonts w:ascii="Times New Roman" w:hAnsi="Times New Roman" w:cs="Times New Roman" w:hint="eastAsia"/>
+          <w:sz w:val="24"/>
+        </w:rPr>
+        <w:t xml:space="preserve"> </w:t>
+      </w:r>
+      <w:r>
+        <w:rPr>
+          <w:rFonts w:ascii="Times New Roman" w:hAnsi="Times New Roman" w:cs="Times New Roman" w:hint="eastAsia"/>
+          <w:sz w:val="24"/>
+        </w:rPr>
+        <w:t xml:space="preserve">Pre-written </w:t>
+      </w:r>
+      <w:r>
+        <w:rPr>
+          <w:rFonts w:ascii="Times New Roman" w:hAnsi="Times New Roman" w:cs="Times New Roman"/>
+          <w:sz w:val="24"/>
+        </w:rPr>
+        <w:lastRenderedPageBreak/>
+        <w:t>functions</w:t>
+      </w:r>
+      <w:r>
+        <w:rPr>
+          <w:rFonts w:ascii="Times New Roman" w:hAnsi="Times New Roman" w:cs="Times New Roman" w:hint="eastAsia"/>
+          <w:sz w:val="24"/>
+        </w:rPr>
+        <w:t xml:space="preserve"> were simply called one-by-one</w:t>
+      </w:r>
+      <w:r>
+        <w:rPr>
+          <w:rFonts w:ascii="Times New Roman" w:hAnsi="Times New Roman" w:cs="Times New Roman"/>
+          <w:sz w:val="24"/>
+        </w:rPr>
+        <w:t xml:space="preserve"> except for multicollinearity </w:t>
+      </w:r>
+      <w:proofErr w:type="spellStart"/>
+      <w:r>
+        <w:rPr>
+          <w:rFonts w:ascii="Times New Roman" w:hAnsi="Times New Roman" w:cs="Times New Roman"/>
+          <w:sz w:val="24"/>
+        </w:rPr>
+        <w:t>disagnostics</w:t>
+      </w:r>
+      <w:proofErr w:type="spellEnd"/>
+      <w:r>
+        <w:rPr>
+          <w:rFonts w:ascii="Times New Roman" w:hAnsi="Times New Roman" w:cs="Times New Roman" w:hint="eastAsia"/>
+          <w:sz w:val="24"/>
+        </w:rPr>
+        <w:t xml:space="preserve">. </w:t>
+      </w:r>
+      <w:r>
+        <w:rPr>
+          <w:rFonts w:ascii="Times New Roman" w:hAnsi="Times New Roman" w:cs="Times New Roman"/>
+          <w:sz w:val="24"/>
+        </w:rPr>
+        <w:t xml:space="preserve">For normality, Q-Q plot and Shapiro-Wilk (S-W) test visually and statistically sufficient evidence for violation of normality, p = </w:t>
+      </w:r>
+      <w:r>
+        <w:rPr>
+          <w:rFonts w:ascii="Times New Roman" w:hAnsi="Times New Roman" w:cs="Times New Roman"/>
+          <w:sz w:val="24"/>
+        </w:rPr>
+        <w:t xml:space="preserve">0.013 </w:t>
+      </w:r>
+      <w:r>
+        <w:rPr>
+          <w:rStyle w:val="HTML"/>
+          <w:rFonts w:ascii="Times New Roman" w:hAnsi="Times New Roman" w:cs="Times New Roman"/>
+          <w:b/>
+          <w:bCs/>
+        </w:rPr>
+        <w:t>&lt;</w:t>
+      </w:r>
+      <w:r>
+        <w:rPr>
+          <w:rStyle w:val="HTML"/>
+          <w:rFonts w:ascii="Times New Roman" w:hAnsi="Times New Roman" w:cs="Times New Roman" w:hint="eastAsia"/>
+          <w:b/>
+          <w:bCs/>
+        </w:rPr>
+        <w:t xml:space="preserve"> </w:t>
+      </w:r>
+      <w:r>
+        <w:rPr>
+          <w:rStyle w:val="HTML"/>
+          <w:rFonts w:ascii="Times New Roman" w:hAnsi="Times New Roman" w:cs="Times New Roman" w:hint="eastAsia"/>
+        </w:rPr>
+        <w:t>0.05</w:t>
+      </w:r>
+      <w:r>
+        <w:rPr>
+          <w:rStyle w:val="HTML"/>
+          <w:rFonts w:ascii="Times New Roman" w:hAnsi="Times New Roman" w:cs="Times New Roman" w:hint="eastAsia"/>
+        </w:rPr>
+        <w:t xml:space="preserve"> in S-W test</w:t>
+      </w:r>
+      <w:r>
+        <w:rPr>
+          <w:rStyle w:val="HTML"/>
+          <w:rFonts w:ascii="Times New Roman" w:hAnsi="Times New Roman" w:cs="Times New Roman"/>
+        </w:rPr>
+        <w:t>. H</w:t>
+      </w:r>
+      <w:r>
+        <w:rPr>
+          <w:rStyle w:val="HTML"/>
+          <w:rFonts w:ascii="Times New Roman" w:hAnsi="Times New Roman" w:cs="Times New Roman"/>
+        </w:rPr>
+        <w:t>omoscedasticity</w:t>
+      </w:r>
+      <w:r>
+        <w:rPr>
+          <w:rStyle w:val="HTML"/>
+          <w:rFonts w:ascii="Times New Roman" w:hAnsi="Times New Roman" w:cs="Times New Roman"/>
+        </w:rPr>
+        <w:t xml:space="preserve">, independence of residuals, linearity, and outlier are </w:t>
+      </w:r>
+      <w:r>
+        <w:rPr>
+          <w:rStyle w:val="HTML"/>
+          <w:rFonts w:ascii="Times New Roman" w:hAnsi="Times New Roman" w:cs="Times New Roman"/>
+        </w:rPr>
+        <w:t>checked,</w:t>
+      </w:r>
+      <w:r>
+        <w:rPr>
+          <w:rStyle w:val="HTML"/>
+          <w:rFonts w:ascii="Times New Roman" w:hAnsi="Times New Roman" w:cs="Times New Roman"/>
+        </w:rPr>
+        <w:t xml:space="preserve"> and they are not violated. For </w:t>
+      </w:r>
+      <w:r>
+        <w:rPr>
+          <w:rStyle w:val="HTML"/>
+          <w:rFonts w:ascii="Times New Roman" w:hAnsi="Times New Roman" w:cs="Times New Roman"/>
+        </w:rPr>
+        <w:t>solving the violation of normality,</w:t>
+      </w:r>
+      <w:r>
+        <w:rPr>
+          <w:rStyle w:val="HTML"/>
+          <w:rFonts w:ascii="Times New Roman" w:hAnsi="Times New Roman" w:cs="Times New Roman"/>
+        </w:rPr>
+        <w:t xml:space="preserve"> </w:t>
+      </w:r>
+      <w:r>
+        <w:rPr>
+          <w:rStyle w:val="HTML"/>
+          <w:rFonts w:ascii="Times New Roman" w:hAnsi="Times New Roman" w:cs="Times New Roman"/>
+        </w:rPr>
+        <w:t>a nonparametric bootstrap was used to approximate the sampling distribution of the coefficient</w:t>
+      </w:r>
+      <w:r>
+        <w:rPr>
+          <w:rStyle w:val="HTML"/>
+          <w:rFonts w:ascii="Times New Roman" w:hAnsi="Times New Roman" w:cs="Times New Roman"/>
+        </w:rPr>
+        <w:t xml:space="preserve">, the bootstrapped 95% confidence interval (5000 resamples) is </w:t>
+      </w:r>
+      <w:r>
+        <w:rPr>
+          <w:rFonts w:ascii="Times New Roman" w:hAnsi="Times New Roman" w:cs="Times New Roman"/>
+          <w:sz w:val="24"/>
+        </w:rPr>
+        <w:t>[</w:t>
+      </w:r>
+      <w:r>
+        <w:rPr>
+          <w:rFonts w:ascii="Times New Roman" w:hAnsi="Times New Roman" w:cs="Times New Roman"/>
+          <w:sz w:val="24"/>
+        </w:rPr>
+        <w:t>-3.96, 0.54</w:t>
+      </w:r>
+      <w:r>
+        <w:rPr>
+          <w:rFonts w:ascii="Times New Roman" w:hAnsi="Times New Roman" w:cs="Times New Roman"/>
+          <w:sz w:val="24"/>
+        </w:rPr>
+        <w:t>]</w:t>
+      </w:r>
+      <w:r>
+        <w:rPr>
+          <w:rFonts w:ascii="Times New Roman" w:hAnsi="Times New Roman" w:cs="Times New Roman"/>
+          <w:sz w:val="24"/>
+        </w:rPr>
+        <w:t xml:space="preserve"> including 0, therefore, there is insufficient evidence for rejection of null hypothesis stating that there is no effect of sleep hours on emotion regulation. Practically, it </w:t>
+      </w:r>
+      <w:r>
+        <w:rPr>
+          <w:rFonts w:ascii="Times New Roman" w:hAnsi="Times New Roman" w:cs="Times New Roman"/>
+          <w:sz w:val="24"/>
+        </w:rPr>
+        <w:t xml:space="preserve">the </w:t>
+      </w:r>
+      <w:r>
+        <w:rPr>
+          <w:rFonts w:ascii="Times New Roman" w:hAnsi="Times New Roman" w:cs="Times New Roman"/>
+          <w:sz w:val="24"/>
+        </w:rPr>
+        <w:t>sample provides may support the change of sleep hours have nothing to do with change on emotion regulation at a population-level</w:t>
+      </w:r>
+    </w:p>
+    <w:p>
+      <w:pPr>
+        <w:spacing w:after="0" w:line="240" w:lineRule="auto"/>
+        <w:jc w:val="both"/>
+        <w:rPr>
+          <w:rStyle w:val="af4"/>
+          <w:rFonts w:ascii="Times New Roman" w:hAnsi="Times New Roman" w:cs="Times New Roman"/>
+          <w:sz w:val="20"/>
+          <w:szCs w:val="20"/>
+        </w:rPr>
+      </w:pPr>
+      <w:r>
+        <w:rPr>
+          <w:rStyle w:val="af4"/>
+          <w:rFonts w:ascii="Times New Roman" w:hAnsi="Times New Roman" w:cs="Times New Roman"/>
+          <w:sz w:val="20"/>
+          <w:szCs w:val="20"/>
+        </w:rPr>
+        <w:t xml:space="preserve">Figure </w:t>
+      </w:r>
+      <w:r>
+        <w:rPr>
+          <w:rStyle w:val="af4"/>
+          <w:rFonts w:ascii="Times New Roman" w:hAnsi="Times New Roman" w:cs="Times New Roman" w:hint="eastAsia"/>
+          <w:sz w:val="20"/>
+          <w:szCs w:val="20"/>
+        </w:rPr>
+        <w:t>2</w:t>
+      </w:r>
+      <w:r>
+        <w:rPr>
+          <w:rStyle w:val="af4"/>
+          <w:rFonts w:ascii="Times New Roman" w:hAnsi="Times New Roman" w:cs="Times New Roman"/>
+          <w:sz w:val="20"/>
+          <w:szCs w:val="20"/>
+        </w:rPr>
+        <w:t>.</w:t>
+      </w:r>
+      <w:r>
+        <w:rPr>
+          <w:rStyle w:val="af4"/>
+          <w:rFonts w:ascii="Times New Roman" w:hAnsi="Times New Roman" w:cs="Times New Roman" w:hint="eastAsia"/>
+          <w:sz w:val="20"/>
+          <w:szCs w:val="20"/>
+        </w:rPr>
+        <w:t>1</w:t>
+      </w:r>
+    </w:p>
+    <w:p>
+      <w:pPr>
+        <w:spacing w:after="0" w:line="240" w:lineRule="auto"/>
+        <w:jc w:val="both"/>
+        <w:rPr>
           <w:rFonts w:ascii="Times New Roman" w:hAnsi="Times New Roman" w:cs="Times New Roman"/>
           <w:b/>
           <w:bCs/>
@@ -7458,12 +8037,134 @@
           <w:rFonts w:ascii="Times New Roman" w:hAnsi="Times New Roman" w:cs="Times New Roman"/>
           <w:b/>
           <w:bCs/>
+          <w:noProof/>
           <w:sz w:val="26"/>
           <w:szCs w:val="26"/>
         </w:rPr>
-        <w:t>-</w:t>
-      </w:r>
-      <w:r>
+        <w:drawing>
+          <wp:anchor distT="0" distB="0" distL="114300" distR="114300" simplePos="0" relativeHeight="251659264" behindDoc="0" locked="0" layoutInCell="1" allowOverlap="1" wp14:anchorId="3A5E2690" wp14:editId="79E27620">
+            <wp:simplePos x="0" y="0"/>
+            <wp:positionH relativeFrom="column">
+              <wp:posOffset>3175</wp:posOffset>
+            </wp:positionH>
+            <wp:positionV relativeFrom="paragraph">
+              <wp:posOffset>204651</wp:posOffset>
+            </wp:positionV>
+            <wp:extent cx="4448628" cy="3208197"/>
+            <wp:effectExtent l="0" t="0" r="0" b="5080"/>
+            <wp:wrapSquare wrapText="bothSides"/>
+            <wp:docPr id="1959006581" name="图片 2" descr="图表, 散点图&#10;&#10;描述已自动生成"/>
+            <wp:cNvGraphicFramePr>
+              <a:graphicFrameLocks xmlns:a="http://schemas.openxmlformats.org/drawingml/2006/main" noChangeAspect="1"/>
+            </wp:cNvGraphicFramePr>
+            <a:graphic xmlns:a="http://schemas.openxmlformats.org/drawingml/2006/main">
+              <a:graphicData uri="http://schemas.openxmlformats.org/drawingml/2006/picture">
+                <pic:pic xmlns:pic="http://schemas.openxmlformats.org/drawingml/2006/picture">
+                  <pic:nvPicPr>
+                    <pic:cNvPr id="1959006581" name="图片 2" descr="图表, 散点图&#10;&#10;描述已自动生成"/>
+                    <pic:cNvPicPr/>
+                  </pic:nvPicPr>
+                  <pic:blipFill>
+                    <a:blip r:embed="rId9" cstate="print">
+                      <a:extLst>
+                        <a:ext uri="{28A0092B-C50C-407E-A947-70E740481C1C}">
+                          <a14:useLocalDpi xmlns:a14="http://schemas.microsoft.com/office/drawing/2010/main" val="0"/>
+                        </a:ext>
+                      </a:extLst>
+                    </a:blip>
+                    <a:stretch>
+                      <a:fillRect/>
+                    </a:stretch>
+                  </pic:blipFill>
+                  <pic:spPr>
+                    <a:xfrm>
+                      <a:off x="0" y="0"/>
+                      <a:ext cx="4448628" cy="3208197"/>
+                    </a:xfrm>
+                    <a:prstGeom prst="rect">
+                      <a:avLst/>
+                    </a:prstGeom>
+                  </pic:spPr>
+                </pic:pic>
+              </a:graphicData>
+            </a:graphic>
+            <wp14:sizeRelH relativeFrom="page">
+              <wp14:pctWidth>0</wp14:pctWidth>
+            </wp14:sizeRelH>
+            <wp14:sizeRelV relativeFrom="page">
+              <wp14:pctHeight>0</wp14:pctHeight>
+            </wp14:sizeRelV>
+          </wp:anchor>
+        </w:drawing>
+      </w:r>
+      <w:r>
+        <w:rPr>
+          <w:rStyle w:val="af4"/>
+          <w:rFonts w:ascii="Times New Roman" w:hAnsi="Times New Roman" w:cs="Times New Roman" w:hint="eastAsia"/>
+          <w:b w:val="0"/>
+          <w:bCs w:val="0"/>
+          <w:sz w:val="20"/>
+          <w:szCs w:val="20"/>
+        </w:rPr>
+        <w:t xml:space="preserve">Relationship </w:t>
+      </w:r>
+      <w:r>
+        <w:rPr>
+          <w:rStyle w:val="af4"/>
+          <w:rFonts w:ascii="Times New Roman" w:hAnsi="Times New Roman" w:cs="Times New Roman"/>
+          <w:b w:val="0"/>
+          <w:bCs w:val="0"/>
+          <w:sz w:val="20"/>
+          <w:szCs w:val="20"/>
+        </w:rPr>
+        <w:t>bet</w:t>
+      </w:r>
+      <w:r>
+        <w:rPr>
+          <w:rStyle w:val="af4"/>
+          <w:rFonts w:ascii="Times New Roman" w:hAnsi="Times New Roman" w:cs="Times New Roman" w:hint="eastAsia"/>
+          <w:b w:val="0"/>
+          <w:bCs w:val="0"/>
+          <w:sz w:val="20"/>
+          <w:szCs w:val="20"/>
+        </w:rPr>
+        <w:t xml:space="preserve">ween Mean-centering Sleep Hours and Emotion </w:t>
+      </w:r>
+      <w:r>
+        <w:rPr>
+          <w:rStyle w:val="af4"/>
+          <w:rFonts w:ascii="Times New Roman" w:hAnsi="Times New Roman" w:cs="Times New Roman"/>
+          <w:b w:val="0"/>
+          <w:bCs w:val="0"/>
+          <w:sz w:val="20"/>
+          <w:szCs w:val="20"/>
+        </w:rPr>
+        <w:t>Regulation</w:t>
+      </w:r>
+      <w:r>
+        <w:rPr>
+          <w:rStyle w:val="af4"/>
+          <w:rFonts w:ascii="Times New Roman" w:hAnsi="Times New Roman" w:cs="Times New Roman" w:hint="eastAsia"/>
+          <w:b w:val="0"/>
+          <w:bCs w:val="0"/>
+          <w:sz w:val="20"/>
+          <w:szCs w:val="20"/>
+        </w:rPr>
+        <w:t xml:space="preserve"> Scores</w:t>
+      </w:r>
+      <w:r>
+        <w:rPr>
+          <w:rFonts w:ascii="Times New Roman" w:hAnsi="Times New Roman" w:cs="Times New Roman" w:hint="eastAsia"/>
+          <w:sz w:val="20"/>
+          <w:szCs w:val="20"/>
+        </w:rPr>
+        <w:br/>
+      </w:r>
+    </w:p>
+    <w:p>
+      <w:pPr>
+        <w:spacing w:after="0" w:line="240" w:lineRule="auto"/>
+        <w:jc w:val="both"/>
         <w:rPr>
           <w:rFonts w:ascii="Times New Roman" w:hAnsi="Times New Roman" w:cs="Times New Roman"/>
           <w:b/>
@@ -7471,9 +8172,12 @@
           <w:sz w:val="26"/>
           <w:szCs w:val="26"/>
         </w:rPr>
-        <w:t xml:space="preserve">OVERALL </w:t>
-      </w:r>
-      <w:r>
+      </w:pPr>
+    </w:p>
+    <w:p>
+      <w:pPr>
+        <w:spacing w:after="0" w:line="240" w:lineRule="auto"/>
+        <w:jc w:val="both"/>
         <w:rPr>
           <w:rFonts w:ascii="Times New Roman" w:hAnsi="Times New Roman" w:cs="Times New Roman"/>
           <w:b/>
@@ -7481,8 +8185,7 @@
           <w:sz w:val="26"/>
           <w:szCs w:val="26"/>
         </w:rPr>
-        <w:t>CONCLUSION</w:t>
-      </w:r>
+      </w:pPr>
     </w:p>
     <w:p>
       <w:pPr>
@@ -7492,13 +8195,15 @@
           <w:rFonts w:ascii="Times New Roman" w:hAnsi="Times New Roman" w:cs="Times New Roman"/>
           <w:b/>
           <w:bCs/>
-          <w:i/>
-          <w:iCs/>
           <w:sz w:val="26"/>
           <w:szCs w:val="26"/>
         </w:rPr>
       </w:pPr>
-      <w:r>
+    </w:p>
+    <w:p>
+      <w:pPr>
+        <w:spacing w:after="0" w:line="240" w:lineRule="auto"/>
+        <w:jc w:val="both"/>
         <w:rPr>
           <w:rFonts w:ascii="Times New Roman" w:hAnsi="Times New Roman" w:cs="Times New Roman"/>
           <w:b/>
@@ -7506,7 +8211,545 @@
           <w:sz w:val="26"/>
           <w:szCs w:val="26"/>
         </w:rPr>
+      </w:pPr>
+    </w:p>
+    <w:p>
+      <w:pPr>
+        <w:spacing w:after="0" w:line="240" w:lineRule="auto"/>
+        <w:jc w:val="both"/>
+        <w:rPr>
+          <w:rFonts w:ascii="Times New Roman" w:hAnsi="Times New Roman" w:cs="Times New Roman"/>
+          <w:b/>
+          <w:bCs/>
+          <w:sz w:val="26"/>
+          <w:szCs w:val="26"/>
+        </w:rPr>
+      </w:pPr>
+    </w:p>
+    <w:p>
+      <w:pPr>
+        <w:spacing w:after="0" w:line="240" w:lineRule="auto"/>
+        <w:jc w:val="both"/>
+        <w:rPr>
+          <w:rFonts w:ascii="Times New Roman" w:hAnsi="Times New Roman" w:cs="Times New Roman"/>
+          <w:b/>
+          <w:bCs/>
+          <w:sz w:val="26"/>
+          <w:szCs w:val="26"/>
+        </w:rPr>
+      </w:pPr>
+    </w:p>
+    <w:p>
+      <w:pPr>
+        <w:spacing w:after="0" w:line="240" w:lineRule="auto"/>
+        <w:jc w:val="both"/>
+        <w:rPr>
+          <w:rFonts w:ascii="Times New Roman" w:hAnsi="Times New Roman" w:cs="Times New Roman"/>
+          <w:b/>
+          <w:bCs/>
+          <w:sz w:val="26"/>
+          <w:szCs w:val="26"/>
+        </w:rPr>
+      </w:pPr>
+    </w:p>
+    <w:p>
+      <w:pPr>
+        <w:spacing w:after="0" w:line="240" w:lineRule="auto"/>
+        <w:jc w:val="both"/>
+        <w:rPr>
+          <w:rFonts w:ascii="Times New Roman" w:hAnsi="Times New Roman" w:cs="Times New Roman"/>
+          <w:b/>
+          <w:bCs/>
+          <w:sz w:val="26"/>
+          <w:szCs w:val="26"/>
+        </w:rPr>
+      </w:pPr>
+    </w:p>
+    <w:p>
+      <w:pPr>
+        <w:spacing w:after="0" w:line="240" w:lineRule="auto"/>
+        <w:jc w:val="both"/>
+        <w:rPr>
+          <w:rFonts w:ascii="Times New Roman" w:hAnsi="Times New Roman" w:cs="Times New Roman"/>
+          <w:b/>
+          <w:bCs/>
+          <w:sz w:val="26"/>
+          <w:szCs w:val="26"/>
+        </w:rPr>
+      </w:pPr>
+    </w:p>
+    <w:p>
+      <w:pPr>
+        <w:spacing w:after="0" w:line="240" w:lineRule="auto"/>
+        <w:jc w:val="both"/>
+        <w:rPr>
+          <w:rFonts w:ascii="Times New Roman" w:hAnsi="Times New Roman" w:cs="Times New Roman"/>
+          <w:b/>
+          <w:bCs/>
+          <w:sz w:val="26"/>
+          <w:szCs w:val="26"/>
+        </w:rPr>
+      </w:pPr>
+    </w:p>
+    <w:p>
+      <w:pPr>
+        <w:spacing w:after="0" w:line="240" w:lineRule="auto"/>
+        <w:jc w:val="both"/>
+        <w:rPr>
+          <w:rFonts w:ascii="Times New Roman" w:hAnsi="Times New Roman" w:cs="Times New Roman"/>
+          <w:b/>
+          <w:bCs/>
+          <w:sz w:val="26"/>
+          <w:szCs w:val="26"/>
+        </w:rPr>
+      </w:pPr>
+    </w:p>
+    <w:p>
+      <w:pPr>
+        <w:spacing w:after="0" w:line="240" w:lineRule="auto"/>
+        <w:jc w:val="both"/>
+        <w:rPr>
+          <w:rFonts w:ascii="Times New Roman" w:hAnsi="Times New Roman" w:cs="Times New Roman"/>
+          <w:b/>
+          <w:bCs/>
+          <w:sz w:val="26"/>
+          <w:szCs w:val="26"/>
+        </w:rPr>
+      </w:pPr>
+    </w:p>
+    <w:p>
+      <w:pPr>
+        <w:spacing w:after="0" w:line="240" w:lineRule="auto"/>
+        <w:jc w:val="both"/>
+        <w:rPr>
+          <w:rFonts w:ascii="Times New Roman" w:hAnsi="Times New Roman" w:cs="Times New Roman"/>
+          <w:b/>
+          <w:bCs/>
+          <w:sz w:val="26"/>
+          <w:szCs w:val="26"/>
+        </w:rPr>
+      </w:pPr>
+    </w:p>
+    <w:p>
+      <w:pPr>
+        <w:spacing w:after="0" w:line="240" w:lineRule="auto"/>
+        <w:jc w:val="both"/>
+        <w:rPr>
+          <w:rFonts w:ascii="Times New Roman" w:hAnsi="Times New Roman" w:cs="Times New Roman"/>
+          <w:b/>
+          <w:bCs/>
+          <w:sz w:val="26"/>
+          <w:szCs w:val="26"/>
+        </w:rPr>
+      </w:pPr>
+    </w:p>
+    <w:p>
+      <w:pPr>
+        <w:spacing w:after="0" w:line="240" w:lineRule="auto"/>
+        <w:jc w:val="both"/>
+        <w:rPr>
+          <w:rFonts w:ascii="Times New Roman" w:hAnsi="Times New Roman" w:cs="Times New Roman"/>
+          <w:b/>
+          <w:bCs/>
+          <w:sz w:val="26"/>
+          <w:szCs w:val="26"/>
+        </w:rPr>
+      </w:pPr>
+    </w:p>
+    <w:p>
+      <w:pPr>
+        <w:spacing w:after="0" w:line="240" w:lineRule="auto"/>
+        <w:jc w:val="both"/>
+        <w:rPr>
+          <w:rFonts w:ascii="Times New Roman" w:hAnsi="Times New Roman" w:cs="Times New Roman"/>
+          <w:b/>
+          <w:bCs/>
+          <w:sz w:val="26"/>
+          <w:szCs w:val="26"/>
+        </w:rPr>
+      </w:pPr>
+    </w:p>
+    <w:p>
+      <w:pPr>
+        <w:spacing w:after="0" w:line="240" w:lineRule="auto"/>
+        <w:jc w:val="both"/>
+        <w:rPr>
+          <w:rFonts w:ascii="Times New Roman" w:hAnsi="Times New Roman" w:cs="Times New Roman"/>
+          <w:sz w:val="20"/>
+          <w:szCs w:val="20"/>
+          <w:lang w:eastAsia="ja-JP"/>
+        </w:rPr>
+      </w:pPr>
+      <w:r>
+        <w:rPr>
+          <w:rFonts w:ascii="Times New Roman" w:hAnsi="Times New Roman" w:cs="Times New Roman" w:hint="eastAsia"/>
+          <w:b/>
+          <w:bCs/>
+          <w:noProof/>
+          <w:sz w:val="20"/>
+          <w:szCs w:val="20"/>
+        </w:rPr>
+        <w:t>Note</w:t>
+      </w:r>
+      <w:r>
+        <w:rPr>
+          <w:rFonts w:ascii="Times New Roman" w:hAnsi="Times New Roman" w:cs="Times New Roman"/>
+          <w:b/>
+          <w:bCs/>
+          <w:noProof/>
+          <w:sz w:val="20"/>
+          <w:szCs w:val="20"/>
+        </w:rPr>
+        <w:t> :</w:t>
+      </w:r>
+      <w:r>
+        <w:rPr>
+          <w:rFonts w:ascii="Times New Roman" w:hAnsi="Times New Roman" w:cs="Times New Roman"/>
+          <w:noProof/>
+          <w:sz w:val="20"/>
+          <w:szCs w:val="20"/>
+        </w:rPr>
+        <w:t xml:space="preserve"> </w:t>
+      </w:r>
+      <w:r>
+        <w:rPr>
+          <w:rFonts w:ascii="Times New Roman" w:hAnsi="Times New Roman" w:cs="Times New Roman"/>
+          <w:sz w:val="21"/>
+          <w:szCs w:val="21"/>
+        </w:rPr>
+        <w:t xml:space="preserve">The shaded area represents the 95% confidence interval </w:t>
+      </w:r>
+      <w:r>
+        <w:rPr>
+          <w:rFonts w:ascii="Times New Roman" w:hAnsi="Times New Roman" w:cs="Times New Roman"/>
+          <w:sz w:val="21"/>
+          <w:szCs w:val="21"/>
+        </w:rPr>
+        <w:t xml:space="preserve">around the fitted regression line </w:t>
+      </w:r>
+      <w:r>
+        <w:rPr>
+          <w:rFonts w:ascii="Times New Roman" w:hAnsi="Times New Roman" w:cs="Times New Roman"/>
+          <w:sz w:val="21"/>
+          <w:szCs w:val="21"/>
+        </w:rPr>
+        <w:t>for the estimated mean outcome at corresponding values of the predictor.</w:t>
+      </w:r>
+    </w:p>
+    <w:p>
+      <w:pPr>
+        <w:spacing w:after="0" w:line="240" w:lineRule="auto"/>
+        <w:jc w:val="both"/>
+        <w:rPr>
+          <w:rFonts w:ascii="Times New Roman" w:hAnsi="Times New Roman" w:cs="Times New Roman" w:hint="eastAsia"/>
+          <w:b/>
+          <w:bCs/>
+          <w:sz w:val="26"/>
+          <w:szCs w:val="26"/>
+        </w:rPr>
+      </w:pPr>
+    </w:p>
+    <w:p>
+      <w:pPr>
+        <w:spacing w:after="0" w:line="240" w:lineRule="auto"/>
+        <w:jc w:val="both"/>
+        <w:rPr>
+          <w:rFonts w:ascii="Times New Roman" w:hAnsi="Times New Roman" w:cs="Times New Roman"/>
+          <w:b/>
+          <w:bCs/>
+          <w:sz w:val="26"/>
+          <w:szCs w:val="26"/>
+        </w:rPr>
+      </w:pPr>
+    </w:p>
+    <w:p>
+      <w:pPr>
+        <w:spacing w:after="0" w:line="240" w:lineRule="auto"/>
+        <w:jc w:val="both"/>
+        <w:rPr>
+          <w:rFonts w:ascii="Times New Roman" w:hAnsi="Times New Roman" w:cs="Times New Roman"/>
+          <w:b/>
+          <w:bCs/>
+          <w:sz w:val="26"/>
+          <w:szCs w:val="26"/>
+        </w:rPr>
+      </w:pPr>
+    </w:p>
+    <w:p>
+      <w:pPr>
+        <w:spacing w:after="0" w:line="240" w:lineRule="auto"/>
+        <w:jc w:val="both"/>
+        <w:rPr>
+          <w:rFonts w:ascii="Times New Roman" w:hAnsi="Times New Roman" w:cs="Times New Roman"/>
+          <w:b/>
+          <w:bCs/>
+          <w:sz w:val="26"/>
+          <w:szCs w:val="26"/>
+        </w:rPr>
+      </w:pPr>
+      <w:r>
+        <w:rPr>
+          <w:rFonts w:ascii="Times New Roman" w:hAnsi="Times New Roman" w:cs="Times New Roman"/>
+          <w:b/>
+          <w:bCs/>
+          <w:sz w:val="26"/>
+          <w:szCs w:val="26"/>
+        </w:rPr>
+        <w:t xml:space="preserve">-Aim2 </w:t>
+      </w:r>
+      <w:r>
+        <w:rPr>
+          <w:rFonts w:ascii="Times New Roman" w:hAnsi="Times New Roman" w:cs="Times New Roman"/>
+          <w:b/>
+          <w:bCs/>
+          <w:sz w:val="26"/>
+          <w:szCs w:val="26"/>
+        </w:rPr>
+        <w:t>Results and Discussions</w:t>
+      </w:r>
+    </w:p>
+    <w:p>
+      <w:pPr>
+        <w:spacing w:after="0" w:line="240" w:lineRule="auto"/>
+        <w:jc w:val="both"/>
+        <w:rPr>
+          <w:rFonts w:ascii="Times New Roman" w:hAnsi="Times New Roman" w:cs="Times New Roman"/>
+          <w:b/>
+          <w:bCs/>
+          <w:sz w:val="26"/>
+          <w:szCs w:val="26"/>
+        </w:rPr>
+      </w:pPr>
+    </w:p>
+    <w:p>
+      <w:pPr>
+        <w:spacing w:after="0" w:line="240" w:lineRule="auto"/>
+        <w:jc w:val="both"/>
+        <w:rPr>
+          <w:rFonts w:ascii="Times New Roman" w:hAnsi="Times New Roman" w:cs="Times New Roman"/>
+          <w:b/>
+          <w:bCs/>
+          <w:sz w:val="26"/>
+          <w:szCs w:val="26"/>
+        </w:rPr>
+      </w:pPr>
+    </w:p>
+    <w:p>
+      <w:pPr>
+        <w:spacing w:after="0" w:line="240" w:lineRule="auto"/>
+        <w:jc w:val="both"/>
+        <w:rPr>
+          <w:rFonts w:ascii="Times New Roman" w:hAnsi="Times New Roman" w:cs="Times New Roman"/>
+          <w:b/>
+          <w:bCs/>
+          <w:sz w:val="26"/>
+          <w:szCs w:val="26"/>
+        </w:rPr>
+      </w:pPr>
+    </w:p>
+    <w:p>
+      <w:pPr>
+        <w:spacing w:after="0" w:line="240" w:lineRule="auto"/>
+        <w:jc w:val="both"/>
+        <w:rPr>
+          <w:rFonts w:ascii="Times New Roman" w:hAnsi="Times New Roman" w:cs="Times New Roman"/>
+          <w:b/>
+          <w:bCs/>
+          <w:sz w:val="26"/>
+          <w:szCs w:val="26"/>
+        </w:rPr>
+      </w:pPr>
+    </w:p>
+    <w:p>
+      <w:pPr>
+        <w:spacing w:after="0" w:line="240" w:lineRule="auto"/>
+        <w:jc w:val="both"/>
+        <w:rPr>
+          <w:rFonts w:ascii="Times New Roman" w:hAnsi="Times New Roman" w:cs="Times New Roman"/>
+          <w:b/>
+          <w:bCs/>
+          <w:sz w:val="26"/>
+          <w:szCs w:val="26"/>
+        </w:rPr>
+      </w:pPr>
+    </w:p>
+    <w:p>
+      <w:pPr>
+        <w:spacing w:after="0" w:line="240" w:lineRule="auto"/>
+        <w:jc w:val="both"/>
+        <w:rPr>
+          <w:rFonts w:ascii="Times New Roman" w:hAnsi="Times New Roman" w:cs="Times New Roman"/>
+          <w:b/>
+          <w:bCs/>
+          <w:sz w:val="26"/>
+          <w:szCs w:val="26"/>
+        </w:rPr>
+      </w:pPr>
+    </w:p>
+    <w:p>
+      <w:pPr>
+        <w:spacing w:after="0" w:line="240" w:lineRule="auto"/>
+        <w:jc w:val="both"/>
+        <w:rPr>
+          <w:rFonts w:ascii="Times New Roman" w:hAnsi="Times New Roman" w:cs="Times New Roman"/>
+          <w:b/>
+          <w:bCs/>
+          <w:sz w:val="26"/>
+          <w:szCs w:val="26"/>
+        </w:rPr>
+      </w:pPr>
+    </w:p>
+    <w:p>
+      <w:pPr>
+        <w:spacing w:after="0" w:line="240" w:lineRule="auto"/>
+        <w:jc w:val="both"/>
+        <w:rPr>
+          <w:rFonts w:ascii="Times New Roman" w:hAnsi="Times New Roman" w:cs="Times New Roman"/>
+          <w:b/>
+          <w:bCs/>
+          <w:sz w:val="26"/>
+          <w:szCs w:val="26"/>
+        </w:rPr>
+      </w:pPr>
+    </w:p>
+    <w:p>
+      <w:pPr>
+        <w:spacing w:after="0" w:line="240" w:lineRule="auto"/>
+        <w:jc w:val="both"/>
+        <w:rPr>
+          <w:rFonts w:ascii="Times New Roman" w:hAnsi="Times New Roman" w:cs="Times New Roman"/>
+          <w:b/>
+          <w:bCs/>
+          <w:sz w:val="26"/>
+          <w:szCs w:val="26"/>
+        </w:rPr>
+      </w:pPr>
+    </w:p>
+    <w:p>
+      <w:pPr>
+        <w:spacing w:after="0" w:line="240" w:lineRule="auto"/>
+        <w:jc w:val="both"/>
+        <w:rPr>
+          <w:rFonts w:ascii="Times New Roman" w:hAnsi="Times New Roman" w:cs="Times New Roman"/>
+          <w:b/>
+          <w:bCs/>
+          <w:sz w:val="26"/>
+          <w:szCs w:val="26"/>
+        </w:rPr>
+      </w:pPr>
+    </w:p>
+    <w:p>
+      <w:pPr>
+        <w:spacing w:after="0" w:line="240" w:lineRule="auto"/>
+        <w:jc w:val="both"/>
+        <w:rPr>
+          <w:rFonts w:ascii="Times New Roman" w:hAnsi="Times New Roman" w:cs="Times New Roman"/>
+          <w:b/>
+          <w:bCs/>
+          <w:sz w:val="26"/>
+          <w:szCs w:val="26"/>
+        </w:rPr>
+      </w:pPr>
+    </w:p>
+    <w:p>
+      <w:pPr>
+        <w:spacing w:after="0" w:line="240" w:lineRule="auto"/>
+        <w:jc w:val="both"/>
+        <w:rPr>
+          <w:rFonts w:ascii="Times New Roman" w:hAnsi="Times New Roman" w:cs="Times New Roman"/>
+          <w:b/>
+          <w:bCs/>
+          <w:sz w:val="26"/>
+          <w:szCs w:val="26"/>
+        </w:rPr>
+      </w:pPr>
+      <w:r>
+        <w:rPr>
+          <w:rFonts w:ascii="Times New Roman" w:hAnsi="Times New Roman" w:cs="Times New Roman"/>
+          <w:b/>
+          <w:bCs/>
+          <w:sz w:val="26"/>
+          <w:szCs w:val="26"/>
+        </w:rPr>
+        <w:t>-</w:t>
+      </w:r>
+      <w:r>
+        <w:rPr>
+          <w:rFonts w:ascii="Times New Roman" w:hAnsi="Times New Roman" w:cs="Times New Roman"/>
+          <w:b/>
+          <w:bCs/>
+          <w:sz w:val="26"/>
+          <w:szCs w:val="26"/>
+        </w:rPr>
+        <w:t xml:space="preserve">OVERALL </w:t>
+      </w:r>
+      <w:r>
+        <w:rPr>
+          <w:rFonts w:ascii="Times New Roman" w:hAnsi="Times New Roman" w:cs="Times New Roman"/>
+          <w:b/>
+          <w:bCs/>
+          <w:sz w:val="26"/>
+          <w:szCs w:val="26"/>
+        </w:rPr>
+        <w:t>CONCLUSION</w:t>
+      </w:r>
+    </w:p>
+    <w:p>
+      <w:pPr>
+        <w:spacing w:after="0" w:line="240" w:lineRule="auto"/>
+        <w:jc w:val="both"/>
+        <w:rPr>
+          <w:rFonts w:ascii="Times New Roman" w:hAnsi="Times New Roman" w:cs="Times New Roman"/>
+          <w:b/>
+          <w:bCs/>
+          <w:sz w:val="26"/>
+          <w:szCs w:val="26"/>
+        </w:rPr>
+      </w:pPr>
+      <w:r>
+        <w:rPr>
+          <w:rFonts w:ascii="Times New Roman" w:hAnsi="Times New Roman" w:cs="Times New Roman"/>
+          <w:b/>
+          <w:bCs/>
+          <w:sz w:val="26"/>
+          <w:szCs w:val="26"/>
+        </w:rPr>
         <w:t>-LIMITATION</w:t>
+      </w:r>
+      <w:r>
+        <w:rPr>
+          <w:rFonts w:ascii="Times New Roman" w:hAnsi="Times New Roman" w:cs="Times New Roman"/>
+          <w:b/>
+          <w:bCs/>
+          <w:sz w:val="26"/>
+          <w:szCs w:val="26"/>
+        </w:rPr>
+        <w:t>S</w:t>
+      </w:r>
+    </w:p>
+    <w:p>
+      <w:pPr>
+        <w:spacing w:after="0" w:line="240" w:lineRule="auto"/>
+        <w:jc w:val="both"/>
+        <w:rPr>
+          <w:rFonts w:ascii="Times New Roman" w:hAnsi="Times New Roman" w:cs="Times New Roman"/>
+          <w:b/>
+          <w:bCs/>
+          <w:sz w:val="26"/>
+          <w:szCs w:val="26"/>
+          <w:lang w:val="fr-CA"/>
+        </w:rPr>
+      </w:pPr>
+      <w:r>
+        <w:rPr>
+          <w:rFonts w:ascii="Times New Roman" w:hAnsi="Times New Roman" w:cs="Times New Roman"/>
+          <w:b/>
+          <w:bCs/>
+          <w:sz w:val="26"/>
+          <w:szCs w:val="26"/>
+          <w:lang w:val="fr-CA"/>
+        </w:rPr>
+        <w:t>-REFERENCES</w:t>
       </w:r>
     </w:p>
     <w:p>

</xml_diff>

<commit_message>
Finish of Aim1_Analysis Result(First edit)
</commit_message>
<xml_diff>
--- a/Project1_Sleep_Deprivation_Cognition/Report/Analysis_Report.docx
+++ b/Project1_Sleep_Deprivation_Cognition/Report/Analysis_Report.docx
@@ -5806,7 +5806,7 @@
           <w:szCs w:val="20"/>
         </w:rPr>
         <w:drawing>
-          <wp:anchor distT="0" distB="0" distL="114300" distR="114300" simplePos="0" relativeHeight="251658240" behindDoc="0" locked="0" layoutInCell="1" allowOverlap="1" wp14:anchorId="6C018DE2" wp14:editId="3081F761">
+          <wp:anchor distT="0" distB="0" distL="114300" distR="114300" simplePos="0" relativeHeight="251658240" behindDoc="0" locked="0" layoutInCell="1" allowOverlap="1" wp14:anchorId="6C018DE2" wp14:editId="3DE052DD">
             <wp:simplePos x="0" y="0"/>
             <wp:positionH relativeFrom="column">
               <wp:posOffset>1270</wp:posOffset>
@@ -7475,7 +7475,7 @@
           <w:sz w:val="26"/>
           <w:szCs w:val="26"/>
         </w:rPr>
-        <w:t xml:space="preserve"> Results and Discussions</w:t>
+        <w:t xml:space="preserve"> Results</w:t>
       </w:r>
     </w:p>
     <w:p>
@@ -7507,11 +7507,27 @@
       </w:r>
       <w:r>
         <w:rPr>
-          <w:rFonts w:ascii="Times New Roman" w:hAnsi="Times New Roman" w:cs="Times New Roman"/>
+          <w:rFonts w:ascii="Times New Roman" w:hAnsi="Times New Roman" w:cs="Times New Roman" w:hint="eastAsia"/>
           <w:sz w:val="26"/>
           <w:szCs w:val="26"/>
         </w:rPr>
-        <w:t>Model1.1</w:t>
+        <w:t>Aim1</w:t>
+      </w:r>
+      <w:r>
+        <w:rPr>
+          <w:rFonts w:ascii="Times New Roman" w:hAnsi="Times New Roman" w:cs="Times New Roman"/>
+          <w:sz w:val="26"/>
+          <w:szCs w:val="26"/>
+        </w:rPr>
+        <w:t>_</w:t>
+      </w:r>
+      <w:r>
+        <w:rPr>
+          <w:rFonts w:ascii="Times New Roman" w:hAnsi="Times New Roman" w:cs="Times New Roman"/>
+          <w:sz w:val="26"/>
+          <w:szCs w:val="26"/>
+        </w:rPr>
+        <w:t>model1</w:t>
       </w:r>
       <w:r>
         <w:rPr>
@@ -7644,14 +7660,7 @@
           <w:rFonts w:ascii="Times New Roman" w:hAnsi="Times New Roman" w:cs="Times New Roman"/>
           <w:sz w:val="24"/>
         </w:rPr>
-        <w:t xml:space="preserve"> but this result is not statistically significant, b = -1.67, SE = 1.21, t-value = -1.38 and p-value = 0.17 </w:t>
-      </w:r>
-      <w:r>
-        <w:rPr>
-          <w:rFonts w:ascii="Times New Roman" w:hAnsi="Times New Roman" w:cs="Times New Roman"/>
-          <w:sz w:val="24"/>
-        </w:rPr>
-        <w:t>&gt;</w:t>
+        <w:t xml:space="preserve"> but this result is not statistically significant, b = -1.67, SE = 1.21, t-value = -1.38 and p-value = 0.17 &gt;</w:t>
       </w:r>
       <w:r>
         <w:rPr>
@@ -7693,7 +7702,21 @@
           <w:rFonts w:ascii="Times New Roman" w:hAnsi="Times New Roman" w:cs="Times New Roman" w:hint="eastAsia"/>
           <w:sz w:val="24"/>
         </w:rPr>
-        <w:t xml:space="preserve"> 3.2% </w:t>
+        <w:t xml:space="preserve"> 3.2</w:t>
+      </w:r>
+      <w:r>
+        <w:rPr>
+          <w:rFonts w:ascii="Times New Roman" w:hAnsi="Times New Roman" w:cs="Times New Roman"/>
+          <w:sz w:val="24"/>
+        </w:rPr>
+        <w:t>0</w:t>
+      </w:r>
+      <w:r>
+        <w:rPr>
+          <w:rFonts w:ascii="Times New Roman" w:hAnsi="Times New Roman" w:cs="Times New Roman" w:hint="eastAsia"/>
+          <w:sz w:val="24"/>
+        </w:rPr>
+        <w:t xml:space="preserve">% </w:t>
       </w:r>
       <w:r>
         <w:rPr>
@@ -7722,7 +7745,7 @@
         <w:spacing w:after="0" w:line="240" w:lineRule="auto"/>
         <w:jc w:val="both"/>
         <w:rPr>
-          <w:rFonts w:ascii="Times New Roman" w:eastAsia="宋体" w:hAnsi="Times New Roman" w:cs="Times New Roman"/>
+          <w:rFonts w:ascii="Times New Roman" w:hAnsi="Times New Roman" w:cs="Times New Roman"/>
           <w:sz w:val="24"/>
         </w:rPr>
       </w:pPr>
@@ -7738,28 +7761,7 @@
           <w:rFonts w:ascii="Times New Roman" w:hAnsi="Times New Roman" w:cs="Times New Roman"/>
           <w:sz w:val="24"/>
         </w:rPr>
-        <w:t xml:space="preserve">Assumption diagnostics were then conducted to assess whether estimated sampling distribution of the regression coefficients could be considered sufficiently consistent with theoretical expectations for </w:t>
-      </w:r>
-      <w:r>
-        <w:rPr>
-          <w:rFonts w:ascii="Times New Roman" w:hAnsi="Times New Roman" w:cs="Times New Roman" w:hint="eastAsia"/>
-          <w:sz w:val="24"/>
-        </w:rPr>
-        <w:t>accurate</w:t>
-      </w:r>
-      <w:r>
-        <w:rPr>
-          <w:rFonts w:ascii="Times New Roman" w:hAnsi="Times New Roman" w:cs="Times New Roman"/>
-          <w:sz w:val="24"/>
-        </w:rPr>
-        <w:t xml:space="preserve"> inference</w:t>
-      </w:r>
-      <w:r>
-        <w:rPr>
-          <w:rFonts w:ascii="Times New Roman" w:hAnsi="Times New Roman" w:cs="Times New Roman" w:hint="eastAsia"/>
-          <w:sz w:val="24"/>
-        </w:rPr>
-        <w:t xml:space="preserve"> and estimation</w:t>
+        <w:t>Assumption diagnostics were then conducted to assess whether the model conditions supporting valid statistical inference were reasonably satisfied</w:t>
       </w:r>
       <w:r>
         <w:rPr>
@@ -7770,17 +7772,17 @@
       </w:r>
       <w:r>
         <w:rPr>
-          <w:rFonts w:ascii="Times New Roman" w:hAnsi="Times New Roman" w:cs="Times New Roman" w:hint="eastAsia"/>
+          <w:rFonts w:ascii="Times New Roman" w:hAnsi="Times New Roman" w:cs="Times New Roman"/>
           <w:sz w:val="24"/>
         </w:rPr>
         <w:t xml:space="preserve"> </w:t>
       </w:r>
       <w:r>
         <w:rPr>
-          <w:rFonts w:ascii="Times New Roman" w:hAnsi="Times New Roman" w:cs="Times New Roman" w:hint="eastAsia"/>
-          <w:sz w:val="24"/>
-        </w:rPr>
-        <w:t xml:space="preserve">Pre-written </w:t>
+          <w:rFonts w:ascii="Times New Roman" w:hAnsi="Times New Roman" w:cs="Times New Roman"/>
+          <w:sz w:val="24"/>
+        </w:rPr>
+        <w:t xml:space="preserve">Pre-written diagnostic functions were applied sequentially, except for multicollinearity diagnostics, which </w:t>
       </w:r>
       <w:r>
         <w:rPr>
@@ -7788,34 +7790,18 @@
           <w:sz w:val="24"/>
         </w:rPr>
         <w:lastRenderedPageBreak/>
-        <w:t>functions</w:t>
-      </w:r>
-      <w:r>
-        <w:rPr>
-          <w:rFonts w:ascii="Times New Roman" w:hAnsi="Times New Roman" w:cs="Times New Roman" w:hint="eastAsia"/>
-          <w:sz w:val="24"/>
-        </w:rPr>
-        <w:t xml:space="preserve"> were simply called one-by-one</w:t>
-      </w:r>
-      <w:r>
-        <w:rPr>
-          <w:rFonts w:ascii="Times New Roman" w:hAnsi="Times New Roman" w:cs="Times New Roman"/>
-          <w:sz w:val="24"/>
-        </w:rPr>
-        <w:t xml:space="preserve"> except for multicollinearity </w:t>
-      </w:r>
-      <w:proofErr w:type="spellStart"/>
-      <w:r>
-        <w:rPr>
-          <w:rFonts w:ascii="Times New Roman" w:hAnsi="Times New Roman" w:cs="Times New Roman"/>
-          <w:sz w:val="24"/>
-        </w:rPr>
-        <w:t>disagnostics</w:t>
-      </w:r>
-      <w:proofErr w:type="spellEnd"/>
-      <w:r>
-        <w:rPr>
-          <w:rFonts w:ascii="Times New Roman" w:hAnsi="Times New Roman" w:cs="Times New Roman" w:hint="eastAsia"/>
+        <w:t>were not required for t</w:t>
+      </w:r>
+      <w:r>
+        <w:rPr>
+          <w:rFonts w:ascii="Times New Roman" w:hAnsi="Times New Roman" w:cs="Times New Roman"/>
+          <w:sz w:val="24"/>
+        </w:rPr>
+        <w:t>his single-predictor model</w:t>
+      </w:r>
+      <w:r>
+        <w:rPr>
+          <w:rFonts w:ascii="Times New Roman" w:hAnsi="Times New Roman" w:cs="Times New Roman"/>
           <w:sz w:val="24"/>
         </w:rPr>
         <w:t xml:space="preserve">. </w:t>
@@ -7825,14 +7811,28 @@
           <w:rFonts w:ascii="Times New Roman" w:hAnsi="Times New Roman" w:cs="Times New Roman"/>
           <w:sz w:val="24"/>
         </w:rPr>
-        <w:t xml:space="preserve">For normality, Q-Q plot and Shapiro-Wilk (S-W) test visually and statistically sufficient evidence for violation of normality, p = </w:t>
-      </w:r>
-      <w:r>
-        <w:rPr>
-          <w:rFonts w:ascii="Times New Roman" w:hAnsi="Times New Roman" w:cs="Times New Roman"/>
-          <w:sz w:val="24"/>
-        </w:rPr>
-        <w:t xml:space="preserve">0.013 </w:t>
+        <w:t>For normality, the Q-Q plot and Shapiro-Wilk (S-W) test provided visual and statistical evidence of deviation from normality,</w:t>
+      </w:r>
+      <w:r>
+        <w:rPr>
+          <w:rFonts w:ascii="Times New Roman" w:hAnsi="Times New Roman" w:cs="Times New Roman"/>
+          <w:sz w:val="24"/>
+        </w:rPr>
+        <w:t xml:space="preserve"> </w:t>
+      </w:r>
+      <w:r>
+        <w:rPr>
+          <w:rFonts w:ascii="Times New Roman" w:hAnsi="Times New Roman" w:cs="Times New Roman"/>
+          <w:sz w:val="24"/>
+        </w:rPr>
+        <w:t>p=.013</w:t>
+      </w:r>
+      <w:r>
+        <w:rPr>
+          <w:rFonts w:ascii="Times New Roman" w:hAnsi="Times New Roman" w:cs="Times New Roman"/>
+          <w:sz w:val="24"/>
+        </w:rPr>
+        <w:t xml:space="preserve"> </w:t>
       </w:r>
       <w:r>
         <w:rPr>
@@ -7841,136 +7841,139 @@
           <w:b/>
           <w:bCs/>
         </w:rPr>
-        <w:t>&lt;</w:t>
+        <w:t xml:space="preserve">&lt; </w:t>
       </w:r>
       <w:r>
         <w:rPr>
           <w:rStyle w:val="HTML"/>
-          <w:rFonts w:ascii="Times New Roman" w:hAnsi="Times New Roman" w:cs="Times New Roman" w:hint="eastAsia"/>
-          <w:b/>
-          <w:bCs/>
-        </w:rPr>
-        <w:t xml:space="preserve"> </w:t>
+          <w:rFonts w:ascii="Times New Roman" w:hAnsi="Times New Roman" w:cs="Times New Roman"/>
+        </w:rPr>
+        <w:t>0.05</w:t>
       </w:r>
       <w:r>
         <w:rPr>
           <w:rStyle w:val="HTML"/>
-          <w:rFonts w:ascii="Times New Roman" w:hAnsi="Times New Roman" w:cs="Times New Roman" w:hint="eastAsia"/>
-        </w:rPr>
-        <w:t>0.05</w:t>
+          <w:rFonts w:ascii="Times New Roman" w:hAnsi="Times New Roman" w:cs="Times New Roman"/>
+        </w:rPr>
+        <w:t xml:space="preserve"> in S-W test. Homoscedasticity, independence of residuals, linearity, and outlier are </w:t>
       </w:r>
       <w:r>
         <w:rPr>
           <w:rStyle w:val="HTML"/>
-          <w:rFonts w:ascii="Times New Roman" w:hAnsi="Times New Roman" w:cs="Times New Roman" w:hint="eastAsia"/>
-        </w:rPr>
-        <w:t xml:space="preserve"> in S-W test</w:t>
+          <w:rFonts w:ascii="Times New Roman" w:hAnsi="Times New Roman" w:cs="Times New Roman"/>
+        </w:rPr>
+        <w:t>checked,</w:t>
       </w:r>
       <w:r>
         <w:rPr>
           <w:rStyle w:val="HTML"/>
           <w:rFonts w:ascii="Times New Roman" w:hAnsi="Times New Roman" w:cs="Times New Roman"/>
         </w:rPr>
-        <w:t>. H</w:t>
+        <w:t xml:space="preserve"> and </w:t>
       </w:r>
       <w:r>
         <w:rPr>
           <w:rStyle w:val="HTML"/>
           <w:rFonts w:ascii="Times New Roman" w:hAnsi="Times New Roman" w:cs="Times New Roman"/>
         </w:rPr>
-        <w:t>omoscedasticity</w:t>
+        <w:t xml:space="preserve">no substantial violations were detected (for diagnostics on other assumptions, see “Figure” </w:t>
+      </w:r>
+      <w:r>
+        <w:rPr>
+          <w:rFonts w:ascii="Times New Roman" w:hAnsi="Times New Roman" w:cs="Times New Roman"/>
+          <w:sz w:val="24"/>
+        </w:rPr>
+        <w:t xml:space="preserve">section in the </w:t>
+      </w:r>
+      <w:r>
+        <w:rPr>
+          <w:rFonts w:ascii="Times New Roman" w:hAnsi="Times New Roman" w:cs="Times New Roman"/>
+          <w:sz w:val="24"/>
+        </w:rPr>
+        <w:t>report</w:t>
+      </w:r>
+      <w:r>
+        <w:rPr>
+          <w:rFonts w:ascii="Times New Roman" w:hAnsi="Times New Roman" w:cs="Times New Roman"/>
+          <w:sz w:val="24"/>
+        </w:rPr>
+        <w:t xml:space="preserve"> file</w:t>
       </w:r>
       <w:r>
         <w:rPr>
           <w:rStyle w:val="HTML"/>
           <w:rFonts w:ascii="Times New Roman" w:hAnsi="Times New Roman" w:cs="Times New Roman"/>
         </w:rPr>
-        <w:t xml:space="preserve">, independence of residuals, linearity, and outlier are </w:t>
+        <w:t xml:space="preserve">). </w:t>
+      </w:r>
+      <w:r>
+        <w:rPr>
+          <w:rFonts w:ascii="Times New Roman" w:hAnsi="Times New Roman" w:cs="Times New Roman"/>
+          <w:sz w:val="24"/>
+        </w:rPr>
+        <w:t>To reduce reliance on the normality assumption for inference</w:t>
       </w:r>
       <w:r>
         <w:rPr>
           <w:rStyle w:val="HTML"/>
           <w:rFonts w:ascii="Times New Roman" w:hAnsi="Times New Roman" w:cs="Times New Roman"/>
         </w:rPr>
-        <w:t>checked,</w:t>
+        <w:t xml:space="preserve">, </w:t>
       </w:r>
       <w:r>
         <w:rPr>
           <w:rStyle w:val="HTML"/>
           <w:rFonts w:ascii="Times New Roman" w:hAnsi="Times New Roman" w:cs="Times New Roman"/>
         </w:rPr>
-        <w:t xml:space="preserve"> and they are not violated. For </w:t>
+        <w:t>a nonparametric bootstrap was used to approximate the sampling distribution of the coefficient</w:t>
       </w:r>
       <w:r>
         <w:rPr>
           <w:rStyle w:val="HTML"/>
           <w:rFonts w:ascii="Times New Roman" w:hAnsi="Times New Roman" w:cs="Times New Roman"/>
         </w:rPr>
-        <w:t>solving the violation of normality,</w:t>
+        <w:t>, the bootstrapped 95</w:t>
       </w:r>
       <w:r>
         <w:rPr>
           <w:rStyle w:val="HTML"/>
           <w:rFonts w:ascii="Times New Roman" w:hAnsi="Times New Roman" w:cs="Times New Roman"/>
         </w:rPr>
-        <w:t xml:space="preserve"> </w:t>
-      </w:r>
-      <w:r>
-        <w:rPr>
-          <w:rStyle w:val="HTML"/>
-          <w:rFonts w:ascii="Times New Roman" w:hAnsi="Times New Roman" w:cs="Times New Roman"/>
-        </w:rPr>
-        <w:t>a nonparametric bootstrap was used to approximate the sampling distribution of the coefficient</w:t>
-      </w:r>
-      <w:r>
-        <w:rPr>
-          <w:rStyle w:val="HTML"/>
-          <w:rFonts w:ascii="Times New Roman" w:hAnsi="Times New Roman" w:cs="Times New Roman"/>
-        </w:rPr>
-        <w:t xml:space="preserve">, the bootstrapped 95% confidence interval (5000 resamples) is </w:t>
-      </w:r>
-      <w:r>
-        <w:rPr>
-          <w:rFonts w:ascii="Times New Roman" w:hAnsi="Times New Roman" w:cs="Times New Roman"/>
-          <w:sz w:val="24"/>
-        </w:rPr>
-        <w:t>[</w:t>
-      </w:r>
-      <w:r>
-        <w:rPr>
-          <w:rFonts w:ascii="Times New Roman" w:hAnsi="Times New Roman" w:cs="Times New Roman"/>
-          <w:sz w:val="24"/>
-        </w:rPr>
-        <w:t>-3.96, 0.54</w:t>
-      </w:r>
-      <w:r>
-        <w:rPr>
-          <w:rFonts w:ascii="Times New Roman" w:hAnsi="Times New Roman" w:cs="Times New Roman"/>
-          <w:sz w:val="24"/>
-        </w:rPr>
-        <w:t>]</w:t>
-      </w:r>
-      <w:r>
-        <w:rPr>
-          <w:rFonts w:ascii="Times New Roman" w:hAnsi="Times New Roman" w:cs="Times New Roman"/>
-          <w:sz w:val="24"/>
-        </w:rPr>
-        <w:t xml:space="preserve"> including 0, therefore, there is insufficient evidence for rejection of null hypothesis stating that there is no effect of sleep hours on emotion regulation. Practically, it </w:t>
-      </w:r>
-      <w:r>
-        <w:rPr>
-          <w:rFonts w:ascii="Times New Roman" w:hAnsi="Times New Roman" w:cs="Times New Roman"/>
-          <w:sz w:val="24"/>
-        </w:rPr>
-        <w:t xml:space="preserve">the </w:t>
-      </w:r>
-      <w:r>
-        <w:rPr>
-          <w:rFonts w:ascii="Times New Roman" w:hAnsi="Times New Roman" w:cs="Times New Roman"/>
-          <w:sz w:val="24"/>
-        </w:rPr>
-        <w:t>sample provides may support the change of sleep hours have nothing to do with change on emotion regulation at a population-level</w:t>
-      </w:r>
+        <w:t xml:space="preserve">% confidence interval (5000 resamples) is </w:t>
+      </w:r>
+      <w:r>
+        <w:rPr>
+          <w:rFonts w:ascii="Times New Roman" w:hAnsi="Times New Roman" w:cs="Times New Roman"/>
+          <w:sz w:val="24"/>
+        </w:rPr>
+        <w:t>[-3.96, 0.54]</w:t>
+      </w:r>
+      <w:r>
+        <w:rPr>
+          <w:rFonts w:ascii="Times New Roman" w:hAnsi="Times New Roman" w:cs="Times New Roman"/>
+          <w:sz w:val="24"/>
+        </w:rPr>
+        <w:t xml:space="preserve"> including 0, </w:t>
+      </w:r>
+      <w:r>
+        <w:rPr>
+          <w:rFonts w:ascii="Times New Roman" w:hAnsi="Times New Roman" w:cs="Times New Roman"/>
+          <w:sz w:val="24"/>
+        </w:rPr>
+        <w:t>Therefore, the bootstrap analysis likewise provided insufficient evidence that sleep duration was associated with emotion-regulation scores at the population level.</w:t>
+      </w:r>
+    </w:p>
+    <w:p>
+      <w:pPr>
+        <w:spacing w:after="0" w:line="240" w:lineRule="auto"/>
+        <w:jc w:val="both"/>
+        <w:rPr>
+          <w:rStyle w:val="af4"/>
+          <w:rFonts w:ascii="Times New Roman" w:hAnsi="Times New Roman" w:cs="Times New Roman"/>
+          <w:sz w:val="20"/>
+          <w:szCs w:val="20"/>
+        </w:rPr>
+      </w:pPr>
     </w:p>
     <w:p>
       <w:pPr>
@@ -8441,7 +8444,762 @@
         <w:spacing w:after="0" w:line="240" w:lineRule="auto"/>
         <w:jc w:val="both"/>
         <w:rPr>
+          <w:rFonts w:ascii="Times New Roman" w:hAnsi="Times New Roman" w:cs="Times New Roman"/>
+          <w:b/>
+          <w:bCs/>
+          <w:sz w:val="24"/>
+        </w:rPr>
+      </w:pPr>
+    </w:p>
+    <w:p>
+      <w:pPr>
+        <w:spacing w:after="0" w:line="240" w:lineRule="auto"/>
+        <w:jc w:val="both"/>
+        <w:rPr>
+          <w:rFonts w:ascii="Times New Roman" w:hAnsi="Times New Roman" w:cs="Times New Roman"/>
+          <w:sz w:val="24"/>
+        </w:rPr>
+      </w:pPr>
+      <w:r>
+        <w:rPr>
+          <w:rFonts w:ascii="Times New Roman" w:hAnsi="Times New Roman" w:cs="Times New Roman"/>
+          <w:sz w:val="24"/>
+        </w:rPr>
+        <w:t xml:space="preserve">  Aim1_model2 established a multiple linear regression with incorporation of mean-centering stress level scores as new predictor variables. The effect of sleep hours and stress levels are now conditional. At sample level, the result shows that </w:t>
+      </w:r>
+      <w:r>
+        <w:rPr>
           <w:rFonts w:ascii="Times New Roman" w:hAnsi="Times New Roman" w:cs="Times New Roman" w:hint="eastAsia"/>
+          <w:sz w:val="24"/>
+        </w:rPr>
+        <w:t xml:space="preserve">each </w:t>
+      </w:r>
+      <w:r>
+        <w:rPr>
+          <w:rFonts w:ascii="Times New Roman" w:hAnsi="Times New Roman" w:cs="Times New Roman"/>
+          <w:sz w:val="24"/>
+        </w:rPr>
+        <w:t xml:space="preserve">one hour increase in sleep duration above the sample mean was associated with </w:t>
+      </w:r>
+      <w:r>
+        <w:rPr>
+          <w:rFonts w:ascii="Times New Roman" w:hAnsi="Times New Roman" w:cs="Times New Roman"/>
+          <w:sz w:val="24"/>
+        </w:rPr>
+        <w:t xml:space="preserve">1.70-point decrease in emotion regulation score when stress level is </w:t>
+      </w:r>
+      <w:r>
+        <w:rPr>
+          <w:rFonts w:ascii="Times New Roman" w:hAnsi="Times New Roman" w:cs="Times New Roman" w:hint="eastAsia"/>
+          <w:sz w:val="24"/>
+        </w:rPr>
+        <w:t xml:space="preserve">controlled to be </w:t>
+      </w:r>
+      <w:r>
+        <w:rPr>
+          <w:rFonts w:ascii="Times New Roman" w:hAnsi="Times New Roman" w:cs="Times New Roman"/>
+          <w:sz w:val="24"/>
+        </w:rPr>
+        <w:t>its mean. One point increase in stress level above the sample mean was associated with 0.24-point decrease in emotion regulations score when sleep duration is controlled to be</w:t>
+      </w:r>
+      <w:r>
+        <w:rPr>
+          <w:rFonts w:ascii="Times New Roman" w:hAnsi="Times New Roman" w:cs="Times New Roman" w:hint="eastAsia"/>
+          <w:sz w:val="24"/>
+        </w:rPr>
+        <w:t xml:space="preserve"> </w:t>
+      </w:r>
+      <w:r>
+        <w:rPr>
+          <w:rFonts w:ascii="Times New Roman" w:hAnsi="Times New Roman" w:cs="Times New Roman"/>
+          <w:sz w:val="24"/>
+        </w:rPr>
+        <w:t xml:space="preserve">its mean. However, these results are neither statistically significant. For conditional effect of sleep duration, b = -1.70, </w:t>
+      </w:r>
+      <w:r>
+        <w:rPr>
+          <w:rFonts w:ascii="Times New Roman" w:hAnsi="Times New Roman" w:cs="Times New Roman"/>
+          <w:sz w:val="24"/>
+        </w:rPr>
+        <w:t>SE = 1.2</w:t>
+      </w:r>
+      <w:r>
+        <w:rPr>
+          <w:rFonts w:ascii="Times New Roman" w:hAnsi="Times New Roman" w:cs="Times New Roman"/>
+          <w:sz w:val="24"/>
+        </w:rPr>
+        <w:t>0</w:t>
+      </w:r>
+      <w:r>
+        <w:rPr>
+          <w:rFonts w:ascii="Times New Roman" w:hAnsi="Times New Roman" w:cs="Times New Roman"/>
+          <w:sz w:val="24"/>
+        </w:rPr>
+        <w:t>, t-value = -1.</w:t>
+      </w:r>
+      <w:r>
+        <w:rPr>
+          <w:rFonts w:ascii="Times New Roman" w:hAnsi="Times New Roman" w:cs="Times New Roman"/>
+          <w:sz w:val="24"/>
+        </w:rPr>
+        <w:t>41</w:t>
+      </w:r>
+      <w:r>
+        <w:rPr>
+          <w:rFonts w:ascii="Times New Roman" w:hAnsi="Times New Roman" w:cs="Times New Roman"/>
+          <w:sz w:val="24"/>
+        </w:rPr>
+        <w:t xml:space="preserve"> and p-value = 0.</w:t>
+      </w:r>
+      <w:r>
+        <w:rPr>
+          <w:rFonts w:ascii="Times New Roman" w:hAnsi="Times New Roman" w:cs="Times New Roman"/>
+          <w:sz w:val="24"/>
+        </w:rPr>
+        <w:t>16</w:t>
+      </w:r>
+      <w:r>
+        <w:rPr>
+          <w:rFonts w:ascii="Times New Roman" w:hAnsi="Times New Roman" w:cs="Times New Roman"/>
+          <w:sz w:val="24"/>
+        </w:rPr>
+        <w:t xml:space="preserve"> &gt;</w:t>
+      </w:r>
+      <w:r>
+        <w:rPr>
+          <w:rFonts w:ascii="Times New Roman" w:hAnsi="Times New Roman" w:cs="Times New Roman" w:hint="eastAsia"/>
+          <w:sz w:val="24"/>
+        </w:rPr>
+        <w:t xml:space="preserve"> 0.05</w:t>
+      </w:r>
+      <w:r>
+        <w:rPr>
+          <w:rFonts w:ascii="Times New Roman" w:hAnsi="Times New Roman" w:cs="Times New Roman"/>
+          <w:sz w:val="24"/>
+        </w:rPr>
+        <w:t>. For conditional effect of stress level</w:t>
+      </w:r>
+      <w:r>
+        <w:rPr>
+          <w:rFonts w:ascii="Times New Roman" w:hAnsi="Times New Roman" w:cs="Times New Roman"/>
+          <w:sz w:val="24"/>
+        </w:rPr>
+        <w:t xml:space="preserve">, b = -0.24, SE = 0.20, t-value = -1.18 and </w:t>
+      </w:r>
+      <w:r>
+        <w:rPr>
+          <w:rFonts w:ascii="Times New Roman" w:hAnsi="Times New Roman" w:cs="Times New Roman"/>
+          <w:sz w:val="24"/>
+        </w:rPr>
+        <w:t>p-value = 0.</w:t>
+      </w:r>
+      <w:r>
+        <w:rPr>
+          <w:rFonts w:ascii="Times New Roman" w:hAnsi="Times New Roman" w:cs="Times New Roman"/>
+          <w:sz w:val="24"/>
+        </w:rPr>
+        <w:t>24</w:t>
+      </w:r>
+      <w:r>
+        <w:rPr>
+          <w:rFonts w:ascii="Times New Roman" w:hAnsi="Times New Roman" w:cs="Times New Roman"/>
+          <w:sz w:val="24"/>
+        </w:rPr>
+        <w:t xml:space="preserve"> &gt;</w:t>
+      </w:r>
+      <w:r>
+        <w:rPr>
+          <w:rFonts w:ascii="Times New Roman" w:hAnsi="Times New Roman" w:cs="Times New Roman" w:hint="eastAsia"/>
+          <w:sz w:val="24"/>
+        </w:rPr>
+        <w:t xml:space="preserve"> 0.05</w:t>
+      </w:r>
+      <w:r>
+        <w:rPr>
+          <w:rFonts w:ascii="Times New Roman" w:hAnsi="Times New Roman" w:cs="Times New Roman" w:hint="eastAsia"/>
+          <w:sz w:val="24"/>
+        </w:rPr>
+        <w:t>.</w:t>
+      </w:r>
+      <w:r>
+        <w:rPr>
+          <w:rFonts w:ascii="Times New Roman" w:hAnsi="Times New Roman" w:cs="Times New Roman"/>
+          <w:sz w:val="24"/>
+        </w:rPr>
+        <w:t xml:space="preserve"> </w:t>
+      </w:r>
+      <w:r>
+        <w:rPr>
+          <w:rFonts w:ascii="Times New Roman" w:hAnsi="Times New Roman" w:cs="Times New Roman"/>
+          <w:sz w:val="24"/>
+        </w:rPr>
+        <w:t>The model accounted for approximately 5.5% of the variance in emotion-</w:t>
+      </w:r>
+      <w:r>
+        <w:rPr>
+          <w:rFonts w:ascii="Times New Roman" w:hAnsi="Times New Roman" w:cs="Times New Roman"/>
+          <w:sz w:val="24"/>
+        </w:rPr>
+        <w:lastRenderedPageBreak/>
+        <w:t>regulation scores</w:t>
+      </w:r>
+      <w:r>
+        <w:rPr>
+          <w:rFonts w:ascii="Times New Roman" w:hAnsi="Times New Roman" w:cs="Times New Roman"/>
+          <w:sz w:val="24"/>
+        </w:rPr>
+        <w:t>,</w:t>
+      </w:r>
+      <w:r>
+        <w:rPr>
+          <w:rFonts w:ascii="Times New Roman" w:hAnsi="Times New Roman" w:cs="Times New Roman"/>
+          <w:sz w:val="24"/>
+        </w:rPr>
+        <w:t xml:space="preserve"> </w:t>
+      </w:r>
+      <w:r>
+        <w:rPr>
+          <w:rFonts w:ascii="Times New Roman" w:hAnsi="Times New Roman" w:cs="Times New Roman"/>
+          <w:sz w:val="24"/>
+        </w:rPr>
+        <w:t xml:space="preserve">R^2 = 0.055, with an adjusted R^2 = 0.022, </w:t>
+      </w:r>
+      <w:r>
+        <w:rPr>
+          <w:rFonts w:ascii="Times New Roman" w:hAnsi="Times New Roman" w:cs="Times New Roman"/>
+          <w:sz w:val="24"/>
+        </w:rPr>
+        <w:t>apparently leaving most of the outcome variance unexplained by this model</w:t>
+      </w:r>
+      <w:r>
+        <w:rPr>
+          <w:rFonts w:ascii="Times New Roman" w:hAnsi="Times New Roman" w:cs="Times New Roman"/>
+          <w:sz w:val="24"/>
+        </w:rPr>
+        <w:t xml:space="preserve">, with incorporation of new predictor variable. </w:t>
+      </w:r>
+      <w:r>
+        <w:rPr>
+          <w:rFonts w:ascii="Times New Roman" w:hAnsi="Times New Roman" w:cs="Times New Roman"/>
+          <w:sz w:val="24"/>
+        </w:rPr>
+        <w:t xml:space="preserve">Figure2.2 shows the respective conditional effects of the predictor variables </w:t>
+      </w:r>
+      <w:r>
+        <w:rPr>
+          <w:rFonts w:ascii="Times New Roman" w:hAnsi="Times New Roman" w:cs="Times New Roman"/>
+          <w:sz w:val="24"/>
+        </w:rPr>
+        <w:t xml:space="preserve">and the hyperplane representing model fitting they construct in a 3D space. </w:t>
+      </w:r>
+    </w:p>
+    <w:p>
+      <w:pPr>
+        <w:spacing w:after="0" w:line="240" w:lineRule="auto"/>
+        <w:ind w:firstLineChars="100" w:firstLine="240"/>
+        <w:jc w:val="both"/>
+        <w:rPr>
+          <w:rFonts w:ascii="Times New Roman" w:hAnsi="Times New Roman" w:cs="Times New Roman"/>
+          <w:sz w:val="24"/>
+        </w:rPr>
+      </w:pPr>
+      <w:r>
+        <w:rPr>
+          <w:rFonts w:ascii="Times New Roman" w:hAnsi="Times New Roman" w:cs="Times New Roman"/>
+          <w:sz w:val="24"/>
+        </w:rPr>
+        <w:t xml:space="preserve">For assumptions diagnostics. </w:t>
+      </w:r>
+      <w:r>
+        <w:rPr>
+          <w:rFonts w:ascii="Times New Roman" w:hAnsi="Times New Roman" w:cs="Times New Roman"/>
+          <w:sz w:val="24"/>
+        </w:rPr>
+        <w:t>For normality, the Q-Q plot and Shapiro-Wilk (S-W) test provided visual and statistical evidence of deviation from normality, p</w:t>
+      </w:r>
+      <w:r>
+        <w:rPr>
+          <w:rFonts w:ascii="Times New Roman" w:hAnsi="Times New Roman" w:cs="Times New Roman"/>
+          <w:sz w:val="24"/>
+        </w:rPr>
+        <w:t xml:space="preserve">-value </w:t>
+      </w:r>
+      <w:r>
+        <w:rPr>
+          <w:rFonts w:ascii="Times New Roman" w:hAnsi="Times New Roman" w:cs="Times New Roman"/>
+          <w:sz w:val="24"/>
+        </w:rPr>
+        <w:t>=.0</w:t>
+      </w:r>
+      <w:r>
+        <w:rPr>
+          <w:rFonts w:ascii="Times New Roman" w:hAnsi="Times New Roman" w:cs="Times New Roman"/>
+          <w:sz w:val="24"/>
+        </w:rPr>
+        <w:t>4</w:t>
+      </w:r>
+      <w:r>
+        <w:rPr>
+          <w:rFonts w:ascii="Times New Roman" w:hAnsi="Times New Roman" w:cs="Times New Roman"/>
+          <w:sz w:val="24"/>
+        </w:rPr>
+        <w:t xml:space="preserve"> </w:t>
+      </w:r>
+      <w:r>
+        <w:rPr>
+          <w:rStyle w:val="HTML"/>
+          <w:rFonts w:ascii="Times New Roman" w:hAnsi="Times New Roman" w:cs="Times New Roman"/>
+          <w:b/>
+          <w:bCs/>
+        </w:rPr>
+        <w:t xml:space="preserve">&lt; </w:t>
+      </w:r>
+      <w:r>
+        <w:rPr>
+          <w:rStyle w:val="HTML"/>
+          <w:rFonts w:ascii="Times New Roman" w:hAnsi="Times New Roman" w:cs="Times New Roman"/>
+        </w:rPr>
+        <w:t>0.05</w:t>
+      </w:r>
+      <w:r>
+        <w:rPr>
+          <w:rStyle w:val="HTML"/>
+          <w:rFonts w:ascii="Times New Roman" w:hAnsi="Times New Roman" w:cs="Times New Roman"/>
+        </w:rPr>
+        <w:t xml:space="preserve"> in S-W test. Homoscedasticity, independence of residuals, linearity, outlier </w:t>
+      </w:r>
+      <w:r>
+        <w:rPr>
+          <w:rStyle w:val="HTML"/>
+          <w:rFonts w:ascii="Times New Roman" w:hAnsi="Times New Roman" w:cs="Times New Roman"/>
+        </w:rPr>
+        <w:t xml:space="preserve">and multicollinearity </w:t>
+      </w:r>
+      <w:r>
+        <w:rPr>
+          <w:rStyle w:val="HTML"/>
+          <w:rFonts w:ascii="Times New Roman" w:hAnsi="Times New Roman" w:cs="Times New Roman"/>
+        </w:rPr>
+        <w:t>are checked</w:t>
+      </w:r>
+      <w:r>
+        <w:rPr>
+          <w:rStyle w:val="HTML"/>
+          <w:rFonts w:ascii="Times New Roman" w:hAnsi="Times New Roman" w:cs="Times New Roman"/>
+        </w:rPr>
+        <w:t xml:space="preserve"> separately</w:t>
+      </w:r>
+      <w:r>
+        <w:rPr>
+          <w:rStyle w:val="HTML"/>
+          <w:rFonts w:ascii="Times New Roman" w:hAnsi="Times New Roman" w:cs="Times New Roman"/>
+        </w:rPr>
+        <w:t xml:space="preserve">, and no substantial violations were detected (for diagnostics on other assumptions, see “Figure” </w:t>
+      </w:r>
+      <w:r>
+        <w:rPr>
+          <w:rFonts w:ascii="Times New Roman" w:hAnsi="Times New Roman" w:cs="Times New Roman"/>
+          <w:sz w:val="24"/>
+        </w:rPr>
+        <w:t>section in the report file</w:t>
+      </w:r>
+      <w:r>
+        <w:rPr>
+          <w:rStyle w:val="HTML"/>
+          <w:rFonts w:ascii="Times New Roman" w:hAnsi="Times New Roman" w:cs="Times New Roman"/>
+        </w:rPr>
+        <w:t xml:space="preserve">). </w:t>
+      </w:r>
+      <w:r>
+        <w:rPr>
+          <w:rFonts w:ascii="Times New Roman" w:hAnsi="Times New Roman" w:cs="Times New Roman"/>
+          <w:sz w:val="24"/>
+        </w:rPr>
+        <w:t>To reduce reliance on the normality assumption for inference</w:t>
+      </w:r>
+      <w:r>
+        <w:rPr>
+          <w:rStyle w:val="HTML"/>
+          <w:rFonts w:ascii="Times New Roman" w:hAnsi="Times New Roman" w:cs="Times New Roman"/>
+        </w:rPr>
+        <w:t>, a nonparametric bootstrap was used to approximate the sampling distribution of the coefficient, the bootstrapped 95</w:t>
+      </w:r>
+      <w:r>
+        <w:rPr>
+          <w:rStyle w:val="HTML"/>
+          <w:rFonts w:ascii="Times New Roman" w:hAnsi="Times New Roman" w:cs="Times New Roman"/>
+        </w:rPr>
+        <w:t>% confidence interval (5000 resamples)</w:t>
+      </w:r>
+      <w:r>
+        <w:rPr>
+          <w:rStyle w:val="HTML"/>
+          <w:rFonts w:ascii="Times New Roman" w:hAnsi="Times New Roman" w:cs="Times New Roman"/>
+        </w:rPr>
+        <w:t xml:space="preserve"> for sleep duration and stress level</w:t>
+      </w:r>
+      <w:r>
+        <w:rPr>
+          <w:rStyle w:val="HTML"/>
+          <w:rFonts w:ascii="Times New Roman" w:hAnsi="Times New Roman" w:cs="Times New Roman"/>
+        </w:rPr>
+        <w:t xml:space="preserve"> </w:t>
+      </w:r>
+      <w:r>
+        <w:rPr>
+          <w:rStyle w:val="HTML"/>
+          <w:rFonts w:ascii="Times New Roman" w:hAnsi="Times New Roman" w:cs="Times New Roman"/>
+        </w:rPr>
+        <w:t>are</w:t>
+      </w:r>
+      <w:r>
+        <w:rPr>
+          <w:rStyle w:val="HTML"/>
+          <w:rFonts w:ascii="Times New Roman" w:hAnsi="Times New Roman" w:cs="Times New Roman"/>
+        </w:rPr>
+        <w:t xml:space="preserve"> </w:t>
+      </w:r>
+      <w:r>
+        <w:rPr>
+          <w:rFonts w:ascii="Times New Roman" w:hAnsi="Times New Roman" w:cs="Times New Roman"/>
+          <w:sz w:val="24"/>
+        </w:rPr>
+        <w:t>[-</w:t>
+      </w:r>
+      <w:r>
+        <w:rPr>
+          <w:rFonts w:ascii="Times New Roman" w:hAnsi="Times New Roman" w:cs="Times New Roman"/>
+          <w:sz w:val="24"/>
+        </w:rPr>
+        <w:t>4.11</w:t>
+      </w:r>
+      <w:r>
+        <w:rPr>
+          <w:rFonts w:ascii="Times New Roman" w:hAnsi="Times New Roman" w:cs="Times New Roman"/>
+          <w:sz w:val="24"/>
+        </w:rPr>
+        <w:t>, 0.</w:t>
+      </w:r>
+      <w:r>
+        <w:rPr>
+          <w:rFonts w:ascii="Times New Roman" w:hAnsi="Times New Roman" w:cs="Times New Roman"/>
+          <w:sz w:val="24"/>
+        </w:rPr>
+        <w:t>71</w:t>
+      </w:r>
+      <w:r>
+        <w:rPr>
+          <w:rFonts w:ascii="Times New Roman" w:hAnsi="Times New Roman" w:cs="Times New Roman"/>
+          <w:sz w:val="24"/>
+        </w:rPr>
+        <w:t>]</w:t>
+      </w:r>
+      <w:r>
+        <w:rPr>
+          <w:rFonts w:ascii="Times New Roman" w:hAnsi="Times New Roman" w:cs="Times New Roman"/>
+          <w:sz w:val="24"/>
+        </w:rPr>
+        <w:t xml:space="preserve"> </w:t>
+      </w:r>
+      <w:r>
+        <w:rPr>
+          <w:rFonts w:ascii="Times New Roman" w:hAnsi="Times New Roman" w:cs="Times New Roman"/>
+          <w:sz w:val="24"/>
+        </w:rPr>
+        <w:t xml:space="preserve"> and </w:t>
+      </w:r>
+      <w:r>
+        <w:rPr>
+          <w:rStyle w:val="HTML"/>
+          <w:rFonts w:ascii="Times New Roman" w:hAnsi="Times New Roman" w:cs="Times New Roman"/>
+        </w:rPr>
+        <w:t xml:space="preserve"> </w:t>
+      </w:r>
+      <w:r>
+        <w:rPr>
+          <w:rFonts w:ascii="Times New Roman" w:hAnsi="Times New Roman" w:cs="Times New Roman"/>
+          <w:sz w:val="24"/>
+        </w:rPr>
+        <w:t>[-</w:t>
+      </w:r>
+      <w:r>
+        <w:rPr>
+          <w:rFonts w:ascii="Times New Roman" w:hAnsi="Times New Roman" w:cs="Times New Roman"/>
+          <w:sz w:val="24"/>
+        </w:rPr>
+        <w:t>0.64</w:t>
+      </w:r>
+      <w:r>
+        <w:rPr>
+          <w:rFonts w:ascii="Times New Roman" w:hAnsi="Times New Roman" w:cs="Times New Roman"/>
+          <w:sz w:val="24"/>
+        </w:rPr>
+        <w:t>, 0.</w:t>
+      </w:r>
+      <w:r>
+        <w:rPr>
+          <w:rFonts w:ascii="Times New Roman" w:hAnsi="Times New Roman" w:cs="Times New Roman"/>
+          <w:sz w:val="24"/>
+        </w:rPr>
+        <w:t>17</w:t>
+      </w:r>
+      <w:r>
+        <w:rPr>
+          <w:rFonts w:ascii="Times New Roman" w:hAnsi="Times New Roman" w:cs="Times New Roman"/>
+          <w:sz w:val="24"/>
+        </w:rPr>
+        <w:t>]</w:t>
+      </w:r>
+      <w:r>
+        <w:rPr>
+          <w:rFonts w:ascii="Times New Roman" w:hAnsi="Times New Roman" w:cs="Times New Roman"/>
+          <w:sz w:val="24"/>
+        </w:rPr>
+        <w:t xml:space="preserve"> respectively and they all</w:t>
+      </w:r>
+      <w:r>
+        <w:rPr>
+          <w:rFonts w:ascii="Times New Roman" w:hAnsi="Times New Roman" w:cs="Times New Roman"/>
+          <w:sz w:val="24"/>
+        </w:rPr>
+        <w:t xml:space="preserve"> </w:t>
+      </w:r>
+      <w:r>
+        <w:rPr>
+          <w:rFonts w:ascii="Times New Roman" w:hAnsi="Times New Roman" w:cs="Times New Roman"/>
+          <w:sz w:val="24"/>
+        </w:rPr>
+        <w:t>includes</w:t>
+      </w:r>
+      <w:r>
+        <w:rPr>
+          <w:rFonts w:ascii="Times New Roman" w:hAnsi="Times New Roman" w:cs="Times New Roman"/>
+          <w:sz w:val="24"/>
+        </w:rPr>
+        <w:t xml:space="preserve"> 0, </w:t>
+      </w:r>
+      <w:r>
+        <w:rPr>
+          <w:rFonts w:ascii="Times New Roman" w:hAnsi="Times New Roman" w:cs="Times New Roman"/>
+          <w:sz w:val="24"/>
+        </w:rPr>
+        <w:t>Therefore, the bootstrap analysis likewise provided insufficient evidence that sleep duration was associated with emotion-regulation scores at the population level.</w:t>
+      </w:r>
+      <w:r>
+        <w:rPr>
+          <w:rFonts w:ascii="Times New Roman" w:hAnsi="Times New Roman" w:cs="Times New Roman"/>
+          <w:sz w:val="24"/>
+        </w:rPr>
+        <w:t xml:space="preserve"> However, for stress level, it was observed that its bootstrapped 95% CI was relatively narrower than that of </w:t>
+      </w:r>
+      <w:r>
+        <w:rPr>
+          <w:rFonts w:ascii="Times New Roman" w:hAnsi="Times New Roman" w:cs="Times New Roman"/>
+          <w:sz w:val="24"/>
+        </w:rPr>
+        <w:t xml:space="preserve">sleep hour. This may possibly indicate that relatively, there is less uncertainty of sample statics of regression coefficient of stress level. </w:t>
+      </w:r>
+    </w:p>
+    <w:p>
+      <w:pPr>
+        <w:spacing w:after="0" w:line="240" w:lineRule="auto"/>
+        <w:ind w:firstLineChars="100" w:firstLine="240"/>
+        <w:jc w:val="both"/>
+        <w:rPr>
+          <w:rFonts w:ascii="Times New Roman" w:hAnsi="Times New Roman" w:cs="Times New Roman"/>
+          <w:sz w:val="24"/>
+        </w:rPr>
+      </w:pPr>
+      <w:r>
+        <w:rPr>
+          <w:rFonts w:ascii="Times New Roman" w:hAnsi="Times New Roman" w:cs="Times New Roman"/>
+          <w:sz w:val="24"/>
+        </w:rPr>
+        <w:t xml:space="preserve">This model </w:t>
+      </w:r>
+      <w:r>
+        <w:rPr>
+          <w:rFonts w:ascii="Times New Roman" w:hAnsi="Times New Roman" w:cs="Times New Roman"/>
+          <w:sz w:val="24"/>
+        </w:rPr>
+        <w:t xml:space="preserve">was subsequently compared with Aim1_model1 to evaluate whether the addition of stress level improved explanatory performance beyond sleep duration alone. The addition of stress increased R^2 by approximately </w:t>
+      </w:r>
+      <w:r>
+        <w:rPr>
+          <w:rFonts w:ascii="Times New Roman" w:hAnsi="Times New Roman" w:cs="Times New Roman"/>
+          <w:sz w:val="24"/>
+        </w:rPr>
+        <w:t>0</w:t>
+      </w:r>
+      <w:r>
+        <w:rPr>
+          <w:rFonts w:ascii="Times New Roman" w:hAnsi="Times New Roman" w:cs="Times New Roman"/>
+          <w:sz w:val="24"/>
+        </w:rPr>
+        <w:t xml:space="preserve">.023, while adjusted R^2 increased </w:t>
+      </w:r>
+      <w:r>
+        <w:rPr>
+          <w:rFonts w:ascii="Times New Roman" w:hAnsi="Times New Roman" w:cs="Times New Roman"/>
+          <w:sz w:val="24"/>
+        </w:rPr>
+        <w:t xml:space="preserve">approximately 0.007. </w:t>
+      </w:r>
+      <w:r>
+        <w:rPr>
+          <w:rFonts w:ascii="Times New Roman" w:hAnsi="Times New Roman" w:cs="Times New Roman"/>
+          <w:sz w:val="24"/>
+        </w:rPr>
+        <w:t>The nested-model comparison was not statistically significant, p=</w:t>
+      </w:r>
+      <w:r>
+        <w:rPr>
+          <w:rFonts w:ascii="Times New Roman" w:hAnsi="Times New Roman" w:cs="Times New Roman"/>
+          <w:sz w:val="24"/>
+        </w:rPr>
+        <w:t xml:space="preserve"> 0</w:t>
+      </w:r>
+      <w:r>
+        <w:rPr>
+          <w:rFonts w:ascii="Times New Roman" w:hAnsi="Times New Roman" w:cs="Times New Roman"/>
+          <w:sz w:val="24"/>
+        </w:rPr>
+        <w:t>.24</w:t>
+      </w:r>
+      <w:r>
+        <w:rPr>
+          <w:rFonts w:ascii="Times New Roman" w:hAnsi="Times New Roman" w:cs="Times New Roman"/>
+          <w:sz w:val="24"/>
+        </w:rPr>
+        <w:t xml:space="preserve"> </w:t>
+      </w:r>
+      <w:r>
+        <w:rPr>
+          <w:rStyle w:val="HTML"/>
+          <w:rFonts w:ascii="Times New Roman" w:hAnsi="Times New Roman" w:cs="Times New Roman"/>
+          <w:b/>
+          <w:bCs/>
+        </w:rPr>
+        <w:t xml:space="preserve">&lt; </w:t>
+      </w:r>
+      <w:r>
+        <w:rPr>
+          <w:rStyle w:val="HTML"/>
+          <w:rFonts w:ascii="Times New Roman" w:hAnsi="Times New Roman" w:cs="Times New Roman"/>
+        </w:rPr>
+        <w:t>0.05</w:t>
+      </w:r>
+      <w:r>
+        <w:rPr>
+          <w:rFonts w:ascii="Times New Roman" w:hAnsi="Times New Roman" w:cs="Times New Roman"/>
+          <w:sz w:val="24"/>
+        </w:rPr>
+        <w:t>,</w:t>
+      </w:r>
+      <w:r>
+        <w:rPr>
+          <w:rFonts w:ascii="Times New Roman" w:hAnsi="Times New Roman" w:cs="Times New Roman"/>
+          <w:sz w:val="24"/>
+        </w:rPr>
+        <w:t xml:space="preserve"> providing</w:t>
+      </w:r>
+      <w:r>
+        <w:rPr>
+          <w:rFonts w:ascii="Times New Roman" w:hAnsi="Times New Roman" w:cs="Times New Roman"/>
+          <w:sz w:val="24"/>
+        </w:rPr>
+        <w:t xml:space="preserve"> insufficient evidence that stress level contributed incremental explanatory value beyond the sleep-duration-only model.</w:t>
+      </w:r>
+      <w:r>
+        <w:rPr>
+          <w:rFonts w:ascii="Times New Roman" w:hAnsi="Times New Roman" w:cs="Times New Roman"/>
+          <w:sz w:val="24"/>
+        </w:rPr>
+        <w:t xml:space="preserve">  </w:t>
+      </w:r>
+    </w:p>
+    <w:p>
+      <w:pPr>
+        <w:spacing w:after="0" w:line="240" w:lineRule="auto"/>
+        <w:ind w:firstLineChars="100" w:firstLine="240"/>
+        <w:jc w:val="both"/>
+        <w:rPr>
+          <w:rFonts w:ascii="Times New Roman" w:hAnsi="Times New Roman" w:cs="Times New Roman"/>
+          <w:b/>
+          <w:bCs/>
+          <w:sz w:val="24"/>
+        </w:rPr>
+      </w:pPr>
+      <w:r>
+        <w:rPr>
+          <w:rFonts w:ascii="Times New Roman" w:hAnsi="Times New Roman" w:cs="Times New Roman"/>
+          <w:sz w:val="24"/>
+        </w:rPr>
+        <w:t>Following Aim1_model2, moderation_model3 was constructed by incorporating an interaction term (mean-centered sleep duration * mean-centered stress level). Whereas the additive model assumed that the association of each predictor with emotion regulation remained constant across values of the other predictor, the interaction model examined whether these associations varied conditionally across predictor levels. It also sought to test whether the non-significant average associations observed in the additive model might have been obscured by effects that differed across levels of the other predictor. At the sample level, it was observed that for each additional hour of sleep, the slope of stress on emotion regulation became 0.038 points more negative, and vice versa. However, this interaction was not statistically significant, b=</w:t>
+      </w:r>
+      <w:r>
+        <w:rPr>
+          <w:rFonts w:ascii="Times New Roman" w:hAnsi="Times New Roman" w:cs="Times New Roman"/>
+          <w:sz w:val="24"/>
+        </w:rPr>
+        <w:t xml:space="preserve"> </w:t>
+      </w:r>
+      <w:r>
+        <w:rPr>
+          <w:rFonts w:ascii="Times New Roman" w:hAnsi="Times New Roman" w:cs="Times New Roman"/>
+          <w:sz w:val="24"/>
+        </w:rPr>
+        <w:t>-0.038, SE=</w:t>
+      </w:r>
+      <w:r>
+        <w:rPr>
+          <w:rFonts w:ascii="Times New Roman" w:hAnsi="Times New Roman" w:cs="Times New Roman"/>
+          <w:sz w:val="24"/>
+        </w:rPr>
+        <w:t xml:space="preserve"> </w:t>
+      </w:r>
+      <w:r>
+        <w:rPr>
+          <w:rFonts w:ascii="Times New Roman" w:hAnsi="Times New Roman" w:cs="Times New Roman"/>
+          <w:sz w:val="24"/>
+        </w:rPr>
+        <w:t>0.11, t=</w:t>
+      </w:r>
+      <w:r>
+        <w:rPr>
+          <w:rFonts w:ascii="Times New Roman" w:hAnsi="Times New Roman" w:cs="Times New Roman"/>
+          <w:sz w:val="24"/>
+        </w:rPr>
+        <w:t xml:space="preserve"> </w:t>
+      </w:r>
+      <w:r>
+        <w:rPr>
+          <w:rFonts w:ascii="Times New Roman" w:hAnsi="Times New Roman" w:cs="Times New Roman"/>
+          <w:sz w:val="24"/>
+        </w:rPr>
+        <w:t>-0.34, p=</w:t>
+      </w:r>
+      <w:r>
+        <w:rPr>
+          <w:rFonts w:ascii="Times New Roman" w:hAnsi="Times New Roman" w:cs="Times New Roman"/>
+          <w:sz w:val="24"/>
+        </w:rPr>
+        <w:t xml:space="preserve"> 0</w:t>
+      </w:r>
+      <w:r>
+        <w:rPr>
+          <w:rFonts w:ascii="Times New Roman" w:hAnsi="Times New Roman" w:cs="Times New Roman"/>
+          <w:sz w:val="24"/>
+        </w:rPr>
+        <w:t>.739&gt;.05. Therefore, there was insufficient evidence to state that the effect of either stress level or sleep duration on emotion-regulation performance was dependent on the level of the other predictor.</w:t>
+      </w:r>
+    </w:p>
+    <w:p>
+      <w:pPr>
+        <w:spacing w:after="0" w:line="240" w:lineRule="auto"/>
+        <w:jc w:val="both"/>
+        <w:rPr>
+          <w:rFonts w:ascii="Times New Roman" w:hAnsi="Times New Roman" w:cs="Times New Roman"/>
           <w:b/>
           <w:bCs/>
           <w:sz w:val="26"/>
@@ -8487,7 +9245,11 @@
           <w:szCs w:val="26"/>
         </w:rPr>
       </w:pPr>
-      <w:r>
+    </w:p>
+    <w:p>
+      <w:pPr>
+        <w:spacing w:after="0" w:line="240" w:lineRule="auto"/>
+        <w:jc w:val="both"/>
         <w:rPr>
           <w:rFonts w:ascii="Times New Roman" w:hAnsi="Times New Roman" w:cs="Times New Roman"/>
           <w:b/>
@@ -8495,9 +9257,12 @@
           <w:sz w:val="26"/>
           <w:szCs w:val="26"/>
         </w:rPr>
-        <w:t xml:space="preserve">-Aim2 </w:t>
-      </w:r>
-      <w:r>
+      </w:pPr>
+    </w:p>
+    <w:p>
+      <w:pPr>
+        <w:spacing w:after="0" w:line="240" w:lineRule="auto"/>
+        <w:jc w:val="both"/>
         <w:rPr>
           <w:rFonts w:ascii="Times New Roman" w:hAnsi="Times New Roman" w:cs="Times New Roman"/>
           <w:b/>
@@ -8505,8 +9270,7 @@
           <w:sz w:val="26"/>
           <w:szCs w:val="26"/>
         </w:rPr>
-        <w:t>Results and Discussions</w:t>
-      </w:r>
+      </w:pPr>
     </w:p>
     <w:p>
       <w:pPr>
@@ -8533,6 +9297,17 @@
           <w:szCs w:val="26"/>
         </w:rPr>
       </w:pPr>
+      <w:r>
+        <w:rPr>
+          <w:rFonts w:ascii="Times New Roman" w:hAnsi="Times New Roman" w:cs="Times New Roman"/>
+          <w:b/>
+          <w:bCs/>
+          <w:sz w:val="26"/>
+          <w:szCs w:val="26"/>
+        </w:rPr>
+        <w:lastRenderedPageBreak/>
+        <w:t>Figure 2.2</w:t>
+      </w:r>
     </w:p>
     <w:p>
       <w:pPr>
@@ -8542,10 +9317,91 @@
           <w:rFonts w:ascii="Times New Roman" w:hAnsi="Times New Roman" w:cs="Times New Roman"/>
           <w:b/>
           <w:bCs/>
+          <w:sz w:val="21"/>
+          <w:szCs w:val="21"/>
+        </w:rPr>
+      </w:pPr>
+      <w:r>
+        <w:rPr>
+          <w:rFonts w:ascii="Times New Roman" w:hAnsi="Times New Roman" w:cs="Times New Roman"/>
+          <w:b/>
+          <w:bCs/>
+          <w:noProof/>
           <w:sz w:val="26"/>
           <w:szCs w:val="26"/>
         </w:rPr>
-      </w:pPr>
+        <w:drawing>
+          <wp:anchor distT="0" distB="0" distL="114300" distR="114300" simplePos="0" relativeHeight="251660288" behindDoc="1" locked="0" layoutInCell="1" allowOverlap="1" wp14:anchorId="2BD54F1C" wp14:editId="07836919">
+            <wp:simplePos x="0" y="0"/>
+            <wp:positionH relativeFrom="column">
+              <wp:posOffset>2540</wp:posOffset>
+            </wp:positionH>
+            <wp:positionV relativeFrom="paragraph">
+              <wp:posOffset>198120</wp:posOffset>
+            </wp:positionV>
+            <wp:extent cx="5199380" cy="3749675"/>
+            <wp:effectExtent l="0" t="0" r="0" b="0"/>
+            <wp:wrapTight wrapText="bothSides">
+              <wp:wrapPolygon edited="0">
+                <wp:start x="0" y="0"/>
+                <wp:lineTo x="0" y="21509"/>
+                <wp:lineTo x="21526" y="21509"/>
+                <wp:lineTo x="21526" y="0"/>
+                <wp:lineTo x="0" y="0"/>
+              </wp:wrapPolygon>
+            </wp:wrapTight>
+            <wp:docPr id="23998347" name="图片 1" descr="图表, 散点图&#10;&#10;描述已自动生成"/>
+            <wp:cNvGraphicFramePr>
+              <a:graphicFrameLocks xmlns:a="http://schemas.openxmlformats.org/drawingml/2006/main" noChangeAspect="1"/>
+            </wp:cNvGraphicFramePr>
+            <a:graphic xmlns:a="http://schemas.openxmlformats.org/drawingml/2006/main">
+              <a:graphicData uri="http://schemas.openxmlformats.org/drawingml/2006/picture">
+                <pic:pic xmlns:pic="http://schemas.openxmlformats.org/drawingml/2006/picture">
+                  <pic:nvPicPr>
+                    <pic:cNvPr id="23998347" name="图片 1" descr="图表, 散点图&#10;&#10;描述已自动生成"/>
+                    <pic:cNvPicPr/>
+                  </pic:nvPicPr>
+                  <pic:blipFill>
+                    <a:blip r:embed="rId10" cstate="print">
+                      <a:extLst>
+                        <a:ext uri="{28A0092B-C50C-407E-A947-70E740481C1C}">
+                          <a14:useLocalDpi xmlns:a14="http://schemas.microsoft.com/office/drawing/2010/main" val="0"/>
+                        </a:ext>
+                      </a:extLst>
+                    </a:blip>
+                    <a:stretch>
+                      <a:fillRect/>
+                    </a:stretch>
+                  </pic:blipFill>
+                  <pic:spPr>
+                    <a:xfrm>
+                      <a:off x="0" y="0"/>
+                      <a:ext cx="5199380" cy="3749675"/>
+                    </a:xfrm>
+                    <a:prstGeom prst="rect">
+                      <a:avLst/>
+                    </a:prstGeom>
+                  </pic:spPr>
+                </pic:pic>
+              </a:graphicData>
+            </a:graphic>
+            <wp14:sizeRelH relativeFrom="page">
+              <wp14:pctWidth>0</wp14:pctWidth>
+            </wp14:sizeRelH>
+            <wp14:sizeRelV relativeFrom="page">
+              <wp14:pctHeight>0</wp14:pctHeight>
+            </wp14:sizeRelV>
+          </wp:anchor>
+        </w:drawing>
+      </w:r>
+      <w:r>
+        <w:rPr>
+          <w:rFonts w:ascii="Times New Roman" w:hAnsi="Times New Roman" w:cs="Times New Roman"/>
+          <w:sz w:val="21"/>
+          <w:szCs w:val="21"/>
+        </w:rPr>
+        <w:t>Fitted Multiple Linear Regression Plane for Sleep Duration, Stress Level, and Emotion Regulation</w:t>
+      </w:r>
     </w:p>
     <w:p>
       <w:pPr>
@@ -8553,6 +9409,133 @@
         <w:jc w:val="both"/>
         <w:rPr>
           <w:rFonts w:ascii="Times New Roman" w:hAnsi="Times New Roman" w:cs="Times New Roman"/>
+          <w:sz w:val="21"/>
+          <w:szCs w:val="21"/>
+          <w:lang w:eastAsia="ja-JP"/>
+        </w:rPr>
+      </w:pPr>
+      <w:r>
+        <w:rPr>
+          <w:rFonts w:ascii="Times New Roman" w:hAnsi="Times New Roman" w:cs="Times New Roman" w:hint="eastAsia"/>
+          <w:b/>
+          <w:bCs/>
+          <w:noProof/>
+          <w:sz w:val="20"/>
+          <w:szCs w:val="20"/>
+        </w:rPr>
+        <w:t>No</w:t>
+      </w:r>
+      <w:r>
+        <w:rPr>
+          <w:rFonts w:ascii="Times New Roman" w:hAnsi="Times New Roman" w:cs="Times New Roman" w:hint="eastAsia"/>
+          <w:b/>
+          <w:bCs/>
+          <w:noProof/>
+          <w:sz w:val="21"/>
+          <w:szCs w:val="21"/>
+        </w:rPr>
+        <w:t>te</w:t>
+      </w:r>
+      <w:r>
+        <w:rPr>
+          <w:rFonts w:ascii="Times New Roman" w:hAnsi="Times New Roman" w:cs="Times New Roman"/>
+          <w:b/>
+          <w:bCs/>
+          <w:noProof/>
+          <w:sz w:val="21"/>
+          <w:szCs w:val="21"/>
+        </w:rPr>
+        <w:t> :</w:t>
+      </w:r>
+      <w:r>
+        <w:rPr>
+          <w:rFonts w:ascii="Times New Roman" w:hAnsi="Times New Roman" w:cs="Times New Roman"/>
+          <w:noProof/>
+          <w:sz w:val="21"/>
+          <w:szCs w:val="21"/>
+        </w:rPr>
+        <w:t xml:space="preserve"> </w:t>
+      </w:r>
+      <w:r>
+        <w:rPr>
+          <w:rFonts w:ascii="Times New Roman" w:hAnsi="Times New Roman" w:cs="Times New Roman"/>
+          <w:sz w:val="21"/>
+          <w:szCs w:val="21"/>
+        </w:rPr>
+        <w:t xml:space="preserve">The </w:t>
+      </w:r>
+      <w:r>
+        <w:rPr>
+          <w:rFonts w:ascii="Times New Roman" w:hAnsi="Times New Roman" w:cs="Times New Roman"/>
+          <w:sz w:val="21"/>
+          <w:szCs w:val="21"/>
+        </w:rPr>
+        <w:t>plane</w:t>
+      </w:r>
+      <w:r>
+        <w:rPr>
+          <w:rFonts w:ascii="Times New Roman" w:hAnsi="Times New Roman" w:cs="Times New Roman"/>
+          <w:sz w:val="21"/>
+          <w:szCs w:val="21"/>
+        </w:rPr>
+        <w:t xml:space="preserve"> represents the multiple linear regression model. </w:t>
+      </w:r>
+      <w:r>
+        <w:rPr>
+          <w:rFonts w:ascii="Times New Roman" w:hAnsi="Times New Roman" w:cs="Times New Roman"/>
+          <w:sz w:val="21"/>
+          <w:szCs w:val="21"/>
+        </w:rPr>
+        <w:t>X-dimension represents mean-center</w:t>
+      </w:r>
+      <w:r>
+        <w:rPr>
+          <w:rFonts w:ascii="Times New Roman" w:hAnsi="Times New Roman" w:cs="Times New Roman"/>
+          <w:sz w:val="21"/>
+          <w:szCs w:val="21"/>
+        </w:rPr>
+        <w:t>ed</w:t>
+      </w:r>
+      <w:r>
+        <w:rPr>
+          <w:rFonts w:ascii="Times New Roman" w:hAnsi="Times New Roman" w:cs="Times New Roman"/>
+          <w:sz w:val="21"/>
+          <w:szCs w:val="21"/>
+        </w:rPr>
+        <w:t xml:space="preserve"> sleep hours, Y-dimension represents mean-center</w:t>
+      </w:r>
+      <w:r>
+        <w:rPr>
+          <w:rFonts w:ascii="Times New Roman" w:hAnsi="Times New Roman" w:cs="Times New Roman"/>
+          <w:sz w:val="21"/>
+          <w:szCs w:val="21"/>
+        </w:rPr>
+        <w:t>ed</w:t>
+      </w:r>
+      <w:r>
+        <w:rPr>
+          <w:rFonts w:ascii="Times New Roman" w:hAnsi="Times New Roman" w:cs="Times New Roman"/>
+          <w:sz w:val="21"/>
+          <w:szCs w:val="21"/>
+        </w:rPr>
+        <w:t xml:space="preserve"> stress level and Z-dimension represents emotion regulation scores</w:t>
+      </w:r>
+      <w:r>
+        <w:rPr>
+          <w:rFonts w:ascii="Times New Roman" w:hAnsi="Times New Roman" w:cs="Times New Roman"/>
+          <w:sz w:val="21"/>
+          <w:szCs w:val="21"/>
+          <w:lang w:eastAsia="ja-JP"/>
+        </w:rPr>
+        <w:t xml:space="preserve"> outcome variable</w:t>
+      </w:r>
+    </w:p>
+    <w:p>
+      <w:pPr>
+        <w:spacing w:after="0" w:line="240" w:lineRule="auto"/>
+        <w:jc w:val="both"/>
+        <w:rPr>
+          <w:rFonts w:ascii="Times New Roman" w:hAnsi="Times New Roman" w:cs="Times New Roman"/>
           <w:b/>
           <w:bCs/>
           <w:sz w:val="26"/>
@@ -8585,6 +9568,26 @@
           <w:szCs w:val="26"/>
         </w:rPr>
       </w:pPr>
+      <w:r>
+        <w:rPr>
+          <w:rFonts w:ascii="Times New Roman" w:hAnsi="Times New Roman" w:cs="Times New Roman"/>
+          <w:b/>
+          <w:bCs/>
+          <w:sz w:val="26"/>
+          <w:szCs w:val="26"/>
+        </w:rPr>
+        <w:t xml:space="preserve">-Aim2 </w:t>
+      </w:r>
+      <w:r>
+        <w:rPr>
+          <w:rFonts w:ascii="Times New Roman" w:hAnsi="Times New Roman" w:cs="Times New Roman"/>
+          <w:b/>
+          <w:bCs/>
+          <w:sz w:val="26"/>
+          <w:szCs w:val="26"/>
+        </w:rPr>
+        <w:t>Results</w:t>
+      </w:r>
     </w:p>
     <w:p>
       <w:pPr>
@@ -8598,6 +9601,16 @@
           <w:szCs w:val="26"/>
         </w:rPr>
       </w:pPr>
+      <w:r>
+        <w:rPr>
+          <w:rFonts w:ascii="Times New Roman" w:hAnsi="Times New Roman" w:cs="Times New Roman"/>
+          <w:b/>
+          <w:bCs/>
+          <w:sz w:val="26"/>
+          <w:szCs w:val="26"/>
+        </w:rPr>
+        <w:t>-DISCUSSION</w:t>
+      </w:r>
     </w:p>
     <w:p>
       <w:pPr>
@@ -8611,6 +9624,36 @@
           <w:szCs w:val="26"/>
         </w:rPr>
       </w:pPr>
+      <w:r>
+        <w:rPr>
+          <w:rFonts w:ascii="Times New Roman" w:hAnsi="Times New Roman" w:cs="Times New Roman"/>
+          <w:b/>
+          <w:bCs/>
+          <w:sz w:val="26"/>
+          <w:szCs w:val="26"/>
+        </w:rPr>
+        <w:t>-</w:t>
+      </w:r>
+      <w:r>
+        <w:rPr>
+          <w:rFonts w:ascii="Times New Roman" w:hAnsi="Times New Roman" w:cs="Times New Roman"/>
+          <w:b/>
+          <w:bCs/>
+          <w:sz w:val="26"/>
+          <w:szCs w:val="26"/>
+        </w:rPr>
+        <w:t xml:space="preserve">OVERALL </w:t>
+      </w:r>
+      <w:r>
+        <w:rPr>
+          <w:rFonts w:ascii="Times New Roman" w:hAnsi="Times New Roman" w:cs="Times New Roman"/>
+          <w:b/>
+          <w:bCs/>
+          <w:sz w:val="26"/>
+          <w:szCs w:val="26"/>
+        </w:rPr>
+        <w:t>CONCLUSION</w:t>
+      </w:r>
     </w:p>
     <w:p>
       <w:pPr>
@@ -8624,6 +9667,26 @@
           <w:szCs w:val="26"/>
         </w:rPr>
       </w:pPr>
+      <w:r>
+        <w:rPr>
+          <w:rFonts w:ascii="Times New Roman" w:hAnsi="Times New Roman" w:cs="Times New Roman"/>
+          <w:b/>
+          <w:bCs/>
+          <w:sz w:val="26"/>
+          <w:szCs w:val="26"/>
+        </w:rPr>
+        <w:t>-LIMITATION</w:t>
+      </w:r>
+      <w:r>
+        <w:rPr>
+          <w:rFonts w:ascii="Times New Roman" w:hAnsi="Times New Roman" w:cs="Times New Roman"/>
+          <w:b/>
+          <w:bCs/>
+          <w:sz w:val="26"/>
+          <w:szCs w:val="26"/>
+        </w:rPr>
+        <w:t>S</w:t>
+      </w:r>
     </w:p>
     <w:p>
       <w:pPr>
@@ -8637,117 +9700,13 @@
           <w:szCs w:val="26"/>
         </w:rPr>
       </w:pPr>
-    </w:p>
-    <w:p>
-      <w:pPr>
-        <w:spacing w:after="0" w:line="240" w:lineRule="auto"/>
-        <w:jc w:val="both"/>
+      <w:r>
         <w:rPr>
           <w:rFonts w:ascii="Times New Roman" w:hAnsi="Times New Roman" w:cs="Times New Roman"/>
           <w:b/>
           <w:bCs/>
           <w:sz w:val="26"/>
           <w:szCs w:val="26"/>
-        </w:rPr>
-      </w:pPr>
-    </w:p>
-    <w:p>
-      <w:pPr>
-        <w:spacing w:after="0" w:line="240" w:lineRule="auto"/>
-        <w:jc w:val="both"/>
-        <w:rPr>
-          <w:rFonts w:ascii="Times New Roman" w:hAnsi="Times New Roman" w:cs="Times New Roman"/>
-          <w:b/>
-          <w:bCs/>
-          <w:sz w:val="26"/>
-          <w:szCs w:val="26"/>
-        </w:rPr>
-      </w:pPr>
-      <w:r>
-        <w:rPr>
-          <w:rFonts w:ascii="Times New Roman" w:hAnsi="Times New Roman" w:cs="Times New Roman"/>
-          <w:b/>
-          <w:bCs/>
-          <w:sz w:val="26"/>
-          <w:szCs w:val="26"/>
-        </w:rPr>
-        <w:t>-</w:t>
-      </w:r>
-      <w:r>
-        <w:rPr>
-          <w:rFonts w:ascii="Times New Roman" w:hAnsi="Times New Roman" w:cs="Times New Roman"/>
-          <w:b/>
-          <w:bCs/>
-          <w:sz w:val="26"/>
-          <w:szCs w:val="26"/>
-        </w:rPr>
-        <w:t xml:space="preserve">OVERALL </w:t>
-      </w:r>
-      <w:r>
-        <w:rPr>
-          <w:rFonts w:ascii="Times New Roman" w:hAnsi="Times New Roman" w:cs="Times New Roman"/>
-          <w:b/>
-          <w:bCs/>
-          <w:sz w:val="26"/>
-          <w:szCs w:val="26"/>
-        </w:rPr>
-        <w:t>CONCLUSION</w:t>
-      </w:r>
-    </w:p>
-    <w:p>
-      <w:pPr>
-        <w:spacing w:after="0" w:line="240" w:lineRule="auto"/>
-        <w:jc w:val="both"/>
-        <w:rPr>
-          <w:rFonts w:ascii="Times New Roman" w:hAnsi="Times New Roman" w:cs="Times New Roman"/>
-          <w:b/>
-          <w:bCs/>
-          <w:sz w:val="26"/>
-          <w:szCs w:val="26"/>
-        </w:rPr>
-      </w:pPr>
-      <w:r>
-        <w:rPr>
-          <w:rFonts w:ascii="Times New Roman" w:hAnsi="Times New Roman" w:cs="Times New Roman"/>
-          <w:b/>
-          <w:bCs/>
-          <w:sz w:val="26"/>
-          <w:szCs w:val="26"/>
-        </w:rPr>
-        <w:t>-LIMITATION</w:t>
-      </w:r>
-      <w:r>
-        <w:rPr>
-          <w:rFonts w:ascii="Times New Roman" w:hAnsi="Times New Roman" w:cs="Times New Roman"/>
-          <w:b/>
-          <w:bCs/>
-          <w:sz w:val="26"/>
-          <w:szCs w:val="26"/>
-        </w:rPr>
-        <w:t>S</w:t>
-      </w:r>
-    </w:p>
-    <w:p>
-      <w:pPr>
-        <w:spacing w:after="0" w:line="240" w:lineRule="auto"/>
-        <w:jc w:val="both"/>
-        <w:rPr>
-          <w:rFonts w:ascii="Times New Roman" w:hAnsi="Times New Roman" w:cs="Times New Roman"/>
-          <w:b/>
-          <w:bCs/>
-          <w:sz w:val="26"/>
-          <w:szCs w:val="26"/>
-          <w:lang w:val="fr-CA"/>
-        </w:rPr>
-      </w:pPr>
-      <w:r>
-        <w:rPr>
-          <w:rFonts w:ascii="Times New Roman" w:hAnsi="Times New Roman" w:cs="Times New Roman"/>
-          <w:b/>
-          <w:bCs/>
-          <w:sz w:val="26"/>
-          <w:szCs w:val="26"/>
-          <w:lang w:val="fr-CA"/>
         </w:rPr>
         <w:t>-REFERENCES</w:t>
       </w:r>

</xml_diff>